<commit_message>
docs: documentação inicial do projeto V1.2
</commit_message>
<xml_diff>
--- a/PID_Relatório_5o_e_6o.Períodos_2026.docx
+++ b/PID_Relatório_5o_e_6o.Períodos_2026.docx
@@ -1,6 +1,6 @@
 
 <file path=word/document.xml><?xml version="1.0" encoding="utf-8"?>
-<w:document xmlns:wpc="http://schemas.microsoft.com/office/word/2010/wordprocessingCanvas" xmlns:cx="http://schemas.microsoft.com/office/drawing/2014/chartex" xmlns:cx1="http://schemas.microsoft.com/office/drawing/2015/9/8/chartex" xmlns:cx2="http://schemas.microsoft.com/office/drawing/2015/10/21/chartex" xmlns:cx3="http://schemas.microsoft.com/office/drawing/2016/5/9/chartex" xmlns:cx4="http://schemas.microsoft.com/office/drawing/2016/5/10/chartex" xmlns:cx5="http://schemas.microsoft.com/office/drawing/2016/5/11/chartex" xmlns:cx6="http://schemas.microsoft.com/office/drawing/2016/5/12/chartex" xmlns:cx7="http://schemas.microsoft.com/office/drawing/2016/5/13/chartex" xmlns:cx8="http://schemas.microsoft.com/office/drawing/2016/5/14/chartex" xmlns:mc="http://schemas.openxmlformats.org/markup-compatibility/2006" xmlns:aink="http://schemas.microsoft.com/office/drawing/2016/ink" xmlns:am3d="http://schemas.microsoft.com/office/drawing/2017/model3d" xmlns:o="urn:schemas-microsoft-com:office:office" xmlns:oel="http://schemas.microsoft.com/office/2019/extlst" xmlns:r="http://schemas.openxmlformats.org/officeDocument/2006/relationships" xmlns:m="http://schemas.openxmlformats.org/officeDocument/2006/math" xmlns:v="urn:schemas-microsoft-com:vml" xmlns:wp14="http://schemas.microsoft.com/office/word/2010/wordprocessingDrawing" xmlns:wp="http://schemas.openxmlformats.org/drawingml/2006/wordprocessingDrawing" xmlns:w10="urn:schemas-microsoft-com:office:word" xmlns:w="http://schemas.openxmlformats.org/wordprocessingml/2006/main" xmlns:w14="http://schemas.microsoft.com/office/word/2010/wordml" xmlns:w15="http://schemas.microsoft.com/office/word/2012/wordml" xmlns:w16cex="http://schemas.microsoft.com/office/word/2018/wordml/cex" xmlns:w16cid="http://schemas.microsoft.com/office/word/2016/wordml/cid" xmlns:w16="http://schemas.microsoft.com/office/word/2018/wordml" xmlns:w16du="http://schemas.microsoft.com/office/word/2023/wordml/word16du" xmlns:w16sdtdh="http://schemas.microsoft.com/office/word/2020/wordml/sdtdatahash" xmlns:w16sdtfl="http://schemas.microsoft.com/office/word/2024/wordml/sdtformatlock" xmlns:w16se="http://schemas.microsoft.com/office/word/2015/wordml/symex" xmlns:wpg="http://schemas.microsoft.com/office/word/2010/wordprocessingGroup" xmlns:wpi="http://schemas.microsoft.com/office/word/2010/wordprocessingInk" xmlns:wne="http://schemas.microsoft.com/office/word/2006/wordml" xmlns:wps="http://schemas.microsoft.com/office/word/2010/wordprocessingShape" xmlns:a="http://schemas.openxmlformats.org/drawingml/2006/main" mc:Ignorable="w14 w15 w16se w16cid w16 w16cex w16sdtdh w16sdtfl w16du wp14">
+<w:document xmlns:wpc="http://schemas.microsoft.com/office/word/2010/wordprocessingCanvas" xmlns:cx="http://schemas.microsoft.com/office/drawing/2014/chartex" xmlns:mc="http://schemas.openxmlformats.org/markup-compatibility/2006" xmlns:o="urn:schemas-microsoft-com:office:office" xmlns:r="http://schemas.openxmlformats.org/officeDocument/2006/relationships" xmlns:m="http://schemas.openxmlformats.org/officeDocument/2006/math" xmlns:v="urn:schemas-microsoft-com:vml" xmlns:wp14="http://schemas.microsoft.com/office/word/2010/wordprocessingDrawing" xmlns:wp="http://schemas.openxmlformats.org/drawingml/2006/wordprocessingDrawing" xmlns:w10="urn:schemas-microsoft-com:office:word" xmlns:w="http://schemas.openxmlformats.org/wordprocessingml/2006/main" xmlns:w14="http://schemas.microsoft.com/office/word/2010/wordml" xmlns:w15="http://schemas.microsoft.com/office/word/2012/wordml" xmlns:w16se="http://schemas.microsoft.com/office/word/2015/wordml/symex" xmlns:wpg="http://schemas.microsoft.com/office/word/2010/wordprocessingGroup" xmlns:wpi="http://schemas.microsoft.com/office/word/2010/wordprocessingInk" xmlns:wne="http://schemas.microsoft.com/office/word/2006/wordml" xmlns:wps="http://schemas.microsoft.com/office/word/2010/wordprocessingShape" mc:Ignorable="w14 w15 w16se wp14">
   <w:body>
     <w:p>
       <w:pPr>
@@ -58,14 +58,14 @@
       <w:pPr>
         <w:jc w:val="center"/>
         <w:rPr>
-          <w:b w:val="1"/>
-          <w:bCs w:val="1"/>
-        </w:rPr>
-      </w:pPr>
-      <w:r>
-        <w:rPr>
-          <w:b w:val="1"/>
-          <w:bCs w:val="1"/>
+          <w:b/>
+          <w:bCs/>
+        </w:rPr>
+      </w:pPr>
+      <w:r>
+        <w:rPr>
+          <w:b/>
+          <w:bCs/>
         </w:rPr>
         <w:t>BRUNO EDUARDO FARIA DE MORAIS</w:t>
       </w:r>
@@ -86,6 +86,13 @@
       <w:pPr>
         <w:jc w:val="center"/>
       </w:pPr>
+      <w:r>
+        <w:rPr>
+          <w:b/>
+          <w:bCs/>
+        </w:rPr>
+        <w:t>MARCELA DE CÁSSIA COSTA REZENDE</w:t>
+      </w:r>
     </w:p>
     <w:p>
       <w:pPr>
@@ -194,12 +201,17 @@
           <w:b/>
           <w:bCs/>
         </w:rPr>
+        <w:lastRenderedPageBreak/>
         <w:t>FAI – CENTRO DE ENSINO SUPERIOR EM GESTÃO, TECNOLOGIA E EDUCAÇÃO</w:t>
       </w:r>
     </w:p>
     <w:p>
       <w:pPr>
         <w:jc w:val="center"/>
+        <w:rPr>
+          <w:b/>
+          <w:bCs/>
+        </w:rPr>
       </w:pPr>
       <w:r>
         <w:rPr>
@@ -217,6 +229,26 @@
     <w:p>
       <w:pPr>
         <w:jc w:val="center"/>
+        <w:rPr>
+          <w:b/>
+          <w:bCs/>
+        </w:rPr>
+      </w:pPr>
+      <w:r>
+        <w:rPr>
+          <w:b/>
+          <w:bCs/>
+        </w:rPr>
+        <w:t>BRUNO EDUARDO FARIA DE MORAIS</w:t>
+      </w:r>
+    </w:p>
+    <w:p>
+      <w:pPr>
+        <w:jc w:val="center"/>
+        <w:rPr>
+          <w:b/>
+          <w:bCs/>
+        </w:rPr>
       </w:pPr>
       <w:r>
         <w:rPr>
@@ -230,6 +262,13 @@
       <w:pPr>
         <w:jc w:val="center"/>
       </w:pPr>
+      <w:r>
+        <w:rPr>
+          <w:b/>
+          <w:bCs/>
+        </w:rPr>
+        <w:t>MARCELA DE CÁSSIA COSTA REZENDE</w:t>
+      </w:r>
     </w:p>
     <w:p>
       <w:pPr>
@@ -255,6 +294,11 @@
       <w:pPr>
         <w:jc w:val="center"/>
       </w:pPr>
+    </w:p>
+    <w:p>
+      <w:pPr>
+        <w:jc w:val="center"/>
+      </w:pPr>
       <w:r>
         <w:rPr>
           <w:b/>
@@ -299,11 +343,6 @@
     </w:p>
     <w:p>
       <w:pPr>
-        <w:jc w:val="both"/>
-      </w:pPr>
-    </w:p>
-    <w:p>
-      <w:pPr>
         <w:jc w:val="center"/>
       </w:pPr>
       <w:r>
@@ -338,6 +377,7 @@
           <w:b/>
           <w:bCs/>
         </w:rPr>
+        <w:lastRenderedPageBreak/>
         <w:t xml:space="preserve">LISTA DE REVISÃO </w:t>
       </w:r>
     </w:p>
@@ -346,12 +386,12 @@
         <w:tblW w:w="8926" w:type="dxa"/>
         <w:tblInd w:w="288" w:type="dxa"/>
         <w:tblBorders>
-          <w:top w:val="single" w:color="000000" w:themeColor="text1" w:sz="6" w:space="0"/>
-          <w:left w:val="single" w:color="000000" w:themeColor="text1" w:sz="6" w:space="0"/>
-          <w:bottom w:val="single" w:color="000000" w:themeColor="text1" w:sz="6" w:space="0"/>
-          <w:right w:val="single" w:color="000000" w:themeColor="text1" w:sz="6" w:space="0"/>
-          <w:insideH w:val="single" w:color="000000" w:themeColor="text1" w:sz="6" w:space="0"/>
-          <w:insideV w:val="single" w:color="000000" w:themeColor="text1" w:sz="6" w:space="0"/>
+          <w:top w:val="single" w:sz="6" w:space="0" w:color="000000" w:themeColor="text1"/>
+          <w:left w:val="single" w:sz="6" w:space="0" w:color="000000" w:themeColor="text1"/>
+          <w:bottom w:val="single" w:sz="6" w:space="0" w:color="000000" w:themeColor="text1"/>
+          <w:right w:val="single" w:sz="6" w:space="0" w:color="000000" w:themeColor="text1"/>
+          <w:insideH w:val="single" w:sz="6" w:space="0" w:color="000000" w:themeColor="text1"/>
+          <w:insideV w:val="single" w:sz="6" w:space="0" w:color="000000" w:themeColor="text1"/>
         </w:tblBorders>
         <w:tblLayout w:type="fixed"/>
         <w:tblLook w:val="0000" w:firstRow="0" w:lastRow="0" w:firstColumn="0" w:lastColumn="0" w:noHBand="0" w:noVBand="0"/>
@@ -370,7 +410,6 @@
           <w:tcPr>
             <w:tcW w:w="1272" w:type="dxa"/>
             <w:shd w:val="clear" w:color="auto" w:fill="FFFFFF" w:themeFill="background1"/>
-            <w:tcMar/>
           </w:tcPr>
           <w:p>
             <w:pPr>
@@ -400,7 +439,6 @@
           <w:tcPr>
             <w:tcW w:w="1275" w:type="dxa"/>
             <w:shd w:val="clear" w:color="auto" w:fill="FFFFFF" w:themeFill="background1"/>
-            <w:tcMar/>
           </w:tcPr>
           <w:p>
             <w:pPr>
@@ -430,7 +468,6 @@
           <w:tcPr>
             <w:tcW w:w="1977" w:type="dxa"/>
             <w:shd w:val="clear" w:color="auto" w:fill="FFFFFF" w:themeFill="background1"/>
-            <w:tcMar/>
           </w:tcPr>
           <w:p>
             <w:pPr>
@@ -460,7 +497,6 @@
           <w:tcPr>
             <w:tcW w:w="4402" w:type="dxa"/>
             <w:shd w:val="clear" w:color="auto" w:fill="FFFFFF" w:themeFill="background1"/>
-            <w:tcMar/>
           </w:tcPr>
           <w:p>
             <w:pPr>
@@ -491,7 +527,6 @@
         <w:tc>
           <w:tcPr>
             <w:tcW w:w="1272" w:type="dxa"/>
-            <w:tcMar/>
           </w:tcPr>
           <w:p>
             <w:pPr>
@@ -519,7 +554,6 @@
         <w:tc>
           <w:tcPr>
             <w:tcW w:w="1275" w:type="dxa"/>
-            <w:tcMar/>
           </w:tcPr>
           <w:p>
             <w:pPr>
@@ -534,7 +568,6 @@
         <w:tc>
           <w:tcPr>
             <w:tcW w:w="1977" w:type="dxa"/>
-            <w:tcMar/>
           </w:tcPr>
           <w:p>
             <w:pPr>
@@ -561,7 +594,6 @@
         <w:tc>
           <w:tcPr>
             <w:tcW w:w="4402" w:type="dxa"/>
-            <w:tcMar/>
           </w:tcPr>
           <w:p>
             <w:pPr>
@@ -594,23 +626,17 @@
         <w:tc>
           <w:tcPr>
             <w:tcW w:w="1272" w:type="dxa"/>
-            <w:tcMar/>
           </w:tcPr>
           <w:p>
             <w:pPr>
-              <w:pStyle w:val="Normal"/>
               <w:jc w:val="center"/>
               <w:rPr>
-                <w:color w:val="000000" w:themeColor="text1" w:themeTint="FF" w:themeShade="FF"/>
+                <w:color w:val="000000" w:themeColor="text1"/>
               </w:rPr>
             </w:pPr>
             <w:r>
               <w:rPr>
-                <w:rFonts w:ascii="Times New Roman" w:hAnsi="Times New Roman" w:eastAsia="Times New Roman" w:cs="Times New Roman"/>
-                <w:color w:val="000000" w:themeColor="text1" w:themeTint="FF" w:themeShade="FF"/>
-                <w:sz w:val="24"/>
-                <w:szCs w:val="24"/>
-                <w:lang w:eastAsia="pt-BR" w:bidi="ar-SA"/>
+                <w:color w:val="000000" w:themeColor="text1"/>
               </w:rPr>
               <w:t>08/03/26</w:t>
             </w:r>
@@ -619,23 +645,17 @@
         <w:tc>
           <w:tcPr>
             <w:tcW w:w="1275" w:type="dxa"/>
-            <w:tcMar/>
           </w:tcPr>
           <w:p>
             <w:pPr>
-              <w:pStyle w:val="Normal"/>
               <w:jc w:val="center"/>
               <w:rPr>
-                <w:color w:val="000000" w:themeColor="text1" w:themeTint="FF" w:themeShade="FF"/>
+                <w:color w:val="000000" w:themeColor="text1"/>
               </w:rPr>
             </w:pPr>
             <w:r>
               <w:rPr>
-                <w:rFonts w:ascii="Times New Roman" w:hAnsi="Times New Roman" w:eastAsia="Times New Roman" w:cs="Times New Roman"/>
-                <w:color w:val="000000" w:themeColor="text1" w:themeTint="FF" w:themeShade="FF"/>
-                <w:sz w:val="24"/>
-                <w:szCs w:val="24"/>
-                <w:lang w:eastAsia="pt-BR" w:bidi="ar-SA"/>
+                <w:color w:val="000000" w:themeColor="text1"/>
               </w:rPr>
               <w:t>V1.1</w:t>
             </w:r>
@@ -644,22 +664,16 @@
         <w:tc>
           <w:tcPr>
             <w:tcW w:w="1977" w:type="dxa"/>
-            <w:tcMar/>
           </w:tcPr>
           <w:p>
             <w:pPr>
-              <w:pStyle w:val="Normal"/>
-              <w:rPr>
-                <w:color w:val="000000" w:themeColor="text1" w:themeTint="FF" w:themeShade="FF"/>
+              <w:rPr>
+                <w:color w:val="000000" w:themeColor="text1"/>
               </w:rPr>
             </w:pPr>
             <w:r>
               <w:rPr>
-                <w:rFonts w:ascii="Times New Roman" w:hAnsi="Times New Roman" w:eastAsia="Times New Roman" w:cs="Times New Roman"/>
-                <w:color w:val="000000" w:themeColor="text1" w:themeTint="FF" w:themeShade="FF"/>
-                <w:sz w:val="24"/>
-                <w:szCs w:val="24"/>
-                <w:lang w:eastAsia="pt-BR" w:bidi="ar-SA"/>
+                <w:color w:val="000000" w:themeColor="text1"/>
               </w:rPr>
               <w:t>BRUNO EDUARDO</w:t>
             </w:r>
@@ -668,35 +682,99 @@
         <w:tc>
           <w:tcPr>
             <w:tcW w:w="4402" w:type="dxa"/>
-            <w:tcMar/>
           </w:tcPr>
           <w:p>
             <w:pPr>
-              <w:pStyle w:val="Normal"/>
               <w:jc w:val="both"/>
               <w:rPr>
-                <w:color w:val="000000" w:themeColor="text1" w:themeTint="FF" w:themeShade="FF"/>
+                <w:color w:val="000000" w:themeColor="text1"/>
               </w:rPr>
             </w:pPr>
             <w:r>
               <w:rPr>
-                <w:rFonts w:ascii="Times New Roman" w:hAnsi="Times New Roman" w:eastAsia="Times New Roman" w:cs="Times New Roman"/>
-                <w:color w:val="000000" w:themeColor="text1" w:themeTint="FF" w:themeShade="FF"/>
-                <w:sz w:val="24"/>
-                <w:szCs w:val="24"/>
-                <w:lang w:eastAsia="pt-BR" w:bidi="ar-SA"/>
-              </w:rPr>
-              <w:t>CAPITULO</w:t>
-            </w:r>
-            <w:r>
-              <w:rPr>
-                <w:rFonts w:ascii="Times New Roman" w:hAnsi="Times New Roman" w:eastAsia="Times New Roman" w:cs="Times New Roman"/>
-                <w:color w:val="000000" w:themeColor="text1" w:themeTint="FF" w:themeShade="FF"/>
-                <w:sz w:val="24"/>
-                <w:szCs w:val="24"/>
-                <w:lang w:eastAsia="pt-BR" w:bidi="ar-SA"/>
-              </w:rPr>
-              <w:t xml:space="preserve"> 1 (2.6, 2.7 e 2.8)</w:t>
+                <w:color w:val="000000" w:themeColor="text1"/>
+              </w:rPr>
+              <w:t>CAPITULO 1 (2.6, 2.7 e 2.8)</w:t>
+            </w:r>
+          </w:p>
+        </w:tc>
+      </w:tr>
+      <w:tr>
+        <w:trPr>
+          <w:trHeight w:val="300"/>
+        </w:trPr>
+        <w:tc>
+          <w:tcPr>
+            <w:tcW w:w="1272" w:type="dxa"/>
+          </w:tcPr>
+          <w:p>
+            <w:pPr>
+              <w:jc w:val="center"/>
+              <w:rPr>
+                <w:color w:val="000000" w:themeColor="text1"/>
+              </w:rPr>
+            </w:pPr>
+            <w:r>
+              <w:rPr>
+                <w:color w:val="000000" w:themeColor="text1"/>
+              </w:rPr>
+              <w:t>08/03/26</w:t>
+            </w:r>
+          </w:p>
+        </w:tc>
+        <w:tc>
+          <w:tcPr>
+            <w:tcW w:w="1275" w:type="dxa"/>
+          </w:tcPr>
+          <w:p>
+            <w:pPr>
+              <w:jc w:val="center"/>
+              <w:rPr>
+                <w:color w:val="000000" w:themeColor="text1"/>
+              </w:rPr>
+            </w:pPr>
+            <w:r>
+              <w:rPr>
+                <w:color w:val="000000" w:themeColor="text1"/>
+              </w:rPr>
+              <w:t>V1.2</w:t>
+            </w:r>
+          </w:p>
+        </w:tc>
+        <w:tc>
+          <w:tcPr>
+            <w:tcW w:w="1977" w:type="dxa"/>
+          </w:tcPr>
+          <w:p>
+            <w:pPr>
+              <w:rPr>
+                <w:color w:val="000000" w:themeColor="text1"/>
+              </w:rPr>
+            </w:pPr>
+            <w:r>
+              <w:rPr>
+                <w:color w:val="000000" w:themeColor="text1"/>
+              </w:rPr>
+              <w:t>MARCELA</w:t>
+            </w:r>
+          </w:p>
+        </w:tc>
+        <w:tc>
+          <w:tcPr>
+            <w:tcW w:w="4402" w:type="dxa"/>
+          </w:tcPr>
+          <w:p>
+            <w:pPr>
+              <w:jc w:val="both"/>
+              <w:rPr>
+                <w:color w:val="000000" w:themeColor="text1"/>
+              </w:rPr>
+            </w:pPr>
+            <w:r>
+              <w:rPr>
+                <w:color w:val="000000" w:themeColor="text1"/>
+              </w:rPr>
+              <w:t>RESUMO E CAPITULO 1 (2.5)</w:t>
             </w:r>
           </w:p>
         </w:tc>
@@ -715,7 +793,7 @@
       <w:pPr>
         <w:jc w:val="center"/>
       </w:pPr>
-      <w:bookmarkStart w:name="_ch6ot5knti9w" w:colFirst="0" w:colLast="0" w:id="0"/>
+      <w:bookmarkStart w:id="0" w:name="_ch6ot5knti9w" w:colFirst="0" w:colLast="0"/>
       <w:bookmarkEnd w:id="0"/>
       <w:r>
         <w:br w:type="page"/>
@@ -725,6 +803,7 @@
           <w:b/>
           <w:bCs/>
         </w:rPr>
+        <w:lastRenderedPageBreak/>
         <w:t>AGRADECIMENTOS</w:t>
       </w:r>
     </w:p>
@@ -740,35 +819,47 @@
           <w:b/>
           <w:bCs/>
         </w:rPr>
+        <w:lastRenderedPageBreak/>
         <w:t>RESUMO</w:t>
       </w:r>
     </w:p>
     <w:p>
-      <w:pPr>
+      <w:r>
+        <w:t xml:space="preserve">Com o aumento do envelhecimento da população nas últimas décadas, houve dificuldades para os familiares na organização das atividades diárias e no acompanhamento adequado da rotina de cuidado, necessitando do auxílio de cuidadores especializados. Devido à dificuldade de encontrar cuidadores confiáveis, o </w:t>
+      </w:r>
+      <w:proofErr w:type="spellStart"/>
+      <w:r>
+        <w:t>ElderConnect</w:t>
+      </w:r>
+      <w:proofErr w:type="spellEnd"/>
+      <w:r>
+        <w:t xml:space="preserve"> foi criado com o objetivo de auxiliar na conexão entre cuidadores e familiares, além de contribuir para o gerenciamento das atividades de cuidado. O sistema será projetado usando Java e </w:t>
+      </w:r>
+      <w:proofErr w:type="spellStart"/>
+      <w:r>
+        <w:t>PostSQL</w:t>
+      </w:r>
+      <w:proofErr w:type="spellEnd"/>
+      <w:r>
+        <w:t xml:space="preserve"> para banco de dados. O objetivo é desenvolver um sistema que auxilie e facilite o cuidado com pessoas idosas.</w:t>
+      </w:r>
+    </w:p>
+    <w:p>
+      <w:r>
+        <w:rPr>
+          <w:b/>
+          <w:bCs/>
+        </w:rPr>
+        <w:t xml:space="preserve">Palavras-chave: </w:t>
+      </w:r>
+      <w:r>
         <w:rPr>
           <w:color w:val="0070C0"/>
         </w:rPr>
-      </w:pPr>
-      <w:r>
-        <w:rPr>
-          <w:color w:val="0070C0"/>
-        </w:rPr>
-        <w:t>Faça um resumo sobre este documento, utilizando até 250 palavras distribuídas em um único parágrafo.</w:t>
-      </w:r>
-    </w:p>
-    <w:p>
-      <w:r>
-        <w:rPr>
-          <w:b/>
-          <w:bCs/>
-        </w:rPr>
-        <w:t xml:space="preserve">Palavras-chave: </w:t>
-      </w:r>
-      <w:r>
-        <w:rPr>
-          <w:color w:val="0070C0"/>
-        </w:rPr>
-        <w:t>cite no mínimo três palavras-chave separadas por ponto e vírgula.</w:t>
+        <w:t xml:space="preserve">  </w:t>
+      </w:r>
+      <w:r>
+        <w:t xml:space="preserve">  Cuidado de idosos; Cuidadores; Gerenciamento de cuidados; Envelhecimento populacional</w:t>
       </w:r>
       <w:r>
         <w:br w:type="page"/>
@@ -778,6 +869,7 @@
           <w:b/>
           <w:bCs/>
         </w:rPr>
+        <w:lastRenderedPageBreak/>
         <w:t>LISTA DE FIGURAS</w:t>
       </w:r>
       <w:r>
@@ -828,7 +920,7 @@
                             <w:pPr>
                               <w:suppressAutoHyphens/>
                               <w:spacing w:line="1" w:lineRule="atLeast"/>
-                              <w:ind w:leftChars="-1" w:hanging="2" w:hangingChars="1"/>
+                              <w:ind w:leftChars="-1" w:hangingChars="1" w:hanging="2"/>
                               <w:textDirection w:val="btLr"/>
                               <w:textAlignment w:val="top"/>
                               <w:outlineLvl w:val="0"/>
@@ -841,7 +933,7 @@
                             <w:pPr>
                               <w:suppressAutoHyphens/>
                               <w:spacing w:line="1" w:lineRule="atLeast"/>
-                              <w:ind w:leftChars="-1" w:hanging="2" w:hangingChars="1"/>
+                              <w:ind w:leftChars="-1" w:hangingChars="1" w:hanging="2"/>
                               <w:textDirection w:val="btLr"/>
                               <w:textAlignment w:val="top"/>
                               <w:outlineLvl w:val="0"/>
@@ -859,7 +951,7 @@
               </wp:anchor>
             </w:drawing>
           </mc:Choice>
-          <mc:Fallback xmlns:a="http://schemas.openxmlformats.org/drawingml/2006/main">
+          <mc:Fallback xmlns:a="http://schemas.openxmlformats.org/drawingml/2006/main" xmlns:w16sdtfl="http://schemas.microsoft.com/office/word/2024/wordml/sdtformatlock" xmlns:w16sdtdh="http://schemas.microsoft.com/office/word/2020/wordml/sdtdatahash" xmlns:w16du="http://schemas.microsoft.com/office/word/2023/wordml/word16du" xmlns:w16="http://schemas.microsoft.com/office/word/2018/wordml" xmlns:w16cid="http://schemas.microsoft.com/office/word/2016/wordml/cid" xmlns:w16cex="http://schemas.microsoft.com/office/word/2018/wordml/cex" xmlns:oel="http://schemas.microsoft.com/office/2019/extlst" xmlns:am3d="http://schemas.microsoft.com/office/drawing/2017/model3d" xmlns:aink="http://schemas.microsoft.com/office/drawing/2016/ink" xmlns:cx8="http://schemas.microsoft.com/office/drawing/2016/5/14/chartex" xmlns:cx7="http://schemas.microsoft.com/office/drawing/2016/5/13/chartex" xmlns:cx6="http://schemas.microsoft.com/office/drawing/2016/5/12/chartex" xmlns:cx5="http://schemas.microsoft.com/office/drawing/2016/5/11/chartex" xmlns:cx4="http://schemas.microsoft.com/office/drawing/2016/5/10/chartex" xmlns:cx3="http://schemas.microsoft.com/office/drawing/2016/5/9/chartex" xmlns:cx2="http://schemas.microsoft.com/office/drawing/2015/10/21/chartex" xmlns:cx1="http://schemas.microsoft.com/office/drawing/2015/9/8/chartex">
             <w:pict w14:anchorId="08459B00">
               <v:shapetype id="_x0000_t202" coordsize="21600,21600" o:spt="202" path="m,l,21600r21600,l21600,xe" w14:anchorId="7018CBA8">
                 <v:stroke joinstyle="miter"/>
@@ -934,6 +1026,7 @@
           <w:b/>
           <w:bCs/>
         </w:rPr>
+        <w:lastRenderedPageBreak/>
         <w:t>LISTA DE SIGLAS E ABREVIATURAS</w:t>
       </w:r>
     </w:p>
@@ -1092,12 +1185,21 @@
               <w:spacing w:before="120" w:after="120"/>
               <w:jc w:val="both"/>
             </w:pPr>
+            <w:proofErr w:type="spellStart"/>
             <w:r>
               <w:rPr>
                 <w:i/>
                 <w:iCs/>
               </w:rPr>
-              <w:t xml:space="preserve">Random Access </w:t>
+              <w:t>Random</w:t>
+            </w:r>
+            <w:proofErr w:type="spellEnd"/>
+            <w:r>
+              <w:rPr>
+                <w:i/>
+                <w:iCs/>
+              </w:rPr>
+              <w:t xml:space="preserve"> Access </w:t>
             </w:r>
             <w:proofErr w:type="spellStart"/>
             <w:r>
@@ -1276,13 +1378,8 @@
           <w:b/>
           <w:bCs/>
         </w:rPr>
+        <w:lastRenderedPageBreak/>
         <w:tab/>
-      </w:r>
-      <w:r>
-        <w:rPr>
-          <w:b/>
-          <w:bCs/>
-        </w:rPr>
         <w:t>SUMÁRIO</w:t>
       </w:r>
       <w:r>
@@ -1316,7 +1413,7 @@
               <w:tab w:val="right" w:pos="9062"/>
             </w:tabs>
             <w:rPr>
-              <w:rFonts w:ascii="Calibri" w:hAnsi="Calibri" w:eastAsia="Calibri" w:cs="Calibri"/>
+              <w:rFonts w:ascii="Calibri" w:eastAsia="Calibri" w:hAnsi="Calibri" w:cs="Calibri"/>
               <w:color w:val="000000"/>
               <w:sz w:val="22"/>
               <w:szCs w:val="22"/>
@@ -1343,11 +1440,6 @@
                 <w:color w:val="000000"/>
               </w:rPr>
               <w:tab/>
-            </w:r>
-            <w:r>
-              <w:rPr>
-                <w:color w:val="000000"/>
-              </w:rPr>
               <w:t>10</w:t>
             </w:r>
           </w:hyperlink>
@@ -1365,7 +1457,7 @@
               <w:tab w:val="right" w:pos="9062"/>
             </w:tabs>
             <w:rPr>
-              <w:rFonts w:ascii="Calibri" w:hAnsi="Calibri" w:eastAsia="Calibri" w:cs="Calibri"/>
+              <w:rFonts w:ascii="Calibri" w:eastAsia="Calibri" w:hAnsi="Calibri" w:cs="Calibri"/>
               <w:color w:val="000000"/>
               <w:sz w:val="22"/>
               <w:szCs w:val="22"/>
@@ -1383,11 +1475,6 @@
                 <w:color w:val="000000"/>
               </w:rPr>
               <w:tab/>
-            </w:r>
-            <w:r>
-              <w:rPr>
-                <w:color w:val="000000"/>
-              </w:rPr>
               <w:t>11</w:t>
             </w:r>
           </w:hyperlink>
@@ -1406,7 +1493,7 @@
             </w:tabs>
             <w:ind w:left="240"/>
             <w:rPr>
-              <w:rFonts w:ascii="Calibri" w:hAnsi="Calibri" w:eastAsia="Calibri" w:cs="Calibri"/>
+              <w:rFonts w:ascii="Calibri" w:eastAsia="Calibri" w:hAnsi="Calibri" w:cs="Calibri"/>
               <w:color w:val="000000"/>
               <w:sz w:val="22"/>
               <w:szCs w:val="22"/>
@@ -1424,11 +1511,6 @@
                 <w:color w:val="000000"/>
               </w:rPr>
               <w:tab/>
-            </w:r>
-            <w:r>
-              <w:rPr>
-                <w:color w:val="000000"/>
-              </w:rPr>
               <w:t>11</w:t>
             </w:r>
           </w:hyperlink>
@@ -1447,7 +1529,7 @@
             </w:tabs>
             <w:ind w:left="240"/>
             <w:rPr>
-              <w:rFonts w:ascii="Calibri" w:hAnsi="Calibri" w:eastAsia="Calibri" w:cs="Calibri"/>
+              <w:rFonts w:ascii="Calibri" w:eastAsia="Calibri" w:hAnsi="Calibri" w:cs="Calibri"/>
               <w:color w:val="000000"/>
               <w:sz w:val="22"/>
               <w:szCs w:val="22"/>
@@ -1465,11 +1547,6 @@
                 <w:color w:val="000000"/>
               </w:rPr>
               <w:tab/>
-            </w:r>
-            <w:r>
-              <w:rPr>
-                <w:color w:val="000000"/>
-              </w:rPr>
               <w:t>11</w:t>
             </w:r>
           </w:hyperlink>
@@ -1488,7 +1565,7 @@
             </w:tabs>
             <w:ind w:left="240"/>
             <w:rPr>
-              <w:rFonts w:ascii="Calibri" w:hAnsi="Calibri" w:eastAsia="Calibri" w:cs="Calibri"/>
+              <w:rFonts w:ascii="Calibri" w:eastAsia="Calibri" w:hAnsi="Calibri" w:cs="Calibri"/>
               <w:color w:val="000000"/>
               <w:sz w:val="22"/>
               <w:szCs w:val="22"/>
@@ -1506,11 +1583,6 @@
                 <w:color w:val="000000"/>
               </w:rPr>
               <w:tab/>
-            </w:r>
-            <w:r>
-              <w:rPr>
-                <w:color w:val="000000"/>
-              </w:rPr>
               <w:t>11</w:t>
             </w:r>
           </w:hyperlink>
@@ -1529,7 +1601,7 @@
             </w:tabs>
             <w:ind w:left="240"/>
             <w:rPr>
-              <w:rFonts w:ascii="Calibri" w:hAnsi="Calibri" w:eastAsia="Calibri" w:cs="Calibri"/>
+              <w:rFonts w:ascii="Calibri" w:eastAsia="Calibri" w:hAnsi="Calibri" w:cs="Calibri"/>
               <w:color w:val="000000"/>
               <w:sz w:val="22"/>
               <w:szCs w:val="22"/>
@@ -1547,11 +1619,6 @@
                 <w:color w:val="000000"/>
               </w:rPr>
               <w:tab/>
-            </w:r>
-            <w:r>
-              <w:rPr>
-                <w:color w:val="000000"/>
-              </w:rPr>
               <w:t>12</w:t>
             </w:r>
           </w:hyperlink>
@@ -1570,7 +1637,7 @@
             </w:tabs>
             <w:ind w:left="240"/>
             <w:rPr>
-              <w:rFonts w:ascii="Calibri" w:hAnsi="Calibri" w:eastAsia="Calibri" w:cs="Calibri"/>
+              <w:rFonts w:ascii="Calibri" w:eastAsia="Calibri" w:hAnsi="Calibri" w:cs="Calibri"/>
               <w:color w:val="000000"/>
               <w:sz w:val="22"/>
               <w:szCs w:val="22"/>
@@ -1588,11 +1655,6 @@
                 <w:color w:val="000000"/>
               </w:rPr>
               <w:tab/>
-            </w:r>
-            <w:r>
-              <w:rPr>
-                <w:color w:val="000000"/>
-              </w:rPr>
               <w:t>12</w:t>
             </w:r>
           </w:hyperlink>
@@ -1611,7 +1673,7 @@
             </w:tabs>
             <w:ind w:left="240"/>
             <w:rPr>
-              <w:rFonts w:ascii="Calibri" w:hAnsi="Calibri" w:eastAsia="Calibri" w:cs="Calibri"/>
+              <w:rFonts w:ascii="Calibri" w:eastAsia="Calibri" w:hAnsi="Calibri" w:cs="Calibri"/>
               <w:color w:val="000000"/>
               <w:sz w:val="22"/>
               <w:szCs w:val="22"/>
@@ -1629,11 +1691,6 @@
                 <w:color w:val="000000"/>
               </w:rPr>
               <w:tab/>
-            </w:r>
-            <w:r>
-              <w:rPr>
-                <w:color w:val="000000"/>
-              </w:rPr>
               <w:t>12</w:t>
             </w:r>
           </w:hyperlink>
@@ -1652,7 +1709,7 @@
             </w:tabs>
             <w:ind w:left="240"/>
             <w:rPr>
-              <w:rFonts w:ascii="Calibri" w:hAnsi="Calibri" w:eastAsia="Calibri" w:cs="Calibri"/>
+              <w:rFonts w:ascii="Calibri" w:eastAsia="Calibri" w:hAnsi="Calibri" w:cs="Calibri"/>
               <w:color w:val="000000"/>
               <w:sz w:val="22"/>
               <w:szCs w:val="22"/>
@@ -1670,11 +1727,6 @@
                 <w:color w:val="000000"/>
               </w:rPr>
               <w:tab/>
-            </w:r>
-            <w:r>
-              <w:rPr>
-                <w:color w:val="000000"/>
-              </w:rPr>
               <w:t>12</w:t>
             </w:r>
           </w:hyperlink>
@@ -1693,7 +1745,7 @@
             </w:tabs>
             <w:ind w:left="240"/>
             <w:rPr>
-              <w:rFonts w:ascii="Calibri" w:hAnsi="Calibri" w:eastAsia="Calibri" w:cs="Calibri"/>
+              <w:rFonts w:ascii="Calibri" w:eastAsia="Calibri" w:hAnsi="Calibri" w:cs="Calibri"/>
               <w:color w:val="000000"/>
               <w:sz w:val="22"/>
               <w:szCs w:val="22"/>
@@ -1711,11 +1763,6 @@
                 <w:color w:val="000000"/>
               </w:rPr>
               <w:tab/>
-            </w:r>
-            <w:r>
-              <w:rPr>
-                <w:color w:val="000000"/>
-              </w:rPr>
               <w:t>12</w:t>
             </w:r>
           </w:hyperlink>
@@ -1733,7 +1780,7 @@
               <w:tab w:val="right" w:pos="9062"/>
             </w:tabs>
             <w:rPr>
-              <w:rFonts w:ascii="Calibri" w:hAnsi="Calibri" w:eastAsia="Calibri" w:cs="Calibri"/>
+              <w:rFonts w:ascii="Calibri" w:eastAsia="Calibri" w:hAnsi="Calibri" w:cs="Calibri"/>
               <w:color w:val="000000"/>
               <w:sz w:val="22"/>
               <w:szCs w:val="22"/>
@@ -1751,11 +1798,6 @@
                 <w:color w:val="000000"/>
               </w:rPr>
               <w:tab/>
-            </w:r>
-            <w:r>
-              <w:rPr>
-                <w:color w:val="000000"/>
-              </w:rPr>
               <w:t>14</w:t>
             </w:r>
           </w:hyperlink>
@@ -1774,7 +1816,7 @@
             </w:tabs>
             <w:ind w:left="240"/>
             <w:rPr>
-              <w:rFonts w:ascii="Calibri" w:hAnsi="Calibri" w:eastAsia="Calibri" w:cs="Calibri"/>
+              <w:rFonts w:ascii="Calibri" w:eastAsia="Calibri" w:hAnsi="Calibri" w:cs="Calibri"/>
               <w:color w:val="000000"/>
               <w:sz w:val="22"/>
               <w:szCs w:val="22"/>
@@ -1792,11 +1834,6 @@
                 <w:color w:val="000000"/>
               </w:rPr>
               <w:tab/>
-            </w:r>
-            <w:r>
-              <w:rPr>
-                <w:color w:val="000000"/>
-              </w:rPr>
               <w:t>14</w:t>
             </w:r>
           </w:hyperlink>
@@ -1815,7 +1852,7 @@
             </w:tabs>
             <w:ind w:left="240"/>
             <w:rPr>
-              <w:rFonts w:ascii="Calibri" w:hAnsi="Calibri" w:eastAsia="Calibri" w:cs="Calibri"/>
+              <w:rFonts w:ascii="Calibri" w:eastAsia="Calibri" w:hAnsi="Calibri" w:cs="Calibri"/>
               <w:color w:val="000000"/>
               <w:sz w:val="22"/>
               <w:szCs w:val="22"/>
@@ -1833,11 +1870,6 @@
                 <w:color w:val="000000"/>
               </w:rPr>
               <w:tab/>
-            </w:r>
-            <w:r>
-              <w:rPr>
-                <w:color w:val="000000"/>
-              </w:rPr>
               <w:t>14</w:t>
             </w:r>
           </w:hyperlink>
@@ -1856,7 +1888,7 @@
             </w:tabs>
             <w:ind w:left="240"/>
             <w:rPr>
-              <w:rFonts w:ascii="Calibri" w:hAnsi="Calibri" w:eastAsia="Calibri" w:cs="Calibri"/>
+              <w:rFonts w:ascii="Calibri" w:eastAsia="Calibri" w:hAnsi="Calibri" w:cs="Calibri"/>
               <w:color w:val="000000"/>
               <w:sz w:val="22"/>
               <w:szCs w:val="22"/>
@@ -1874,11 +1906,6 @@
                 <w:color w:val="000000"/>
               </w:rPr>
               <w:tab/>
-            </w:r>
-            <w:r>
-              <w:rPr>
-                <w:color w:val="000000"/>
-              </w:rPr>
               <w:t>14</w:t>
             </w:r>
           </w:hyperlink>
@@ -1897,7 +1924,7 @@
             </w:tabs>
             <w:ind w:left="240"/>
             <w:rPr>
-              <w:rFonts w:ascii="Calibri" w:hAnsi="Calibri" w:eastAsia="Calibri" w:cs="Calibri"/>
+              <w:rFonts w:ascii="Calibri" w:eastAsia="Calibri" w:hAnsi="Calibri" w:cs="Calibri"/>
               <w:color w:val="000000"/>
               <w:sz w:val="22"/>
               <w:szCs w:val="22"/>
@@ -1915,11 +1942,6 @@
                 <w:color w:val="000000"/>
               </w:rPr>
               <w:tab/>
-            </w:r>
-            <w:r>
-              <w:rPr>
-                <w:color w:val="000000"/>
-              </w:rPr>
               <w:t>15</w:t>
             </w:r>
           </w:hyperlink>
@@ -1938,7 +1960,7 @@
             </w:tabs>
             <w:ind w:left="240"/>
             <w:rPr>
-              <w:rFonts w:ascii="Calibri" w:hAnsi="Calibri" w:eastAsia="Calibri" w:cs="Calibri"/>
+              <w:rFonts w:ascii="Calibri" w:eastAsia="Calibri" w:hAnsi="Calibri" w:cs="Calibri"/>
               <w:color w:val="000000"/>
               <w:sz w:val="22"/>
               <w:szCs w:val="22"/>
@@ -1956,11 +1978,6 @@
                 <w:color w:val="000000"/>
               </w:rPr>
               <w:tab/>
-            </w:r>
-            <w:r>
-              <w:rPr>
-                <w:color w:val="000000"/>
-              </w:rPr>
               <w:t>15</w:t>
             </w:r>
           </w:hyperlink>
@@ -1978,7 +1995,7 @@
               <w:tab w:val="right" w:pos="9062"/>
             </w:tabs>
             <w:rPr>
-              <w:rFonts w:ascii="Calibri" w:hAnsi="Calibri" w:eastAsia="Calibri" w:cs="Calibri"/>
+              <w:rFonts w:ascii="Calibri" w:eastAsia="Calibri" w:hAnsi="Calibri" w:cs="Calibri"/>
               <w:color w:val="000000"/>
               <w:sz w:val="22"/>
               <w:szCs w:val="22"/>
@@ -1996,11 +2013,6 @@
                 <w:color w:val="000000"/>
               </w:rPr>
               <w:tab/>
-            </w:r>
-            <w:r>
-              <w:rPr>
-                <w:color w:val="000000"/>
-              </w:rPr>
               <w:t>16</w:t>
             </w:r>
           </w:hyperlink>
@@ -2019,7 +2031,7 @@
             </w:tabs>
             <w:ind w:left="240"/>
             <w:rPr>
-              <w:rFonts w:ascii="Calibri" w:hAnsi="Calibri" w:eastAsia="Calibri" w:cs="Calibri"/>
+              <w:rFonts w:ascii="Calibri" w:eastAsia="Calibri" w:hAnsi="Calibri" w:cs="Calibri"/>
               <w:color w:val="000000"/>
               <w:sz w:val="22"/>
               <w:szCs w:val="22"/>
@@ -2037,11 +2049,6 @@
                 <w:color w:val="000000"/>
               </w:rPr>
               <w:tab/>
-            </w:r>
-            <w:r>
-              <w:rPr>
-                <w:color w:val="000000"/>
-              </w:rPr>
               <w:t>16</w:t>
             </w:r>
           </w:hyperlink>
@@ -2060,7 +2067,7 @@
             </w:tabs>
             <w:ind w:left="240"/>
             <w:rPr>
-              <w:rFonts w:ascii="Calibri" w:hAnsi="Calibri" w:eastAsia="Calibri" w:cs="Calibri"/>
+              <w:rFonts w:ascii="Calibri" w:eastAsia="Calibri" w:hAnsi="Calibri" w:cs="Calibri"/>
               <w:color w:val="000000"/>
               <w:sz w:val="22"/>
               <w:szCs w:val="22"/>
@@ -2078,11 +2085,6 @@
                 <w:color w:val="000000"/>
               </w:rPr>
               <w:tab/>
-            </w:r>
-            <w:r>
-              <w:rPr>
-                <w:color w:val="000000"/>
-              </w:rPr>
               <w:t>16</w:t>
             </w:r>
           </w:hyperlink>
@@ -2101,7 +2103,7 @@
             </w:tabs>
             <w:ind w:left="240"/>
             <w:rPr>
-              <w:rFonts w:ascii="Calibri" w:hAnsi="Calibri" w:eastAsia="Calibri" w:cs="Calibri"/>
+              <w:rFonts w:ascii="Calibri" w:eastAsia="Calibri" w:hAnsi="Calibri" w:cs="Calibri"/>
               <w:color w:val="000000"/>
               <w:sz w:val="22"/>
               <w:szCs w:val="22"/>
@@ -2119,11 +2121,6 @@
                 <w:color w:val="000000"/>
               </w:rPr>
               <w:tab/>
-            </w:r>
-            <w:r>
-              <w:rPr>
-                <w:color w:val="000000"/>
-              </w:rPr>
               <w:t>16</w:t>
             </w:r>
           </w:hyperlink>
@@ -2141,7 +2138,7 @@
               <w:tab w:val="right" w:pos="9062"/>
             </w:tabs>
             <w:rPr>
-              <w:rFonts w:ascii="Calibri" w:hAnsi="Calibri" w:eastAsia="Calibri" w:cs="Calibri"/>
+              <w:rFonts w:ascii="Calibri" w:eastAsia="Calibri" w:hAnsi="Calibri" w:cs="Calibri"/>
               <w:color w:val="000000"/>
               <w:sz w:val="22"/>
               <w:szCs w:val="22"/>
@@ -2159,11 +2156,6 @@
                 <w:color w:val="000000"/>
               </w:rPr>
               <w:tab/>
-            </w:r>
-            <w:r>
-              <w:rPr>
-                <w:color w:val="000000"/>
-              </w:rPr>
               <w:t>17</w:t>
             </w:r>
           </w:hyperlink>
@@ -2181,7 +2173,7 @@
               <w:tab w:val="right" w:pos="9062"/>
             </w:tabs>
             <w:rPr>
-              <w:rFonts w:ascii="Calibri" w:hAnsi="Calibri" w:eastAsia="Calibri" w:cs="Calibri"/>
+              <w:rFonts w:ascii="Calibri" w:eastAsia="Calibri" w:hAnsi="Calibri" w:cs="Calibri"/>
               <w:color w:val="000000"/>
               <w:sz w:val="22"/>
               <w:szCs w:val="22"/>
@@ -2199,11 +2191,6 @@
                 <w:color w:val="000000"/>
               </w:rPr>
               <w:tab/>
-            </w:r>
-            <w:r>
-              <w:rPr>
-                <w:color w:val="000000"/>
-              </w:rPr>
               <w:t>18</w:t>
             </w:r>
           </w:hyperlink>
@@ -2221,7 +2208,7 @@
               <w:tab w:val="right" w:pos="9062"/>
             </w:tabs>
             <w:rPr>
-              <w:rFonts w:ascii="Calibri" w:hAnsi="Calibri" w:eastAsia="Calibri" w:cs="Calibri"/>
+              <w:rFonts w:ascii="Calibri" w:eastAsia="Calibri" w:hAnsi="Calibri" w:cs="Calibri"/>
               <w:color w:val="000000"/>
               <w:sz w:val="22"/>
               <w:szCs w:val="22"/>
@@ -2239,11 +2226,6 @@
                 <w:color w:val="000000"/>
               </w:rPr>
               <w:tab/>
-            </w:r>
-            <w:r>
-              <w:rPr>
-                <w:color w:val="000000"/>
-              </w:rPr>
               <w:t>19</w:t>
             </w:r>
           </w:hyperlink>
@@ -2261,7 +2243,7 @@
               <w:tab w:val="right" w:pos="9062"/>
             </w:tabs>
             <w:rPr>
-              <w:rFonts w:ascii="Calibri" w:hAnsi="Calibri" w:eastAsia="Calibri" w:cs="Calibri"/>
+              <w:rFonts w:ascii="Calibri" w:eastAsia="Calibri" w:hAnsi="Calibri" w:cs="Calibri"/>
               <w:color w:val="000000"/>
               <w:sz w:val="22"/>
               <w:szCs w:val="22"/>
@@ -2279,11 +2261,6 @@
                 <w:color w:val="000000"/>
               </w:rPr>
               <w:tab/>
-            </w:r>
-            <w:r>
-              <w:rPr>
-                <w:color w:val="000000"/>
-              </w:rPr>
               <w:t>20</w:t>
             </w:r>
           </w:hyperlink>
@@ -2301,7 +2278,7 @@
               <w:tab w:val="right" w:pos="9062"/>
             </w:tabs>
             <w:rPr>
-              <w:rFonts w:ascii="Calibri" w:hAnsi="Calibri" w:eastAsia="Calibri" w:cs="Calibri"/>
+              <w:rFonts w:ascii="Calibri" w:eastAsia="Calibri" w:hAnsi="Calibri" w:cs="Calibri"/>
               <w:color w:val="000000"/>
               <w:sz w:val="22"/>
               <w:szCs w:val="22"/>
@@ -2319,11 +2296,6 @@
                 <w:color w:val="000000"/>
               </w:rPr>
               <w:tab/>
-            </w:r>
-            <w:r>
-              <w:rPr>
-                <w:color w:val="000000"/>
-              </w:rPr>
               <w:t>21</w:t>
             </w:r>
           </w:hyperlink>
@@ -2341,7 +2313,7 @@
               <w:tab w:val="right" w:pos="9062"/>
             </w:tabs>
             <w:rPr>
-              <w:rFonts w:ascii="Calibri" w:hAnsi="Calibri" w:eastAsia="Calibri" w:cs="Calibri"/>
+              <w:rFonts w:ascii="Calibri" w:eastAsia="Calibri" w:hAnsi="Calibri" w:cs="Calibri"/>
               <w:color w:val="000000"/>
               <w:sz w:val="22"/>
               <w:szCs w:val="22"/>
@@ -2359,11 +2331,6 @@
                 <w:color w:val="000000"/>
               </w:rPr>
               <w:tab/>
-            </w:r>
-            <w:r>
-              <w:rPr>
-                <w:color w:val="000000"/>
-              </w:rPr>
               <w:t>22</w:t>
             </w:r>
           </w:hyperlink>
@@ -2381,7 +2348,7 @@
               <w:tab w:val="right" w:pos="9062"/>
             </w:tabs>
             <w:rPr>
-              <w:rFonts w:ascii="Calibri" w:hAnsi="Calibri" w:eastAsia="Calibri" w:cs="Calibri"/>
+              <w:rFonts w:ascii="Calibri" w:eastAsia="Calibri" w:hAnsi="Calibri" w:cs="Calibri"/>
               <w:color w:val="000000"/>
               <w:sz w:val="22"/>
               <w:szCs w:val="22"/>
@@ -2399,11 +2366,6 @@
                 <w:color w:val="000000"/>
               </w:rPr>
               <w:tab/>
-            </w:r>
-            <w:r>
-              <w:rPr>
-                <w:color w:val="000000"/>
-              </w:rPr>
               <w:t>23</w:t>
             </w:r>
           </w:hyperlink>
@@ -2421,7 +2383,7 @@
               <w:tab w:val="right" w:pos="9062"/>
             </w:tabs>
             <w:rPr>
-              <w:rFonts w:ascii="Calibri" w:hAnsi="Calibri" w:eastAsia="Calibri" w:cs="Calibri"/>
+              <w:rFonts w:ascii="Calibri" w:eastAsia="Calibri" w:hAnsi="Calibri" w:cs="Calibri"/>
               <w:color w:val="000000"/>
               <w:sz w:val="22"/>
               <w:szCs w:val="22"/>
@@ -2439,11 +2401,6 @@
                 <w:color w:val="000000"/>
               </w:rPr>
               <w:tab/>
-            </w:r>
-            <w:r>
-              <w:rPr>
-                <w:color w:val="000000"/>
-              </w:rPr>
               <w:t>24</w:t>
             </w:r>
           </w:hyperlink>
@@ -2461,7 +2418,7 @@
           <w:headerReference w:type="even" r:id="rId6"/>
           <w:headerReference w:type="default" r:id="rId7"/>
           <w:headerReference w:type="first" r:id="rId8"/>
-          <w:pgSz w:w="11907" w:h="16840" w:orient="portrait"/>
+          <w:pgSz w:w="11907" w:h="16840"/>
           <w:pgMar w:top="1701" w:right="1134" w:bottom="1134" w:left="1701" w:header="720" w:footer="720" w:gutter="0"/>
           <w:pgNumType w:start="1"/>
           <w:cols w:space="720"/>
@@ -2488,7 +2445,7 @@
           <w:color w:val="000000"/>
         </w:rPr>
       </w:pPr>
-      <w:bookmarkStart w:name="_uebpuqog7hoa" w:colFirst="0" w:colLast="0" w:id="1"/>
+      <w:bookmarkStart w:id="1" w:name="_uebpuqog7hoa" w:colFirst="0" w:colLast="0"/>
       <w:bookmarkEnd w:id="1"/>
       <w:r>
         <w:rPr>
@@ -2497,6 +2454,7 @@
           <w:smallCaps/>
           <w:color w:val="000000"/>
         </w:rPr>
+        <w:lastRenderedPageBreak/>
         <w:t>1 INTRODUÇÃO</w:t>
       </w:r>
       <w:r>
@@ -2547,7 +2505,7 @@
                             <w:pPr>
                               <w:suppressAutoHyphens/>
                               <w:spacing w:line="1" w:lineRule="atLeast"/>
-                              <w:ind w:leftChars="-1" w:hanging="2" w:hangingChars="1"/>
+                              <w:ind w:leftChars="-1" w:hangingChars="1" w:hanging="2"/>
                               <w:textDirection w:val="btLr"/>
                               <w:textAlignment w:val="top"/>
                               <w:outlineLvl w:val="0"/>
@@ -2560,7 +2518,7 @@
                             <w:pPr>
                               <w:suppressAutoHyphens/>
                               <w:spacing w:line="1" w:lineRule="atLeast"/>
-                              <w:ind w:leftChars="-1" w:hanging="2" w:hangingChars="1"/>
+                              <w:ind w:leftChars="-1" w:hangingChars="1" w:hanging="2"/>
                               <w:textDirection w:val="btLr"/>
                               <w:textAlignment w:val="top"/>
                               <w:outlineLvl w:val="0"/>
@@ -2578,7 +2536,7 @@
               </wp:anchor>
             </w:drawing>
           </mc:Choice>
-          <mc:Fallback xmlns:a="http://schemas.openxmlformats.org/drawingml/2006/main">
+          <mc:Fallback xmlns:a="http://schemas.openxmlformats.org/drawingml/2006/main" xmlns:w16sdtfl="http://schemas.microsoft.com/office/word/2024/wordml/sdtformatlock" xmlns:w16sdtdh="http://schemas.microsoft.com/office/word/2020/wordml/sdtdatahash" xmlns:w16du="http://schemas.microsoft.com/office/word/2023/wordml/word16du" xmlns:w16="http://schemas.microsoft.com/office/word/2018/wordml" xmlns:w16cid="http://schemas.microsoft.com/office/word/2016/wordml/cid" xmlns:w16cex="http://schemas.microsoft.com/office/word/2018/wordml/cex" xmlns:oel="http://schemas.microsoft.com/office/2019/extlst" xmlns:am3d="http://schemas.microsoft.com/office/drawing/2017/model3d" xmlns:aink="http://schemas.microsoft.com/office/drawing/2016/ink" xmlns:cx8="http://schemas.microsoft.com/office/drawing/2016/5/14/chartex" xmlns:cx7="http://schemas.microsoft.com/office/drawing/2016/5/13/chartex" xmlns:cx6="http://schemas.microsoft.com/office/drawing/2016/5/12/chartex" xmlns:cx5="http://schemas.microsoft.com/office/drawing/2016/5/11/chartex" xmlns:cx4="http://schemas.microsoft.com/office/drawing/2016/5/10/chartex" xmlns:cx3="http://schemas.microsoft.com/office/drawing/2016/5/9/chartex" xmlns:cx2="http://schemas.microsoft.com/office/drawing/2015/10/21/chartex" xmlns:cx1="http://schemas.microsoft.com/office/drawing/2015/9/8/chartex">
             <w:pict w14:anchorId="39C9A96B">
               <v:shape id="Caixa de Texto 3" style="position:absolute;margin-left:440pt;margin-top:-54.4pt;width:15pt;height:20.4pt;z-index:251659264;visibility:visible;mso-wrap-style:square;mso-wrap-distance-left:9pt;mso-wrap-distance-top:0;mso-wrap-distance-right:9pt;mso-wrap-distance-bottom:0;mso-position-horizontal:absolute;mso-position-horizontal-relative:text;mso-position-vertical:absolute;mso-position-vertical-relative:text;v-text-anchor:top" o:spid="_x0000_s1027" stroked="f" type="#_x0000_t202" o:gfxdata="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" w14:anchorId="65E7CEEC">
                 <v:textbox>
@@ -2664,7 +2622,7 @@
                             <w:pPr>
                               <w:suppressAutoHyphens/>
                               <w:spacing w:line="1" w:lineRule="atLeast"/>
-                              <w:ind w:leftChars="-1" w:hanging="2" w:hangingChars="1"/>
+                              <w:ind w:leftChars="-1" w:hangingChars="1" w:hanging="2"/>
                               <w:textDirection w:val="btLr"/>
                               <w:textAlignment w:val="top"/>
                               <w:outlineLvl w:val="0"/>
@@ -2677,7 +2635,7 @@
                             <w:pPr>
                               <w:suppressAutoHyphens/>
                               <w:spacing w:line="1" w:lineRule="atLeast"/>
-                              <w:ind w:leftChars="-1" w:hanging="2" w:hangingChars="1"/>
+                              <w:ind w:leftChars="-1" w:hangingChars="1" w:hanging="2"/>
                               <w:textDirection w:val="btLr"/>
                               <w:textAlignment w:val="top"/>
                               <w:outlineLvl w:val="0"/>
@@ -2695,7 +2653,7 @@
               </wp:anchor>
             </w:drawing>
           </mc:Choice>
-          <mc:Fallback xmlns:a="http://schemas.openxmlformats.org/drawingml/2006/main">
+          <mc:Fallback xmlns:a="http://schemas.openxmlformats.org/drawingml/2006/main" xmlns:w16sdtfl="http://schemas.microsoft.com/office/word/2024/wordml/sdtformatlock" xmlns:w16sdtdh="http://schemas.microsoft.com/office/word/2020/wordml/sdtdatahash" xmlns:w16du="http://schemas.microsoft.com/office/word/2023/wordml/word16du" xmlns:w16="http://schemas.microsoft.com/office/word/2018/wordml" xmlns:w16cid="http://schemas.microsoft.com/office/word/2016/wordml/cid" xmlns:w16cex="http://schemas.microsoft.com/office/word/2018/wordml/cex" xmlns:oel="http://schemas.microsoft.com/office/2019/extlst" xmlns:am3d="http://schemas.microsoft.com/office/drawing/2017/model3d" xmlns:aink="http://schemas.microsoft.com/office/drawing/2016/ink" xmlns:cx8="http://schemas.microsoft.com/office/drawing/2016/5/14/chartex" xmlns:cx7="http://schemas.microsoft.com/office/drawing/2016/5/13/chartex" xmlns:cx6="http://schemas.microsoft.com/office/drawing/2016/5/12/chartex" xmlns:cx5="http://schemas.microsoft.com/office/drawing/2016/5/11/chartex" xmlns:cx4="http://schemas.microsoft.com/office/drawing/2016/5/10/chartex" xmlns:cx3="http://schemas.microsoft.com/office/drawing/2016/5/9/chartex" xmlns:cx2="http://schemas.microsoft.com/office/drawing/2015/10/21/chartex" xmlns:cx1="http://schemas.microsoft.com/office/drawing/2015/9/8/chartex">
             <w:pict w14:anchorId="32BFD1CD">
               <v:shape id="Caixa de Texto 2" style="position:absolute;margin-left:445pt;margin-top:-54.4pt;width:10pt;height:20.4pt;z-index:251660288;visibility:visible;mso-wrap-style:square;mso-wrap-distance-left:9pt;mso-wrap-distance-top:0;mso-wrap-distance-right:9pt;mso-wrap-distance-bottom:0;mso-position-horizontal:absolute;mso-position-horizontal-relative:text;mso-position-vertical:absolute;mso-position-vertical-relative:text;v-text-anchor:top" o:spid="_x0000_s1028" stroked="f" type="#_x0000_t202" o:gfxdata="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" w14:anchorId="7FCD1C33">
                 <v:textbox>
@@ -2809,7 +2767,21 @@
         <w:rPr>
           <w:color w:val="000000" w:themeColor="text1"/>
         </w:rPr>
-        <w:t xml:space="preserve"> e PostgreSQL como banco de dados, garantindo organização, segurança e escalabilidade. O objetivo principal é oferecer uma solução prática, segura e organizada para apoiar o cuidado com a pessoa idosa, promovendo mais tranquilidade aos familiares e maior profissionalização aos cuidadores.</w:t>
+        <w:t xml:space="preserve"> e </w:t>
+      </w:r>
+      <w:proofErr w:type="spellStart"/>
+      <w:r>
+        <w:rPr>
+          <w:color w:val="000000" w:themeColor="text1"/>
+        </w:rPr>
+        <w:t>PostgreSQL</w:t>
+      </w:r>
+      <w:proofErr w:type="spellEnd"/>
+      <w:r>
+        <w:rPr>
+          <w:color w:val="000000" w:themeColor="text1"/>
+        </w:rPr>
+        <w:t xml:space="preserve"> como banco de dados, garantindo organização, segurança e escalabilidade. O objetivo principal é oferecer uma solução prática, segura e organizada para apoiar o cuidado com a pessoa idosa, promovendo mais tranquilidade aos familiares e maior profissionalização aos cuidadores.</w:t>
       </w:r>
     </w:p>
     <w:p>
@@ -2830,7 +2802,7 @@
           <w:color w:val="000000"/>
         </w:rPr>
       </w:pPr>
-      <w:bookmarkStart w:name="_gihow8iyy5tk" w:colFirst="0" w:colLast="0" w:id="2"/>
+      <w:bookmarkStart w:id="2" w:name="_gihow8iyy5tk" w:colFirst="0" w:colLast="0"/>
       <w:bookmarkEnd w:id="2"/>
       <w:r>
         <w:br w:type="page"/>
@@ -2842,6 +2814,7 @@
           <w:smallCaps/>
           <w:color w:val="000000"/>
         </w:rPr>
+        <w:lastRenderedPageBreak/>
         <w:t>2</w:t>
       </w:r>
       <w:r>
@@ -2886,12 +2859,33 @@
           <w:right w:val="nil"/>
           <w:between w:val="nil"/>
         </w:pBdr>
-        <w:spacing w:before="240"/>
-        <w:jc w:val="both"/>
-        <w:rPr>
-          <w:color w:val="0070C0"/>
-        </w:rPr>
-      </w:pPr>
+        <w:rPr>
+          <w:smallCaps/>
+          <w:color w:val="000000"/>
+        </w:rPr>
+      </w:pPr>
+      <w:r>
+        <w:rPr>
+          <w:smallCaps/>
+          <w:color w:val="000000"/>
+        </w:rPr>
+        <w:t xml:space="preserve">2.1 TEMA </w:t>
+      </w:r>
+    </w:p>
+    <w:p>
+      <w:pPr>
+        <w:rPr>
+          <w:color w:val="000000" w:themeColor="text1"/>
+        </w:rPr>
+      </w:pPr>
+      <w:r>
+        <w:rPr>
+          <w:color w:val="000000" w:themeColor="text1"/>
+        </w:rPr>
+        <w:t>Sistema Web para auxiliar comunicação entre idosos, responsáveis e cuidadores, facilitando o contato e a organização dos cuidados.</w:t>
+      </w:r>
+      <w:bookmarkStart w:id="3" w:name="_wtwf8uuzt1zz" w:colFirst="0" w:colLast="0"/>
+      <w:bookmarkEnd w:id="3"/>
     </w:p>
     <w:p>
       <w:pPr>
@@ -2913,11 +2907,13 @@
           <w:smallCaps/>
           <w:color w:val="000000"/>
         </w:rPr>
-        <w:t xml:space="preserve">2.1 TEMA </w:t>
-      </w:r>
-    </w:p>
-    <w:p>
-      <w:pPr>
+        <w:t>2.2 FORMULAÇÃO DO PROBLEMA E HIPÓTESE</w:t>
+      </w:r>
+    </w:p>
+    <w:p>
+      <w:pPr>
+        <w:spacing w:before="240"/>
+        <w:jc w:val="both"/>
         <w:rPr>
           <w:color w:val="000000" w:themeColor="text1"/>
         </w:rPr>
@@ -2926,17 +2922,51 @@
         <w:rPr>
           <w:color w:val="000000" w:themeColor="text1"/>
         </w:rPr>
-        <w:t>Sistema Web para auxiliar comunicação entre idosos, responsáveis e cuidadores, facilitando o contato e a organização dos cuidados.</w:t>
-      </w:r>
-      <w:bookmarkStart w:name="_wtwf8uuzt1zz" w:colFirst="0" w:colLast="0" w:id="3"/>
-      <w:bookmarkEnd w:id="3"/>
-    </w:p>
-    <w:p>
-      <w:pPr>
+        <w:t>PROBLEMA: durante o levantamento de ideias para a escolha do tema do trabalho, a equipe identificou situações para as quais o seu trabalho poderia ser útil e aplicável.</w:t>
+      </w:r>
+      <w:r>
+        <w:rPr>
+          <w:color w:val="000000" w:themeColor="text1"/>
+        </w:rPr>
+        <w:t xml:space="preserve"> Em uma entrevista realizada com uma cuidadora de idosos, foram relatadas algumas dificuldades enfrentadas no dia a dia da profissão. Entre elas, destacam-se a dificuldade em transmitir confiança às famílias dos idosos, a dificuldade das famílias em encontrar cuidadores disponíveis e confiáveis e a ausência de um ambiente organizado onde seja possível procurar profissionais, visualizar suas experiências e avaliar seus serviços. Um lugar organizado onde a família poderia procurar cuidadores e ver suas experiencias.</w:t>
+      </w:r>
+    </w:p>
+    <w:p>
+      <w:pPr>
+        <w:spacing w:before="240"/>
+        <w:jc w:val="both"/>
+        <w:rPr>
+          <w:color w:val="000000" w:themeColor="text1"/>
+        </w:rPr>
+      </w:pPr>
+      <w:r>
+        <w:rPr>
+          <w:color w:val="000000" w:themeColor="text1"/>
+        </w:rPr>
+        <w:t xml:space="preserve">HIPÓTESE: </w:t>
+      </w:r>
+      <w:r>
+        <w:rPr>
+          <w:color w:val="000000" w:themeColor="text1"/>
+        </w:rPr>
+        <w:t>Acredita-se que o desenvolvimento de um sistema web que conecte responsáveis, idosos e cuidadores possa facilitar a busca por profissionais qualificados, aumentar a confiança entre as partes e oferecer um ambiente organizado para a divulgação de experiências, disponibilidade e informações dos cuidadores, contribuindo para melhorar a comunicação e a contratação desses profissionais.</w:t>
+      </w:r>
+    </w:p>
+    <w:p>
+      <w:pPr>
+        <w:jc w:val="both"/>
         <w:rPr>
           <w:color w:val="FF0000"/>
         </w:rPr>
       </w:pPr>
+      <w:bookmarkStart w:id="4" w:name="_4kon9gd1dvv5" w:colFirst="0" w:colLast="0"/>
+      <w:bookmarkEnd w:id="4"/>
+      <w:r>
+        <w:rPr>
+          <w:color w:val="FF0000"/>
+        </w:rPr>
+        <w:br w:type="page"/>
+      </w:r>
     </w:p>
     <w:p>
       <w:pPr>
@@ -2958,60 +2988,76 @@
           <w:smallCaps/>
           <w:color w:val="000000"/>
         </w:rPr>
-        <w:t>2.2 FORMULAÇÃO DO PROBLEMA E HIPÓTESE</w:t>
+        <w:lastRenderedPageBreak/>
+        <w:t>2.3 OBJETIVOS</w:t>
+      </w:r>
+    </w:p>
+    <w:p>
+      <w:pPr>
+        <w:jc w:val="both"/>
+      </w:pPr>
+      <w:r>
+        <w:rPr>
+          <w:b/>
+          <w:bCs/>
+        </w:rPr>
+        <w:t>2.3.1 Objetivo Geral</w:t>
       </w:r>
     </w:p>
     <w:p>
       <w:pPr>
         <w:spacing w:before="240"/>
         <w:jc w:val="both"/>
-        <w:rPr>
-          <w:color w:val="000000" w:themeColor="text1"/>
-        </w:rPr>
-      </w:pPr>
-      <w:r>
-        <w:rPr>
-          <w:color w:val="000000" w:themeColor="text1"/>
-        </w:rPr>
-        <w:t>PROBLEMA: durante o levantamento de ideias para a escolha do tema do trabalho, a equipe identificou situações para as quais o seu trabalho poderia ser útil e aplicável.</w:t>
-      </w:r>
-      <w:r>
-        <w:rPr>
-          <w:color w:val="000000" w:themeColor="text1"/>
-        </w:rPr>
-        <w:t xml:space="preserve"> Em uma entrevista realizada com uma cuidadora de idosos, foram relatadas algumas dificuldades enfrentadas no dia a dia da profissão. Entre elas, destacam-se a dificuldade em transmitir confiança às famílias dos idosos, a dificuldade das famílias em encontrar cuidadores disponíveis e confiáveis e a ausência de um ambiente organizado onde seja possível procurar profissionais, visualizar suas experiências e avaliar seus serviços. Um lugar organizado onde a família poderia procurar cuidadores e ver suas experiencias.</w:t>
+      </w:pPr>
+      <w:r>
+        <w:t>O Objetivo final deste trabalho é desenvolver um sistema fácil de usar e eficiente que facilite a vida de cuidadores e idosos/</w:t>
+      </w:r>
+      <w:r>
+        <w:t>responsáveis</w:t>
+      </w:r>
+      <w:r>
+        <w:t>.</w:t>
+      </w:r>
+    </w:p>
+    <w:p>
+      <w:pPr>
+        <w:jc w:val="both"/>
+      </w:pPr>
+      <w:r>
+        <w:rPr>
+          <w:b/>
+          <w:bCs/>
+        </w:rPr>
+        <w:t>2.3.2 Objetivos Específicos</w:t>
       </w:r>
     </w:p>
     <w:p>
       <w:pPr>
         <w:spacing w:before="240"/>
-        <w:jc w:val="both"/>
-        <w:rPr>
-          <w:color w:val="000000" w:themeColor="text1"/>
-        </w:rPr>
-      </w:pPr>
-      <w:r>
-        <w:rPr>
-          <w:color w:val="000000" w:themeColor="text1"/>
-        </w:rPr>
-        <w:t xml:space="preserve">HIPÓTESE: </w:t>
-      </w:r>
-      <w:r>
-        <w:rPr>
-          <w:color w:val="000000" w:themeColor="text1"/>
-        </w:rPr>
-        <w:t>Acredita-se que o desenvolvimento de um sistema web que conecte responsáveis, idosos e cuidadores possa facilitar a busca por profissionais qualificados, aumentar a confiança entre as partes e oferecer um ambiente organizado para a divulgação de experiências, disponibilidade e informações dos cuidadores, contribuindo para melhorar a comunicação e a contratação desses profissionais.</w:t>
-      </w:r>
-    </w:p>
-    <w:p>
-      <w:pPr>
-        <w:jc w:val="both"/>
-        <w:rPr>
-          <w:color w:val="FF0000"/>
-        </w:rPr>
-      </w:pPr>
-      <w:bookmarkStart w:name="_4kon9gd1dvv5" w:colFirst="0" w:colLast="0" w:id="4"/>
-      <w:bookmarkEnd w:id="4"/>
+      </w:pPr>
+      <w:r>
+        <w:t>• Desenvolver um sistema web para cadastro de cuidadores, responsáveis e idosos.</w:t>
+      </w:r>
+      <w:r>
+        <w:br/>
+        <w:t>• Permitir que cuidadores informem experiência, cidade, valor por hora e disponibilidade de horários.</w:t>
+      </w:r>
+      <w:r>
+        <w:br/>
+        <w:t>• Criar um sistema de busca que possibilite aos responsáveis encontrar cuidadores utilizando filtros específicos.</w:t>
+      </w:r>
+      <w:r>
+        <w:br/>
+        <w:t>• Desenvolver uma funcionalidade para vincular cuidadores aos idosos após a contratação.</w:t>
+      </w:r>
+      <w:r>
+        <w:br/>
+        <w:t>• Implementar uma agenda de medicamentos para auxiliar no controle de remédios, doses e horários.</w:t>
+      </w:r>
+      <w:r>
+        <w:br/>
+        <w:t>• Utilizar Java no desenvolvimento do sistema e PostgreSQL para armazenamento dos dados.</w:t>
+      </w:r>
     </w:p>
     <w:p>
       <w:pPr>
@@ -3033,24 +3079,7 @@
           <w:smallCaps/>
           <w:color w:val="000000"/>
         </w:rPr>
-        <w:t>2.3 OBJETIVOS</w:t>
-      </w:r>
-    </w:p>
-    <w:p>
-      <w:pPr>
-        <w:jc w:val="both"/>
-      </w:pPr>
-    </w:p>
-    <w:p>
-      <w:pPr>
-        <w:jc w:val="both"/>
-      </w:pPr>
-      <w:r>
-        <w:rPr>
-          <w:b/>
-          <w:bCs/>
-        </w:rPr>
-        <w:t>2.3.1 Objetivo Geral</w:t>
+        <w:t>2.4 JUSTIFICATIVA</w:t>
       </w:r>
     </w:p>
     <w:p>
@@ -3059,72 +3088,40 @@
         <w:jc w:val="both"/>
       </w:pPr>
       <w:r>
-        <w:t>O Objetivo final deste trabalho é desenvolver um sistema fácil de usar e eficiente que facilite a vida de cuidadores e idosos/</w:t>
-      </w:r>
-      <w:r>
-        <w:t>responsáveis</w:t>
-      </w:r>
-      <w:r>
-        <w:t>.</w:t>
-      </w:r>
-    </w:p>
-    <w:p>
-      <w:pPr>
+        <w:t>O crescimento da população idosa tem aumentado a necessidade de cuidados especializados e acompanhamento diário. Muitas famílias enfrentam dificuldades para encontrar cuidadores de idosos confiáveis e qualificados, além de não possuírem um ambiente organizado onde possam buscar profissionais e verificar suas experiências e disponibilidade. Da mesma forma, cuidadores também enfrentam dificuldades para divulgar seus serviços e conquistar a confiança das famílias.</w:t>
+      </w:r>
+    </w:p>
+    <w:p>
+      <w:pPr>
+        <w:spacing w:before="240"/>
+        <w:jc w:val="both"/>
+      </w:pPr>
+      <w:r>
+        <w:t>Diante desse cenário, torna-se relevante o desenvolvimento de um sistema que facilite a comunicação e a conexão entre responsáveis, idosos e cuidadores. A criação de uma plataforma digital pode contribuir para tornar esse processo mais organizado, seguro e acessível, permitindo que responsáveis encontrem profissionais de forma mais prática e que cuidadores possam apresentar suas experiências e disponibilidade de trabalho.</w:t>
+      </w:r>
+    </w:p>
+    <w:p>
+      <w:pPr>
+        <w:jc w:val="both"/>
+        <w:rPr>
+          <w:color w:val="0070C0"/>
+        </w:rPr>
+      </w:pPr>
+    </w:p>
+    <w:p>
+      <w:pPr>
+        <w:tabs>
+          <w:tab w:val="center" w:pos="4972"/>
+          <w:tab w:val="right" w:pos="9224"/>
+        </w:tabs>
+        <w:spacing w:before="120" w:after="120"/>
         <w:jc w:val="both"/>
         <w:rPr>
           <w:color w:val="FF0000"/>
         </w:rPr>
       </w:pPr>
-    </w:p>
-    <w:p>
-      <w:pPr>
-        <w:jc w:val="both"/>
-      </w:pPr>
-      <w:r>
-        <w:rPr>
-          <w:b/>
-          <w:bCs/>
-        </w:rPr>
-        <w:t>2.3.2 Objetivos Específicos</w:t>
-      </w:r>
-    </w:p>
-    <w:p>
-      <w:pPr>
-        <w:spacing w:before="240"/>
-      </w:pPr>
-      <w:r>
-        <w:t>• Desenvolver um sistema web para cadastro de cuidadores, responsáveis e idosos.</w:t>
-      </w:r>
-      <w:r>
-        <w:br/>
-      </w:r>
-      <w:r>
-        <w:t>• Permitir que cuidadores informem experiência, cidade, valor por hora e disponibilidade de horários.</w:t>
-      </w:r>
-      <w:r>
-        <w:br/>
-      </w:r>
-      <w:r>
-        <w:t>• Criar um sistema de busca que possibilite aos responsáveis encontrar cuidadores utilizando filtros específicos.</w:t>
-      </w:r>
-      <w:r>
-        <w:br/>
-      </w:r>
-      <w:r>
-        <w:t>• Desenvolver uma funcionalidade para vincular cuidadores aos idosos após a contratação.</w:t>
-      </w:r>
-      <w:r>
-        <w:br/>
-      </w:r>
-      <w:r>
-        <w:t>• Implementar uma agenda de medicamentos para auxiliar no controle de remédios, doses e horários.</w:t>
-      </w:r>
-      <w:r>
-        <w:br/>
-      </w:r>
-      <w:r>
-        <w:t>• Utilizar Java no desenvolvimento do sistema e PostgreSQL para armazenamento dos dados.</w:t>
-      </w:r>
+      <w:bookmarkStart w:id="5" w:name="_a242hfqy1pb1" w:colFirst="0" w:colLast="0"/>
+      <w:bookmarkEnd w:id="5"/>
     </w:p>
     <w:p>
       <w:pPr>
@@ -3146,49 +3143,18 @@
           <w:smallCaps/>
           <w:color w:val="000000"/>
         </w:rPr>
-        <w:t>2.4 JUSTIFICATIVA</w:t>
-      </w:r>
-    </w:p>
-    <w:p>
-      <w:pPr>
-        <w:spacing w:before="240"/>
-        <w:jc w:val="both"/>
-      </w:pPr>
-      <w:r>
-        <w:t>O crescimento da população idosa tem aumentado a necessidade de cuidados especializados e acompanhamento diário. Muitas famílias enfrentam dificuldades para encontrar cuidadores de idosos confiáveis e qualificados, além de não possuírem um ambiente organizado onde possam buscar profissionais e verificar suas experiências e disponibilidade. Da mesma forma, cuidadores também enfrentam dificuldades para divulgar seus serviços e conquistar a confiança das famílias.</w:t>
-      </w:r>
-    </w:p>
-    <w:p>
-      <w:pPr>
-        <w:spacing w:before="240"/>
-        <w:jc w:val="both"/>
-      </w:pPr>
-      <w:r>
-        <w:t>Diante desse cenário, torna-se relevante o desenvolvimento de um sistema que facilite a comunicação e a conexão entre responsáveis, idosos e cuidadores. A criação de uma plataforma digital pode contribuir para tornar esse processo mais organizado, seguro e acessível, permitindo que responsáveis encontrem profissionais de forma mais prática e que cuidadores possam apresentar suas experiências e disponibilidade de trabalho.</w:t>
-      </w:r>
-    </w:p>
-    <w:p>
-      <w:pPr>
-        <w:jc w:val="both"/>
-        <w:rPr>
-          <w:color w:val="0070C0"/>
-        </w:rPr>
-      </w:pPr>
-    </w:p>
-    <w:p>
-      <w:pPr>
-        <w:tabs>
-          <w:tab w:val="center" w:pos="4972"/>
-          <w:tab w:val="right" w:pos="9224"/>
-        </w:tabs>
-        <w:spacing w:before="120" w:after="120"/>
-        <w:jc w:val="both"/>
-        <w:rPr>
-          <w:color w:val="FF0000"/>
-        </w:rPr>
-      </w:pPr>
-      <w:bookmarkStart w:name="_a242hfqy1pb1" w:colFirst="0" w:colLast="0" w:id="5"/>
-      <w:bookmarkEnd w:id="5"/>
+        <w:t>2.5 PÚBLICO DE INTERESSE</w:t>
+      </w:r>
+    </w:p>
+    <w:p>
+      <w:pPr>
+        <w:keepNext/>
+      </w:pPr>
+      <w:bookmarkStart w:id="6" w:name="_vu5456qxwj1m" w:colFirst="0" w:colLast="0"/>
+      <w:bookmarkEnd w:id="6"/>
+      <w:r>
+        <w:t>O sistema é direcionado principalmente a cuidadores de idosos, bem como aos próprios idosos e seus familiares.</w:t>
+      </w:r>
     </w:p>
     <w:p>
       <w:pPr>
@@ -3208,40 +3174,51 @@
       <w:r>
         <w:rPr>
           <w:smallCaps/>
-          <w:color w:val="000000"/>
-        </w:rPr>
-        <w:t>2.5 PÚBLICO DE INTERESSE</w:t>
-      </w:r>
-    </w:p>
-    <w:p>
-      <w:pPr>
-        <w:jc w:val="both"/>
-        <w:rPr>
-          <w:color w:val="FF0000"/>
-        </w:rPr>
-      </w:pPr>
-      <w:r>
-        <w:rPr>
-          <w:color w:val="0070C0"/>
-        </w:rPr>
-        <w:t>Identifique os perfis das pessoas ou o segmento de mercado que deverá utilizar o produto resultante deste trabalho. Por exemplo: estudantes do Ensino Médio; pessoas com deficiência auditiva; etc</w:t>
-      </w:r>
-      <w:r>
-        <w:rPr>
-          <w:color w:val="FF0000"/>
-        </w:rPr>
-        <w:t>.</w:t>
-      </w:r>
-    </w:p>
-    <w:p>
-      <w:pPr>
-        <w:jc w:val="both"/>
-        <w:rPr>
-          <w:color w:val="FF0000"/>
-        </w:rPr>
-      </w:pPr>
-      <w:bookmarkStart w:name="_vu5456qxwj1m" w:colFirst="0" w:colLast="0" w:id="6"/>
-      <w:bookmarkEnd w:id="6"/>
+          <w:color w:val="000000" w:themeColor="text1"/>
+        </w:rPr>
+        <w:t xml:space="preserve">2.6 REFERENCIAL TEÓRICO </w:t>
+      </w:r>
+    </w:p>
+    <w:p>
+      <w:pPr>
+        <w:spacing w:before="240"/>
+        <w:jc w:val="both"/>
+      </w:pPr>
+      <w:r>
+        <w:t>O crescimento da população idosa tem aumentado a demanda por soluções que auxiliem no cuidado, acompanhamento e organização da rotina dessas pessoas. Com o avanço da expectativa de vida, torna cada vez mais comum que familiares ou profissionais assumam o papel de cuidadores, sendo necessário o uso de ferramentas que facilitem a gestão das informações relacionadas à saúde, medicamentos e atividades diárias do idoso.</w:t>
+      </w:r>
+    </w:p>
+    <w:p>
+      <w:pPr>
+        <w:spacing w:before="240"/>
+        <w:jc w:val="both"/>
+      </w:pPr>
+      <w:r>
+        <w:t>De acordo com Marek et al., o gerenciamento de medicamentos em idosos é um processo complexo, pois envolve diversos fatores como dificuldades cognitivas, problemas de visão e a presença de múltiplos medicamentos prescritos. Esses fatores podem levar a erros na administração dos remédios quando não há um acompanhamento adequado, principalmente quando o idoso vive sozinho ou depende de diferentes cuidadores ao lon</w:t>
+      </w:r>
+      <w:r>
+        <w:t>go do dia (MAREK et al., 2008).</w:t>
+      </w:r>
+    </w:p>
+    <w:p>
+      <w:pPr>
+        <w:spacing w:before="240"/>
+        <w:jc w:val="both"/>
+      </w:pPr>
+      <w:r>
+        <w:t>Nesse contexto, o uso de tecnologias digitais tem sido cada vez mais explorado para apoiar o cuidado com pessoas idosas. Sistemas computacionais podem auxiliar no monitoramento da saúde, no controle de medicamentos e na comunicação entre cuidadores e familiares. Estudos recentes também apontam que soluções tecnológicas voltadas à saúde podem contribuir para melhorar a adesão ao tratamento e reduzir o estresse dos cuidadores, ao oferecer lembretes, registros e acompanhamento das rotinas de cuidado (ZHOU, 2025).</w:t>
+      </w:r>
+    </w:p>
+    <w:p>
+      <w:pPr>
+        <w:spacing w:before="240"/>
+        <w:jc w:val="both"/>
+      </w:pPr>
+      <w:r>
+        <w:t>Um exemplo de trabalho relacionado é o aplicativo DoseApp, que foi desenvolvido com o objetivo de auxiliar cuidadores e familiares no gerenciamento de medicamentos e na organização da rotina diária de idosos. O sistema permite registrar horários, dosagens e outras informações importantes, reduzindo o risco de perda de informações quando há revezamento entre diferentes cuidadores (ROSTIROLLA; SOUZA, 2022)</w:t>
+      </w:r>
+      <w:bookmarkStart w:id="7" w:name="_ctqy09cxo6nw"/>
+      <w:bookmarkEnd w:id="7"/>
     </w:p>
     <w:p>
       <w:pPr>
@@ -3253,685 +3230,71 @@
           <w:right w:val="nil"/>
           <w:between w:val="nil"/>
         </w:pBdr>
-        <w:rPr>
-          <w:smallCaps/>
-          <w:color w:val="000000"/>
-        </w:rPr>
-      </w:pPr>
-      <w:r>
-        <w:rPr>
-          <w:smallCaps w:val="1"/>
-          <w:color w:val="000000" w:themeColor="text1" w:themeTint="FF" w:themeShade="FF"/>
-        </w:rPr>
-        <w:t xml:space="preserve">2.6 REFERENCIAL TEÓRICO </w:t>
-      </w:r>
-    </w:p>
-    <w:p>
-      <w:pPr>
-        <w:spacing w:before="240" w:beforeAutospacing="off" w:after="240" w:afterAutospacing="off"/>
-        <w:jc w:val="both"/>
-        <w:rPr>
-          <w:noProof w:val="0"/>
-          <w:lang w:val="pt-BR"/>
-        </w:rPr>
-      </w:pPr>
-      <w:r>
-        <w:rPr>
-          <w:rFonts w:ascii="Times New Roman" w:hAnsi="Times New Roman" w:eastAsia="Times New Roman" w:cs="Times New Roman"/>
-          <w:noProof w:val="0"/>
-          <w:color w:val="auto"/>
-          <w:sz w:val="24"/>
-          <w:szCs w:val="24"/>
-          <w:lang w:val="pt-BR" w:eastAsia="pt-BR" w:bidi="ar-SA"/>
-        </w:rPr>
-        <w:t>O</w:t>
-      </w:r>
-      <w:r>
-        <w:rPr>
-          <w:rFonts w:ascii="Times New Roman" w:hAnsi="Times New Roman" w:eastAsia="Times New Roman" w:cs="Times New Roman"/>
-          <w:noProof w:val="0"/>
-          <w:color w:val="auto"/>
-          <w:sz w:val="24"/>
-          <w:szCs w:val="24"/>
-          <w:lang w:val="pt-BR" w:eastAsia="pt-BR" w:bidi="ar-SA"/>
-        </w:rPr>
-        <w:t xml:space="preserve"> crescimento da população idosa tem aumentado a demanda por soluções que auxiliem no cuidado, acompanhamento e organização da rotina dessas pessoas. Com o avanço da expectativa de vida, torna cada vez mais comum que familiares ou profissionais assumam o papel de cuidadores, sendo necessário o uso de ferramentas que facilitem a gestão das informações relacionadas à saúde, medicamentos e atividades diárias do idoso.</w:t>
-      </w:r>
-    </w:p>
-    <w:p>
-      <w:pPr>
-        <w:spacing w:before="240" w:beforeAutospacing="off" w:after="240" w:afterAutospacing="off"/>
-        <w:jc w:val="both"/>
-        <w:rPr>
-          <w:noProof w:val="0"/>
-          <w:lang w:val="pt-BR"/>
-        </w:rPr>
-      </w:pPr>
-      <w:r>
-        <w:rPr>
-          <w:rFonts w:ascii="Times New Roman" w:hAnsi="Times New Roman" w:eastAsia="Times New Roman" w:cs="Times New Roman"/>
-          <w:noProof w:val="0"/>
-          <w:color w:val="auto"/>
-          <w:sz w:val="24"/>
-          <w:szCs w:val="24"/>
-          <w:lang w:val="pt-BR" w:eastAsia="pt-BR" w:bidi="ar-SA"/>
-        </w:rPr>
-        <w:t>De acordo com Marek et al., o gerenciamento de medicamentos em idosos é um processo complexo, pois envolve diversos fatores como dificuldades cognitivas, problemas de visão e a presença de múltipl</w:t>
-      </w:r>
-      <w:r>
-        <w:rPr>
-          <w:rFonts w:ascii="Times New Roman" w:hAnsi="Times New Roman" w:eastAsia="Times New Roman" w:cs="Times New Roman"/>
-          <w:noProof w:val="0"/>
-          <w:color w:val="auto"/>
-          <w:sz w:val="24"/>
-          <w:szCs w:val="24"/>
-          <w:lang w:val="pt-BR" w:eastAsia="pt-BR" w:bidi="ar-SA"/>
-        </w:rPr>
-        <w:t>os medicamentos prescritos. Esses fatores podem levar a erros na administração dos remédios quando não há um acompanhamento adequado, principalmente quando o idoso vive sozinho ou depende de diferentes cuidadores ao longo do dia (MAREK et al., 2008</w:t>
-      </w:r>
-      <w:r>
-        <w:rPr>
-          <w:rFonts w:ascii="Times New Roman" w:hAnsi="Times New Roman" w:eastAsia="Times New Roman" w:cs="Times New Roman"/>
-          <w:noProof w:val="0"/>
-          <w:color w:val="auto"/>
-          <w:sz w:val="24"/>
-          <w:szCs w:val="24"/>
-          <w:lang w:val="pt-BR" w:eastAsia="pt-BR" w:bidi="ar-SA"/>
-        </w:rPr>
-        <w:t>) .</w:t>
-      </w:r>
-    </w:p>
-    <w:p>
-      <w:pPr>
-        <w:spacing w:before="240" w:beforeAutospacing="off" w:after="240" w:afterAutospacing="off"/>
-        <w:jc w:val="both"/>
-        <w:rPr>
-          <w:noProof w:val="0"/>
-          <w:lang w:val="pt-BR"/>
-        </w:rPr>
-      </w:pPr>
-    </w:p>
-    <w:p>
-      <w:pPr>
-        <w:spacing w:before="240" w:beforeAutospacing="off" w:after="240" w:afterAutospacing="off"/>
-        <w:jc w:val="both"/>
-        <w:rPr>
-          <w:noProof w:val="0"/>
-          <w:lang w:val="pt-BR"/>
-        </w:rPr>
-      </w:pPr>
-      <w:r>
-        <w:rPr>
-          <w:rFonts w:ascii="Times New Roman" w:hAnsi="Times New Roman" w:eastAsia="Times New Roman" w:cs="Times New Roman"/>
-          <w:noProof w:val="0"/>
-          <w:color w:val="auto"/>
-          <w:sz w:val="24"/>
-          <w:szCs w:val="24"/>
-          <w:lang w:val="pt-BR" w:eastAsia="pt-BR" w:bidi="ar-SA"/>
-        </w:rPr>
-        <w:t>Nesse con</w:t>
-      </w:r>
-      <w:r>
-        <w:rPr>
-          <w:rFonts w:ascii="Times New Roman" w:hAnsi="Times New Roman" w:eastAsia="Times New Roman" w:cs="Times New Roman"/>
-          <w:noProof w:val="0"/>
-          <w:color w:val="auto"/>
-          <w:sz w:val="24"/>
-          <w:szCs w:val="24"/>
-          <w:lang w:val="pt-BR" w:eastAsia="pt-BR" w:bidi="ar-SA"/>
-        </w:rPr>
-        <w:t>texto, o uso de tecnologias digitais tem sido cada vez mais explorado para apoiar o cuidado com pessoas idosas. Sistemas computacionais podem auxiliar no monitoramento da saúde, no controle de medicamentos e na comunicação entre cuidadores e familiares. Estudos recentes também apontam que soluções tecnológicas voltadas à saúde podem contribuir para melhorar a adesão ao tratamento e reduzir o estresse dos cuidadores, ao oferecer lembretes, registros e acompanhamento das rotinas de cuidado (ZHOU, 2025).</w:t>
-      </w:r>
-    </w:p>
-    <w:p>
-      <w:pPr>
-        <w:spacing w:before="240" w:beforeAutospacing="off" w:after="240" w:afterAutospacing="off"/>
-        <w:jc w:val="both"/>
-        <w:rPr>
-          <w:noProof w:val="0"/>
-          <w:lang w:val="pt-BR"/>
-        </w:rPr>
-      </w:pPr>
-      <w:r>
-        <w:rPr>
-          <w:rFonts w:ascii="Times New Roman" w:hAnsi="Times New Roman" w:eastAsia="Times New Roman" w:cs="Times New Roman"/>
-          <w:noProof w:val="0"/>
-          <w:color w:val="auto"/>
-          <w:sz w:val="24"/>
-          <w:szCs w:val="24"/>
-          <w:lang w:val="pt-BR" w:eastAsia="pt-BR" w:bidi="ar-SA"/>
-        </w:rPr>
-        <w:t xml:space="preserve">Um exemplo de trabalho relacionado é o aplicativo </w:t>
-      </w:r>
-      <w:r>
-        <w:rPr>
-          <w:rFonts w:ascii="Times New Roman" w:hAnsi="Times New Roman" w:eastAsia="Times New Roman" w:cs="Times New Roman"/>
-          <w:noProof w:val="0"/>
-          <w:color w:val="auto"/>
-          <w:sz w:val="24"/>
-          <w:szCs w:val="24"/>
-          <w:lang w:val="pt-BR" w:eastAsia="pt-BR" w:bidi="ar-SA"/>
-        </w:rPr>
-        <w:t>DoseApp</w:t>
-      </w:r>
-      <w:r>
-        <w:rPr>
-          <w:rFonts w:ascii="Times New Roman" w:hAnsi="Times New Roman" w:eastAsia="Times New Roman" w:cs="Times New Roman"/>
-          <w:noProof w:val="0"/>
-          <w:color w:val="auto"/>
-          <w:sz w:val="24"/>
-          <w:szCs w:val="24"/>
-          <w:lang w:val="pt-BR" w:eastAsia="pt-BR" w:bidi="ar-SA"/>
-        </w:rPr>
-        <w:t>, que foi desenvolvido com o objetivo de auxiliar cuidadores e familiares no gerenciamento de medicamentos e na organização da rotina diária de idosos. O sistema permite registrar horários, dosagens e outras informações importantes, reduzindo o risco de perda de informações quando há revezamento entre diferentes cuidadores (ROSTIROLLA; SOUZA, 2022)</w:t>
-      </w:r>
-      <w:bookmarkStart w:name="_ctqy09cxo6nw" w:id="7"/>
-      <w:bookmarkEnd w:id="7"/>
-    </w:p>
-    <w:p>
-      <w:pPr>
-        <w:keepNext w:val="1"/>
-        <w:pBdr>
-          <w:top w:val="nil" w:color="FF000000" w:sz="0" w:space="0"/>
-          <w:left w:val="nil" w:color="FF000000" w:sz="0" w:space="0"/>
-          <w:bottom w:val="nil" w:color="FF000000" w:sz="0" w:space="0"/>
-          <w:right w:val="nil" w:color="FF000000" w:sz="0" w:space="0"/>
-          <w:between w:val="nil" w:color="FF000000" w:sz="0" w:space="0"/>
-        </w:pBdr>
-      </w:pPr>
-      <w:r>
-        <w:rPr>
-          <w:rFonts w:ascii="Times New Roman" w:hAnsi="Times New Roman" w:eastAsia="Times New Roman" w:cs="Times New Roman"/>
-          <w:color w:val="auto"/>
-          <w:sz w:val="24"/>
-          <w:szCs w:val="24"/>
-          <w:lang w:eastAsia="pt-BR" w:bidi="ar-SA"/>
-        </w:rPr>
+      </w:pPr>
+      <w:r>
+        <w:lastRenderedPageBreak/>
         <w:t>2.7 METODOLOGIA DE TRABALHO</w:t>
       </w:r>
     </w:p>
     <w:p>
       <w:pPr>
-        <w:spacing w:before="240" w:beforeAutospacing="off" w:after="240" w:afterAutospacing="off" w:line="360" w:lineRule="auto"/>
-        <w:ind w:left="0" w:right="0"/>
-        <w:jc w:val="both"/>
-        <w:rPr>
-          <w:rFonts w:ascii="Times New Roman" w:hAnsi="Times New Roman" w:eastAsia="Times New Roman" w:cs="Times New Roman"/>
-          <w:noProof w:val="0"/>
-          <w:color w:val="auto"/>
-          <w:sz w:val="24"/>
-          <w:szCs w:val="24"/>
-          <w:lang w:val="pt-BR" w:eastAsia="pt-BR" w:bidi="ar-SA"/>
-        </w:rPr>
-      </w:pPr>
-      <w:r>
-        <w:rPr>
-          <w:rFonts w:ascii="Times New Roman" w:hAnsi="Times New Roman" w:eastAsia="Times New Roman" w:cs="Times New Roman"/>
-          <w:noProof w:val="0"/>
-          <w:color w:val="auto"/>
-          <w:sz w:val="24"/>
-          <w:szCs w:val="24"/>
-          <w:lang w:val="pt-BR" w:eastAsia="pt-BR" w:bidi="ar-SA"/>
-        </w:rPr>
-        <w:t xml:space="preserve">Para o desenvolvimento do projeto </w:t>
-      </w:r>
-      <w:r>
-        <w:rPr>
-          <w:rFonts w:ascii="Times New Roman" w:hAnsi="Times New Roman" w:eastAsia="Times New Roman" w:cs="Times New Roman"/>
-          <w:noProof w:val="0"/>
-          <w:color w:val="auto"/>
-          <w:sz w:val="24"/>
-          <w:szCs w:val="24"/>
-          <w:lang w:val="pt-BR" w:eastAsia="pt-BR" w:bidi="ar-SA"/>
-        </w:rPr>
-        <w:t>ElderConnect</w:t>
-      </w:r>
-      <w:r>
-        <w:rPr>
-          <w:rFonts w:ascii="Times New Roman" w:hAnsi="Times New Roman" w:eastAsia="Times New Roman" w:cs="Times New Roman"/>
-          <w:noProof w:val="0"/>
-          <w:color w:val="auto"/>
-          <w:sz w:val="24"/>
-          <w:szCs w:val="24"/>
-          <w:lang w:val="pt-BR" w:eastAsia="pt-BR" w:bidi="ar-SA"/>
-        </w:rPr>
-        <w:t>, será adotada uma abordagem baseada nas etapas de análise, planejamento, desenvolvimento e testes do sistema. O objetivo dessa metodologia é garantir que o sistema seja construído de forma organizada, atendendo às necessidades identificadas durante o levantamento de informações e entrevistas realizadas.</w:t>
-      </w:r>
-    </w:p>
-    <w:p>
-      <w:pPr>
-        <w:spacing w:before="240" w:beforeAutospacing="off" w:after="240" w:afterAutospacing="off" w:line="360" w:lineRule="auto"/>
-        <w:ind w:left="0" w:right="0"/>
-        <w:jc w:val="both"/>
-        <w:rPr>
-          <w:noProof w:val="0"/>
-          <w:lang w:val="pt-BR"/>
-        </w:rPr>
-      </w:pPr>
-      <w:r>
-        <w:rPr>
-          <w:rFonts w:ascii="Times New Roman" w:hAnsi="Times New Roman" w:eastAsia="Times New Roman" w:cs="Times New Roman"/>
-          <w:noProof w:val="0"/>
-          <w:color w:val="auto"/>
-          <w:sz w:val="24"/>
-          <w:szCs w:val="24"/>
-          <w:lang w:val="pt-BR" w:eastAsia="pt-BR" w:bidi="ar-SA"/>
-        </w:rPr>
+        <w:spacing w:before="240"/>
+        <w:jc w:val="both"/>
+      </w:pPr>
+      <w:r>
+        <w:t>Para o desenvolvimento do projeto ElderConnect, será adotada uma abordagem baseada nas etapas de análise, planejamento, desenvolvimento e testes do sistema. O objetivo dessa metodologia é garantir que o sistema seja construído de forma organizada, atendendo às necessidades identificadas durante o levantamento de informações e entrevistas realizadas.</w:t>
+      </w:r>
+    </w:p>
+    <w:p>
+      <w:pPr>
+        <w:spacing w:before="240"/>
+        <w:jc w:val="both"/>
+      </w:pPr>
+      <w:r>
         <w:t>Inicialmente foi realizada uma etapa de levantamento de requisitos, na qual foram coletadas informações sobre os principais problemas enfrentados por cuidadores, familiares e profissionais da área da saúde no cuidado com pessoas idosas. Essa etapa foi realizada por meio de entrevistas com pessoas que possuem experiência no tema, permitindo compreender melhor as necessidades do público-alvo e as principais dificuldades existentes na contratação de cuidadores e no acompanhamento da rotina dos idosos.</w:t>
       </w:r>
     </w:p>
     <w:p>
       <w:pPr>
-        <w:spacing w:before="240" w:beforeAutospacing="off" w:after="240" w:afterAutospacing="off" w:line="360" w:lineRule="auto"/>
-        <w:ind w:left="0" w:right="0"/>
-        <w:jc w:val="both"/>
-        <w:rPr>
-          <w:noProof w:val="0"/>
-          <w:lang w:val="pt-BR"/>
-        </w:rPr>
-      </w:pPr>
-      <w:r>
-        <w:rPr>
-          <w:rFonts w:ascii="Times New Roman" w:hAnsi="Times New Roman" w:eastAsia="Times New Roman" w:cs="Times New Roman"/>
-          <w:noProof w:val="0"/>
-          <w:color w:val="auto"/>
-          <w:sz w:val="24"/>
-          <w:szCs w:val="24"/>
-          <w:lang w:val="pt-BR" w:eastAsia="pt-BR" w:bidi="ar-SA"/>
-        </w:rPr>
+        <w:spacing w:before="240"/>
+        <w:jc w:val="both"/>
+      </w:pPr>
+      <w:r>
         <w:t>Após o levantamento dessas informações, foi realizada a análise do problema e definição das funcionalidades do sistema, com o objetivo de identificar quais recursos seriam necessários para atender às demandas observadas. Entre as funcionalidades definidas estão o cadastro de usuários (responsáveis, cuidadores e idosos), sistema de autenticação, busca de cuidadores com filtros específicos, vinculação de cuidadores aos idosos e uma agenda para controle de medicamentos.</w:t>
       </w:r>
     </w:p>
     <w:p>
       <w:pPr>
-        <w:spacing w:before="240" w:beforeAutospacing="off" w:after="240" w:afterAutospacing="off" w:line="360" w:lineRule="auto"/>
-        <w:ind w:left="0" w:right="0"/>
-        <w:jc w:val="both"/>
-        <w:rPr>
-          <w:noProof w:val="0"/>
-          <w:lang w:val="pt-BR"/>
-        </w:rPr>
-      </w:pPr>
-      <w:r>
-        <w:rPr>
-          <w:rFonts w:ascii="Times New Roman" w:hAnsi="Times New Roman" w:eastAsia="Times New Roman" w:cs="Times New Roman"/>
-          <w:noProof w:val="0"/>
-          <w:color w:val="auto"/>
-          <w:sz w:val="24"/>
-          <w:szCs w:val="24"/>
-          <w:lang w:val="pt-BR" w:eastAsia="pt-BR" w:bidi="ar-SA"/>
-        </w:rPr>
+        <w:spacing w:before="240"/>
+        <w:jc w:val="both"/>
+      </w:pPr>
+      <w:r>
         <w:t>Na etapa seguinte será realizado o projeto e modelagem do sistema, incluindo a criação dos diagramas necessários para representar a estrutura do banco de dados e o funcionamento do sistema. Essa etapa envolve a definição das entidades, relacionamentos e regras de funcionamento, garantindo uma organização adequada das informações.</w:t>
       </w:r>
     </w:p>
     <w:p>
       <w:pPr>
-        <w:spacing w:before="240" w:beforeAutospacing="off" w:after="240" w:afterAutospacing="off" w:line="360" w:lineRule="auto"/>
-        <w:ind w:left="0" w:right="0"/>
-        <w:jc w:val="both"/>
-        <w:rPr>
-          <w:noProof w:val="0"/>
-          <w:lang w:val="pt-BR"/>
-        </w:rPr>
-      </w:pPr>
-      <w:r>
-        <w:rPr>
-          <w:rFonts w:ascii="Times New Roman" w:hAnsi="Times New Roman" w:eastAsia="Times New Roman" w:cs="Times New Roman"/>
-          <w:noProof w:val="0"/>
-          <w:color w:val="auto"/>
-          <w:sz w:val="24"/>
-          <w:szCs w:val="24"/>
-          <w:lang w:val="pt-BR" w:eastAsia="pt-BR" w:bidi="ar-SA"/>
-        </w:rPr>
-        <w:t xml:space="preserve">Posteriormente será iniciada a fase de desenvolvimento do sistema, utilizando a linguagem de programação Java para o </w:t>
-      </w:r>
-      <w:r>
-        <w:rPr>
-          <w:rFonts w:ascii="Times New Roman" w:hAnsi="Times New Roman" w:eastAsia="Times New Roman" w:cs="Times New Roman"/>
-          <w:noProof w:val="0"/>
-          <w:color w:val="auto"/>
-          <w:sz w:val="24"/>
-          <w:szCs w:val="24"/>
-          <w:lang w:val="pt-BR" w:eastAsia="pt-BR" w:bidi="ar-SA"/>
-        </w:rPr>
-        <w:t>backend</w:t>
-      </w:r>
-      <w:r>
-        <w:rPr>
-          <w:rFonts w:ascii="Times New Roman" w:hAnsi="Times New Roman" w:eastAsia="Times New Roman" w:cs="Times New Roman"/>
-          <w:noProof w:val="0"/>
-          <w:color w:val="auto"/>
-          <w:sz w:val="24"/>
-          <w:szCs w:val="24"/>
-          <w:lang w:val="pt-BR" w:eastAsia="pt-BR" w:bidi="ar-SA"/>
-        </w:rPr>
-        <w:t xml:space="preserve"> e o sistema de gerenciamento de banco de dados PostgreSQL para armazenamento das informações. Durante essa fase serão implementadas as funcionalidades definidas anteriormente, bem como os mecanismos de autenticação e organização dos dados dos usuários.</w:t>
-      </w:r>
-    </w:p>
-    <w:p>
-      <w:pPr>
-        <w:spacing w:before="240" w:beforeAutospacing="off" w:after="240" w:afterAutospacing="off" w:line="360" w:lineRule="auto"/>
-        <w:ind w:left="0" w:right="0"/>
-        <w:jc w:val="both"/>
-        <w:rPr>
-          <w:noProof w:val="0"/>
-          <w:lang w:val="pt-BR"/>
-        </w:rPr>
-      </w:pPr>
-      <w:r>
-        <w:rPr>
-          <w:rFonts w:ascii="Times New Roman" w:hAnsi="Times New Roman" w:eastAsia="Times New Roman" w:cs="Times New Roman"/>
-          <w:noProof w:val="0"/>
-          <w:color w:val="auto"/>
-          <w:sz w:val="24"/>
-          <w:szCs w:val="24"/>
-          <w:lang w:val="pt-BR" w:eastAsia="pt-BR" w:bidi="ar-SA"/>
-        </w:rPr>
-        <w:t>Por fim, será realizada a fase de testes e validação do sistema, com o objetivo de verificar se as funcionalidades estão operando corretamente e se o sistema atende às necessidades identificadas no início do projeto. Caso sejam identificados problemas ou melhorias, ajustes serão realizados antes da finalização do projeto.</w:t>
-      </w:r>
-      <w:bookmarkStart w:name="_u304za3h7w33" w:id="8"/>
+        <w:spacing w:before="240"/>
+        <w:jc w:val="both"/>
+      </w:pPr>
+      <w:r>
+        <w:t>Posteriormente será iniciada a fase de desenvolvimento do sistema, utilizando a linguagem de programação Java para o backend e o sistema de gerenciamento de banco de dados PostgreSQL para armazenamento das informações. Durante essa fase serão implementadas as funcionalidades definidas anteriormente, bem como os mecanismos de autenticação e organização dos dados dos usuários.</w:t>
+      </w:r>
+    </w:p>
+    <w:p>
+      <w:pPr>
+        <w:spacing w:before="240"/>
+        <w:jc w:val="both"/>
+      </w:pPr>
+      <w:r>
+        <w:t xml:space="preserve">Por fim, será realizada a fase de testes e validação do sistema, com o objetivo de verificar se as funcionalidades estão operando corretamente e se o sistema atende às necessidades </w:t>
+      </w:r>
+      <w:r>
+        <w:lastRenderedPageBreak/>
+        <w:t>identificadas no início do projeto. Caso sejam identificados problemas ou melhorias, ajustes serão realizados antes da finalização do projeto.</w:t>
+      </w:r>
+      <w:bookmarkStart w:id="8" w:name="_u304za3h7w33"/>
       <w:bookmarkEnd w:id="8"/>
-    </w:p>
-    <w:p>
-      <w:pPr>
-        <w:keepNext w:val="1"/>
-        <w:pBdr>
-          <w:top w:val="nil" w:color="FF000000" w:sz="0" w:space="0"/>
-          <w:left w:val="nil" w:color="FF000000" w:sz="0" w:space="0"/>
-          <w:bottom w:val="nil" w:color="FF000000" w:sz="0" w:space="0"/>
-          <w:right w:val="nil" w:color="FF000000" w:sz="0" w:space="0"/>
-          <w:between w:val="nil" w:color="FF000000" w:sz="0" w:space="0"/>
-        </w:pBdr>
-      </w:pPr>
-      <w:r>
-        <w:rPr>
-          <w:rFonts w:ascii="Times New Roman" w:hAnsi="Times New Roman" w:eastAsia="Times New Roman" w:cs="Times New Roman"/>
-          <w:color w:val="auto"/>
-          <w:sz w:val="24"/>
-          <w:szCs w:val="24"/>
-          <w:lang w:eastAsia="pt-BR" w:bidi="ar-SA"/>
-        </w:rPr>
-        <w:t>2.8 ANÁLISE SITUACIONAL</w:t>
-      </w:r>
-    </w:p>
-    <w:p>
-      <w:pPr>
-        <w:keepNext/>
-        <w:spacing w:before="240" w:beforeAutospacing="off" w:after="240" w:afterAutospacing="off"/>
-        <w:jc w:val="both"/>
-        <w:rPr>
-          <w:noProof w:val="0"/>
-          <w:lang w:val="pt-BR"/>
-        </w:rPr>
-      </w:pPr>
-      <w:r>
-        <w:rPr>
-          <w:rFonts w:ascii="Times New Roman" w:hAnsi="Times New Roman" w:eastAsia="Times New Roman" w:cs="Times New Roman"/>
-          <w:noProof w:val="0"/>
-          <w:color w:val="auto"/>
-          <w:sz w:val="24"/>
-          <w:szCs w:val="24"/>
-          <w:lang w:val="pt-BR" w:eastAsia="pt-BR" w:bidi="ar-SA"/>
-        </w:rPr>
-        <w:t>Para compreender melhor o contexto em que o projeto está inserido, realizamos entrevistas com pessoas que possuem experiência direta no cuidado e acompanhamento de idosos. O objetivo foi identificar os principais desafios enfrentados por cuidadores, familiares e profissionais da saúde, além de compreender as necessidades existentes e possíveis oportunidades de melhoria por meio do uso de tecnologias.</w:t>
-      </w:r>
-    </w:p>
-    <w:p>
-      <w:pPr>
-        <w:keepNext/>
-        <w:spacing w:before="240" w:beforeAutospacing="off" w:after="240" w:afterAutospacing="off"/>
-        <w:jc w:val="both"/>
-        <w:rPr>
-          <w:noProof w:val="0"/>
-          <w:lang w:val="pt-BR"/>
-        </w:rPr>
-      </w:pPr>
-      <w:r>
-        <w:rPr>
-          <w:rFonts w:ascii="Times New Roman" w:hAnsi="Times New Roman" w:eastAsia="Times New Roman" w:cs="Times New Roman"/>
-          <w:noProof w:val="0"/>
-          <w:color w:val="auto"/>
-          <w:sz w:val="24"/>
-          <w:szCs w:val="24"/>
-          <w:lang w:val="pt-BR" w:eastAsia="pt-BR" w:bidi="ar-SA"/>
-        </w:rPr>
-        <w:t xml:space="preserve">A primeira entrevistada foi </w:t>
-      </w:r>
-      <w:r>
-        <w:rPr>
-          <w:rFonts w:ascii="Times New Roman" w:hAnsi="Times New Roman" w:eastAsia="Times New Roman" w:cs="Times New Roman"/>
-          <w:noProof w:val="0"/>
-          <w:color w:val="auto"/>
-          <w:sz w:val="24"/>
-          <w:szCs w:val="24"/>
-          <w:lang w:val="pt-BR" w:eastAsia="pt-BR" w:bidi="ar-SA"/>
-        </w:rPr>
-        <w:t>Lúcia Helena</w:t>
-      </w:r>
-      <w:r>
-        <w:rPr>
-          <w:rFonts w:ascii="Times New Roman" w:hAnsi="Times New Roman" w:eastAsia="Times New Roman" w:cs="Times New Roman"/>
-          <w:noProof w:val="0"/>
-          <w:color w:val="auto"/>
-          <w:sz w:val="24"/>
-          <w:szCs w:val="24"/>
-          <w:lang w:val="pt-BR" w:eastAsia="pt-BR" w:bidi="ar-SA"/>
-        </w:rPr>
-        <w:t>, cuidadora de idosos com cerca de 15 anos de experiência. Ela comentou que o processo de contratação de cuidadores é, atualmente, pouco organizado, acontecendo principalmente por indicações de profissionais de saúde ou de conhecidos. Isso gera dificuldades tanto para os cuidadores, que dependem dessas recomendações para conseguir trabalho, quanto para as famílias, que muitas vezes precisam encontrar rapidamente alguém de confiança para cuidar de um idoso.</w:t>
-      </w:r>
-    </w:p>
-    <w:p>
-      <w:pPr>
-        <w:keepNext/>
-        <w:spacing w:before="240" w:beforeAutospacing="off" w:after="240" w:afterAutospacing="off"/>
-        <w:jc w:val="both"/>
-        <w:rPr>
-          <w:noProof w:val="0"/>
-          <w:lang w:val="pt-BR"/>
-        </w:rPr>
-      </w:pPr>
-      <w:r>
-        <w:rPr>
-          <w:rFonts w:ascii="Times New Roman" w:hAnsi="Times New Roman" w:eastAsia="Times New Roman" w:cs="Times New Roman"/>
-          <w:noProof w:val="0"/>
-          <w:color w:val="auto"/>
-          <w:sz w:val="24"/>
-          <w:szCs w:val="24"/>
-          <w:lang w:val="pt-BR" w:eastAsia="pt-BR" w:bidi="ar-SA"/>
-        </w:rPr>
-        <w:t xml:space="preserve">Outro desafio destacado por Lúcia é a dificuldade em conseguir cuidadores disponíveis de forma imediata, especialmente em situações emergenciais, como quando um idoso recebe alta hospitalar e necessita de acompanhamento contínuo. Segundo ela, um sistema organizado que permitisse às famílias </w:t>
-      </w:r>
-      <w:r>
-        <w:rPr>
-          <w:rFonts w:ascii="Times New Roman" w:hAnsi="Times New Roman" w:eastAsia="Times New Roman" w:cs="Times New Roman"/>
-          <w:noProof w:val="0"/>
-          <w:color w:val="auto"/>
-          <w:sz w:val="24"/>
-          <w:szCs w:val="24"/>
-          <w:lang w:val="pt-BR" w:eastAsia="pt-BR" w:bidi="ar-SA"/>
-        </w:rPr>
-        <w:t>encontrar</w:t>
-      </w:r>
-      <w:r>
-        <w:rPr>
-          <w:rFonts w:ascii="Times New Roman" w:hAnsi="Times New Roman" w:eastAsia="Times New Roman" w:cs="Times New Roman"/>
-          <w:noProof w:val="0"/>
-          <w:color w:val="auto"/>
-          <w:sz w:val="24"/>
-          <w:szCs w:val="24"/>
-          <w:lang w:val="pt-BR" w:eastAsia="pt-BR" w:bidi="ar-SA"/>
-        </w:rPr>
-        <w:t xml:space="preserve"> cuidadores, verificar suas experiências e entrar em contato facilmente poderia melhorar bastante essa situação. Lúcia também enfatizou que a solução precisa ser simples de usar, considerando que muitas pessoas têm pouca familiaridade com tecnologia e utilizam principalmente redes sociais em dispositivos móveis.</w:t>
-      </w:r>
-    </w:p>
-    <w:p>
-      <w:pPr>
-        <w:keepNext/>
-        <w:spacing w:before="240" w:beforeAutospacing="off" w:after="240" w:afterAutospacing="off"/>
-        <w:jc w:val="both"/>
-        <w:rPr>
-          <w:rFonts w:ascii="Times New Roman" w:hAnsi="Times New Roman" w:eastAsia="Times New Roman" w:cs="Times New Roman"/>
-          <w:noProof w:val="0"/>
-          <w:color w:val="auto"/>
-          <w:sz w:val="24"/>
-          <w:szCs w:val="24"/>
-          <w:lang w:val="pt-BR" w:eastAsia="pt-BR" w:bidi="ar-SA"/>
-        </w:rPr>
-      </w:pPr>
-      <w:r>
-        <w:rPr>
-          <w:rFonts w:ascii="Times New Roman" w:hAnsi="Times New Roman" w:eastAsia="Times New Roman" w:cs="Times New Roman"/>
-          <w:noProof w:val="0"/>
-          <w:color w:val="auto"/>
-          <w:sz w:val="24"/>
-          <w:szCs w:val="24"/>
-          <w:lang w:val="pt-BR" w:eastAsia="pt-BR" w:bidi="ar-SA"/>
-        </w:rPr>
-        <w:t xml:space="preserve">A segunda entrevista foi com </w:t>
-      </w:r>
-      <w:r>
-        <w:rPr>
-          <w:rFonts w:ascii="Times New Roman" w:hAnsi="Times New Roman" w:eastAsia="Times New Roman" w:cs="Times New Roman"/>
-          <w:noProof w:val="0"/>
-          <w:color w:val="auto"/>
-          <w:sz w:val="24"/>
-          <w:szCs w:val="24"/>
-          <w:lang w:val="pt-BR" w:eastAsia="pt-BR" w:bidi="ar-SA"/>
-        </w:rPr>
-        <w:t>Aparecida de Fátima Faria Barbosa</w:t>
-      </w:r>
-      <w:r>
-        <w:rPr>
-          <w:rFonts w:ascii="Times New Roman" w:hAnsi="Times New Roman" w:eastAsia="Times New Roman" w:cs="Times New Roman"/>
-          <w:noProof w:val="0"/>
-          <w:color w:val="auto"/>
-          <w:sz w:val="24"/>
-          <w:szCs w:val="24"/>
-          <w:lang w:val="pt-BR" w:eastAsia="pt-BR" w:bidi="ar-SA"/>
-        </w:rPr>
-        <w:t>, agente comunitária de saúde com 18 anos de atuação e coordenadora de uma comunidade religiosa há cerca de 20 anos. Ela apontou que o envelhecimento da população aumenta a demanda por cuidados especializados para idosos, criando desafios para famílias que precisam trabalhar e não podem acompanhar seus parentes o tempo todo.</w:t>
-      </w:r>
-    </w:p>
-    <w:p>
-      <w:pPr>
-        <w:keepNext/>
-        <w:spacing w:before="240" w:beforeAutospacing="off" w:after="240" w:afterAutospacing="off"/>
-        <w:jc w:val="both"/>
-        <w:rPr>
-          <w:rFonts w:ascii="Times New Roman" w:hAnsi="Times New Roman" w:eastAsia="Times New Roman" w:cs="Times New Roman"/>
-          <w:noProof w:val="0"/>
-          <w:color w:val="auto"/>
-          <w:sz w:val="24"/>
-          <w:szCs w:val="24"/>
-          <w:lang w:val="pt-BR" w:eastAsia="pt-BR" w:bidi="ar-SA"/>
-        </w:rPr>
-      </w:pPr>
-      <w:r>
-        <w:rPr>
-          <w:rFonts w:ascii="Times New Roman" w:hAnsi="Times New Roman" w:eastAsia="Times New Roman" w:cs="Times New Roman"/>
-          <w:noProof w:val="0"/>
-          <w:color w:val="auto"/>
-          <w:sz w:val="24"/>
-          <w:szCs w:val="24"/>
-          <w:lang w:val="pt-BR" w:eastAsia="pt-BR" w:bidi="ar-SA"/>
-        </w:rPr>
-        <w:t xml:space="preserve">Aparecida destacou que encontrar cuidadores capacitados e de confiança é uma dificuldade comum. Muitas famílias recorrem a soluções improvisadas, como escalas entre parentes ou instalação de equipamentos de monitoramento em casa. Ela também acredita que tecnologias digitais podem melhorar o acompanhamento dos idosos, principalmente se forem capazes de enviar alertas em </w:t>
-      </w:r>
-      <w:r>
-        <w:rPr>
-          <w:rFonts w:ascii="Times New Roman" w:hAnsi="Times New Roman" w:eastAsia="Times New Roman" w:cs="Times New Roman"/>
-          <w:noProof w:val="0"/>
-          <w:color w:val="auto"/>
-          <w:sz w:val="24"/>
-          <w:szCs w:val="24"/>
-          <w:lang w:val="pt-BR" w:eastAsia="pt-BR" w:bidi="ar-SA"/>
-        </w:rPr>
-        <w:t>situações de emergência</w:t>
-      </w:r>
-      <w:r>
-        <w:rPr>
-          <w:rFonts w:ascii="Times New Roman" w:hAnsi="Times New Roman" w:eastAsia="Times New Roman" w:cs="Times New Roman"/>
-          <w:noProof w:val="0"/>
-          <w:color w:val="auto"/>
-          <w:sz w:val="24"/>
-          <w:szCs w:val="24"/>
-          <w:lang w:val="pt-BR" w:eastAsia="pt-BR" w:bidi="ar-SA"/>
-        </w:rPr>
-        <w:t>, como quedas ou problemas de saúde. Outro ponto importante mencionado foi a dificuldade de acesso enfrentada por moradores da zona rural, onde a distância entre residências e a limitação de internet dificultam o acompanhamento constante do idoso e o acesso a serviços de cuidado.</w:t>
-      </w:r>
-    </w:p>
-    <w:p>
-      <w:pPr>
-        <w:keepNext/>
-        <w:spacing w:before="240" w:beforeAutospacing="off" w:after="240" w:afterAutospacing="off"/>
-        <w:jc w:val="both"/>
-        <w:rPr>
-          <w:rFonts w:ascii="Times New Roman" w:hAnsi="Times New Roman" w:eastAsia="Times New Roman" w:cs="Times New Roman"/>
-          <w:noProof w:val="0"/>
-          <w:color w:val="auto"/>
-          <w:sz w:val="24"/>
-          <w:szCs w:val="24"/>
-          <w:lang w:val="pt-BR" w:eastAsia="pt-BR" w:bidi="ar-SA"/>
-        </w:rPr>
-      </w:pPr>
-      <w:r>
-        <w:rPr>
-          <w:rFonts w:ascii="Times New Roman" w:hAnsi="Times New Roman" w:eastAsia="Times New Roman" w:cs="Times New Roman"/>
-          <w:noProof w:val="0"/>
-          <w:color w:val="auto"/>
-          <w:sz w:val="24"/>
-          <w:szCs w:val="24"/>
-          <w:lang w:val="pt-BR" w:eastAsia="pt-BR" w:bidi="ar-SA"/>
-        </w:rPr>
-        <w:t>A partir dessas entrevistas, foi possível identificar alguns pontos em comum. Entre os principais desafios estão a dificuldade de encontrar cuidadores disponíveis e confiáveis, a falta de organização na divulgação dos serviços de cuidado e a necessidade de ferramentas que auxiliem no acompanhamento da rotina e da saúde dos idosos. Observou-se também que soluções tecnológicas podem contribuir significativamente para reduzir essas dificuldades, desde que sejam simples, acessíveis e adaptadas ao perfil dos usuários, que muitas vezes possuem pouca familiaridade com sistemas digitais.</w:t>
-      </w:r>
-    </w:p>
-    <w:p>
-      <w:pPr>
-        <w:pStyle w:val="Normal"/>
-        <w:keepNext/>
-        <w:spacing w:before="240"/>
-        <w:jc w:val="both"/>
-        <w:rPr>
-          <w:b w:val="1"/>
-          <w:bCs w:val="1"/>
-          <w:smallCaps w:val="1"/>
-          <w:color w:val="000000"/>
-        </w:rPr>
-      </w:pPr>
-      <w:bookmarkStart w:name="_5xhdqyoxv5pz" w:id="9"/>
-      <w:bookmarkEnd w:id="9"/>
-      <w:r>
-        <w:rPr>
-          <w:b w:val="1"/>
-          <w:bCs w:val="1"/>
-          <w:smallCaps w:val="1"/>
-          <w:color w:val="000000" w:themeColor="text1" w:themeTint="FF" w:themeShade="FF"/>
-        </w:rPr>
-        <w:t xml:space="preserve">3 PLANEJAMENTO </w:t>
-      </w:r>
-    </w:p>
-    <w:p>
-      <w:pPr>
-        <w:rPr>
-          <w:color w:val="0070C0"/>
-        </w:rPr>
-      </w:pPr>
-      <w:r>
-        <w:rPr>
-          <w:color w:val="0070C0"/>
-        </w:rPr>
-        <w:t>Descreva a apresentação do capítulo.</w:t>
-      </w:r>
-    </w:p>
-    <w:p>
-      <w:pPr>
-        <w:rPr>
-          <w:color w:val="0070C0"/>
-        </w:rPr>
-      </w:pPr>
-      <w:bookmarkStart w:name="_85x6gq42hjga" w:colFirst="0" w:colLast="0" w:id="11"/>
-      <w:bookmarkEnd w:id="11"/>
     </w:p>
     <w:p>
       <w:pPr>
@@ -3943,22 +3306,114 @@
           <w:right w:val="nil"/>
           <w:between w:val="nil"/>
         </w:pBdr>
-        <w:rPr>
+      </w:pPr>
+      <w:r>
+        <w:t>2.8 ANÁLISE SITUACIONAL</w:t>
+      </w:r>
+    </w:p>
+    <w:p>
+      <w:pPr>
+        <w:keepNext/>
+        <w:spacing w:before="240"/>
+        <w:jc w:val="both"/>
+      </w:pPr>
+      <w:r>
+        <w:t>Para compreender melhor o contexto em que o projeto está inserido, realizamos entrevistas com pessoas que possuem experiência direta no cuidado e acompanhamento de idosos. O objetivo foi identificar os principais desafios enfrentados por cuidadores, familiares e profissionais da saúde, além de compreender as necessidades existentes e possíveis oportunidades de melhoria por meio do uso de tecnologias.</w:t>
+      </w:r>
+    </w:p>
+    <w:p>
+      <w:pPr>
+        <w:keepNext/>
+        <w:spacing w:before="240"/>
+        <w:jc w:val="both"/>
+      </w:pPr>
+      <w:r>
+        <w:t>A primeira entrevistada foi Lúcia Helena, cuidadora de idosos com cerca de 15 anos de experiência. Ela comentou que o processo de contratação de cuidadores é, atualmente, pouco organizado, acontecendo principalmente por indicações de profissionais de saúde ou de conhecidos. Isso gera dificuldades tanto para os cuidadores, que dependem dessas recomendações para conseguir trabalho, quanto para as famílias, que muitas vezes precisam encontrar rapidamente alguém de confiança para cuidar de um idoso.</w:t>
+      </w:r>
+    </w:p>
+    <w:p>
+      <w:pPr>
+        <w:keepNext/>
+        <w:spacing w:before="240"/>
+        <w:jc w:val="both"/>
+      </w:pPr>
+      <w:r>
+        <w:t>Outro desafio destacado por Lúcia é a dificuldade em conseguir cuidadores disponíveis de forma imediata, especialmente em situações emergenciais, como quando um idoso recebe alta hospitalar e necessita de acompanhamento contínuo. Segundo ela, um sistema organizado que permitisse às famílias encontrar cuidadores, verificar suas experiências e entrar em contato facilmente poderia melhorar bastante essa situação. Lúcia também enfatizou que a solução precisa ser simples de usar, considerando que muitas pessoas têm pouca familiaridade com tecnologia e utilizam principalmente redes sociais em dispositivos móveis.</w:t>
+      </w:r>
+    </w:p>
+    <w:p>
+      <w:pPr>
+        <w:keepNext/>
+        <w:spacing w:before="240"/>
+        <w:jc w:val="both"/>
+      </w:pPr>
+      <w:r>
+        <w:t>A segunda entrevista foi com Aparecida de Fátima Faria Barbosa, agente comunitária de saúde com 18 anos de atuação e coordenadora de uma comunidade religiosa há cerca de 20 anos. Ela apontou que o envelhecimento da população aumenta a demanda por cuidados especializados para idosos, criando desafios para famílias que precisam trabalhar e não podem acompanhar seus parentes o tempo todo.</w:t>
+      </w:r>
+    </w:p>
+    <w:p>
+      <w:pPr>
+        <w:keepNext/>
+        <w:spacing w:before="240"/>
+        <w:jc w:val="both"/>
+      </w:pPr>
+      <w:r>
+        <w:t xml:space="preserve">Aparecida destacou que encontrar cuidadores capacitados e de confiança é uma dificuldade comum. Muitas famílias recorrem a soluções improvisadas, como escalas entre parentes ou instalação de equipamentos de monitoramento em casa. Ela também acredita que tecnologias </w:t>
+      </w:r>
+      <w:r>
+        <w:lastRenderedPageBreak/>
+        <w:t>digitais podem melhorar o acompanhamento dos idosos, principalmente se forem capazes de enviar alertas em situações de emergência, como quedas ou problemas de saúde. Outro ponto importante mencionado foi a dificuldade de acesso enfrentada por moradores da zona rural, onde a distância entre residências e a limitação de internet dificultam o acompanhamento constante do idoso e o acesso a serviços de cuidado.</w:t>
+      </w:r>
+    </w:p>
+    <w:p>
+      <w:pPr>
+        <w:keepNext/>
+        <w:spacing w:before="240"/>
+        <w:jc w:val="both"/>
+      </w:pPr>
+      <w:r>
+        <w:t>A partir dessas entrevistas, foi possível identificar alguns pontos em comum. Entre os principais desafios estão a dificuldade de encontrar cuidadores disponíveis e confiáveis, a falta de organização na divulgação dos serviços de cuidado e a necessidade de ferramentas que auxiliem no acompanhamento da rotina e da saúde dos idosos. Observou-se também que soluções tecnológicas podem contribuir significativamente para reduzir essas dificuldades, desde que sejam simples, acessíveis e adaptadas ao perfil dos usuários, que muitas vezes possuem pouca familiaridade com sistemas digitais.</w:t>
+      </w:r>
+    </w:p>
+    <w:p>
+      <w:pPr>
+        <w:keepNext/>
+        <w:spacing w:before="240"/>
+        <w:jc w:val="both"/>
+      </w:pPr>
+      <w:r>
+        <w:br w:type="page"/>
+      </w:r>
+    </w:p>
+    <w:p>
+      <w:pPr>
+        <w:keepNext/>
+        <w:spacing w:before="240"/>
+        <w:jc w:val="both"/>
+        <w:rPr>
+          <w:b/>
+          <w:bCs/>
           <w:smallCaps/>
           <w:color w:val="000000"/>
         </w:rPr>
       </w:pPr>
-      <w:r>
-        <w:rPr>
+      <w:bookmarkStart w:id="9" w:name="_5xhdqyoxv5pz"/>
+      <w:bookmarkStart w:id="10" w:name="_GoBack"/>
+      <w:bookmarkEnd w:id="9"/>
+      <w:bookmarkEnd w:id="10"/>
+      <w:r>
+        <w:rPr>
+          <w:b/>
+          <w:bCs/>
           <w:smallCaps/>
-          <w:color w:val="000000"/>
-        </w:rPr>
-        <w:t>3.1 RECURSOS HUMANOS</w:t>
-      </w:r>
-    </w:p>
-    <w:p>
-      <w:pPr>
-        <w:jc w:val="both"/>
+          <w:color w:val="000000" w:themeColor="text1"/>
+        </w:rPr>
+        <w:lastRenderedPageBreak/>
+        <w:t xml:space="preserve">3 PLANEJAMENTO </w:t>
+      </w:r>
+    </w:p>
+    <w:p>
+      <w:pPr>
         <w:rPr>
           <w:color w:val="0070C0"/>
         </w:rPr>
@@ -3967,18 +3422,17 @@
         <w:rPr>
           <w:color w:val="0070C0"/>
         </w:rPr>
-        <w:t>Apresente a relação dos integrantes da equipe, professores e demais colaboradores do trabalho.</w:t>
-      </w:r>
-    </w:p>
-    <w:p>
-      <w:pPr>
-        <w:jc w:val="both"/>
-        <w:rPr>
-          <w:color w:val="FF0000"/>
-        </w:rPr>
-      </w:pPr>
-      <w:bookmarkStart w:name="_hlzhjesqyqyu" w:colFirst="0" w:colLast="0" w:id="12"/>
-      <w:bookmarkEnd w:id="12"/>
+        <w:t>Descreva a apresentação do capítulo.</w:t>
+      </w:r>
+    </w:p>
+    <w:p>
+      <w:pPr>
+        <w:rPr>
+          <w:color w:val="0070C0"/>
+        </w:rPr>
+      </w:pPr>
+      <w:bookmarkStart w:id="11" w:name="_85x6gq42hjga" w:colFirst="0" w:colLast="0"/>
+      <w:bookmarkEnd w:id="11"/>
     </w:p>
     <w:p>
       <w:pPr>
@@ -4000,7 +3454,7 @@
           <w:smallCaps/>
           <w:color w:val="000000"/>
         </w:rPr>
-        <w:t>3.2 RECURSOS DE HARDWARE</w:t>
+        <w:t>3.1 RECURSOS HUMANOS</w:t>
       </w:r>
     </w:p>
     <w:p>
@@ -4010,111 +3464,11 @@
           <w:color w:val="0070C0"/>
         </w:rPr>
       </w:pPr>
-      <w:bookmarkStart w:name="_47l4drcmyedf" w:colFirst="0" w:colLast="0" w:id="13"/>
-      <w:bookmarkEnd w:id="13"/>
       <w:r>
         <w:rPr>
           <w:color w:val="0070C0"/>
         </w:rPr>
-        <w:t xml:space="preserve">Escreva as configurações de computadores e demais periféricos a ser utilizados para o desenvolvimento do trabalho. </w:t>
-      </w:r>
-    </w:p>
-    <w:p>
-      <w:pPr>
-        <w:jc w:val="both"/>
-        <w:rPr>
-          <w:color w:val="0070C0"/>
-        </w:rPr>
-      </w:pPr>
-      <w:r>
-        <w:rPr>
-          <w:color w:val="0070C0"/>
-        </w:rPr>
-        <w:t xml:space="preserve">Exemplos: </w:t>
-      </w:r>
-    </w:p>
-    <w:p>
-      <w:pPr>
-        <w:jc w:val="both"/>
-        <w:rPr>
-          <w:color w:val="0070C0"/>
-        </w:rPr>
-      </w:pPr>
-      <w:r>
-        <w:rPr>
-          <w:color w:val="0070C0"/>
-        </w:rPr>
-        <w:t xml:space="preserve">RH 1 – Três microcomputadores com processadores Intel i7, 4,9 GHz, 32-bit (x86); 16 </w:t>
-      </w:r>
-      <w:proofErr w:type="spellStart"/>
-      <w:r>
-        <w:rPr>
-          <w:color w:val="0070C0"/>
-        </w:rPr>
-        <w:t>Gbytes</w:t>
-      </w:r>
-      <w:proofErr w:type="spellEnd"/>
-      <w:r>
-        <w:rPr>
-          <w:color w:val="0070C0"/>
-        </w:rPr>
-        <w:t xml:space="preserve"> RAM e 16 </w:t>
-      </w:r>
-      <w:proofErr w:type="spellStart"/>
-      <w:r>
-        <w:rPr>
-          <w:color w:val="0070C0"/>
-        </w:rPr>
-        <w:t>Gbytes</w:t>
-      </w:r>
-      <w:proofErr w:type="spellEnd"/>
-      <w:r>
-        <w:rPr>
-          <w:color w:val="0070C0"/>
-        </w:rPr>
-        <w:t xml:space="preserve"> de espaço livre em disco.</w:t>
-      </w:r>
-    </w:p>
-    <w:p>
-      <w:pPr>
-        <w:jc w:val="both"/>
-        <w:rPr>
-          <w:color w:val="0070C0"/>
-        </w:rPr>
-      </w:pPr>
-      <w:r>
-        <w:rPr>
-          <w:color w:val="0070C0"/>
-        </w:rPr>
-        <w:t>RH 2 – Uma Impressora HP Deskjet colorida.</w:t>
-      </w:r>
-    </w:p>
-    <w:p>
-      <w:pPr>
-        <w:jc w:val="both"/>
-        <w:rPr>
-          <w:color w:val="0070C0"/>
-        </w:rPr>
-      </w:pPr>
-      <w:r>
-        <w:rPr>
-          <w:color w:val="0070C0"/>
-        </w:rPr>
-        <w:t xml:space="preserve">RH 3 – Uma </w:t>
-      </w:r>
-      <w:r>
-        <w:rPr>
-          <w:i/>
-          <w:iCs/>
-          <w:color w:val="0070C0"/>
-        </w:rPr>
-        <w:t>webcam</w:t>
-      </w:r>
-      <w:r>
-        <w:rPr>
-          <w:color w:val="0070C0"/>
-        </w:rPr>
-        <w:t xml:space="preserve"> com resolução mínima de 6 MP.</w:t>
+        <w:t>Apresente a relação dos integrantes da equipe, professores e demais colaboradores do trabalho.</w:t>
       </w:r>
     </w:p>
     <w:p>
@@ -4124,8 +3478,8 @@
           <w:color w:val="FF0000"/>
         </w:rPr>
       </w:pPr>
-      <w:bookmarkStart w:name="_zgip7uuby6ix" w:colFirst="0" w:colLast="0" w:id="14"/>
-      <w:bookmarkEnd w:id="14"/>
+      <w:bookmarkStart w:id="12" w:name="_hlzhjesqyqyu" w:colFirst="0" w:colLast="0"/>
+      <w:bookmarkEnd w:id="12"/>
     </w:p>
     <w:p>
       <w:pPr>
@@ -4147,6 +3501,161 @@
           <w:smallCaps/>
           <w:color w:val="000000"/>
         </w:rPr>
+        <w:t>3.2 RECURSOS DE HARDWARE</w:t>
+      </w:r>
+    </w:p>
+    <w:p>
+      <w:pPr>
+        <w:jc w:val="both"/>
+        <w:rPr>
+          <w:color w:val="0070C0"/>
+        </w:rPr>
+      </w:pPr>
+      <w:bookmarkStart w:id="13" w:name="_47l4drcmyedf" w:colFirst="0" w:colLast="0"/>
+      <w:bookmarkEnd w:id="13"/>
+      <w:r>
+        <w:rPr>
+          <w:color w:val="0070C0"/>
+        </w:rPr>
+        <w:t xml:space="preserve">Escreva as configurações de computadores e demais periféricos a ser utilizados para o desenvolvimento do trabalho. </w:t>
+      </w:r>
+    </w:p>
+    <w:p>
+      <w:pPr>
+        <w:jc w:val="both"/>
+        <w:rPr>
+          <w:color w:val="0070C0"/>
+        </w:rPr>
+      </w:pPr>
+      <w:r>
+        <w:rPr>
+          <w:color w:val="0070C0"/>
+        </w:rPr>
+        <w:t xml:space="preserve">Exemplos: </w:t>
+      </w:r>
+    </w:p>
+    <w:p>
+      <w:pPr>
+        <w:jc w:val="both"/>
+        <w:rPr>
+          <w:color w:val="0070C0"/>
+        </w:rPr>
+      </w:pPr>
+      <w:r>
+        <w:rPr>
+          <w:color w:val="0070C0"/>
+        </w:rPr>
+        <w:t xml:space="preserve">RH 1 – Três microcomputadores com processadores Intel i7, 4,9 GHz, 32-bit (x86); 16 </w:t>
+      </w:r>
+      <w:proofErr w:type="spellStart"/>
+      <w:r>
+        <w:rPr>
+          <w:color w:val="0070C0"/>
+        </w:rPr>
+        <w:t>Gbytes</w:t>
+      </w:r>
+      <w:proofErr w:type="spellEnd"/>
+      <w:r>
+        <w:rPr>
+          <w:color w:val="0070C0"/>
+        </w:rPr>
+        <w:t xml:space="preserve"> RAM e 16 </w:t>
+      </w:r>
+      <w:proofErr w:type="spellStart"/>
+      <w:r>
+        <w:rPr>
+          <w:color w:val="0070C0"/>
+        </w:rPr>
+        <w:t>Gbytes</w:t>
+      </w:r>
+      <w:proofErr w:type="spellEnd"/>
+      <w:r>
+        <w:rPr>
+          <w:color w:val="0070C0"/>
+        </w:rPr>
+        <w:t xml:space="preserve"> de espaço livre em disco.</w:t>
+      </w:r>
+    </w:p>
+    <w:p>
+      <w:pPr>
+        <w:jc w:val="both"/>
+        <w:rPr>
+          <w:color w:val="0070C0"/>
+        </w:rPr>
+      </w:pPr>
+      <w:r>
+        <w:rPr>
+          <w:color w:val="0070C0"/>
+        </w:rPr>
+        <w:t>RH 2 – Uma Impressora HP Deskjet colorida.</w:t>
+      </w:r>
+    </w:p>
+    <w:p>
+      <w:pPr>
+        <w:jc w:val="both"/>
+        <w:rPr>
+          <w:color w:val="0070C0"/>
+        </w:rPr>
+      </w:pPr>
+      <w:r>
+        <w:rPr>
+          <w:color w:val="0070C0"/>
+        </w:rPr>
+        <w:t xml:space="preserve">RH 3 – </w:t>
+      </w:r>
+      <w:proofErr w:type="gramStart"/>
+      <w:r>
+        <w:rPr>
+          <w:color w:val="0070C0"/>
+        </w:rPr>
+        <w:t xml:space="preserve">Uma </w:t>
+      </w:r>
+      <w:r>
+        <w:rPr>
+          <w:i/>
+          <w:iCs/>
+          <w:color w:val="0070C0"/>
+        </w:rPr>
+        <w:t>webcam</w:t>
+      </w:r>
+      <w:proofErr w:type="gramEnd"/>
+      <w:r>
+        <w:rPr>
+          <w:color w:val="0070C0"/>
+        </w:rPr>
+        <w:t xml:space="preserve"> com resolução mínima de 6 MP.</w:t>
+      </w:r>
+    </w:p>
+    <w:p>
+      <w:pPr>
+        <w:jc w:val="both"/>
+        <w:rPr>
+          <w:color w:val="FF0000"/>
+        </w:rPr>
+      </w:pPr>
+      <w:bookmarkStart w:id="14" w:name="_zgip7uuby6ix" w:colFirst="0" w:colLast="0"/>
+      <w:bookmarkEnd w:id="14"/>
+    </w:p>
+    <w:p>
+      <w:pPr>
+        <w:keepNext/>
+        <w:pBdr>
+          <w:top w:val="nil"/>
+          <w:left w:val="nil"/>
+          <w:bottom w:val="nil"/>
+          <w:right w:val="nil"/>
+          <w:between w:val="nil"/>
+        </w:pBdr>
+        <w:rPr>
+          <w:smallCaps/>
+          <w:color w:val="000000"/>
+        </w:rPr>
+      </w:pPr>
+      <w:r>
+        <w:rPr>
+          <w:smallCaps/>
+          <w:color w:val="000000"/>
+        </w:rPr>
         <w:t>3.3 RECURSOS DE SOFTWARE</w:t>
       </w:r>
     </w:p>
@@ -4176,65 +3685,49 @@
           <w:color w:val="0070C0"/>
           <w:lang w:val="en-US"/>
         </w:rPr>
-        <w:t xml:space="preserve">RS 1 </w:t>
-      </w:r>
-      <w:proofErr w:type="gramStart"/>
-      <w:r>
+        <w:t>RS 1 -  IntelliJ IDEA v. 2025.</w:t>
+      </w:r>
+    </w:p>
+    <w:p>
+      <w:pPr>
         <w:rPr>
           <w:color w:val="0070C0"/>
           <w:lang w:val="en-US"/>
         </w:rPr>
-        <w:t>-  IntelliJ</w:t>
-      </w:r>
-      <w:proofErr w:type="gramEnd"/>
+      </w:pPr>
       <w:r>
         <w:rPr>
           <w:color w:val="0070C0"/>
           <w:lang w:val="en-US"/>
         </w:rPr>
-        <w:t xml:space="preserve"> IDEA v. 2025.</w:t>
-      </w:r>
-    </w:p>
-    <w:p>
-      <w:pPr>
+        <w:t xml:space="preserve">RS </w:t>
+      </w:r>
+      <w:proofErr w:type="gramStart"/>
+      <w:r>
         <w:rPr>
           <w:color w:val="0070C0"/>
           <w:lang w:val="en-US"/>
         </w:rPr>
-      </w:pPr>
+        <w:t>2  -</w:t>
+      </w:r>
+      <w:proofErr w:type="gramEnd"/>
       <w:r>
         <w:rPr>
           <w:color w:val="0070C0"/>
           <w:lang w:val="en-US"/>
         </w:rPr>
-        <w:t xml:space="preserve">RS </w:t>
-      </w:r>
-      <w:proofErr w:type="gramStart"/>
-      <w:r>
+        <w:t xml:space="preserve"> Microsoft Word 2019.</w:t>
+      </w:r>
+    </w:p>
+    <w:p>
+      <w:pPr>
         <w:rPr>
           <w:color w:val="0070C0"/>
-          <w:lang w:val="en-US"/>
-        </w:rPr>
-        <w:t>2  -</w:t>
-      </w:r>
-      <w:proofErr w:type="gramEnd"/>
+        </w:rPr>
+      </w:pPr>
       <w:r>
         <w:rPr>
           <w:color w:val="0070C0"/>
-          <w:lang w:val="en-US"/>
-        </w:rPr>
-        <w:t xml:space="preserve"> Microsoft Word 2019.</w:t>
-      </w:r>
-    </w:p>
-    <w:p>
-      <w:pPr>
-        <w:rPr>
-          <w:color w:val="0070C0"/>
-        </w:rPr>
-      </w:pPr>
-      <w:r>
-        <w:rPr>
-          <w:color w:val="0070C0"/>
         </w:rPr>
         <w:t>RS 3 - Sistema operacional Microsoft Windows 11 Professional.</w:t>
       </w:r>
@@ -4245,7 +3738,7 @@
           <w:color w:val="FF0000"/>
         </w:rPr>
       </w:pPr>
-      <w:bookmarkStart w:name="_pxyab1tdqc6h" w:colFirst="0" w:colLast="0" w:id="15"/>
+      <w:bookmarkStart w:id="15" w:name="_pxyab1tdqc6h" w:colFirst="0" w:colLast="0"/>
       <w:bookmarkEnd w:id="15"/>
     </w:p>
     <w:p>
@@ -4269,6 +3762,7 @@
           <w:smallCaps/>
           <w:color w:val="000000"/>
         </w:rPr>
+        <w:lastRenderedPageBreak/>
         <w:t xml:space="preserve">3.4 OUTROS RECURSOS </w:t>
       </w:r>
     </w:p>
@@ -4293,7 +3787,7 @@
           <w:color w:val="0070C0"/>
         </w:rPr>
       </w:pPr>
-      <w:bookmarkStart w:name="_3unqfi5pywb" w:colFirst="0" w:colLast="0" w:id="16"/>
+      <w:bookmarkStart w:id="16" w:name="_3unqfi5pywb" w:colFirst="0" w:colLast="0"/>
       <w:bookmarkEnd w:id="16"/>
     </w:p>
     <w:p>
@@ -4360,7 +3854,7 @@
           <w:color w:val="000000"/>
         </w:rPr>
       </w:pPr>
-      <w:bookmarkStart w:name="_69ez10u2xwkb" w:colFirst="0" w:colLast="0" w:id="17"/>
+      <w:bookmarkStart w:id="17" w:name="_69ez10u2xwkb" w:colFirst="0" w:colLast="0"/>
       <w:bookmarkEnd w:id="17"/>
       <w:r>
         <w:br w:type="page"/>
@@ -4371,6 +3865,7 @@
           <w:bCs/>
           <w:color w:val="000000"/>
         </w:rPr>
+        <w:lastRenderedPageBreak/>
         <w:t>4 ESPECIFICAÇÃO E ANÁLISE DOS REQUISITOS DO SISTEMA DE SOFTWARE</w:t>
       </w:r>
     </w:p>
@@ -4390,7 +3885,7 @@
           <w:color w:val="000000"/>
         </w:rPr>
       </w:pPr>
-      <w:bookmarkStart w:name="_p41l1yyjr2lp" w:colFirst="0" w:colLast="0" w:id="18"/>
+      <w:bookmarkStart w:id="18" w:name="_p41l1yyjr2lp" w:colFirst="0" w:colLast="0"/>
       <w:bookmarkEnd w:id="18"/>
       <w:r>
         <w:rPr>
@@ -4414,7 +3909,7 @@
       </w:r>
     </w:p>
     <w:p>
-      <w:bookmarkStart w:name="_jnfti9d8nig6" w:colFirst="0" w:colLast="0" w:id="19"/>
+      <w:bookmarkStart w:id="19" w:name="_jnfti9d8nig6" w:colFirst="0" w:colLast="0"/>
       <w:bookmarkEnd w:id="19"/>
     </w:p>
     <w:p>
@@ -4454,7 +3949,7 @@
       </w:r>
     </w:p>
     <w:p>
-      <w:bookmarkStart w:name="_yfftpsqmbn38" w:colFirst="0" w:colLast="0" w:id="20"/>
+      <w:bookmarkStart w:id="20" w:name="_yfftpsqmbn38" w:colFirst="0" w:colLast="0"/>
       <w:bookmarkEnd w:id="20"/>
     </w:p>
     <w:p>
@@ -4511,7 +4006,7 @@
           <w:color w:val="000000"/>
         </w:rPr>
       </w:pPr>
-      <w:bookmarkStart w:name="_zbtgsztsx5qt" w:colFirst="0" w:colLast="0" w:id="21"/>
+      <w:bookmarkStart w:id="21" w:name="_zbtgsztsx5qt" w:colFirst="0" w:colLast="0"/>
       <w:bookmarkEnd w:id="21"/>
       <w:r>
         <w:br w:type="page"/>
@@ -4522,6 +4017,7 @@
           <w:bCs/>
           <w:color w:val="000000"/>
         </w:rPr>
+        <w:lastRenderedPageBreak/>
         <w:t>5 ARQUITETURA E PROJETO DO SISTEMA DE SOFTWARE</w:t>
       </w:r>
     </w:p>
@@ -4556,7 +4052,7 @@
           <w:color w:val="000000"/>
         </w:rPr>
       </w:pPr>
-      <w:bookmarkStart w:name="_uzs395uand0e" w:colFirst="0" w:colLast="0" w:id="22"/>
+      <w:bookmarkStart w:id="22" w:name="_uzs395uand0e" w:colFirst="0" w:colLast="0"/>
       <w:bookmarkEnd w:id="22"/>
       <w:r>
         <w:br w:type="page"/>
@@ -4567,6 +4063,7 @@
           <w:bCs/>
           <w:color w:val="000000"/>
         </w:rPr>
+        <w:lastRenderedPageBreak/>
         <w:t>6 IMPLEMENTAÇÃO DO SISTEMA DE SOFTWARE</w:t>
       </w:r>
     </w:p>
@@ -4604,7 +4101,7 @@
           <w:color w:val="000000"/>
         </w:rPr>
       </w:pPr>
-      <w:bookmarkStart w:name="_xwz6vzo9lzyl" w:colFirst="0" w:colLast="0" w:id="23"/>
+      <w:bookmarkStart w:id="23" w:name="_xwz6vzo9lzyl" w:colFirst="0" w:colLast="0"/>
       <w:bookmarkEnd w:id="23"/>
       <w:r>
         <w:br w:type="page"/>
@@ -4615,6 +4112,7 @@
           <w:bCs/>
           <w:color w:val="000000"/>
         </w:rPr>
+        <w:lastRenderedPageBreak/>
         <w:t>7 PLANO DE TESTES PARA O SISTEMA DE SOFTWARE</w:t>
       </w:r>
     </w:p>
@@ -4670,7 +4168,7 @@
           <w:color w:val="FF0000"/>
         </w:rPr>
       </w:pPr>
-      <w:bookmarkStart w:name="_mkvs2qyhhbcp" w:colFirst="0" w:colLast="0" w:id="24"/>
+      <w:bookmarkStart w:id="24" w:name="_mkvs2qyhhbcp" w:colFirst="0" w:colLast="0"/>
       <w:bookmarkEnd w:id="24"/>
     </w:p>
     <w:p>
@@ -4691,7 +4189,7 @@
           <w:color w:val="000000"/>
         </w:rPr>
       </w:pPr>
-      <w:bookmarkStart w:name="_8zxqz5wgmdxn" w:colFirst="0" w:colLast="0" w:id="25"/>
+      <w:bookmarkStart w:id="25" w:name="_8zxqz5wgmdxn" w:colFirst="0" w:colLast="0"/>
       <w:bookmarkEnd w:id="25"/>
       <w:r>
         <w:br w:type="page"/>
@@ -4703,6 +4201,7 @@
           <w:smallCaps/>
           <w:color w:val="000000"/>
         </w:rPr>
+        <w:lastRenderedPageBreak/>
         <w:t>8 CONCLUSÃO</w:t>
       </w:r>
     </w:p>
@@ -4738,64 +4237,57 @@
           <w:color w:val="000000"/>
         </w:rPr>
       </w:pPr>
-      <w:bookmarkStart w:name="_vu8skbkjafvu" w:id="26"/>
+      <w:bookmarkStart w:id="26" w:name="_vu8skbkjafvu"/>
       <w:bookmarkEnd w:id="26"/>
       <w:r>
         <w:br w:type="page"/>
       </w:r>
       <w:r>
         <w:rPr>
-          <w:b w:val="1"/>
-          <w:bCs w:val="1"/>
-          <w:smallCaps w:val="1"/>
-          <w:color w:val="000000" w:themeColor="text1" w:themeTint="FF" w:themeShade="FF"/>
-        </w:rPr>
+          <w:b/>
+          <w:bCs/>
+          <w:smallCaps/>
+          <w:color w:val="000000" w:themeColor="text1"/>
+        </w:rPr>
+        <w:lastRenderedPageBreak/>
         <w:t xml:space="preserve">REFERÊNCIAS </w:t>
       </w:r>
     </w:p>
     <w:p>
       <w:pPr>
-        <w:pStyle w:val="Normal"/>
         <w:spacing w:before="120" w:after="120"/>
       </w:pPr>
       <w:r>
         <w:rPr>
-          <w:rFonts w:ascii="Times New Roman" w:hAnsi="Times New Roman" w:eastAsia="Times New Roman" w:cs="Times New Roman"/>
-          <w:noProof w:val="0"/>
-          <w:color w:val="auto"/>
-          <w:sz w:val="24"/>
-          <w:szCs w:val="24"/>
-          <w:lang w:val="en-US" w:eastAsia="pt-BR" w:bidi="ar-SA"/>
-        </w:rPr>
-        <w:t>MAREK, Karen D. et al. Medication Management of the Community-Dwelling Older Adult. In: Patient Safety and Quality: An Evidence-Based Handbook for Nurses. Rockville: AHRQ, 2008.</w:t>
-      </w:r>
-      <w:r>
-        <w:rPr>
-          <w:rFonts w:ascii="Times New Roman" w:hAnsi="Times New Roman" w:eastAsia="Times New Roman" w:cs="Times New Roman"/>
-          <w:noProof w:val="0"/>
-          <w:color w:val="auto"/>
-          <w:sz w:val="24"/>
-          <w:szCs w:val="24"/>
-          <w:lang w:val="en-US" w:eastAsia="pt-BR" w:bidi="ar-SA"/>
+          <w:lang w:val="en-US"/>
+        </w:rPr>
+        <w:t xml:space="preserve">MAREK, Karen D. </w:t>
+      </w:r>
+      <w:proofErr w:type="gramStart"/>
+      <w:r>
+        <w:rPr>
+          <w:lang w:val="en-US"/>
+        </w:rPr>
+        <w:t>et al.</w:t>
+      </w:r>
+      <w:proofErr w:type="gramEnd"/>
+      <w:r>
+        <w:rPr>
+          <w:lang w:val="en-US"/>
+        </w:rPr>
+        <w:t xml:space="preserve"> Medication Management of the Community-Dwelling Older Adult. In: Patient Safety and Quality: An Evidence-Based Handbook for Nurses. Rockville: AHRQ, 2008.</w:t>
+      </w:r>
+      <w:r>
+        <w:rPr>
+          <w:lang w:val="en-US"/>
         </w:rPr>
         <w:t xml:space="preserve"> </w:t>
       </w:r>
       <w:r>
-        <w:rPr>
-          <w:rFonts w:ascii="Times New Roman" w:hAnsi="Times New Roman" w:eastAsia="Times New Roman" w:cs="Times New Roman"/>
-          <w:color w:val="auto"/>
-          <w:sz w:val="24"/>
-          <w:szCs w:val="24"/>
-          <w:lang w:eastAsia="pt-BR" w:bidi="ar-SA"/>
-        </w:rPr>
         <w:t>Disponível em: &lt;https://www.ncbi.nlm.nih.gov/books/NBK2670/&gt;</w:t>
       </w:r>
       <w:r>
         <w:rPr>
-          <w:rFonts w:ascii="Times New Roman" w:hAnsi="Times New Roman" w:eastAsia="Times New Roman" w:cs="Times New Roman"/>
-          <w:noProof w:val="0"/>
-          <w:sz w:val="24"/>
-          <w:szCs w:val="24"/>
           <w:lang w:val="en-US"/>
         </w:rPr>
         <w:t xml:space="preserve"> </w:t>
@@ -4803,285 +4295,38 @@
     </w:p>
     <w:p>
       <w:pPr>
-        <w:pStyle w:val="Normal"/>
         <w:spacing w:line="240" w:lineRule="auto"/>
-        <w:rPr>
-          <w:rFonts w:ascii="Times New Roman" w:hAnsi="Times New Roman" w:eastAsia="Times New Roman" w:cs="Times New Roman"/>
-          <w:color w:val="auto"/>
-          <w:sz w:val="24"/>
-          <w:szCs w:val="24"/>
-          <w:lang w:eastAsia="pt-BR" w:bidi="ar-SA"/>
-        </w:rPr>
-      </w:pPr>
-      <w:r>
-        <w:rPr>
-          <w:rFonts w:ascii="Times New Roman" w:hAnsi="Times New Roman" w:eastAsia="Times New Roman" w:cs="Times New Roman"/>
-          <w:noProof w:val="0"/>
-          <w:sz w:val="24"/>
-          <w:szCs w:val="24"/>
-          <w:lang w:val="pt-BR"/>
-        </w:rPr>
-        <w:t xml:space="preserve">ROSTIROLLA, Gabriela T.; SOUZA, Odair M. </w:t>
-      </w:r>
-      <w:r>
-        <w:rPr>
-          <w:rFonts w:ascii="Times New Roman" w:hAnsi="Times New Roman" w:eastAsia="Times New Roman" w:cs="Times New Roman"/>
-          <w:noProof w:val="0"/>
-          <w:sz w:val="24"/>
-          <w:szCs w:val="24"/>
-          <w:lang w:val="pt-BR"/>
-        </w:rPr>
-        <w:t>DoseApp</w:t>
-      </w:r>
-      <w:r>
-        <w:rPr>
-          <w:rFonts w:ascii="Times New Roman" w:hAnsi="Times New Roman" w:eastAsia="Times New Roman" w:cs="Times New Roman"/>
-          <w:noProof w:val="0"/>
-          <w:sz w:val="24"/>
-          <w:szCs w:val="24"/>
-          <w:lang w:val="pt-BR"/>
-        </w:rPr>
-        <w:t xml:space="preserve">: Aplicativo para gestão de medicamentos e auxílio nas rotinas dos cuidadores de idosos. Anais do </w:t>
-      </w:r>
-      <w:r>
-        <w:rPr>
-          <w:rFonts w:ascii="Times New Roman" w:hAnsi="Times New Roman" w:eastAsia="Times New Roman" w:cs="Times New Roman"/>
-          <w:noProof w:val="0"/>
-          <w:sz w:val="24"/>
-          <w:szCs w:val="24"/>
-          <w:lang w:val="pt-BR"/>
-        </w:rPr>
-        <w:t>Latinoware</w:t>
-      </w:r>
-      <w:r>
-        <w:rPr>
-          <w:rFonts w:ascii="Times New Roman" w:hAnsi="Times New Roman" w:eastAsia="Times New Roman" w:cs="Times New Roman"/>
-          <w:noProof w:val="0"/>
-          <w:sz w:val="24"/>
-          <w:szCs w:val="24"/>
-          <w:lang w:val="pt-BR"/>
-        </w:rPr>
-        <w:t>, 2022.</w:t>
-      </w:r>
-      <w:r>
-        <w:rPr>
-          <w:rFonts w:ascii="Times New Roman" w:hAnsi="Times New Roman" w:eastAsia="Times New Roman" w:cs="Times New Roman"/>
-          <w:noProof w:val="0"/>
-          <w:sz w:val="24"/>
-          <w:szCs w:val="24"/>
-          <w:lang w:val="pt-BR"/>
+      </w:pPr>
+      <w:r>
+        <w:t>ROSTIROLLA, Gabriela T.; SOUZA, Odair M. DoseApp: Aplicativo para gestão de medicamentos e auxílio nas rotinas dos cuidadores de idosos. Anais do Latinoware, 2022.</w:t>
+      </w:r>
+      <w:r>
+        <w:t xml:space="preserve"> Disponível em: &lt;https://sol.sbc.org.br/index.php/latinoware/article/view/22976/&gt;.</w:t>
+      </w:r>
+    </w:p>
+    <w:p>
+      <w:pPr>
+        <w:spacing w:before="120" w:after="120"/>
+      </w:pPr>
+      <w:r>
+        <w:rPr>
+          <w:lang w:val="en-US"/>
+        </w:rPr>
+        <w:t>ZHOU, Zhiyin. Adhera: A Human-Centered Health Informatics Solution for Reducing Informal Caregiver Burden through Improved Medication Adherence. 2025.</w:t>
+      </w:r>
+      <w:r>
+        <w:rPr>
+          <w:lang w:val="en-US"/>
         </w:rPr>
         <w:t xml:space="preserve"> </w:t>
       </w:r>
       <w:r>
-        <w:rPr>
-          <w:rFonts w:ascii="Times New Roman" w:hAnsi="Times New Roman" w:eastAsia="Times New Roman" w:cs="Times New Roman"/>
-          <w:color w:val="auto"/>
-          <w:sz w:val="24"/>
-          <w:szCs w:val="24"/>
-          <w:lang w:eastAsia="pt-BR" w:bidi="ar-SA"/>
-        </w:rPr>
-        <w:t>Disponível em: &lt;https://sol.sbc.org.br/</w:t>
-      </w:r>
-      <w:r>
-        <w:rPr>
-          <w:rFonts w:ascii="Times New Roman" w:hAnsi="Times New Roman" w:eastAsia="Times New Roman" w:cs="Times New Roman"/>
-          <w:color w:val="auto"/>
-          <w:sz w:val="24"/>
-          <w:szCs w:val="24"/>
-          <w:lang w:eastAsia="pt-BR" w:bidi="ar-SA"/>
-        </w:rPr>
-        <w:t>index.php</w:t>
-      </w:r>
-      <w:r>
-        <w:rPr>
-          <w:rFonts w:ascii="Times New Roman" w:hAnsi="Times New Roman" w:eastAsia="Times New Roman" w:cs="Times New Roman"/>
-          <w:color w:val="auto"/>
-          <w:sz w:val="24"/>
-          <w:szCs w:val="24"/>
-          <w:lang w:eastAsia="pt-BR" w:bidi="ar-SA"/>
-        </w:rPr>
-        <w:t>/</w:t>
-      </w:r>
-      <w:r>
-        <w:rPr>
-          <w:rFonts w:ascii="Times New Roman" w:hAnsi="Times New Roman" w:eastAsia="Times New Roman" w:cs="Times New Roman"/>
-          <w:color w:val="auto"/>
-          <w:sz w:val="24"/>
-          <w:szCs w:val="24"/>
-          <w:lang w:eastAsia="pt-BR" w:bidi="ar-SA"/>
-        </w:rPr>
-        <w:t>latinoware</w:t>
-      </w:r>
-      <w:r>
-        <w:rPr>
-          <w:rFonts w:ascii="Times New Roman" w:hAnsi="Times New Roman" w:eastAsia="Times New Roman" w:cs="Times New Roman"/>
-          <w:color w:val="auto"/>
-          <w:sz w:val="24"/>
-          <w:szCs w:val="24"/>
-          <w:lang w:eastAsia="pt-BR" w:bidi="ar-SA"/>
-        </w:rPr>
-        <w:t>/</w:t>
-      </w:r>
-      <w:r>
-        <w:rPr>
-          <w:rFonts w:ascii="Times New Roman" w:hAnsi="Times New Roman" w:eastAsia="Times New Roman" w:cs="Times New Roman"/>
-          <w:color w:val="auto"/>
-          <w:sz w:val="24"/>
-          <w:szCs w:val="24"/>
-          <w:lang w:eastAsia="pt-BR" w:bidi="ar-SA"/>
-        </w:rPr>
-        <w:t>article</w:t>
-      </w:r>
-      <w:r>
-        <w:rPr>
-          <w:rFonts w:ascii="Times New Roman" w:hAnsi="Times New Roman" w:eastAsia="Times New Roman" w:cs="Times New Roman"/>
-          <w:color w:val="auto"/>
-          <w:sz w:val="24"/>
-          <w:szCs w:val="24"/>
-          <w:lang w:eastAsia="pt-BR" w:bidi="ar-SA"/>
-        </w:rPr>
-        <w:t>/</w:t>
-      </w:r>
-      <w:r>
-        <w:rPr>
-          <w:rFonts w:ascii="Times New Roman" w:hAnsi="Times New Roman" w:eastAsia="Times New Roman" w:cs="Times New Roman"/>
-          <w:color w:val="auto"/>
-          <w:sz w:val="24"/>
-          <w:szCs w:val="24"/>
-          <w:lang w:eastAsia="pt-BR" w:bidi="ar-SA"/>
-        </w:rPr>
-        <w:t>view</w:t>
-      </w:r>
-      <w:r>
-        <w:rPr>
-          <w:rFonts w:ascii="Times New Roman" w:hAnsi="Times New Roman" w:eastAsia="Times New Roman" w:cs="Times New Roman"/>
-          <w:color w:val="auto"/>
-          <w:sz w:val="24"/>
-          <w:szCs w:val="24"/>
-          <w:lang w:eastAsia="pt-BR" w:bidi="ar-SA"/>
-        </w:rPr>
-        <w:t>/22976/&gt;.</w:t>
-      </w:r>
-    </w:p>
-    <w:p>
-      <w:pPr>
-        <w:pStyle w:val="Normal"/>
-        <w:spacing w:before="120" w:after="120"/>
-        <w:rPr>
-          <w:rFonts w:ascii="Times New Roman" w:hAnsi="Times New Roman" w:eastAsia="Times New Roman" w:cs="Times New Roman"/>
-          <w:sz w:val="24"/>
-          <w:szCs w:val="24"/>
-        </w:rPr>
-      </w:pPr>
-      <w:r>
-        <w:rPr>
-          <w:rFonts w:ascii="Times New Roman" w:hAnsi="Times New Roman" w:eastAsia="Times New Roman" w:cs="Times New Roman"/>
-          <w:noProof w:val="0"/>
-          <w:sz w:val="24"/>
-          <w:szCs w:val="24"/>
-          <w:lang w:val="en-US"/>
-        </w:rPr>
-        <w:t xml:space="preserve">ZHOU, </w:t>
-      </w:r>
-      <w:r>
-        <w:rPr>
-          <w:rFonts w:ascii="Times New Roman" w:hAnsi="Times New Roman" w:eastAsia="Times New Roman" w:cs="Times New Roman"/>
-          <w:noProof w:val="0"/>
-          <w:sz w:val="24"/>
-          <w:szCs w:val="24"/>
-          <w:lang w:val="en-US"/>
-        </w:rPr>
-        <w:t>Zhiyin</w:t>
-      </w:r>
-      <w:r>
-        <w:rPr>
-          <w:rFonts w:ascii="Times New Roman" w:hAnsi="Times New Roman" w:eastAsia="Times New Roman" w:cs="Times New Roman"/>
-          <w:noProof w:val="0"/>
-          <w:sz w:val="24"/>
-          <w:szCs w:val="24"/>
-          <w:lang w:val="en-US"/>
-        </w:rPr>
-        <w:t xml:space="preserve">. </w:t>
-      </w:r>
-      <w:r>
-        <w:rPr>
-          <w:rFonts w:ascii="Times New Roman" w:hAnsi="Times New Roman" w:eastAsia="Times New Roman" w:cs="Times New Roman"/>
-          <w:noProof w:val="0"/>
-          <w:sz w:val="24"/>
-          <w:szCs w:val="24"/>
-          <w:lang w:val="en-US"/>
-        </w:rPr>
-        <w:t>Adhera</w:t>
-      </w:r>
-      <w:r>
-        <w:rPr>
-          <w:rFonts w:ascii="Times New Roman" w:hAnsi="Times New Roman" w:eastAsia="Times New Roman" w:cs="Times New Roman"/>
-          <w:noProof w:val="0"/>
-          <w:sz w:val="24"/>
-          <w:szCs w:val="24"/>
-          <w:lang w:val="en-US"/>
-        </w:rPr>
-        <w:t>: A Human-Centered Health Informatics Solution for Reducing Informal Caregiver Burden through Improved Medication Adherence. 2025.</w:t>
-      </w:r>
-      <w:r>
-        <w:rPr>
-          <w:rFonts w:ascii="Times New Roman" w:hAnsi="Times New Roman" w:eastAsia="Times New Roman" w:cs="Times New Roman"/>
-          <w:noProof w:val="0"/>
-          <w:sz w:val="24"/>
-          <w:szCs w:val="24"/>
-          <w:lang w:val="en-US"/>
-        </w:rPr>
-        <w:t xml:space="preserve"> </w:t>
-      </w:r>
-      <w:r>
-        <w:rPr>
-          <w:rFonts w:ascii="Times New Roman" w:hAnsi="Times New Roman" w:eastAsia="Times New Roman" w:cs="Times New Roman"/>
-          <w:color w:val="auto"/>
-          <w:sz w:val="24"/>
-          <w:szCs w:val="24"/>
-          <w:lang w:eastAsia="pt-BR" w:bidi="ar-SA"/>
-        </w:rPr>
         <w:t xml:space="preserve">Disponível em: </w:t>
       </w:r>
       <w:r>
-        <w:rPr>
-          <w:rFonts w:ascii="Times New Roman" w:hAnsi="Times New Roman" w:eastAsia="Times New Roman" w:cs="Times New Roman"/>
-          <w:color w:val="auto"/>
-          <w:sz w:val="24"/>
-          <w:szCs w:val="24"/>
-          <w:lang w:eastAsia="pt-BR" w:bidi="ar-SA"/>
-        </w:rPr>
-        <w:t>&lt;https://arxiv.org/</w:t>
-      </w:r>
-      <w:r>
-        <w:rPr>
-          <w:rFonts w:ascii="Times New Roman" w:hAnsi="Times New Roman" w:eastAsia="Times New Roman" w:cs="Times New Roman"/>
-          <w:color w:val="auto"/>
-          <w:sz w:val="24"/>
-          <w:szCs w:val="24"/>
-          <w:lang w:eastAsia="pt-BR" w:bidi="ar-SA"/>
-        </w:rPr>
-        <w:t>abs</w:t>
-      </w:r>
-      <w:r>
-        <w:rPr>
-          <w:rFonts w:ascii="Times New Roman" w:hAnsi="Times New Roman" w:eastAsia="Times New Roman" w:cs="Times New Roman"/>
-          <w:color w:val="auto"/>
-          <w:sz w:val="24"/>
-          <w:szCs w:val="24"/>
-          <w:lang w:eastAsia="pt-BR" w:bidi="ar-SA"/>
-        </w:rPr>
-        <w:t>/2512.03878/&gt;</w:t>
-      </w:r>
-      <w:r>
-        <w:rPr>
-          <w:rFonts w:ascii="Times New Roman" w:hAnsi="Times New Roman" w:eastAsia="Times New Roman" w:cs="Times New Roman"/>
-          <w:color w:val="auto"/>
-          <w:sz w:val="24"/>
-          <w:szCs w:val="24"/>
-          <w:lang w:eastAsia="pt-BR" w:bidi="ar-SA"/>
-        </w:rPr>
+        <w:t>&lt;https://arxiv.org/abs/2512.03878/&gt;</w:t>
+      </w:r>
+      <w:r>
         <w:t>.</w:t>
       </w:r>
     </w:p>
@@ -5111,7 +4356,7 @@
           <w:color w:val="000000"/>
         </w:rPr>
       </w:pPr>
-      <w:bookmarkStart w:name="_amvst46n8d5f" w:colFirst="0" w:colLast="0" w:id="27"/>
+      <w:bookmarkStart w:id="27" w:name="_amvst46n8d5f" w:colFirst="0" w:colLast="0"/>
       <w:bookmarkEnd w:id="27"/>
       <w:r>
         <w:br w:type="page"/>
@@ -5122,6 +4367,7 @@
           <w:bCs/>
           <w:color w:val="000000"/>
         </w:rPr>
+        <w:lastRenderedPageBreak/>
         <w:t>APÊNDICE A – CRONOGRAMA DO PROJETO</w:t>
       </w:r>
     </w:p>
@@ -5156,7 +4402,7 @@
           <w:color w:val="000000"/>
         </w:rPr>
       </w:pPr>
-      <w:bookmarkStart w:name="_9qjp406jcxub" w:colFirst="0" w:colLast="0" w:id="28"/>
+      <w:bookmarkStart w:id="28" w:name="_9qjp406jcxub" w:colFirst="0" w:colLast="0"/>
       <w:bookmarkEnd w:id="28"/>
       <w:r>
         <w:br w:type="page"/>
@@ -5167,6 +4413,7 @@
           <w:bCs/>
           <w:color w:val="000000"/>
         </w:rPr>
+        <w:lastRenderedPageBreak/>
         <w:t>APÊNDICE B – REQUISITOS DO SISTEMA DE SOFTWARE</w:t>
       </w:r>
     </w:p>
@@ -5201,7 +4448,7 @@
           <w:color w:val="000000"/>
         </w:rPr>
       </w:pPr>
-      <w:bookmarkStart w:name="_io2bxhhvd09c" w:colFirst="0" w:colLast="0" w:id="29"/>
+      <w:bookmarkStart w:id="29" w:name="_io2bxhhvd09c" w:colFirst="0" w:colLast="0"/>
       <w:bookmarkEnd w:id="29"/>
       <w:r>
         <w:br w:type="page"/>
@@ -5212,6 +4459,7 @@
           <w:bCs/>
           <w:color w:val="000000"/>
         </w:rPr>
+        <w:lastRenderedPageBreak/>
         <w:t>APÊNDICE C – ANÁLISE DOS REQUISITOS DO SISTEMA DE SOFTWARE</w:t>
       </w:r>
     </w:p>
@@ -5252,7 +4500,7 @@
     <w:sectPr>
       <w:headerReference w:type="default" r:id="rId9"/>
       <w:headerReference w:type="first" r:id="rId10"/>
-      <w:pgSz w:w="11907" w:h="16840" w:orient="portrait"/>
+      <w:pgSz w:w="11907" w:h="16840"/>
       <w:pgMar w:top="1699" w:right="1138" w:bottom="1238" w:left="1699" w:header="720" w:footer="720" w:gutter="0"/>
       <w:cols w:space="720"/>
       <w:titlePg/>
@@ -5262,7 +4510,7 @@
 </file>
 
 <file path=word/endnotes.xml><?xml version="1.0" encoding="utf-8"?>
-<w:endnotes xmlns:wpc="http://schemas.microsoft.com/office/word/2010/wordprocessingCanvas" xmlns:cx="http://schemas.microsoft.com/office/drawing/2014/chartex" xmlns:cx1="http://schemas.microsoft.com/office/drawing/2015/9/8/chartex" xmlns:cx2="http://schemas.microsoft.com/office/drawing/2015/10/21/chartex" xmlns:cx3="http://schemas.microsoft.com/office/drawing/2016/5/9/chartex" xmlns:cx4="http://schemas.microsoft.com/office/drawing/2016/5/10/chartex" xmlns:cx5="http://schemas.microsoft.com/office/drawing/2016/5/11/chartex" xmlns:cx6="http://schemas.microsoft.com/office/drawing/2016/5/12/chartex" xmlns:cx7="http://schemas.microsoft.com/office/drawing/2016/5/13/chartex" xmlns:cx8="http://schemas.microsoft.com/office/drawing/2016/5/14/chartex" xmlns:mc="http://schemas.openxmlformats.org/markup-compatibility/2006" xmlns:aink="http://schemas.microsoft.com/office/drawing/2016/ink" xmlns:am3d="http://schemas.microsoft.com/office/drawing/2017/model3d" xmlns:o="urn:schemas-microsoft-com:office:office" xmlns:oel="http://schemas.microsoft.com/office/2019/extlst" xmlns:r="http://schemas.openxmlformats.org/officeDocument/2006/relationships" xmlns:m="http://schemas.openxmlformats.org/officeDocument/2006/math" xmlns:v="urn:schemas-microsoft-com:vml" xmlns:wp14="http://schemas.microsoft.com/office/word/2010/wordprocessingDrawing" xmlns:wp="http://schemas.openxmlformats.org/drawingml/2006/wordprocessingDrawing" xmlns:w10="urn:schemas-microsoft-com:office:word" xmlns:w="http://schemas.openxmlformats.org/wordprocessingml/2006/main" xmlns:w14="http://schemas.microsoft.com/office/word/2010/wordml" xmlns:w15="http://schemas.microsoft.com/office/word/2012/wordml" xmlns:w16cex="http://schemas.microsoft.com/office/word/2018/wordml/cex" xmlns:w16cid="http://schemas.microsoft.com/office/word/2016/wordml/cid" xmlns:w16="http://schemas.microsoft.com/office/word/2018/wordml" xmlns:w16du="http://schemas.microsoft.com/office/word/2023/wordml/word16du" xmlns:w16sdtdh="http://schemas.microsoft.com/office/word/2020/wordml/sdtdatahash" xmlns:w16sdtfl="http://schemas.microsoft.com/office/word/2024/wordml/sdtformatlock" xmlns:w16se="http://schemas.microsoft.com/office/word/2015/wordml/symex" xmlns:wpg="http://schemas.microsoft.com/office/word/2010/wordprocessingGroup" xmlns:wpi="http://schemas.microsoft.com/office/word/2010/wordprocessingInk" xmlns:wne="http://schemas.microsoft.com/office/word/2006/wordml" xmlns:wps="http://schemas.microsoft.com/office/word/2010/wordprocessingShape" mc:Ignorable="w14 w15 w16se w16cid w16 w16cex w16sdtdh w16sdtfl w16du wp14">
+<w:endnotes xmlns:wpc="http://schemas.microsoft.com/office/word/2010/wordprocessingCanvas" xmlns:cx="http://schemas.microsoft.com/office/drawing/2014/chartex" xmlns:mc="http://schemas.openxmlformats.org/markup-compatibility/2006" xmlns:o="urn:schemas-microsoft-com:office:office" xmlns:r="http://schemas.openxmlformats.org/officeDocument/2006/relationships" xmlns:m="http://schemas.openxmlformats.org/officeDocument/2006/math" xmlns:v="urn:schemas-microsoft-com:vml" xmlns:wp14="http://schemas.microsoft.com/office/word/2010/wordprocessingDrawing" xmlns:wp="http://schemas.openxmlformats.org/drawingml/2006/wordprocessingDrawing" xmlns:w10="urn:schemas-microsoft-com:office:word" xmlns:w="http://schemas.openxmlformats.org/wordprocessingml/2006/main" xmlns:w14="http://schemas.microsoft.com/office/word/2010/wordml" xmlns:w15="http://schemas.microsoft.com/office/word/2012/wordml" xmlns:w16se="http://schemas.microsoft.com/office/word/2015/wordml/symex" xmlns:wpg="http://schemas.microsoft.com/office/word/2010/wordprocessingGroup" xmlns:wpi="http://schemas.microsoft.com/office/word/2010/wordprocessingInk" xmlns:wne="http://schemas.microsoft.com/office/word/2006/wordml" xmlns:wps="http://schemas.microsoft.com/office/word/2010/wordprocessingShape" mc:Ignorable="w14 w15 w16se wp14">
   <w:endnote w:type="separator" w:id="-1">
     <w:p>
       <w:pPr>
@@ -5287,7 +4535,7 @@
 </file>
 
 <file path=word/footnotes.xml><?xml version="1.0" encoding="utf-8"?>
-<w:footnotes xmlns:wpc="http://schemas.microsoft.com/office/word/2010/wordprocessingCanvas" xmlns:cx="http://schemas.microsoft.com/office/drawing/2014/chartex" xmlns:cx1="http://schemas.microsoft.com/office/drawing/2015/9/8/chartex" xmlns:cx2="http://schemas.microsoft.com/office/drawing/2015/10/21/chartex" xmlns:cx3="http://schemas.microsoft.com/office/drawing/2016/5/9/chartex" xmlns:cx4="http://schemas.microsoft.com/office/drawing/2016/5/10/chartex" xmlns:cx5="http://schemas.microsoft.com/office/drawing/2016/5/11/chartex" xmlns:cx6="http://schemas.microsoft.com/office/drawing/2016/5/12/chartex" xmlns:cx7="http://schemas.microsoft.com/office/drawing/2016/5/13/chartex" xmlns:cx8="http://schemas.microsoft.com/office/drawing/2016/5/14/chartex" xmlns:mc="http://schemas.openxmlformats.org/markup-compatibility/2006" xmlns:aink="http://schemas.microsoft.com/office/drawing/2016/ink" xmlns:am3d="http://schemas.microsoft.com/office/drawing/2017/model3d" xmlns:o="urn:schemas-microsoft-com:office:office" xmlns:oel="http://schemas.microsoft.com/office/2019/extlst" xmlns:r="http://schemas.openxmlformats.org/officeDocument/2006/relationships" xmlns:m="http://schemas.openxmlformats.org/officeDocument/2006/math" xmlns:v="urn:schemas-microsoft-com:vml" xmlns:wp14="http://schemas.microsoft.com/office/word/2010/wordprocessingDrawing" xmlns:wp="http://schemas.openxmlformats.org/drawingml/2006/wordprocessingDrawing" xmlns:w10="urn:schemas-microsoft-com:office:word" xmlns:w="http://schemas.openxmlformats.org/wordprocessingml/2006/main" xmlns:w14="http://schemas.microsoft.com/office/word/2010/wordml" xmlns:w15="http://schemas.microsoft.com/office/word/2012/wordml" xmlns:w16cex="http://schemas.microsoft.com/office/word/2018/wordml/cex" xmlns:w16cid="http://schemas.microsoft.com/office/word/2016/wordml/cid" xmlns:w16="http://schemas.microsoft.com/office/word/2018/wordml" xmlns:w16du="http://schemas.microsoft.com/office/word/2023/wordml/word16du" xmlns:w16sdtdh="http://schemas.microsoft.com/office/word/2020/wordml/sdtdatahash" xmlns:w16sdtfl="http://schemas.microsoft.com/office/word/2024/wordml/sdtformatlock" xmlns:w16se="http://schemas.microsoft.com/office/word/2015/wordml/symex" xmlns:wpg="http://schemas.microsoft.com/office/word/2010/wordprocessingGroup" xmlns:wpi="http://schemas.microsoft.com/office/word/2010/wordprocessingInk" xmlns:wne="http://schemas.microsoft.com/office/word/2006/wordml" xmlns:wps="http://schemas.microsoft.com/office/word/2010/wordprocessingShape" mc:Ignorable="w14 w15 w16se w16cid w16 w16cex w16sdtdh w16sdtfl w16du wp14">
+<w:footnotes xmlns:wpc="http://schemas.microsoft.com/office/word/2010/wordprocessingCanvas" xmlns:cx="http://schemas.microsoft.com/office/drawing/2014/chartex" xmlns:mc="http://schemas.openxmlformats.org/markup-compatibility/2006" xmlns:o="urn:schemas-microsoft-com:office:office" xmlns:r="http://schemas.openxmlformats.org/officeDocument/2006/relationships" xmlns:m="http://schemas.openxmlformats.org/officeDocument/2006/math" xmlns:v="urn:schemas-microsoft-com:vml" xmlns:wp14="http://schemas.microsoft.com/office/word/2010/wordprocessingDrawing" xmlns:wp="http://schemas.openxmlformats.org/drawingml/2006/wordprocessingDrawing" xmlns:w10="urn:schemas-microsoft-com:office:word" xmlns:w="http://schemas.openxmlformats.org/wordprocessingml/2006/main" xmlns:w14="http://schemas.microsoft.com/office/word/2010/wordml" xmlns:w15="http://schemas.microsoft.com/office/word/2012/wordml" xmlns:w16se="http://schemas.microsoft.com/office/word/2015/wordml/symex" xmlns:wpg="http://schemas.microsoft.com/office/word/2010/wordprocessingGroup" xmlns:wpi="http://schemas.microsoft.com/office/word/2010/wordprocessingInk" xmlns:wne="http://schemas.microsoft.com/office/word/2006/wordml" xmlns:wps="http://schemas.microsoft.com/office/word/2010/wordprocessingShape" mc:Ignorable="w14 w15 w16se wp14">
   <w:footnote w:type="separator" w:id="-1">
     <w:p>
       <w:pPr>
@@ -5312,7 +4560,7 @@
 </file>
 
 <file path=word/header1.xml><?xml version="1.0" encoding="utf-8"?>
-<w:hdr xmlns:wpc="http://schemas.microsoft.com/office/word/2010/wordprocessingCanvas" xmlns:cx="http://schemas.microsoft.com/office/drawing/2014/chartex" xmlns:cx1="http://schemas.microsoft.com/office/drawing/2015/9/8/chartex" xmlns:cx2="http://schemas.microsoft.com/office/drawing/2015/10/21/chartex" xmlns:cx3="http://schemas.microsoft.com/office/drawing/2016/5/9/chartex" xmlns:cx4="http://schemas.microsoft.com/office/drawing/2016/5/10/chartex" xmlns:cx5="http://schemas.microsoft.com/office/drawing/2016/5/11/chartex" xmlns:cx6="http://schemas.microsoft.com/office/drawing/2016/5/12/chartex" xmlns:cx7="http://schemas.microsoft.com/office/drawing/2016/5/13/chartex" xmlns:cx8="http://schemas.microsoft.com/office/drawing/2016/5/14/chartex" xmlns:mc="http://schemas.openxmlformats.org/markup-compatibility/2006" xmlns:aink="http://schemas.microsoft.com/office/drawing/2016/ink" xmlns:am3d="http://schemas.microsoft.com/office/drawing/2017/model3d" xmlns:o="urn:schemas-microsoft-com:office:office" xmlns:oel="http://schemas.microsoft.com/office/2019/extlst" xmlns:r="http://schemas.openxmlformats.org/officeDocument/2006/relationships" xmlns:m="http://schemas.openxmlformats.org/officeDocument/2006/math" xmlns:v="urn:schemas-microsoft-com:vml" xmlns:wp14="http://schemas.microsoft.com/office/word/2010/wordprocessingDrawing" xmlns:wp="http://schemas.openxmlformats.org/drawingml/2006/wordprocessingDrawing" xmlns:w10="urn:schemas-microsoft-com:office:word" xmlns:w="http://schemas.openxmlformats.org/wordprocessingml/2006/main" xmlns:w14="http://schemas.microsoft.com/office/word/2010/wordml" xmlns:w15="http://schemas.microsoft.com/office/word/2012/wordml" xmlns:w16cex="http://schemas.microsoft.com/office/word/2018/wordml/cex" xmlns:w16cid="http://schemas.microsoft.com/office/word/2016/wordml/cid" xmlns:w16="http://schemas.microsoft.com/office/word/2018/wordml" xmlns:w16du="http://schemas.microsoft.com/office/word/2023/wordml/word16du" xmlns:w16sdtdh="http://schemas.microsoft.com/office/word/2020/wordml/sdtdatahash" xmlns:w16sdtfl="http://schemas.microsoft.com/office/word/2024/wordml/sdtformatlock" xmlns:w16se="http://schemas.microsoft.com/office/word/2015/wordml/symex" xmlns:wpg="http://schemas.microsoft.com/office/word/2010/wordprocessingGroup" xmlns:wpi="http://schemas.microsoft.com/office/word/2010/wordprocessingInk" xmlns:wne="http://schemas.microsoft.com/office/word/2006/wordml" xmlns:wps="http://schemas.microsoft.com/office/word/2010/wordprocessingShape" mc:Ignorable="w14 w15 w16se w16cid w16 w16cex w16sdtdh w16sdtfl w16du wp14">
+<w:hdr xmlns:wpc="http://schemas.microsoft.com/office/word/2010/wordprocessingCanvas" xmlns:cx="http://schemas.microsoft.com/office/drawing/2014/chartex" xmlns:mc="http://schemas.openxmlformats.org/markup-compatibility/2006" xmlns:o="urn:schemas-microsoft-com:office:office" xmlns:r="http://schemas.openxmlformats.org/officeDocument/2006/relationships" xmlns:m="http://schemas.openxmlformats.org/officeDocument/2006/math" xmlns:v="urn:schemas-microsoft-com:vml" xmlns:wp14="http://schemas.microsoft.com/office/word/2010/wordprocessingDrawing" xmlns:wp="http://schemas.openxmlformats.org/drawingml/2006/wordprocessingDrawing" xmlns:w10="urn:schemas-microsoft-com:office:word" xmlns:w="http://schemas.openxmlformats.org/wordprocessingml/2006/main" xmlns:w14="http://schemas.microsoft.com/office/word/2010/wordml" xmlns:w15="http://schemas.microsoft.com/office/word/2012/wordml" xmlns:w16se="http://schemas.microsoft.com/office/word/2015/wordml/symex" xmlns:wpg="http://schemas.microsoft.com/office/word/2010/wordprocessingGroup" xmlns:wpi="http://schemas.microsoft.com/office/word/2010/wordprocessingInk" xmlns:wne="http://schemas.microsoft.com/office/word/2006/wordml" xmlns:wps="http://schemas.microsoft.com/office/word/2010/wordprocessingShape" mc:Ignorable="w14 w15 w16se wp14">
   <w:p>
     <w:pPr>
       <w:pBdr>
@@ -5347,12 +4595,6 @@
       <w:rPr>
         <w:color w:val="000000"/>
       </w:rPr>
-      <w:fldChar w:fldCharType="separate"/>
-    </w:r>
-    <w:r>
-      <w:rPr>
-        <w:color w:val="000000"/>
-      </w:rPr>
       <w:fldChar w:fldCharType="end"/>
     </w:r>
   </w:p>
@@ -5379,7 +4621,7 @@
 </file>
 
 <file path=word/header2.xml><?xml version="1.0" encoding="utf-8"?>
-<w:hdr xmlns:wpc="http://schemas.microsoft.com/office/word/2010/wordprocessingCanvas" xmlns:cx="http://schemas.microsoft.com/office/drawing/2014/chartex" xmlns:cx1="http://schemas.microsoft.com/office/drawing/2015/9/8/chartex" xmlns:cx2="http://schemas.microsoft.com/office/drawing/2015/10/21/chartex" xmlns:cx3="http://schemas.microsoft.com/office/drawing/2016/5/9/chartex" xmlns:cx4="http://schemas.microsoft.com/office/drawing/2016/5/10/chartex" xmlns:cx5="http://schemas.microsoft.com/office/drawing/2016/5/11/chartex" xmlns:cx6="http://schemas.microsoft.com/office/drawing/2016/5/12/chartex" xmlns:cx7="http://schemas.microsoft.com/office/drawing/2016/5/13/chartex" xmlns:cx8="http://schemas.microsoft.com/office/drawing/2016/5/14/chartex" xmlns:mc="http://schemas.openxmlformats.org/markup-compatibility/2006" xmlns:aink="http://schemas.microsoft.com/office/drawing/2016/ink" xmlns:am3d="http://schemas.microsoft.com/office/drawing/2017/model3d" xmlns:o="urn:schemas-microsoft-com:office:office" xmlns:oel="http://schemas.microsoft.com/office/2019/extlst" xmlns:r="http://schemas.openxmlformats.org/officeDocument/2006/relationships" xmlns:m="http://schemas.openxmlformats.org/officeDocument/2006/math" xmlns:v="urn:schemas-microsoft-com:vml" xmlns:wp14="http://schemas.microsoft.com/office/word/2010/wordprocessingDrawing" xmlns:wp="http://schemas.openxmlformats.org/drawingml/2006/wordprocessingDrawing" xmlns:w10="urn:schemas-microsoft-com:office:word" xmlns:w="http://schemas.openxmlformats.org/wordprocessingml/2006/main" xmlns:w14="http://schemas.microsoft.com/office/word/2010/wordml" xmlns:w15="http://schemas.microsoft.com/office/word/2012/wordml" xmlns:w16cex="http://schemas.microsoft.com/office/word/2018/wordml/cex" xmlns:w16cid="http://schemas.microsoft.com/office/word/2016/wordml/cid" xmlns:w16="http://schemas.microsoft.com/office/word/2018/wordml" xmlns:w16du="http://schemas.microsoft.com/office/word/2023/wordml/word16du" xmlns:w16sdtdh="http://schemas.microsoft.com/office/word/2020/wordml/sdtdatahash" xmlns:w16sdtfl="http://schemas.microsoft.com/office/word/2024/wordml/sdtformatlock" xmlns:w16se="http://schemas.microsoft.com/office/word/2015/wordml/symex" xmlns:wpg="http://schemas.microsoft.com/office/word/2010/wordprocessingGroup" xmlns:wpi="http://schemas.microsoft.com/office/word/2010/wordprocessingInk" xmlns:wne="http://schemas.microsoft.com/office/word/2006/wordml" xmlns:wps="http://schemas.microsoft.com/office/word/2010/wordprocessingShape" mc:Ignorable="w14 w15 w16se w16cid w16 w16cex w16sdtdh w16sdtfl w16du wp14">
+<w:hdr xmlns:wpc="http://schemas.microsoft.com/office/word/2010/wordprocessingCanvas" xmlns:cx="http://schemas.microsoft.com/office/drawing/2014/chartex" xmlns:mc="http://schemas.openxmlformats.org/markup-compatibility/2006" xmlns:o="urn:schemas-microsoft-com:office:office" xmlns:r="http://schemas.openxmlformats.org/officeDocument/2006/relationships" xmlns:m="http://schemas.openxmlformats.org/officeDocument/2006/math" xmlns:v="urn:schemas-microsoft-com:vml" xmlns:wp14="http://schemas.microsoft.com/office/word/2010/wordprocessingDrawing" xmlns:wp="http://schemas.openxmlformats.org/drawingml/2006/wordprocessingDrawing" xmlns:w10="urn:schemas-microsoft-com:office:word" xmlns:w="http://schemas.openxmlformats.org/wordprocessingml/2006/main" xmlns:w14="http://schemas.microsoft.com/office/word/2010/wordml" xmlns:w15="http://schemas.microsoft.com/office/word/2012/wordml" xmlns:w16se="http://schemas.microsoft.com/office/word/2015/wordml/symex" xmlns:wpg="http://schemas.microsoft.com/office/word/2010/wordprocessingGroup" xmlns:wpi="http://schemas.microsoft.com/office/word/2010/wordprocessingInk" xmlns:wne="http://schemas.microsoft.com/office/word/2006/wordml" xmlns:wps="http://schemas.microsoft.com/office/word/2010/wordprocessingShape" mc:Ignorable="w14 w15 w16se wp14">
   <w:p>
     <w:pPr>
       <w:pBdr>
@@ -5421,7 +4663,7 @@
         <w:noProof/>
         <w:color w:val="000000"/>
       </w:rPr>
-      <w:t>2</w:t>
+      <w:t>9</w:t>
     </w:r>
     <w:r>
       <w:rPr>
@@ -5453,7 +4695,7 @@
 </file>
 
 <file path=word/header3.xml><?xml version="1.0" encoding="utf-8"?>
-<w:hdr xmlns:wpc="http://schemas.microsoft.com/office/word/2010/wordprocessingCanvas" xmlns:cx="http://schemas.microsoft.com/office/drawing/2014/chartex" xmlns:cx1="http://schemas.microsoft.com/office/drawing/2015/9/8/chartex" xmlns:cx2="http://schemas.microsoft.com/office/drawing/2015/10/21/chartex" xmlns:cx3="http://schemas.microsoft.com/office/drawing/2016/5/9/chartex" xmlns:cx4="http://schemas.microsoft.com/office/drawing/2016/5/10/chartex" xmlns:cx5="http://schemas.microsoft.com/office/drawing/2016/5/11/chartex" xmlns:cx6="http://schemas.microsoft.com/office/drawing/2016/5/12/chartex" xmlns:cx7="http://schemas.microsoft.com/office/drawing/2016/5/13/chartex" xmlns:cx8="http://schemas.microsoft.com/office/drawing/2016/5/14/chartex" xmlns:mc="http://schemas.openxmlformats.org/markup-compatibility/2006" xmlns:aink="http://schemas.microsoft.com/office/drawing/2016/ink" xmlns:am3d="http://schemas.microsoft.com/office/drawing/2017/model3d" xmlns:o="urn:schemas-microsoft-com:office:office" xmlns:oel="http://schemas.microsoft.com/office/2019/extlst" xmlns:r="http://schemas.openxmlformats.org/officeDocument/2006/relationships" xmlns:m="http://schemas.openxmlformats.org/officeDocument/2006/math" xmlns:v="urn:schemas-microsoft-com:vml" xmlns:wp14="http://schemas.microsoft.com/office/word/2010/wordprocessingDrawing" xmlns:wp="http://schemas.openxmlformats.org/drawingml/2006/wordprocessingDrawing" xmlns:w10="urn:schemas-microsoft-com:office:word" xmlns:w="http://schemas.openxmlformats.org/wordprocessingml/2006/main" xmlns:w14="http://schemas.microsoft.com/office/word/2010/wordml" xmlns:w15="http://schemas.microsoft.com/office/word/2012/wordml" xmlns:w16cex="http://schemas.microsoft.com/office/word/2018/wordml/cex" xmlns:w16cid="http://schemas.microsoft.com/office/word/2016/wordml/cid" xmlns:w16="http://schemas.microsoft.com/office/word/2018/wordml" xmlns:w16du="http://schemas.microsoft.com/office/word/2023/wordml/word16du" xmlns:w16sdtdh="http://schemas.microsoft.com/office/word/2020/wordml/sdtdatahash" xmlns:w16sdtfl="http://schemas.microsoft.com/office/word/2024/wordml/sdtformatlock" xmlns:w16se="http://schemas.microsoft.com/office/word/2015/wordml/symex" xmlns:wpg="http://schemas.microsoft.com/office/word/2010/wordprocessingGroup" xmlns:wpi="http://schemas.microsoft.com/office/word/2010/wordprocessingInk" xmlns:wne="http://schemas.microsoft.com/office/word/2006/wordml" xmlns:wps="http://schemas.microsoft.com/office/word/2010/wordprocessingShape" mc:Ignorable="w14 w15 w16se w16cid w16 w16cex w16sdtdh w16sdtfl w16du wp14">
+<w:hdr xmlns:wpc="http://schemas.microsoft.com/office/word/2010/wordprocessingCanvas" xmlns:cx="http://schemas.microsoft.com/office/drawing/2014/chartex" xmlns:mc="http://schemas.openxmlformats.org/markup-compatibility/2006" xmlns:o="urn:schemas-microsoft-com:office:office" xmlns:r="http://schemas.openxmlformats.org/officeDocument/2006/relationships" xmlns:m="http://schemas.openxmlformats.org/officeDocument/2006/math" xmlns:v="urn:schemas-microsoft-com:vml" xmlns:wp14="http://schemas.microsoft.com/office/word/2010/wordprocessingDrawing" xmlns:wp="http://schemas.openxmlformats.org/drawingml/2006/wordprocessingDrawing" xmlns:w10="urn:schemas-microsoft-com:office:word" xmlns:w="http://schemas.openxmlformats.org/wordprocessingml/2006/main" xmlns:w14="http://schemas.microsoft.com/office/word/2010/wordml" xmlns:w15="http://schemas.microsoft.com/office/word/2012/wordml" xmlns:w16se="http://schemas.microsoft.com/office/word/2015/wordml/symex" xmlns:wpg="http://schemas.microsoft.com/office/word/2010/wordprocessingGroup" xmlns:wpi="http://schemas.microsoft.com/office/word/2010/wordprocessingInk" xmlns:wne="http://schemas.microsoft.com/office/word/2006/wordml" xmlns:wps="http://schemas.microsoft.com/office/word/2010/wordprocessingShape" mc:Ignorable="w14 w15 w16se wp14">
   <w:p>
     <w:pPr>
       <w:pBdr>
@@ -5495,7 +4737,7 @@
 </file>
 
 <file path=word/header4.xml><?xml version="1.0" encoding="utf-8"?>
-<w:hdr xmlns:wpc="http://schemas.microsoft.com/office/word/2010/wordprocessingCanvas" xmlns:cx="http://schemas.microsoft.com/office/drawing/2014/chartex" xmlns:cx1="http://schemas.microsoft.com/office/drawing/2015/9/8/chartex" xmlns:cx2="http://schemas.microsoft.com/office/drawing/2015/10/21/chartex" xmlns:cx3="http://schemas.microsoft.com/office/drawing/2016/5/9/chartex" xmlns:cx4="http://schemas.microsoft.com/office/drawing/2016/5/10/chartex" xmlns:cx5="http://schemas.microsoft.com/office/drawing/2016/5/11/chartex" xmlns:cx6="http://schemas.microsoft.com/office/drawing/2016/5/12/chartex" xmlns:cx7="http://schemas.microsoft.com/office/drawing/2016/5/13/chartex" xmlns:cx8="http://schemas.microsoft.com/office/drawing/2016/5/14/chartex" xmlns:mc="http://schemas.openxmlformats.org/markup-compatibility/2006" xmlns:aink="http://schemas.microsoft.com/office/drawing/2016/ink" xmlns:am3d="http://schemas.microsoft.com/office/drawing/2017/model3d" xmlns:o="urn:schemas-microsoft-com:office:office" xmlns:oel="http://schemas.microsoft.com/office/2019/extlst" xmlns:r="http://schemas.openxmlformats.org/officeDocument/2006/relationships" xmlns:m="http://schemas.openxmlformats.org/officeDocument/2006/math" xmlns:v="urn:schemas-microsoft-com:vml" xmlns:wp14="http://schemas.microsoft.com/office/word/2010/wordprocessingDrawing" xmlns:wp="http://schemas.openxmlformats.org/drawingml/2006/wordprocessingDrawing" xmlns:w10="urn:schemas-microsoft-com:office:word" xmlns:w="http://schemas.openxmlformats.org/wordprocessingml/2006/main" xmlns:w14="http://schemas.microsoft.com/office/word/2010/wordml" xmlns:w15="http://schemas.microsoft.com/office/word/2012/wordml" xmlns:w16cex="http://schemas.microsoft.com/office/word/2018/wordml/cex" xmlns:w16cid="http://schemas.microsoft.com/office/word/2016/wordml/cid" xmlns:w16="http://schemas.microsoft.com/office/word/2018/wordml" xmlns:w16du="http://schemas.microsoft.com/office/word/2023/wordml/word16du" xmlns:w16sdtdh="http://schemas.microsoft.com/office/word/2020/wordml/sdtdatahash" xmlns:w16sdtfl="http://schemas.microsoft.com/office/word/2024/wordml/sdtformatlock" xmlns:w16se="http://schemas.microsoft.com/office/word/2015/wordml/symex" xmlns:wpg="http://schemas.microsoft.com/office/word/2010/wordprocessingGroup" xmlns:wpi="http://schemas.microsoft.com/office/word/2010/wordprocessingInk" xmlns:wne="http://schemas.microsoft.com/office/word/2006/wordml" xmlns:wps="http://schemas.microsoft.com/office/word/2010/wordprocessingShape" mc:Ignorable="w14 w15 w16se w16cid w16 w16cex w16sdtdh w16sdtfl w16du wp14">
+<w:hdr xmlns:wpc="http://schemas.microsoft.com/office/word/2010/wordprocessingCanvas" xmlns:cx="http://schemas.microsoft.com/office/drawing/2014/chartex" xmlns:mc="http://schemas.openxmlformats.org/markup-compatibility/2006" xmlns:o="urn:schemas-microsoft-com:office:office" xmlns:r="http://schemas.openxmlformats.org/officeDocument/2006/relationships" xmlns:m="http://schemas.openxmlformats.org/officeDocument/2006/math" xmlns:v="urn:schemas-microsoft-com:vml" xmlns:wp14="http://schemas.microsoft.com/office/word/2010/wordprocessingDrawing" xmlns:wp="http://schemas.openxmlformats.org/drawingml/2006/wordprocessingDrawing" xmlns:w10="urn:schemas-microsoft-com:office:word" xmlns:w="http://schemas.openxmlformats.org/wordprocessingml/2006/main" xmlns:w14="http://schemas.microsoft.com/office/word/2010/wordml" xmlns:w15="http://schemas.microsoft.com/office/word/2012/wordml" xmlns:w16se="http://schemas.microsoft.com/office/word/2015/wordml/symex" xmlns:wpg="http://schemas.microsoft.com/office/word/2010/wordprocessingGroup" xmlns:wpi="http://schemas.microsoft.com/office/word/2010/wordprocessingInk" xmlns:wne="http://schemas.microsoft.com/office/word/2006/wordml" xmlns:wps="http://schemas.microsoft.com/office/word/2010/wordprocessingShape" mc:Ignorable="w14 w15 w16se wp14">
   <w:p>
     <w:pPr>
       <w:pBdr>
@@ -5537,7 +4779,7 @@
         <w:noProof/>
         <w:color w:val="000000"/>
       </w:rPr>
-      <w:t>11</w:t>
+      <w:t>26</w:t>
     </w:r>
     <w:r>
       <w:rPr>
@@ -5569,7 +4811,7 @@
 </file>
 
 <file path=word/header5.xml><?xml version="1.0" encoding="utf-8"?>
-<w:hdr xmlns:wpc="http://schemas.microsoft.com/office/word/2010/wordprocessingCanvas" xmlns:cx="http://schemas.microsoft.com/office/drawing/2014/chartex" xmlns:cx1="http://schemas.microsoft.com/office/drawing/2015/9/8/chartex" xmlns:cx2="http://schemas.microsoft.com/office/drawing/2015/10/21/chartex" xmlns:cx3="http://schemas.microsoft.com/office/drawing/2016/5/9/chartex" xmlns:cx4="http://schemas.microsoft.com/office/drawing/2016/5/10/chartex" xmlns:cx5="http://schemas.microsoft.com/office/drawing/2016/5/11/chartex" xmlns:cx6="http://schemas.microsoft.com/office/drawing/2016/5/12/chartex" xmlns:cx7="http://schemas.microsoft.com/office/drawing/2016/5/13/chartex" xmlns:cx8="http://schemas.microsoft.com/office/drawing/2016/5/14/chartex" xmlns:mc="http://schemas.openxmlformats.org/markup-compatibility/2006" xmlns:aink="http://schemas.microsoft.com/office/drawing/2016/ink" xmlns:am3d="http://schemas.microsoft.com/office/drawing/2017/model3d" xmlns:o="urn:schemas-microsoft-com:office:office" xmlns:oel="http://schemas.microsoft.com/office/2019/extlst" xmlns:r="http://schemas.openxmlformats.org/officeDocument/2006/relationships" xmlns:m="http://schemas.openxmlformats.org/officeDocument/2006/math" xmlns:v="urn:schemas-microsoft-com:vml" xmlns:wp14="http://schemas.microsoft.com/office/word/2010/wordprocessingDrawing" xmlns:wp="http://schemas.openxmlformats.org/drawingml/2006/wordprocessingDrawing" xmlns:w10="urn:schemas-microsoft-com:office:word" xmlns:w="http://schemas.openxmlformats.org/wordprocessingml/2006/main" xmlns:w14="http://schemas.microsoft.com/office/word/2010/wordml" xmlns:w15="http://schemas.microsoft.com/office/word/2012/wordml" xmlns:w16cex="http://schemas.microsoft.com/office/word/2018/wordml/cex" xmlns:w16cid="http://schemas.microsoft.com/office/word/2016/wordml/cid" xmlns:w16="http://schemas.microsoft.com/office/word/2018/wordml" xmlns:w16du="http://schemas.microsoft.com/office/word/2023/wordml/word16du" xmlns:w16sdtdh="http://schemas.microsoft.com/office/word/2020/wordml/sdtdatahash" xmlns:w16sdtfl="http://schemas.microsoft.com/office/word/2024/wordml/sdtformatlock" xmlns:w16se="http://schemas.microsoft.com/office/word/2015/wordml/symex" xmlns:wpg="http://schemas.microsoft.com/office/word/2010/wordprocessingGroup" xmlns:wpi="http://schemas.microsoft.com/office/word/2010/wordprocessingInk" xmlns:wne="http://schemas.microsoft.com/office/word/2006/wordml" xmlns:wps="http://schemas.microsoft.com/office/word/2010/wordprocessingShape" mc:Ignorable="w14 w15 w16se w16cid w16 w16cex w16sdtdh w16sdtfl w16du wp14">
+<w:hdr xmlns:wpc="http://schemas.microsoft.com/office/word/2010/wordprocessingCanvas" xmlns:cx="http://schemas.microsoft.com/office/drawing/2014/chartex" xmlns:mc="http://schemas.openxmlformats.org/markup-compatibility/2006" xmlns:o="urn:schemas-microsoft-com:office:office" xmlns:r="http://schemas.openxmlformats.org/officeDocument/2006/relationships" xmlns:m="http://schemas.openxmlformats.org/officeDocument/2006/math" xmlns:v="urn:schemas-microsoft-com:vml" xmlns:wp14="http://schemas.microsoft.com/office/word/2010/wordprocessingDrawing" xmlns:wp="http://schemas.openxmlformats.org/drawingml/2006/wordprocessingDrawing" xmlns:w10="urn:schemas-microsoft-com:office:word" xmlns:w="http://schemas.openxmlformats.org/wordprocessingml/2006/main" xmlns:w14="http://schemas.microsoft.com/office/word/2010/wordml" xmlns:w15="http://schemas.microsoft.com/office/word/2012/wordml" xmlns:w16se="http://schemas.microsoft.com/office/word/2015/wordml/symex" xmlns:wpg="http://schemas.microsoft.com/office/word/2010/wordprocessingGroup" xmlns:wpi="http://schemas.microsoft.com/office/word/2010/wordprocessingInk" xmlns:wne="http://schemas.microsoft.com/office/word/2006/wordml" xmlns:wps="http://schemas.microsoft.com/office/word/2010/wordprocessingShape" mc:Ignorable="w14 w15 w16se wp14">
   <w:p>
     <w:pPr>
       <w:pBdr>
@@ -5630,11 +4872,11 @@
 </file>
 
 <file path=word/styles.xml><?xml version="1.0" encoding="utf-8"?>
-<w:styles xmlns:wp14="http://schemas.microsoft.com/office/word/2010/wordprocessingDrawing" xmlns:mc="http://schemas.openxmlformats.org/markup-compatibility/2006" xmlns:r="http://schemas.openxmlformats.org/officeDocument/2006/relationships" xmlns:w="http://schemas.openxmlformats.org/wordprocessingml/2006/main" xmlns:w14="http://schemas.microsoft.com/office/word/2010/wordml" xmlns:w15="http://schemas.microsoft.com/office/word/2012/wordml" xmlns:w16cex="http://schemas.microsoft.com/office/word/2018/wordml/cex" xmlns:w16cid="http://schemas.microsoft.com/office/word/2016/wordml/cid" xmlns:w16="http://schemas.microsoft.com/office/word/2018/wordml" xmlns:w16du="http://schemas.microsoft.com/office/word/2023/wordml/word16du" xmlns:w16sdtdh="http://schemas.microsoft.com/office/word/2020/wordml/sdtdatahash" xmlns:w16sdtfl="http://schemas.microsoft.com/office/word/2024/wordml/sdtformatlock" xmlns:w16se="http://schemas.microsoft.com/office/word/2015/wordml/symex" mc:Ignorable="w14 w15 w16se w16cid w16 w16cex w16sdtdh w16sdtfl w16du wp14">
+<w:styles xmlns:mc="http://schemas.openxmlformats.org/markup-compatibility/2006" xmlns:r="http://schemas.openxmlformats.org/officeDocument/2006/relationships" xmlns:w="http://schemas.openxmlformats.org/wordprocessingml/2006/main" xmlns:w14="http://schemas.microsoft.com/office/word/2010/wordml" xmlns:w15="http://schemas.microsoft.com/office/word/2012/wordml" xmlns:w16se="http://schemas.microsoft.com/office/word/2015/wordml/symex" mc:Ignorable="w14 w15 w16se">
   <w:docDefaults>
     <w:rPrDefault>
       <w:rPr>
-        <w:rFonts w:ascii="Times New Roman" w:hAnsi="Times New Roman" w:eastAsia="Times New Roman" w:cs="Times New Roman"/>
+        <w:rFonts w:ascii="Times New Roman" w:eastAsia="Times New Roman" w:hAnsi="Times New Roman" w:cs="Times New Roman"/>
         <w:sz w:val="24"/>
         <w:szCs w:val="24"/>
         <w:lang w:val="pt-BR" w:eastAsia="pt-BR" w:bidi="ar-SA"/>
@@ -5646,17 +4888,17 @@
       </w:pPr>
     </w:pPrDefault>
   </w:docDefaults>
-  <w:latentStyles w:defLockedState="0" w:defUIPriority="99" w:defSemiHidden="0" w:defUnhideWhenUsed="0" w:defQFormat="0" w:count="376">
+  <w:latentStyles w:defLockedState="0" w:defUIPriority="99" w:defSemiHidden="0" w:defUnhideWhenUsed="0" w:defQFormat="0" w:count="371">
     <w:lsdException w:name="Normal" w:uiPriority="0" w:qFormat="1"/>
     <w:lsdException w:name="heading 1" w:uiPriority="9" w:qFormat="1"/>
-    <w:lsdException w:name="heading 2" w:uiPriority="9" w:semiHidden="1" w:unhideWhenUsed="1" w:qFormat="1"/>
-    <w:lsdException w:name="heading 3" w:uiPriority="9" w:semiHidden="1" w:unhideWhenUsed="1" w:qFormat="1"/>
-    <w:lsdException w:name="heading 4" w:uiPriority="9" w:semiHidden="1" w:unhideWhenUsed="1" w:qFormat="1"/>
-    <w:lsdException w:name="heading 5" w:uiPriority="9" w:semiHidden="1" w:unhideWhenUsed="1" w:qFormat="1"/>
-    <w:lsdException w:name="heading 6" w:uiPriority="9" w:semiHidden="1" w:unhideWhenUsed="1" w:qFormat="1"/>
-    <w:lsdException w:name="heading 7" w:uiPriority="9" w:semiHidden="1" w:unhideWhenUsed="1" w:qFormat="1"/>
-    <w:lsdException w:name="heading 8" w:uiPriority="9" w:semiHidden="1" w:unhideWhenUsed="1" w:qFormat="1"/>
-    <w:lsdException w:name="heading 9" w:uiPriority="9" w:semiHidden="1" w:unhideWhenUsed="1" w:qFormat="1"/>
+    <w:lsdException w:name="heading 2" w:semiHidden="1" w:uiPriority="9" w:unhideWhenUsed="1" w:qFormat="1"/>
+    <w:lsdException w:name="heading 3" w:semiHidden="1" w:uiPriority="9" w:unhideWhenUsed="1" w:qFormat="1"/>
+    <w:lsdException w:name="heading 4" w:semiHidden="1" w:uiPriority="9" w:unhideWhenUsed="1" w:qFormat="1"/>
+    <w:lsdException w:name="heading 5" w:semiHidden="1" w:uiPriority="9" w:unhideWhenUsed="1" w:qFormat="1"/>
+    <w:lsdException w:name="heading 6" w:semiHidden="1" w:uiPriority="9" w:unhideWhenUsed="1" w:qFormat="1"/>
+    <w:lsdException w:name="heading 7" w:semiHidden="1" w:uiPriority="9" w:unhideWhenUsed="1" w:qFormat="1"/>
+    <w:lsdException w:name="heading 8" w:semiHidden="1" w:uiPriority="9" w:unhideWhenUsed="1" w:qFormat="1"/>
+    <w:lsdException w:name="heading 9" w:semiHidden="1" w:uiPriority="9" w:unhideWhenUsed="1" w:qFormat="1"/>
     <w:lsdException w:name="index 1" w:semiHidden="1" w:unhideWhenUsed="1"/>
     <w:lsdException w:name="index 2" w:semiHidden="1" w:unhideWhenUsed="1"/>
     <w:lsdException w:name="index 3" w:semiHidden="1" w:unhideWhenUsed="1"/>
@@ -5666,22 +4908,22 @@
     <w:lsdException w:name="index 7" w:semiHidden="1" w:unhideWhenUsed="1"/>
     <w:lsdException w:name="index 8" w:semiHidden="1" w:unhideWhenUsed="1"/>
     <w:lsdException w:name="index 9" w:semiHidden="1" w:unhideWhenUsed="1"/>
-    <w:lsdException w:name="toc 1" w:uiPriority="39" w:semiHidden="1" w:unhideWhenUsed="1"/>
-    <w:lsdException w:name="toc 2" w:uiPriority="39" w:semiHidden="1" w:unhideWhenUsed="1"/>
-    <w:lsdException w:name="toc 3" w:uiPriority="39" w:semiHidden="1" w:unhideWhenUsed="1"/>
-    <w:lsdException w:name="toc 4" w:uiPriority="39" w:semiHidden="1" w:unhideWhenUsed="1"/>
-    <w:lsdException w:name="toc 5" w:uiPriority="39" w:semiHidden="1" w:unhideWhenUsed="1"/>
-    <w:lsdException w:name="toc 6" w:uiPriority="39" w:semiHidden="1" w:unhideWhenUsed="1"/>
-    <w:lsdException w:name="toc 7" w:uiPriority="39" w:semiHidden="1" w:unhideWhenUsed="1"/>
-    <w:lsdException w:name="toc 8" w:uiPriority="39" w:semiHidden="1" w:unhideWhenUsed="1"/>
-    <w:lsdException w:name="toc 9" w:uiPriority="39" w:semiHidden="1" w:unhideWhenUsed="1"/>
+    <w:lsdException w:name="toc 1" w:semiHidden="1" w:uiPriority="39" w:unhideWhenUsed="1"/>
+    <w:lsdException w:name="toc 2" w:semiHidden="1" w:uiPriority="39" w:unhideWhenUsed="1"/>
+    <w:lsdException w:name="toc 3" w:semiHidden="1" w:uiPriority="39" w:unhideWhenUsed="1"/>
+    <w:lsdException w:name="toc 4" w:semiHidden="1" w:uiPriority="39" w:unhideWhenUsed="1"/>
+    <w:lsdException w:name="toc 5" w:semiHidden="1" w:uiPriority="39" w:unhideWhenUsed="1"/>
+    <w:lsdException w:name="toc 6" w:semiHidden="1" w:uiPriority="39" w:unhideWhenUsed="1"/>
+    <w:lsdException w:name="toc 7" w:semiHidden="1" w:uiPriority="39" w:unhideWhenUsed="1"/>
+    <w:lsdException w:name="toc 8" w:semiHidden="1" w:uiPriority="39" w:unhideWhenUsed="1"/>
+    <w:lsdException w:name="toc 9" w:semiHidden="1" w:uiPriority="39" w:unhideWhenUsed="1"/>
     <w:lsdException w:name="Normal Indent" w:semiHidden="1" w:unhideWhenUsed="1"/>
     <w:lsdException w:name="footnote text" w:semiHidden="1" w:unhideWhenUsed="1"/>
     <w:lsdException w:name="annotation text" w:semiHidden="1" w:unhideWhenUsed="1"/>
     <w:lsdException w:name="header" w:semiHidden="1" w:unhideWhenUsed="1"/>
     <w:lsdException w:name="footer" w:semiHidden="1" w:unhideWhenUsed="1"/>
     <w:lsdException w:name="index heading" w:semiHidden="1" w:unhideWhenUsed="1"/>
-    <w:lsdException w:name="caption" w:uiPriority="35" w:semiHidden="1" w:unhideWhenUsed="1" w:qFormat="1"/>
+    <w:lsdException w:name="caption" w:semiHidden="1" w:uiPriority="35" w:unhideWhenUsed="1" w:qFormat="1"/>
     <w:lsdException w:name="table of figures" w:semiHidden="1" w:unhideWhenUsed="1"/>
     <w:lsdException w:name="envelope address" w:semiHidden="1" w:unhideWhenUsed="1"/>
     <w:lsdException w:name="envelope return" w:semiHidden="1" w:unhideWhenUsed="1"/>
@@ -5712,7 +4954,7 @@
     <w:lsdException w:name="Title" w:uiPriority="10" w:qFormat="1"/>
     <w:lsdException w:name="Closing" w:semiHidden="1" w:unhideWhenUsed="1"/>
     <w:lsdException w:name="Signature" w:semiHidden="1" w:unhideWhenUsed="1"/>
-    <w:lsdException w:name="Default Paragraph Font" w:uiPriority="1" w:semiHidden="1" w:unhideWhenUsed="1"/>
+    <w:lsdException w:name="Default Paragraph Font" w:semiHidden="1" w:uiPriority="1" w:unhideWhenUsed="1"/>
     <w:lsdException w:name="Body Text" w:semiHidden="1" w:unhideWhenUsed="1"/>
     <w:lsdException w:name="Body Text Indent" w:semiHidden="1" w:unhideWhenUsed="1"/>
     <w:lsdException w:name="List Continue" w:semiHidden="1" w:unhideWhenUsed="1"/>
@@ -5912,8 +5154,8 @@
     <w:lsdException w:name="Subtle Reference" w:uiPriority="31" w:qFormat="1"/>
     <w:lsdException w:name="Intense Reference" w:uiPriority="32" w:qFormat="1"/>
     <w:lsdException w:name="Book Title" w:uiPriority="33" w:qFormat="1"/>
-    <w:lsdException w:name="Bibliography" w:uiPriority="37" w:semiHidden="1" w:unhideWhenUsed="1"/>
-    <w:lsdException w:name="TOC Heading" w:uiPriority="39" w:semiHidden="1" w:unhideWhenUsed="1" w:qFormat="1"/>
+    <w:lsdException w:name="Bibliography" w:semiHidden="1" w:uiPriority="37" w:unhideWhenUsed="1"/>
+    <w:lsdException w:name="TOC Heading" w:semiHidden="1" w:uiPriority="39" w:unhideWhenUsed="1" w:qFormat="1"/>
     <w:lsdException w:name="Plain Table 1" w:uiPriority="41"/>
     <w:lsdException w:name="Plain Table 2" w:uiPriority="42"/>
     <w:lsdException w:name="Plain Table 3" w:uiPriority="43"/>
@@ -6018,13 +5260,8 @@
     <w:lsdException w:name="List Table 5 Dark Accent 6" w:uiPriority="50"/>
     <w:lsdException w:name="List Table 6 Colorful Accent 6" w:uiPriority="51"/>
     <w:lsdException w:name="List Table 7 Colorful Accent 6" w:uiPriority="52"/>
-    <w:lsdException w:name="Mention" w:semiHidden="1" w:unhideWhenUsed="1"/>
-    <w:lsdException w:name="Smart Hyperlink" w:semiHidden="1" w:unhideWhenUsed="1"/>
-    <w:lsdException w:name="Hashtag" w:semiHidden="1" w:unhideWhenUsed="1"/>
-    <w:lsdException w:name="Unresolved Mention" w:semiHidden="1" w:unhideWhenUsed="1"/>
-    <w:lsdException w:name="Smart Link" w:semiHidden="1" w:unhideWhenUsed="1"/>
   </w:latentStyles>
-  <w:style w:type="paragraph" w:styleId="Normal" w:default="1">
+  <w:style w:type="paragraph" w:default="1" w:styleId="Normal">
     <w:name w:val="Normal"/>
     <w:qFormat/>
   </w:style>
@@ -6150,13 +5387,13 @@
       <w:szCs w:val="20"/>
     </w:rPr>
   </w:style>
-  <w:style w:type="character" w:styleId="Fontepargpadro" w:default="1">
+  <w:style w:type="character" w:default="1" w:styleId="Fontepargpadro">
     <w:name w:val="Default Paragraph Font"/>
     <w:uiPriority w:val="1"/>
     <w:semiHidden/>
     <w:unhideWhenUsed/>
   </w:style>
-  <w:style w:type="table" w:styleId="Tabelanormal" w:default="1">
+  <w:style w:type="table" w:default="1" w:styleId="Tabelanormal">
     <w:name w:val="Normal Table"/>
     <w:uiPriority w:val="99"/>
     <w:semiHidden/>
@@ -6171,13 +5408,13 @@
       </w:tblCellMar>
     </w:tblPr>
   </w:style>
-  <w:style w:type="numbering" w:styleId="Semlista" w:default="1">
+  <w:style w:type="numbering" w:default="1" w:styleId="Semlista">
     <w:name w:val="No List"/>
     <w:uiPriority w:val="99"/>
     <w:semiHidden/>
     <w:unhideWhenUsed/>
   </w:style>
-  <w:style w:type="table" w:styleId="TableNormal" w:customStyle="1">
+  <w:style w:type="table" w:customStyle="1" w:styleId="TableNormal">
     <w:name w:val="TableNormal"/>
     <w:tblPr>
       <w:tblCellMar>
@@ -6218,7 +5455,7 @@
       <w:spacing w:before="360" w:after="80"/>
     </w:pPr>
     <w:rPr>
-      <w:rFonts w:ascii="Georgia" w:hAnsi="Georgia" w:eastAsia="Georgia" w:cs="Georgia"/>
+      <w:rFonts w:ascii="Georgia" w:eastAsia="Georgia" w:hAnsi="Georgia" w:cs="Georgia"/>
       <w:i/>
       <w:iCs/>
       <w:color w:val="666666"/>
@@ -6226,7 +5463,7 @@
       <w:szCs w:val="48"/>
     </w:rPr>
   </w:style>
-  <w:style w:type="table" w:styleId="a" w:customStyle="1">
+  <w:style w:type="table" w:customStyle="1" w:styleId="a">
     <w:basedOn w:val="TableNormal"/>
     <w:tblPr>
       <w:tblStyleRowBandSize w:val="1"/>
@@ -6239,7 +5476,7 @@
       </w:tblCellMar>
     </w:tblPr>
   </w:style>
-  <w:style w:type="table" w:styleId="a0" w:customStyle="1">
+  <w:style w:type="table" w:customStyle="1" w:styleId="a0">
     <w:basedOn w:val="TableNormal"/>
     <w:tblPr>
       <w:tblStyleRowBandSize w:val="1"/>

</xml_diff>

<commit_message>
docs: ajustes no texto do resumo e do capitulo  1 V1.3
</commit_message>
<xml_diff>
--- a/PID_Relatório_5o_e_6o.Períodos_2026.docx
+++ b/PID_Relatório_5o_e_6o.Períodos_2026.docx
@@ -1,6 +1,6 @@
 
 <file path=word/document.xml><?xml version="1.0" encoding="utf-8"?>
-<w:document xmlns:wpc="http://schemas.microsoft.com/office/word/2010/wordprocessingCanvas" xmlns:cx="http://schemas.microsoft.com/office/drawing/2014/chartex" xmlns:mc="http://schemas.openxmlformats.org/markup-compatibility/2006" xmlns:o="urn:schemas-microsoft-com:office:office" xmlns:r="http://schemas.openxmlformats.org/officeDocument/2006/relationships" xmlns:m="http://schemas.openxmlformats.org/officeDocument/2006/math" xmlns:v="urn:schemas-microsoft-com:vml" xmlns:wp14="http://schemas.microsoft.com/office/word/2010/wordprocessingDrawing" xmlns:wp="http://schemas.openxmlformats.org/drawingml/2006/wordprocessingDrawing" xmlns:w10="urn:schemas-microsoft-com:office:word" xmlns:w="http://schemas.openxmlformats.org/wordprocessingml/2006/main" xmlns:w14="http://schemas.microsoft.com/office/word/2010/wordml" xmlns:w15="http://schemas.microsoft.com/office/word/2012/wordml" xmlns:w16se="http://schemas.microsoft.com/office/word/2015/wordml/symex" xmlns:wpg="http://schemas.microsoft.com/office/word/2010/wordprocessingGroup" xmlns:wpi="http://schemas.microsoft.com/office/word/2010/wordprocessingInk" xmlns:wne="http://schemas.microsoft.com/office/word/2006/wordml" xmlns:wps="http://schemas.microsoft.com/office/word/2010/wordprocessingShape" mc:Ignorable="w14 w15 w16se wp14">
+<w:document xmlns:wpc="http://schemas.microsoft.com/office/word/2010/wordprocessingCanvas" xmlns:cx="http://schemas.microsoft.com/office/drawing/2014/chartex" xmlns:mc="http://schemas.openxmlformats.org/markup-compatibility/2006" xmlns:o="urn:schemas-microsoft-com:office:office" xmlns:r="http://schemas.openxmlformats.org/officeDocument/2006/relationships" xmlns:m="http://schemas.openxmlformats.org/officeDocument/2006/math" xmlns:v="urn:schemas-microsoft-com:vml" xmlns:wp14="http://schemas.microsoft.com/office/word/2010/wordprocessingDrawing" xmlns:wp="http://schemas.openxmlformats.org/drawingml/2006/wordprocessingDrawing" xmlns:w10="urn:schemas-microsoft-com:office:word" xmlns:w="http://schemas.openxmlformats.org/wordprocessingml/2006/main" xmlns:w14="http://schemas.microsoft.com/office/word/2010/wordml" xmlns:w15="http://schemas.microsoft.com/office/word/2012/wordml" xmlns:w16se="http://schemas.microsoft.com/office/word/2015/wordml/symex" xmlns:wpg="http://schemas.microsoft.com/office/word/2010/wordprocessingGroup" xmlns:wpi="http://schemas.microsoft.com/office/word/2010/wordprocessingInk" xmlns:wne="http://schemas.microsoft.com/office/word/2006/wordml" xmlns:wps="http://schemas.microsoft.com/office/word/2010/wordprocessingShape" xmlns:a="http://schemas.openxmlformats.org/drawingml/2006/main" mc:Ignorable="w14 w15 w16se wp14">
   <w:body>
     <w:p>
       <w:pPr>
@@ -201,7 +201,6 @@
           <w:b/>
           <w:bCs/>
         </w:rPr>
-        <w:lastRenderedPageBreak/>
         <w:t>FAI – CENTRO DE ENSINO SUPERIOR EM GESTÃO, TECNOLOGIA E EDUCAÇÃO</w:t>
       </w:r>
     </w:p>
@@ -377,7 +376,6 @@
           <w:b/>
           <w:bCs/>
         </w:rPr>
-        <w:lastRenderedPageBreak/>
         <w:t xml:space="preserve">LISTA DE REVISÃO </w:t>
       </w:r>
     </w:p>
@@ -386,12 +384,12 @@
         <w:tblW w:w="8926" w:type="dxa"/>
         <w:tblInd w:w="288" w:type="dxa"/>
         <w:tblBorders>
-          <w:top w:val="single" w:sz="6" w:space="0" w:color="000000" w:themeColor="text1"/>
-          <w:left w:val="single" w:sz="6" w:space="0" w:color="000000" w:themeColor="text1"/>
-          <w:bottom w:val="single" w:sz="6" w:space="0" w:color="000000" w:themeColor="text1"/>
-          <w:right w:val="single" w:sz="6" w:space="0" w:color="000000" w:themeColor="text1"/>
-          <w:insideH w:val="single" w:sz="6" w:space="0" w:color="000000" w:themeColor="text1"/>
-          <w:insideV w:val="single" w:sz="6" w:space="0" w:color="000000" w:themeColor="text1"/>
+          <w:top w:val="single" w:color="000000" w:themeColor="text1" w:sz="6" w:space="0"/>
+          <w:left w:val="single" w:color="000000" w:themeColor="text1" w:sz="6" w:space="0"/>
+          <w:bottom w:val="single" w:color="000000" w:themeColor="text1" w:sz="6" w:space="0"/>
+          <w:right w:val="single" w:color="000000" w:themeColor="text1" w:sz="6" w:space="0"/>
+          <w:insideH w:val="single" w:color="000000" w:themeColor="text1" w:sz="6" w:space="0"/>
+          <w:insideV w:val="single" w:color="000000" w:themeColor="text1" w:sz="6" w:space="0"/>
         </w:tblBorders>
         <w:tblLayout w:type="fixed"/>
         <w:tblLook w:val="0000" w:firstRow="0" w:lastRow="0" w:firstColumn="0" w:lastColumn="0" w:noHBand="0" w:noVBand="0"/>
@@ -410,6 +408,7 @@
           <w:tcPr>
             <w:tcW w:w="1272" w:type="dxa"/>
             <w:shd w:val="clear" w:color="auto" w:fill="FFFFFF" w:themeFill="background1"/>
+            <w:tcMar/>
           </w:tcPr>
           <w:p>
             <w:pPr>
@@ -439,6 +438,7 @@
           <w:tcPr>
             <w:tcW w:w="1275" w:type="dxa"/>
             <w:shd w:val="clear" w:color="auto" w:fill="FFFFFF" w:themeFill="background1"/>
+            <w:tcMar/>
           </w:tcPr>
           <w:p>
             <w:pPr>
@@ -468,6 +468,7 @@
           <w:tcPr>
             <w:tcW w:w="1977" w:type="dxa"/>
             <w:shd w:val="clear" w:color="auto" w:fill="FFFFFF" w:themeFill="background1"/>
+            <w:tcMar/>
           </w:tcPr>
           <w:p>
             <w:pPr>
@@ -497,6 +498,7 @@
           <w:tcPr>
             <w:tcW w:w="4402" w:type="dxa"/>
             <w:shd w:val="clear" w:color="auto" w:fill="FFFFFF" w:themeFill="background1"/>
+            <w:tcMar/>
           </w:tcPr>
           <w:p>
             <w:pPr>
@@ -527,6 +529,7 @@
         <w:tc>
           <w:tcPr>
             <w:tcW w:w="1272" w:type="dxa"/>
+            <w:tcMar/>
           </w:tcPr>
           <w:p>
             <w:pPr>
@@ -554,6 +557,7 @@
         <w:tc>
           <w:tcPr>
             <w:tcW w:w="1275" w:type="dxa"/>
+            <w:tcMar/>
           </w:tcPr>
           <w:p>
             <w:pPr>
@@ -561,60 +565,82 @@
               <w:jc w:val="center"/>
             </w:pPr>
             <w:r>
-              <w:t>V1.0</w:t>
+              <w:rPr/>
+              <w:t>v</w:t>
+            </w:r>
+            <w:r>
+              <w:rPr/>
+              <w:t>1.0</w:t>
             </w:r>
           </w:p>
         </w:tc>
         <w:tc>
           <w:tcPr>
             <w:tcW w:w="1977" w:type="dxa"/>
+            <w:tcMar/>
           </w:tcPr>
           <w:p>
             <w:pPr>
+              <w:pStyle w:val="Normal"/>
+              <w:suppressLineNumbers w:val="0"/>
               <w:pBdr>
-                <w:top w:val="nil"/>
-                <w:left w:val="nil"/>
-                <w:bottom w:val="nil"/>
-                <w:right w:val="nil"/>
-                <w:between w:val="nil"/>
+                <w:top w:val="nil" w:color="FF000000" w:sz="0" w:space="0"/>
+                <w:left w:val="nil" w:color="FF000000" w:sz="0" w:space="0"/>
+                <w:bottom w:val="nil" w:color="FF000000" w:sz="0" w:space="0"/>
+                <w:right w:val="nil" w:color="FF000000" w:sz="0" w:space="0"/>
+                <w:between w:val="nil" w:color="FF000000" w:sz="0" w:space="0"/>
               </w:pBdr>
-              <w:spacing w:before="40" w:after="40"/>
-              <w:rPr>
-                <w:color w:val="000000"/>
-              </w:rPr>
+              <w:bidi w:val="0"/>
+              <w:spacing w:before="40" w:beforeAutospacing="off" w:after="40" w:afterAutospacing="off" w:line="360" w:lineRule="auto"/>
+              <w:ind w:left="0" w:right="0"/>
+              <w:jc w:val="left"/>
             </w:pPr>
             <w:r>
               <w:rPr>
-                <w:color w:val="000000"/>
-              </w:rPr>
-              <w:t>JOSÉ ALFREDO</w:t>
+                <w:color w:val="000000" w:themeColor="text1" w:themeTint="FF" w:themeShade="FF"/>
+              </w:rPr>
+              <w:t>José Alfredo</w:t>
             </w:r>
           </w:p>
         </w:tc>
         <w:tc>
           <w:tcPr>
             <w:tcW w:w="4402" w:type="dxa"/>
+            <w:tcMar/>
           </w:tcPr>
           <w:p>
             <w:pPr>
+              <w:pStyle w:val="Normal"/>
+              <w:suppressLineNumbers w:val="0"/>
               <w:pBdr>
-                <w:top w:val="nil"/>
-                <w:left w:val="nil"/>
-                <w:bottom w:val="nil"/>
-                <w:right w:val="nil"/>
-                <w:between w:val="nil"/>
+                <w:top w:val="nil" w:color="FF000000" w:sz="0" w:space="0"/>
+                <w:left w:val="nil" w:color="FF000000" w:sz="0" w:space="0"/>
+                <w:bottom w:val="nil" w:color="FF000000" w:sz="0" w:space="0"/>
+                <w:right w:val="nil" w:color="FF000000" w:sz="0" w:space="0"/>
+                <w:between w:val="nil" w:color="FF000000" w:sz="0" w:space="0"/>
               </w:pBdr>
-              <w:spacing w:before="40" w:after="40"/>
+              <w:bidi w:val="0"/>
+              <w:spacing w:before="40" w:beforeAutospacing="off" w:after="40" w:afterAutospacing="off" w:line="360" w:lineRule="auto"/>
+              <w:ind w:left="0" w:right="0"/>
               <w:jc w:val="both"/>
-              <w:rPr>
-                <w:color w:val="000000"/>
-              </w:rPr>
             </w:pPr>
             <w:r>
               <w:rPr>
-                <w:color w:val="000000"/>
-              </w:rPr>
-              <w:t>INTRODUÇÃO E CAPITULO 1</w:t>
+                <w:color w:val="000000" w:themeColor="text1" w:themeTint="FF" w:themeShade="FF"/>
+              </w:rPr>
+              <w:t xml:space="preserve">Introdução e </w:t>
+            </w:r>
+            <w:r>
+              <w:rPr>
+                <w:color w:val="000000" w:themeColor="text1" w:themeTint="FF" w:themeShade="FF"/>
+              </w:rPr>
+              <w:t>Capítulo</w:t>
+            </w:r>
+            <w:r>
+              <w:rPr>
+                <w:color w:val="000000" w:themeColor="text1" w:themeTint="FF" w:themeShade="FF"/>
+              </w:rPr>
+              <w:t xml:space="preserve"> 1</w:t>
             </w:r>
           </w:p>
         </w:tc>
@@ -626,6 +652,7 @@
         <w:tc>
           <w:tcPr>
             <w:tcW w:w="1272" w:type="dxa"/>
+            <w:tcMar/>
           </w:tcPr>
           <w:p>
             <w:pPr>
@@ -645,6 +672,7 @@
         <w:tc>
           <w:tcPr>
             <w:tcW w:w="1275" w:type="dxa"/>
+            <w:tcMar/>
           </w:tcPr>
           <w:p>
             <w:pPr>
@@ -655,33 +683,51 @@
             </w:pPr>
             <w:r>
               <w:rPr>
-                <w:color w:val="000000" w:themeColor="text1"/>
-              </w:rPr>
-              <w:t>V1.1</w:t>
+                <w:color w:val="000000" w:themeColor="text1" w:themeTint="FF" w:themeShade="FF"/>
+              </w:rPr>
+              <w:t>v</w:t>
+            </w:r>
+            <w:r>
+              <w:rPr>
+                <w:color w:val="000000" w:themeColor="text1" w:themeTint="FF" w:themeShade="FF"/>
+              </w:rPr>
+              <w:t>1.1</w:t>
             </w:r>
           </w:p>
         </w:tc>
         <w:tc>
           <w:tcPr>
             <w:tcW w:w="1977" w:type="dxa"/>
+            <w:tcMar/>
           </w:tcPr>
           <w:p>
             <w:pPr>
-              <w:rPr>
-                <w:color w:val="000000" w:themeColor="text1"/>
+              <w:pStyle w:val="Normal"/>
+              <w:suppressLineNumbers w:val="0"/>
+              <w:bidi w:val="0"/>
+              <w:spacing w:before="0" w:beforeAutospacing="off" w:after="240" w:afterAutospacing="off" w:line="360" w:lineRule="auto"/>
+              <w:ind w:left="0" w:right="0"/>
+              <w:jc w:val="left"/>
+              <w:rPr>
+                <w:color w:val="000000" w:themeColor="text1" w:themeTint="FF" w:themeShade="FF"/>
               </w:rPr>
             </w:pPr>
             <w:r>
               <w:rPr>
-                <w:color w:val="000000" w:themeColor="text1"/>
-              </w:rPr>
-              <w:t>BRUNO EDUARDO</w:t>
+                <w:rFonts w:ascii="Times New Roman" w:hAnsi="Times New Roman" w:eastAsia="Times New Roman" w:cs="Times New Roman"/>
+                <w:color w:val="000000" w:themeColor="text1" w:themeTint="FF" w:themeShade="FF"/>
+                <w:sz w:val="24"/>
+                <w:szCs w:val="24"/>
+                <w:lang w:eastAsia="pt-BR" w:bidi="ar-SA"/>
+              </w:rPr>
+              <w:t>Bruno Eduardo</w:t>
             </w:r>
           </w:p>
         </w:tc>
         <w:tc>
           <w:tcPr>
             <w:tcW w:w="4402" w:type="dxa"/>
+            <w:tcMar/>
           </w:tcPr>
           <w:p>
             <w:pPr>
@@ -692,9 +738,27 @@
             </w:pPr>
             <w:r>
               <w:rPr>
-                <w:color w:val="000000" w:themeColor="text1"/>
-              </w:rPr>
-              <w:t>CAPITULO 1 (2.6, 2.7 e 2.8)</w:t>
+                <w:color w:val="000000" w:themeColor="text1" w:themeTint="FF" w:themeShade="FF"/>
+              </w:rPr>
+              <w:t>Ca</w:t>
+            </w:r>
+            <w:r>
+              <w:rPr>
+                <w:color w:val="000000" w:themeColor="text1" w:themeTint="FF" w:themeShade="FF"/>
+              </w:rPr>
+              <w:t>pítulo</w:t>
+            </w:r>
+            <w:r>
+              <w:rPr>
+                <w:color w:val="000000" w:themeColor="text1" w:themeTint="FF" w:themeShade="FF"/>
+              </w:rPr>
+              <w:t xml:space="preserve"> 1</w:t>
+            </w:r>
+            <w:r>
+              <w:rPr>
+                <w:color w:val="000000" w:themeColor="text1" w:themeTint="FF" w:themeShade="FF"/>
+              </w:rPr>
+              <w:t xml:space="preserve"> (2.6, 2.7 e 2.8)</w:t>
             </w:r>
           </w:p>
         </w:tc>
@@ -706,6 +770,7 @@
         <w:tc>
           <w:tcPr>
             <w:tcW w:w="1272" w:type="dxa"/>
+            <w:tcMar/>
           </w:tcPr>
           <w:p>
             <w:pPr>
@@ -725,6 +790,7 @@
         <w:tc>
           <w:tcPr>
             <w:tcW w:w="1275" w:type="dxa"/>
+            <w:tcMar/>
           </w:tcPr>
           <w:p>
             <w:pPr>
@@ -735,33 +801,44 @@
             </w:pPr>
             <w:r>
               <w:rPr>
-                <w:color w:val="000000" w:themeColor="text1"/>
-              </w:rPr>
-              <w:t>V1.2</w:t>
+                <w:color w:val="000000" w:themeColor="text1" w:themeTint="FF" w:themeShade="FF"/>
+              </w:rPr>
+              <w:t>v</w:t>
+            </w:r>
+            <w:r>
+              <w:rPr>
+                <w:color w:val="000000" w:themeColor="text1" w:themeTint="FF" w:themeShade="FF"/>
+              </w:rPr>
+              <w:t>1.2</w:t>
             </w:r>
           </w:p>
         </w:tc>
         <w:tc>
           <w:tcPr>
             <w:tcW w:w="1977" w:type="dxa"/>
+            <w:tcMar/>
           </w:tcPr>
           <w:p>
             <w:pPr>
-              <w:rPr>
-                <w:color w:val="000000" w:themeColor="text1"/>
-              </w:rPr>
+              <w:pStyle w:val="Normal"/>
+              <w:suppressLineNumbers w:val="0"/>
+              <w:bidi w:val="0"/>
+              <w:spacing w:before="0" w:beforeAutospacing="off" w:after="240" w:afterAutospacing="off" w:line="360" w:lineRule="auto"/>
+              <w:ind w:left="0" w:right="0"/>
+              <w:jc w:val="left"/>
             </w:pPr>
             <w:r>
               <w:rPr>
-                <w:color w:val="000000" w:themeColor="text1"/>
-              </w:rPr>
-              <w:t>MARCELA</w:t>
+                <w:color w:val="000000" w:themeColor="text1" w:themeTint="FF" w:themeShade="FF"/>
+              </w:rPr>
+              <w:t>Marcela</w:t>
             </w:r>
           </w:p>
         </w:tc>
         <w:tc>
           <w:tcPr>
             <w:tcW w:w="4402" w:type="dxa"/>
+            <w:tcMar/>
           </w:tcPr>
           <w:p>
             <w:pPr>
@@ -772,9 +849,164 @@
             </w:pPr>
             <w:r>
               <w:rPr>
-                <w:color w:val="000000" w:themeColor="text1"/>
-              </w:rPr>
-              <w:t>RESUMO E CAPITULO 1 (2.5)</w:t>
+                <w:color w:val="000000" w:themeColor="text1" w:themeTint="FF" w:themeShade="FF"/>
+              </w:rPr>
+              <w:t>R</w:t>
+            </w:r>
+            <w:r>
+              <w:rPr>
+                <w:color w:val="000000" w:themeColor="text1" w:themeTint="FF" w:themeShade="FF"/>
+              </w:rPr>
+              <w:t xml:space="preserve">esumo e </w:t>
+            </w:r>
+            <w:r>
+              <w:rPr>
+                <w:color w:val="000000" w:themeColor="text1" w:themeTint="FF" w:themeShade="FF"/>
+              </w:rPr>
+              <w:t>Capítulo</w:t>
+            </w:r>
+            <w:r>
+              <w:rPr>
+                <w:color w:val="000000" w:themeColor="text1" w:themeTint="FF" w:themeShade="FF"/>
+              </w:rPr>
+              <w:t xml:space="preserve"> 1</w:t>
+            </w:r>
+            <w:r>
+              <w:rPr>
+                <w:color w:val="000000" w:themeColor="text1" w:themeTint="FF" w:themeShade="FF"/>
+              </w:rPr>
+              <w:t xml:space="preserve"> (2.5)</w:t>
+            </w:r>
+          </w:p>
+        </w:tc>
+      </w:tr>
+      <w:tr>
+        <w:trPr>
+          <w:trHeight w:val="300"/>
+        </w:trPr>
+        <w:tc>
+          <w:tcPr>
+            <w:tcW w:w="1272" w:type="dxa"/>
+            <w:tcMar/>
+          </w:tcPr>
+          <w:p>
+            <w:pPr>
+              <w:pStyle w:val="Normal"/>
+              <w:jc w:val="center"/>
+              <w:rPr>
+                <w:color w:val="000000" w:themeColor="text1" w:themeTint="FF" w:themeShade="FF"/>
+              </w:rPr>
+            </w:pPr>
+            <w:r>
+              <w:rPr>
+                <w:color w:val="000000" w:themeColor="text1" w:themeTint="FF" w:themeShade="FF"/>
+              </w:rPr>
+              <w:t>13/03/26</w:t>
+            </w:r>
+          </w:p>
+        </w:tc>
+        <w:tc>
+          <w:tcPr>
+            <w:tcW w:w="1275" w:type="dxa"/>
+            <w:tcMar/>
+          </w:tcPr>
+          <w:p>
+            <w:pPr>
+              <w:pStyle w:val="Normal"/>
+              <w:jc w:val="center"/>
+              <w:rPr>
+                <w:color w:val="000000" w:themeColor="text1" w:themeTint="FF" w:themeShade="FF"/>
+              </w:rPr>
+            </w:pPr>
+            <w:r>
+              <w:rPr>
+                <w:color w:val="000000" w:themeColor="text1" w:themeTint="FF" w:themeShade="FF"/>
+              </w:rPr>
+              <w:t>V1.3</w:t>
+            </w:r>
+          </w:p>
+        </w:tc>
+        <w:tc>
+          <w:tcPr>
+            <w:tcW w:w="1977" w:type="dxa"/>
+            <w:tcMar/>
+          </w:tcPr>
+          <w:p>
+            <w:pPr>
+              <w:pStyle w:val="Normal"/>
+              <w:spacing w:line="360" w:lineRule="auto"/>
+              <w:jc w:val="left"/>
+              <w:rPr>
+                <w:color w:val="000000" w:themeColor="text1" w:themeTint="FF" w:themeShade="FF"/>
+              </w:rPr>
+            </w:pPr>
+            <w:r>
+              <w:rPr>
+                <w:color w:val="000000" w:themeColor="text1" w:themeTint="FF" w:themeShade="FF"/>
+              </w:rPr>
+              <w:t>Bruno Eduardo</w:t>
+            </w:r>
+          </w:p>
+        </w:tc>
+        <w:tc>
+          <w:tcPr>
+            <w:tcW w:w="4402" w:type="dxa"/>
+            <w:tcMar/>
+          </w:tcPr>
+          <w:p>
+            <w:pPr>
+              <w:pStyle w:val="Normal"/>
+              <w:jc w:val="both"/>
+            </w:pPr>
+            <w:r>
+              <w:rPr>
+                <w:rFonts w:ascii="Times New Roman" w:hAnsi="Times New Roman" w:eastAsia="Times New Roman" w:cs="Times New Roman"/>
+                <w:noProof w:val="0"/>
+                <w:sz w:val="24"/>
+                <w:szCs w:val="24"/>
+                <w:lang w:val="pt-BR"/>
+              </w:rPr>
+              <w:t xml:space="preserve">Resumo e </w:t>
+            </w:r>
+            <w:r>
+              <w:rPr>
+                <w:rFonts w:ascii="Times New Roman" w:hAnsi="Times New Roman" w:eastAsia="Times New Roman" w:cs="Times New Roman"/>
+                <w:noProof w:val="0"/>
+                <w:sz w:val="24"/>
+                <w:szCs w:val="24"/>
+                <w:lang w:val="pt-BR"/>
+              </w:rPr>
+              <w:t>Capítulo</w:t>
+            </w:r>
+            <w:r>
+              <w:rPr>
+                <w:rFonts w:ascii="Times New Roman" w:hAnsi="Times New Roman" w:eastAsia="Times New Roman" w:cs="Times New Roman"/>
+                <w:noProof w:val="0"/>
+                <w:sz w:val="24"/>
+                <w:szCs w:val="24"/>
+                <w:lang w:val="pt-BR"/>
+              </w:rPr>
+              <w:t xml:space="preserve"> 1 (A</w:t>
+            </w:r>
+            <w:r>
+              <w:rPr>
+                <w:rFonts w:ascii="Times New Roman" w:hAnsi="Times New Roman" w:eastAsia="Times New Roman" w:cs="Times New Roman"/>
+                <w:noProof w:val="0"/>
+                <w:sz w:val="24"/>
+                <w:szCs w:val="24"/>
+                <w:lang w:val="pt-BR"/>
+              </w:rPr>
+              <w:t>justes no texto</w:t>
+            </w:r>
+            <w:r>
+              <w:rPr>
+                <w:rFonts w:ascii="Times New Roman" w:hAnsi="Times New Roman" w:eastAsia="Times New Roman" w:cs="Times New Roman"/>
+                <w:noProof w:val="0"/>
+                <w:sz w:val="24"/>
+                <w:szCs w:val="24"/>
+                <w:lang w:val="pt-BR"/>
+              </w:rPr>
+              <w:t>)</w:t>
             </w:r>
           </w:p>
         </w:tc>
@@ -793,7 +1025,7 @@
       <w:pPr>
         <w:jc w:val="center"/>
       </w:pPr>
-      <w:bookmarkStart w:id="0" w:name="_ch6ot5knti9w" w:colFirst="0" w:colLast="0"/>
+      <w:bookmarkStart w:name="_ch6ot5knti9w" w:colFirst="0" w:colLast="0" w:id="0"/>
       <w:bookmarkEnd w:id="0"/>
       <w:r>
         <w:br w:type="page"/>
@@ -803,7 +1035,6 @@
           <w:b/>
           <w:bCs/>
         </w:rPr>
-        <w:lastRenderedPageBreak/>
         <w:t>AGRADECIMENTOS</w:t>
       </w:r>
     </w:p>
@@ -819,36 +1050,42 @@
           <w:b/>
           <w:bCs/>
         </w:rPr>
-        <w:lastRenderedPageBreak/>
         <w:t>RESUMO</w:t>
       </w:r>
     </w:p>
     <w:p>
-      <w:r>
+      <w:pPr>
+        <w:jc w:val="center"/>
+      </w:pPr>
+      <w:r>
+        <w:rPr/>
         <w:t xml:space="preserve">Com o aumento do envelhecimento da população nas últimas décadas, houve dificuldades para os familiares na organização das atividades diárias e no acompanhamento adequado da rotina de cuidado, necessitando do auxílio de cuidadores especializados. Devido à dificuldade de encontrar cuidadores confiáveis, o </w:t>
       </w:r>
-      <w:proofErr w:type="spellStart"/>
-      <w:r>
+      <w:r>
+        <w:rPr/>
         <w:t>ElderConnect</w:t>
       </w:r>
-      <w:proofErr w:type="spellEnd"/>
-      <w:r>
+      <w:r>
+        <w:rPr/>
         <w:t xml:space="preserve"> foi criado com o objetivo de auxiliar na conexão entre cuidadores e familiares, além de contribuir para o gerenciamento das atividades de cuidado. O sistema será projetado usando Java e </w:t>
       </w:r>
-      <w:proofErr w:type="spellStart"/>
-      <w:r>
+      <w:r>
+        <w:rPr/>
         <w:t>PostSQL</w:t>
       </w:r>
-      <w:proofErr w:type="spellEnd"/>
-      <w:r>
+      <w:r>
+        <w:rPr/>
         <w:t xml:space="preserve"> para banco de dados. O objetivo é desenvolver um sistema que auxilie e facilite o cuidado com pessoas idosas.</w:t>
       </w:r>
     </w:p>
     <w:p>
-      <w:r>
-        <w:rPr>
-          <w:b/>
-          <w:bCs/>
+      <w:pPr>
+        <w:jc w:val="left"/>
+      </w:pPr>
+      <w:r>
+        <w:rPr>
+          <w:b w:val="1"/>
+          <w:bCs w:val="1"/>
         </w:rPr>
         <w:t xml:space="preserve">Palavras-chave: </w:t>
       </w:r>
@@ -859,18 +1096,29 @@
         <w:t xml:space="preserve">  </w:t>
       </w:r>
       <w:r>
-        <w:t xml:space="preserve">  Cuidado de idosos; Cuidadores; Gerenciamento de cuidados; Envelhecimento populacional</w:t>
+        <w:rPr/>
+        <w:t xml:space="preserve">  Cuidado de idosos; Cuidadores; Gerenciamento de cuidados; Envelhecimento </w:t>
+      </w:r>
+      <w:r>
+        <w:rPr/>
+        <w:t xml:space="preserve">populacional</w:t>
       </w:r>
       <w:r>
         <w:br w:type="page"/>
       </w:r>
       <w:r>
         <w:rPr>
-          <w:b/>
-          <w:bCs/>
-        </w:rPr>
-        <w:lastRenderedPageBreak/>
-        <w:t>LISTA DE FIGURAS</w:t>
+          <w:b w:val="1"/>
+          <w:bCs w:val="1"/>
+        </w:rPr>
+        <w:t>LISTA</w:t>
+      </w:r>
+      <w:r>
+        <w:rPr>
+          <w:b w:val="1"/>
+          <w:bCs w:val="1"/>
+        </w:rPr>
+        <w:t xml:space="preserve"> DE FIGURAS</w:t>
       </w:r>
       <w:r>
         <w:rPr>
@@ -920,7 +1168,7 @@
                             <w:pPr>
                               <w:suppressAutoHyphens/>
                               <w:spacing w:line="1" w:lineRule="atLeast"/>
-                              <w:ind w:leftChars="-1" w:hangingChars="1" w:hanging="2"/>
+                              <w:ind w:leftChars="-1" w:hanging="2" w:hangingChars="1"/>
                               <w:textDirection w:val="btLr"/>
                               <w:textAlignment w:val="top"/>
                               <w:outlineLvl w:val="0"/>
@@ -933,7 +1181,7 @@
                             <w:pPr>
                               <w:suppressAutoHyphens/>
                               <w:spacing w:line="1" w:lineRule="atLeast"/>
-                              <w:ind w:leftChars="-1" w:hangingChars="1" w:hanging="2"/>
+                              <w:ind w:leftChars="-1" w:hanging="2" w:hangingChars="1"/>
                               <w:textDirection w:val="btLr"/>
                               <w:textAlignment w:val="top"/>
                               <w:outlineLvl w:val="0"/>
@@ -1026,7 +1274,6 @@
           <w:b/>
           <w:bCs/>
         </w:rPr>
-        <w:lastRenderedPageBreak/>
         <w:t>LISTA DE SIGLAS E ABREVIATURAS</w:t>
       </w:r>
     </w:p>
@@ -1378,8 +1625,13 @@
           <w:b/>
           <w:bCs/>
         </w:rPr>
-        <w:lastRenderedPageBreak/>
         <w:tab/>
+      </w:r>
+      <w:r>
+        <w:rPr>
+          <w:b/>
+          <w:bCs/>
+        </w:rPr>
         <w:t>SUMÁRIO</w:t>
       </w:r>
       <w:r>
@@ -1413,7 +1665,7 @@
               <w:tab w:val="right" w:pos="9062"/>
             </w:tabs>
             <w:rPr>
-              <w:rFonts w:ascii="Calibri" w:eastAsia="Calibri" w:hAnsi="Calibri" w:cs="Calibri"/>
+              <w:rFonts w:ascii="Calibri" w:hAnsi="Calibri" w:eastAsia="Calibri" w:cs="Calibri"/>
               <w:color w:val="000000"/>
               <w:sz w:val="22"/>
               <w:szCs w:val="22"/>
@@ -1440,6 +1692,11 @@
                 <w:color w:val="000000"/>
               </w:rPr>
               <w:tab/>
+            </w:r>
+            <w:r>
+              <w:rPr>
+                <w:color w:val="000000"/>
+              </w:rPr>
               <w:t>10</w:t>
             </w:r>
           </w:hyperlink>
@@ -1457,7 +1714,7 @@
               <w:tab w:val="right" w:pos="9062"/>
             </w:tabs>
             <w:rPr>
-              <w:rFonts w:ascii="Calibri" w:eastAsia="Calibri" w:hAnsi="Calibri" w:cs="Calibri"/>
+              <w:rFonts w:ascii="Calibri" w:hAnsi="Calibri" w:eastAsia="Calibri" w:cs="Calibri"/>
               <w:color w:val="000000"/>
               <w:sz w:val="22"/>
               <w:szCs w:val="22"/>
@@ -1475,6 +1732,11 @@
                 <w:color w:val="000000"/>
               </w:rPr>
               <w:tab/>
+            </w:r>
+            <w:r>
+              <w:rPr>
+                <w:color w:val="000000"/>
+              </w:rPr>
               <w:t>11</w:t>
             </w:r>
           </w:hyperlink>
@@ -1493,7 +1755,7 @@
             </w:tabs>
             <w:ind w:left="240"/>
             <w:rPr>
-              <w:rFonts w:ascii="Calibri" w:eastAsia="Calibri" w:hAnsi="Calibri" w:cs="Calibri"/>
+              <w:rFonts w:ascii="Calibri" w:hAnsi="Calibri" w:eastAsia="Calibri" w:cs="Calibri"/>
               <w:color w:val="000000"/>
               <w:sz w:val="22"/>
               <w:szCs w:val="22"/>
@@ -1511,6 +1773,11 @@
                 <w:color w:val="000000"/>
               </w:rPr>
               <w:tab/>
+            </w:r>
+            <w:r>
+              <w:rPr>
+                <w:color w:val="000000"/>
+              </w:rPr>
               <w:t>11</w:t>
             </w:r>
           </w:hyperlink>
@@ -1529,7 +1796,7 @@
             </w:tabs>
             <w:ind w:left="240"/>
             <w:rPr>
-              <w:rFonts w:ascii="Calibri" w:eastAsia="Calibri" w:hAnsi="Calibri" w:cs="Calibri"/>
+              <w:rFonts w:ascii="Calibri" w:hAnsi="Calibri" w:eastAsia="Calibri" w:cs="Calibri"/>
               <w:color w:val="000000"/>
               <w:sz w:val="22"/>
               <w:szCs w:val="22"/>
@@ -1547,6 +1814,11 @@
                 <w:color w:val="000000"/>
               </w:rPr>
               <w:tab/>
+            </w:r>
+            <w:r>
+              <w:rPr>
+                <w:color w:val="000000"/>
+              </w:rPr>
               <w:t>11</w:t>
             </w:r>
           </w:hyperlink>
@@ -1565,7 +1837,7 @@
             </w:tabs>
             <w:ind w:left="240"/>
             <w:rPr>
-              <w:rFonts w:ascii="Calibri" w:eastAsia="Calibri" w:hAnsi="Calibri" w:cs="Calibri"/>
+              <w:rFonts w:ascii="Calibri" w:hAnsi="Calibri" w:eastAsia="Calibri" w:cs="Calibri"/>
               <w:color w:val="000000"/>
               <w:sz w:val="22"/>
               <w:szCs w:val="22"/>
@@ -1583,6 +1855,11 @@
                 <w:color w:val="000000"/>
               </w:rPr>
               <w:tab/>
+            </w:r>
+            <w:r>
+              <w:rPr>
+                <w:color w:val="000000"/>
+              </w:rPr>
               <w:t>11</w:t>
             </w:r>
           </w:hyperlink>
@@ -1601,7 +1878,7 @@
             </w:tabs>
             <w:ind w:left="240"/>
             <w:rPr>
-              <w:rFonts w:ascii="Calibri" w:eastAsia="Calibri" w:hAnsi="Calibri" w:cs="Calibri"/>
+              <w:rFonts w:ascii="Calibri" w:hAnsi="Calibri" w:eastAsia="Calibri" w:cs="Calibri"/>
               <w:color w:val="000000"/>
               <w:sz w:val="22"/>
               <w:szCs w:val="22"/>
@@ -1619,6 +1896,11 @@
                 <w:color w:val="000000"/>
               </w:rPr>
               <w:tab/>
+            </w:r>
+            <w:r>
+              <w:rPr>
+                <w:color w:val="000000"/>
+              </w:rPr>
               <w:t>12</w:t>
             </w:r>
           </w:hyperlink>
@@ -1637,7 +1919,7 @@
             </w:tabs>
             <w:ind w:left="240"/>
             <w:rPr>
-              <w:rFonts w:ascii="Calibri" w:eastAsia="Calibri" w:hAnsi="Calibri" w:cs="Calibri"/>
+              <w:rFonts w:ascii="Calibri" w:hAnsi="Calibri" w:eastAsia="Calibri" w:cs="Calibri"/>
               <w:color w:val="000000"/>
               <w:sz w:val="22"/>
               <w:szCs w:val="22"/>
@@ -1655,6 +1937,11 @@
                 <w:color w:val="000000"/>
               </w:rPr>
               <w:tab/>
+            </w:r>
+            <w:r>
+              <w:rPr>
+                <w:color w:val="000000"/>
+              </w:rPr>
               <w:t>12</w:t>
             </w:r>
           </w:hyperlink>
@@ -1673,7 +1960,7 @@
             </w:tabs>
             <w:ind w:left="240"/>
             <w:rPr>
-              <w:rFonts w:ascii="Calibri" w:eastAsia="Calibri" w:hAnsi="Calibri" w:cs="Calibri"/>
+              <w:rFonts w:ascii="Calibri" w:hAnsi="Calibri" w:eastAsia="Calibri" w:cs="Calibri"/>
               <w:color w:val="000000"/>
               <w:sz w:val="22"/>
               <w:szCs w:val="22"/>
@@ -1691,6 +1978,11 @@
                 <w:color w:val="000000"/>
               </w:rPr>
               <w:tab/>
+            </w:r>
+            <w:r>
+              <w:rPr>
+                <w:color w:val="000000"/>
+              </w:rPr>
               <w:t>12</w:t>
             </w:r>
           </w:hyperlink>
@@ -1709,7 +2001,7 @@
             </w:tabs>
             <w:ind w:left="240"/>
             <w:rPr>
-              <w:rFonts w:ascii="Calibri" w:eastAsia="Calibri" w:hAnsi="Calibri" w:cs="Calibri"/>
+              <w:rFonts w:ascii="Calibri" w:hAnsi="Calibri" w:eastAsia="Calibri" w:cs="Calibri"/>
               <w:color w:val="000000"/>
               <w:sz w:val="22"/>
               <w:szCs w:val="22"/>
@@ -1727,6 +2019,11 @@
                 <w:color w:val="000000"/>
               </w:rPr>
               <w:tab/>
+            </w:r>
+            <w:r>
+              <w:rPr>
+                <w:color w:val="000000"/>
+              </w:rPr>
               <w:t>12</w:t>
             </w:r>
           </w:hyperlink>
@@ -1745,7 +2042,7 @@
             </w:tabs>
             <w:ind w:left="240"/>
             <w:rPr>
-              <w:rFonts w:ascii="Calibri" w:eastAsia="Calibri" w:hAnsi="Calibri" w:cs="Calibri"/>
+              <w:rFonts w:ascii="Calibri" w:hAnsi="Calibri" w:eastAsia="Calibri" w:cs="Calibri"/>
               <w:color w:val="000000"/>
               <w:sz w:val="22"/>
               <w:szCs w:val="22"/>
@@ -1763,6 +2060,11 @@
                 <w:color w:val="000000"/>
               </w:rPr>
               <w:tab/>
+            </w:r>
+            <w:r>
+              <w:rPr>
+                <w:color w:val="000000"/>
+              </w:rPr>
               <w:t>12</w:t>
             </w:r>
           </w:hyperlink>
@@ -1780,7 +2082,7 @@
               <w:tab w:val="right" w:pos="9062"/>
             </w:tabs>
             <w:rPr>
-              <w:rFonts w:ascii="Calibri" w:eastAsia="Calibri" w:hAnsi="Calibri" w:cs="Calibri"/>
+              <w:rFonts w:ascii="Calibri" w:hAnsi="Calibri" w:eastAsia="Calibri" w:cs="Calibri"/>
               <w:color w:val="000000"/>
               <w:sz w:val="22"/>
               <w:szCs w:val="22"/>
@@ -1798,6 +2100,11 @@
                 <w:color w:val="000000"/>
               </w:rPr>
               <w:tab/>
+            </w:r>
+            <w:r>
+              <w:rPr>
+                <w:color w:val="000000"/>
+              </w:rPr>
               <w:t>14</w:t>
             </w:r>
           </w:hyperlink>
@@ -1816,7 +2123,7 @@
             </w:tabs>
             <w:ind w:left="240"/>
             <w:rPr>
-              <w:rFonts w:ascii="Calibri" w:eastAsia="Calibri" w:hAnsi="Calibri" w:cs="Calibri"/>
+              <w:rFonts w:ascii="Calibri" w:hAnsi="Calibri" w:eastAsia="Calibri" w:cs="Calibri"/>
               <w:color w:val="000000"/>
               <w:sz w:val="22"/>
               <w:szCs w:val="22"/>
@@ -1834,6 +2141,11 @@
                 <w:color w:val="000000"/>
               </w:rPr>
               <w:tab/>
+            </w:r>
+            <w:r>
+              <w:rPr>
+                <w:color w:val="000000"/>
+              </w:rPr>
               <w:t>14</w:t>
             </w:r>
           </w:hyperlink>
@@ -1852,7 +2164,7 @@
             </w:tabs>
             <w:ind w:left="240"/>
             <w:rPr>
-              <w:rFonts w:ascii="Calibri" w:eastAsia="Calibri" w:hAnsi="Calibri" w:cs="Calibri"/>
+              <w:rFonts w:ascii="Calibri" w:hAnsi="Calibri" w:eastAsia="Calibri" w:cs="Calibri"/>
               <w:color w:val="000000"/>
               <w:sz w:val="22"/>
               <w:szCs w:val="22"/>
@@ -1870,6 +2182,11 @@
                 <w:color w:val="000000"/>
               </w:rPr>
               <w:tab/>
+            </w:r>
+            <w:r>
+              <w:rPr>
+                <w:color w:val="000000"/>
+              </w:rPr>
               <w:t>14</w:t>
             </w:r>
           </w:hyperlink>
@@ -1888,7 +2205,7 @@
             </w:tabs>
             <w:ind w:left="240"/>
             <w:rPr>
-              <w:rFonts w:ascii="Calibri" w:eastAsia="Calibri" w:hAnsi="Calibri" w:cs="Calibri"/>
+              <w:rFonts w:ascii="Calibri" w:hAnsi="Calibri" w:eastAsia="Calibri" w:cs="Calibri"/>
               <w:color w:val="000000"/>
               <w:sz w:val="22"/>
               <w:szCs w:val="22"/>
@@ -1906,6 +2223,11 @@
                 <w:color w:val="000000"/>
               </w:rPr>
               <w:tab/>
+            </w:r>
+            <w:r>
+              <w:rPr>
+                <w:color w:val="000000"/>
+              </w:rPr>
               <w:t>14</w:t>
             </w:r>
           </w:hyperlink>
@@ -1924,7 +2246,7 @@
             </w:tabs>
             <w:ind w:left="240"/>
             <w:rPr>
-              <w:rFonts w:ascii="Calibri" w:eastAsia="Calibri" w:hAnsi="Calibri" w:cs="Calibri"/>
+              <w:rFonts w:ascii="Calibri" w:hAnsi="Calibri" w:eastAsia="Calibri" w:cs="Calibri"/>
               <w:color w:val="000000"/>
               <w:sz w:val="22"/>
               <w:szCs w:val="22"/>
@@ -1942,6 +2264,11 @@
                 <w:color w:val="000000"/>
               </w:rPr>
               <w:tab/>
+            </w:r>
+            <w:r>
+              <w:rPr>
+                <w:color w:val="000000"/>
+              </w:rPr>
               <w:t>15</w:t>
             </w:r>
           </w:hyperlink>
@@ -1960,7 +2287,7 @@
             </w:tabs>
             <w:ind w:left="240"/>
             <w:rPr>
-              <w:rFonts w:ascii="Calibri" w:eastAsia="Calibri" w:hAnsi="Calibri" w:cs="Calibri"/>
+              <w:rFonts w:ascii="Calibri" w:hAnsi="Calibri" w:eastAsia="Calibri" w:cs="Calibri"/>
               <w:color w:val="000000"/>
               <w:sz w:val="22"/>
               <w:szCs w:val="22"/>
@@ -1978,6 +2305,11 @@
                 <w:color w:val="000000"/>
               </w:rPr>
               <w:tab/>
+            </w:r>
+            <w:r>
+              <w:rPr>
+                <w:color w:val="000000"/>
+              </w:rPr>
               <w:t>15</w:t>
             </w:r>
           </w:hyperlink>
@@ -1995,7 +2327,7 @@
               <w:tab w:val="right" w:pos="9062"/>
             </w:tabs>
             <w:rPr>
-              <w:rFonts w:ascii="Calibri" w:eastAsia="Calibri" w:hAnsi="Calibri" w:cs="Calibri"/>
+              <w:rFonts w:ascii="Calibri" w:hAnsi="Calibri" w:eastAsia="Calibri" w:cs="Calibri"/>
               <w:color w:val="000000"/>
               <w:sz w:val="22"/>
               <w:szCs w:val="22"/>
@@ -2013,6 +2345,11 @@
                 <w:color w:val="000000"/>
               </w:rPr>
               <w:tab/>
+            </w:r>
+            <w:r>
+              <w:rPr>
+                <w:color w:val="000000"/>
+              </w:rPr>
               <w:t>16</w:t>
             </w:r>
           </w:hyperlink>
@@ -2031,7 +2368,7 @@
             </w:tabs>
             <w:ind w:left="240"/>
             <w:rPr>
-              <w:rFonts w:ascii="Calibri" w:eastAsia="Calibri" w:hAnsi="Calibri" w:cs="Calibri"/>
+              <w:rFonts w:ascii="Calibri" w:hAnsi="Calibri" w:eastAsia="Calibri" w:cs="Calibri"/>
               <w:color w:val="000000"/>
               <w:sz w:val="22"/>
               <w:szCs w:val="22"/>
@@ -2049,6 +2386,11 @@
                 <w:color w:val="000000"/>
               </w:rPr>
               <w:tab/>
+            </w:r>
+            <w:r>
+              <w:rPr>
+                <w:color w:val="000000"/>
+              </w:rPr>
               <w:t>16</w:t>
             </w:r>
           </w:hyperlink>
@@ -2067,7 +2409,7 @@
             </w:tabs>
             <w:ind w:left="240"/>
             <w:rPr>
-              <w:rFonts w:ascii="Calibri" w:eastAsia="Calibri" w:hAnsi="Calibri" w:cs="Calibri"/>
+              <w:rFonts w:ascii="Calibri" w:hAnsi="Calibri" w:eastAsia="Calibri" w:cs="Calibri"/>
               <w:color w:val="000000"/>
               <w:sz w:val="22"/>
               <w:szCs w:val="22"/>
@@ -2085,6 +2427,11 @@
                 <w:color w:val="000000"/>
               </w:rPr>
               <w:tab/>
+            </w:r>
+            <w:r>
+              <w:rPr>
+                <w:color w:val="000000"/>
+              </w:rPr>
               <w:t>16</w:t>
             </w:r>
           </w:hyperlink>
@@ -2103,7 +2450,7 @@
             </w:tabs>
             <w:ind w:left="240"/>
             <w:rPr>
-              <w:rFonts w:ascii="Calibri" w:eastAsia="Calibri" w:hAnsi="Calibri" w:cs="Calibri"/>
+              <w:rFonts w:ascii="Calibri" w:hAnsi="Calibri" w:eastAsia="Calibri" w:cs="Calibri"/>
               <w:color w:val="000000"/>
               <w:sz w:val="22"/>
               <w:szCs w:val="22"/>
@@ -2121,6 +2468,11 @@
                 <w:color w:val="000000"/>
               </w:rPr>
               <w:tab/>
+            </w:r>
+            <w:r>
+              <w:rPr>
+                <w:color w:val="000000"/>
+              </w:rPr>
               <w:t>16</w:t>
             </w:r>
           </w:hyperlink>
@@ -2138,7 +2490,7 @@
               <w:tab w:val="right" w:pos="9062"/>
             </w:tabs>
             <w:rPr>
-              <w:rFonts w:ascii="Calibri" w:eastAsia="Calibri" w:hAnsi="Calibri" w:cs="Calibri"/>
+              <w:rFonts w:ascii="Calibri" w:hAnsi="Calibri" w:eastAsia="Calibri" w:cs="Calibri"/>
               <w:color w:val="000000"/>
               <w:sz w:val="22"/>
               <w:szCs w:val="22"/>
@@ -2156,6 +2508,11 @@
                 <w:color w:val="000000"/>
               </w:rPr>
               <w:tab/>
+            </w:r>
+            <w:r>
+              <w:rPr>
+                <w:color w:val="000000"/>
+              </w:rPr>
               <w:t>17</w:t>
             </w:r>
           </w:hyperlink>
@@ -2173,7 +2530,7 @@
               <w:tab w:val="right" w:pos="9062"/>
             </w:tabs>
             <w:rPr>
-              <w:rFonts w:ascii="Calibri" w:eastAsia="Calibri" w:hAnsi="Calibri" w:cs="Calibri"/>
+              <w:rFonts w:ascii="Calibri" w:hAnsi="Calibri" w:eastAsia="Calibri" w:cs="Calibri"/>
               <w:color w:val="000000"/>
               <w:sz w:val="22"/>
               <w:szCs w:val="22"/>
@@ -2191,6 +2548,11 @@
                 <w:color w:val="000000"/>
               </w:rPr>
               <w:tab/>
+            </w:r>
+            <w:r>
+              <w:rPr>
+                <w:color w:val="000000"/>
+              </w:rPr>
               <w:t>18</w:t>
             </w:r>
           </w:hyperlink>
@@ -2208,7 +2570,7 @@
               <w:tab w:val="right" w:pos="9062"/>
             </w:tabs>
             <w:rPr>
-              <w:rFonts w:ascii="Calibri" w:eastAsia="Calibri" w:hAnsi="Calibri" w:cs="Calibri"/>
+              <w:rFonts w:ascii="Calibri" w:hAnsi="Calibri" w:eastAsia="Calibri" w:cs="Calibri"/>
               <w:color w:val="000000"/>
               <w:sz w:val="22"/>
               <w:szCs w:val="22"/>
@@ -2226,6 +2588,11 @@
                 <w:color w:val="000000"/>
               </w:rPr>
               <w:tab/>
+            </w:r>
+            <w:r>
+              <w:rPr>
+                <w:color w:val="000000"/>
+              </w:rPr>
               <w:t>19</w:t>
             </w:r>
           </w:hyperlink>
@@ -2243,7 +2610,7 @@
               <w:tab w:val="right" w:pos="9062"/>
             </w:tabs>
             <w:rPr>
-              <w:rFonts w:ascii="Calibri" w:eastAsia="Calibri" w:hAnsi="Calibri" w:cs="Calibri"/>
+              <w:rFonts w:ascii="Calibri" w:hAnsi="Calibri" w:eastAsia="Calibri" w:cs="Calibri"/>
               <w:color w:val="000000"/>
               <w:sz w:val="22"/>
               <w:szCs w:val="22"/>
@@ -2261,6 +2628,11 @@
                 <w:color w:val="000000"/>
               </w:rPr>
               <w:tab/>
+            </w:r>
+            <w:r>
+              <w:rPr>
+                <w:color w:val="000000"/>
+              </w:rPr>
               <w:t>20</w:t>
             </w:r>
           </w:hyperlink>
@@ -2278,7 +2650,7 @@
               <w:tab w:val="right" w:pos="9062"/>
             </w:tabs>
             <w:rPr>
-              <w:rFonts w:ascii="Calibri" w:eastAsia="Calibri" w:hAnsi="Calibri" w:cs="Calibri"/>
+              <w:rFonts w:ascii="Calibri" w:hAnsi="Calibri" w:eastAsia="Calibri" w:cs="Calibri"/>
               <w:color w:val="000000"/>
               <w:sz w:val="22"/>
               <w:szCs w:val="22"/>
@@ -2296,6 +2668,11 @@
                 <w:color w:val="000000"/>
               </w:rPr>
               <w:tab/>
+            </w:r>
+            <w:r>
+              <w:rPr>
+                <w:color w:val="000000"/>
+              </w:rPr>
               <w:t>21</w:t>
             </w:r>
           </w:hyperlink>
@@ -2313,7 +2690,7 @@
               <w:tab w:val="right" w:pos="9062"/>
             </w:tabs>
             <w:rPr>
-              <w:rFonts w:ascii="Calibri" w:eastAsia="Calibri" w:hAnsi="Calibri" w:cs="Calibri"/>
+              <w:rFonts w:ascii="Calibri" w:hAnsi="Calibri" w:eastAsia="Calibri" w:cs="Calibri"/>
               <w:color w:val="000000"/>
               <w:sz w:val="22"/>
               <w:szCs w:val="22"/>
@@ -2331,6 +2708,11 @@
                 <w:color w:val="000000"/>
               </w:rPr>
               <w:tab/>
+            </w:r>
+            <w:r>
+              <w:rPr>
+                <w:color w:val="000000"/>
+              </w:rPr>
               <w:t>22</w:t>
             </w:r>
           </w:hyperlink>
@@ -2348,7 +2730,7 @@
               <w:tab w:val="right" w:pos="9062"/>
             </w:tabs>
             <w:rPr>
-              <w:rFonts w:ascii="Calibri" w:eastAsia="Calibri" w:hAnsi="Calibri" w:cs="Calibri"/>
+              <w:rFonts w:ascii="Calibri" w:hAnsi="Calibri" w:eastAsia="Calibri" w:cs="Calibri"/>
               <w:color w:val="000000"/>
               <w:sz w:val="22"/>
               <w:szCs w:val="22"/>
@@ -2366,6 +2748,11 @@
                 <w:color w:val="000000"/>
               </w:rPr>
               <w:tab/>
+            </w:r>
+            <w:r>
+              <w:rPr>
+                <w:color w:val="000000"/>
+              </w:rPr>
               <w:t>23</w:t>
             </w:r>
           </w:hyperlink>
@@ -2383,7 +2770,7 @@
               <w:tab w:val="right" w:pos="9062"/>
             </w:tabs>
             <w:rPr>
-              <w:rFonts w:ascii="Calibri" w:eastAsia="Calibri" w:hAnsi="Calibri" w:cs="Calibri"/>
+              <w:rFonts w:ascii="Calibri" w:hAnsi="Calibri" w:eastAsia="Calibri" w:cs="Calibri"/>
               <w:color w:val="000000"/>
               <w:sz w:val="22"/>
               <w:szCs w:val="22"/>
@@ -2401,6 +2788,11 @@
                 <w:color w:val="000000"/>
               </w:rPr>
               <w:tab/>
+            </w:r>
+            <w:r>
+              <w:rPr>
+                <w:color w:val="000000"/>
+              </w:rPr>
               <w:t>24</w:t>
             </w:r>
           </w:hyperlink>
@@ -2418,7 +2810,7 @@
           <w:headerReference w:type="even" r:id="rId6"/>
           <w:headerReference w:type="default" r:id="rId7"/>
           <w:headerReference w:type="first" r:id="rId8"/>
-          <w:pgSz w:w="11907" w:h="16840"/>
+          <w:pgSz w:w="11907" w:h="16840" w:orient="portrait"/>
           <w:pgMar w:top="1701" w:right="1134" w:bottom="1134" w:left="1701" w:header="720" w:footer="720" w:gutter="0"/>
           <w:pgNumType w:start="1"/>
           <w:cols w:space="720"/>
@@ -2445,7 +2837,7 @@
           <w:color w:val="000000"/>
         </w:rPr>
       </w:pPr>
-      <w:bookmarkStart w:id="1" w:name="_uebpuqog7hoa" w:colFirst="0" w:colLast="0"/>
+      <w:bookmarkStart w:name="_uebpuqog7hoa" w:colFirst="0" w:colLast="0" w:id="1"/>
       <w:bookmarkEnd w:id="1"/>
       <w:r>
         <w:rPr>
@@ -2454,7 +2846,6 @@
           <w:smallCaps/>
           <w:color w:val="000000"/>
         </w:rPr>
-        <w:lastRenderedPageBreak/>
         <w:t>1 INTRODUÇÃO</w:t>
       </w:r>
       <w:r>
@@ -2505,7 +2896,7 @@
                             <w:pPr>
                               <w:suppressAutoHyphens/>
                               <w:spacing w:line="1" w:lineRule="atLeast"/>
-                              <w:ind w:leftChars="-1" w:hangingChars="1" w:hanging="2"/>
+                              <w:ind w:leftChars="-1" w:hanging="2" w:hangingChars="1"/>
                               <w:textDirection w:val="btLr"/>
                               <w:textAlignment w:val="top"/>
                               <w:outlineLvl w:val="0"/>
@@ -2518,7 +2909,7 @@
                             <w:pPr>
                               <w:suppressAutoHyphens/>
                               <w:spacing w:line="1" w:lineRule="atLeast"/>
-                              <w:ind w:leftChars="-1" w:hangingChars="1" w:hanging="2"/>
+                              <w:ind w:leftChars="-1" w:hanging="2" w:hangingChars="1"/>
                               <w:textDirection w:val="btLr"/>
                               <w:textAlignment w:val="top"/>
                               <w:outlineLvl w:val="0"/>
@@ -2622,7 +3013,7 @@
                             <w:pPr>
                               <w:suppressAutoHyphens/>
                               <w:spacing w:line="1" w:lineRule="atLeast"/>
-                              <w:ind w:leftChars="-1" w:hangingChars="1" w:hanging="2"/>
+                              <w:ind w:leftChars="-1" w:hanging="2" w:hangingChars="1"/>
                               <w:textDirection w:val="btLr"/>
                               <w:textAlignment w:val="top"/>
                               <w:outlineLvl w:val="0"/>
@@ -2635,7 +3026,7 @@
                             <w:pPr>
                               <w:suppressAutoHyphens/>
                               <w:spacing w:line="1" w:lineRule="atLeast"/>
-                              <w:ind w:leftChars="-1" w:hangingChars="1" w:hanging="2"/>
+                              <w:ind w:leftChars="-1" w:hanging="2" w:hangingChars="1"/>
                               <w:textDirection w:val="btLr"/>
                               <w:textAlignment w:val="top"/>
                               <w:outlineLvl w:val="0"/>
@@ -2802,7 +3193,7 @@
           <w:color w:val="000000"/>
         </w:rPr>
       </w:pPr>
-      <w:bookmarkStart w:id="2" w:name="_gihow8iyy5tk" w:colFirst="0" w:colLast="0"/>
+      <w:bookmarkStart w:name="_gihow8iyy5tk" w:colFirst="0" w:colLast="0" w:id="2"/>
       <w:bookmarkEnd w:id="2"/>
       <w:r>
         <w:br w:type="page"/>
@@ -2814,7 +3205,6 @@
           <w:smallCaps/>
           <w:color w:val="000000"/>
         </w:rPr>
-        <w:lastRenderedPageBreak/>
         <w:t>2</w:t>
       </w:r>
       <w:r>
@@ -2884,7 +3274,7 @@
         </w:rPr>
         <w:t>Sistema Web para auxiliar comunicação entre idosos, responsáveis e cuidadores, facilitando o contato e a organização dos cuidados.</w:t>
       </w:r>
-      <w:bookmarkStart w:id="3" w:name="_wtwf8uuzt1zz" w:colFirst="0" w:colLast="0"/>
+      <w:bookmarkStart w:name="_wtwf8uuzt1zz" w:colFirst="0" w:colLast="0" w:id="3"/>
       <w:bookmarkEnd w:id="3"/>
     </w:p>
     <w:p>
@@ -2959,7 +3349,7 @@
           <w:color w:val="FF0000"/>
         </w:rPr>
       </w:pPr>
-      <w:bookmarkStart w:id="4" w:name="_4kon9gd1dvv5" w:colFirst="0" w:colLast="0"/>
+      <w:bookmarkStart w:name="_4kon9gd1dvv5" w:colFirst="0" w:colLast="0" w:id="4"/>
       <w:bookmarkEnd w:id="4"/>
       <w:r>
         <w:rPr>
@@ -2988,7 +3378,6 @@
           <w:smallCaps/>
           <w:color w:val="000000"/>
         </w:rPr>
-        <w:lastRenderedPageBreak/>
         <w:t>2.3 OBJETIVOS</w:t>
       </w:r>
     </w:p>
@@ -3040,22 +3429,32 @@
       </w:r>
       <w:r>
         <w:br/>
+      </w:r>
+      <w:r>
         <w:t>• Permitir que cuidadores informem experiência, cidade, valor por hora e disponibilidade de horários.</w:t>
       </w:r>
       <w:r>
         <w:br/>
+      </w:r>
+      <w:r>
         <w:t>• Criar um sistema de busca que possibilite aos responsáveis encontrar cuidadores utilizando filtros específicos.</w:t>
       </w:r>
       <w:r>
         <w:br/>
+      </w:r>
+      <w:r>
         <w:t>• Desenvolver uma funcionalidade para vincular cuidadores aos idosos após a contratação.</w:t>
       </w:r>
       <w:r>
         <w:br/>
+      </w:r>
+      <w:r>
         <w:t>• Implementar uma agenda de medicamentos para auxiliar no controle de remédios, doses e horários.</w:t>
       </w:r>
       <w:r>
         <w:br/>
+      </w:r>
+      <w:r>
         <w:t>• Utilizar Java no desenvolvimento do sistema e PostgreSQL para armazenamento dos dados.</w:t>
       </w:r>
     </w:p>
@@ -3120,7 +3519,7 @@
           <w:color w:val="FF0000"/>
         </w:rPr>
       </w:pPr>
-      <w:bookmarkStart w:id="5" w:name="_a242hfqy1pb1" w:colFirst="0" w:colLast="0"/>
+      <w:bookmarkStart w:name="_a242hfqy1pb1" w:colFirst="0" w:colLast="0" w:id="5"/>
       <w:bookmarkEnd w:id="5"/>
     </w:p>
     <w:p>
@@ -3150,7 +3549,7 @@
       <w:pPr>
         <w:keepNext/>
       </w:pPr>
-      <w:bookmarkStart w:id="6" w:name="_vu5456qxwj1m" w:colFirst="0" w:colLast="0"/>
+      <w:bookmarkStart w:name="_vu5456qxwj1m" w:colFirst="0" w:colLast="0" w:id="6"/>
       <w:bookmarkEnd w:id="6"/>
       <w:r>
         <w:t>O sistema é direcionado principalmente a cuidadores de idosos, bem como aos próprios idosos e seus familiares.</w:t>
@@ -3217,7 +3616,7 @@
       <w:r>
         <w:t>Um exemplo de trabalho relacionado é o aplicativo DoseApp, que foi desenvolvido com o objetivo de auxiliar cuidadores e familiares no gerenciamento de medicamentos e na organização da rotina diária de idosos. O sistema permite registrar horários, dosagens e outras informações importantes, reduzindo o risco de perda de informações quando há revezamento entre diferentes cuidadores (ROSTIROLLA; SOUZA, 2022)</w:t>
       </w:r>
-      <w:bookmarkStart w:id="7" w:name="_ctqy09cxo6nw"/>
+      <w:bookmarkStart w:name="_ctqy09cxo6nw" w:id="7"/>
       <w:bookmarkEnd w:id="7"/>
     </w:p>
     <w:p>
@@ -3232,7 +3631,6 @@
         </w:pBdr>
       </w:pPr>
       <w:r>
-        <w:lastRenderedPageBreak/>
         <w:t>2.7 METODOLOGIA DE TRABALHO</w:t>
       </w:r>
     </w:p>
@@ -3290,10 +3688,9 @@
         <w:t xml:space="preserve">Por fim, será realizada a fase de testes e validação do sistema, com o objetivo de verificar se as funcionalidades estão operando corretamente e se o sistema atende às necessidades </w:t>
       </w:r>
       <w:r>
-        <w:lastRenderedPageBreak/>
         <w:t>identificadas no início do projeto. Caso sejam identificados problemas ou melhorias, ajustes serão realizados antes da finalização do projeto.</w:t>
       </w:r>
-      <w:bookmarkStart w:id="8" w:name="_u304za3h7w33"/>
+      <w:bookmarkStart w:name="_u304za3h7w33" w:id="8"/>
       <w:bookmarkEnd w:id="8"/>
     </w:p>
     <w:p>
@@ -3318,51 +3715,8 @@
         <w:jc w:val="both"/>
       </w:pPr>
       <w:r>
+        <w:rPr/>
         <w:t>Para compreender melhor o contexto em que o projeto está inserido, realizamos entrevistas com pessoas que possuem experiência direta no cuidado e acompanhamento de idosos. O objetivo foi identificar os principais desafios enfrentados por cuidadores, familiares e profissionais da saúde, além de compreender as necessidades existentes e possíveis oportunidades de melhoria por meio do uso de tecnologias.</w:t>
-      </w:r>
-    </w:p>
-    <w:p>
-      <w:pPr>
-        <w:keepNext/>
-        <w:spacing w:before="240"/>
-        <w:jc w:val="both"/>
-      </w:pPr>
-      <w:r>
-        <w:t>A primeira entrevistada foi Lúcia Helena, cuidadora de idosos com cerca de 15 anos de experiência. Ela comentou que o processo de contratação de cuidadores é, atualmente, pouco organizado, acontecendo principalmente por indicações de profissionais de saúde ou de conhecidos. Isso gera dificuldades tanto para os cuidadores, que dependem dessas recomendações para conseguir trabalho, quanto para as famílias, que muitas vezes precisam encontrar rapidamente alguém de confiança para cuidar de um idoso.</w:t>
-      </w:r>
-    </w:p>
-    <w:p>
-      <w:pPr>
-        <w:keepNext/>
-        <w:spacing w:before="240"/>
-        <w:jc w:val="both"/>
-      </w:pPr>
-      <w:r>
-        <w:t>Outro desafio destacado por Lúcia é a dificuldade em conseguir cuidadores disponíveis de forma imediata, especialmente em situações emergenciais, como quando um idoso recebe alta hospitalar e necessita de acompanhamento contínuo. Segundo ela, um sistema organizado que permitisse às famílias encontrar cuidadores, verificar suas experiências e entrar em contato facilmente poderia melhorar bastante essa situação. Lúcia também enfatizou que a solução precisa ser simples de usar, considerando que muitas pessoas têm pouca familiaridade com tecnologia e utilizam principalmente redes sociais em dispositivos móveis.</w:t>
-      </w:r>
-    </w:p>
-    <w:p>
-      <w:pPr>
-        <w:keepNext/>
-        <w:spacing w:before="240"/>
-        <w:jc w:val="both"/>
-      </w:pPr>
-      <w:r>
-        <w:t>A segunda entrevista foi com Aparecida de Fátima Faria Barbosa, agente comunitária de saúde com 18 anos de atuação e coordenadora de uma comunidade religiosa há cerca de 20 anos. Ela apontou que o envelhecimento da população aumenta a demanda por cuidados especializados para idosos, criando desafios para famílias que precisam trabalhar e não podem acompanhar seus parentes o tempo todo.</w:t>
-      </w:r>
-    </w:p>
-    <w:p>
-      <w:pPr>
-        <w:keepNext/>
-        <w:spacing w:before="240"/>
-        <w:jc w:val="both"/>
-      </w:pPr>
-      <w:r>
-        <w:t xml:space="preserve">Aparecida destacou que encontrar cuidadores capacitados e de confiança é uma dificuldade comum. Muitas famílias recorrem a soluções improvisadas, como escalas entre parentes ou instalação de equipamentos de monitoramento em casa. Ela também acredita que tecnologias </w:t>
-      </w:r>
-      <w:r>
-        <w:lastRenderedPageBreak/>
-        <w:t>digitais podem melhorar o acompanhamento dos idosos, principalmente se forem capazes de enviar alertas em situações de emergência, como quedas ou problemas de saúde. Outro ponto importante mencionado foi a dificuldade de acesso enfrentada por moradores da zona rural, onde a distância entre residências e a limitação de internet dificultam o acompanhamento constante do idoso e o acesso a serviços de cuidado.</w:t>
       </w:r>
     </w:p>
     <w:p>
@@ -3397,8 +3751,8 @@
           <w:color w:val="000000"/>
         </w:rPr>
       </w:pPr>
-      <w:bookmarkStart w:id="9" w:name="_5xhdqyoxv5pz"/>
-      <w:bookmarkStart w:id="10" w:name="_GoBack"/>
+      <w:bookmarkStart w:name="_5xhdqyoxv5pz" w:id="9"/>
+      <w:bookmarkStart w:name="_GoBack" w:id="10"/>
       <w:bookmarkEnd w:id="9"/>
       <w:bookmarkEnd w:id="10"/>
       <w:r>
@@ -3408,7 +3762,6 @@
           <w:smallCaps/>
           <w:color w:val="000000" w:themeColor="text1"/>
         </w:rPr>
-        <w:lastRenderedPageBreak/>
         <w:t xml:space="preserve">3 PLANEJAMENTO </w:t>
       </w:r>
     </w:p>
@@ -3431,7 +3784,7 @@
           <w:color w:val="0070C0"/>
         </w:rPr>
       </w:pPr>
-      <w:bookmarkStart w:id="11" w:name="_85x6gq42hjga" w:colFirst="0" w:colLast="0"/>
+      <w:bookmarkStart w:name="_85x6gq42hjga" w:colFirst="0" w:colLast="0" w:id="11"/>
       <w:bookmarkEnd w:id="11"/>
     </w:p>
     <w:p>
@@ -3478,7 +3831,7 @@
           <w:color w:val="FF0000"/>
         </w:rPr>
       </w:pPr>
-      <w:bookmarkStart w:id="12" w:name="_hlzhjesqyqyu" w:colFirst="0" w:colLast="0"/>
+      <w:bookmarkStart w:name="_hlzhjesqyqyu" w:colFirst="0" w:colLast="0" w:id="12"/>
       <w:bookmarkEnd w:id="12"/>
     </w:p>
     <w:p>
@@ -3511,7 +3864,7 @@
           <w:color w:val="0070C0"/>
         </w:rPr>
       </w:pPr>
-      <w:bookmarkStart w:id="13" w:name="_47l4drcmyedf" w:colFirst="0" w:colLast="0"/>
+      <w:bookmarkStart w:name="_47l4drcmyedf" w:colFirst="0" w:colLast="0" w:id="13"/>
       <w:bookmarkEnd w:id="13"/>
       <w:r>
         <w:rPr>
@@ -3633,7 +3986,7 @@
           <w:color w:val="FF0000"/>
         </w:rPr>
       </w:pPr>
-      <w:bookmarkStart w:id="14" w:name="_zgip7uuby6ix" w:colFirst="0" w:colLast="0"/>
+      <w:bookmarkStart w:name="_zgip7uuby6ix" w:colFirst="0" w:colLast="0" w:id="14"/>
       <w:bookmarkEnd w:id="14"/>
     </w:p>
     <w:p>
@@ -3738,7 +4091,7 @@
           <w:color w:val="FF0000"/>
         </w:rPr>
       </w:pPr>
-      <w:bookmarkStart w:id="15" w:name="_pxyab1tdqc6h" w:colFirst="0" w:colLast="0"/>
+      <w:bookmarkStart w:name="_pxyab1tdqc6h" w:colFirst="0" w:colLast="0" w:id="15"/>
       <w:bookmarkEnd w:id="15"/>
     </w:p>
     <w:p>
@@ -3762,7 +4115,6 @@
           <w:smallCaps/>
           <w:color w:val="000000"/>
         </w:rPr>
-        <w:lastRenderedPageBreak/>
         <w:t xml:space="preserve">3.4 OUTROS RECURSOS </w:t>
       </w:r>
     </w:p>
@@ -3787,7 +4139,7 @@
           <w:color w:val="0070C0"/>
         </w:rPr>
       </w:pPr>
-      <w:bookmarkStart w:id="16" w:name="_3unqfi5pywb" w:colFirst="0" w:colLast="0"/>
+      <w:bookmarkStart w:name="_3unqfi5pywb" w:colFirst="0" w:colLast="0" w:id="16"/>
       <w:bookmarkEnd w:id="16"/>
     </w:p>
     <w:p>
@@ -3854,7 +4206,7 @@
           <w:color w:val="000000"/>
         </w:rPr>
       </w:pPr>
-      <w:bookmarkStart w:id="17" w:name="_69ez10u2xwkb" w:colFirst="0" w:colLast="0"/>
+      <w:bookmarkStart w:name="_69ez10u2xwkb" w:colFirst="0" w:colLast="0" w:id="17"/>
       <w:bookmarkEnd w:id="17"/>
       <w:r>
         <w:br w:type="page"/>
@@ -3865,7 +4217,6 @@
           <w:bCs/>
           <w:color w:val="000000"/>
         </w:rPr>
-        <w:lastRenderedPageBreak/>
         <w:t>4 ESPECIFICAÇÃO E ANÁLISE DOS REQUISITOS DO SISTEMA DE SOFTWARE</w:t>
       </w:r>
     </w:p>
@@ -3885,7 +4236,7 @@
           <w:color w:val="000000"/>
         </w:rPr>
       </w:pPr>
-      <w:bookmarkStart w:id="18" w:name="_p41l1yyjr2lp" w:colFirst="0" w:colLast="0"/>
+      <w:bookmarkStart w:name="_p41l1yyjr2lp" w:colFirst="0" w:colLast="0" w:id="18"/>
       <w:bookmarkEnd w:id="18"/>
       <w:r>
         <w:rPr>
@@ -3909,7 +4260,7 @@
       </w:r>
     </w:p>
     <w:p>
-      <w:bookmarkStart w:id="19" w:name="_jnfti9d8nig6" w:colFirst="0" w:colLast="0"/>
+      <w:bookmarkStart w:name="_jnfti9d8nig6" w:colFirst="0" w:colLast="0" w:id="19"/>
       <w:bookmarkEnd w:id="19"/>
     </w:p>
     <w:p>
@@ -3949,7 +4300,7 @@
       </w:r>
     </w:p>
     <w:p>
-      <w:bookmarkStart w:id="20" w:name="_yfftpsqmbn38" w:colFirst="0" w:colLast="0"/>
+      <w:bookmarkStart w:name="_yfftpsqmbn38" w:colFirst="0" w:colLast="0" w:id="20"/>
       <w:bookmarkEnd w:id="20"/>
     </w:p>
     <w:p>
@@ -4006,7 +4357,7 @@
           <w:color w:val="000000"/>
         </w:rPr>
       </w:pPr>
-      <w:bookmarkStart w:id="21" w:name="_zbtgsztsx5qt" w:colFirst="0" w:colLast="0"/>
+      <w:bookmarkStart w:name="_zbtgsztsx5qt" w:colFirst="0" w:colLast="0" w:id="21"/>
       <w:bookmarkEnd w:id="21"/>
       <w:r>
         <w:br w:type="page"/>
@@ -4017,7 +4368,6 @@
           <w:bCs/>
           <w:color w:val="000000"/>
         </w:rPr>
-        <w:lastRenderedPageBreak/>
         <w:t>5 ARQUITETURA E PROJETO DO SISTEMA DE SOFTWARE</w:t>
       </w:r>
     </w:p>
@@ -4052,7 +4402,7 @@
           <w:color w:val="000000"/>
         </w:rPr>
       </w:pPr>
-      <w:bookmarkStart w:id="22" w:name="_uzs395uand0e" w:colFirst="0" w:colLast="0"/>
+      <w:bookmarkStart w:name="_uzs395uand0e" w:colFirst="0" w:colLast="0" w:id="22"/>
       <w:bookmarkEnd w:id="22"/>
       <w:r>
         <w:br w:type="page"/>
@@ -4063,7 +4413,6 @@
           <w:bCs/>
           <w:color w:val="000000"/>
         </w:rPr>
-        <w:lastRenderedPageBreak/>
         <w:t>6 IMPLEMENTAÇÃO DO SISTEMA DE SOFTWARE</w:t>
       </w:r>
     </w:p>
@@ -4101,7 +4450,7 @@
           <w:color w:val="000000"/>
         </w:rPr>
       </w:pPr>
-      <w:bookmarkStart w:id="23" w:name="_xwz6vzo9lzyl" w:colFirst="0" w:colLast="0"/>
+      <w:bookmarkStart w:name="_xwz6vzo9lzyl" w:colFirst="0" w:colLast="0" w:id="23"/>
       <w:bookmarkEnd w:id="23"/>
       <w:r>
         <w:br w:type="page"/>
@@ -4112,7 +4461,6 @@
           <w:bCs/>
           <w:color w:val="000000"/>
         </w:rPr>
-        <w:lastRenderedPageBreak/>
         <w:t>7 PLANO DE TESTES PARA O SISTEMA DE SOFTWARE</w:t>
       </w:r>
     </w:p>
@@ -4168,7 +4516,7 @@
           <w:color w:val="FF0000"/>
         </w:rPr>
       </w:pPr>
-      <w:bookmarkStart w:id="24" w:name="_mkvs2qyhhbcp" w:colFirst="0" w:colLast="0"/>
+      <w:bookmarkStart w:name="_mkvs2qyhhbcp" w:colFirst="0" w:colLast="0" w:id="24"/>
       <w:bookmarkEnd w:id="24"/>
     </w:p>
     <w:p>
@@ -4189,7 +4537,7 @@
           <w:color w:val="000000"/>
         </w:rPr>
       </w:pPr>
-      <w:bookmarkStart w:id="25" w:name="_8zxqz5wgmdxn" w:colFirst="0" w:colLast="0"/>
+      <w:bookmarkStart w:name="_8zxqz5wgmdxn" w:colFirst="0" w:colLast="0" w:id="25"/>
       <w:bookmarkEnd w:id="25"/>
       <w:r>
         <w:br w:type="page"/>
@@ -4201,7 +4549,6 @@
           <w:smallCaps/>
           <w:color w:val="000000"/>
         </w:rPr>
-        <w:lastRenderedPageBreak/>
         <w:t>8 CONCLUSÃO</w:t>
       </w:r>
     </w:p>
@@ -4237,7 +4584,7 @@
           <w:color w:val="000000"/>
         </w:rPr>
       </w:pPr>
-      <w:bookmarkStart w:id="26" w:name="_vu8skbkjafvu"/>
+      <w:bookmarkStart w:name="_vu8skbkjafvu" w:id="26"/>
       <w:bookmarkEnd w:id="26"/>
       <w:r>
         <w:br w:type="page"/>
@@ -4249,7 +4596,6 @@
           <w:smallCaps/>
           <w:color w:val="000000" w:themeColor="text1"/>
         </w:rPr>
-        <w:lastRenderedPageBreak/>
         <w:t xml:space="preserve">REFERÊNCIAS </w:t>
       </w:r>
     </w:p>
@@ -4356,7 +4702,7 @@
           <w:color w:val="000000"/>
         </w:rPr>
       </w:pPr>
-      <w:bookmarkStart w:id="27" w:name="_amvst46n8d5f" w:colFirst="0" w:colLast="0"/>
+      <w:bookmarkStart w:name="_amvst46n8d5f" w:colFirst="0" w:colLast="0" w:id="27"/>
       <w:bookmarkEnd w:id="27"/>
       <w:r>
         <w:br w:type="page"/>
@@ -4367,7 +4713,6 @@
           <w:bCs/>
           <w:color w:val="000000"/>
         </w:rPr>
-        <w:lastRenderedPageBreak/>
         <w:t>APÊNDICE A – CRONOGRAMA DO PROJETO</w:t>
       </w:r>
     </w:p>
@@ -4402,7 +4747,7 @@
           <w:color w:val="000000"/>
         </w:rPr>
       </w:pPr>
-      <w:bookmarkStart w:id="28" w:name="_9qjp406jcxub" w:colFirst="0" w:colLast="0"/>
+      <w:bookmarkStart w:name="_9qjp406jcxub" w:colFirst="0" w:colLast="0" w:id="28"/>
       <w:bookmarkEnd w:id="28"/>
       <w:r>
         <w:br w:type="page"/>
@@ -4413,7 +4758,6 @@
           <w:bCs/>
           <w:color w:val="000000"/>
         </w:rPr>
-        <w:lastRenderedPageBreak/>
         <w:t>APÊNDICE B – REQUISITOS DO SISTEMA DE SOFTWARE</w:t>
       </w:r>
     </w:p>
@@ -4448,7 +4792,7 @@
           <w:color w:val="000000"/>
         </w:rPr>
       </w:pPr>
-      <w:bookmarkStart w:id="29" w:name="_io2bxhhvd09c" w:colFirst="0" w:colLast="0"/>
+      <w:bookmarkStart w:name="_io2bxhhvd09c" w:colFirst="0" w:colLast="0" w:id="29"/>
       <w:bookmarkEnd w:id="29"/>
       <w:r>
         <w:br w:type="page"/>
@@ -4459,7 +4803,6 @@
           <w:bCs/>
           <w:color w:val="000000"/>
         </w:rPr>
-        <w:lastRenderedPageBreak/>
         <w:t>APÊNDICE C – ANÁLISE DOS REQUISITOS DO SISTEMA DE SOFTWARE</w:t>
       </w:r>
     </w:p>
@@ -4500,7 +4843,7 @@
     <w:sectPr>
       <w:headerReference w:type="default" r:id="rId9"/>
       <w:headerReference w:type="first" r:id="rId10"/>
-      <w:pgSz w:w="11907" w:h="16840"/>
+      <w:pgSz w:w="11907" w:h="16840" w:orient="portrait"/>
       <w:pgMar w:top="1699" w:right="1138" w:bottom="1238" w:left="1699" w:header="720" w:footer="720" w:gutter="0"/>
       <w:cols w:space="720"/>
       <w:titlePg/>
@@ -4872,11 +5215,11 @@
 </file>
 
 <file path=word/styles.xml><?xml version="1.0" encoding="utf-8"?>
-<w:styles xmlns:mc="http://schemas.openxmlformats.org/markup-compatibility/2006" xmlns:r="http://schemas.openxmlformats.org/officeDocument/2006/relationships" xmlns:w="http://schemas.openxmlformats.org/wordprocessingml/2006/main" xmlns:w14="http://schemas.microsoft.com/office/word/2010/wordml" xmlns:w15="http://schemas.microsoft.com/office/word/2012/wordml" xmlns:w16se="http://schemas.microsoft.com/office/word/2015/wordml/symex" mc:Ignorable="w14 w15 w16se">
+<w:styles xmlns:wp14="http://schemas.microsoft.com/office/word/2010/wordprocessingDrawing" xmlns:mc="http://schemas.openxmlformats.org/markup-compatibility/2006" xmlns:r="http://schemas.openxmlformats.org/officeDocument/2006/relationships" xmlns:w="http://schemas.openxmlformats.org/wordprocessingml/2006/main" xmlns:w14="http://schemas.microsoft.com/office/word/2010/wordml" xmlns:w15="http://schemas.microsoft.com/office/word/2012/wordml" xmlns:w16se="http://schemas.microsoft.com/office/word/2015/wordml/symex" mc:Ignorable="w14 w15 w16se wp14">
   <w:docDefaults>
     <w:rPrDefault>
       <w:rPr>
-        <w:rFonts w:ascii="Times New Roman" w:eastAsia="Times New Roman" w:hAnsi="Times New Roman" w:cs="Times New Roman"/>
+        <w:rFonts w:ascii="Times New Roman" w:hAnsi="Times New Roman" w:eastAsia="Times New Roman" w:cs="Times New Roman"/>
         <w:sz w:val="24"/>
         <w:szCs w:val="24"/>
         <w:lang w:val="pt-BR" w:eastAsia="pt-BR" w:bidi="ar-SA"/>
@@ -4891,14 +5234,14 @@
   <w:latentStyles w:defLockedState="0" w:defUIPriority="99" w:defSemiHidden="0" w:defUnhideWhenUsed="0" w:defQFormat="0" w:count="371">
     <w:lsdException w:name="Normal" w:uiPriority="0" w:qFormat="1"/>
     <w:lsdException w:name="heading 1" w:uiPriority="9" w:qFormat="1"/>
-    <w:lsdException w:name="heading 2" w:semiHidden="1" w:uiPriority="9" w:unhideWhenUsed="1" w:qFormat="1"/>
-    <w:lsdException w:name="heading 3" w:semiHidden="1" w:uiPriority="9" w:unhideWhenUsed="1" w:qFormat="1"/>
-    <w:lsdException w:name="heading 4" w:semiHidden="1" w:uiPriority="9" w:unhideWhenUsed="1" w:qFormat="1"/>
-    <w:lsdException w:name="heading 5" w:semiHidden="1" w:uiPriority="9" w:unhideWhenUsed="1" w:qFormat="1"/>
-    <w:lsdException w:name="heading 6" w:semiHidden="1" w:uiPriority="9" w:unhideWhenUsed="1" w:qFormat="1"/>
-    <w:lsdException w:name="heading 7" w:semiHidden="1" w:uiPriority="9" w:unhideWhenUsed="1" w:qFormat="1"/>
-    <w:lsdException w:name="heading 8" w:semiHidden="1" w:uiPriority="9" w:unhideWhenUsed="1" w:qFormat="1"/>
-    <w:lsdException w:name="heading 9" w:semiHidden="1" w:uiPriority="9" w:unhideWhenUsed="1" w:qFormat="1"/>
+    <w:lsdException w:name="heading 2" w:uiPriority="9" w:semiHidden="1" w:unhideWhenUsed="1" w:qFormat="1"/>
+    <w:lsdException w:name="heading 3" w:uiPriority="9" w:semiHidden="1" w:unhideWhenUsed="1" w:qFormat="1"/>
+    <w:lsdException w:name="heading 4" w:uiPriority="9" w:semiHidden="1" w:unhideWhenUsed="1" w:qFormat="1"/>
+    <w:lsdException w:name="heading 5" w:uiPriority="9" w:semiHidden="1" w:unhideWhenUsed="1" w:qFormat="1"/>
+    <w:lsdException w:name="heading 6" w:uiPriority="9" w:semiHidden="1" w:unhideWhenUsed="1" w:qFormat="1"/>
+    <w:lsdException w:name="heading 7" w:uiPriority="9" w:semiHidden="1" w:unhideWhenUsed="1" w:qFormat="1"/>
+    <w:lsdException w:name="heading 8" w:uiPriority="9" w:semiHidden="1" w:unhideWhenUsed="1" w:qFormat="1"/>
+    <w:lsdException w:name="heading 9" w:uiPriority="9" w:semiHidden="1" w:unhideWhenUsed="1" w:qFormat="1"/>
     <w:lsdException w:name="index 1" w:semiHidden="1" w:unhideWhenUsed="1"/>
     <w:lsdException w:name="index 2" w:semiHidden="1" w:unhideWhenUsed="1"/>
     <w:lsdException w:name="index 3" w:semiHidden="1" w:unhideWhenUsed="1"/>
@@ -4908,22 +5251,22 @@
     <w:lsdException w:name="index 7" w:semiHidden="1" w:unhideWhenUsed="1"/>
     <w:lsdException w:name="index 8" w:semiHidden="1" w:unhideWhenUsed="1"/>
     <w:lsdException w:name="index 9" w:semiHidden="1" w:unhideWhenUsed="1"/>
-    <w:lsdException w:name="toc 1" w:semiHidden="1" w:uiPriority="39" w:unhideWhenUsed="1"/>
-    <w:lsdException w:name="toc 2" w:semiHidden="1" w:uiPriority="39" w:unhideWhenUsed="1"/>
-    <w:lsdException w:name="toc 3" w:semiHidden="1" w:uiPriority="39" w:unhideWhenUsed="1"/>
-    <w:lsdException w:name="toc 4" w:semiHidden="1" w:uiPriority="39" w:unhideWhenUsed="1"/>
-    <w:lsdException w:name="toc 5" w:semiHidden="1" w:uiPriority="39" w:unhideWhenUsed="1"/>
-    <w:lsdException w:name="toc 6" w:semiHidden="1" w:uiPriority="39" w:unhideWhenUsed="1"/>
-    <w:lsdException w:name="toc 7" w:semiHidden="1" w:uiPriority="39" w:unhideWhenUsed="1"/>
-    <w:lsdException w:name="toc 8" w:semiHidden="1" w:uiPriority="39" w:unhideWhenUsed="1"/>
-    <w:lsdException w:name="toc 9" w:semiHidden="1" w:uiPriority="39" w:unhideWhenUsed="1"/>
+    <w:lsdException w:name="toc 1" w:uiPriority="39" w:semiHidden="1" w:unhideWhenUsed="1"/>
+    <w:lsdException w:name="toc 2" w:uiPriority="39" w:semiHidden="1" w:unhideWhenUsed="1"/>
+    <w:lsdException w:name="toc 3" w:uiPriority="39" w:semiHidden="1" w:unhideWhenUsed="1"/>
+    <w:lsdException w:name="toc 4" w:uiPriority="39" w:semiHidden="1" w:unhideWhenUsed="1"/>
+    <w:lsdException w:name="toc 5" w:uiPriority="39" w:semiHidden="1" w:unhideWhenUsed="1"/>
+    <w:lsdException w:name="toc 6" w:uiPriority="39" w:semiHidden="1" w:unhideWhenUsed="1"/>
+    <w:lsdException w:name="toc 7" w:uiPriority="39" w:semiHidden="1" w:unhideWhenUsed="1"/>
+    <w:lsdException w:name="toc 8" w:uiPriority="39" w:semiHidden="1" w:unhideWhenUsed="1"/>
+    <w:lsdException w:name="toc 9" w:uiPriority="39" w:semiHidden="1" w:unhideWhenUsed="1"/>
     <w:lsdException w:name="Normal Indent" w:semiHidden="1" w:unhideWhenUsed="1"/>
     <w:lsdException w:name="footnote text" w:semiHidden="1" w:unhideWhenUsed="1"/>
     <w:lsdException w:name="annotation text" w:semiHidden="1" w:unhideWhenUsed="1"/>
     <w:lsdException w:name="header" w:semiHidden="1" w:unhideWhenUsed="1"/>
     <w:lsdException w:name="footer" w:semiHidden="1" w:unhideWhenUsed="1"/>
     <w:lsdException w:name="index heading" w:semiHidden="1" w:unhideWhenUsed="1"/>
-    <w:lsdException w:name="caption" w:semiHidden="1" w:uiPriority="35" w:unhideWhenUsed="1" w:qFormat="1"/>
+    <w:lsdException w:name="caption" w:uiPriority="35" w:semiHidden="1" w:unhideWhenUsed="1" w:qFormat="1"/>
     <w:lsdException w:name="table of figures" w:semiHidden="1" w:unhideWhenUsed="1"/>
     <w:lsdException w:name="envelope address" w:semiHidden="1" w:unhideWhenUsed="1"/>
     <w:lsdException w:name="envelope return" w:semiHidden="1" w:unhideWhenUsed="1"/>
@@ -4954,7 +5297,7 @@
     <w:lsdException w:name="Title" w:uiPriority="10" w:qFormat="1"/>
     <w:lsdException w:name="Closing" w:semiHidden="1" w:unhideWhenUsed="1"/>
     <w:lsdException w:name="Signature" w:semiHidden="1" w:unhideWhenUsed="1"/>
-    <w:lsdException w:name="Default Paragraph Font" w:semiHidden="1" w:uiPriority="1" w:unhideWhenUsed="1"/>
+    <w:lsdException w:name="Default Paragraph Font" w:uiPriority="1" w:semiHidden="1" w:unhideWhenUsed="1"/>
     <w:lsdException w:name="Body Text" w:semiHidden="1" w:unhideWhenUsed="1"/>
     <w:lsdException w:name="Body Text Indent" w:semiHidden="1" w:unhideWhenUsed="1"/>
     <w:lsdException w:name="List Continue" w:semiHidden="1" w:unhideWhenUsed="1"/>
@@ -5154,8 +5497,8 @@
     <w:lsdException w:name="Subtle Reference" w:uiPriority="31" w:qFormat="1"/>
     <w:lsdException w:name="Intense Reference" w:uiPriority="32" w:qFormat="1"/>
     <w:lsdException w:name="Book Title" w:uiPriority="33" w:qFormat="1"/>
-    <w:lsdException w:name="Bibliography" w:semiHidden="1" w:uiPriority="37" w:unhideWhenUsed="1"/>
-    <w:lsdException w:name="TOC Heading" w:semiHidden="1" w:uiPriority="39" w:unhideWhenUsed="1" w:qFormat="1"/>
+    <w:lsdException w:name="Bibliography" w:uiPriority="37" w:semiHidden="1" w:unhideWhenUsed="1"/>
+    <w:lsdException w:name="TOC Heading" w:uiPriority="39" w:semiHidden="1" w:unhideWhenUsed="1" w:qFormat="1"/>
     <w:lsdException w:name="Plain Table 1" w:uiPriority="41"/>
     <w:lsdException w:name="Plain Table 2" w:uiPriority="42"/>
     <w:lsdException w:name="Plain Table 3" w:uiPriority="43"/>
@@ -5261,7 +5604,7 @@
     <w:lsdException w:name="List Table 6 Colorful Accent 6" w:uiPriority="51"/>
     <w:lsdException w:name="List Table 7 Colorful Accent 6" w:uiPriority="52"/>
   </w:latentStyles>
-  <w:style w:type="paragraph" w:default="1" w:styleId="Normal">
+  <w:style w:type="paragraph" w:styleId="Normal" w:default="1">
     <w:name w:val="Normal"/>
     <w:qFormat/>
   </w:style>
@@ -5387,13 +5730,13 @@
       <w:szCs w:val="20"/>
     </w:rPr>
   </w:style>
-  <w:style w:type="character" w:default="1" w:styleId="Fontepargpadro">
+  <w:style w:type="character" w:styleId="Fontepargpadro" w:default="1">
     <w:name w:val="Default Paragraph Font"/>
     <w:uiPriority w:val="1"/>
     <w:semiHidden/>
     <w:unhideWhenUsed/>
   </w:style>
-  <w:style w:type="table" w:default="1" w:styleId="Tabelanormal">
+  <w:style w:type="table" w:styleId="Tabelanormal" w:default="1">
     <w:name w:val="Normal Table"/>
     <w:uiPriority w:val="99"/>
     <w:semiHidden/>
@@ -5408,13 +5751,13 @@
       </w:tblCellMar>
     </w:tblPr>
   </w:style>
-  <w:style w:type="numbering" w:default="1" w:styleId="Semlista">
+  <w:style w:type="numbering" w:styleId="Semlista" w:default="1">
     <w:name w:val="No List"/>
     <w:uiPriority w:val="99"/>
     <w:semiHidden/>
     <w:unhideWhenUsed/>
   </w:style>
-  <w:style w:type="table" w:customStyle="1" w:styleId="TableNormal">
+  <w:style w:type="table" w:styleId="TableNormal" w:customStyle="1">
     <w:name w:val="TableNormal"/>
     <w:tblPr>
       <w:tblCellMar>
@@ -5455,7 +5798,7 @@
       <w:spacing w:before="360" w:after="80"/>
     </w:pPr>
     <w:rPr>
-      <w:rFonts w:ascii="Georgia" w:eastAsia="Georgia" w:hAnsi="Georgia" w:cs="Georgia"/>
+      <w:rFonts w:ascii="Georgia" w:hAnsi="Georgia" w:eastAsia="Georgia" w:cs="Georgia"/>
       <w:i/>
       <w:iCs/>
       <w:color w:val="666666"/>
@@ -5463,7 +5806,7 @@
       <w:szCs w:val="48"/>
     </w:rPr>
   </w:style>
-  <w:style w:type="table" w:customStyle="1" w:styleId="a">
+  <w:style w:type="table" w:styleId="a" w:customStyle="1">
     <w:basedOn w:val="TableNormal"/>
     <w:tblPr>
       <w:tblStyleRowBandSize w:val="1"/>
@@ -5476,7 +5819,7 @@
       </w:tblCellMar>
     </w:tblPr>
   </w:style>
-  <w:style w:type="table" w:customStyle="1" w:styleId="a0">
+  <w:style w:type="table" w:styleId="a0" w:customStyle="1">
     <w:basedOn w:val="TableNormal"/>
     <w:tblPr>
       <w:tblStyleRowBandSize w:val="1"/>

</xml_diff>

<commit_message>
doc: Mudanca no capitulo 5
</commit_message>
<xml_diff>
--- a/PID_Relatório_5o_e_6o.Períodos_2026.docx
+++ b/PID_Relatório_5o_e_6o.Períodos_2026.docx
@@ -1,6 +1,6 @@
 
 <file path=word/document.xml><?xml version="1.0" encoding="utf-8"?>
-<w:document xmlns:wpc="http://schemas.microsoft.com/office/word/2010/wordprocessingCanvas" xmlns:mc="http://schemas.openxmlformats.org/markup-compatibility/2006" xmlns:o="urn:schemas-microsoft-com:office:office" xmlns:r="http://schemas.openxmlformats.org/officeDocument/2006/relationships" xmlns:m="http://schemas.openxmlformats.org/officeDocument/2006/math" xmlns:v="urn:schemas-microsoft-com:vml" xmlns:wp14="http://schemas.microsoft.com/office/word/2010/wordprocessingDrawing" xmlns:wp="http://schemas.openxmlformats.org/drawingml/2006/wordprocessingDrawing" xmlns:w10="urn:schemas-microsoft-com:office:word" xmlns:w="http://schemas.openxmlformats.org/wordprocessingml/2006/main" xmlns:w14="http://schemas.microsoft.com/office/word/2010/wordml" xmlns:wpg="http://schemas.microsoft.com/office/word/2010/wordprocessingGroup" xmlns:wpi="http://schemas.microsoft.com/office/word/2010/wordprocessingInk" xmlns:wne="http://schemas.microsoft.com/office/word/2006/wordml" xmlns:wps="http://schemas.microsoft.com/office/word/2010/wordprocessingShape" mc:Ignorable="w14 wp14">
+<w:document xmlns:wpc="http://schemas.microsoft.com/office/word/2010/wordprocessingCanvas" xmlns:cx="http://schemas.microsoft.com/office/drawing/2014/chartex" xmlns:cx1="http://schemas.microsoft.com/office/drawing/2015/9/8/chartex" xmlns:cx2="http://schemas.microsoft.com/office/drawing/2015/10/21/chartex" xmlns:cx3="http://schemas.microsoft.com/office/drawing/2016/5/9/chartex" xmlns:cx4="http://schemas.microsoft.com/office/drawing/2016/5/10/chartex" xmlns:cx5="http://schemas.microsoft.com/office/drawing/2016/5/11/chartex" xmlns:cx6="http://schemas.microsoft.com/office/drawing/2016/5/12/chartex" xmlns:cx7="http://schemas.microsoft.com/office/drawing/2016/5/13/chartex" xmlns:cx8="http://schemas.microsoft.com/office/drawing/2016/5/14/chartex" xmlns:mc="http://schemas.openxmlformats.org/markup-compatibility/2006" xmlns:aink="http://schemas.microsoft.com/office/drawing/2016/ink" xmlns:am3d="http://schemas.microsoft.com/office/drawing/2017/model3d" xmlns:o="urn:schemas-microsoft-com:office:office" xmlns:oel="http://schemas.microsoft.com/office/2019/extlst" xmlns:r="http://schemas.openxmlformats.org/officeDocument/2006/relationships" xmlns:m="http://schemas.openxmlformats.org/officeDocument/2006/math" xmlns:v="urn:schemas-microsoft-com:vml" xmlns:wp14="http://schemas.microsoft.com/office/word/2010/wordprocessingDrawing" xmlns:wp="http://schemas.openxmlformats.org/drawingml/2006/wordprocessingDrawing" xmlns:w10="urn:schemas-microsoft-com:office:word" xmlns:w="http://schemas.openxmlformats.org/wordprocessingml/2006/main" xmlns:w14="http://schemas.microsoft.com/office/word/2010/wordml" xmlns:w15="http://schemas.microsoft.com/office/word/2012/wordml" xmlns:w16cex="http://schemas.microsoft.com/office/word/2018/wordml/cex" xmlns:w16cid="http://schemas.microsoft.com/office/word/2016/wordml/cid" xmlns:w16="http://schemas.microsoft.com/office/word/2018/wordml" xmlns:w16du="http://schemas.microsoft.com/office/word/2023/wordml/word16du" xmlns:w16sdtdh="http://schemas.microsoft.com/office/word/2020/wordml/sdtdatahash" xmlns:w16sdtfl="http://schemas.microsoft.com/office/word/2024/wordml/sdtformatlock" xmlns:w16se="http://schemas.microsoft.com/office/word/2015/wordml/symex" xmlns:wpg="http://schemas.microsoft.com/office/word/2010/wordprocessingGroup" xmlns:wpi="http://schemas.microsoft.com/office/word/2010/wordprocessingInk" xmlns:wne="http://schemas.microsoft.com/office/word/2006/wordml" xmlns:wps="http://schemas.microsoft.com/office/word/2010/wordprocessingShape" mc:Ignorable="w14 w15 w16se w16cid w16 w16cex w16sdtdh w16sdtfl w16du wp14">
   <w:body>
     <w:p>
       <w:pPr>
@@ -1316,11 +1316,11 @@
           </mc:Choice>
           <mc:Fallback>
             <w:pict>
-              <v:shapetype id="_x0000_t202" coordsize="21600,21600" o:spt="202" path="m,l,21600r21600,l21600,xe">
+              <v:shapetype w14:anchorId="7018CBA8" id="_x0000_t202" coordsize="21600,21600" o:spt="202" path="m,l,21600r21600,l21600,xe">
                 <v:stroke joinstyle="miter"/>
                 <v:path gradientshapeok="t" o:connecttype="rect"/>
               </v:shapetype>
-              <v:shape id="Caixa de Texto 1" o:spid="_x0000_s1026" type="#_x0000_t202" style="position:absolute;margin-left:445pt;margin-top:-47.6pt;width:10pt;height:13.6pt;z-index:251658240;visibility:visible;mso-wrap-style:square;mso-wrap-distance-left:9pt;mso-wrap-distance-top:0;mso-wrap-distance-right:9pt;mso-wrap-distance-bottom:0;mso-position-horizontal:absolute;mso-position-horizontal-relative:text;mso-position-vertical:absolute;mso-position-vertical-relative:text;v-text-anchor:top" o:gfxdata="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" stroked="f">
+              <v:shape id="Caixa de Texto 1" o:spid="_x0000_s1026" type="#_x0000_t202" style="position:absolute;margin-left:445pt;margin-top:-47.6pt;width:10pt;height:13.6pt;z-index:251658240;visibility:visible;mso-wrap-style:square;mso-wrap-distance-left:9pt;mso-wrap-distance-top:0;mso-wrap-distance-right:9pt;mso-wrap-distance-bottom:0;mso-position-horizontal:absolute;mso-position-horizontal-relative:text;mso-position-vertical:absolute;mso-position-vertical-relative:text;v-text-anchor:top" o:gfxdata="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" stroked="f">
                 <v:textbox>
                   <w:txbxContent>
                     <w:p>
@@ -1548,21 +1548,12 @@
               <w:spacing w:before="120" w:after="120"/>
               <w:jc w:val="both"/>
             </w:pPr>
-            <w:proofErr w:type="spellStart"/>
             <w:r>
               <w:rPr>
                 <w:i/>
                 <w:iCs/>
               </w:rPr>
-              <w:t>Random</w:t>
-            </w:r>
-            <w:proofErr w:type="spellEnd"/>
-            <w:r>
-              <w:rPr>
-                <w:i/>
-                <w:iCs/>
-              </w:rPr>
-              <w:t xml:space="preserve"> Access </w:t>
+              <w:t xml:space="preserve">Random Access </w:t>
             </w:r>
             <w:proofErr w:type="spellStart"/>
             <w:r>
@@ -1761,7 +1752,6 @@
           <w:docPartUnique/>
         </w:docPartObj>
       </w:sdtPr>
-      <w:sdtEndPr/>
       <w:sdtContent>
         <w:p>
           <w:pPr>
@@ -2901,7 +2891,7 @@
           </mc:Choice>
           <mc:Fallback>
             <w:pict>
-              <v:shape id="Caixa de Texto 3" o:spid="_x0000_s1027" type="#_x0000_t202" style="position:absolute;margin-left:440pt;margin-top:-54.4pt;width:15pt;height:20.4pt;z-index:251659264;visibility:visible;mso-wrap-style:square;mso-wrap-distance-left:9pt;mso-wrap-distance-top:0;mso-wrap-distance-right:9pt;mso-wrap-distance-bottom:0;mso-position-horizontal:absolute;mso-position-horizontal-relative:text;mso-position-vertical:absolute;mso-position-vertical-relative:text;v-text-anchor:top" o:gfxdata="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" stroked="f">
+              <v:shape w14:anchorId="65E7CEEC" id="Caixa de Texto 3" o:spid="_x0000_s1027" type="#_x0000_t202" style="position:absolute;margin-left:440pt;margin-top:-54.4pt;width:15pt;height:20.4pt;z-index:251659264;visibility:visible;mso-wrap-style:square;mso-wrap-distance-left:9pt;mso-wrap-distance-top:0;mso-wrap-distance-right:9pt;mso-wrap-distance-bottom:0;mso-position-horizontal:absolute;mso-position-horizontal-relative:text;mso-position-vertical:absolute;mso-position-vertical-relative:text;v-text-anchor:top" o:gfxdata="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" stroked="f">
                 <v:textbox>
                   <w:txbxContent>
                     <w:p>
@@ -3018,7 +3008,7 @@
           </mc:Choice>
           <mc:Fallback>
             <w:pict>
-              <v:shape id="Caixa de Texto 2" o:spid="_x0000_s1028" type="#_x0000_t202" style="position:absolute;margin-left:445pt;margin-top:-54.4pt;width:10pt;height:20.4pt;z-index:251660288;visibility:visible;mso-wrap-style:square;mso-wrap-distance-left:9pt;mso-wrap-distance-top:0;mso-wrap-distance-right:9pt;mso-wrap-distance-bottom:0;mso-position-horizontal:absolute;mso-position-horizontal-relative:text;mso-position-vertical:absolute;mso-position-vertical-relative:text;v-text-anchor:top" o:gfxdata="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" stroked="f">
+              <v:shape w14:anchorId="7FCD1C33" id="Caixa de Texto 2" o:spid="_x0000_s1028" type="#_x0000_t202" style="position:absolute;margin-left:445pt;margin-top:-54.4pt;width:10pt;height:20.4pt;z-index:251660288;visibility:visible;mso-wrap-style:square;mso-wrap-distance-left:9pt;mso-wrap-distance-top:0;mso-wrap-distance-right:9pt;mso-wrap-distance-bottom:0;mso-position-horizontal:absolute;mso-position-horizontal-relative:text;mso-position-vertical:absolute;mso-position-vertical-relative:text;v-text-anchor:top" o:gfxdata="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" stroked="f">
                 <v:textbox>
                   <w:txbxContent>
                     <w:p>
@@ -3131,21 +3121,7 @@
         <w:rPr>
           <w:color w:val="000000" w:themeColor="text1"/>
         </w:rPr>
-        <w:t xml:space="preserve"> e </w:t>
-      </w:r>
-      <w:proofErr w:type="spellStart"/>
-      <w:r>
-        <w:rPr>
-          <w:color w:val="000000" w:themeColor="text1"/>
-        </w:rPr>
-        <w:t>PostgreSQL</w:t>
-      </w:r>
-      <w:proofErr w:type="spellEnd"/>
-      <w:r>
-        <w:rPr>
-          <w:color w:val="000000" w:themeColor="text1"/>
-        </w:rPr>
-        <w:t xml:space="preserve"> como banco de dados, garantindo organização, segurança e escalabilidade. O objetivo principal é oferecer uma solução prática, segura e organizada para apoiar o cuidado com a pessoa idosa, promovendo mais tranquilidade aos familiares e maior profissionalização aos cuidadores.</w:t>
+        <w:t xml:space="preserve"> e PostgreSQL como banco de dados, garantindo organização, segurança e escalabilidade. O objetivo principal é oferecer uma solução prática, segura e organizada para apoiar o cuidado com a pessoa idosa, promovendo mais tranquilidade aos familiares e maior profissionalização aos cuidadores.</w:t>
       </w:r>
     </w:p>
     <w:p>
@@ -3877,12 +3853,14 @@
         <w:rPr>
           <w:smallCaps/>
           <w:color w:val="000000"/>
+          <w:lang w:val="en-US"/>
         </w:rPr>
       </w:pPr>
       <w:r>
         <w:rPr>
           <w:smallCaps/>
           <w:color w:val="000000" w:themeColor="text1"/>
+          <w:lang w:val="en-US"/>
         </w:rPr>
         <w:t>3.2 RECURSOS DE HARDWARE</w:t>
       </w:r>
@@ -4580,7 +4558,6 @@
         <w:t xml:space="preserve"> </w:t>
       </w:r>
       <w:proofErr w:type="spellStart"/>
-      <w:proofErr w:type="gramStart"/>
       <w:r>
         <w:rPr>
           <w:rStyle w:val="citation-150"/>
@@ -4589,7 +4566,6 @@
         <w:t>ElderConnect</w:t>
       </w:r>
       <w:proofErr w:type="spellEnd"/>
-      <w:proofErr w:type="gramEnd"/>
       <w:r>
         <w:rPr>
           <w:rStyle w:val="citation-150"/>
@@ -4777,13 +4753,8 @@
               <w:spacing w:before="240"/>
             </w:pPr>
             <w:r>
-              <w:t xml:space="preserve">Credenciais incorretas no </w:t>
-            </w:r>
-            <w:proofErr w:type="spellStart"/>
-            <w:r>
-              <w:t>login</w:t>
-            </w:r>
-            <w:proofErr w:type="spellEnd"/>
+              <w:t>Credenciais incorretas no login</w:t>
+            </w:r>
           </w:p>
         </w:tc>
         <w:tc>
@@ -4819,15 +4790,7 @@
               <w:spacing w:before="240"/>
             </w:pPr>
             <w:r>
-              <w:t xml:space="preserve">"E-mail ou senha </w:t>
-            </w:r>
-            <w:proofErr w:type="gramStart"/>
-            <w:r>
-              <w:t>incorretos</w:t>
-            </w:r>
-            <w:proofErr w:type="gramEnd"/>
-            <w:r>
-              <w:t>. Por favor, verifique seus dados e tente novamente."</w:t>
+              <w:t>"E-mail ou senha incorretos. Por favor, verifique seus dados e tente novamente."</w:t>
             </w:r>
           </w:p>
         </w:tc>
@@ -4843,10 +4806,7 @@
               <w:spacing w:before="240"/>
             </w:pPr>
             <w:r>
-              <w:t xml:space="preserve">             </w:t>
-            </w:r>
-            <w:r>
-              <w:t>MSG-03</w:t>
+              <w:t xml:space="preserve">             MSG-03</w:t>
             </w:r>
           </w:p>
         </w:tc>
@@ -4883,10 +4843,7 @@
               <w:spacing w:before="240"/>
             </w:pPr>
             <w:r>
-              <w:t>(Texto sob o c</w:t>
-            </w:r>
-            <w:r>
-              <w:t>ampo)</w:t>
+              <w:t>(Texto sob o campo)</w:t>
             </w:r>
           </w:p>
         </w:tc>
@@ -4916,10 +4873,7 @@
               <w:spacing w:before="240"/>
             </w:pPr>
             <w:r>
-              <w:t xml:space="preserve">             </w:t>
-            </w:r>
-            <w:r>
-              <w:t>MSG-04</w:t>
+              <w:t xml:space="preserve">             MSG-04</w:t>
             </w:r>
           </w:p>
         </w:tc>
@@ -5019,32 +4973,16 @@
           <w:smallCaps/>
           <w:color w:val="000000"/>
         </w:rPr>
-        <w:t>4.5</w:t>
-      </w:r>
-      <w:r>
-        <w:rPr>
-          <w:smallCaps/>
-          <w:color w:val="000000"/>
-        </w:rPr>
-        <w:t xml:space="preserve"> </w:t>
-      </w:r>
-      <w:r>
-        <w:t>POLÍTICA E MECANISMOS DE CONFORMIDADE COM A LGPD (LEI Nº 13.709/2018</w:t>
-      </w:r>
-      <w:proofErr w:type="gramStart"/>
-      <w:r>
-        <w:t>)</w:t>
-      </w:r>
-      <w:bookmarkStart w:id="20" w:name="_GoBack"/>
-      <w:bookmarkEnd w:id="20"/>
-      <w:proofErr w:type="gramEnd"/>
+        <w:t xml:space="preserve">4.5 </w:t>
+      </w:r>
+      <w:r>
+        <w:t>POLÍTICA E MECANISMOS DE CONFORMIDADE COM A LGPD (LEI Nº 13.709/2018)</w:t>
+      </w:r>
       <w:r>
         <w:br/>
       </w:r>
       <w:r>
         <w:br/>
-      </w:r>
-      <w:r>
         <w:t xml:space="preserve">Para garantir a total conformidade com a LGPD, o </w:t>
       </w:r>
       <w:proofErr w:type="spellStart"/>
@@ -5093,13 +5031,8 @@
         <w:spacing w:line="360" w:lineRule="auto"/>
         <w:jc w:val="both"/>
       </w:pPr>
-      <w:proofErr w:type="spellStart"/>
-      <w:r>
-        <w:t>Anonimização</w:t>
-      </w:r>
-      <w:proofErr w:type="spellEnd"/>
-      <w:r>
-        <w:t xml:space="preserve"> e Minimização de Dados: Serão coletados estritamente os dados necessários para o funcionamento do negócio</w:t>
+      <w:r>
+        <w:t>Anonimização e Minimização de Dados: Serão coletados estritamente os dados necessários para o funcionamento do negócio</w:t>
       </w:r>
       <w:r>
         <w:t xml:space="preserve">. </w:t>
@@ -5124,25 +5057,7 @@
         <w:t xml:space="preserve">. </w:t>
       </w:r>
       <w:r>
-        <w:t xml:space="preserve">Ao confirmar a exclusão, o sistema executará uma rotina no banco </w:t>
-      </w:r>
-      <w:proofErr w:type="spellStart"/>
-      <w:proofErr w:type="gramStart"/>
-      <w:r>
-        <w:t>PostgreSQL</w:t>
-      </w:r>
-      <w:proofErr w:type="spellEnd"/>
-      <w:proofErr w:type="gramEnd"/>
-      <w:r>
-        <w:t xml:space="preserve"> que apagará logicamente (e fisicamente após 30 dias) todos os dados pessoais do usuário, mantendo apenas dados transacionais </w:t>
-      </w:r>
-      <w:proofErr w:type="spellStart"/>
-      <w:r>
-        <w:t>anonimizados</w:t>
-      </w:r>
-      <w:proofErr w:type="spellEnd"/>
-      <w:r>
-        <w:t xml:space="preserve"> para fins estatísticos e fiscais</w:t>
+        <w:t>Ao confirmar a exclusão, o sistema executará uma rotina no banco PostgreSQL que apagará logicamente (e fisicamente após 30 dias) todos os dados pessoais do usuário, mantendo apenas dados transacionais anonimizados para fins estatísticos e fiscais</w:t>
       </w:r>
       <w:r>
         <w:t xml:space="preserve">. </w:t>
@@ -5158,15 +5073,7 @@
         <w:t>Segurança dos Dados de Saúde (Dados Sensíveis): O registro de medicamentos (nome, dose e frequência) é classificado juridicamente como dado de saúde (sensível)</w:t>
       </w:r>
       <w:r>
-        <w:t xml:space="preserve">. Esses registros trafegarão </w:t>
-      </w:r>
-      <w:proofErr w:type="gramStart"/>
-      <w:r>
-        <w:t>sob criptografia</w:t>
-      </w:r>
-      <w:proofErr w:type="gramEnd"/>
-      <w:r>
-        <w:t xml:space="preserve"> e sua persistência no banco contará com controle de acesso rígido por nível de permissão (RBAC - </w:t>
+        <w:t xml:space="preserve">. Esses registros trafegarão sob criptografia e sua persistência no banco contará com controle de acesso rígido por nível de permissão (RBAC - </w:t>
       </w:r>
       <w:r>
         <w:t>Role-</w:t>
@@ -5219,16 +5126,118 @@
     </w:p>
     <w:p>
       <w:pPr>
+        <w:pStyle w:val="NormalWeb"/>
+        <w:spacing w:line="360" w:lineRule="auto"/>
         <w:jc w:val="both"/>
-        <w:rPr>
-          <w:color w:val="0070C0"/>
-        </w:rPr>
-      </w:pPr>
-      <w:r>
-        <w:rPr>
-          <w:color w:val="0070C0"/>
-        </w:rPr>
-        <w:t>Para ser relatada no segundo semestre.</w:t>
+      </w:pPr>
+      <w:r>
+        <w:t xml:space="preserve">Este capítulo apresenta a arquitetura e o projeto do sistema de software </w:t>
+      </w:r>
+      <w:proofErr w:type="spellStart"/>
+      <w:r>
+        <w:t>ElderConnect</w:t>
+      </w:r>
+      <w:proofErr w:type="spellEnd"/>
+      <w:r>
+        <w:t>.</w:t>
+      </w:r>
+      <w:r>
+        <w:t xml:space="preserve"> </w:t>
+      </w:r>
+      <w:r>
+        <w:t xml:space="preserve">Para representar a estrutura do sistema, foram utilizados diagramas de pacotes referentes ao </w:t>
+      </w:r>
+      <w:proofErr w:type="spellStart"/>
+      <w:r>
+        <w:t>back-end</w:t>
+      </w:r>
+      <w:proofErr w:type="spellEnd"/>
+      <w:r>
+        <w:t xml:space="preserve"> e ao front-</w:t>
+      </w:r>
+      <w:proofErr w:type="spellStart"/>
+      <w:r>
+        <w:t>end</w:t>
+      </w:r>
+      <w:proofErr w:type="spellEnd"/>
+      <w:r>
+        <w:t>, um diagrama de classes de negócio e diagramas de sequência.</w:t>
+      </w:r>
+    </w:p>
+    <w:p>
+      <w:pPr>
+        <w:keepNext/>
+        <w:pBdr>
+          <w:top w:val="nil"/>
+          <w:left w:val="nil"/>
+          <w:bottom w:val="nil"/>
+          <w:right w:val="nil"/>
+          <w:between w:val="nil"/>
+        </w:pBdr>
+        <w:rPr>
+          <w:smallCaps/>
+          <w:color w:val="000000"/>
+        </w:rPr>
+      </w:pPr>
+      <w:r>
+        <w:rPr>
+          <w:smallCaps/>
+          <w:color w:val="000000"/>
+        </w:rPr>
+        <w:t>5.1 ARQUITETURA DO BACK-END</w:t>
+      </w:r>
+    </w:p>
+    <w:p>
+      <w:pPr>
+        <w:pStyle w:val="NormalWeb"/>
+        <w:spacing w:line="360" w:lineRule="auto"/>
+        <w:jc w:val="both"/>
+      </w:pPr>
+      <w:r>
+        <w:t>O</w:t>
+      </w:r>
+      <w:r>
+        <w:t xml:space="preserve"> projeto do </w:t>
+      </w:r>
+      <w:proofErr w:type="spellStart"/>
+      <w:r>
+        <w:t>back-end</w:t>
+      </w:r>
+      <w:proofErr w:type="spellEnd"/>
+      <w:r>
+        <w:t xml:space="preserve"> </w:t>
+      </w:r>
+      <w:r>
+        <w:t>foi</w:t>
+      </w:r>
+      <w:r>
+        <w:t xml:space="preserve"> dividido em diferentes pacotes, responsáveis por agrupar componentes com funções relacionadas. Essa separação permite organizar elementos associados ao controle das requisições, às regras de negócio, ao acesso aos dados e às configurações necessárias para o funcionamento da aplicação.</w:t>
+      </w:r>
+    </w:p>
+    <w:p>
+      <w:pPr>
+        <w:pStyle w:val="NormalWeb"/>
+        <w:spacing w:line="360" w:lineRule="auto"/>
+        <w:jc w:val="both"/>
+      </w:pPr>
+      <w:r>
+        <w:t xml:space="preserve">A Figura 1 apresenta a estrutura definida para os pacotes do </w:t>
+      </w:r>
+      <w:proofErr w:type="spellStart"/>
+      <w:r>
+        <w:t>back-end</w:t>
+      </w:r>
+      <w:proofErr w:type="spellEnd"/>
+      <w:r>
+        <w:t xml:space="preserve"> do </w:t>
+      </w:r>
+      <w:proofErr w:type="spellStart"/>
+      <w:r>
+        <w:t>ElderConnect</w:t>
+      </w:r>
+      <w:proofErr w:type="spellEnd"/>
+      <w:r>
+        <w:t>.</w:t>
       </w:r>
     </w:p>
     <w:p>
@@ -5242,43 +5251,217 @@
           <w:between w:val="nil"/>
         </w:pBdr>
         <w:spacing w:before="240"/>
-        <w:rPr>
-          <w:b/>
-          <w:bCs/>
-          <w:color w:val="000000"/>
-        </w:rPr>
-      </w:pPr>
-      <w:bookmarkStart w:id="21" w:name="_uzs395uand0e" w:colFirst="0" w:colLast="0"/>
-      <w:bookmarkEnd w:id="21"/>
-      <w:r>
-        <w:br w:type="page"/>
-      </w:r>
-      <w:r>
-        <w:rPr>
-          <w:b/>
-          <w:bCs/>
-          <w:color w:val="000000"/>
-        </w:rPr>
+      </w:pPr>
+      <w:r>
+        <w:rPr>
+          <w:noProof/>
+        </w:rPr>
+        <w:drawing>
+          <wp:inline distT="0" distB="0" distL="0" distR="0" wp14:anchorId="11BD942A" wp14:editId="7E0F0A44">
+            <wp:extent cx="5676900" cy="3891423"/>
+            <wp:effectExtent l="0" t="0" r="0" b="0"/>
+            <wp:docPr id="985804729" name="Imagem 4"/>
+            <wp:cNvGraphicFramePr>
+              <a:graphicFrameLocks xmlns:a="http://schemas.openxmlformats.org/drawingml/2006/main" noChangeAspect="1"/>
+            </wp:cNvGraphicFramePr>
+            <a:graphic xmlns:a="http://schemas.openxmlformats.org/drawingml/2006/main">
+              <a:graphicData uri="http://schemas.openxmlformats.org/drawingml/2006/picture">
+                <pic:pic xmlns:pic="http://schemas.openxmlformats.org/drawingml/2006/picture">
+                  <pic:nvPicPr>
+                    <pic:cNvPr id="0" name="Picture 1"/>
+                    <pic:cNvPicPr>
+                      <a:picLocks noChangeAspect="1" noChangeArrowheads="1"/>
+                    </pic:cNvPicPr>
+                  </pic:nvPicPr>
+                  <pic:blipFill rotWithShape="1">
+                    <a:blip r:embed="rId11" cstate="print">
+                      <a:extLst>
+                        <a:ext uri="{28A0092B-C50C-407E-A947-70E740481C1C}">
+                          <a14:useLocalDpi xmlns:a14="http://schemas.microsoft.com/office/drawing/2010/main" val="0"/>
+                        </a:ext>
+                      </a:extLst>
+                    </a:blip>
+                    <a:srcRect r="71296" b="39716"/>
+                    <a:stretch>
+                      <a:fillRect/>
+                    </a:stretch>
+                  </pic:blipFill>
+                  <pic:spPr bwMode="auto">
+                    <a:xfrm>
+                      <a:off x="0" y="0"/>
+                      <a:ext cx="5685140" cy="3897071"/>
+                    </a:xfrm>
+                    <a:prstGeom prst="rect">
+                      <a:avLst/>
+                    </a:prstGeom>
+                    <a:noFill/>
+                    <a:ln>
+                      <a:noFill/>
+                    </a:ln>
+                    <a:extLst>
+                      <a:ext uri="{53640926-AAD7-44D8-BBD7-CCE9431645EC}">
+                        <a14:shadowObscured xmlns:a14="http://schemas.microsoft.com/office/drawing/2010/main"/>
+                      </a:ext>
+                    </a:extLst>
+                  </pic:spPr>
+                </pic:pic>
+              </a:graphicData>
+            </a:graphic>
+          </wp:inline>
+        </w:drawing>
+      </w:r>
+    </w:p>
+    <w:p>
+      <w:pPr>
+        <w:pStyle w:val="Legenda"/>
+        <w:rPr>
+          <w:i w:val="0"/>
+          <w:iCs w:val="0"/>
+          <w:color w:val="auto"/>
+          <w:sz w:val="20"/>
+          <w:szCs w:val="20"/>
+        </w:rPr>
+      </w:pPr>
+      <w:r>
+        <w:rPr>
+          <w:i w:val="0"/>
+          <w:iCs w:val="0"/>
+          <w:color w:val="auto"/>
+          <w:sz w:val="20"/>
+          <w:szCs w:val="20"/>
+        </w:rPr>
+        <w:t xml:space="preserve">FIGURA </w:t>
+      </w:r>
+      <w:r>
+        <w:rPr>
+          <w:i w:val="0"/>
+          <w:iCs w:val="0"/>
+          <w:color w:val="auto"/>
+          <w:sz w:val="20"/>
+          <w:szCs w:val="20"/>
+        </w:rPr>
+        <w:fldChar w:fldCharType="begin"/>
+      </w:r>
+      <w:r>
+        <w:rPr>
+          <w:i w:val="0"/>
+          <w:iCs w:val="0"/>
+          <w:color w:val="auto"/>
+          <w:sz w:val="20"/>
+          <w:szCs w:val="20"/>
+        </w:rPr>
+        <w:instrText xml:space="preserve"> SEQ FIGURA \* ARABIC </w:instrText>
+      </w:r>
+      <w:r>
+        <w:rPr>
+          <w:i w:val="0"/>
+          <w:iCs w:val="0"/>
+          <w:color w:val="auto"/>
+          <w:sz w:val="20"/>
+          <w:szCs w:val="20"/>
+        </w:rPr>
+        <w:fldChar w:fldCharType="separate"/>
+      </w:r>
+      <w:r>
+        <w:rPr>
+          <w:i w:val="0"/>
+          <w:iCs w:val="0"/>
+          <w:noProof/>
+          <w:color w:val="auto"/>
+          <w:sz w:val="20"/>
+          <w:szCs w:val="20"/>
+        </w:rPr>
+        <w:t>1</w:t>
+      </w:r>
+      <w:r>
+        <w:rPr>
+          <w:i w:val="0"/>
+          <w:iCs w:val="0"/>
+          <w:color w:val="auto"/>
+          <w:sz w:val="20"/>
+          <w:szCs w:val="20"/>
+        </w:rPr>
+        <w:fldChar w:fldCharType="end"/>
+      </w:r>
+      <w:r>
+        <w:rPr>
+          <w:i w:val="0"/>
+          <w:iCs w:val="0"/>
+          <w:color w:val="auto"/>
+          <w:sz w:val="20"/>
+          <w:szCs w:val="20"/>
+        </w:rPr>
+        <w:t xml:space="preserve"> - Diagrama de Pacotes da </w:t>
+      </w:r>
+      <w:proofErr w:type="spellStart"/>
+      <w:r>
+        <w:rPr>
+          <w:i w:val="0"/>
+          <w:iCs w:val="0"/>
+          <w:color w:val="auto"/>
+          <w:sz w:val="20"/>
+          <w:szCs w:val="20"/>
+        </w:rPr>
+        <w:t>Backend</w:t>
+      </w:r>
+      <w:proofErr w:type="spellEnd"/>
+    </w:p>
+    <w:p>
+      <w:pPr>
+        <w:pStyle w:val="Legenda"/>
+        <w:rPr>
+          <w:i w:val="0"/>
+          <w:iCs w:val="0"/>
+          <w:color w:val="auto"/>
+          <w:sz w:val="20"/>
+          <w:szCs w:val="20"/>
+        </w:rPr>
+      </w:pPr>
+      <w:r>
+        <w:rPr>
+          <w:i w:val="0"/>
+          <w:iCs w:val="0"/>
+          <w:color w:val="auto"/>
+          <w:sz w:val="20"/>
+          <w:szCs w:val="20"/>
+        </w:rPr>
+        <w:t>FONTE: Elaboração dos autores</w:t>
+      </w:r>
+    </w:p>
+    <w:p/>
+    <w:p>
+      <w:r>
         <w:lastRenderedPageBreak/>
-        <w:t>6 IMPLEMENTAÇÃO DO SISTEMA DE SOFTWARE</w:t>
-      </w:r>
-    </w:p>
-    <w:p/>
-    <w:p>
-      <w:pPr>
-        <w:jc w:val="both"/>
-        <w:rPr>
-          <w:color w:val="0070C0"/>
-        </w:rPr>
-      </w:pPr>
-      <w:r>
-        <w:rPr>
-          <w:color w:val="0070C0"/>
-        </w:rPr>
-        <w:t>Para ser relatada no segundo semestre.</w:t>
-      </w:r>
-    </w:p>
-    <w:p/>
+        <w:t>5.2 ARQUITETURA DO FRONT-END</w:t>
+      </w:r>
+    </w:p>
+    <w:p>
+      <w:r>
+        <w:t>O front-</w:t>
+      </w:r>
+      <w:proofErr w:type="spellStart"/>
+      <w:r>
+        <w:t>end</w:t>
+      </w:r>
+      <w:proofErr w:type="spellEnd"/>
+      <w:r>
+        <w:t xml:space="preserve"> é a </w:t>
+      </w:r>
+      <w:r>
+        <w:t>camada deverá apresentar as informações e funcionalidades de acordo com o perfil e as ações executadas pelos responsáveis, cuidadores e demais usuários cadastrados.</w:t>
+      </w:r>
+    </w:p>
+    <w:p>
+      <w:r>
+        <w:t xml:space="preserve">A Figura 2 apresenta a organização das principais áreas funcionais previstas para a interface do sistema. Entre os elementos representados </w:t>
+      </w:r>
+      <w:r>
+        <w:t xml:space="preserve">se </w:t>
+      </w:r>
+      <w:r>
+        <w:t>encontram funcionalidades relacionadas a contratos, idosos ou responsáveis, cuidadores, medicamentos e agendamentos.</w:t>
+      </w:r>
+    </w:p>
     <w:p>
       <w:pPr>
         <w:keepNext/>
@@ -5290,26 +5473,211 @@
           <w:between w:val="nil"/>
         </w:pBdr>
         <w:spacing w:before="240"/>
+      </w:pPr>
+      <w:r>
+        <w:rPr>
+          <w:noProof/>
+        </w:rPr>
+        <w:drawing>
+          <wp:inline distT="0" distB="0" distL="0" distR="0" wp14:anchorId="57F8B064" wp14:editId="7B6C1FDB">
+            <wp:extent cx="5743575" cy="2428875"/>
+            <wp:effectExtent l="0" t="0" r="9525" b="9525"/>
+            <wp:docPr id="359587046" name="Imagem 5"/>
+            <wp:cNvGraphicFramePr>
+              <a:graphicFrameLocks xmlns:a="http://schemas.openxmlformats.org/drawingml/2006/main" noChangeAspect="1"/>
+            </wp:cNvGraphicFramePr>
+            <a:graphic xmlns:a="http://schemas.openxmlformats.org/drawingml/2006/main">
+              <a:graphicData uri="http://schemas.openxmlformats.org/drawingml/2006/picture">
+                <pic:pic xmlns:pic="http://schemas.openxmlformats.org/drawingml/2006/picture">
+                  <pic:nvPicPr>
+                    <pic:cNvPr id="0" name="Picture 2"/>
+                    <pic:cNvPicPr>
+                      <a:picLocks noChangeAspect="1" noChangeArrowheads="1"/>
+                    </pic:cNvPicPr>
+                  </pic:nvPicPr>
+                  <pic:blipFill>
+                    <a:blip r:embed="rId12" cstate="print">
+                      <a:extLst>
+                        <a:ext uri="{28A0092B-C50C-407E-A947-70E740481C1C}">
+                          <a14:useLocalDpi xmlns:a14="http://schemas.microsoft.com/office/drawing/2010/main" val="0"/>
+                        </a:ext>
+                      </a:extLst>
+                    </a:blip>
+                    <a:srcRect/>
+                    <a:stretch>
+                      <a:fillRect/>
+                    </a:stretch>
+                  </pic:blipFill>
+                  <pic:spPr bwMode="auto">
+                    <a:xfrm>
+                      <a:off x="0" y="0"/>
+                      <a:ext cx="5743575" cy="2428875"/>
+                    </a:xfrm>
+                    <a:prstGeom prst="rect">
+                      <a:avLst/>
+                    </a:prstGeom>
+                    <a:noFill/>
+                    <a:ln>
+                      <a:noFill/>
+                    </a:ln>
+                  </pic:spPr>
+                </pic:pic>
+              </a:graphicData>
+            </a:graphic>
+          </wp:inline>
+        </w:drawing>
+      </w:r>
+    </w:p>
+    <w:p>
+      <w:pPr>
+        <w:pStyle w:val="Legenda"/>
+        <w:rPr>
+          <w:i w:val="0"/>
+          <w:iCs w:val="0"/>
+          <w:color w:val="auto"/>
+          <w:sz w:val="20"/>
+          <w:szCs w:val="20"/>
+        </w:rPr>
+      </w:pPr>
+      <w:r>
+        <w:rPr>
+          <w:i w:val="0"/>
+          <w:iCs w:val="0"/>
+          <w:color w:val="auto"/>
+          <w:sz w:val="20"/>
+          <w:szCs w:val="20"/>
+        </w:rPr>
+        <w:t xml:space="preserve">FIGURA </w:t>
+      </w:r>
+      <w:r>
+        <w:rPr>
+          <w:i w:val="0"/>
+          <w:iCs w:val="0"/>
+          <w:color w:val="auto"/>
+          <w:sz w:val="20"/>
+          <w:szCs w:val="20"/>
+        </w:rPr>
+        <w:fldChar w:fldCharType="begin"/>
+      </w:r>
+      <w:r>
+        <w:rPr>
+          <w:i w:val="0"/>
+          <w:iCs w:val="0"/>
+          <w:color w:val="auto"/>
+          <w:sz w:val="20"/>
+          <w:szCs w:val="20"/>
+        </w:rPr>
+        <w:instrText xml:space="preserve"> SEQ FIGURA \* ARABIC </w:instrText>
+      </w:r>
+      <w:r>
+        <w:rPr>
+          <w:i w:val="0"/>
+          <w:iCs w:val="0"/>
+          <w:color w:val="auto"/>
+          <w:sz w:val="20"/>
+          <w:szCs w:val="20"/>
+        </w:rPr>
+        <w:fldChar w:fldCharType="separate"/>
+      </w:r>
+      <w:r>
+        <w:rPr>
+          <w:i w:val="0"/>
+          <w:iCs w:val="0"/>
+          <w:noProof/>
+          <w:color w:val="auto"/>
+          <w:sz w:val="20"/>
+          <w:szCs w:val="20"/>
+        </w:rPr>
+        <w:t>2</w:t>
+      </w:r>
+      <w:r>
+        <w:rPr>
+          <w:i w:val="0"/>
+          <w:iCs w:val="0"/>
+          <w:color w:val="auto"/>
+          <w:sz w:val="20"/>
+          <w:szCs w:val="20"/>
+        </w:rPr>
+        <w:fldChar w:fldCharType="end"/>
+      </w:r>
+      <w:r>
+        <w:rPr>
+          <w:i w:val="0"/>
+          <w:iCs w:val="0"/>
+          <w:color w:val="auto"/>
+          <w:sz w:val="20"/>
+          <w:szCs w:val="20"/>
+        </w:rPr>
+        <w:t xml:space="preserve"> - Diagrama de Pacotes do </w:t>
+      </w:r>
+      <w:proofErr w:type="spellStart"/>
+      <w:r>
+        <w:rPr>
+          <w:i w:val="0"/>
+          <w:iCs w:val="0"/>
+          <w:color w:val="auto"/>
+          <w:sz w:val="20"/>
+          <w:szCs w:val="20"/>
+        </w:rPr>
+        <w:t>Frontend</w:t>
+      </w:r>
+      <w:proofErr w:type="spellEnd"/>
+    </w:p>
+    <w:p>
+      <w:pPr>
+        <w:pStyle w:val="Legenda"/>
+        <w:rPr>
+          <w:i w:val="0"/>
+          <w:iCs w:val="0"/>
+          <w:color w:val="auto"/>
+          <w:sz w:val="20"/>
+          <w:szCs w:val="20"/>
+        </w:rPr>
+      </w:pPr>
+      <w:r>
+        <w:rPr>
+          <w:i w:val="0"/>
+          <w:iCs w:val="0"/>
+          <w:color w:val="auto"/>
+          <w:sz w:val="20"/>
+          <w:szCs w:val="20"/>
+        </w:rPr>
+        <w:t>FONTE: Elaboração dos autores</w:t>
+      </w:r>
+    </w:p>
+    <w:p/>
+    <w:p>
+      <w:pPr>
         <w:rPr>
           <w:b/>
           <w:bCs/>
-          <w:smallCaps/>
-          <w:color w:val="000000"/>
-        </w:rPr>
-      </w:pPr>
-      <w:bookmarkStart w:id="22" w:name="_xwz6vzo9lzyl" w:colFirst="0" w:colLast="0"/>
-      <w:bookmarkEnd w:id="22"/>
-      <w:r>
-        <w:br w:type="page"/>
-      </w:r>
+        </w:rPr>
+      </w:pPr>
       <w:r>
         <w:rPr>
           <w:b/>
           <w:bCs/>
-          <w:color w:val="000000"/>
-        </w:rPr>
+        </w:rPr>
+        <w:br w:type="page"/>
+      </w:r>
+    </w:p>
+    <w:p>
+      <w:r>
         <w:lastRenderedPageBreak/>
-        <w:t>7 PLANO DE TESTES PARA O SISTEMA DE SOFTWARE</w:t>
+        <w:t>5.3 MODELO DE CLASSES DE NEGÓCIO</w:t>
+      </w:r>
+    </w:p>
+    <w:p>
+      <w:r>
+        <w:t xml:space="preserve">O diagrama de classes de negócio representa os principais elementos envolvidos no funcionamento do </w:t>
+      </w:r>
+      <w:proofErr w:type="spellStart"/>
+      <w:r>
+        <w:t>ElderConnect</w:t>
+      </w:r>
+      <w:proofErr w:type="spellEnd"/>
+      <w:r>
+        <w:t xml:space="preserve"> e os relacionamentos existentes entre eles.</w:t>
       </w:r>
     </w:p>
     <w:p>
@@ -5323,50 +5691,581 @@
           <w:between w:val="nil"/>
         </w:pBdr>
         <w:spacing w:before="240"/>
+      </w:pPr>
+      <w:r>
+        <w:rPr>
+          <w:noProof/>
+        </w:rPr>
+        <w:drawing>
+          <wp:inline distT="0" distB="0" distL="0" distR="0" wp14:anchorId="482E331D" wp14:editId="6F7E9E9F">
+            <wp:extent cx="5753100" cy="5953125"/>
+            <wp:effectExtent l="0" t="0" r="0" b="0"/>
+            <wp:docPr id="1891324538" name="Imagem 6"/>
+            <wp:cNvGraphicFramePr>
+              <a:graphicFrameLocks xmlns:a="http://schemas.openxmlformats.org/drawingml/2006/main" noChangeAspect="1"/>
+            </wp:cNvGraphicFramePr>
+            <a:graphic xmlns:a="http://schemas.openxmlformats.org/drawingml/2006/main">
+              <a:graphicData uri="http://schemas.openxmlformats.org/drawingml/2006/picture">
+                <pic:pic xmlns:pic="http://schemas.openxmlformats.org/drawingml/2006/picture">
+                  <pic:nvPicPr>
+                    <pic:cNvPr id="0" name="Picture 3"/>
+                    <pic:cNvPicPr>
+                      <a:picLocks noChangeAspect="1" noChangeArrowheads="1"/>
+                    </pic:cNvPicPr>
+                  </pic:nvPicPr>
+                  <pic:blipFill>
+                    <a:blip r:embed="rId13">
+                      <a:extLst>
+                        <a:ext uri="{28A0092B-C50C-407E-A947-70E740481C1C}">
+                          <a14:useLocalDpi xmlns:a14="http://schemas.microsoft.com/office/drawing/2010/main" val="0"/>
+                        </a:ext>
+                      </a:extLst>
+                    </a:blip>
+                    <a:srcRect/>
+                    <a:stretch>
+                      <a:fillRect/>
+                    </a:stretch>
+                  </pic:blipFill>
+                  <pic:spPr bwMode="auto">
+                    <a:xfrm>
+                      <a:off x="0" y="0"/>
+                      <a:ext cx="5753100" cy="5953125"/>
+                    </a:xfrm>
+                    <a:prstGeom prst="rect">
+                      <a:avLst/>
+                    </a:prstGeom>
+                    <a:noFill/>
+                    <a:ln>
+                      <a:noFill/>
+                    </a:ln>
+                  </pic:spPr>
+                </pic:pic>
+              </a:graphicData>
+            </a:graphic>
+          </wp:inline>
+        </w:drawing>
+      </w:r>
+    </w:p>
+    <w:p>
+      <w:pPr>
+        <w:pStyle w:val="Legenda"/>
+        <w:rPr>
+          <w:i w:val="0"/>
+          <w:iCs w:val="0"/>
+          <w:color w:val="auto"/>
+          <w:sz w:val="20"/>
+          <w:szCs w:val="20"/>
+        </w:rPr>
+      </w:pPr>
+      <w:r>
+        <w:rPr>
+          <w:i w:val="0"/>
+          <w:iCs w:val="0"/>
+          <w:color w:val="auto"/>
+          <w:sz w:val="20"/>
+          <w:szCs w:val="20"/>
+        </w:rPr>
+        <w:t xml:space="preserve">FIGURA </w:t>
+      </w:r>
+      <w:r>
+        <w:rPr>
+          <w:i w:val="0"/>
+          <w:iCs w:val="0"/>
+          <w:color w:val="auto"/>
+          <w:sz w:val="20"/>
+          <w:szCs w:val="20"/>
+        </w:rPr>
+        <w:fldChar w:fldCharType="begin"/>
+      </w:r>
+      <w:r>
+        <w:rPr>
+          <w:i w:val="0"/>
+          <w:iCs w:val="0"/>
+          <w:color w:val="auto"/>
+          <w:sz w:val="20"/>
+          <w:szCs w:val="20"/>
+        </w:rPr>
+        <w:instrText xml:space="preserve"> SEQ FIGURA \* ARABIC </w:instrText>
+      </w:r>
+      <w:r>
+        <w:rPr>
+          <w:i w:val="0"/>
+          <w:iCs w:val="0"/>
+          <w:color w:val="auto"/>
+          <w:sz w:val="20"/>
+          <w:szCs w:val="20"/>
+        </w:rPr>
+        <w:fldChar w:fldCharType="separate"/>
+      </w:r>
+      <w:r>
+        <w:rPr>
+          <w:i w:val="0"/>
+          <w:iCs w:val="0"/>
+          <w:noProof/>
+          <w:color w:val="auto"/>
+          <w:sz w:val="20"/>
+          <w:szCs w:val="20"/>
+        </w:rPr>
+        <w:t>3</w:t>
+      </w:r>
+      <w:r>
+        <w:rPr>
+          <w:i w:val="0"/>
+          <w:iCs w:val="0"/>
+          <w:color w:val="auto"/>
+          <w:sz w:val="20"/>
+          <w:szCs w:val="20"/>
+        </w:rPr>
+        <w:fldChar w:fldCharType="end"/>
+      </w:r>
+      <w:r>
+        <w:rPr>
+          <w:i w:val="0"/>
+          <w:iCs w:val="0"/>
+          <w:color w:val="auto"/>
+          <w:sz w:val="20"/>
+          <w:szCs w:val="20"/>
+        </w:rPr>
+        <w:t xml:space="preserve"> - Diagrama de Classe de Negócios</w:t>
+      </w:r>
+    </w:p>
+    <w:p>
+      <w:pPr>
+        <w:pStyle w:val="Legenda"/>
+        <w:rPr>
+          <w:i w:val="0"/>
+          <w:iCs w:val="0"/>
+          <w:color w:val="auto"/>
+          <w:sz w:val="20"/>
+          <w:szCs w:val="20"/>
+        </w:rPr>
+      </w:pPr>
+      <w:r>
+        <w:rPr>
+          <w:i w:val="0"/>
+          <w:iCs w:val="0"/>
+          <w:color w:val="auto"/>
+          <w:sz w:val="20"/>
+          <w:szCs w:val="20"/>
+        </w:rPr>
+        <w:t>FONTE: Elaboração dos autores</w:t>
+      </w:r>
+    </w:p>
+    <w:p/>
+    <w:p>
+      <w:pPr>
+        <w:keepNext/>
+      </w:pPr>
+      <w:r>
+        <w:lastRenderedPageBreak/>
+        <w:t>5.4 DIAGRAMAS DE SEQUÊNCIA</w:t>
+      </w:r>
+    </w:p>
+    <w:p>
+      <w:pPr>
+        <w:keepNext/>
+      </w:pPr>
+      <w:r>
+        <w:t>Os diagramas de sequência representam a interação entre os componentes do sistema durante a execução de uma determinada funcionalidade. Diferente do diagrama de classes, os diagramas de sequência demonstram a ordem em que as mensagens são trocadas durante a realização de uma operação.</w:t>
+      </w:r>
+    </w:p>
+    <w:p>
+      <w:pPr>
+        <w:keepNext/>
+      </w:pPr>
+      <w:r>
+        <w:t xml:space="preserve">No projeto </w:t>
+      </w:r>
+      <w:proofErr w:type="spellStart"/>
+      <w:r>
+        <w:t>ElderConnect</w:t>
+      </w:r>
+      <w:proofErr w:type="spellEnd"/>
+      <w:r>
+        <w:t xml:space="preserve"> foram elaborados dois diagramas de sequência: um referente ao cenário principal de autenticação e outro relacionado ao cenário alternativo de recuperação de senha.</w:t>
+      </w:r>
+    </w:p>
+    <w:p>
+      <w:pPr>
+        <w:keepNext/>
         <w:rPr>
           <w:b/>
           <w:bCs/>
-          <w:smallCaps/>
-          <w:color w:val="000000"/>
-        </w:rPr>
-      </w:pPr>
-    </w:p>
-    <w:p>
-      <w:pPr>
-        <w:jc w:val="both"/>
-        <w:rPr>
-          <w:color w:val="0070C0"/>
-        </w:rPr>
-      </w:pPr>
-      <w:r>
-        <w:rPr>
-          <w:color w:val="FF0000"/>
-        </w:rPr>
-        <w:t xml:space="preserve"> </w:t>
-      </w:r>
-      <w:r>
-        <w:rPr>
-          <w:color w:val="0070C0"/>
-        </w:rPr>
-        <w:t>Para ser relatado no segundo semestre.</w:t>
-      </w:r>
-    </w:p>
-    <w:p>
-      <w:pPr>
-        <w:rPr>
-          <w:color w:val="FF0000"/>
-        </w:rPr>
-      </w:pPr>
-    </w:p>
-    <w:p>
-      <w:pPr>
-        <w:rPr>
-          <w:color w:val="FF0000"/>
-        </w:rPr>
-      </w:pPr>
-      <w:bookmarkStart w:id="23" w:name="_mkvs2qyhhbcp" w:colFirst="0" w:colLast="0"/>
-      <w:bookmarkEnd w:id="23"/>
-    </w:p>
+        </w:rPr>
+      </w:pPr>
+      <w:r>
+        <w:rPr>
+          <w:b/>
+          <w:bCs/>
+        </w:rPr>
+        <w:t>5.4.1 Cenário principal de autenticação</w:t>
+      </w:r>
+    </w:p>
+    <w:p>
+      <w:pPr>
+        <w:keepNext/>
+      </w:pPr>
+      <w:r>
+        <w:t>A Figura 4 representa o processo de autenticação do usuário no sistema. O fluxo tem início quando o usuário informa suas credenciais, compostas por e-mail e senha, por meio da tela de login.</w:t>
+      </w:r>
+    </w:p>
+    <w:p>
+      <w:pPr>
+        <w:keepNext/>
+      </w:pPr>
+      <w:r>
+        <w:rPr>
+          <w:noProof/>
+        </w:rPr>
+        <w:drawing>
+          <wp:inline distT="0" distB="0" distL="0" distR="0" wp14:anchorId="65E54B2E" wp14:editId="2882075E">
+            <wp:extent cx="5753100" cy="2743200"/>
+            <wp:effectExtent l="0" t="0" r="0" b="0"/>
+            <wp:docPr id="1939154328" name="Imagem 8"/>
+            <wp:cNvGraphicFramePr>
+              <a:graphicFrameLocks xmlns:a="http://schemas.openxmlformats.org/drawingml/2006/main" noChangeAspect="1"/>
+            </wp:cNvGraphicFramePr>
+            <a:graphic xmlns:a="http://schemas.openxmlformats.org/drawingml/2006/main">
+              <a:graphicData uri="http://schemas.openxmlformats.org/drawingml/2006/picture">
+                <pic:pic xmlns:pic="http://schemas.openxmlformats.org/drawingml/2006/picture">
+                  <pic:nvPicPr>
+                    <pic:cNvPr id="0" name="Picture 5"/>
+                    <pic:cNvPicPr>
+                      <a:picLocks noChangeAspect="1" noChangeArrowheads="1"/>
+                    </pic:cNvPicPr>
+                  </pic:nvPicPr>
+                  <pic:blipFill>
+                    <a:blip r:embed="rId14">
+                      <a:extLst>
+                        <a:ext uri="{28A0092B-C50C-407E-A947-70E740481C1C}">
+                          <a14:useLocalDpi xmlns:a14="http://schemas.microsoft.com/office/drawing/2010/main" val="0"/>
+                        </a:ext>
+                      </a:extLst>
+                    </a:blip>
+                    <a:srcRect/>
+                    <a:stretch>
+                      <a:fillRect/>
+                    </a:stretch>
+                  </pic:blipFill>
+                  <pic:spPr bwMode="auto">
+                    <a:xfrm>
+                      <a:off x="0" y="0"/>
+                      <a:ext cx="5753100" cy="2743200"/>
+                    </a:xfrm>
+                    <a:prstGeom prst="rect">
+                      <a:avLst/>
+                    </a:prstGeom>
+                    <a:noFill/>
+                    <a:ln>
+                      <a:noFill/>
+                    </a:ln>
+                  </pic:spPr>
+                </pic:pic>
+              </a:graphicData>
+            </a:graphic>
+          </wp:inline>
+        </w:drawing>
+      </w:r>
+    </w:p>
+    <w:p>
+      <w:pPr>
+        <w:pStyle w:val="Legenda"/>
+        <w:rPr>
+          <w:i w:val="0"/>
+          <w:iCs w:val="0"/>
+          <w:color w:val="auto"/>
+          <w:sz w:val="20"/>
+          <w:szCs w:val="20"/>
+        </w:rPr>
+      </w:pPr>
+      <w:r>
+        <w:rPr>
+          <w:i w:val="0"/>
+          <w:iCs w:val="0"/>
+          <w:color w:val="auto"/>
+          <w:sz w:val="20"/>
+          <w:szCs w:val="20"/>
+        </w:rPr>
+        <w:t xml:space="preserve">FIGURA </w:t>
+      </w:r>
+      <w:r>
+        <w:rPr>
+          <w:i w:val="0"/>
+          <w:iCs w:val="0"/>
+          <w:color w:val="auto"/>
+          <w:sz w:val="20"/>
+          <w:szCs w:val="20"/>
+        </w:rPr>
+        <w:fldChar w:fldCharType="begin"/>
+      </w:r>
+      <w:r>
+        <w:rPr>
+          <w:i w:val="0"/>
+          <w:iCs w:val="0"/>
+          <w:color w:val="auto"/>
+          <w:sz w:val="20"/>
+          <w:szCs w:val="20"/>
+        </w:rPr>
+        <w:instrText xml:space="preserve"> SEQ FIGURA \* ARABIC </w:instrText>
+      </w:r>
+      <w:r>
+        <w:rPr>
+          <w:i w:val="0"/>
+          <w:iCs w:val="0"/>
+          <w:color w:val="auto"/>
+          <w:sz w:val="20"/>
+          <w:szCs w:val="20"/>
+        </w:rPr>
+        <w:fldChar w:fldCharType="separate"/>
+      </w:r>
+      <w:r>
+        <w:rPr>
+          <w:i w:val="0"/>
+          <w:iCs w:val="0"/>
+          <w:noProof/>
+          <w:color w:val="auto"/>
+          <w:sz w:val="20"/>
+          <w:szCs w:val="20"/>
+        </w:rPr>
+        <w:t>4</w:t>
+      </w:r>
+      <w:r>
+        <w:rPr>
+          <w:i w:val="0"/>
+          <w:iCs w:val="0"/>
+          <w:color w:val="auto"/>
+          <w:sz w:val="20"/>
+          <w:szCs w:val="20"/>
+        </w:rPr>
+        <w:fldChar w:fldCharType="end"/>
+      </w:r>
+      <w:r>
+        <w:rPr>
+          <w:i w:val="0"/>
+          <w:iCs w:val="0"/>
+          <w:color w:val="auto"/>
+          <w:sz w:val="20"/>
+          <w:szCs w:val="20"/>
+        </w:rPr>
+        <w:t xml:space="preserve"> - Diagrama de Sequência do cenário principal</w:t>
+      </w:r>
+    </w:p>
+    <w:p>
+      <w:pPr>
+        <w:pStyle w:val="Legenda"/>
+        <w:rPr>
+          <w:i w:val="0"/>
+          <w:iCs w:val="0"/>
+          <w:color w:val="auto"/>
+          <w:sz w:val="20"/>
+          <w:szCs w:val="20"/>
+        </w:rPr>
+      </w:pPr>
+      <w:r>
+        <w:rPr>
+          <w:i w:val="0"/>
+          <w:iCs w:val="0"/>
+          <w:color w:val="auto"/>
+          <w:sz w:val="20"/>
+          <w:szCs w:val="20"/>
+        </w:rPr>
+        <w:t>FONTE: Elaboração dos autores</w:t>
+      </w:r>
+    </w:p>
+    <w:p>
+      <w:pPr>
+        <w:keepNext/>
+        <w:rPr>
+          <w:b/>
+          <w:bCs/>
+        </w:rPr>
+      </w:pPr>
+      <w:r>
+        <w:rPr>
+          <w:b/>
+          <w:bCs/>
+        </w:rPr>
+        <w:lastRenderedPageBreak/>
+        <w:t>5.4.2 Cenário alternativo de recuperação de senha</w:t>
+      </w:r>
+    </w:p>
+    <w:p>
+      <w:pPr>
+        <w:keepNext/>
+      </w:pPr>
+      <w:r>
+        <w:t>A Figura 5 representa um cenário alternativo relacionado à recuperação da senha de acesso. Esse processo ocorre quando o usuário não consegue utilizar sua senha atual e solicita ao sistema um procedimento para recuperação do acesso.</w:t>
+      </w:r>
+    </w:p>
+    <w:p>
+      <w:pPr>
+        <w:keepNext/>
+      </w:pPr>
+      <w:r>
+        <w:rPr>
+          <w:noProof/>
+        </w:rPr>
+        <w:drawing>
+          <wp:inline distT="0" distB="0" distL="0" distR="0" wp14:anchorId="43E50F73" wp14:editId="458E8BD7">
+            <wp:extent cx="5759450" cy="2503695"/>
+            <wp:effectExtent l="0" t="0" r="0" b="0"/>
+            <wp:docPr id="1121894631" name="Imagem 7"/>
+            <wp:cNvGraphicFramePr>
+              <a:graphicFrameLocks xmlns:a="http://schemas.openxmlformats.org/drawingml/2006/main" noChangeAspect="1"/>
+            </wp:cNvGraphicFramePr>
+            <a:graphic xmlns:a="http://schemas.openxmlformats.org/drawingml/2006/main">
+              <a:graphicData uri="http://schemas.openxmlformats.org/drawingml/2006/picture">
+                <pic:pic xmlns:pic="http://schemas.openxmlformats.org/drawingml/2006/picture">
+                  <pic:nvPicPr>
+                    <pic:cNvPr id="0" name="Picture 4"/>
+                    <pic:cNvPicPr>
+                      <a:picLocks noChangeAspect="1" noChangeArrowheads="1"/>
+                    </pic:cNvPicPr>
+                  </pic:nvPicPr>
+                  <pic:blipFill>
+                    <a:blip r:embed="rId15">
+                      <a:extLst>
+                        <a:ext uri="{28A0092B-C50C-407E-A947-70E740481C1C}">
+                          <a14:useLocalDpi xmlns:a14="http://schemas.microsoft.com/office/drawing/2010/main" val="0"/>
+                        </a:ext>
+                      </a:extLst>
+                    </a:blip>
+                    <a:srcRect/>
+                    <a:stretch>
+                      <a:fillRect/>
+                    </a:stretch>
+                  </pic:blipFill>
+                  <pic:spPr bwMode="auto">
+                    <a:xfrm>
+                      <a:off x="0" y="0"/>
+                      <a:ext cx="5759450" cy="2503695"/>
+                    </a:xfrm>
+                    <a:prstGeom prst="rect">
+                      <a:avLst/>
+                    </a:prstGeom>
+                    <a:noFill/>
+                    <a:ln>
+                      <a:noFill/>
+                    </a:ln>
+                  </pic:spPr>
+                </pic:pic>
+              </a:graphicData>
+            </a:graphic>
+          </wp:inline>
+        </w:drawing>
+      </w:r>
+    </w:p>
+    <w:p>
+      <w:pPr>
+        <w:pStyle w:val="Legenda"/>
+        <w:rPr>
+          <w:i w:val="0"/>
+          <w:iCs w:val="0"/>
+          <w:color w:val="auto"/>
+          <w:sz w:val="20"/>
+          <w:szCs w:val="20"/>
+        </w:rPr>
+      </w:pPr>
+      <w:r>
+        <w:rPr>
+          <w:i w:val="0"/>
+          <w:iCs w:val="0"/>
+          <w:color w:val="auto"/>
+          <w:sz w:val="20"/>
+          <w:szCs w:val="20"/>
+        </w:rPr>
+        <w:t xml:space="preserve">FIGURA </w:t>
+      </w:r>
+      <w:r>
+        <w:rPr>
+          <w:i w:val="0"/>
+          <w:iCs w:val="0"/>
+          <w:color w:val="auto"/>
+          <w:sz w:val="20"/>
+          <w:szCs w:val="20"/>
+        </w:rPr>
+        <w:fldChar w:fldCharType="begin"/>
+      </w:r>
+      <w:r>
+        <w:rPr>
+          <w:i w:val="0"/>
+          <w:iCs w:val="0"/>
+          <w:color w:val="auto"/>
+          <w:sz w:val="20"/>
+          <w:szCs w:val="20"/>
+        </w:rPr>
+        <w:instrText xml:space="preserve"> SEQ FIGURA \* ARABIC </w:instrText>
+      </w:r>
+      <w:r>
+        <w:rPr>
+          <w:i w:val="0"/>
+          <w:iCs w:val="0"/>
+          <w:color w:val="auto"/>
+          <w:sz w:val="20"/>
+          <w:szCs w:val="20"/>
+        </w:rPr>
+        <w:fldChar w:fldCharType="separate"/>
+      </w:r>
+      <w:r>
+        <w:rPr>
+          <w:i w:val="0"/>
+          <w:iCs w:val="0"/>
+          <w:noProof/>
+          <w:color w:val="auto"/>
+          <w:sz w:val="20"/>
+          <w:szCs w:val="20"/>
+        </w:rPr>
+        <w:t>5</w:t>
+      </w:r>
+      <w:r>
+        <w:rPr>
+          <w:i w:val="0"/>
+          <w:iCs w:val="0"/>
+          <w:color w:val="auto"/>
+          <w:sz w:val="20"/>
+          <w:szCs w:val="20"/>
+        </w:rPr>
+        <w:fldChar w:fldCharType="end"/>
+      </w:r>
+      <w:r>
+        <w:rPr>
+          <w:i w:val="0"/>
+          <w:iCs w:val="0"/>
+          <w:color w:val="auto"/>
+          <w:sz w:val="20"/>
+          <w:szCs w:val="20"/>
+        </w:rPr>
+        <w:t xml:space="preserve"> - Diagrama de Sequência do cenário alternativo</w:t>
+      </w:r>
+    </w:p>
+    <w:p>
+      <w:pPr>
+        <w:pStyle w:val="Legenda"/>
+        <w:rPr>
+          <w:i w:val="0"/>
+          <w:iCs w:val="0"/>
+          <w:color w:val="auto"/>
+          <w:sz w:val="20"/>
+          <w:szCs w:val="20"/>
+        </w:rPr>
+      </w:pPr>
+      <w:r>
+        <w:rPr>
+          <w:i w:val="0"/>
+          <w:iCs w:val="0"/>
+          <w:color w:val="auto"/>
+          <w:sz w:val="20"/>
+          <w:szCs w:val="20"/>
+        </w:rPr>
+        <w:t>FONTE: Elaboração dos autores</w:t>
+      </w:r>
+    </w:p>
+    <w:p>
+      <w:pPr>
+        <w:keepNext/>
+      </w:pPr>
+    </w:p>
+    <w:p/>
     <w:p>
       <w:pPr>
         <w:keepNext/>
@@ -5381,12 +6280,9 @@
         <w:rPr>
           <w:b/>
           <w:bCs/>
-          <w:smallCaps/>
           <w:color w:val="000000"/>
         </w:rPr>
       </w:pPr>
-      <w:bookmarkStart w:id="24" w:name="_8zxqz5wgmdxn" w:colFirst="0" w:colLast="0"/>
-      <w:bookmarkEnd w:id="24"/>
       <w:r>
         <w:br w:type="page"/>
       </w:r>
@@ -5394,16 +6290,16 @@
         <w:rPr>
           <w:b/>
           <w:bCs/>
-          <w:smallCaps/>
           <w:color w:val="000000"/>
         </w:rPr>
         <w:lastRenderedPageBreak/>
-        <w:t>8 CONCLUSÃO</w:t>
-      </w:r>
-    </w:p>
-    <w:p>
-      <w:pPr>
-        <w:spacing w:before="120" w:after="120"/>
+        <w:t>6 IMPLEMENTAÇÃO DO SISTEMA DE SOFTWARE</w:t>
+      </w:r>
+    </w:p>
+    <w:p/>
+    <w:p>
+      <w:pPr>
+        <w:jc w:val="both"/>
         <w:rPr>
           <w:color w:val="0070C0"/>
         </w:rPr>
@@ -5412,9 +6308,10 @@
         <w:rPr>
           <w:color w:val="0070C0"/>
         </w:rPr>
-        <w:t>Descreva a conclusão do trabalho em cada entrega de incremento, identificando se os objetivos definidos estão sendo alcançados, as perspectivas para a continuidade do trabalho, os desafios encontrados e os conhecimentos adquiridos.</w:t>
-      </w:r>
-    </w:p>
+        <w:t>Para ser relatada no segundo semestre.</w:t>
+      </w:r>
+    </w:p>
+    <w:p/>
     <w:p>
       <w:pPr>
         <w:keepNext/>
@@ -5433,8 +6330,8 @@
           <w:color w:val="000000"/>
         </w:rPr>
       </w:pPr>
-      <w:bookmarkStart w:id="25" w:name="_vu8skbkjafvu"/>
-      <w:bookmarkEnd w:id="25"/>
+      <w:bookmarkStart w:id="20" w:name="_xwz6vzo9lzyl" w:colFirst="0" w:colLast="0"/>
+      <w:bookmarkEnd w:id="20"/>
       <w:r>
         <w:br w:type="page"/>
       </w:r>
@@ -5442,85 +6339,11 @@
         <w:rPr>
           <w:b/>
           <w:bCs/>
-          <w:smallCaps/>
-          <w:color w:val="000000" w:themeColor="text1"/>
+          <w:color w:val="000000"/>
         </w:rPr>
         <w:lastRenderedPageBreak/>
-        <w:t xml:space="preserve">REFERÊNCIAS </w:t>
-      </w:r>
-    </w:p>
-    <w:p>
-      <w:pPr>
-        <w:spacing w:before="120" w:after="120"/>
-      </w:pPr>
-      <w:r>
-        <w:rPr>
-          <w:lang w:val="en-US"/>
-        </w:rPr>
-        <w:t xml:space="preserve">MAREK, Karen D. et al. Medication Management of the Community-Dwelling Older Adult. In: Patient Safety and Quality: An Evidence-Based Handbook for Nurses. </w:t>
-      </w:r>
-      <w:proofErr w:type="spellStart"/>
-      <w:r>
-        <w:t>Rockville</w:t>
-      </w:r>
-      <w:proofErr w:type="spellEnd"/>
-      <w:r>
-        <w:t>: AHRQ, 2008.</w:t>
-      </w:r>
-      <w:r>
-        <w:t xml:space="preserve"> </w:t>
-      </w:r>
-      <w:r>
-        <w:t>Disponível em: &lt;https://www.ncbi.nlm.nih.gov/books/NBK2670/&gt;</w:t>
-      </w:r>
-      <w:r>
-        <w:t xml:space="preserve"> </w:t>
-      </w:r>
-    </w:p>
-    <w:p>
-      <w:pPr>
-        <w:spacing w:line="240" w:lineRule="auto"/>
-      </w:pPr>
-      <w:r>
-        <w:t>ROSTIROLLA, Gabriela T.; SOUZA, Odair M. DoseApp: Aplicativo para gestão de medicamentos e auxílio nas rotinas dos cuidadores de idosos. Anais do Latinoware, 2022.</w:t>
-      </w:r>
-      <w:r>
-        <w:t xml:space="preserve"> Disponível em: &lt;https://sol.sbc.org.br/index.php/latinoware/article/view/22976/&gt;.</w:t>
-      </w:r>
-    </w:p>
-    <w:p>
-      <w:pPr>
-        <w:spacing w:before="120" w:after="120"/>
-      </w:pPr>
-      <w:r>
-        <w:rPr>
-          <w:lang w:val="en-US"/>
-        </w:rPr>
-        <w:t xml:space="preserve">ZHOU, Zhiyin. Adhera: A Human-Centered Health Informatics Solution for Reducing Informal Caregiver Burden through Improved Medication Adherence. </w:t>
-      </w:r>
-      <w:r>
-        <w:t>2025.</w:t>
-      </w:r>
-      <w:r>
-        <w:t xml:space="preserve"> </w:t>
-      </w:r>
-      <w:r>
-        <w:t xml:space="preserve">Disponível em: </w:t>
-      </w:r>
-      <w:r>
-        <w:t>&lt;https://arxiv.org/abs/2512.03878/&gt;</w:t>
-      </w:r>
-      <w:r>
-        <w:t>.</w:t>
-      </w:r>
-    </w:p>
-    <w:p>
-      <w:pPr>
-        <w:spacing w:before="120" w:after="120"/>
-        <w:rPr>
-          <w:color w:val="FF0000"/>
-        </w:rPr>
-      </w:pPr>
+        <w:t>7 PLANO DE TESTES PARA O SISTEMA DE SOFTWARE</w:t>
+      </w:r>
     </w:p>
     <w:p>
       <w:pPr>
@@ -5540,33 +6363,42 @@
           <w:color w:val="000000"/>
         </w:rPr>
       </w:pPr>
-      <w:bookmarkStart w:id="26" w:name="_amvst46n8d5f" w:colFirst="0" w:colLast="0"/>
-      <w:bookmarkEnd w:id="26"/>
-      <w:r>
-        <w:br w:type="page"/>
-      </w:r>
-      <w:r>
-        <w:rPr>
-          <w:b/>
-          <w:bCs/>
-          <w:color w:val="000000"/>
-        </w:rPr>
-        <w:lastRenderedPageBreak/>
-        <w:t>APÊNDICE A – CRONOGRAMA DO PROJETO</w:t>
-      </w:r>
-    </w:p>
-    <w:p>
-      <w:r>
-        <w:t>O cronograma do projeto está disponível na pasta “</w:t>
-      </w:r>
-      <w:proofErr w:type="spellStart"/>
-      <w:r>
-        <w:t>ApêndiceA</w:t>
-      </w:r>
-      <w:proofErr w:type="spellEnd"/>
-      <w:r>
-        <w:t>” que acompanha este documento.</w:t>
-      </w:r>
+    </w:p>
+    <w:p>
+      <w:pPr>
+        <w:jc w:val="both"/>
+        <w:rPr>
+          <w:color w:val="0070C0"/>
+        </w:rPr>
+      </w:pPr>
+      <w:r>
+        <w:rPr>
+          <w:color w:val="FF0000"/>
+        </w:rPr>
+        <w:t xml:space="preserve"> </w:t>
+      </w:r>
+      <w:r>
+        <w:rPr>
+          <w:color w:val="0070C0"/>
+        </w:rPr>
+        <w:t>Para ser relatado no segundo semestre.</w:t>
+      </w:r>
+    </w:p>
+    <w:p>
+      <w:pPr>
+        <w:rPr>
+          <w:color w:val="FF0000"/>
+        </w:rPr>
+      </w:pPr>
+    </w:p>
+    <w:p>
+      <w:pPr>
+        <w:rPr>
+          <w:color w:val="FF0000"/>
+        </w:rPr>
+      </w:pPr>
+      <w:bookmarkStart w:id="21" w:name="_mkvs2qyhhbcp" w:colFirst="0" w:colLast="0"/>
+      <w:bookmarkEnd w:id="21"/>
     </w:p>
     <w:p>
       <w:pPr>
@@ -5586,8 +6418,8 @@
           <w:color w:val="000000"/>
         </w:rPr>
       </w:pPr>
-      <w:bookmarkStart w:id="27" w:name="_9qjp406jcxub" w:colFirst="0" w:colLast="0"/>
-      <w:bookmarkEnd w:id="27"/>
+      <w:bookmarkStart w:id="22" w:name="_8zxqz5wgmdxn" w:colFirst="0" w:colLast="0"/>
+      <w:bookmarkEnd w:id="22"/>
       <w:r>
         <w:br w:type="page"/>
       </w:r>
@@ -5595,23 +6427,25 @@
         <w:rPr>
           <w:b/>
           <w:bCs/>
+          <w:smallCaps/>
           <w:color w:val="000000"/>
         </w:rPr>
         <w:lastRenderedPageBreak/>
-        <w:t>APÊNDICE B – REQUISITOS DO SISTEMA DE SOFTWARE</w:t>
-      </w:r>
-    </w:p>
-    <w:p>
-      <w:r>
-        <w:t>Os requisitos estão disponíveis na pasta “</w:t>
-      </w:r>
-      <w:proofErr w:type="spellStart"/>
-      <w:r>
-        <w:t>ApêndiceB</w:t>
-      </w:r>
-      <w:proofErr w:type="spellEnd"/>
-      <w:r>
-        <w:t>” que acompanha este documento.</w:t>
+        <w:t>8 CONCLUSÃO</w:t>
+      </w:r>
+    </w:p>
+    <w:p>
+      <w:pPr>
+        <w:spacing w:before="120" w:after="120"/>
+        <w:rPr>
+          <w:color w:val="0070C0"/>
+        </w:rPr>
+      </w:pPr>
+      <w:r>
+        <w:rPr>
+          <w:color w:val="0070C0"/>
+        </w:rPr>
+        <w:t>Descreva a conclusão do trabalho em cada entrega de incremento, identificando se os objetivos definidos estão sendo alcançados, as perspectivas para a continuidade do trabalho, os desafios encontrados e os conhecimentos adquiridos.</w:t>
       </w:r>
     </w:p>
     <w:p>
@@ -5632,8 +6466,8 @@
           <w:color w:val="000000"/>
         </w:rPr>
       </w:pPr>
-      <w:bookmarkStart w:id="28" w:name="_io2bxhhvd09c" w:colFirst="0" w:colLast="0"/>
-      <w:bookmarkEnd w:id="28"/>
+      <w:bookmarkStart w:id="23" w:name="_vu8skbkjafvu"/>
+      <w:bookmarkEnd w:id="23"/>
       <w:r>
         <w:br w:type="page"/>
       </w:r>
@@ -5641,27 +6475,89 @@
         <w:rPr>
           <w:b/>
           <w:bCs/>
-          <w:color w:val="000000"/>
+          <w:smallCaps/>
+          <w:color w:val="000000" w:themeColor="text1"/>
         </w:rPr>
         <w:lastRenderedPageBreak/>
-        <w:t>APÊNDICE C – ANÁLISE DOS REQUISITOS DO SISTEMA DE SOFTWARE</w:t>
-      </w:r>
-    </w:p>
-    <w:p>
-      <w:r>
-        <w:t>Os requisitos estão disponíveis na pasta “</w:t>
+        <w:t xml:space="preserve">REFERÊNCIAS </w:t>
+      </w:r>
+    </w:p>
+    <w:p>
+      <w:pPr>
+        <w:spacing w:before="120" w:after="120"/>
+      </w:pPr>
+      <w:r>
+        <w:t xml:space="preserve">MAREK, Karen D. et al. </w:t>
+      </w:r>
+      <w:r>
+        <w:rPr>
+          <w:lang w:val="en-US"/>
+        </w:rPr>
+        <w:t xml:space="preserve">Medication Management of the Community-Dwelling Older Adult. In: Patient Safety and Quality: An Evidence-Based Handbook for Nurses. </w:t>
       </w:r>
       <w:proofErr w:type="spellStart"/>
       <w:r>
-        <w:t>ApêndiceC</w:t>
+        <w:t>Rockville</w:t>
       </w:r>
       <w:proofErr w:type="spellEnd"/>
       <w:r>
-        <w:t>” que acompanha este documento.</w:t>
-      </w:r>
-    </w:p>
-    <w:p/>
-    <w:p/>
+        <w:t>: AHRQ, 2008.</w:t>
+      </w:r>
+      <w:r>
+        <w:t xml:space="preserve"> </w:t>
+      </w:r>
+      <w:r>
+        <w:t>Disponível em: &lt;https://www.ncbi.nlm.nih.gov/books/NBK2670/&gt;</w:t>
+      </w:r>
+      <w:r>
+        <w:t xml:space="preserve"> </w:t>
+      </w:r>
+    </w:p>
+    <w:p>
+      <w:pPr>
+        <w:spacing w:line="240" w:lineRule="auto"/>
+      </w:pPr>
+      <w:r>
+        <w:t>ROSTIROLLA, Gabriela T.; SOUZA, Odair M. DoseApp: Aplicativo para gestão de medicamentos e auxílio nas rotinas dos cuidadores de idosos. Anais do Latinoware, 2022.</w:t>
+      </w:r>
+      <w:r>
+        <w:t xml:space="preserve"> Disponível em: &lt;https://sol.sbc.org.br/index.php/latinoware/article/view/22976/&gt;.</w:t>
+      </w:r>
+    </w:p>
+    <w:p>
+      <w:pPr>
+        <w:spacing w:before="120" w:after="120"/>
+      </w:pPr>
+      <w:r>
+        <w:rPr>
+          <w:lang w:val="en-US"/>
+        </w:rPr>
+        <w:t xml:space="preserve">ZHOU, Zhiyin. Adhera: A Human-Centered Health Informatics Solution for Reducing Informal Caregiver Burden through Improved Medication Adherence. </w:t>
+      </w:r>
+      <w:r>
+        <w:t>2025.</w:t>
+      </w:r>
+      <w:r>
+        <w:t xml:space="preserve"> </w:t>
+      </w:r>
+      <w:r>
+        <w:t xml:space="preserve">Disponível em: </w:t>
+      </w:r>
+      <w:r>
+        <w:t>&lt;https://arxiv.org/abs/2512.03878/&gt;</w:t>
+      </w:r>
+      <w:r>
+        <w:t>.</w:t>
+      </w:r>
+    </w:p>
+    <w:p>
+      <w:pPr>
+        <w:spacing w:before="120" w:after="120"/>
+        <w:rPr>
+          <w:color w:val="FF0000"/>
+        </w:rPr>
+      </w:pPr>
+    </w:p>
     <w:p>
       <w:pPr>
         <w:keepNext/>
@@ -5680,10 +6576,150 @@
           <w:color w:val="000000"/>
         </w:rPr>
       </w:pPr>
+      <w:bookmarkStart w:id="24" w:name="_amvst46n8d5f" w:colFirst="0" w:colLast="0"/>
+      <w:bookmarkEnd w:id="24"/>
+      <w:r>
+        <w:br w:type="page"/>
+      </w:r>
+      <w:r>
+        <w:rPr>
+          <w:b/>
+          <w:bCs/>
+          <w:color w:val="000000"/>
+        </w:rPr>
+        <w:lastRenderedPageBreak/>
+        <w:t>APÊNDICE A – CRONOGRAMA DO PROJETO</w:t>
+      </w:r>
+    </w:p>
+    <w:p>
+      <w:r>
+        <w:t>O cronograma do projeto está disponível na pasta “</w:t>
+      </w:r>
+      <w:proofErr w:type="spellStart"/>
+      <w:r>
+        <w:t>ApêndiceA</w:t>
+      </w:r>
+      <w:proofErr w:type="spellEnd"/>
+      <w:r>
+        <w:t>” que acompanha este documento.</w:t>
+      </w:r>
+    </w:p>
+    <w:p>
+      <w:pPr>
+        <w:keepNext/>
+        <w:pBdr>
+          <w:top w:val="nil"/>
+          <w:left w:val="nil"/>
+          <w:bottom w:val="nil"/>
+          <w:right w:val="nil"/>
+          <w:between w:val="nil"/>
+        </w:pBdr>
+        <w:spacing w:before="240"/>
+        <w:rPr>
+          <w:b/>
+          <w:bCs/>
+          <w:smallCaps/>
+          <w:color w:val="000000"/>
+        </w:rPr>
+      </w:pPr>
+      <w:bookmarkStart w:id="25" w:name="_9qjp406jcxub" w:colFirst="0" w:colLast="0"/>
+      <w:bookmarkEnd w:id="25"/>
+      <w:r>
+        <w:br w:type="page"/>
+      </w:r>
+      <w:r>
+        <w:rPr>
+          <w:b/>
+          <w:bCs/>
+          <w:color w:val="000000"/>
+        </w:rPr>
+        <w:lastRenderedPageBreak/>
+        <w:t>APÊNDICE B – REQUISITOS DO SISTEMA DE SOFTWARE</w:t>
+      </w:r>
+    </w:p>
+    <w:p>
+      <w:r>
+        <w:t>Os requisitos estão disponíveis na pasta “</w:t>
+      </w:r>
+      <w:proofErr w:type="spellStart"/>
+      <w:r>
+        <w:t>ApêndiceB</w:t>
+      </w:r>
+      <w:proofErr w:type="spellEnd"/>
+      <w:r>
+        <w:t>” que acompanha este documento.</w:t>
+      </w:r>
+    </w:p>
+    <w:p>
+      <w:pPr>
+        <w:keepNext/>
+        <w:pBdr>
+          <w:top w:val="nil"/>
+          <w:left w:val="nil"/>
+          <w:bottom w:val="nil"/>
+          <w:right w:val="nil"/>
+          <w:between w:val="nil"/>
+        </w:pBdr>
+        <w:spacing w:before="240"/>
+        <w:rPr>
+          <w:b/>
+          <w:bCs/>
+          <w:smallCaps/>
+          <w:color w:val="000000"/>
+        </w:rPr>
+      </w:pPr>
+      <w:bookmarkStart w:id="26" w:name="_io2bxhhvd09c" w:colFirst="0" w:colLast="0"/>
+      <w:bookmarkEnd w:id="26"/>
+      <w:r>
+        <w:br w:type="page"/>
+      </w:r>
+      <w:r>
+        <w:rPr>
+          <w:b/>
+          <w:bCs/>
+          <w:color w:val="000000"/>
+        </w:rPr>
+        <w:lastRenderedPageBreak/>
+        <w:t>APÊNDICE C – ANÁLISE DOS REQUISITOS DO SISTEMA DE SOFTWARE</w:t>
+      </w:r>
+    </w:p>
+    <w:p>
+      <w:r>
+        <w:t>Os requisitos estão disponíveis na pasta “</w:t>
+      </w:r>
+      <w:proofErr w:type="spellStart"/>
+      <w:r>
+        <w:t>ApêndiceC</w:t>
+      </w:r>
+      <w:proofErr w:type="spellEnd"/>
+      <w:r>
+        <w:t>” que acompanha este documento.</w:t>
+      </w:r>
+    </w:p>
+    <w:p/>
+    <w:p/>
+    <w:p>
+      <w:pPr>
+        <w:keepNext/>
+        <w:pBdr>
+          <w:top w:val="nil"/>
+          <w:left w:val="nil"/>
+          <w:bottom w:val="nil"/>
+          <w:right w:val="nil"/>
+          <w:between w:val="nil"/>
+        </w:pBdr>
+        <w:spacing w:before="240"/>
+        <w:rPr>
+          <w:b/>
+          <w:bCs/>
+          <w:smallCaps/>
+          <w:color w:val="000000"/>
+        </w:rPr>
+      </w:pPr>
     </w:p>
     <w:sectPr>
-      <w:headerReference w:type="default" r:id="rId11"/>
-      <w:headerReference w:type="first" r:id="rId12"/>
+      <w:headerReference w:type="default" r:id="rId16"/>
+      <w:headerReference w:type="first" r:id="rId17"/>
       <w:pgSz w:w="11907" w:h="16840"/>
       <w:pgMar w:top="1699" w:right="1138" w:bottom="1238" w:left="1699" w:header="720" w:footer="720" w:gutter="0"/>
       <w:cols w:space="720"/>
@@ -5694,7 +6730,7 @@
 </file>
 
 <file path=word/endnotes.xml><?xml version="1.0" encoding="utf-8"?>
-<w:endnotes xmlns:wpc="http://schemas.microsoft.com/office/word/2010/wordprocessingCanvas" xmlns:mc="http://schemas.openxmlformats.org/markup-compatibility/2006" xmlns:o="urn:schemas-microsoft-com:office:office" xmlns:r="http://schemas.openxmlformats.org/officeDocument/2006/relationships" xmlns:m="http://schemas.openxmlformats.org/officeDocument/2006/math" xmlns:v="urn:schemas-microsoft-com:vml" xmlns:wp14="http://schemas.microsoft.com/office/word/2010/wordprocessingDrawing" xmlns:wp="http://schemas.openxmlformats.org/drawingml/2006/wordprocessingDrawing" xmlns:w10="urn:schemas-microsoft-com:office:word" xmlns:w="http://schemas.openxmlformats.org/wordprocessingml/2006/main" xmlns:w14="http://schemas.microsoft.com/office/word/2010/wordml" xmlns:wpg="http://schemas.microsoft.com/office/word/2010/wordprocessingGroup" xmlns:wpi="http://schemas.microsoft.com/office/word/2010/wordprocessingInk" xmlns:wne="http://schemas.microsoft.com/office/word/2006/wordml" xmlns:wps="http://schemas.microsoft.com/office/word/2010/wordprocessingShape" mc:Ignorable="w14 wp14">
+<w:endnotes xmlns:wpc="http://schemas.microsoft.com/office/word/2010/wordprocessingCanvas" xmlns:cx="http://schemas.microsoft.com/office/drawing/2014/chartex" xmlns:cx1="http://schemas.microsoft.com/office/drawing/2015/9/8/chartex" xmlns:cx2="http://schemas.microsoft.com/office/drawing/2015/10/21/chartex" xmlns:cx3="http://schemas.microsoft.com/office/drawing/2016/5/9/chartex" xmlns:cx4="http://schemas.microsoft.com/office/drawing/2016/5/10/chartex" xmlns:cx5="http://schemas.microsoft.com/office/drawing/2016/5/11/chartex" xmlns:cx6="http://schemas.microsoft.com/office/drawing/2016/5/12/chartex" xmlns:cx7="http://schemas.microsoft.com/office/drawing/2016/5/13/chartex" xmlns:cx8="http://schemas.microsoft.com/office/drawing/2016/5/14/chartex" xmlns:mc="http://schemas.openxmlformats.org/markup-compatibility/2006" xmlns:aink="http://schemas.microsoft.com/office/drawing/2016/ink" xmlns:am3d="http://schemas.microsoft.com/office/drawing/2017/model3d" xmlns:o="urn:schemas-microsoft-com:office:office" xmlns:oel="http://schemas.microsoft.com/office/2019/extlst" xmlns:r="http://schemas.openxmlformats.org/officeDocument/2006/relationships" xmlns:m="http://schemas.openxmlformats.org/officeDocument/2006/math" xmlns:v="urn:schemas-microsoft-com:vml" xmlns:wp14="http://schemas.microsoft.com/office/word/2010/wordprocessingDrawing" xmlns:wp="http://schemas.openxmlformats.org/drawingml/2006/wordprocessingDrawing" xmlns:w10="urn:schemas-microsoft-com:office:word" xmlns:w="http://schemas.openxmlformats.org/wordprocessingml/2006/main" xmlns:w14="http://schemas.microsoft.com/office/word/2010/wordml" xmlns:w15="http://schemas.microsoft.com/office/word/2012/wordml" xmlns:w16cex="http://schemas.microsoft.com/office/word/2018/wordml/cex" xmlns:w16cid="http://schemas.microsoft.com/office/word/2016/wordml/cid" xmlns:w16="http://schemas.microsoft.com/office/word/2018/wordml" xmlns:w16du="http://schemas.microsoft.com/office/word/2023/wordml/word16du" xmlns:w16sdtdh="http://schemas.microsoft.com/office/word/2020/wordml/sdtdatahash" xmlns:w16sdtfl="http://schemas.microsoft.com/office/word/2024/wordml/sdtformatlock" xmlns:w16se="http://schemas.microsoft.com/office/word/2015/wordml/symex" xmlns:wpg="http://schemas.microsoft.com/office/word/2010/wordprocessingGroup" xmlns:wpi="http://schemas.microsoft.com/office/word/2010/wordprocessingInk" xmlns:wne="http://schemas.microsoft.com/office/word/2006/wordml" xmlns:wps="http://schemas.microsoft.com/office/word/2010/wordprocessingShape" mc:Ignorable="w14 w15 w16se w16cid w16 w16cex w16sdtdh w16sdtfl w16du wp14">
   <w:endnote w:type="separator" w:id="-1">
     <w:p>
       <w:pPr>
@@ -5719,7 +6755,7 @@
 </file>
 
 <file path=word/footnotes.xml><?xml version="1.0" encoding="utf-8"?>
-<w:footnotes xmlns:wpc="http://schemas.microsoft.com/office/word/2010/wordprocessingCanvas" xmlns:mc="http://schemas.openxmlformats.org/markup-compatibility/2006" xmlns:o="urn:schemas-microsoft-com:office:office" xmlns:r="http://schemas.openxmlformats.org/officeDocument/2006/relationships" xmlns:m="http://schemas.openxmlformats.org/officeDocument/2006/math" xmlns:v="urn:schemas-microsoft-com:vml" xmlns:wp14="http://schemas.microsoft.com/office/word/2010/wordprocessingDrawing" xmlns:wp="http://schemas.openxmlformats.org/drawingml/2006/wordprocessingDrawing" xmlns:w10="urn:schemas-microsoft-com:office:word" xmlns:w="http://schemas.openxmlformats.org/wordprocessingml/2006/main" xmlns:w14="http://schemas.microsoft.com/office/word/2010/wordml" xmlns:wpg="http://schemas.microsoft.com/office/word/2010/wordprocessingGroup" xmlns:wpi="http://schemas.microsoft.com/office/word/2010/wordprocessingInk" xmlns:wne="http://schemas.microsoft.com/office/word/2006/wordml" xmlns:wps="http://schemas.microsoft.com/office/word/2010/wordprocessingShape" mc:Ignorable="w14 wp14">
+<w:footnotes xmlns:wpc="http://schemas.microsoft.com/office/word/2010/wordprocessingCanvas" xmlns:cx="http://schemas.microsoft.com/office/drawing/2014/chartex" xmlns:cx1="http://schemas.microsoft.com/office/drawing/2015/9/8/chartex" xmlns:cx2="http://schemas.microsoft.com/office/drawing/2015/10/21/chartex" xmlns:cx3="http://schemas.microsoft.com/office/drawing/2016/5/9/chartex" xmlns:cx4="http://schemas.microsoft.com/office/drawing/2016/5/10/chartex" xmlns:cx5="http://schemas.microsoft.com/office/drawing/2016/5/11/chartex" xmlns:cx6="http://schemas.microsoft.com/office/drawing/2016/5/12/chartex" xmlns:cx7="http://schemas.microsoft.com/office/drawing/2016/5/13/chartex" xmlns:cx8="http://schemas.microsoft.com/office/drawing/2016/5/14/chartex" xmlns:mc="http://schemas.openxmlformats.org/markup-compatibility/2006" xmlns:aink="http://schemas.microsoft.com/office/drawing/2016/ink" xmlns:am3d="http://schemas.microsoft.com/office/drawing/2017/model3d" xmlns:o="urn:schemas-microsoft-com:office:office" xmlns:oel="http://schemas.microsoft.com/office/2019/extlst" xmlns:r="http://schemas.openxmlformats.org/officeDocument/2006/relationships" xmlns:m="http://schemas.openxmlformats.org/officeDocument/2006/math" xmlns:v="urn:schemas-microsoft-com:vml" xmlns:wp14="http://schemas.microsoft.com/office/word/2010/wordprocessingDrawing" xmlns:wp="http://schemas.openxmlformats.org/drawingml/2006/wordprocessingDrawing" xmlns:w10="urn:schemas-microsoft-com:office:word" xmlns:w="http://schemas.openxmlformats.org/wordprocessingml/2006/main" xmlns:w14="http://schemas.microsoft.com/office/word/2010/wordml" xmlns:w15="http://schemas.microsoft.com/office/word/2012/wordml" xmlns:w16cex="http://schemas.microsoft.com/office/word/2018/wordml/cex" xmlns:w16cid="http://schemas.microsoft.com/office/word/2016/wordml/cid" xmlns:w16="http://schemas.microsoft.com/office/word/2018/wordml" xmlns:w16du="http://schemas.microsoft.com/office/word/2023/wordml/word16du" xmlns:w16sdtdh="http://schemas.microsoft.com/office/word/2020/wordml/sdtdatahash" xmlns:w16sdtfl="http://schemas.microsoft.com/office/word/2024/wordml/sdtformatlock" xmlns:w16se="http://schemas.microsoft.com/office/word/2015/wordml/symex" xmlns:wpg="http://schemas.microsoft.com/office/word/2010/wordprocessingGroup" xmlns:wpi="http://schemas.microsoft.com/office/word/2010/wordprocessingInk" xmlns:wne="http://schemas.microsoft.com/office/word/2006/wordml" xmlns:wps="http://schemas.microsoft.com/office/word/2010/wordprocessingShape" mc:Ignorable="w14 w15 w16se w16cid w16 w16cex w16sdtdh w16sdtfl w16du wp14">
   <w:footnote w:type="separator" w:id="-1">
     <w:p>
       <w:pPr>
@@ -5744,7 +6780,7 @@
 </file>
 
 <file path=word/header1.xml><?xml version="1.0" encoding="utf-8"?>
-<w:hdr xmlns:wpc="http://schemas.microsoft.com/office/word/2010/wordprocessingCanvas" xmlns:mc="http://schemas.openxmlformats.org/markup-compatibility/2006" xmlns:o="urn:schemas-microsoft-com:office:office" xmlns:r="http://schemas.openxmlformats.org/officeDocument/2006/relationships" xmlns:m="http://schemas.openxmlformats.org/officeDocument/2006/math" xmlns:v="urn:schemas-microsoft-com:vml" xmlns:wp14="http://schemas.microsoft.com/office/word/2010/wordprocessingDrawing" xmlns:wp="http://schemas.openxmlformats.org/drawingml/2006/wordprocessingDrawing" xmlns:w10="urn:schemas-microsoft-com:office:word" xmlns:w="http://schemas.openxmlformats.org/wordprocessingml/2006/main" xmlns:w14="http://schemas.microsoft.com/office/word/2010/wordml" xmlns:wpg="http://schemas.microsoft.com/office/word/2010/wordprocessingGroup" xmlns:wpi="http://schemas.microsoft.com/office/word/2010/wordprocessingInk" xmlns:wne="http://schemas.microsoft.com/office/word/2006/wordml" xmlns:wps="http://schemas.microsoft.com/office/word/2010/wordprocessingShape" mc:Ignorable="w14 wp14">
+<w:hdr xmlns:wpc="http://schemas.microsoft.com/office/word/2010/wordprocessingCanvas" xmlns:cx="http://schemas.microsoft.com/office/drawing/2014/chartex" xmlns:cx1="http://schemas.microsoft.com/office/drawing/2015/9/8/chartex" xmlns:cx2="http://schemas.microsoft.com/office/drawing/2015/10/21/chartex" xmlns:cx3="http://schemas.microsoft.com/office/drawing/2016/5/9/chartex" xmlns:cx4="http://schemas.microsoft.com/office/drawing/2016/5/10/chartex" xmlns:cx5="http://schemas.microsoft.com/office/drawing/2016/5/11/chartex" xmlns:cx6="http://schemas.microsoft.com/office/drawing/2016/5/12/chartex" xmlns:cx7="http://schemas.microsoft.com/office/drawing/2016/5/13/chartex" xmlns:cx8="http://schemas.microsoft.com/office/drawing/2016/5/14/chartex" xmlns:mc="http://schemas.openxmlformats.org/markup-compatibility/2006" xmlns:aink="http://schemas.microsoft.com/office/drawing/2016/ink" xmlns:am3d="http://schemas.microsoft.com/office/drawing/2017/model3d" xmlns:o="urn:schemas-microsoft-com:office:office" xmlns:oel="http://schemas.microsoft.com/office/2019/extlst" xmlns:r="http://schemas.openxmlformats.org/officeDocument/2006/relationships" xmlns:m="http://schemas.openxmlformats.org/officeDocument/2006/math" xmlns:v="urn:schemas-microsoft-com:vml" xmlns:wp14="http://schemas.microsoft.com/office/word/2010/wordprocessingDrawing" xmlns:wp="http://schemas.openxmlformats.org/drawingml/2006/wordprocessingDrawing" xmlns:w10="urn:schemas-microsoft-com:office:word" xmlns:w="http://schemas.openxmlformats.org/wordprocessingml/2006/main" xmlns:w14="http://schemas.microsoft.com/office/word/2010/wordml" xmlns:w15="http://schemas.microsoft.com/office/word/2012/wordml" xmlns:w16cex="http://schemas.microsoft.com/office/word/2018/wordml/cex" xmlns:w16cid="http://schemas.microsoft.com/office/word/2016/wordml/cid" xmlns:w16="http://schemas.microsoft.com/office/word/2018/wordml" xmlns:w16du="http://schemas.microsoft.com/office/word/2023/wordml/word16du" xmlns:w16sdtdh="http://schemas.microsoft.com/office/word/2020/wordml/sdtdatahash" xmlns:w16sdtfl="http://schemas.microsoft.com/office/word/2024/wordml/sdtformatlock" xmlns:w16se="http://schemas.microsoft.com/office/word/2015/wordml/symex" xmlns:wpg="http://schemas.microsoft.com/office/word/2010/wordprocessingGroup" xmlns:wpi="http://schemas.microsoft.com/office/word/2010/wordprocessingInk" xmlns:wne="http://schemas.microsoft.com/office/word/2006/wordml" xmlns:wps="http://schemas.microsoft.com/office/word/2010/wordprocessingShape" mc:Ignorable="w14 w15 w16se w16cid w16 w16cex w16sdtdh w16sdtfl w16du wp14">
   <w:p>
     <w:pPr>
       <w:pBdr>
@@ -5805,7 +6841,7 @@
 </file>
 
 <file path=word/header2.xml><?xml version="1.0" encoding="utf-8"?>
-<w:hdr xmlns:wpc="http://schemas.microsoft.com/office/word/2010/wordprocessingCanvas" xmlns:mc="http://schemas.openxmlformats.org/markup-compatibility/2006" xmlns:o="urn:schemas-microsoft-com:office:office" xmlns:r="http://schemas.openxmlformats.org/officeDocument/2006/relationships" xmlns:m="http://schemas.openxmlformats.org/officeDocument/2006/math" xmlns:v="urn:schemas-microsoft-com:vml" xmlns:wp14="http://schemas.microsoft.com/office/word/2010/wordprocessingDrawing" xmlns:wp="http://schemas.openxmlformats.org/drawingml/2006/wordprocessingDrawing" xmlns:w10="urn:schemas-microsoft-com:office:word" xmlns:w="http://schemas.openxmlformats.org/wordprocessingml/2006/main" xmlns:w14="http://schemas.microsoft.com/office/word/2010/wordml" xmlns:wpg="http://schemas.microsoft.com/office/word/2010/wordprocessingGroup" xmlns:wpi="http://schemas.microsoft.com/office/word/2010/wordprocessingInk" xmlns:wne="http://schemas.microsoft.com/office/word/2006/wordml" xmlns:wps="http://schemas.microsoft.com/office/word/2010/wordprocessingShape" mc:Ignorable="w14 wp14">
+<w:hdr xmlns:wpc="http://schemas.microsoft.com/office/word/2010/wordprocessingCanvas" xmlns:cx="http://schemas.microsoft.com/office/drawing/2014/chartex" xmlns:cx1="http://schemas.microsoft.com/office/drawing/2015/9/8/chartex" xmlns:cx2="http://schemas.microsoft.com/office/drawing/2015/10/21/chartex" xmlns:cx3="http://schemas.microsoft.com/office/drawing/2016/5/9/chartex" xmlns:cx4="http://schemas.microsoft.com/office/drawing/2016/5/10/chartex" xmlns:cx5="http://schemas.microsoft.com/office/drawing/2016/5/11/chartex" xmlns:cx6="http://schemas.microsoft.com/office/drawing/2016/5/12/chartex" xmlns:cx7="http://schemas.microsoft.com/office/drawing/2016/5/13/chartex" xmlns:cx8="http://schemas.microsoft.com/office/drawing/2016/5/14/chartex" xmlns:mc="http://schemas.openxmlformats.org/markup-compatibility/2006" xmlns:aink="http://schemas.microsoft.com/office/drawing/2016/ink" xmlns:am3d="http://schemas.microsoft.com/office/drawing/2017/model3d" xmlns:o="urn:schemas-microsoft-com:office:office" xmlns:oel="http://schemas.microsoft.com/office/2019/extlst" xmlns:r="http://schemas.openxmlformats.org/officeDocument/2006/relationships" xmlns:m="http://schemas.openxmlformats.org/officeDocument/2006/math" xmlns:v="urn:schemas-microsoft-com:vml" xmlns:wp14="http://schemas.microsoft.com/office/word/2010/wordprocessingDrawing" xmlns:wp="http://schemas.openxmlformats.org/drawingml/2006/wordprocessingDrawing" xmlns:w10="urn:schemas-microsoft-com:office:word" xmlns:w="http://schemas.openxmlformats.org/wordprocessingml/2006/main" xmlns:w14="http://schemas.microsoft.com/office/word/2010/wordml" xmlns:w15="http://schemas.microsoft.com/office/word/2012/wordml" xmlns:w16cex="http://schemas.microsoft.com/office/word/2018/wordml/cex" xmlns:w16cid="http://schemas.microsoft.com/office/word/2016/wordml/cid" xmlns:w16="http://schemas.microsoft.com/office/word/2018/wordml" xmlns:w16du="http://schemas.microsoft.com/office/word/2023/wordml/word16du" xmlns:w16sdtdh="http://schemas.microsoft.com/office/word/2020/wordml/sdtdatahash" xmlns:w16sdtfl="http://schemas.microsoft.com/office/word/2024/wordml/sdtformatlock" xmlns:w16se="http://schemas.microsoft.com/office/word/2015/wordml/symex" xmlns:wpg="http://schemas.microsoft.com/office/word/2010/wordprocessingGroup" xmlns:wpi="http://schemas.microsoft.com/office/word/2010/wordprocessingInk" xmlns:wne="http://schemas.microsoft.com/office/word/2006/wordml" xmlns:wps="http://schemas.microsoft.com/office/word/2010/wordprocessingShape" mc:Ignorable="w14 w15 w16se w16cid w16 w16cex w16sdtdh w16sdtfl w16du wp14">
   <w:p>
     <w:pPr>
       <w:pBdr>
@@ -5879,7 +6915,7 @@
 </file>
 
 <file path=word/header3.xml><?xml version="1.0" encoding="utf-8"?>
-<w:hdr xmlns:wpc="http://schemas.microsoft.com/office/word/2010/wordprocessingCanvas" xmlns:mc="http://schemas.openxmlformats.org/markup-compatibility/2006" xmlns:o="urn:schemas-microsoft-com:office:office" xmlns:r="http://schemas.openxmlformats.org/officeDocument/2006/relationships" xmlns:m="http://schemas.openxmlformats.org/officeDocument/2006/math" xmlns:v="urn:schemas-microsoft-com:vml" xmlns:wp14="http://schemas.microsoft.com/office/word/2010/wordprocessingDrawing" xmlns:wp="http://schemas.openxmlformats.org/drawingml/2006/wordprocessingDrawing" xmlns:w10="urn:schemas-microsoft-com:office:word" xmlns:w="http://schemas.openxmlformats.org/wordprocessingml/2006/main" xmlns:w14="http://schemas.microsoft.com/office/word/2010/wordml" xmlns:wpg="http://schemas.microsoft.com/office/word/2010/wordprocessingGroup" xmlns:wpi="http://schemas.microsoft.com/office/word/2010/wordprocessingInk" xmlns:wne="http://schemas.microsoft.com/office/word/2006/wordml" xmlns:wps="http://schemas.microsoft.com/office/word/2010/wordprocessingShape" mc:Ignorable="w14 wp14">
+<w:hdr xmlns:wpc="http://schemas.microsoft.com/office/word/2010/wordprocessingCanvas" xmlns:cx="http://schemas.microsoft.com/office/drawing/2014/chartex" xmlns:cx1="http://schemas.microsoft.com/office/drawing/2015/9/8/chartex" xmlns:cx2="http://schemas.microsoft.com/office/drawing/2015/10/21/chartex" xmlns:cx3="http://schemas.microsoft.com/office/drawing/2016/5/9/chartex" xmlns:cx4="http://schemas.microsoft.com/office/drawing/2016/5/10/chartex" xmlns:cx5="http://schemas.microsoft.com/office/drawing/2016/5/11/chartex" xmlns:cx6="http://schemas.microsoft.com/office/drawing/2016/5/12/chartex" xmlns:cx7="http://schemas.microsoft.com/office/drawing/2016/5/13/chartex" xmlns:cx8="http://schemas.microsoft.com/office/drawing/2016/5/14/chartex" xmlns:mc="http://schemas.openxmlformats.org/markup-compatibility/2006" xmlns:aink="http://schemas.microsoft.com/office/drawing/2016/ink" xmlns:am3d="http://schemas.microsoft.com/office/drawing/2017/model3d" xmlns:o="urn:schemas-microsoft-com:office:office" xmlns:oel="http://schemas.microsoft.com/office/2019/extlst" xmlns:r="http://schemas.openxmlformats.org/officeDocument/2006/relationships" xmlns:m="http://schemas.openxmlformats.org/officeDocument/2006/math" xmlns:v="urn:schemas-microsoft-com:vml" xmlns:wp14="http://schemas.microsoft.com/office/word/2010/wordprocessingDrawing" xmlns:wp="http://schemas.openxmlformats.org/drawingml/2006/wordprocessingDrawing" xmlns:w10="urn:schemas-microsoft-com:office:word" xmlns:w="http://schemas.openxmlformats.org/wordprocessingml/2006/main" xmlns:w14="http://schemas.microsoft.com/office/word/2010/wordml" xmlns:w15="http://schemas.microsoft.com/office/word/2012/wordml" xmlns:w16cex="http://schemas.microsoft.com/office/word/2018/wordml/cex" xmlns:w16cid="http://schemas.microsoft.com/office/word/2016/wordml/cid" xmlns:w16="http://schemas.microsoft.com/office/word/2018/wordml" xmlns:w16du="http://schemas.microsoft.com/office/word/2023/wordml/word16du" xmlns:w16sdtdh="http://schemas.microsoft.com/office/word/2020/wordml/sdtdatahash" xmlns:w16sdtfl="http://schemas.microsoft.com/office/word/2024/wordml/sdtformatlock" xmlns:w16se="http://schemas.microsoft.com/office/word/2015/wordml/symex" xmlns:wpg="http://schemas.microsoft.com/office/word/2010/wordprocessingGroup" xmlns:wpi="http://schemas.microsoft.com/office/word/2010/wordprocessingInk" xmlns:wne="http://schemas.microsoft.com/office/word/2006/wordml" xmlns:wps="http://schemas.microsoft.com/office/word/2010/wordprocessingShape" mc:Ignorable="w14 w15 w16se w16cid w16 w16cex w16sdtdh w16sdtfl w16du wp14">
   <w:p>
     <w:pPr>
       <w:pBdr>
@@ -5921,7 +6957,7 @@
 </file>
 
 <file path=word/header4.xml><?xml version="1.0" encoding="utf-8"?>
-<w:hdr xmlns:wpc="http://schemas.microsoft.com/office/word/2010/wordprocessingCanvas" xmlns:mc="http://schemas.openxmlformats.org/markup-compatibility/2006" xmlns:o="urn:schemas-microsoft-com:office:office" xmlns:r="http://schemas.openxmlformats.org/officeDocument/2006/relationships" xmlns:m="http://schemas.openxmlformats.org/officeDocument/2006/math" xmlns:v="urn:schemas-microsoft-com:vml" xmlns:wp14="http://schemas.microsoft.com/office/word/2010/wordprocessingDrawing" xmlns:wp="http://schemas.openxmlformats.org/drawingml/2006/wordprocessingDrawing" xmlns:w10="urn:schemas-microsoft-com:office:word" xmlns:w="http://schemas.openxmlformats.org/wordprocessingml/2006/main" xmlns:w14="http://schemas.microsoft.com/office/word/2010/wordml" xmlns:wpg="http://schemas.microsoft.com/office/word/2010/wordprocessingGroup" xmlns:wpi="http://schemas.microsoft.com/office/word/2010/wordprocessingInk" xmlns:wne="http://schemas.microsoft.com/office/word/2006/wordml" xmlns:wps="http://schemas.microsoft.com/office/word/2010/wordprocessingShape" mc:Ignorable="w14 wp14">
+<w:hdr xmlns:wpc="http://schemas.microsoft.com/office/word/2010/wordprocessingCanvas" xmlns:cx="http://schemas.microsoft.com/office/drawing/2014/chartex" xmlns:cx1="http://schemas.microsoft.com/office/drawing/2015/9/8/chartex" xmlns:cx2="http://schemas.microsoft.com/office/drawing/2015/10/21/chartex" xmlns:cx3="http://schemas.microsoft.com/office/drawing/2016/5/9/chartex" xmlns:cx4="http://schemas.microsoft.com/office/drawing/2016/5/10/chartex" xmlns:cx5="http://schemas.microsoft.com/office/drawing/2016/5/11/chartex" xmlns:cx6="http://schemas.microsoft.com/office/drawing/2016/5/12/chartex" xmlns:cx7="http://schemas.microsoft.com/office/drawing/2016/5/13/chartex" xmlns:cx8="http://schemas.microsoft.com/office/drawing/2016/5/14/chartex" xmlns:mc="http://schemas.openxmlformats.org/markup-compatibility/2006" xmlns:aink="http://schemas.microsoft.com/office/drawing/2016/ink" xmlns:am3d="http://schemas.microsoft.com/office/drawing/2017/model3d" xmlns:o="urn:schemas-microsoft-com:office:office" xmlns:oel="http://schemas.microsoft.com/office/2019/extlst" xmlns:r="http://schemas.openxmlformats.org/officeDocument/2006/relationships" xmlns:m="http://schemas.openxmlformats.org/officeDocument/2006/math" xmlns:v="urn:schemas-microsoft-com:vml" xmlns:wp14="http://schemas.microsoft.com/office/word/2010/wordprocessingDrawing" xmlns:wp="http://schemas.openxmlformats.org/drawingml/2006/wordprocessingDrawing" xmlns:w10="urn:schemas-microsoft-com:office:word" xmlns:w="http://schemas.openxmlformats.org/wordprocessingml/2006/main" xmlns:w14="http://schemas.microsoft.com/office/word/2010/wordml" xmlns:w15="http://schemas.microsoft.com/office/word/2012/wordml" xmlns:w16cex="http://schemas.microsoft.com/office/word/2018/wordml/cex" xmlns:w16cid="http://schemas.microsoft.com/office/word/2016/wordml/cid" xmlns:w16="http://schemas.microsoft.com/office/word/2018/wordml" xmlns:w16du="http://schemas.microsoft.com/office/word/2023/wordml/word16du" xmlns:w16sdtdh="http://schemas.microsoft.com/office/word/2020/wordml/sdtdatahash" xmlns:w16sdtfl="http://schemas.microsoft.com/office/word/2024/wordml/sdtformatlock" xmlns:w16se="http://schemas.microsoft.com/office/word/2015/wordml/symex" xmlns:wpg="http://schemas.microsoft.com/office/word/2010/wordprocessingGroup" xmlns:wpi="http://schemas.microsoft.com/office/word/2010/wordprocessingInk" xmlns:wne="http://schemas.microsoft.com/office/word/2006/wordml" xmlns:wps="http://schemas.microsoft.com/office/word/2010/wordprocessingShape" mc:Ignorable="w14 w15 w16se w16cid w16 w16cex w16sdtdh w16sdtfl w16du wp14">
   <w:p>
     <w:pPr>
       <w:pBdr>
@@ -5995,7 +7031,7 @@
 </file>
 
 <file path=word/header5.xml><?xml version="1.0" encoding="utf-8"?>
-<w:hdr xmlns:wpc="http://schemas.microsoft.com/office/word/2010/wordprocessingCanvas" xmlns:mc="http://schemas.openxmlformats.org/markup-compatibility/2006" xmlns:o="urn:schemas-microsoft-com:office:office" xmlns:r="http://schemas.openxmlformats.org/officeDocument/2006/relationships" xmlns:m="http://schemas.openxmlformats.org/officeDocument/2006/math" xmlns:v="urn:schemas-microsoft-com:vml" xmlns:wp14="http://schemas.microsoft.com/office/word/2010/wordprocessingDrawing" xmlns:wp="http://schemas.openxmlformats.org/drawingml/2006/wordprocessingDrawing" xmlns:w10="urn:schemas-microsoft-com:office:word" xmlns:w="http://schemas.openxmlformats.org/wordprocessingml/2006/main" xmlns:w14="http://schemas.microsoft.com/office/word/2010/wordml" xmlns:wpg="http://schemas.microsoft.com/office/word/2010/wordprocessingGroup" xmlns:wpi="http://schemas.microsoft.com/office/word/2010/wordprocessingInk" xmlns:wne="http://schemas.microsoft.com/office/word/2006/wordml" xmlns:wps="http://schemas.microsoft.com/office/word/2010/wordprocessingShape" mc:Ignorable="w14 wp14">
+<w:hdr xmlns:wpc="http://schemas.microsoft.com/office/word/2010/wordprocessingCanvas" xmlns:cx="http://schemas.microsoft.com/office/drawing/2014/chartex" xmlns:cx1="http://schemas.microsoft.com/office/drawing/2015/9/8/chartex" xmlns:cx2="http://schemas.microsoft.com/office/drawing/2015/10/21/chartex" xmlns:cx3="http://schemas.microsoft.com/office/drawing/2016/5/9/chartex" xmlns:cx4="http://schemas.microsoft.com/office/drawing/2016/5/10/chartex" xmlns:cx5="http://schemas.microsoft.com/office/drawing/2016/5/11/chartex" xmlns:cx6="http://schemas.microsoft.com/office/drawing/2016/5/12/chartex" xmlns:cx7="http://schemas.microsoft.com/office/drawing/2016/5/13/chartex" xmlns:cx8="http://schemas.microsoft.com/office/drawing/2016/5/14/chartex" xmlns:mc="http://schemas.openxmlformats.org/markup-compatibility/2006" xmlns:aink="http://schemas.microsoft.com/office/drawing/2016/ink" xmlns:am3d="http://schemas.microsoft.com/office/drawing/2017/model3d" xmlns:o="urn:schemas-microsoft-com:office:office" xmlns:oel="http://schemas.microsoft.com/office/2019/extlst" xmlns:r="http://schemas.openxmlformats.org/officeDocument/2006/relationships" xmlns:m="http://schemas.openxmlformats.org/officeDocument/2006/math" xmlns:v="urn:schemas-microsoft-com:vml" xmlns:wp14="http://schemas.microsoft.com/office/word/2010/wordprocessingDrawing" xmlns:wp="http://schemas.openxmlformats.org/drawingml/2006/wordprocessingDrawing" xmlns:w10="urn:schemas-microsoft-com:office:word" xmlns:w="http://schemas.openxmlformats.org/wordprocessingml/2006/main" xmlns:w14="http://schemas.microsoft.com/office/word/2010/wordml" xmlns:w15="http://schemas.microsoft.com/office/word/2012/wordml" xmlns:w16cex="http://schemas.microsoft.com/office/word/2018/wordml/cex" xmlns:w16cid="http://schemas.microsoft.com/office/word/2016/wordml/cid" xmlns:w16="http://schemas.microsoft.com/office/word/2018/wordml" xmlns:w16du="http://schemas.microsoft.com/office/word/2023/wordml/word16du" xmlns:w16sdtdh="http://schemas.microsoft.com/office/word/2020/wordml/sdtdatahash" xmlns:w16sdtfl="http://schemas.microsoft.com/office/word/2024/wordml/sdtformatlock" xmlns:w16se="http://schemas.microsoft.com/office/word/2015/wordml/symex" xmlns:wpg="http://schemas.microsoft.com/office/word/2010/wordprocessingGroup" xmlns:wpi="http://schemas.microsoft.com/office/word/2010/wordprocessingInk" xmlns:wne="http://schemas.microsoft.com/office/word/2006/wordml" xmlns:wps="http://schemas.microsoft.com/office/word/2010/wordprocessingShape" mc:Ignorable="w14 w15 w16se w16cid w16 w16cex w16sdtdh w16sdtfl w16du wp14">
   <w:p>
     <w:pPr>
       <w:pBdr>
@@ -6056,8 +7092,8 @@
 </file>
 
 <file path=word/numbering.xml><?xml version="1.0" encoding="utf-8"?>
-<w:numbering xmlns:wpc="http://schemas.microsoft.com/office/word/2010/wordprocessingCanvas" xmlns:mc="http://schemas.openxmlformats.org/markup-compatibility/2006" xmlns:o="urn:schemas-microsoft-com:office:office" xmlns:r="http://schemas.openxmlformats.org/officeDocument/2006/relationships" xmlns:m="http://schemas.openxmlformats.org/officeDocument/2006/math" xmlns:v="urn:schemas-microsoft-com:vml" xmlns:wp14="http://schemas.microsoft.com/office/word/2010/wordprocessingDrawing" xmlns:wp="http://schemas.openxmlformats.org/drawingml/2006/wordprocessingDrawing" xmlns:w10="urn:schemas-microsoft-com:office:word" xmlns:w="http://schemas.openxmlformats.org/wordprocessingml/2006/main" xmlns:w14="http://schemas.microsoft.com/office/word/2010/wordml" xmlns:wpg="http://schemas.microsoft.com/office/word/2010/wordprocessingGroup" xmlns:wpi="http://schemas.microsoft.com/office/word/2010/wordprocessingInk" xmlns:wne="http://schemas.microsoft.com/office/word/2006/wordml" xmlns:wps="http://schemas.microsoft.com/office/word/2010/wordprocessingShape" mc:Ignorable="w14 wp14">
-  <w:abstractNum w:abstractNumId="0">
+<w:numbering xmlns:wpc="http://schemas.microsoft.com/office/word/2010/wordprocessingCanvas" xmlns:cx="http://schemas.microsoft.com/office/drawing/2014/chartex" xmlns:cx1="http://schemas.microsoft.com/office/drawing/2015/9/8/chartex" xmlns:cx2="http://schemas.microsoft.com/office/drawing/2015/10/21/chartex" xmlns:cx3="http://schemas.microsoft.com/office/drawing/2016/5/9/chartex" xmlns:cx4="http://schemas.microsoft.com/office/drawing/2016/5/10/chartex" xmlns:cx5="http://schemas.microsoft.com/office/drawing/2016/5/11/chartex" xmlns:cx6="http://schemas.microsoft.com/office/drawing/2016/5/12/chartex" xmlns:cx7="http://schemas.microsoft.com/office/drawing/2016/5/13/chartex" xmlns:cx8="http://schemas.microsoft.com/office/drawing/2016/5/14/chartex" xmlns:mc="http://schemas.openxmlformats.org/markup-compatibility/2006" xmlns:aink="http://schemas.microsoft.com/office/drawing/2016/ink" xmlns:am3d="http://schemas.microsoft.com/office/drawing/2017/model3d" xmlns:o="urn:schemas-microsoft-com:office:office" xmlns:oel="http://schemas.microsoft.com/office/2019/extlst" xmlns:r="http://schemas.openxmlformats.org/officeDocument/2006/relationships" xmlns:m="http://schemas.openxmlformats.org/officeDocument/2006/math" xmlns:v="urn:schemas-microsoft-com:vml" xmlns:wp14="http://schemas.microsoft.com/office/word/2010/wordprocessingDrawing" xmlns:wp="http://schemas.openxmlformats.org/drawingml/2006/wordprocessingDrawing" xmlns:w10="urn:schemas-microsoft-com:office:word" xmlns:w="http://schemas.openxmlformats.org/wordprocessingml/2006/main" xmlns:w14="http://schemas.microsoft.com/office/word/2010/wordml" xmlns:w15="http://schemas.microsoft.com/office/word/2012/wordml" xmlns:w16cex="http://schemas.microsoft.com/office/word/2018/wordml/cex" xmlns:w16cid="http://schemas.microsoft.com/office/word/2016/wordml/cid" xmlns:w16="http://schemas.microsoft.com/office/word/2018/wordml" xmlns:w16du="http://schemas.microsoft.com/office/word/2023/wordml/word16du" xmlns:w16sdtdh="http://schemas.microsoft.com/office/word/2020/wordml/sdtdatahash" xmlns:w16sdtfl="http://schemas.microsoft.com/office/word/2024/wordml/sdtformatlock" xmlns:w16se="http://schemas.microsoft.com/office/word/2015/wordml/symex" xmlns:wpg="http://schemas.microsoft.com/office/word/2010/wordprocessingGroup" xmlns:wpi="http://schemas.microsoft.com/office/word/2010/wordprocessingInk" xmlns:wne="http://schemas.microsoft.com/office/word/2006/wordml" xmlns:wps="http://schemas.microsoft.com/office/word/2010/wordprocessingShape" mc:Ignorable="w14 w15 w16se w16cid w16 w16cex w16sdtdh w16sdtfl w16du wp14">
+  <w:abstractNum w:abstractNumId="0" w15:restartNumberingAfterBreak="0">
     <w:nsid w:val="07DE711C"/>
     <w:multiLevelType w:val="multilevel"/>
     <w:tmpl w:val="0E425538"/>
@@ -6170,14 +7206,14 @@
       </w:pPr>
     </w:lvl>
   </w:abstractNum>
-  <w:num w:numId="1">
+  <w:num w:numId="1" w16cid:durableId="1079405117">
     <w:abstractNumId w:val="0"/>
   </w:num>
 </w:numbering>
 </file>
 
 <file path=word/styles.xml><?xml version="1.0" encoding="utf-8"?>
-<w:styles xmlns:mc="http://schemas.openxmlformats.org/markup-compatibility/2006" xmlns:r="http://schemas.openxmlformats.org/officeDocument/2006/relationships" xmlns:w="http://schemas.openxmlformats.org/wordprocessingml/2006/main" xmlns:w14="http://schemas.microsoft.com/office/word/2010/wordml" mc:Ignorable="w14">
+<w:styles xmlns:mc="http://schemas.openxmlformats.org/markup-compatibility/2006" xmlns:r="http://schemas.openxmlformats.org/officeDocument/2006/relationships" xmlns:w="http://schemas.openxmlformats.org/wordprocessingml/2006/main" xmlns:w14="http://schemas.microsoft.com/office/word/2010/wordml" xmlns:w15="http://schemas.microsoft.com/office/word/2012/wordml" xmlns:w16cex="http://schemas.microsoft.com/office/word/2018/wordml/cex" xmlns:w16cid="http://schemas.microsoft.com/office/word/2016/wordml/cid" xmlns:w16="http://schemas.microsoft.com/office/word/2018/wordml" xmlns:w16du="http://schemas.microsoft.com/office/word/2023/wordml/word16du" xmlns:w16sdtdh="http://schemas.microsoft.com/office/word/2020/wordml/sdtdatahash" xmlns:w16sdtfl="http://schemas.microsoft.com/office/word/2024/wordml/sdtformatlock" xmlns:w16se="http://schemas.microsoft.com/office/word/2015/wordml/symex" mc:Ignorable="w14 w15 w16se w16cid w16 w16cex w16sdtdh w16sdtfl w16du">
   <w:docDefaults>
     <w:rPrDefault>
       <w:rPr>
@@ -6193,144 +7229,383 @@
       </w:pPr>
     </w:pPrDefault>
   </w:docDefaults>
-  <w:latentStyles w:defLockedState="0" w:defUIPriority="99" w:defSemiHidden="1" w:defUnhideWhenUsed="1" w:defQFormat="0" w:count="267">
-    <w:lsdException w:name="Normal" w:semiHidden="0" w:uiPriority="0" w:unhideWhenUsed="0" w:qFormat="1"/>
-    <w:lsdException w:name="heading 1" w:semiHidden="0" w:uiPriority="9" w:unhideWhenUsed="0" w:qFormat="1"/>
-    <w:lsdException w:name="heading 2" w:uiPriority="9" w:qFormat="1"/>
-    <w:lsdException w:name="heading 3" w:uiPriority="9" w:qFormat="1"/>
-    <w:lsdException w:name="heading 4" w:uiPriority="9" w:qFormat="1"/>
-    <w:lsdException w:name="heading 5" w:uiPriority="9" w:qFormat="1"/>
-    <w:lsdException w:name="heading 6" w:uiPriority="9" w:qFormat="1"/>
-    <w:lsdException w:name="heading 7" w:uiPriority="9" w:qFormat="1"/>
-    <w:lsdException w:name="heading 8" w:uiPriority="9" w:qFormat="1"/>
-    <w:lsdException w:name="heading 9" w:uiPriority="9" w:qFormat="1"/>
-    <w:lsdException w:name="toc 1" w:uiPriority="39"/>
-    <w:lsdException w:name="toc 2" w:uiPriority="39"/>
-    <w:lsdException w:name="toc 3" w:uiPriority="39"/>
-    <w:lsdException w:name="toc 4" w:uiPriority="39"/>
-    <w:lsdException w:name="toc 5" w:uiPriority="39"/>
-    <w:lsdException w:name="toc 6" w:uiPriority="39"/>
-    <w:lsdException w:name="toc 7" w:uiPriority="39"/>
-    <w:lsdException w:name="toc 8" w:uiPriority="39"/>
-    <w:lsdException w:name="toc 9" w:uiPriority="39"/>
-    <w:lsdException w:name="caption" w:uiPriority="35" w:qFormat="1"/>
-    <w:lsdException w:name="Title" w:semiHidden="0" w:uiPriority="10" w:unhideWhenUsed="0" w:qFormat="1"/>
-    <w:lsdException w:name="Default Paragraph Font" w:uiPriority="1"/>
-    <w:lsdException w:name="Subtitle" w:semiHidden="0" w:uiPriority="11" w:unhideWhenUsed="0" w:qFormat="1"/>
-    <w:lsdException w:name="Strong" w:semiHidden="0" w:uiPriority="22" w:unhideWhenUsed="0" w:qFormat="1"/>
-    <w:lsdException w:name="Emphasis" w:semiHidden="0" w:uiPriority="20" w:unhideWhenUsed="0" w:qFormat="1"/>
-    <w:lsdException w:name="Table Grid" w:semiHidden="0" w:uiPriority="39" w:unhideWhenUsed="0"/>
-    <w:lsdException w:name="Placeholder Text" w:unhideWhenUsed="0"/>
-    <w:lsdException w:name="No Spacing" w:semiHidden="0" w:uiPriority="1" w:unhideWhenUsed="0" w:qFormat="1"/>
-    <w:lsdException w:name="Light Shading" w:semiHidden="0" w:uiPriority="60" w:unhideWhenUsed="0"/>
-    <w:lsdException w:name="Light List" w:semiHidden="0" w:uiPriority="61" w:unhideWhenUsed="0"/>
-    <w:lsdException w:name="Light Grid" w:semiHidden="0" w:uiPriority="62" w:unhideWhenUsed="0"/>
-    <w:lsdException w:name="Medium Shading 1" w:semiHidden="0" w:uiPriority="63" w:unhideWhenUsed="0"/>
-    <w:lsdException w:name="Medium Shading 2" w:semiHidden="0" w:uiPriority="64" w:unhideWhenUsed="0"/>
-    <w:lsdException w:name="Medium List 1" w:semiHidden="0" w:uiPriority="65" w:unhideWhenUsed="0"/>
-    <w:lsdException w:name="Medium List 2" w:semiHidden="0" w:uiPriority="66" w:unhideWhenUsed="0"/>
-    <w:lsdException w:name="Medium Grid 1" w:semiHidden="0" w:uiPriority="67" w:unhideWhenUsed="0"/>
-    <w:lsdException w:name="Medium Grid 2" w:semiHidden="0" w:uiPriority="68" w:unhideWhenUsed="0"/>
-    <w:lsdException w:name="Medium Grid 3" w:semiHidden="0" w:uiPriority="69" w:unhideWhenUsed="0"/>
-    <w:lsdException w:name="Dark List" w:semiHidden="0" w:uiPriority="70" w:unhideWhenUsed="0"/>
-    <w:lsdException w:name="Colorful Shading" w:semiHidden="0" w:uiPriority="71" w:unhideWhenUsed="0"/>
-    <w:lsdException w:name="Colorful List" w:semiHidden="0" w:uiPriority="72" w:unhideWhenUsed="0"/>
-    <w:lsdException w:name="Colorful Grid" w:semiHidden="0" w:uiPriority="73" w:unhideWhenUsed="0"/>
-    <w:lsdException w:name="Light Shading Accent 1" w:semiHidden="0" w:uiPriority="60" w:unhideWhenUsed="0"/>
-    <w:lsdException w:name="Light List Accent 1" w:semiHidden="0" w:uiPriority="61" w:unhideWhenUsed="0"/>
-    <w:lsdException w:name="Light Grid Accent 1" w:semiHidden="0" w:uiPriority="62" w:unhideWhenUsed="0"/>
-    <w:lsdException w:name="Medium Shading 1 Accent 1" w:semiHidden="0" w:uiPriority="63" w:unhideWhenUsed="0"/>
-    <w:lsdException w:name="Medium Shading 2 Accent 1" w:semiHidden="0" w:uiPriority="64" w:unhideWhenUsed="0"/>
-    <w:lsdException w:name="Medium List 1 Accent 1" w:semiHidden="0" w:uiPriority="65" w:unhideWhenUsed="0"/>
-    <w:lsdException w:name="Revision" w:unhideWhenUsed="0"/>
-    <w:lsdException w:name="List Paragraph" w:semiHidden="0" w:uiPriority="34" w:unhideWhenUsed="0" w:qFormat="1"/>
-    <w:lsdException w:name="Quote" w:semiHidden="0" w:uiPriority="29" w:unhideWhenUsed="0" w:qFormat="1"/>
-    <w:lsdException w:name="Intense Quote" w:semiHidden="0" w:uiPriority="30" w:unhideWhenUsed="0" w:qFormat="1"/>
-    <w:lsdException w:name="Medium List 2 Accent 1" w:semiHidden="0" w:uiPriority="66" w:unhideWhenUsed="0"/>
-    <w:lsdException w:name="Medium Grid 1 Accent 1" w:semiHidden="0" w:uiPriority="67" w:unhideWhenUsed="0"/>
-    <w:lsdException w:name="Medium Grid 2 Accent 1" w:semiHidden="0" w:uiPriority="68" w:unhideWhenUsed="0"/>
-    <w:lsdException w:name="Medium Grid 3 Accent 1" w:semiHidden="0" w:uiPriority="69" w:unhideWhenUsed="0"/>
-    <w:lsdException w:name="Dark List Accent 1" w:semiHidden="0" w:uiPriority="70" w:unhideWhenUsed="0"/>
-    <w:lsdException w:name="Colorful Shading Accent 1" w:semiHidden="0" w:uiPriority="71" w:unhideWhenUsed="0"/>
-    <w:lsdException w:name="Colorful List Accent 1" w:semiHidden="0" w:uiPriority="72" w:unhideWhenUsed="0"/>
-    <w:lsdException w:name="Colorful Grid Accent 1" w:semiHidden="0" w:uiPriority="73" w:unhideWhenUsed="0"/>
-    <w:lsdException w:name="Light Shading Accent 2" w:semiHidden="0" w:uiPriority="60" w:unhideWhenUsed="0"/>
-    <w:lsdException w:name="Light List Accent 2" w:semiHidden="0" w:uiPriority="61" w:unhideWhenUsed="0"/>
-    <w:lsdException w:name="Light Grid Accent 2" w:semiHidden="0" w:uiPriority="62" w:unhideWhenUsed="0"/>
-    <w:lsdException w:name="Medium Shading 1 Accent 2" w:semiHidden="0" w:uiPriority="63" w:unhideWhenUsed="0"/>
-    <w:lsdException w:name="Medium Shading 2 Accent 2" w:semiHidden="0" w:uiPriority="64" w:unhideWhenUsed="0"/>
-    <w:lsdException w:name="Medium List 1 Accent 2" w:semiHidden="0" w:uiPriority="65" w:unhideWhenUsed="0"/>
-    <w:lsdException w:name="Medium List 2 Accent 2" w:semiHidden="0" w:uiPriority="66" w:unhideWhenUsed="0"/>
-    <w:lsdException w:name="Medium Grid 1 Accent 2" w:semiHidden="0" w:uiPriority="67" w:unhideWhenUsed="0"/>
-    <w:lsdException w:name="Medium Grid 2 Accent 2" w:semiHidden="0" w:uiPriority="68" w:unhideWhenUsed="0"/>
-    <w:lsdException w:name="Medium Grid 3 Accent 2" w:semiHidden="0" w:uiPriority="69" w:unhideWhenUsed="0"/>
-    <w:lsdException w:name="Dark List Accent 2" w:semiHidden="0" w:uiPriority="70" w:unhideWhenUsed="0"/>
-    <w:lsdException w:name="Colorful Shading Accent 2" w:semiHidden="0" w:uiPriority="71" w:unhideWhenUsed="0"/>
-    <w:lsdException w:name="Colorful List Accent 2" w:semiHidden="0" w:uiPriority="72" w:unhideWhenUsed="0"/>
-    <w:lsdException w:name="Colorful Grid Accent 2" w:semiHidden="0" w:uiPriority="73" w:unhideWhenUsed="0"/>
-    <w:lsdException w:name="Light Shading Accent 3" w:semiHidden="0" w:uiPriority="60" w:unhideWhenUsed="0"/>
-    <w:lsdException w:name="Light List Accent 3" w:semiHidden="0" w:uiPriority="61" w:unhideWhenUsed="0"/>
-    <w:lsdException w:name="Light Grid Accent 3" w:semiHidden="0" w:uiPriority="62" w:unhideWhenUsed="0"/>
-    <w:lsdException w:name="Medium Shading 1 Accent 3" w:semiHidden="0" w:uiPriority="63" w:unhideWhenUsed="0"/>
-    <w:lsdException w:name="Medium Shading 2 Accent 3" w:semiHidden="0" w:uiPriority="64" w:unhideWhenUsed="0"/>
-    <w:lsdException w:name="Medium List 1 Accent 3" w:semiHidden="0" w:uiPriority="65" w:unhideWhenUsed="0"/>
-    <w:lsdException w:name="Medium List 2 Accent 3" w:semiHidden="0" w:uiPriority="66" w:unhideWhenUsed="0"/>
-    <w:lsdException w:name="Medium Grid 1 Accent 3" w:semiHidden="0" w:uiPriority="67" w:unhideWhenUsed="0"/>
-    <w:lsdException w:name="Medium Grid 2 Accent 3" w:semiHidden="0" w:uiPriority="68" w:unhideWhenUsed="0"/>
-    <w:lsdException w:name="Medium Grid 3 Accent 3" w:semiHidden="0" w:uiPriority="69" w:unhideWhenUsed="0"/>
-    <w:lsdException w:name="Dark List Accent 3" w:semiHidden="0" w:uiPriority="70" w:unhideWhenUsed="0"/>
-    <w:lsdException w:name="Colorful Shading Accent 3" w:semiHidden="0" w:uiPriority="71" w:unhideWhenUsed="0"/>
-    <w:lsdException w:name="Colorful List Accent 3" w:semiHidden="0" w:uiPriority="72" w:unhideWhenUsed="0"/>
-    <w:lsdException w:name="Colorful Grid Accent 3" w:semiHidden="0" w:uiPriority="73" w:unhideWhenUsed="0"/>
-    <w:lsdException w:name="Light Shading Accent 4" w:semiHidden="0" w:uiPriority="60" w:unhideWhenUsed="0"/>
-    <w:lsdException w:name="Light List Accent 4" w:semiHidden="0" w:uiPriority="61" w:unhideWhenUsed="0"/>
-    <w:lsdException w:name="Light Grid Accent 4" w:semiHidden="0" w:uiPriority="62" w:unhideWhenUsed="0"/>
-    <w:lsdException w:name="Medium Shading 1 Accent 4" w:semiHidden="0" w:uiPriority="63" w:unhideWhenUsed="0"/>
-    <w:lsdException w:name="Medium Shading 2 Accent 4" w:semiHidden="0" w:uiPriority="64" w:unhideWhenUsed="0"/>
-    <w:lsdException w:name="Medium List 1 Accent 4" w:semiHidden="0" w:uiPriority="65" w:unhideWhenUsed="0"/>
-    <w:lsdException w:name="Medium List 2 Accent 4" w:semiHidden="0" w:uiPriority="66" w:unhideWhenUsed="0"/>
-    <w:lsdException w:name="Medium Grid 1 Accent 4" w:semiHidden="0" w:uiPriority="67" w:unhideWhenUsed="0"/>
-    <w:lsdException w:name="Medium Grid 2 Accent 4" w:semiHidden="0" w:uiPriority="68" w:unhideWhenUsed="0"/>
-    <w:lsdException w:name="Medium Grid 3 Accent 4" w:semiHidden="0" w:uiPriority="69" w:unhideWhenUsed="0"/>
-    <w:lsdException w:name="Dark List Accent 4" w:semiHidden="0" w:uiPriority="70" w:unhideWhenUsed="0"/>
-    <w:lsdException w:name="Colorful Shading Accent 4" w:semiHidden="0" w:uiPriority="71" w:unhideWhenUsed="0"/>
-    <w:lsdException w:name="Colorful List Accent 4" w:semiHidden="0" w:uiPriority="72" w:unhideWhenUsed="0"/>
-    <w:lsdException w:name="Colorful Grid Accent 4" w:semiHidden="0" w:uiPriority="73" w:unhideWhenUsed="0"/>
-    <w:lsdException w:name="Light Shading Accent 5" w:semiHidden="0" w:uiPriority="60" w:unhideWhenUsed="0"/>
-    <w:lsdException w:name="Light List Accent 5" w:semiHidden="0" w:uiPriority="61" w:unhideWhenUsed="0"/>
-    <w:lsdException w:name="Light Grid Accent 5" w:semiHidden="0" w:uiPriority="62" w:unhideWhenUsed="0"/>
-    <w:lsdException w:name="Medium Shading 1 Accent 5" w:semiHidden="0" w:uiPriority="63" w:unhideWhenUsed="0"/>
-    <w:lsdException w:name="Medium Shading 2 Accent 5" w:semiHidden="0" w:uiPriority="64" w:unhideWhenUsed="0"/>
-    <w:lsdException w:name="Medium List 1 Accent 5" w:semiHidden="0" w:uiPriority="65" w:unhideWhenUsed="0"/>
-    <w:lsdException w:name="Medium List 2 Accent 5" w:semiHidden="0" w:uiPriority="66" w:unhideWhenUsed="0"/>
-    <w:lsdException w:name="Medium Grid 1 Accent 5" w:semiHidden="0" w:uiPriority="67" w:unhideWhenUsed="0"/>
-    <w:lsdException w:name="Medium Grid 2 Accent 5" w:semiHidden="0" w:uiPriority="68" w:unhideWhenUsed="0"/>
-    <w:lsdException w:name="Medium Grid 3 Accent 5" w:semiHidden="0" w:uiPriority="69" w:unhideWhenUsed="0"/>
-    <w:lsdException w:name="Dark List Accent 5" w:semiHidden="0" w:uiPriority="70" w:unhideWhenUsed="0"/>
-    <w:lsdException w:name="Colorful Shading Accent 5" w:semiHidden="0" w:uiPriority="71" w:unhideWhenUsed="0"/>
-    <w:lsdException w:name="Colorful List Accent 5" w:semiHidden="0" w:uiPriority="72" w:unhideWhenUsed="0"/>
-    <w:lsdException w:name="Colorful Grid Accent 5" w:semiHidden="0" w:uiPriority="73" w:unhideWhenUsed="0"/>
-    <w:lsdException w:name="Light Shading Accent 6" w:semiHidden="0" w:uiPriority="60" w:unhideWhenUsed="0"/>
-    <w:lsdException w:name="Light List Accent 6" w:semiHidden="0" w:uiPriority="61" w:unhideWhenUsed="0"/>
-    <w:lsdException w:name="Light Grid Accent 6" w:semiHidden="0" w:uiPriority="62" w:unhideWhenUsed="0"/>
-    <w:lsdException w:name="Medium Shading 1 Accent 6" w:semiHidden="0" w:uiPriority="63" w:unhideWhenUsed="0"/>
-    <w:lsdException w:name="Medium Shading 2 Accent 6" w:semiHidden="0" w:uiPriority="64" w:unhideWhenUsed="0"/>
-    <w:lsdException w:name="Medium List 1 Accent 6" w:semiHidden="0" w:uiPriority="65" w:unhideWhenUsed="0"/>
-    <w:lsdException w:name="Medium List 2 Accent 6" w:semiHidden="0" w:uiPriority="66" w:unhideWhenUsed="0"/>
-    <w:lsdException w:name="Medium Grid 1 Accent 6" w:semiHidden="0" w:uiPriority="67" w:unhideWhenUsed="0"/>
-    <w:lsdException w:name="Medium Grid 2 Accent 6" w:semiHidden="0" w:uiPriority="68" w:unhideWhenUsed="0"/>
-    <w:lsdException w:name="Medium Grid 3 Accent 6" w:semiHidden="0" w:uiPriority="69" w:unhideWhenUsed="0"/>
-    <w:lsdException w:name="Dark List Accent 6" w:semiHidden="0" w:uiPriority="70" w:unhideWhenUsed="0"/>
-    <w:lsdException w:name="Colorful Shading Accent 6" w:semiHidden="0" w:uiPriority="71" w:unhideWhenUsed="0"/>
-    <w:lsdException w:name="Colorful List Accent 6" w:semiHidden="0" w:uiPriority="72" w:unhideWhenUsed="0"/>
-    <w:lsdException w:name="Colorful Grid Accent 6" w:semiHidden="0" w:uiPriority="73" w:unhideWhenUsed="0"/>
-    <w:lsdException w:name="Subtle Emphasis" w:semiHidden="0" w:uiPriority="19" w:unhideWhenUsed="0" w:qFormat="1"/>
-    <w:lsdException w:name="Intense Emphasis" w:semiHidden="0" w:uiPriority="21" w:unhideWhenUsed="0" w:qFormat="1"/>
-    <w:lsdException w:name="Subtle Reference" w:semiHidden="0" w:uiPriority="31" w:unhideWhenUsed="0" w:qFormat="1"/>
-    <w:lsdException w:name="Intense Reference" w:semiHidden="0" w:uiPriority="32" w:unhideWhenUsed="0" w:qFormat="1"/>
-    <w:lsdException w:name="Book Title" w:semiHidden="0" w:uiPriority="33" w:unhideWhenUsed="0" w:qFormat="1"/>
-    <w:lsdException w:name="Bibliography" w:uiPriority="37"/>
-    <w:lsdException w:name="TOC Heading" w:uiPriority="39" w:qFormat="1"/>
+  <w:latentStyles w:defLockedState="0" w:defUIPriority="99" w:defSemiHidden="0" w:defUnhideWhenUsed="0" w:defQFormat="0" w:count="376">
+    <w:lsdException w:name="Normal" w:uiPriority="0" w:qFormat="1"/>
+    <w:lsdException w:name="heading 1" w:uiPriority="9" w:qFormat="1"/>
+    <w:lsdException w:name="heading 2" w:semiHidden="1" w:uiPriority="9" w:unhideWhenUsed="1" w:qFormat="1"/>
+    <w:lsdException w:name="heading 3" w:semiHidden="1" w:uiPriority="9" w:unhideWhenUsed="1" w:qFormat="1"/>
+    <w:lsdException w:name="heading 4" w:semiHidden="1" w:uiPriority="9" w:unhideWhenUsed="1" w:qFormat="1"/>
+    <w:lsdException w:name="heading 5" w:semiHidden="1" w:uiPriority="9" w:unhideWhenUsed="1" w:qFormat="1"/>
+    <w:lsdException w:name="heading 6" w:semiHidden="1" w:uiPriority="9" w:unhideWhenUsed="1" w:qFormat="1"/>
+    <w:lsdException w:name="heading 7" w:semiHidden="1" w:uiPriority="9" w:unhideWhenUsed="1" w:qFormat="1"/>
+    <w:lsdException w:name="heading 8" w:semiHidden="1" w:uiPriority="9" w:unhideWhenUsed="1" w:qFormat="1"/>
+    <w:lsdException w:name="heading 9" w:semiHidden="1" w:uiPriority="9" w:unhideWhenUsed="1" w:qFormat="1"/>
+    <w:lsdException w:name="index 1" w:semiHidden="1" w:unhideWhenUsed="1"/>
+    <w:lsdException w:name="index 2" w:semiHidden="1" w:unhideWhenUsed="1"/>
+    <w:lsdException w:name="index 3" w:semiHidden="1" w:unhideWhenUsed="1"/>
+    <w:lsdException w:name="index 4" w:semiHidden="1" w:unhideWhenUsed="1"/>
+    <w:lsdException w:name="index 5" w:semiHidden="1" w:unhideWhenUsed="1"/>
+    <w:lsdException w:name="index 6" w:semiHidden="1" w:unhideWhenUsed="1"/>
+    <w:lsdException w:name="index 7" w:semiHidden="1" w:unhideWhenUsed="1"/>
+    <w:lsdException w:name="index 8" w:semiHidden="1" w:unhideWhenUsed="1"/>
+    <w:lsdException w:name="index 9" w:semiHidden="1" w:unhideWhenUsed="1"/>
+    <w:lsdException w:name="toc 1" w:semiHidden="1" w:uiPriority="39" w:unhideWhenUsed="1"/>
+    <w:lsdException w:name="toc 2" w:semiHidden="1" w:uiPriority="39" w:unhideWhenUsed="1"/>
+    <w:lsdException w:name="toc 3" w:semiHidden="1" w:uiPriority="39" w:unhideWhenUsed="1"/>
+    <w:lsdException w:name="toc 4" w:semiHidden="1" w:uiPriority="39" w:unhideWhenUsed="1"/>
+    <w:lsdException w:name="toc 5" w:semiHidden="1" w:uiPriority="39" w:unhideWhenUsed="1"/>
+    <w:lsdException w:name="toc 6" w:semiHidden="1" w:uiPriority="39" w:unhideWhenUsed="1"/>
+    <w:lsdException w:name="toc 7" w:semiHidden="1" w:uiPriority="39" w:unhideWhenUsed="1"/>
+    <w:lsdException w:name="toc 8" w:semiHidden="1" w:uiPriority="39" w:unhideWhenUsed="1"/>
+    <w:lsdException w:name="toc 9" w:semiHidden="1" w:uiPriority="39" w:unhideWhenUsed="1"/>
+    <w:lsdException w:name="Normal Indent" w:semiHidden="1" w:unhideWhenUsed="1"/>
+    <w:lsdException w:name="footnote text" w:semiHidden="1" w:unhideWhenUsed="1"/>
+    <w:lsdException w:name="annotation text" w:semiHidden="1" w:unhideWhenUsed="1"/>
+    <w:lsdException w:name="header" w:semiHidden="1" w:unhideWhenUsed="1"/>
+    <w:lsdException w:name="footer" w:semiHidden="1" w:unhideWhenUsed="1"/>
+    <w:lsdException w:name="index heading" w:semiHidden="1" w:unhideWhenUsed="1"/>
+    <w:lsdException w:name="caption" w:semiHidden="1" w:uiPriority="35" w:unhideWhenUsed="1" w:qFormat="1"/>
+    <w:lsdException w:name="table of figures" w:semiHidden="1" w:unhideWhenUsed="1"/>
+    <w:lsdException w:name="envelope address" w:semiHidden="1" w:unhideWhenUsed="1"/>
+    <w:lsdException w:name="envelope return" w:semiHidden="1" w:unhideWhenUsed="1"/>
+    <w:lsdException w:name="footnote reference" w:semiHidden="1" w:unhideWhenUsed="1"/>
+    <w:lsdException w:name="annotation reference" w:semiHidden="1" w:unhideWhenUsed="1"/>
+    <w:lsdException w:name="line number" w:semiHidden="1" w:unhideWhenUsed="1"/>
+    <w:lsdException w:name="page number" w:semiHidden="1" w:unhideWhenUsed="1"/>
+    <w:lsdException w:name="endnote reference" w:semiHidden="1" w:unhideWhenUsed="1"/>
+    <w:lsdException w:name="endnote text" w:semiHidden="1" w:unhideWhenUsed="1"/>
+    <w:lsdException w:name="table of authorities" w:semiHidden="1" w:unhideWhenUsed="1"/>
+    <w:lsdException w:name="macro" w:semiHidden="1" w:unhideWhenUsed="1"/>
+    <w:lsdException w:name="toa heading" w:semiHidden="1" w:unhideWhenUsed="1"/>
+    <w:lsdException w:name="List" w:semiHidden="1" w:unhideWhenUsed="1"/>
+    <w:lsdException w:name="List Bullet" w:semiHidden="1" w:unhideWhenUsed="1"/>
+    <w:lsdException w:name="List Number" w:semiHidden="1" w:unhideWhenUsed="1"/>
+    <w:lsdException w:name="List 2" w:semiHidden="1" w:unhideWhenUsed="1"/>
+    <w:lsdException w:name="List 3" w:semiHidden="1" w:unhideWhenUsed="1"/>
+    <w:lsdException w:name="List 4" w:semiHidden="1" w:unhideWhenUsed="1"/>
+    <w:lsdException w:name="List 5" w:semiHidden="1" w:unhideWhenUsed="1"/>
+    <w:lsdException w:name="List Bullet 2" w:semiHidden="1" w:unhideWhenUsed="1"/>
+    <w:lsdException w:name="List Bullet 3" w:semiHidden="1" w:unhideWhenUsed="1"/>
+    <w:lsdException w:name="List Bullet 4" w:semiHidden="1" w:unhideWhenUsed="1"/>
+    <w:lsdException w:name="List Bullet 5" w:semiHidden="1" w:unhideWhenUsed="1"/>
+    <w:lsdException w:name="List Number 2" w:semiHidden="1" w:unhideWhenUsed="1"/>
+    <w:lsdException w:name="List Number 3" w:semiHidden="1" w:unhideWhenUsed="1"/>
+    <w:lsdException w:name="List Number 4" w:semiHidden="1" w:unhideWhenUsed="1"/>
+    <w:lsdException w:name="List Number 5" w:semiHidden="1" w:unhideWhenUsed="1"/>
+    <w:lsdException w:name="Title" w:uiPriority="10" w:qFormat="1"/>
+    <w:lsdException w:name="Closing" w:semiHidden="1" w:unhideWhenUsed="1"/>
+    <w:lsdException w:name="Signature" w:semiHidden="1" w:unhideWhenUsed="1"/>
+    <w:lsdException w:name="Default Paragraph Font" w:semiHidden="1" w:uiPriority="1" w:unhideWhenUsed="1"/>
+    <w:lsdException w:name="Body Text" w:semiHidden="1" w:unhideWhenUsed="1"/>
+    <w:lsdException w:name="Body Text Indent" w:semiHidden="1" w:unhideWhenUsed="1"/>
+    <w:lsdException w:name="List Continue" w:semiHidden="1" w:unhideWhenUsed="1"/>
+    <w:lsdException w:name="List Continue 2" w:semiHidden="1" w:unhideWhenUsed="1"/>
+    <w:lsdException w:name="List Continue 3" w:semiHidden="1" w:unhideWhenUsed="1"/>
+    <w:lsdException w:name="List Continue 4" w:semiHidden="1" w:unhideWhenUsed="1"/>
+    <w:lsdException w:name="List Continue 5" w:semiHidden="1" w:unhideWhenUsed="1"/>
+    <w:lsdException w:name="Message Header" w:semiHidden="1" w:unhideWhenUsed="1"/>
+    <w:lsdException w:name="Subtitle" w:uiPriority="11" w:qFormat="1"/>
+    <w:lsdException w:name="Salutation" w:semiHidden="1" w:unhideWhenUsed="1"/>
+    <w:lsdException w:name="Date" w:semiHidden="1" w:unhideWhenUsed="1"/>
+    <w:lsdException w:name="Body Text First Indent" w:semiHidden="1" w:unhideWhenUsed="1"/>
+    <w:lsdException w:name="Body Text First Indent 2" w:semiHidden="1" w:unhideWhenUsed="1"/>
+    <w:lsdException w:name="Note Heading" w:semiHidden="1" w:unhideWhenUsed="1"/>
+    <w:lsdException w:name="Body Text 2" w:semiHidden="1" w:unhideWhenUsed="1"/>
+    <w:lsdException w:name="Body Text 3" w:semiHidden="1" w:unhideWhenUsed="1"/>
+    <w:lsdException w:name="Body Text Indent 2" w:semiHidden="1" w:unhideWhenUsed="1"/>
+    <w:lsdException w:name="Body Text Indent 3" w:semiHidden="1" w:unhideWhenUsed="1"/>
+    <w:lsdException w:name="Block Text" w:semiHidden="1" w:unhideWhenUsed="1"/>
+    <w:lsdException w:name="Hyperlink" w:semiHidden="1" w:unhideWhenUsed="1"/>
+    <w:lsdException w:name="FollowedHyperlink" w:semiHidden="1" w:unhideWhenUsed="1"/>
+    <w:lsdException w:name="Strong" w:uiPriority="22" w:qFormat="1"/>
+    <w:lsdException w:name="Emphasis" w:uiPriority="20" w:qFormat="1"/>
+    <w:lsdException w:name="Document Map" w:semiHidden="1" w:unhideWhenUsed="1"/>
+    <w:lsdException w:name="Plain Text" w:semiHidden="1" w:unhideWhenUsed="1"/>
+    <w:lsdException w:name="E-mail Signature" w:semiHidden="1" w:unhideWhenUsed="1"/>
+    <w:lsdException w:name="HTML Top of Form" w:semiHidden="1" w:unhideWhenUsed="1"/>
+    <w:lsdException w:name="HTML Bottom of Form" w:semiHidden="1" w:unhideWhenUsed="1"/>
+    <w:lsdException w:name="Normal (Web)" w:semiHidden="1" w:unhideWhenUsed="1"/>
+    <w:lsdException w:name="HTML Acronym" w:semiHidden="1" w:unhideWhenUsed="1"/>
+    <w:lsdException w:name="HTML Address" w:semiHidden="1" w:unhideWhenUsed="1"/>
+    <w:lsdException w:name="HTML Cite" w:semiHidden="1" w:unhideWhenUsed="1"/>
+    <w:lsdException w:name="HTML Code" w:semiHidden="1" w:unhideWhenUsed="1"/>
+    <w:lsdException w:name="HTML Definition" w:semiHidden="1" w:unhideWhenUsed="1"/>
+    <w:lsdException w:name="HTML Keyboard" w:semiHidden="1" w:unhideWhenUsed="1"/>
+    <w:lsdException w:name="HTML Preformatted" w:semiHidden="1" w:unhideWhenUsed="1"/>
+    <w:lsdException w:name="HTML Sample" w:semiHidden="1" w:unhideWhenUsed="1"/>
+    <w:lsdException w:name="HTML Typewriter" w:semiHidden="1" w:unhideWhenUsed="1"/>
+    <w:lsdException w:name="HTML Variable" w:semiHidden="1" w:unhideWhenUsed="1"/>
+    <w:lsdException w:name="Normal Table" w:semiHidden="1" w:unhideWhenUsed="1"/>
+    <w:lsdException w:name="annotation subject" w:semiHidden="1" w:unhideWhenUsed="1"/>
+    <w:lsdException w:name="No List" w:semiHidden="1" w:unhideWhenUsed="1"/>
+    <w:lsdException w:name="Outline List 1" w:semiHidden="1" w:unhideWhenUsed="1"/>
+    <w:lsdException w:name="Outline List 2" w:semiHidden="1" w:unhideWhenUsed="1"/>
+    <w:lsdException w:name="Outline List 3" w:semiHidden="1" w:unhideWhenUsed="1"/>
+    <w:lsdException w:name="Table Simple 1" w:semiHidden="1" w:unhideWhenUsed="1"/>
+    <w:lsdException w:name="Table Simple 2" w:semiHidden="1" w:unhideWhenUsed="1"/>
+    <w:lsdException w:name="Table Simple 3" w:semiHidden="1" w:unhideWhenUsed="1"/>
+    <w:lsdException w:name="Table Classic 1" w:semiHidden="1" w:unhideWhenUsed="1"/>
+    <w:lsdException w:name="Table Classic 2" w:semiHidden="1" w:unhideWhenUsed="1"/>
+    <w:lsdException w:name="Table Classic 3" w:semiHidden="1" w:unhideWhenUsed="1"/>
+    <w:lsdException w:name="Table Classic 4" w:semiHidden="1" w:unhideWhenUsed="1"/>
+    <w:lsdException w:name="Table Colorful 1" w:semiHidden="1" w:unhideWhenUsed="1"/>
+    <w:lsdException w:name="Table Colorful 2" w:semiHidden="1" w:unhideWhenUsed="1"/>
+    <w:lsdException w:name="Table Colorful 3" w:semiHidden="1" w:unhideWhenUsed="1"/>
+    <w:lsdException w:name="Table Columns 1" w:semiHidden="1" w:unhideWhenUsed="1"/>
+    <w:lsdException w:name="Table Columns 2" w:semiHidden="1" w:unhideWhenUsed="1"/>
+    <w:lsdException w:name="Table Columns 3" w:semiHidden="1" w:unhideWhenUsed="1"/>
+    <w:lsdException w:name="Table Columns 4" w:semiHidden="1" w:unhideWhenUsed="1"/>
+    <w:lsdException w:name="Table Columns 5" w:semiHidden="1" w:unhideWhenUsed="1"/>
+    <w:lsdException w:name="Table Grid 1" w:semiHidden="1" w:unhideWhenUsed="1"/>
+    <w:lsdException w:name="Table Grid 2" w:semiHidden="1" w:unhideWhenUsed="1"/>
+    <w:lsdException w:name="Table Grid 3" w:semiHidden="1" w:unhideWhenUsed="1"/>
+    <w:lsdException w:name="Table Grid 4" w:semiHidden="1" w:unhideWhenUsed="1"/>
+    <w:lsdException w:name="Table Grid 5" w:semiHidden="1" w:unhideWhenUsed="1"/>
+    <w:lsdException w:name="Table Grid 6" w:semiHidden="1" w:unhideWhenUsed="1"/>
+    <w:lsdException w:name="Table Grid 7" w:semiHidden="1" w:unhideWhenUsed="1"/>
+    <w:lsdException w:name="Table Grid 8" w:semiHidden="1" w:unhideWhenUsed="1"/>
+    <w:lsdException w:name="Table List 1" w:semiHidden="1" w:unhideWhenUsed="1"/>
+    <w:lsdException w:name="Table List 2" w:semiHidden="1" w:unhideWhenUsed="1"/>
+    <w:lsdException w:name="Table List 3" w:semiHidden="1" w:unhideWhenUsed="1"/>
+    <w:lsdException w:name="Table List 4" w:semiHidden="1" w:unhideWhenUsed="1"/>
+    <w:lsdException w:name="Table List 5" w:semiHidden="1" w:unhideWhenUsed="1"/>
+    <w:lsdException w:name="Table List 6" w:semiHidden="1" w:unhideWhenUsed="1"/>
+    <w:lsdException w:name="Table List 7" w:semiHidden="1" w:unhideWhenUsed="1"/>
+    <w:lsdException w:name="Table List 8" w:semiHidden="1" w:unhideWhenUsed="1"/>
+    <w:lsdException w:name="Table 3D effects 1" w:semiHidden="1" w:unhideWhenUsed="1"/>
+    <w:lsdException w:name="Table 3D effects 2" w:semiHidden="1" w:unhideWhenUsed="1"/>
+    <w:lsdException w:name="Table 3D effects 3" w:semiHidden="1" w:unhideWhenUsed="1"/>
+    <w:lsdException w:name="Table Contemporary" w:semiHidden="1" w:unhideWhenUsed="1"/>
+    <w:lsdException w:name="Table Elegant" w:semiHidden="1" w:unhideWhenUsed="1"/>
+    <w:lsdException w:name="Table Professional" w:semiHidden="1" w:unhideWhenUsed="1"/>
+    <w:lsdException w:name="Table Subtle 1" w:semiHidden="1" w:unhideWhenUsed="1"/>
+    <w:lsdException w:name="Table Subtle 2" w:semiHidden="1" w:unhideWhenUsed="1"/>
+    <w:lsdException w:name="Table Web 1" w:semiHidden="1" w:unhideWhenUsed="1"/>
+    <w:lsdException w:name="Table Web 2" w:semiHidden="1" w:unhideWhenUsed="1"/>
+    <w:lsdException w:name="Table Web 3" w:semiHidden="1" w:unhideWhenUsed="1"/>
+    <w:lsdException w:name="Balloon Text" w:semiHidden="1" w:unhideWhenUsed="1"/>
+    <w:lsdException w:name="Table Grid" w:uiPriority="39"/>
+    <w:lsdException w:name="Table Theme" w:semiHidden="1" w:unhideWhenUsed="1"/>
+    <w:lsdException w:name="Placeholder Text" w:semiHidden="1"/>
+    <w:lsdException w:name="No Spacing" w:uiPriority="1" w:qFormat="1"/>
+    <w:lsdException w:name="Light Shading" w:uiPriority="60"/>
+    <w:lsdException w:name="Light List" w:uiPriority="61"/>
+    <w:lsdException w:name="Light Grid" w:uiPriority="62"/>
+    <w:lsdException w:name="Medium Shading 1" w:uiPriority="63"/>
+    <w:lsdException w:name="Medium Shading 2" w:uiPriority="64"/>
+    <w:lsdException w:name="Medium List 1" w:uiPriority="65"/>
+    <w:lsdException w:name="Medium List 2" w:uiPriority="66"/>
+    <w:lsdException w:name="Medium Grid 1" w:uiPriority="67"/>
+    <w:lsdException w:name="Medium Grid 2" w:uiPriority="68"/>
+    <w:lsdException w:name="Medium Grid 3" w:uiPriority="69"/>
+    <w:lsdException w:name="Dark List" w:uiPriority="70"/>
+    <w:lsdException w:name="Colorful Shading" w:uiPriority="71"/>
+    <w:lsdException w:name="Colorful List" w:uiPriority="72"/>
+    <w:lsdException w:name="Colorful Grid" w:uiPriority="73"/>
+    <w:lsdException w:name="Light Shading Accent 1" w:uiPriority="60"/>
+    <w:lsdException w:name="Light List Accent 1" w:uiPriority="61"/>
+    <w:lsdException w:name="Light Grid Accent 1" w:uiPriority="62"/>
+    <w:lsdException w:name="Medium Shading 1 Accent 1" w:uiPriority="63"/>
+    <w:lsdException w:name="Medium Shading 2 Accent 1" w:uiPriority="64"/>
+    <w:lsdException w:name="Medium List 1 Accent 1" w:uiPriority="65"/>
+    <w:lsdException w:name="Revision" w:semiHidden="1"/>
+    <w:lsdException w:name="List Paragraph" w:uiPriority="34" w:qFormat="1"/>
+    <w:lsdException w:name="Quote" w:uiPriority="29" w:qFormat="1"/>
+    <w:lsdException w:name="Intense Quote" w:uiPriority="30" w:qFormat="1"/>
+    <w:lsdException w:name="Medium List 2 Accent 1" w:uiPriority="66"/>
+    <w:lsdException w:name="Medium Grid 1 Accent 1" w:uiPriority="67"/>
+    <w:lsdException w:name="Medium Grid 2 Accent 1" w:uiPriority="68"/>
+    <w:lsdException w:name="Medium Grid 3 Accent 1" w:uiPriority="69"/>
+    <w:lsdException w:name="Dark List Accent 1" w:uiPriority="70"/>
+    <w:lsdException w:name="Colorful Shading Accent 1" w:uiPriority="71"/>
+    <w:lsdException w:name="Colorful List Accent 1" w:uiPriority="72"/>
+    <w:lsdException w:name="Colorful Grid Accent 1" w:uiPriority="73"/>
+    <w:lsdException w:name="Light Shading Accent 2" w:uiPriority="60"/>
+    <w:lsdException w:name="Light List Accent 2" w:uiPriority="61"/>
+    <w:lsdException w:name="Light Grid Accent 2" w:uiPriority="62"/>
+    <w:lsdException w:name="Medium Shading 1 Accent 2" w:uiPriority="63"/>
+    <w:lsdException w:name="Medium Shading 2 Accent 2" w:uiPriority="64"/>
+    <w:lsdException w:name="Medium List 1 Accent 2" w:uiPriority="65"/>
+    <w:lsdException w:name="Medium List 2 Accent 2" w:uiPriority="66"/>
+    <w:lsdException w:name="Medium Grid 1 Accent 2" w:uiPriority="67"/>
+    <w:lsdException w:name="Medium Grid 2 Accent 2" w:uiPriority="68"/>
+    <w:lsdException w:name="Medium Grid 3 Accent 2" w:uiPriority="69"/>
+    <w:lsdException w:name="Dark List Accent 2" w:uiPriority="70"/>
+    <w:lsdException w:name="Colorful Shading Accent 2" w:uiPriority="71"/>
+    <w:lsdException w:name="Colorful List Accent 2" w:uiPriority="72"/>
+    <w:lsdException w:name="Colorful Grid Accent 2" w:uiPriority="73"/>
+    <w:lsdException w:name="Light Shading Accent 3" w:uiPriority="60"/>
+    <w:lsdException w:name="Light List Accent 3" w:uiPriority="61"/>
+    <w:lsdException w:name="Light Grid Accent 3" w:uiPriority="62"/>
+    <w:lsdException w:name="Medium Shading 1 Accent 3" w:uiPriority="63"/>
+    <w:lsdException w:name="Medium Shading 2 Accent 3" w:uiPriority="64"/>
+    <w:lsdException w:name="Medium List 1 Accent 3" w:uiPriority="65"/>
+    <w:lsdException w:name="Medium List 2 Accent 3" w:uiPriority="66"/>
+    <w:lsdException w:name="Medium Grid 1 Accent 3" w:uiPriority="67"/>
+    <w:lsdException w:name="Medium Grid 2 Accent 3" w:uiPriority="68"/>
+    <w:lsdException w:name="Medium Grid 3 Accent 3" w:uiPriority="69"/>
+    <w:lsdException w:name="Dark List Accent 3" w:uiPriority="70"/>
+    <w:lsdException w:name="Colorful Shading Accent 3" w:uiPriority="71"/>
+    <w:lsdException w:name="Colorful List Accent 3" w:uiPriority="72"/>
+    <w:lsdException w:name="Colorful Grid Accent 3" w:uiPriority="73"/>
+    <w:lsdException w:name="Light Shading Accent 4" w:uiPriority="60"/>
+    <w:lsdException w:name="Light List Accent 4" w:uiPriority="61"/>
+    <w:lsdException w:name="Light Grid Accent 4" w:uiPriority="62"/>
+    <w:lsdException w:name="Medium Shading 1 Accent 4" w:uiPriority="63"/>
+    <w:lsdException w:name="Medium Shading 2 Accent 4" w:uiPriority="64"/>
+    <w:lsdException w:name="Medium List 1 Accent 4" w:uiPriority="65"/>
+    <w:lsdException w:name="Medium List 2 Accent 4" w:uiPriority="66"/>
+    <w:lsdException w:name="Medium Grid 1 Accent 4" w:uiPriority="67"/>
+    <w:lsdException w:name="Medium Grid 2 Accent 4" w:uiPriority="68"/>
+    <w:lsdException w:name="Medium Grid 3 Accent 4" w:uiPriority="69"/>
+    <w:lsdException w:name="Dark List Accent 4" w:uiPriority="70"/>
+    <w:lsdException w:name="Colorful Shading Accent 4" w:uiPriority="71"/>
+    <w:lsdException w:name="Colorful List Accent 4" w:uiPriority="72"/>
+    <w:lsdException w:name="Colorful Grid Accent 4" w:uiPriority="73"/>
+    <w:lsdException w:name="Light Shading Accent 5" w:uiPriority="60"/>
+    <w:lsdException w:name="Light List Accent 5" w:uiPriority="61"/>
+    <w:lsdException w:name="Light Grid Accent 5" w:uiPriority="62"/>
+    <w:lsdException w:name="Medium Shading 1 Accent 5" w:uiPriority="63"/>
+    <w:lsdException w:name="Medium Shading 2 Accent 5" w:uiPriority="64"/>
+    <w:lsdException w:name="Medium List 1 Accent 5" w:uiPriority="65"/>
+    <w:lsdException w:name="Medium List 2 Accent 5" w:uiPriority="66"/>
+    <w:lsdException w:name="Medium Grid 1 Accent 5" w:uiPriority="67"/>
+    <w:lsdException w:name="Medium Grid 2 Accent 5" w:uiPriority="68"/>
+    <w:lsdException w:name="Medium Grid 3 Accent 5" w:uiPriority="69"/>
+    <w:lsdException w:name="Dark List Accent 5" w:uiPriority="70"/>
+    <w:lsdException w:name="Colorful Shading Accent 5" w:uiPriority="71"/>
+    <w:lsdException w:name="Colorful List Accent 5" w:uiPriority="72"/>
+    <w:lsdException w:name="Colorful Grid Accent 5" w:uiPriority="73"/>
+    <w:lsdException w:name="Light Shading Accent 6" w:uiPriority="60"/>
+    <w:lsdException w:name="Light List Accent 6" w:uiPriority="61"/>
+    <w:lsdException w:name="Light Grid Accent 6" w:uiPriority="62"/>
+    <w:lsdException w:name="Medium Shading 1 Accent 6" w:uiPriority="63"/>
+    <w:lsdException w:name="Medium Shading 2 Accent 6" w:uiPriority="64"/>
+    <w:lsdException w:name="Medium List 1 Accent 6" w:uiPriority="65"/>
+    <w:lsdException w:name="Medium List 2 Accent 6" w:uiPriority="66"/>
+    <w:lsdException w:name="Medium Grid 1 Accent 6" w:uiPriority="67"/>
+    <w:lsdException w:name="Medium Grid 2 Accent 6" w:uiPriority="68"/>
+    <w:lsdException w:name="Medium Grid 3 Accent 6" w:uiPriority="69"/>
+    <w:lsdException w:name="Dark List Accent 6" w:uiPriority="70"/>
+    <w:lsdException w:name="Colorful Shading Accent 6" w:uiPriority="71"/>
+    <w:lsdException w:name="Colorful List Accent 6" w:uiPriority="72"/>
+    <w:lsdException w:name="Colorful Grid Accent 6" w:uiPriority="73"/>
+    <w:lsdException w:name="Subtle Emphasis" w:uiPriority="19" w:qFormat="1"/>
+    <w:lsdException w:name="Intense Emphasis" w:uiPriority="21" w:qFormat="1"/>
+    <w:lsdException w:name="Subtle Reference" w:uiPriority="31" w:qFormat="1"/>
+    <w:lsdException w:name="Intense Reference" w:uiPriority="32" w:qFormat="1"/>
+    <w:lsdException w:name="Book Title" w:uiPriority="33" w:qFormat="1"/>
+    <w:lsdException w:name="Bibliography" w:semiHidden="1" w:uiPriority="37" w:unhideWhenUsed="1"/>
+    <w:lsdException w:name="TOC Heading" w:semiHidden="1" w:uiPriority="39" w:unhideWhenUsed="1" w:qFormat="1"/>
+    <w:lsdException w:name="Plain Table 1" w:uiPriority="41"/>
+    <w:lsdException w:name="Plain Table 2" w:uiPriority="42"/>
+    <w:lsdException w:name="Plain Table 3" w:uiPriority="43"/>
+    <w:lsdException w:name="Plain Table 4" w:uiPriority="44"/>
+    <w:lsdException w:name="Plain Table 5" w:uiPriority="45"/>
+    <w:lsdException w:name="Grid Table Light" w:uiPriority="40"/>
+    <w:lsdException w:name="Grid Table 1 Light" w:uiPriority="46"/>
+    <w:lsdException w:name="Grid Table 2" w:uiPriority="47"/>
+    <w:lsdException w:name="Grid Table 3" w:uiPriority="48"/>
+    <w:lsdException w:name="Grid Table 4" w:uiPriority="49"/>
+    <w:lsdException w:name="Grid Table 5 Dark" w:uiPriority="50"/>
+    <w:lsdException w:name="Grid Table 6 Colorful" w:uiPriority="51"/>
+    <w:lsdException w:name="Grid Table 7 Colorful" w:uiPriority="52"/>
+    <w:lsdException w:name="Grid Table 1 Light Accent 1" w:uiPriority="46"/>
+    <w:lsdException w:name="Grid Table 2 Accent 1" w:uiPriority="47"/>
+    <w:lsdException w:name="Grid Table 3 Accent 1" w:uiPriority="48"/>
+    <w:lsdException w:name="Grid Table 4 Accent 1" w:uiPriority="49"/>
+    <w:lsdException w:name="Grid Table 5 Dark Accent 1" w:uiPriority="50"/>
+    <w:lsdException w:name="Grid Table 6 Colorful Accent 1" w:uiPriority="51"/>
+    <w:lsdException w:name="Grid Table 7 Colorful Accent 1" w:uiPriority="52"/>
+    <w:lsdException w:name="Grid Table 1 Light Accent 2" w:uiPriority="46"/>
+    <w:lsdException w:name="Grid Table 2 Accent 2" w:uiPriority="47"/>
+    <w:lsdException w:name="Grid Table 3 Accent 2" w:uiPriority="48"/>
+    <w:lsdException w:name="Grid Table 4 Accent 2" w:uiPriority="49"/>
+    <w:lsdException w:name="Grid Table 5 Dark Accent 2" w:uiPriority="50"/>
+    <w:lsdException w:name="Grid Table 6 Colorful Accent 2" w:uiPriority="51"/>
+    <w:lsdException w:name="Grid Table 7 Colorful Accent 2" w:uiPriority="52"/>
+    <w:lsdException w:name="Grid Table 1 Light Accent 3" w:uiPriority="46"/>
+    <w:lsdException w:name="Grid Table 2 Accent 3" w:uiPriority="47"/>
+    <w:lsdException w:name="Grid Table 3 Accent 3" w:uiPriority="48"/>
+    <w:lsdException w:name="Grid Table 4 Accent 3" w:uiPriority="49"/>
+    <w:lsdException w:name="Grid Table 5 Dark Accent 3" w:uiPriority="50"/>
+    <w:lsdException w:name="Grid Table 6 Colorful Accent 3" w:uiPriority="51"/>
+    <w:lsdException w:name="Grid Table 7 Colorful Accent 3" w:uiPriority="52"/>
+    <w:lsdException w:name="Grid Table 1 Light Accent 4" w:uiPriority="46"/>
+    <w:lsdException w:name="Grid Table 2 Accent 4" w:uiPriority="47"/>
+    <w:lsdException w:name="Grid Table 3 Accent 4" w:uiPriority="48"/>
+    <w:lsdException w:name="Grid Table 4 Accent 4" w:uiPriority="49"/>
+    <w:lsdException w:name="Grid Table 5 Dark Accent 4" w:uiPriority="50"/>
+    <w:lsdException w:name="Grid Table 6 Colorful Accent 4" w:uiPriority="51"/>
+    <w:lsdException w:name="Grid Table 7 Colorful Accent 4" w:uiPriority="52"/>
+    <w:lsdException w:name="Grid Table 1 Light Accent 5" w:uiPriority="46"/>
+    <w:lsdException w:name="Grid Table 2 Accent 5" w:uiPriority="47"/>
+    <w:lsdException w:name="Grid Table 3 Accent 5" w:uiPriority="48"/>
+    <w:lsdException w:name="Grid Table 4 Accent 5" w:uiPriority="49"/>
+    <w:lsdException w:name="Grid Table 5 Dark Accent 5" w:uiPriority="50"/>
+    <w:lsdException w:name="Grid Table 6 Colorful Accent 5" w:uiPriority="51"/>
+    <w:lsdException w:name="Grid Table 7 Colorful Accent 5" w:uiPriority="52"/>
+    <w:lsdException w:name="Grid Table 1 Light Accent 6" w:uiPriority="46"/>
+    <w:lsdException w:name="Grid Table 2 Accent 6" w:uiPriority="47"/>
+    <w:lsdException w:name="Grid Table 3 Accent 6" w:uiPriority="48"/>
+    <w:lsdException w:name="Grid Table 4 Accent 6" w:uiPriority="49"/>
+    <w:lsdException w:name="Grid Table 5 Dark Accent 6" w:uiPriority="50"/>
+    <w:lsdException w:name="Grid Table 6 Colorful Accent 6" w:uiPriority="51"/>
+    <w:lsdException w:name="Grid Table 7 Colorful Accent 6" w:uiPriority="52"/>
+    <w:lsdException w:name="List Table 1 Light" w:uiPriority="46"/>
+    <w:lsdException w:name="List Table 2" w:uiPriority="47"/>
+    <w:lsdException w:name="List Table 3" w:uiPriority="48"/>
+    <w:lsdException w:name="List Table 4" w:uiPriority="49"/>
+    <w:lsdException w:name="List Table 5 Dark" w:uiPriority="50"/>
+    <w:lsdException w:name="List Table 6 Colorful" w:uiPriority="51"/>
+    <w:lsdException w:name="List Table 7 Colorful" w:uiPriority="52"/>
+    <w:lsdException w:name="List Table 1 Light Accent 1" w:uiPriority="46"/>
+    <w:lsdException w:name="List Table 2 Accent 1" w:uiPriority="47"/>
+    <w:lsdException w:name="List Table 3 Accent 1" w:uiPriority="48"/>
+    <w:lsdException w:name="List Table 4 Accent 1" w:uiPriority="49"/>
+    <w:lsdException w:name="List Table 5 Dark Accent 1" w:uiPriority="50"/>
+    <w:lsdException w:name="List Table 6 Colorful Accent 1" w:uiPriority="51"/>
+    <w:lsdException w:name="List Table 7 Colorful Accent 1" w:uiPriority="52"/>
+    <w:lsdException w:name="List Table 1 Light Accent 2" w:uiPriority="46"/>
+    <w:lsdException w:name="List Table 2 Accent 2" w:uiPriority="47"/>
+    <w:lsdException w:name="List Table 3 Accent 2" w:uiPriority="48"/>
+    <w:lsdException w:name="List Table 4 Accent 2" w:uiPriority="49"/>
+    <w:lsdException w:name="List Table 5 Dark Accent 2" w:uiPriority="50"/>
+    <w:lsdException w:name="List Table 6 Colorful Accent 2" w:uiPriority="51"/>
+    <w:lsdException w:name="List Table 7 Colorful Accent 2" w:uiPriority="52"/>
+    <w:lsdException w:name="List Table 1 Light Accent 3" w:uiPriority="46"/>
+    <w:lsdException w:name="List Table 2 Accent 3" w:uiPriority="47"/>
+    <w:lsdException w:name="List Table 3 Accent 3" w:uiPriority="48"/>
+    <w:lsdException w:name="List Table 4 Accent 3" w:uiPriority="49"/>
+    <w:lsdException w:name="List Table 5 Dark Accent 3" w:uiPriority="50"/>
+    <w:lsdException w:name="List Table 6 Colorful Accent 3" w:uiPriority="51"/>
+    <w:lsdException w:name="List Table 7 Colorful Accent 3" w:uiPriority="52"/>
+    <w:lsdException w:name="List Table 1 Light Accent 4" w:uiPriority="46"/>
+    <w:lsdException w:name="List Table 2 Accent 4" w:uiPriority="47"/>
+    <w:lsdException w:name="List Table 3 Accent 4" w:uiPriority="48"/>
+    <w:lsdException w:name="List Table 4 Accent 4" w:uiPriority="49"/>
+    <w:lsdException w:name="List Table 5 Dark Accent 4" w:uiPriority="50"/>
+    <w:lsdException w:name="List Table 6 Colorful Accent 4" w:uiPriority="51"/>
+    <w:lsdException w:name="List Table 7 Colorful Accent 4" w:uiPriority="52"/>
+    <w:lsdException w:name="List Table 1 Light Accent 5" w:uiPriority="46"/>
+    <w:lsdException w:name="List Table 2 Accent 5" w:uiPriority="47"/>
+    <w:lsdException w:name="List Table 3 Accent 5" w:uiPriority="48"/>
+    <w:lsdException w:name="List Table 4 Accent 5" w:uiPriority="49"/>
+    <w:lsdException w:name="List Table 5 Dark Accent 5" w:uiPriority="50"/>
+    <w:lsdException w:name="List Table 6 Colorful Accent 5" w:uiPriority="51"/>
+    <w:lsdException w:name="List Table 7 Colorful Accent 5" w:uiPriority="52"/>
+    <w:lsdException w:name="List Table 1 Light Accent 6" w:uiPriority="46"/>
+    <w:lsdException w:name="List Table 2 Accent 6" w:uiPriority="47"/>
+    <w:lsdException w:name="List Table 3 Accent 6" w:uiPriority="48"/>
+    <w:lsdException w:name="List Table 4 Accent 6" w:uiPriority="49"/>
+    <w:lsdException w:name="List Table 5 Dark Accent 6" w:uiPriority="50"/>
+    <w:lsdException w:name="List Table 6 Colorful Accent 6" w:uiPriority="51"/>
+    <w:lsdException w:name="List Table 7 Colorful Accent 6" w:uiPriority="52"/>
+    <w:lsdException w:name="Mention" w:semiHidden="1" w:unhideWhenUsed="1"/>
+    <w:lsdException w:name="Smart Hyperlink" w:semiHidden="1" w:unhideWhenUsed="1"/>
+    <w:lsdException w:name="Hashtag" w:semiHidden="1" w:unhideWhenUsed="1"/>
+    <w:lsdException w:name="Unresolved Mention" w:semiHidden="1" w:unhideWhenUsed="1"/>
+    <w:lsdException w:name="Smart Link" w:semiHidden="1" w:unhideWhenUsed="1"/>
   </w:latentStyles>
   <w:style w:type="paragraph" w:default="1" w:styleId="Normal">
     <w:name w:val="Normal"/>
@@ -6461,7 +7736,6 @@
   <w:style w:type="character" w:default="1" w:styleId="Fontepargpadro">
     <w:name w:val="Default Paragraph Font"/>
     <w:uiPriority w:val="1"/>
-    <w:semiHidden/>
     <w:unhideWhenUsed/>
   </w:style>
   <w:style w:type="table" w:default="1" w:styleId="Tabelanormal">
@@ -6599,7 +7873,6 @@
       <w:spacing w:after="0" w:line="240" w:lineRule="auto"/>
     </w:pPr>
     <w:tblPr>
-      <w:tblInd w:w="0" w:type="dxa"/>
       <w:tblBorders>
         <w:top w:val="single" w:sz="4" w:space="0" w:color="auto"/>
         <w:left w:val="single" w:sz="4" w:space="0" w:color="auto"/>
@@ -6608,12 +7881,6 @@
         <w:insideH w:val="single" w:sz="4" w:space="0" w:color="auto"/>
         <w:insideV w:val="single" w:sz="4" w:space="0" w:color="auto"/>
       </w:tblBorders>
-      <w:tblCellMar>
-        <w:top w:w="0" w:type="dxa"/>
-        <w:left w:w="108" w:type="dxa"/>
-        <w:bottom w:w="0" w:type="dxa"/>
-        <w:right w:w="108" w:type="dxa"/>
-      </w:tblCellMar>
     </w:tblPr>
   </w:style>
   <w:style w:type="character" w:customStyle="1" w:styleId="citation-150">
@@ -6672,504 +7939,24 @@
     <w:basedOn w:val="Fontepargpadro"/>
     <w:rsid w:val="00610733"/>
   </w:style>
-</w:styles>
-</file>
-
-<file path=word/stylesWithEffects.xml><?xml version="1.0" encoding="utf-8"?>
-<w:styles xmlns:wpc="http://schemas.microsoft.com/office/word/2010/wordprocessingCanvas" xmlns:mc="http://schemas.openxmlformats.org/markup-compatibility/2006" xmlns:o="urn:schemas-microsoft-com:office:office" xmlns:r="http://schemas.openxmlformats.org/officeDocument/2006/relationships" xmlns:m="http://schemas.openxmlformats.org/officeDocument/2006/math" xmlns:v="urn:schemas-microsoft-com:vml" xmlns:wp14="http://schemas.microsoft.com/office/word/2010/wordprocessingDrawing" xmlns:wp="http://schemas.openxmlformats.org/drawingml/2006/wordprocessingDrawing" xmlns:w10="urn:schemas-microsoft-com:office:word" xmlns:w="http://schemas.openxmlformats.org/wordprocessingml/2006/main" xmlns:w14="http://schemas.microsoft.com/office/word/2010/wordml" xmlns:wpg="http://schemas.microsoft.com/office/word/2010/wordprocessingGroup" xmlns:wpi="http://schemas.microsoft.com/office/word/2010/wordprocessingInk" xmlns:wne="http://schemas.microsoft.com/office/word/2006/wordml" xmlns:wps="http://schemas.microsoft.com/office/word/2010/wordprocessingShape" mc:Ignorable="w14 wp14">
-  <w:docDefaults>
-    <w:rPrDefault>
-      <w:rPr>
-        <w:rFonts w:ascii="Times New Roman" w:eastAsia="Times New Roman" w:hAnsi="Times New Roman" w:cs="Times New Roman"/>
-        <w:sz w:val="24"/>
-        <w:szCs w:val="24"/>
-        <w:lang w:val="pt-BR" w:eastAsia="pt-BR" w:bidi="ar-SA"/>
-      </w:rPr>
-    </w:rPrDefault>
-    <w:pPrDefault>
-      <w:pPr>
-        <w:spacing w:after="240" w:line="360" w:lineRule="auto"/>
-      </w:pPr>
-    </w:pPrDefault>
-  </w:docDefaults>
-  <w:latentStyles w:defLockedState="0" w:defUIPriority="99" w:defSemiHidden="1" w:defUnhideWhenUsed="1" w:defQFormat="0" w:count="267">
-    <w:lsdException w:name="Normal" w:semiHidden="0" w:uiPriority="0" w:unhideWhenUsed="0" w:qFormat="1"/>
-    <w:lsdException w:name="heading 1" w:semiHidden="0" w:uiPriority="9" w:unhideWhenUsed="0" w:qFormat="1"/>
-    <w:lsdException w:name="heading 2" w:uiPriority="9" w:qFormat="1"/>
-    <w:lsdException w:name="heading 3" w:uiPriority="9" w:qFormat="1"/>
-    <w:lsdException w:name="heading 4" w:uiPriority="9" w:qFormat="1"/>
-    <w:lsdException w:name="heading 5" w:uiPriority="9" w:qFormat="1"/>
-    <w:lsdException w:name="heading 6" w:uiPriority="9" w:qFormat="1"/>
-    <w:lsdException w:name="heading 7" w:uiPriority="9" w:qFormat="1"/>
-    <w:lsdException w:name="heading 8" w:uiPriority="9" w:qFormat="1"/>
-    <w:lsdException w:name="heading 9" w:uiPriority="9" w:qFormat="1"/>
-    <w:lsdException w:name="toc 1" w:uiPriority="39"/>
-    <w:lsdException w:name="toc 2" w:uiPriority="39"/>
-    <w:lsdException w:name="toc 3" w:uiPriority="39"/>
-    <w:lsdException w:name="toc 4" w:uiPriority="39"/>
-    <w:lsdException w:name="toc 5" w:uiPriority="39"/>
-    <w:lsdException w:name="toc 6" w:uiPriority="39"/>
-    <w:lsdException w:name="toc 7" w:uiPriority="39"/>
-    <w:lsdException w:name="toc 8" w:uiPriority="39"/>
-    <w:lsdException w:name="toc 9" w:uiPriority="39"/>
-    <w:lsdException w:name="caption" w:uiPriority="35" w:qFormat="1"/>
-    <w:lsdException w:name="Title" w:semiHidden="0" w:uiPriority="10" w:unhideWhenUsed="0" w:qFormat="1"/>
-    <w:lsdException w:name="Default Paragraph Font" w:uiPriority="1"/>
-    <w:lsdException w:name="Subtitle" w:semiHidden="0" w:uiPriority="11" w:unhideWhenUsed="0" w:qFormat="1"/>
-    <w:lsdException w:name="Strong" w:semiHidden="0" w:uiPriority="22" w:unhideWhenUsed="0" w:qFormat="1"/>
-    <w:lsdException w:name="Emphasis" w:semiHidden="0" w:uiPriority="20" w:unhideWhenUsed="0" w:qFormat="1"/>
-    <w:lsdException w:name="Table Grid" w:semiHidden="0" w:uiPriority="39" w:unhideWhenUsed="0"/>
-    <w:lsdException w:name="Placeholder Text" w:unhideWhenUsed="0"/>
-    <w:lsdException w:name="No Spacing" w:semiHidden="0" w:uiPriority="1" w:unhideWhenUsed="0" w:qFormat="1"/>
-    <w:lsdException w:name="Light Shading" w:semiHidden="0" w:uiPriority="60" w:unhideWhenUsed="0"/>
-    <w:lsdException w:name="Light List" w:semiHidden="0" w:uiPriority="61" w:unhideWhenUsed="0"/>
-    <w:lsdException w:name="Light Grid" w:semiHidden="0" w:uiPriority="62" w:unhideWhenUsed="0"/>
-    <w:lsdException w:name="Medium Shading 1" w:semiHidden="0" w:uiPriority="63" w:unhideWhenUsed="0"/>
-    <w:lsdException w:name="Medium Shading 2" w:semiHidden="0" w:uiPriority="64" w:unhideWhenUsed="0"/>
-    <w:lsdException w:name="Medium List 1" w:semiHidden="0" w:uiPriority="65" w:unhideWhenUsed="0"/>
-    <w:lsdException w:name="Medium List 2" w:semiHidden="0" w:uiPriority="66" w:unhideWhenUsed="0"/>
-    <w:lsdException w:name="Medium Grid 1" w:semiHidden="0" w:uiPriority="67" w:unhideWhenUsed="0"/>
-    <w:lsdException w:name="Medium Grid 2" w:semiHidden="0" w:uiPriority="68" w:unhideWhenUsed="0"/>
-    <w:lsdException w:name="Medium Grid 3" w:semiHidden="0" w:uiPriority="69" w:unhideWhenUsed="0"/>
-    <w:lsdException w:name="Dark List" w:semiHidden="0" w:uiPriority="70" w:unhideWhenUsed="0"/>
-    <w:lsdException w:name="Colorful Shading" w:semiHidden="0" w:uiPriority="71" w:unhideWhenUsed="0"/>
-    <w:lsdException w:name="Colorful List" w:semiHidden="0" w:uiPriority="72" w:unhideWhenUsed="0"/>
-    <w:lsdException w:name="Colorful Grid" w:semiHidden="0" w:uiPriority="73" w:unhideWhenUsed="0"/>
-    <w:lsdException w:name="Light Shading Accent 1" w:semiHidden="0" w:uiPriority="60" w:unhideWhenUsed="0"/>
-    <w:lsdException w:name="Light List Accent 1" w:semiHidden="0" w:uiPriority="61" w:unhideWhenUsed="0"/>
-    <w:lsdException w:name="Light Grid Accent 1" w:semiHidden="0" w:uiPriority="62" w:unhideWhenUsed="0"/>
-    <w:lsdException w:name="Medium Shading 1 Accent 1" w:semiHidden="0" w:uiPriority="63" w:unhideWhenUsed="0"/>
-    <w:lsdException w:name="Medium Shading 2 Accent 1" w:semiHidden="0" w:uiPriority="64" w:unhideWhenUsed="0"/>
-    <w:lsdException w:name="Medium List 1 Accent 1" w:semiHidden="0" w:uiPriority="65" w:unhideWhenUsed="0"/>
-    <w:lsdException w:name="Revision" w:unhideWhenUsed="0"/>
-    <w:lsdException w:name="List Paragraph" w:semiHidden="0" w:uiPriority="34" w:unhideWhenUsed="0" w:qFormat="1"/>
-    <w:lsdException w:name="Quote" w:semiHidden="0" w:uiPriority="29" w:unhideWhenUsed="0" w:qFormat="1"/>
-    <w:lsdException w:name="Intense Quote" w:semiHidden="0" w:uiPriority="30" w:unhideWhenUsed="0" w:qFormat="1"/>
-    <w:lsdException w:name="Medium List 2 Accent 1" w:semiHidden="0" w:uiPriority="66" w:unhideWhenUsed="0"/>
-    <w:lsdException w:name="Medium Grid 1 Accent 1" w:semiHidden="0" w:uiPriority="67" w:unhideWhenUsed="0"/>
-    <w:lsdException w:name="Medium Grid 2 Accent 1" w:semiHidden="0" w:uiPriority="68" w:unhideWhenUsed="0"/>
-    <w:lsdException w:name="Medium Grid 3 Accent 1" w:semiHidden="0" w:uiPriority="69" w:unhideWhenUsed="0"/>
-    <w:lsdException w:name="Dark List Accent 1" w:semiHidden="0" w:uiPriority="70" w:unhideWhenUsed="0"/>
-    <w:lsdException w:name="Colorful Shading Accent 1" w:semiHidden="0" w:uiPriority="71" w:unhideWhenUsed="0"/>
-    <w:lsdException w:name="Colorful List Accent 1" w:semiHidden="0" w:uiPriority="72" w:unhideWhenUsed="0"/>
-    <w:lsdException w:name="Colorful Grid Accent 1" w:semiHidden="0" w:uiPriority="73" w:unhideWhenUsed="0"/>
-    <w:lsdException w:name="Light Shading Accent 2" w:semiHidden="0" w:uiPriority="60" w:unhideWhenUsed="0"/>
-    <w:lsdException w:name="Light List Accent 2" w:semiHidden="0" w:uiPriority="61" w:unhideWhenUsed="0"/>
-    <w:lsdException w:name="Light Grid Accent 2" w:semiHidden="0" w:uiPriority="62" w:unhideWhenUsed="0"/>
-    <w:lsdException w:name="Medium Shading 1 Accent 2" w:semiHidden="0" w:uiPriority="63" w:unhideWhenUsed="0"/>
-    <w:lsdException w:name="Medium Shading 2 Accent 2" w:semiHidden="0" w:uiPriority="64" w:unhideWhenUsed="0"/>
-    <w:lsdException w:name="Medium List 1 Accent 2" w:semiHidden="0" w:uiPriority="65" w:unhideWhenUsed="0"/>
-    <w:lsdException w:name="Medium List 2 Accent 2" w:semiHidden="0" w:uiPriority="66" w:unhideWhenUsed="0"/>
-    <w:lsdException w:name="Medium Grid 1 Accent 2" w:semiHidden="0" w:uiPriority="67" w:unhideWhenUsed="0"/>
-    <w:lsdException w:name="Medium Grid 2 Accent 2" w:semiHidden="0" w:uiPriority="68" w:unhideWhenUsed="0"/>
-    <w:lsdException w:name="Medium Grid 3 Accent 2" w:semiHidden="0" w:uiPriority="69" w:unhideWhenUsed="0"/>
-    <w:lsdException w:name="Dark List Accent 2" w:semiHidden="0" w:uiPriority="70" w:unhideWhenUsed="0"/>
-    <w:lsdException w:name="Colorful Shading Accent 2" w:semiHidden="0" w:uiPriority="71" w:unhideWhenUsed="0"/>
-    <w:lsdException w:name="Colorful List Accent 2" w:semiHidden="0" w:uiPriority="72" w:unhideWhenUsed="0"/>
-    <w:lsdException w:name="Colorful Grid Accent 2" w:semiHidden="0" w:uiPriority="73" w:unhideWhenUsed="0"/>
-    <w:lsdException w:name="Light Shading Accent 3" w:semiHidden="0" w:uiPriority="60" w:unhideWhenUsed="0"/>
-    <w:lsdException w:name="Light List Accent 3" w:semiHidden="0" w:uiPriority="61" w:unhideWhenUsed="0"/>
-    <w:lsdException w:name="Light Grid Accent 3" w:semiHidden="0" w:uiPriority="62" w:unhideWhenUsed="0"/>
-    <w:lsdException w:name="Medium Shading 1 Accent 3" w:semiHidden="0" w:uiPriority="63" w:unhideWhenUsed="0"/>
-    <w:lsdException w:name="Medium Shading 2 Accent 3" w:semiHidden="0" w:uiPriority="64" w:unhideWhenUsed="0"/>
-    <w:lsdException w:name="Medium List 1 Accent 3" w:semiHidden="0" w:uiPriority="65" w:unhideWhenUsed="0"/>
-    <w:lsdException w:name="Medium List 2 Accent 3" w:semiHidden="0" w:uiPriority="66" w:unhideWhenUsed="0"/>
-    <w:lsdException w:name="Medium Grid 1 Accent 3" w:semiHidden="0" w:uiPriority="67" w:unhideWhenUsed="0"/>
-    <w:lsdException w:name="Medium Grid 2 Accent 3" w:semiHidden="0" w:uiPriority="68" w:unhideWhenUsed="0"/>
-    <w:lsdException w:name="Medium Grid 3 Accent 3" w:semiHidden="0" w:uiPriority="69" w:unhideWhenUsed="0"/>
-    <w:lsdException w:name="Dark List Accent 3" w:semiHidden="0" w:uiPriority="70" w:unhideWhenUsed="0"/>
-    <w:lsdException w:name="Colorful Shading Accent 3" w:semiHidden="0" w:uiPriority="71" w:unhideWhenUsed="0"/>
-    <w:lsdException w:name="Colorful List Accent 3" w:semiHidden="0" w:uiPriority="72" w:unhideWhenUsed="0"/>
-    <w:lsdException w:name="Colorful Grid Accent 3" w:semiHidden="0" w:uiPriority="73" w:unhideWhenUsed="0"/>
-    <w:lsdException w:name="Light Shading Accent 4" w:semiHidden="0" w:uiPriority="60" w:unhideWhenUsed="0"/>
-    <w:lsdException w:name="Light List Accent 4" w:semiHidden="0" w:uiPriority="61" w:unhideWhenUsed="0"/>
-    <w:lsdException w:name="Light Grid Accent 4" w:semiHidden="0" w:uiPriority="62" w:unhideWhenUsed="0"/>
-    <w:lsdException w:name="Medium Shading 1 Accent 4" w:semiHidden="0" w:uiPriority="63" w:unhideWhenUsed="0"/>
-    <w:lsdException w:name="Medium Shading 2 Accent 4" w:semiHidden="0" w:uiPriority="64" w:unhideWhenUsed="0"/>
-    <w:lsdException w:name="Medium List 1 Accent 4" w:semiHidden="0" w:uiPriority="65" w:unhideWhenUsed="0"/>
-    <w:lsdException w:name="Medium List 2 Accent 4" w:semiHidden="0" w:uiPriority="66" w:unhideWhenUsed="0"/>
-    <w:lsdException w:name="Medium Grid 1 Accent 4" w:semiHidden="0" w:uiPriority="67" w:unhideWhenUsed="0"/>
-    <w:lsdException w:name="Medium Grid 2 Accent 4" w:semiHidden="0" w:uiPriority="68" w:unhideWhenUsed="0"/>
-    <w:lsdException w:name="Medium Grid 3 Accent 4" w:semiHidden="0" w:uiPriority="69" w:unhideWhenUsed="0"/>
-    <w:lsdException w:name="Dark List Accent 4" w:semiHidden="0" w:uiPriority="70" w:unhideWhenUsed="0"/>
-    <w:lsdException w:name="Colorful Shading Accent 4" w:semiHidden="0" w:uiPriority="71" w:unhideWhenUsed="0"/>
-    <w:lsdException w:name="Colorful List Accent 4" w:semiHidden="0" w:uiPriority="72" w:unhideWhenUsed="0"/>
-    <w:lsdException w:name="Colorful Grid Accent 4" w:semiHidden="0" w:uiPriority="73" w:unhideWhenUsed="0"/>
-    <w:lsdException w:name="Light Shading Accent 5" w:semiHidden="0" w:uiPriority="60" w:unhideWhenUsed="0"/>
-    <w:lsdException w:name="Light List Accent 5" w:semiHidden="0" w:uiPriority="61" w:unhideWhenUsed="0"/>
-    <w:lsdException w:name="Light Grid Accent 5" w:semiHidden="0" w:uiPriority="62" w:unhideWhenUsed="0"/>
-    <w:lsdException w:name="Medium Shading 1 Accent 5" w:semiHidden="0" w:uiPriority="63" w:unhideWhenUsed="0"/>
-    <w:lsdException w:name="Medium Shading 2 Accent 5" w:semiHidden="0" w:uiPriority="64" w:unhideWhenUsed="0"/>
-    <w:lsdException w:name="Medium List 1 Accent 5" w:semiHidden="0" w:uiPriority="65" w:unhideWhenUsed="0"/>
-    <w:lsdException w:name="Medium List 2 Accent 5" w:semiHidden="0" w:uiPriority="66" w:unhideWhenUsed="0"/>
-    <w:lsdException w:name="Medium Grid 1 Accent 5" w:semiHidden="0" w:uiPriority="67" w:unhideWhenUsed="0"/>
-    <w:lsdException w:name="Medium Grid 2 Accent 5" w:semiHidden="0" w:uiPriority="68" w:unhideWhenUsed="0"/>
-    <w:lsdException w:name="Medium Grid 3 Accent 5" w:semiHidden="0" w:uiPriority="69" w:unhideWhenUsed="0"/>
-    <w:lsdException w:name="Dark List Accent 5" w:semiHidden="0" w:uiPriority="70" w:unhideWhenUsed="0"/>
-    <w:lsdException w:name="Colorful Shading Accent 5" w:semiHidden="0" w:uiPriority="71" w:unhideWhenUsed="0"/>
-    <w:lsdException w:name="Colorful List Accent 5" w:semiHidden="0" w:uiPriority="72" w:unhideWhenUsed="0"/>
-    <w:lsdException w:name="Colorful Grid Accent 5" w:semiHidden="0" w:uiPriority="73" w:unhideWhenUsed="0"/>
-    <w:lsdException w:name="Light Shading Accent 6" w:semiHidden="0" w:uiPriority="60" w:unhideWhenUsed="0"/>
-    <w:lsdException w:name="Light List Accent 6" w:semiHidden="0" w:uiPriority="61" w:unhideWhenUsed="0"/>
-    <w:lsdException w:name="Light Grid Accent 6" w:semiHidden="0" w:uiPriority="62" w:unhideWhenUsed="0"/>
-    <w:lsdException w:name="Medium Shading 1 Accent 6" w:semiHidden="0" w:uiPriority="63" w:unhideWhenUsed="0"/>
-    <w:lsdException w:name="Medium Shading 2 Accent 6" w:semiHidden="0" w:uiPriority="64" w:unhideWhenUsed="0"/>
-    <w:lsdException w:name="Medium List 1 Accent 6" w:semiHidden="0" w:uiPriority="65" w:unhideWhenUsed="0"/>
-    <w:lsdException w:name="Medium List 2 Accent 6" w:semiHidden="0" w:uiPriority="66" w:unhideWhenUsed="0"/>
-    <w:lsdException w:name="Medium Grid 1 Accent 6" w:semiHidden="0" w:uiPriority="67" w:unhideWhenUsed="0"/>
-    <w:lsdException w:name="Medium Grid 2 Accent 6" w:semiHidden="0" w:uiPriority="68" w:unhideWhenUsed="0"/>
-    <w:lsdException w:name="Medium Grid 3 Accent 6" w:semiHidden="0" w:uiPriority="69" w:unhideWhenUsed="0"/>
-    <w:lsdException w:name="Dark List Accent 6" w:semiHidden="0" w:uiPriority="70" w:unhideWhenUsed="0"/>
-    <w:lsdException w:name="Colorful Shading Accent 6" w:semiHidden="0" w:uiPriority="71" w:unhideWhenUsed="0"/>
-    <w:lsdException w:name="Colorful List Accent 6" w:semiHidden="0" w:uiPriority="72" w:unhideWhenUsed="0"/>
-    <w:lsdException w:name="Colorful Grid Accent 6" w:semiHidden="0" w:uiPriority="73" w:unhideWhenUsed="0"/>
-    <w:lsdException w:name="Subtle Emphasis" w:semiHidden="0" w:uiPriority="19" w:unhideWhenUsed="0" w:qFormat="1"/>
-    <w:lsdException w:name="Intense Emphasis" w:semiHidden="0" w:uiPriority="21" w:unhideWhenUsed="0" w:qFormat="1"/>
-    <w:lsdException w:name="Subtle Reference" w:semiHidden="0" w:uiPriority="31" w:unhideWhenUsed="0" w:qFormat="1"/>
-    <w:lsdException w:name="Intense Reference" w:semiHidden="0" w:uiPriority="32" w:unhideWhenUsed="0" w:qFormat="1"/>
-    <w:lsdException w:name="Book Title" w:semiHidden="0" w:uiPriority="33" w:unhideWhenUsed="0" w:qFormat="1"/>
-    <w:lsdException w:name="Bibliography" w:uiPriority="37"/>
-    <w:lsdException w:name="TOC Heading" w:uiPriority="39" w:qFormat="1"/>
-  </w:latentStyles>
-  <w:style w:type="paragraph" w:default="1" w:styleId="Normal">
-    <w:name w:val="Normal"/>
-    <w:qFormat/>
-  </w:style>
-  <w:style w:type="paragraph" w:styleId="Ttulo1">
-    <w:name w:val="heading 1"/>
+  <w:style w:type="paragraph" w:styleId="Legenda">
+    <w:name w:val="caption"/>
     <w:basedOn w:val="Normal"/>
     <w:next w:val="Normal"/>
-    <w:uiPriority w:val="9"/>
+    <w:uiPriority w:val="35"/>
+    <w:unhideWhenUsed/>
     <w:qFormat/>
+    <w:rsid w:val="00B6568B"/>
     <w:pPr>
-      <w:keepNext/>
-      <w:keepLines/>
-      <w:spacing w:before="480" w:after="120"/>
-      <w:outlineLvl w:val="0"/>
+      <w:spacing w:after="200" w:line="240" w:lineRule="auto"/>
     </w:pPr>
     <w:rPr>
-      <w:b/>
-      <w:bCs/>
-      <w:sz w:val="48"/>
-      <w:szCs w:val="48"/>
-    </w:rPr>
-  </w:style>
-  <w:style w:type="paragraph" w:styleId="Ttulo2">
-    <w:name w:val="heading 2"/>
-    <w:basedOn w:val="Normal"/>
-    <w:next w:val="Normal"/>
-    <w:uiPriority w:val="9"/>
-    <w:semiHidden/>
-    <w:unhideWhenUsed/>
-    <w:qFormat/>
-    <w:pPr>
-      <w:keepNext/>
-      <w:keepLines/>
-      <w:spacing w:before="360" w:after="80"/>
-      <w:outlineLvl w:val="1"/>
-    </w:pPr>
-    <w:rPr>
-      <w:b/>
-      <w:bCs/>
-      <w:sz w:val="36"/>
-      <w:szCs w:val="36"/>
-    </w:rPr>
-  </w:style>
-  <w:style w:type="paragraph" w:styleId="Ttulo3">
-    <w:name w:val="heading 3"/>
-    <w:basedOn w:val="Normal"/>
-    <w:next w:val="Normal"/>
-    <w:uiPriority w:val="9"/>
-    <w:semiHidden/>
-    <w:unhideWhenUsed/>
-    <w:qFormat/>
-    <w:pPr>
-      <w:keepNext/>
-      <w:keepLines/>
-      <w:spacing w:before="280" w:after="80"/>
-      <w:outlineLvl w:val="2"/>
-    </w:pPr>
-    <w:rPr>
-      <w:b/>
-      <w:bCs/>
-      <w:sz w:val="28"/>
-      <w:szCs w:val="28"/>
-    </w:rPr>
-  </w:style>
-  <w:style w:type="paragraph" w:styleId="Ttulo4">
-    <w:name w:val="heading 4"/>
-    <w:basedOn w:val="Normal"/>
-    <w:next w:val="Normal"/>
-    <w:uiPriority w:val="9"/>
-    <w:semiHidden/>
-    <w:unhideWhenUsed/>
-    <w:qFormat/>
-    <w:pPr>
-      <w:keepNext/>
-      <w:keepLines/>
-      <w:spacing w:before="240" w:after="40"/>
-      <w:outlineLvl w:val="3"/>
-    </w:pPr>
-    <w:rPr>
-      <w:b/>
-      <w:bCs/>
-    </w:rPr>
-  </w:style>
-  <w:style w:type="paragraph" w:styleId="Ttulo5">
-    <w:name w:val="heading 5"/>
-    <w:basedOn w:val="Normal"/>
-    <w:next w:val="Normal"/>
-    <w:uiPriority w:val="9"/>
-    <w:semiHidden/>
-    <w:unhideWhenUsed/>
-    <w:qFormat/>
-    <w:pPr>
-      <w:keepNext/>
-      <w:keepLines/>
-      <w:spacing w:before="220" w:after="40"/>
-      <w:outlineLvl w:val="4"/>
-    </w:pPr>
-    <w:rPr>
-      <w:b/>
-      <w:bCs/>
-      <w:sz w:val="22"/>
-      <w:szCs w:val="22"/>
-    </w:rPr>
-  </w:style>
-  <w:style w:type="paragraph" w:styleId="Ttulo6">
-    <w:name w:val="heading 6"/>
-    <w:basedOn w:val="Normal"/>
-    <w:next w:val="Normal"/>
-    <w:uiPriority w:val="9"/>
-    <w:semiHidden/>
-    <w:unhideWhenUsed/>
-    <w:qFormat/>
-    <w:pPr>
-      <w:keepNext/>
-      <w:keepLines/>
-      <w:spacing w:before="200" w:after="40"/>
-      <w:outlineLvl w:val="5"/>
-    </w:pPr>
-    <w:rPr>
-      <w:b/>
-      <w:bCs/>
-      <w:sz w:val="20"/>
-      <w:szCs w:val="20"/>
-    </w:rPr>
-  </w:style>
-  <w:style w:type="character" w:default="1" w:styleId="Fontepargpadro">
-    <w:name w:val="Default Paragraph Font"/>
-    <w:uiPriority w:val="1"/>
-    <w:semiHidden/>
-    <w:unhideWhenUsed/>
-  </w:style>
-  <w:style w:type="table" w:default="1" w:styleId="Tabelanormal">
-    <w:name w:val="Normal Table"/>
-    <w:uiPriority w:val="99"/>
-    <w:semiHidden/>
-    <w:unhideWhenUsed/>
-    <w:tblPr>
-      <w:tblInd w:w="0" w:type="dxa"/>
-      <w:tblCellMar>
-        <w:top w:w="0" w:type="dxa"/>
-        <w:left w:w="108" w:type="dxa"/>
-        <w:bottom w:w="0" w:type="dxa"/>
-        <w:right w:w="108" w:type="dxa"/>
-      </w:tblCellMar>
-    </w:tblPr>
-  </w:style>
-  <w:style w:type="numbering" w:default="1" w:styleId="Semlista">
-    <w:name w:val="No List"/>
-    <w:uiPriority w:val="99"/>
-    <w:semiHidden/>
-    <w:unhideWhenUsed/>
-  </w:style>
-  <w:style w:type="table" w:customStyle="1" w:styleId="TableNormal">
-    <w:name w:val="TableNormal"/>
-    <w:tblPr>
-      <w:tblCellMar>
-        <w:top w:w="100" w:type="dxa"/>
-        <w:left w:w="100" w:type="dxa"/>
-        <w:bottom w:w="100" w:type="dxa"/>
-        <w:right w:w="100" w:type="dxa"/>
-      </w:tblCellMar>
-    </w:tblPr>
-  </w:style>
-  <w:style w:type="paragraph" w:styleId="Ttulo">
-    <w:name w:val="Title"/>
-    <w:basedOn w:val="Normal"/>
-    <w:next w:val="Normal"/>
-    <w:uiPriority w:val="10"/>
-    <w:qFormat/>
-    <w:pPr>
-      <w:keepNext/>
-      <w:keepLines/>
-      <w:spacing w:before="480" w:after="120"/>
-    </w:pPr>
-    <w:rPr>
-      <w:b/>
-      <w:bCs/>
-      <w:sz w:val="72"/>
-      <w:szCs w:val="72"/>
-    </w:rPr>
-  </w:style>
-  <w:style w:type="paragraph" w:styleId="Subttulo">
-    <w:name w:val="Subtitle"/>
-    <w:basedOn w:val="Normal"/>
-    <w:next w:val="Normal"/>
-    <w:uiPriority w:val="11"/>
-    <w:qFormat/>
-    <w:pPr>
-      <w:keepNext/>
-      <w:keepLines/>
-      <w:spacing w:before="360" w:after="80"/>
-    </w:pPr>
-    <w:rPr>
-      <w:rFonts w:ascii="Georgia" w:eastAsia="Georgia" w:hAnsi="Georgia" w:cs="Georgia"/>
       <w:i/>
       <w:iCs/>
-      <w:color w:val="666666"/>
-      <w:sz w:val="48"/>
-      <w:szCs w:val="48"/>
+      <w:color w:val="1F497D" w:themeColor="text2"/>
+      <w:sz w:val="18"/>
+      <w:szCs w:val="18"/>
     </w:rPr>
-  </w:style>
-  <w:style w:type="table" w:customStyle="1" w:styleId="a">
-    <w:basedOn w:val="TableNormal"/>
-    <w:tblPr>
-      <w:tblStyleRowBandSize w:val="1"/>
-      <w:tblStyleColBandSize w:val="1"/>
-      <w:tblCellMar>
-        <w:top w:w="0" w:type="dxa"/>
-        <w:left w:w="108" w:type="dxa"/>
-        <w:bottom w:w="0" w:type="dxa"/>
-        <w:right w:w="108" w:type="dxa"/>
-      </w:tblCellMar>
-    </w:tblPr>
-  </w:style>
-  <w:style w:type="table" w:customStyle="1" w:styleId="a0">
-    <w:basedOn w:val="TableNormal"/>
-    <w:tblPr>
-      <w:tblStyleRowBandSize w:val="1"/>
-      <w:tblStyleColBandSize w:val="1"/>
-      <w:tblCellMar>
-        <w:top w:w="0" w:type="dxa"/>
-        <w:left w:w="108" w:type="dxa"/>
-        <w:bottom w:w="0" w:type="dxa"/>
-        <w:right w:w="108" w:type="dxa"/>
-      </w:tblCellMar>
-    </w:tblPr>
-  </w:style>
-  <w:style w:type="paragraph" w:styleId="Textodebalo">
-    <w:name w:val="Balloon Text"/>
-    <w:basedOn w:val="Normal"/>
-    <w:link w:val="TextodebaloChar"/>
-    <w:uiPriority w:val="99"/>
-    <w:semiHidden/>
-    <w:unhideWhenUsed/>
-    <w:rsid w:val="00B808CD"/>
-    <w:pPr>
-      <w:spacing w:after="0" w:line="240" w:lineRule="auto"/>
-    </w:pPr>
-    <w:rPr>
-      <w:rFonts w:ascii="Tahoma" w:hAnsi="Tahoma" w:cs="Tahoma"/>
-      <w:sz w:val="16"/>
-      <w:szCs w:val="16"/>
-    </w:rPr>
-  </w:style>
-  <w:style w:type="character" w:customStyle="1" w:styleId="TextodebaloChar">
-    <w:name w:val="Texto de balão Char"/>
-    <w:basedOn w:val="Fontepargpadro"/>
-    <w:link w:val="Textodebalo"/>
-    <w:uiPriority w:val="99"/>
-    <w:semiHidden/>
-    <w:rsid w:val="00B808CD"/>
-    <w:rPr>
-      <w:rFonts w:ascii="Tahoma" w:hAnsi="Tahoma" w:cs="Tahoma"/>
-      <w:sz w:val="16"/>
-      <w:szCs w:val="16"/>
-    </w:rPr>
-  </w:style>
-  <w:style w:type="table" w:styleId="Tabelacomgrade">
-    <w:name w:val="Table Grid"/>
-    <w:basedOn w:val="Tabelanormal"/>
-    <w:uiPriority w:val="39"/>
-    <w:rsid w:val="002757AB"/>
-    <w:pPr>
-      <w:spacing w:after="0" w:line="240" w:lineRule="auto"/>
-    </w:pPr>
-    <w:tblPr>
-      <w:tblInd w:w="0" w:type="dxa"/>
-      <w:tblBorders>
-        <w:top w:val="single" w:sz="4" w:space="0" w:color="auto"/>
-        <w:left w:val="single" w:sz="4" w:space="0" w:color="auto"/>
-        <w:bottom w:val="single" w:sz="4" w:space="0" w:color="auto"/>
-        <w:right w:val="single" w:sz="4" w:space="0" w:color="auto"/>
-        <w:insideH w:val="single" w:sz="4" w:space="0" w:color="auto"/>
-        <w:insideV w:val="single" w:sz="4" w:space="0" w:color="auto"/>
-      </w:tblBorders>
-      <w:tblCellMar>
-        <w:top w:w="0" w:type="dxa"/>
-        <w:left w:w="108" w:type="dxa"/>
-        <w:bottom w:w="0" w:type="dxa"/>
-        <w:right w:w="108" w:type="dxa"/>
-      </w:tblCellMar>
-    </w:tblPr>
-  </w:style>
-  <w:style w:type="character" w:customStyle="1" w:styleId="citation-150">
-    <w:name w:val="citation-150"/>
-    <w:basedOn w:val="Fontepargpadro"/>
-    <w:rsid w:val="00A711AC"/>
-  </w:style>
-  <w:style w:type="character" w:customStyle="1" w:styleId="citation-148">
-    <w:name w:val="citation-148"/>
-    <w:basedOn w:val="Fontepargpadro"/>
-    <w:rsid w:val="007F7CF9"/>
-  </w:style>
-  <w:style w:type="paragraph" w:styleId="NormalWeb">
-    <w:name w:val="Normal (Web)"/>
-    <w:basedOn w:val="Normal"/>
-    <w:uiPriority w:val="99"/>
-    <w:semiHidden/>
-    <w:unhideWhenUsed/>
-    <w:rsid w:val="00610733"/>
-    <w:pPr>
-      <w:spacing w:before="100" w:beforeAutospacing="1" w:after="100" w:afterAutospacing="1" w:line="240" w:lineRule="auto"/>
-    </w:pPr>
-  </w:style>
-  <w:style w:type="character" w:customStyle="1" w:styleId="citation-140">
-    <w:name w:val="citation-140"/>
-    <w:basedOn w:val="Fontepargpadro"/>
-    <w:rsid w:val="00610733"/>
-  </w:style>
-  <w:style w:type="character" w:customStyle="1" w:styleId="citation-139">
-    <w:name w:val="citation-139"/>
-    <w:basedOn w:val="Fontepargpadro"/>
-    <w:rsid w:val="00610733"/>
-  </w:style>
-  <w:style w:type="character" w:customStyle="1" w:styleId="citation-138">
-    <w:name w:val="citation-138"/>
-    <w:basedOn w:val="Fontepargpadro"/>
-    <w:rsid w:val="00610733"/>
-  </w:style>
-  <w:style w:type="character" w:customStyle="1" w:styleId="citation-137">
-    <w:name w:val="citation-137"/>
-    <w:basedOn w:val="Fontepargpadro"/>
-    <w:rsid w:val="00610733"/>
-  </w:style>
-  <w:style w:type="character" w:customStyle="1" w:styleId="citation-136">
-    <w:name w:val="citation-136"/>
-    <w:basedOn w:val="Fontepargpadro"/>
-    <w:rsid w:val="00610733"/>
-  </w:style>
-  <w:style w:type="character" w:customStyle="1" w:styleId="citation-135">
-    <w:name w:val="citation-135"/>
-    <w:basedOn w:val="Fontepargpadro"/>
-    <w:rsid w:val="00610733"/>
-  </w:style>
-  <w:style w:type="character" w:customStyle="1" w:styleId="citation-134">
-    <w:name w:val="citation-134"/>
-    <w:basedOn w:val="Fontepargpadro"/>
-    <w:rsid w:val="00610733"/>
   </w:style>
 </w:styles>
 </file>
@@ -7492,4 +8279,16 @@
   </a:objectDefaults>
   <a:extraClrSchemeLst/>
 </a:theme>
+</file>
+
+<file path=customXml/item1.xml><?xml version="1.0" encoding="utf-8"?>
+<b:Sources xmlns:b="http://schemas.openxmlformats.org/officeDocument/2006/bibliography" xmlns="http://schemas.openxmlformats.org/officeDocument/2006/bibliography" SelectedStyle="\APASixthEditionOfficeOnline.xsl" StyleName="APA" Version="6"/>
+</file>
+
+<file path=customXml/itemProps1.xml><?xml version="1.0" encoding="utf-8"?>
+<ds:datastoreItem xmlns:ds="http://schemas.openxmlformats.org/officeDocument/2006/customXml" ds:itemID="{B8BAE98A-D240-461B-B040-D3F1B36F404F}">
+  <ds:schemaRefs>
+    <ds:schemaRef ds:uri="http://schemas.openxmlformats.org/officeDocument/2006/bibliography"/>
+  </ds:schemaRefs>
+</ds:datastoreItem>
 </file>
</xml_diff>

<commit_message>
docs: justificando textoi no pid
</commit_message>
<xml_diff>
--- a/PID_Relatório_5o_e_6o.Períodos_2026.docx
+++ b/PID_Relatório_5o_e_6o.Períodos_2026.docx
@@ -1,6 +1,6 @@
 
 <file path=word/document.xml><?xml version="1.0" encoding="utf-8"?>
-<w:document xmlns:wpc="http://schemas.microsoft.com/office/word/2010/wordprocessingCanvas" xmlns:cx="http://schemas.microsoft.com/office/drawing/2014/chartex" xmlns:cx1="http://schemas.microsoft.com/office/drawing/2015/9/8/chartex" xmlns:cx2="http://schemas.microsoft.com/office/drawing/2015/10/21/chartex" xmlns:cx3="http://schemas.microsoft.com/office/drawing/2016/5/9/chartex" xmlns:cx4="http://schemas.microsoft.com/office/drawing/2016/5/10/chartex" xmlns:cx5="http://schemas.microsoft.com/office/drawing/2016/5/11/chartex" xmlns:cx6="http://schemas.microsoft.com/office/drawing/2016/5/12/chartex" xmlns:cx7="http://schemas.microsoft.com/office/drawing/2016/5/13/chartex" xmlns:cx8="http://schemas.microsoft.com/office/drawing/2016/5/14/chartex" xmlns:mc="http://schemas.openxmlformats.org/markup-compatibility/2006" xmlns:aink="http://schemas.microsoft.com/office/drawing/2016/ink" xmlns:am3d="http://schemas.microsoft.com/office/drawing/2017/model3d" xmlns:o="urn:schemas-microsoft-com:office:office" xmlns:oel="http://schemas.microsoft.com/office/2019/extlst" xmlns:r="http://schemas.openxmlformats.org/officeDocument/2006/relationships" xmlns:m="http://schemas.openxmlformats.org/officeDocument/2006/math" xmlns:v="urn:schemas-microsoft-com:vml" xmlns:wp14="http://schemas.microsoft.com/office/word/2010/wordprocessingDrawing" xmlns:wp="http://schemas.openxmlformats.org/drawingml/2006/wordprocessingDrawing" xmlns:w10="urn:schemas-microsoft-com:office:word" xmlns:w="http://schemas.openxmlformats.org/wordprocessingml/2006/main" xmlns:w14="http://schemas.microsoft.com/office/word/2010/wordml" xmlns:w15="http://schemas.microsoft.com/office/word/2012/wordml" xmlns:w16cex="http://schemas.microsoft.com/office/word/2018/wordml/cex" xmlns:w16cid="http://schemas.microsoft.com/office/word/2016/wordml/cid" xmlns:w16="http://schemas.microsoft.com/office/word/2018/wordml" xmlns:w16du="http://schemas.microsoft.com/office/word/2023/wordml/word16du" xmlns:w16sdtdh="http://schemas.microsoft.com/office/word/2020/wordml/sdtdatahash" xmlns:w16sdtfl="http://schemas.microsoft.com/office/word/2024/wordml/sdtformatlock" xmlns:w16se="http://schemas.microsoft.com/office/word/2015/wordml/symex" xmlns:wpg="http://schemas.microsoft.com/office/word/2010/wordprocessingGroup" xmlns:wpi="http://schemas.microsoft.com/office/word/2010/wordprocessingInk" xmlns:wne="http://schemas.microsoft.com/office/word/2006/wordml" xmlns:wps="http://schemas.microsoft.com/office/word/2010/wordprocessingShape" mc:Ignorable="w14 w15 w16se w16cid w16 w16cex w16sdtdh w16sdtfl w16du wp14">
+<w:document xmlns:wpc="http://schemas.microsoft.com/office/word/2010/wordprocessingCanvas" xmlns:mc="http://schemas.openxmlformats.org/markup-compatibility/2006" xmlns:o="urn:schemas-microsoft-com:office:office" xmlns:r="http://schemas.openxmlformats.org/officeDocument/2006/relationships" xmlns:m="http://schemas.openxmlformats.org/officeDocument/2006/math" xmlns:v="urn:schemas-microsoft-com:vml" xmlns:wp14="http://schemas.microsoft.com/office/word/2010/wordprocessingDrawing" xmlns:wp="http://schemas.openxmlformats.org/drawingml/2006/wordprocessingDrawing" xmlns:w10="urn:schemas-microsoft-com:office:word" xmlns:w="http://schemas.openxmlformats.org/wordprocessingml/2006/main" xmlns:w14="http://schemas.microsoft.com/office/word/2010/wordml" xmlns:wpg="http://schemas.microsoft.com/office/word/2010/wordprocessingGroup" xmlns:wpi="http://schemas.microsoft.com/office/word/2010/wordprocessingInk" xmlns:wne="http://schemas.microsoft.com/office/word/2006/wordml" xmlns:wps="http://schemas.microsoft.com/office/word/2010/wordprocessingShape" mc:Ignorable="w14 wp14">
   <w:body>
     <w:p>
       <w:pPr>
@@ -1314,7 +1314,7 @@
               </wp:anchor>
             </w:drawing>
           </mc:Choice>
-          <mc:Fallback>
+          <mc:Fallback xmlns:w16se="http://schemas.microsoft.com/office/word/2015/wordml/symex" xmlns:w16sdtfl="http://schemas.microsoft.com/office/word/2024/wordml/sdtformatlock" xmlns:w16sdtdh="http://schemas.microsoft.com/office/word/2020/wordml/sdtdatahash" xmlns:w16du="http://schemas.microsoft.com/office/word/2023/wordml/word16du" xmlns:w16="http://schemas.microsoft.com/office/word/2018/wordml" xmlns:w16cid="http://schemas.microsoft.com/office/word/2016/wordml/cid" xmlns:w16cex="http://schemas.microsoft.com/office/word/2018/wordml/cex" xmlns:w15="http://schemas.microsoft.com/office/word/2012/wordml" xmlns:oel="http://schemas.microsoft.com/office/2019/extlst" xmlns:am3d="http://schemas.microsoft.com/office/drawing/2017/model3d" xmlns:aink="http://schemas.microsoft.com/office/drawing/2016/ink" xmlns:cx8="http://schemas.microsoft.com/office/drawing/2016/5/14/chartex" xmlns:cx7="http://schemas.microsoft.com/office/drawing/2016/5/13/chartex" xmlns:cx6="http://schemas.microsoft.com/office/drawing/2016/5/12/chartex" xmlns:cx5="http://schemas.microsoft.com/office/drawing/2016/5/11/chartex" xmlns:cx4="http://schemas.microsoft.com/office/drawing/2016/5/10/chartex" xmlns:cx3="http://schemas.microsoft.com/office/drawing/2016/5/9/chartex" xmlns:cx2="http://schemas.microsoft.com/office/drawing/2015/10/21/chartex" xmlns:cx1="http://schemas.microsoft.com/office/drawing/2015/9/8/chartex" xmlns:cx="http://schemas.microsoft.com/office/drawing/2014/chartex">
             <w:pict>
               <v:shapetype w14:anchorId="7018CBA8" id="_x0000_t202" coordsize="21600,21600" o:spt="202" path="m,l,21600r21600,l21600,xe">
                 <v:stroke joinstyle="miter"/>
@@ -1374,6 +1374,17 @@
     </w:p>
     <w:p>
       <w:pPr>
+        <w:spacing w:before="120" w:after="120"/>
+        <w:jc w:val="both"/>
+        <w:rPr>
+          <w:color w:val="0070C0"/>
+        </w:rPr>
+      </w:pPr>
+      <w:bookmarkStart w:id="1" w:name="_GoBack"/>
+      <w:bookmarkEnd w:id="1"/>
+    </w:p>
+    <w:p>
+      <w:pPr>
         <w:jc w:val="center"/>
       </w:pPr>
     </w:p>
@@ -1548,12 +1559,21 @@
               <w:spacing w:before="120" w:after="120"/>
               <w:jc w:val="both"/>
             </w:pPr>
+            <w:proofErr w:type="spellStart"/>
             <w:r>
               <w:rPr>
                 <w:i/>
                 <w:iCs/>
               </w:rPr>
-              <w:t xml:space="preserve">Random Access </w:t>
+              <w:t>Random</w:t>
+            </w:r>
+            <w:proofErr w:type="spellEnd"/>
+            <w:r>
+              <w:rPr>
+                <w:i/>
+                <w:iCs/>
+              </w:rPr>
+              <w:t xml:space="preserve"> Access </w:t>
             </w:r>
             <w:proofErr w:type="spellStart"/>
             <w:r>
@@ -1752,6 +1772,7 @@
           <w:docPartUnique/>
         </w:docPartObj>
       </w:sdtPr>
+      <w:sdtEndPr/>
       <w:sdtContent>
         <w:p>
           <w:pPr>
@@ -2768,9 +2789,9 @@
         <w:spacing w:before="120" w:after="120"/>
         <w:jc w:val="both"/>
         <w:sectPr>
-          <w:headerReference w:type="even" r:id="rId8"/>
-          <w:headerReference w:type="default" r:id="rId9"/>
-          <w:headerReference w:type="first" r:id="rId10"/>
+          <w:headerReference w:type="even" r:id="rId9"/>
+          <w:headerReference w:type="default" r:id="rId10"/>
+          <w:headerReference w:type="first" r:id="rId11"/>
           <w:pgSz w:w="11907" w:h="16840"/>
           <w:pgMar w:top="1701" w:right="1134" w:bottom="1134" w:left="1701" w:header="720" w:footer="720" w:gutter="0"/>
           <w:pgNumType w:start="1"/>
@@ -2798,8 +2819,8 @@
           <w:color w:val="000000"/>
         </w:rPr>
       </w:pPr>
-      <w:bookmarkStart w:id="1" w:name="_uebpuqog7hoa" w:colFirst="0" w:colLast="0"/>
-      <w:bookmarkEnd w:id="1"/>
+      <w:bookmarkStart w:id="2" w:name="_uebpuqog7hoa" w:colFirst="0" w:colLast="0"/>
+      <w:bookmarkEnd w:id="2"/>
       <w:r>
         <w:rPr>
           <w:b/>
@@ -2889,7 +2910,7 @@
               </wp:anchor>
             </w:drawing>
           </mc:Choice>
-          <mc:Fallback>
+          <mc:Fallback xmlns:w16se="http://schemas.microsoft.com/office/word/2015/wordml/symex" xmlns:w16sdtfl="http://schemas.microsoft.com/office/word/2024/wordml/sdtformatlock" xmlns:w16sdtdh="http://schemas.microsoft.com/office/word/2020/wordml/sdtdatahash" xmlns:w16du="http://schemas.microsoft.com/office/word/2023/wordml/word16du" xmlns:w16="http://schemas.microsoft.com/office/word/2018/wordml" xmlns:w16cid="http://schemas.microsoft.com/office/word/2016/wordml/cid" xmlns:w16cex="http://schemas.microsoft.com/office/word/2018/wordml/cex" xmlns:w15="http://schemas.microsoft.com/office/word/2012/wordml" xmlns:oel="http://schemas.microsoft.com/office/2019/extlst" xmlns:am3d="http://schemas.microsoft.com/office/drawing/2017/model3d" xmlns:aink="http://schemas.microsoft.com/office/drawing/2016/ink" xmlns:cx8="http://schemas.microsoft.com/office/drawing/2016/5/14/chartex" xmlns:cx7="http://schemas.microsoft.com/office/drawing/2016/5/13/chartex" xmlns:cx6="http://schemas.microsoft.com/office/drawing/2016/5/12/chartex" xmlns:cx5="http://schemas.microsoft.com/office/drawing/2016/5/11/chartex" xmlns:cx4="http://schemas.microsoft.com/office/drawing/2016/5/10/chartex" xmlns:cx3="http://schemas.microsoft.com/office/drawing/2016/5/9/chartex" xmlns:cx2="http://schemas.microsoft.com/office/drawing/2015/10/21/chartex" xmlns:cx1="http://schemas.microsoft.com/office/drawing/2015/9/8/chartex" xmlns:cx="http://schemas.microsoft.com/office/drawing/2014/chartex">
             <w:pict>
               <v:shape w14:anchorId="65E7CEEC" id="Caixa de Texto 3" o:spid="_x0000_s1027" type="#_x0000_t202" style="position:absolute;margin-left:440pt;margin-top:-54.4pt;width:15pt;height:20.4pt;z-index:251659264;visibility:visible;mso-wrap-style:square;mso-wrap-distance-left:9pt;mso-wrap-distance-top:0;mso-wrap-distance-right:9pt;mso-wrap-distance-bottom:0;mso-position-horizontal:absolute;mso-position-horizontal-relative:text;mso-position-vertical:absolute;mso-position-vertical-relative:text;v-text-anchor:top" o:gfxdata="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" stroked="f">
                 <v:textbox>
@@ -3006,7 +3027,7 @@
               </wp:anchor>
             </w:drawing>
           </mc:Choice>
-          <mc:Fallback>
+          <mc:Fallback xmlns:w16se="http://schemas.microsoft.com/office/word/2015/wordml/symex" xmlns:w16sdtfl="http://schemas.microsoft.com/office/word/2024/wordml/sdtformatlock" xmlns:w16sdtdh="http://schemas.microsoft.com/office/word/2020/wordml/sdtdatahash" xmlns:w16du="http://schemas.microsoft.com/office/word/2023/wordml/word16du" xmlns:w16="http://schemas.microsoft.com/office/word/2018/wordml" xmlns:w16cid="http://schemas.microsoft.com/office/word/2016/wordml/cid" xmlns:w16cex="http://schemas.microsoft.com/office/word/2018/wordml/cex" xmlns:w15="http://schemas.microsoft.com/office/word/2012/wordml" xmlns:oel="http://schemas.microsoft.com/office/2019/extlst" xmlns:am3d="http://schemas.microsoft.com/office/drawing/2017/model3d" xmlns:aink="http://schemas.microsoft.com/office/drawing/2016/ink" xmlns:cx8="http://schemas.microsoft.com/office/drawing/2016/5/14/chartex" xmlns:cx7="http://schemas.microsoft.com/office/drawing/2016/5/13/chartex" xmlns:cx6="http://schemas.microsoft.com/office/drawing/2016/5/12/chartex" xmlns:cx5="http://schemas.microsoft.com/office/drawing/2016/5/11/chartex" xmlns:cx4="http://schemas.microsoft.com/office/drawing/2016/5/10/chartex" xmlns:cx3="http://schemas.microsoft.com/office/drawing/2016/5/9/chartex" xmlns:cx2="http://schemas.microsoft.com/office/drawing/2015/10/21/chartex" xmlns:cx1="http://schemas.microsoft.com/office/drawing/2015/9/8/chartex" xmlns:cx="http://schemas.microsoft.com/office/drawing/2014/chartex">
             <w:pict>
               <v:shape w14:anchorId="7FCD1C33" id="Caixa de Texto 2" o:spid="_x0000_s1028" type="#_x0000_t202" style="position:absolute;margin-left:445pt;margin-top:-54.4pt;width:10pt;height:20.4pt;z-index:251660288;visibility:visible;mso-wrap-style:square;mso-wrap-distance-left:9pt;mso-wrap-distance-top:0;mso-wrap-distance-right:9pt;mso-wrap-distance-bottom:0;mso-position-horizontal:absolute;mso-position-horizontal-relative:text;mso-position-vertical:absolute;mso-position-vertical-relative:text;v-text-anchor:top" o:gfxdata="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" stroked="f">
                 <v:textbox>
@@ -3121,7 +3142,21 @@
         <w:rPr>
           <w:color w:val="000000" w:themeColor="text1"/>
         </w:rPr>
-        <w:t xml:space="preserve"> e PostgreSQL como banco de dados, garantindo organização, segurança e escalabilidade. O objetivo principal é oferecer uma solução prática, segura e organizada para apoiar o cuidado com a pessoa idosa, promovendo mais tranquilidade aos familiares e maior profissionalização aos cuidadores.</w:t>
+        <w:t xml:space="preserve"> e </w:t>
+      </w:r>
+      <w:proofErr w:type="spellStart"/>
+      <w:r>
+        <w:rPr>
+          <w:color w:val="000000" w:themeColor="text1"/>
+        </w:rPr>
+        <w:t>PostgreSQL</w:t>
+      </w:r>
+      <w:proofErr w:type="spellEnd"/>
+      <w:r>
+        <w:rPr>
+          <w:color w:val="000000" w:themeColor="text1"/>
+        </w:rPr>
+        <w:t xml:space="preserve"> como banco de dados, garantindo organização, segurança e escalabilidade. O objetivo principal é oferecer uma solução prática, segura e organizada para apoiar o cuidado com a pessoa idosa, promovendo mais tranquilidade aos familiares e maior profissionalização aos cuidadores.</w:t>
       </w:r>
     </w:p>
     <w:p>
@@ -3142,8 +3177,8 @@
           <w:color w:val="000000"/>
         </w:rPr>
       </w:pPr>
-      <w:bookmarkStart w:id="2" w:name="_gihow8iyy5tk" w:colFirst="0" w:colLast="0"/>
-      <w:bookmarkEnd w:id="2"/>
+      <w:bookmarkStart w:id="3" w:name="_gihow8iyy5tk" w:colFirst="0" w:colLast="0"/>
+      <w:bookmarkEnd w:id="3"/>
       <w:r>
         <w:br w:type="page"/>
       </w:r>
@@ -3224,8 +3259,8 @@
         </w:rPr>
         <w:t>Sistema Web para auxiliar comunicação entre idosos, responsáveis e cuidadores, facilitando o contato e a organização dos cuidados.</w:t>
       </w:r>
-      <w:bookmarkStart w:id="3" w:name="_wtwf8uuzt1zz" w:colFirst="0" w:colLast="0"/>
-      <w:bookmarkEnd w:id="3"/>
+      <w:bookmarkStart w:id="4" w:name="_wtwf8uuzt1zz" w:colFirst="0" w:colLast="0"/>
+      <w:bookmarkEnd w:id="4"/>
     </w:p>
     <w:p>
       <w:pPr>
@@ -3299,8 +3334,8 @@
           <w:color w:val="FF0000"/>
         </w:rPr>
       </w:pPr>
-      <w:bookmarkStart w:id="4" w:name="_4kon9gd1dvv5" w:colFirst="0" w:colLast="0"/>
-      <w:bookmarkEnd w:id="4"/>
+      <w:bookmarkStart w:id="5" w:name="_4kon9gd1dvv5" w:colFirst="0" w:colLast="0"/>
+      <w:bookmarkEnd w:id="5"/>
       <w:r>
         <w:rPr>
           <w:color w:val="FF0000"/>
@@ -3460,8 +3495,8 @@
           <w:color w:val="FF0000"/>
         </w:rPr>
       </w:pPr>
-      <w:bookmarkStart w:id="5" w:name="_a242hfqy1pb1" w:colFirst="0" w:colLast="0"/>
-      <w:bookmarkEnd w:id="5"/>
+      <w:bookmarkStart w:id="6" w:name="_a242hfqy1pb1" w:colFirst="0" w:colLast="0"/>
+      <w:bookmarkEnd w:id="6"/>
     </w:p>
     <w:p>
       <w:pPr>
@@ -3490,8 +3525,8 @@
       <w:pPr>
         <w:keepNext/>
       </w:pPr>
-      <w:bookmarkStart w:id="6" w:name="_vu5456qxwj1m" w:colFirst="0" w:colLast="0"/>
-      <w:bookmarkEnd w:id="6"/>
+      <w:bookmarkStart w:id="7" w:name="_vu5456qxwj1m" w:colFirst="0" w:colLast="0"/>
+      <w:bookmarkEnd w:id="7"/>
       <w:r>
         <w:t>O sistema é direcionado principalmente a cuidadores de idosos, bem como aos próprios idosos e seus familiares.</w:t>
       </w:r>
@@ -3557,8 +3592,8 @@
       <w:r>
         <w:t>Um exemplo de trabalho relacionado é o aplicativo DoseApp, que foi desenvolvido com o objetivo de auxiliar cuidadores e familiares no gerenciamento de medicamentos e na organização da rotina diária de idosos. O sistema permite registrar horários, dosagens e outras informações importantes, reduzindo o risco de perda de informações quando há revezamento entre diferentes cuidadores (ROSTIROLLA; SOUZA, 2022)</w:t>
       </w:r>
-      <w:bookmarkStart w:id="7" w:name="_ctqy09cxo6nw"/>
-      <w:bookmarkEnd w:id="7"/>
+      <w:bookmarkStart w:id="8" w:name="_ctqy09cxo6nw"/>
+      <w:bookmarkEnd w:id="8"/>
     </w:p>
     <w:p>
       <w:pPr>
@@ -3642,8 +3677,8 @@
         <w:lastRenderedPageBreak/>
         <w:t>identificadas no início do projeto. Caso sejam identificados problemas ou melhorias, ajustes serão realizados antes da finalização do projeto.</w:t>
       </w:r>
-      <w:bookmarkStart w:id="8" w:name="_u304za3h7w33"/>
-      <w:bookmarkEnd w:id="8"/>
+      <w:bookmarkStart w:id="9" w:name="_u304za3h7w33"/>
+      <w:bookmarkEnd w:id="9"/>
     </w:p>
     <w:p>
       <w:pPr>
@@ -3702,8 +3737,8 @@
           <w:color w:val="000000"/>
         </w:rPr>
       </w:pPr>
-      <w:bookmarkStart w:id="9" w:name="_5xhdqyoxv5pz"/>
-      <w:bookmarkEnd w:id="9"/>
+      <w:bookmarkStart w:id="10" w:name="_5xhdqyoxv5pz"/>
+      <w:bookmarkEnd w:id="10"/>
       <w:r>
         <w:rPr>
           <w:b/>
@@ -3726,8 +3761,8 @@
           <w:color w:val="0070C0"/>
         </w:rPr>
       </w:pPr>
-      <w:bookmarkStart w:id="10" w:name="_85x6gq42hjga" w:colFirst="0" w:colLast="0"/>
-      <w:bookmarkEnd w:id="10"/>
+      <w:bookmarkStart w:id="11" w:name="_85x6gq42hjga" w:colFirst="0" w:colLast="0"/>
+      <w:bookmarkEnd w:id="11"/>
     </w:p>
     <w:p>
       <w:pPr>
@@ -3821,8 +3856,8 @@
           <w:color w:val="FF0000"/>
         </w:rPr>
       </w:pPr>
-      <w:bookmarkStart w:id="11" w:name="_hlzhjesqyqyu"/>
-      <w:bookmarkEnd w:id="11"/>
+      <w:bookmarkStart w:id="12" w:name="_hlzhjesqyqyu"/>
+      <w:bookmarkEnd w:id="12"/>
     </w:p>
     <w:p>
       <w:pPr>
@@ -4065,8 +4100,8 @@
         </w:rPr>
         <w:t xml:space="preserve"> Mouse</w:t>
       </w:r>
-      <w:bookmarkStart w:id="12" w:name="_zgip7uuby6ix"/>
-      <w:bookmarkEnd w:id="12"/>
+      <w:bookmarkStart w:id="13" w:name="_zgip7uuby6ix"/>
+      <w:bookmarkEnd w:id="13"/>
     </w:p>
     <w:p>
       <w:pPr>
@@ -4170,8 +4205,8 @@
         </w:rPr>
         <w:t>RS 3 - Sistema operacional Microsoft Windows 11 Professional.</w:t>
       </w:r>
-      <w:bookmarkStart w:id="13" w:name="_pxyab1tdqc6h"/>
-      <w:bookmarkEnd w:id="13"/>
+      <w:bookmarkStart w:id="14" w:name="_pxyab1tdqc6h"/>
+      <w:bookmarkEnd w:id="14"/>
     </w:p>
     <w:p>
       <w:pPr>
@@ -4311,8 +4346,8 @@
         <w:lastRenderedPageBreak/>
         <w:t>desenvolvimento. Não há, neste projeto, a necessidade de investimentos financeiros significativos, uma vez que a maior parte dos recursos utilizados é de acesso gratuito ou já está disponível para os integrantes.</w:t>
       </w:r>
-      <w:bookmarkStart w:id="14" w:name="_3unqfi5pywb"/>
-      <w:bookmarkEnd w:id="14"/>
+      <w:bookmarkStart w:id="15" w:name="_3unqfi5pywb"/>
+      <w:bookmarkEnd w:id="15"/>
     </w:p>
     <w:p>
       <w:pPr>
@@ -4369,8 +4404,8 @@
           <w:color w:val="000000"/>
         </w:rPr>
       </w:pPr>
-      <w:bookmarkStart w:id="15" w:name="_69ez10u2xwkb" w:colFirst="0" w:colLast="0"/>
-      <w:bookmarkEnd w:id="15"/>
+      <w:bookmarkStart w:id="16" w:name="_69ez10u2xwkb" w:colFirst="0" w:colLast="0"/>
+      <w:bookmarkEnd w:id="16"/>
       <w:r>
         <w:br w:type="page"/>
       </w:r>
@@ -4400,8 +4435,8 @@
           <w:color w:val="000000"/>
         </w:rPr>
       </w:pPr>
-      <w:bookmarkStart w:id="16" w:name="_p41l1yyjr2lp" w:colFirst="0" w:colLast="0"/>
-      <w:bookmarkEnd w:id="16"/>
+      <w:bookmarkStart w:id="17" w:name="_p41l1yyjr2lp" w:colFirst="0" w:colLast="0"/>
+      <w:bookmarkEnd w:id="17"/>
       <w:r>
         <w:rPr>
           <w:color w:val="000000"/>
@@ -4424,8 +4459,8 @@
       </w:r>
     </w:p>
     <w:p>
-      <w:bookmarkStart w:id="17" w:name="_jnfti9d8nig6" w:colFirst="0" w:colLast="0"/>
-      <w:bookmarkEnd w:id="17"/>
+      <w:bookmarkStart w:id="18" w:name="_jnfti9d8nig6" w:colFirst="0" w:colLast="0"/>
+      <w:bookmarkEnd w:id="18"/>
     </w:p>
     <w:p>
       <w:pPr>
@@ -4464,8 +4499,8 @@
       </w:r>
     </w:p>
     <w:p>
-      <w:bookmarkStart w:id="18" w:name="_yfftpsqmbn38" w:colFirst="0" w:colLast="0"/>
-      <w:bookmarkEnd w:id="18"/>
+      <w:bookmarkStart w:id="19" w:name="_yfftpsqmbn38" w:colFirst="0" w:colLast="0"/>
+      <w:bookmarkEnd w:id="19"/>
     </w:p>
     <w:p>
       <w:pPr>
@@ -4515,8 +4550,8 @@
           <w:between w:val="nil"/>
         </w:pBdr>
       </w:pPr>
-      <w:bookmarkStart w:id="19" w:name="_zbtgsztsx5qt" w:colFirst="0" w:colLast="0"/>
-      <w:bookmarkEnd w:id="19"/>
+      <w:bookmarkStart w:id="20" w:name="_zbtgsztsx5qt" w:colFirst="0" w:colLast="0"/>
+      <w:bookmarkEnd w:id="20"/>
       <w:r>
         <w:rPr>
           <w:smallCaps/>
@@ -5274,7 +5309,7 @@
                     </pic:cNvPicPr>
                   </pic:nvPicPr>
                   <pic:blipFill rotWithShape="1">
-                    <a:blip r:embed="rId11" cstate="print">
+                    <a:blip r:embed="rId12" cstate="print">
                       <a:extLst>
                         <a:ext uri="{28A0092B-C50C-407E-A947-70E740481C1C}">
                           <a14:useLocalDpi xmlns:a14="http://schemas.microsoft.com/office/drawing/2010/main" val="0"/>
@@ -5436,6 +5471,10 @@
       </w:r>
     </w:p>
     <w:p>
+      <w:pPr>
+        <w:spacing w:before="240"/>
+        <w:jc w:val="both"/>
+      </w:pPr>
       <w:r>
         <w:t>O front-</w:t>
       </w:r>
@@ -5452,6 +5491,10 @@
       </w:r>
     </w:p>
     <w:p>
+      <w:pPr>
+        <w:spacing w:before="240"/>
+        <w:jc w:val="both"/>
+      </w:pPr>
       <w:r>
         <w:t xml:space="preserve">A Figura 2 apresenta a organização das principais áreas funcionais previstas para a interface do sistema. Entre os elementos representados </w:t>
       </w:r>
@@ -5496,7 +5539,7 @@
                     </pic:cNvPicPr>
                   </pic:nvPicPr>
                   <pic:blipFill>
-                    <a:blip r:embed="rId12" cstate="print">
+                    <a:blip r:embed="rId13" cstate="print">
                       <a:extLst>
                         <a:ext uri="{28A0092B-C50C-407E-A947-70E740481C1C}">
                           <a14:useLocalDpi xmlns:a14="http://schemas.microsoft.com/office/drawing/2010/main" val="0"/>
@@ -5668,6 +5711,10 @@
       </w:r>
     </w:p>
     <w:p>
+      <w:pPr>
+        <w:spacing w:before="240"/>
+        <w:jc w:val="both"/>
+      </w:pPr>
       <w:r>
         <w:t xml:space="preserve">O diagrama de classes de negócio representa os principais elementos envolvidos no funcionamento do </w:t>
       </w:r>
@@ -5714,7 +5761,7 @@
                     </pic:cNvPicPr>
                   </pic:nvPicPr>
                   <pic:blipFill>
-                    <a:blip r:embed="rId13">
+                    <a:blip r:embed="rId14">
                       <a:extLst>
                         <a:ext uri="{28A0092B-C50C-407E-A947-70E740481C1C}">
                           <a14:useLocalDpi xmlns:a14="http://schemas.microsoft.com/office/drawing/2010/main" val="0"/>
@@ -5864,6 +5911,8 @@
     <w:p>
       <w:pPr>
         <w:keepNext/>
+        <w:spacing w:before="240"/>
+        <w:jc w:val="both"/>
       </w:pPr>
       <w:r>
         <w:t>Os diagramas de sequência representam a interação entre os componentes do sistema durante a execução de uma determinada funcionalidade. Diferente do diagrama de classes, os diagramas de sequência demonstram a ordem em que as mensagens são trocadas durante a realização de uma operação.</w:t>
@@ -5872,6 +5921,8 @@
     <w:p>
       <w:pPr>
         <w:keepNext/>
+        <w:spacing w:before="240"/>
+        <w:jc w:val="both"/>
       </w:pPr>
       <w:r>
         <w:t xml:space="preserve">No projeto </w:t>
@@ -5904,6 +5955,8 @@
     <w:p>
       <w:pPr>
         <w:keepNext/>
+        <w:spacing w:before="240"/>
+        <w:jc w:val="both"/>
       </w:pPr>
       <w:r>
         <w:t>A Figura 4 representa o processo de autenticação do usuário no sistema. O fluxo tem início quando o usuário informa suas credenciais, compostas por e-mail e senha, por meio da tela de login.</w:t>
@@ -5935,7 +5988,7 @@
                     </pic:cNvPicPr>
                   </pic:nvPicPr>
                   <pic:blipFill>
-                    <a:blip r:embed="rId14">
+                    <a:blip r:embed="rId15">
                       <a:extLst>
                         <a:ext uri="{28A0092B-C50C-407E-A947-70E740481C1C}">
                           <a14:useLocalDpi xmlns:a14="http://schemas.microsoft.com/office/drawing/2010/main" val="0"/>
@@ -6092,6 +6145,8 @@
     <w:p>
       <w:pPr>
         <w:keepNext/>
+        <w:spacing w:before="240"/>
+        <w:jc w:val="both"/>
       </w:pPr>
       <w:r>
         <w:t>A Figura 5 representa um cenário alternativo relacionado à recuperação da senha de acesso. Esse processo ocorre quando o usuário não consegue utilizar sua senha atual e solicita ao sistema um procedimento para recuperação do acesso.</w:t>
@@ -6123,7 +6178,7 @@
                     </pic:cNvPicPr>
                   </pic:nvPicPr>
                   <pic:blipFill>
-                    <a:blip r:embed="rId15">
+                    <a:blip r:embed="rId16">
                       <a:extLst>
                         <a:ext uri="{28A0092B-C50C-407E-A947-70E740481C1C}">
                           <a14:useLocalDpi xmlns:a14="http://schemas.microsoft.com/office/drawing/2010/main" val="0"/>
@@ -6330,8 +6385,8 @@
           <w:color w:val="000000"/>
         </w:rPr>
       </w:pPr>
-      <w:bookmarkStart w:id="20" w:name="_xwz6vzo9lzyl" w:colFirst="0" w:colLast="0"/>
-      <w:bookmarkEnd w:id="20"/>
+      <w:bookmarkStart w:id="21" w:name="_xwz6vzo9lzyl" w:colFirst="0" w:colLast="0"/>
+      <w:bookmarkEnd w:id="21"/>
       <w:r>
         <w:br w:type="page"/>
       </w:r>
@@ -6397,8 +6452,8 @@
           <w:color w:val="FF0000"/>
         </w:rPr>
       </w:pPr>
-      <w:bookmarkStart w:id="21" w:name="_mkvs2qyhhbcp" w:colFirst="0" w:colLast="0"/>
-      <w:bookmarkEnd w:id="21"/>
+      <w:bookmarkStart w:id="22" w:name="_mkvs2qyhhbcp" w:colFirst="0" w:colLast="0"/>
+      <w:bookmarkEnd w:id="22"/>
     </w:p>
     <w:p>
       <w:pPr>
@@ -6418,8 +6473,8 @@
           <w:color w:val="000000"/>
         </w:rPr>
       </w:pPr>
-      <w:bookmarkStart w:id="22" w:name="_8zxqz5wgmdxn" w:colFirst="0" w:colLast="0"/>
-      <w:bookmarkEnd w:id="22"/>
+      <w:bookmarkStart w:id="23" w:name="_8zxqz5wgmdxn" w:colFirst="0" w:colLast="0"/>
+      <w:bookmarkEnd w:id="23"/>
       <w:r>
         <w:br w:type="page"/>
       </w:r>
@@ -6466,8 +6521,8 @@
           <w:color w:val="000000"/>
         </w:rPr>
       </w:pPr>
-      <w:bookmarkStart w:id="23" w:name="_vu8skbkjafvu"/>
-      <w:bookmarkEnd w:id="23"/>
+      <w:bookmarkStart w:id="24" w:name="_vu8skbkjafvu"/>
+      <w:bookmarkEnd w:id="24"/>
       <w:r>
         <w:br w:type="page"/>
       </w:r>
@@ -6576,8 +6631,8 @@
           <w:color w:val="000000"/>
         </w:rPr>
       </w:pPr>
-      <w:bookmarkStart w:id="24" w:name="_amvst46n8d5f" w:colFirst="0" w:colLast="0"/>
-      <w:bookmarkEnd w:id="24"/>
+      <w:bookmarkStart w:id="25" w:name="_amvst46n8d5f" w:colFirst="0" w:colLast="0"/>
+      <w:bookmarkEnd w:id="25"/>
       <w:r>
         <w:br w:type="page"/>
       </w:r>
@@ -6622,8 +6677,8 @@
           <w:color w:val="000000"/>
         </w:rPr>
       </w:pPr>
-      <w:bookmarkStart w:id="25" w:name="_9qjp406jcxub" w:colFirst="0" w:colLast="0"/>
-      <w:bookmarkEnd w:id="25"/>
+      <w:bookmarkStart w:id="26" w:name="_9qjp406jcxub" w:colFirst="0" w:colLast="0"/>
+      <w:bookmarkEnd w:id="26"/>
       <w:r>
         <w:br w:type="page"/>
       </w:r>
@@ -6668,8 +6723,8 @@
           <w:color w:val="000000"/>
         </w:rPr>
       </w:pPr>
-      <w:bookmarkStart w:id="26" w:name="_io2bxhhvd09c" w:colFirst="0" w:colLast="0"/>
-      <w:bookmarkEnd w:id="26"/>
+      <w:bookmarkStart w:id="27" w:name="_io2bxhhvd09c" w:colFirst="0" w:colLast="0"/>
+      <w:bookmarkEnd w:id="27"/>
       <w:r>
         <w:br w:type="page"/>
       </w:r>
@@ -6718,8 +6773,8 @@
       </w:pPr>
     </w:p>
     <w:sectPr>
-      <w:headerReference w:type="default" r:id="rId16"/>
-      <w:headerReference w:type="first" r:id="rId17"/>
+      <w:headerReference w:type="default" r:id="rId17"/>
+      <w:headerReference w:type="first" r:id="rId18"/>
       <w:pgSz w:w="11907" w:h="16840"/>
       <w:pgMar w:top="1699" w:right="1138" w:bottom="1238" w:left="1699" w:header="720" w:footer="720" w:gutter="0"/>
       <w:cols w:space="720"/>
@@ -6730,7 +6785,7 @@
 </file>
 
 <file path=word/endnotes.xml><?xml version="1.0" encoding="utf-8"?>
-<w:endnotes xmlns:wpc="http://schemas.microsoft.com/office/word/2010/wordprocessingCanvas" xmlns:cx="http://schemas.microsoft.com/office/drawing/2014/chartex" xmlns:cx1="http://schemas.microsoft.com/office/drawing/2015/9/8/chartex" xmlns:cx2="http://schemas.microsoft.com/office/drawing/2015/10/21/chartex" xmlns:cx3="http://schemas.microsoft.com/office/drawing/2016/5/9/chartex" xmlns:cx4="http://schemas.microsoft.com/office/drawing/2016/5/10/chartex" xmlns:cx5="http://schemas.microsoft.com/office/drawing/2016/5/11/chartex" xmlns:cx6="http://schemas.microsoft.com/office/drawing/2016/5/12/chartex" xmlns:cx7="http://schemas.microsoft.com/office/drawing/2016/5/13/chartex" xmlns:cx8="http://schemas.microsoft.com/office/drawing/2016/5/14/chartex" xmlns:mc="http://schemas.openxmlformats.org/markup-compatibility/2006" xmlns:aink="http://schemas.microsoft.com/office/drawing/2016/ink" xmlns:am3d="http://schemas.microsoft.com/office/drawing/2017/model3d" xmlns:o="urn:schemas-microsoft-com:office:office" xmlns:oel="http://schemas.microsoft.com/office/2019/extlst" xmlns:r="http://schemas.openxmlformats.org/officeDocument/2006/relationships" xmlns:m="http://schemas.openxmlformats.org/officeDocument/2006/math" xmlns:v="urn:schemas-microsoft-com:vml" xmlns:wp14="http://schemas.microsoft.com/office/word/2010/wordprocessingDrawing" xmlns:wp="http://schemas.openxmlformats.org/drawingml/2006/wordprocessingDrawing" xmlns:w10="urn:schemas-microsoft-com:office:word" xmlns:w="http://schemas.openxmlformats.org/wordprocessingml/2006/main" xmlns:w14="http://schemas.microsoft.com/office/word/2010/wordml" xmlns:w15="http://schemas.microsoft.com/office/word/2012/wordml" xmlns:w16cex="http://schemas.microsoft.com/office/word/2018/wordml/cex" xmlns:w16cid="http://schemas.microsoft.com/office/word/2016/wordml/cid" xmlns:w16="http://schemas.microsoft.com/office/word/2018/wordml" xmlns:w16du="http://schemas.microsoft.com/office/word/2023/wordml/word16du" xmlns:w16sdtdh="http://schemas.microsoft.com/office/word/2020/wordml/sdtdatahash" xmlns:w16sdtfl="http://schemas.microsoft.com/office/word/2024/wordml/sdtformatlock" xmlns:w16se="http://schemas.microsoft.com/office/word/2015/wordml/symex" xmlns:wpg="http://schemas.microsoft.com/office/word/2010/wordprocessingGroup" xmlns:wpi="http://schemas.microsoft.com/office/word/2010/wordprocessingInk" xmlns:wne="http://schemas.microsoft.com/office/word/2006/wordml" xmlns:wps="http://schemas.microsoft.com/office/word/2010/wordprocessingShape" mc:Ignorable="w14 w15 w16se w16cid w16 w16cex w16sdtdh w16sdtfl w16du wp14">
+<w:endnotes xmlns:wpc="http://schemas.microsoft.com/office/word/2010/wordprocessingCanvas" xmlns:mc="http://schemas.openxmlformats.org/markup-compatibility/2006" xmlns:o="urn:schemas-microsoft-com:office:office" xmlns:r="http://schemas.openxmlformats.org/officeDocument/2006/relationships" xmlns:m="http://schemas.openxmlformats.org/officeDocument/2006/math" xmlns:v="urn:schemas-microsoft-com:vml" xmlns:wp14="http://schemas.microsoft.com/office/word/2010/wordprocessingDrawing" xmlns:wp="http://schemas.openxmlformats.org/drawingml/2006/wordprocessingDrawing" xmlns:w10="urn:schemas-microsoft-com:office:word" xmlns:w="http://schemas.openxmlformats.org/wordprocessingml/2006/main" xmlns:w14="http://schemas.microsoft.com/office/word/2010/wordml" xmlns:wpg="http://schemas.microsoft.com/office/word/2010/wordprocessingGroup" xmlns:wpi="http://schemas.microsoft.com/office/word/2010/wordprocessingInk" xmlns:wne="http://schemas.microsoft.com/office/word/2006/wordml" xmlns:wps="http://schemas.microsoft.com/office/word/2010/wordprocessingShape" mc:Ignorable="w14 wp14">
   <w:endnote w:type="separator" w:id="-1">
     <w:p>
       <w:pPr>
@@ -6755,7 +6810,7 @@
 </file>
 
 <file path=word/footnotes.xml><?xml version="1.0" encoding="utf-8"?>
-<w:footnotes xmlns:wpc="http://schemas.microsoft.com/office/word/2010/wordprocessingCanvas" xmlns:cx="http://schemas.microsoft.com/office/drawing/2014/chartex" xmlns:cx1="http://schemas.microsoft.com/office/drawing/2015/9/8/chartex" xmlns:cx2="http://schemas.microsoft.com/office/drawing/2015/10/21/chartex" xmlns:cx3="http://schemas.microsoft.com/office/drawing/2016/5/9/chartex" xmlns:cx4="http://schemas.microsoft.com/office/drawing/2016/5/10/chartex" xmlns:cx5="http://schemas.microsoft.com/office/drawing/2016/5/11/chartex" xmlns:cx6="http://schemas.microsoft.com/office/drawing/2016/5/12/chartex" xmlns:cx7="http://schemas.microsoft.com/office/drawing/2016/5/13/chartex" xmlns:cx8="http://schemas.microsoft.com/office/drawing/2016/5/14/chartex" xmlns:mc="http://schemas.openxmlformats.org/markup-compatibility/2006" xmlns:aink="http://schemas.microsoft.com/office/drawing/2016/ink" xmlns:am3d="http://schemas.microsoft.com/office/drawing/2017/model3d" xmlns:o="urn:schemas-microsoft-com:office:office" xmlns:oel="http://schemas.microsoft.com/office/2019/extlst" xmlns:r="http://schemas.openxmlformats.org/officeDocument/2006/relationships" xmlns:m="http://schemas.openxmlformats.org/officeDocument/2006/math" xmlns:v="urn:schemas-microsoft-com:vml" xmlns:wp14="http://schemas.microsoft.com/office/word/2010/wordprocessingDrawing" xmlns:wp="http://schemas.openxmlformats.org/drawingml/2006/wordprocessingDrawing" xmlns:w10="urn:schemas-microsoft-com:office:word" xmlns:w="http://schemas.openxmlformats.org/wordprocessingml/2006/main" xmlns:w14="http://schemas.microsoft.com/office/word/2010/wordml" xmlns:w15="http://schemas.microsoft.com/office/word/2012/wordml" xmlns:w16cex="http://schemas.microsoft.com/office/word/2018/wordml/cex" xmlns:w16cid="http://schemas.microsoft.com/office/word/2016/wordml/cid" xmlns:w16="http://schemas.microsoft.com/office/word/2018/wordml" xmlns:w16du="http://schemas.microsoft.com/office/word/2023/wordml/word16du" xmlns:w16sdtdh="http://schemas.microsoft.com/office/word/2020/wordml/sdtdatahash" xmlns:w16sdtfl="http://schemas.microsoft.com/office/word/2024/wordml/sdtformatlock" xmlns:w16se="http://schemas.microsoft.com/office/word/2015/wordml/symex" xmlns:wpg="http://schemas.microsoft.com/office/word/2010/wordprocessingGroup" xmlns:wpi="http://schemas.microsoft.com/office/word/2010/wordprocessingInk" xmlns:wne="http://schemas.microsoft.com/office/word/2006/wordml" xmlns:wps="http://schemas.microsoft.com/office/word/2010/wordprocessingShape" mc:Ignorable="w14 w15 w16se w16cid w16 w16cex w16sdtdh w16sdtfl w16du wp14">
+<w:footnotes xmlns:wpc="http://schemas.microsoft.com/office/word/2010/wordprocessingCanvas" xmlns:mc="http://schemas.openxmlformats.org/markup-compatibility/2006" xmlns:o="urn:schemas-microsoft-com:office:office" xmlns:r="http://schemas.openxmlformats.org/officeDocument/2006/relationships" xmlns:m="http://schemas.openxmlformats.org/officeDocument/2006/math" xmlns:v="urn:schemas-microsoft-com:vml" xmlns:wp14="http://schemas.microsoft.com/office/word/2010/wordprocessingDrawing" xmlns:wp="http://schemas.openxmlformats.org/drawingml/2006/wordprocessingDrawing" xmlns:w10="urn:schemas-microsoft-com:office:word" xmlns:w="http://schemas.openxmlformats.org/wordprocessingml/2006/main" xmlns:w14="http://schemas.microsoft.com/office/word/2010/wordml" xmlns:wpg="http://schemas.microsoft.com/office/word/2010/wordprocessingGroup" xmlns:wpi="http://schemas.microsoft.com/office/word/2010/wordprocessingInk" xmlns:wne="http://schemas.microsoft.com/office/word/2006/wordml" xmlns:wps="http://schemas.microsoft.com/office/word/2010/wordprocessingShape" mc:Ignorable="w14 wp14">
   <w:footnote w:type="separator" w:id="-1">
     <w:p>
       <w:pPr>
@@ -6780,7 +6835,7 @@
 </file>
 
 <file path=word/header1.xml><?xml version="1.0" encoding="utf-8"?>
-<w:hdr xmlns:wpc="http://schemas.microsoft.com/office/word/2010/wordprocessingCanvas" xmlns:cx="http://schemas.microsoft.com/office/drawing/2014/chartex" xmlns:cx1="http://schemas.microsoft.com/office/drawing/2015/9/8/chartex" xmlns:cx2="http://schemas.microsoft.com/office/drawing/2015/10/21/chartex" xmlns:cx3="http://schemas.microsoft.com/office/drawing/2016/5/9/chartex" xmlns:cx4="http://schemas.microsoft.com/office/drawing/2016/5/10/chartex" xmlns:cx5="http://schemas.microsoft.com/office/drawing/2016/5/11/chartex" xmlns:cx6="http://schemas.microsoft.com/office/drawing/2016/5/12/chartex" xmlns:cx7="http://schemas.microsoft.com/office/drawing/2016/5/13/chartex" xmlns:cx8="http://schemas.microsoft.com/office/drawing/2016/5/14/chartex" xmlns:mc="http://schemas.openxmlformats.org/markup-compatibility/2006" xmlns:aink="http://schemas.microsoft.com/office/drawing/2016/ink" xmlns:am3d="http://schemas.microsoft.com/office/drawing/2017/model3d" xmlns:o="urn:schemas-microsoft-com:office:office" xmlns:oel="http://schemas.microsoft.com/office/2019/extlst" xmlns:r="http://schemas.openxmlformats.org/officeDocument/2006/relationships" xmlns:m="http://schemas.openxmlformats.org/officeDocument/2006/math" xmlns:v="urn:schemas-microsoft-com:vml" xmlns:wp14="http://schemas.microsoft.com/office/word/2010/wordprocessingDrawing" xmlns:wp="http://schemas.openxmlformats.org/drawingml/2006/wordprocessingDrawing" xmlns:w10="urn:schemas-microsoft-com:office:word" xmlns:w="http://schemas.openxmlformats.org/wordprocessingml/2006/main" xmlns:w14="http://schemas.microsoft.com/office/word/2010/wordml" xmlns:w15="http://schemas.microsoft.com/office/word/2012/wordml" xmlns:w16cex="http://schemas.microsoft.com/office/word/2018/wordml/cex" xmlns:w16cid="http://schemas.microsoft.com/office/word/2016/wordml/cid" xmlns:w16="http://schemas.microsoft.com/office/word/2018/wordml" xmlns:w16du="http://schemas.microsoft.com/office/word/2023/wordml/word16du" xmlns:w16sdtdh="http://schemas.microsoft.com/office/word/2020/wordml/sdtdatahash" xmlns:w16sdtfl="http://schemas.microsoft.com/office/word/2024/wordml/sdtformatlock" xmlns:w16se="http://schemas.microsoft.com/office/word/2015/wordml/symex" xmlns:wpg="http://schemas.microsoft.com/office/word/2010/wordprocessingGroup" xmlns:wpi="http://schemas.microsoft.com/office/word/2010/wordprocessingInk" xmlns:wne="http://schemas.microsoft.com/office/word/2006/wordml" xmlns:wps="http://schemas.microsoft.com/office/word/2010/wordprocessingShape" mc:Ignorable="w14 w15 w16se w16cid w16 w16cex w16sdtdh w16sdtfl w16du wp14">
+<w:hdr xmlns:wpc="http://schemas.microsoft.com/office/word/2010/wordprocessingCanvas" xmlns:mc="http://schemas.openxmlformats.org/markup-compatibility/2006" xmlns:o="urn:schemas-microsoft-com:office:office" xmlns:r="http://schemas.openxmlformats.org/officeDocument/2006/relationships" xmlns:m="http://schemas.openxmlformats.org/officeDocument/2006/math" xmlns:v="urn:schemas-microsoft-com:vml" xmlns:wp14="http://schemas.microsoft.com/office/word/2010/wordprocessingDrawing" xmlns:wp="http://schemas.openxmlformats.org/drawingml/2006/wordprocessingDrawing" xmlns:w10="urn:schemas-microsoft-com:office:word" xmlns:w="http://schemas.openxmlformats.org/wordprocessingml/2006/main" xmlns:w14="http://schemas.microsoft.com/office/word/2010/wordml" xmlns:wpg="http://schemas.microsoft.com/office/word/2010/wordprocessingGroup" xmlns:wpi="http://schemas.microsoft.com/office/word/2010/wordprocessingInk" xmlns:wne="http://schemas.microsoft.com/office/word/2006/wordml" xmlns:wps="http://schemas.microsoft.com/office/word/2010/wordprocessingShape" mc:Ignorable="w14 wp14">
   <w:p>
     <w:pPr>
       <w:pBdr>
@@ -6841,7 +6896,7 @@
 </file>
 
 <file path=word/header2.xml><?xml version="1.0" encoding="utf-8"?>
-<w:hdr xmlns:wpc="http://schemas.microsoft.com/office/word/2010/wordprocessingCanvas" xmlns:cx="http://schemas.microsoft.com/office/drawing/2014/chartex" xmlns:cx1="http://schemas.microsoft.com/office/drawing/2015/9/8/chartex" xmlns:cx2="http://schemas.microsoft.com/office/drawing/2015/10/21/chartex" xmlns:cx3="http://schemas.microsoft.com/office/drawing/2016/5/9/chartex" xmlns:cx4="http://schemas.microsoft.com/office/drawing/2016/5/10/chartex" xmlns:cx5="http://schemas.microsoft.com/office/drawing/2016/5/11/chartex" xmlns:cx6="http://schemas.microsoft.com/office/drawing/2016/5/12/chartex" xmlns:cx7="http://schemas.microsoft.com/office/drawing/2016/5/13/chartex" xmlns:cx8="http://schemas.microsoft.com/office/drawing/2016/5/14/chartex" xmlns:mc="http://schemas.openxmlformats.org/markup-compatibility/2006" xmlns:aink="http://schemas.microsoft.com/office/drawing/2016/ink" xmlns:am3d="http://schemas.microsoft.com/office/drawing/2017/model3d" xmlns:o="urn:schemas-microsoft-com:office:office" xmlns:oel="http://schemas.microsoft.com/office/2019/extlst" xmlns:r="http://schemas.openxmlformats.org/officeDocument/2006/relationships" xmlns:m="http://schemas.openxmlformats.org/officeDocument/2006/math" xmlns:v="urn:schemas-microsoft-com:vml" xmlns:wp14="http://schemas.microsoft.com/office/word/2010/wordprocessingDrawing" xmlns:wp="http://schemas.openxmlformats.org/drawingml/2006/wordprocessingDrawing" xmlns:w10="urn:schemas-microsoft-com:office:word" xmlns:w="http://schemas.openxmlformats.org/wordprocessingml/2006/main" xmlns:w14="http://schemas.microsoft.com/office/word/2010/wordml" xmlns:w15="http://schemas.microsoft.com/office/word/2012/wordml" xmlns:w16cex="http://schemas.microsoft.com/office/word/2018/wordml/cex" xmlns:w16cid="http://schemas.microsoft.com/office/word/2016/wordml/cid" xmlns:w16="http://schemas.microsoft.com/office/word/2018/wordml" xmlns:w16du="http://schemas.microsoft.com/office/word/2023/wordml/word16du" xmlns:w16sdtdh="http://schemas.microsoft.com/office/word/2020/wordml/sdtdatahash" xmlns:w16sdtfl="http://schemas.microsoft.com/office/word/2024/wordml/sdtformatlock" xmlns:w16se="http://schemas.microsoft.com/office/word/2015/wordml/symex" xmlns:wpg="http://schemas.microsoft.com/office/word/2010/wordprocessingGroup" xmlns:wpi="http://schemas.microsoft.com/office/word/2010/wordprocessingInk" xmlns:wne="http://schemas.microsoft.com/office/word/2006/wordml" xmlns:wps="http://schemas.microsoft.com/office/word/2010/wordprocessingShape" mc:Ignorable="w14 w15 w16se w16cid w16 w16cex w16sdtdh w16sdtfl w16du wp14">
+<w:hdr xmlns:wpc="http://schemas.microsoft.com/office/word/2010/wordprocessingCanvas" xmlns:mc="http://schemas.openxmlformats.org/markup-compatibility/2006" xmlns:o="urn:schemas-microsoft-com:office:office" xmlns:r="http://schemas.openxmlformats.org/officeDocument/2006/relationships" xmlns:m="http://schemas.openxmlformats.org/officeDocument/2006/math" xmlns:v="urn:schemas-microsoft-com:vml" xmlns:wp14="http://schemas.microsoft.com/office/word/2010/wordprocessingDrawing" xmlns:wp="http://schemas.openxmlformats.org/drawingml/2006/wordprocessingDrawing" xmlns:w10="urn:schemas-microsoft-com:office:word" xmlns:w="http://schemas.openxmlformats.org/wordprocessingml/2006/main" xmlns:w14="http://schemas.microsoft.com/office/word/2010/wordml" xmlns:wpg="http://schemas.microsoft.com/office/word/2010/wordprocessingGroup" xmlns:wpi="http://schemas.microsoft.com/office/word/2010/wordprocessingInk" xmlns:wne="http://schemas.microsoft.com/office/word/2006/wordml" xmlns:wps="http://schemas.microsoft.com/office/word/2010/wordprocessingShape" mc:Ignorable="w14 wp14">
   <w:p>
     <w:pPr>
       <w:pBdr>
@@ -6883,7 +6938,7 @@
         <w:noProof/>
         <w:color w:val="000000"/>
       </w:rPr>
-      <w:t>9</w:t>
+      <w:t>2</w:t>
     </w:r>
     <w:r>
       <w:rPr>
@@ -6915,7 +6970,7 @@
 </file>
 
 <file path=word/header3.xml><?xml version="1.0" encoding="utf-8"?>
-<w:hdr xmlns:wpc="http://schemas.microsoft.com/office/word/2010/wordprocessingCanvas" xmlns:cx="http://schemas.microsoft.com/office/drawing/2014/chartex" xmlns:cx1="http://schemas.microsoft.com/office/drawing/2015/9/8/chartex" xmlns:cx2="http://schemas.microsoft.com/office/drawing/2015/10/21/chartex" xmlns:cx3="http://schemas.microsoft.com/office/drawing/2016/5/9/chartex" xmlns:cx4="http://schemas.microsoft.com/office/drawing/2016/5/10/chartex" xmlns:cx5="http://schemas.microsoft.com/office/drawing/2016/5/11/chartex" xmlns:cx6="http://schemas.microsoft.com/office/drawing/2016/5/12/chartex" xmlns:cx7="http://schemas.microsoft.com/office/drawing/2016/5/13/chartex" xmlns:cx8="http://schemas.microsoft.com/office/drawing/2016/5/14/chartex" xmlns:mc="http://schemas.openxmlformats.org/markup-compatibility/2006" xmlns:aink="http://schemas.microsoft.com/office/drawing/2016/ink" xmlns:am3d="http://schemas.microsoft.com/office/drawing/2017/model3d" xmlns:o="urn:schemas-microsoft-com:office:office" xmlns:oel="http://schemas.microsoft.com/office/2019/extlst" xmlns:r="http://schemas.openxmlformats.org/officeDocument/2006/relationships" xmlns:m="http://schemas.openxmlformats.org/officeDocument/2006/math" xmlns:v="urn:schemas-microsoft-com:vml" xmlns:wp14="http://schemas.microsoft.com/office/word/2010/wordprocessingDrawing" xmlns:wp="http://schemas.openxmlformats.org/drawingml/2006/wordprocessingDrawing" xmlns:w10="urn:schemas-microsoft-com:office:word" xmlns:w="http://schemas.openxmlformats.org/wordprocessingml/2006/main" xmlns:w14="http://schemas.microsoft.com/office/word/2010/wordml" xmlns:w15="http://schemas.microsoft.com/office/word/2012/wordml" xmlns:w16cex="http://schemas.microsoft.com/office/word/2018/wordml/cex" xmlns:w16cid="http://schemas.microsoft.com/office/word/2016/wordml/cid" xmlns:w16="http://schemas.microsoft.com/office/word/2018/wordml" xmlns:w16du="http://schemas.microsoft.com/office/word/2023/wordml/word16du" xmlns:w16sdtdh="http://schemas.microsoft.com/office/word/2020/wordml/sdtdatahash" xmlns:w16sdtfl="http://schemas.microsoft.com/office/word/2024/wordml/sdtformatlock" xmlns:w16se="http://schemas.microsoft.com/office/word/2015/wordml/symex" xmlns:wpg="http://schemas.microsoft.com/office/word/2010/wordprocessingGroup" xmlns:wpi="http://schemas.microsoft.com/office/word/2010/wordprocessingInk" xmlns:wne="http://schemas.microsoft.com/office/word/2006/wordml" xmlns:wps="http://schemas.microsoft.com/office/word/2010/wordprocessingShape" mc:Ignorable="w14 w15 w16se w16cid w16 w16cex w16sdtdh w16sdtfl w16du wp14">
+<w:hdr xmlns:wpc="http://schemas.microsoft.com/office/word/2010/wordprocessingCanvas" xmlns:mc="http://schemas.openxmlformats.org/markup-compatibility/2006" xmlns:o="urn:schemas-microsoft-com:office:office" xmlns:r="http://schemas.openxmlformats.org/officeDocument/2006/relationships" xmlns:m="http://schemas.openxmlformats.org/officeDocument/2006/math" xmlns:v="urn:schemas-microsoft-com:vml" xmlns:wp14="http://schemas.microsoft.com/office/word/2010/wordprocessingDrawing" xmlns:wp="http://schemas.openxmlformats.org/drawingml/2006/wordprocessingDrawing" xmlns:w10="urn:schemas-microsoft-com:office:word" xmlns:w="http://schemas.openxmlformats.org/wordprocessingml/2006/main" xmlns:w14="http://schemas.microsoft.com/office/word/2010/wordml" xmlns:wpg="http://schemas.microsoft.com/office/word/2010/wordprocessingGroup" xmlns:wpi="http://schemas.microsoft.com/office/word/2010/wordprocessingInk" xmlns:wne="http://schemas.microsoft.com/office/word/2006/wordml" xmlns:wps="http://schemas.microsoft.com/office/word/2010/wordprocessingShape" mc:Ignorable="w14 wp14">
   <w:p>
     <w:pPr>
       <w:pBdr>
@@ -6957,7 +7012,7 @@
 </file>
 
 <file path=word/header4.xml><?xml version="1.0" encoding="utf-8"?>
-<w:hdr xmlns:wpc="http://schemas.microsoft.com/office/word/2010/wordprocessingCanvas" xmlns:cx="http://schemas.microsoft.com/office/drawing/2014/chartex" xmlns:cx1="http://schemas.microsoft.com/office/drawing/2015/9/8/chartex" xmlns:cx2="http://schemas.microsoft.com/office/drawing/2015/10/21/chartex" xmlns:cx3="http://schemas.microsoft.com/office/drawing/2016/5/9/chartex" xmlns:cx4="http://schemas.microsoft.com/office/drawing/2016/5/10/chartex" xmlns:cx5="http://schemas.microsoft.com/office/drawing/2016/5/11/chartex" xmlns:cx6="http://schemas.microsoft.com/office/drawing/2016/5/12/chartex" xmlns:cx7="http://schemas.microsoft.com/office/drawing/2016/5/13/chartex" xmlns:cx8="http://schemas.microsoft.com/office/drawing/2016/5/14/chartex" xmlns:mc="http://schemas.openxmlformats.org/markup-compatibility/2006" xmlns:aink="http://schemas.microsoft.com/office/drawing/2016/ink" xmlns:am3d="http://schemas.microsoft.com/office/drawing/2017/model3d" xmlns:o="urn:schemas-microsoft-com:office:office" xmlns:oel="http://schemas.microsoft.com/office/2019/extlst" xmlns:r="http://schemas.openxmlformats.org/officeDocument/2006/relationships" xmlns:m="http://schemas.openxmlformats.org/officeDocument/2006/math" xmlns:v="urn:schemas-microsoft-com:vml" xmlns:wp14="http://schemas.microsoft.com/office/word/2010/wordprocessingDrawing" xmlns:wp="http://schemas.openxmlformats.org/drawingml/2006/wordprocessingDrawing" xmlns:w10="urn:schemas-microsoft-com:office:word" xmlns:w="http://schemas.openxmlformats.org/wordprocessingml/2006/main" xmlns:w14="http://schemas.microsoft.com/office/word/2010/wordml" xmlns:w15="http://schemas.microsoft.com/office/word/2012/wordml" xmlns:w16cex="http://schemas.microsoft.com/office/word/2018/wordml/cex" xmlns:w16cid="http://schemas.microsoft.com/office/word/2016/wordml/cid" xmlns:w16="http://schemas.microsoft.com/office/word/2018/wordml" xmlns:w16du="http://schemas.microsoft.com/office/word/2023/wordml/word16du" xmlns:w16sdtdh="http://schemas.microsoft.com/office/word/2020/wordml/sdtdatahash" xmlns:w16sdtfl="http://schemas.microsoft.com/office/word/2024/wordml/sdtformatlock" xmlns:w16se="http://schemas.microsoft.com/office/word/2015/wordml/symex" xmlns:wpg="http://schemas.microsoft.com/office/word/2010/wordprocessingGroup" xmlns:wpi="http://schemas.microsoft.com/office/word/2010/wordprocessingInk" xmlns:wne="http://schemas.microsoft.com/office/word/2006/wordml" xmlns:wps="http://schemas.microsoft.com/office/word/2010/wordprocessingShape" mc:Ignorable="w14 w15 w16se w16cid w16 w16cex w16sdtdh w16sdtfl w16du wp14">
+<w:hdr xmlns:wpc="http://schemas.microsoft.com/office/word/2010/wordprocessingCanvas" xmlns:mc="http://schemas.openxmlformats.org/markup-compatibility/2006" xmlns:o="urn:schemas-microsoft-com:office:office" xmlns:r="http://schemas.openxmlformats.org/officeDocument/2006/relationships" xmlns:m="http://schemas.openxmlformats.org/officeDocument/2006/math" xmlns:v="urn:schemas-microsoft-com:vml" xmlns:wp14="http://schemas.microsoft.com/office/word/2010/wordprocessingDrawing" xmlns:wp="http://schemas.openxmlformats.org/drawingml/2006/wordprocessingDrawing" xmlns:w10="urn:schemas-microsoft-com:office:word" xmlns:w="http://schemas.openxmlformats.org/wordprocessingml/2006/main" xmlns:w14="http://schemas.microsoft.com/office/word/2010/wordml" xmlns:wpg="http://schemas.microsoft.com/office/word/2010/wordprocessingGroup" xmlns:wpi="http://schemas.microsoft.com/office/word/2010/wordprocessingInk" xmlns:wne="http://schemas.microsoft.com/office/word/2006/wordml" xmlns:wps="http://schemas.microsoft.com/office/word/2010/wordprocessingShape" mc:Ignorable="w14 wp14">
   <w:p>
     <w:pPr>
       <w:pBdr>
@@ -6999,7 +7054,7 @@
         <w:noProof/>
         <w:color w:val="000000"/>
       </w:rPr>
-      <w:t>20</w:t>
+      <w:t>11</w:t>
     </w:r>
     <w:r>
       <w:rPr>
@@ -7031,7 +7086,7 @@
 </file>
 
 <file path=word/header5.xml><?xml version="1.0" encoding="utf-8"?>
-<w:hdr xmlns:wpc="http://schemas.microsoft.com/office/word/2010/wordprocessingCanvas" xmlns:cx="http://schemas.microsoft.com/office/drawing/2014/chartex" xmlns:cx1="http://schemas.microsoft.com/office/drawing/2015/9/8/chartex" xmlns:cx2="http://schemas.microsoft.com/office/drawing/2015/10/21/chartex" xmlns:cx3="http://schemas.microsoft.com/office/drawing/2016/5/9/chartex" xmlns:cx4="http://schemas.microsoft.com/office/drawing/2016/5/10/chartex" xmlns:cx5="http://schemas.microsoft.com/office/drawing/2016/5/11/chartex" xmlns:cx6="http://schemas.microsoft.com/office/drawing/2016/5/12/chartex" xmlns:cx7="http://schemas.microsoft.com/office/drawing/2016/5/13/chartex" xmlns:cx8="http://schemas.microsoft.com/office/drawing/2016/5/14/chartex" xmlns:mc="http://schemas.openxmlformats.org/markup-compatibility/2006" xmlns:aink="http://schemas.microsoft.com/office/drawing/2016/ink" xmlns:am3d="http://schemas.microsoft.com/office/drawing/2017/model3d" xmlns:o="urn:schemas-microsoft-com:office:office" xmlns:oel="http://schemas.microsoft.com/office/2019/extlst" xmlns:r="http://schemas.openxmlformats.org/officeDocument/2006/relationships" xmlns:m="http://schemas.openxmlformats.org/officeDocument/2006/math" xmlns:v="urn:schemas-microsoft-com:vml" xmlns:wp14="http://schemas.microsoft.com/office/word/2010/wordprocessingDrawing" xmlns:wp="http://schemas.openxmlformats.org/drawingml/2006/wordprocessingDrawing" xmlns:w10="urn:schemas-microsoft-com:office:word" xmlns:w="http://schemas.openxmlformats.org/wordprocessingml/2006/main" xmlns:w14="http://schemas.microsoft.com/office/word/2010/wordml" xmlns:w15="http://schemas.microsoft.com/office/word/2012/wordml" xmlns:w16cex="http://schemas.microsoft.com/office/word/2018/wordml/cex" xmlns:w16cid="http://schemas.microsoft.com/office/word/2016/wordml/cid" xmlns:w16="http://schemas.microsoft.com/office/word/2018/wordml" xmlns:w16du="http://schemas.microsoft.com/office/word/2023/wordml/word16du" xmlns:w16sdtdh="http://schemas.microsoft.com/office/word/2020/wordml/sdtdatahash" xmlns:w16sdtfl="http://schemas.microsoft.com/office/word/2024/wordml/sdtformatlock" xmlns:w16se="http://schemas.microsoft.com/office/word/2015/wordml/symex" xmlns:wpg="http://schemas.microsoft.com/office/word/2010/wordprocessingGroup" xmlns:wpi="http://schemas.microsoft.com/office/word/2010/wordprocessingInk" xmlns:wne="http://schemas.microsoft.com/office/word/2006/wordml" xmlns:wps="http://schemas.microsoft.com/office/word/2010/wordprocessingShape" mc:Ignorable="w14 w15 w16se w16cid w16 w16cex w16sdtdh w16sdtfl w16du wp14">
+<w:hdr xmlns:wpc="http://schemas.microsoft.com/office/word/2010/wordprocessingCanvas" xmlns:mc="http://schemas.openxmlformats.org/markup-compatibility/2006" xmlns:o="urn:schemas-microsoft-com:office:office" xmlns:r="http://schemas.openxmlformats.org/officeDocument/2006/relationships" xmlns:m="http://schemas.openxmlformats.org/officeDocument/2006/math" xmlns:v="urn:schemas-microsoft-com:vml" xmlns:wp14="http://schemas.microsoft.com/office/word/2010/wordprocessingDrawing" xmlns:wp="http://schemas.openxmlformats.org/drawingml/2006/wordprocessingDrawing" xmlns:w10="urn:schemas-microsoft-com:office:word" xmlns:w="http://schemas.openxmlformats.org/wordprocessingml/2006/main" xmlns:w14="http://schemas.microsoft.com/office/word/2010/wordml" xmlns:wpg="http://schemas.microsoft.com/office/word/2010/wordprocessingGroup" xmlns:wpi="http://schemas.microsoft.com/office/word/2010/wordprocessingInk" xmlns:wne="http://schemas.microsoft.com/office/word/2006/wordml" xmlns:wps="http://schemas.microsoft.com/office/word/2010/wordprocessingShape" mc:Ignorable="w14 wp14">
   <w:p>
     <w:pPr>
       <w:pBdr>
@@ -7092,8 +7147,8 @@
 </file>
 
 <file path=word/numbering.xml><?xml version="1.0" encoding="utf-8"?>
-<w:numbering xmlns:wpc="http://schemas.microsoft.com/office/word/2010/wordprocessingCanvas" xmlns:cx="http://schemas.microsoft.com/office/drawing/2014/chartex" xmlns:cx1="http://schemas.microsoft.com/office/drawing/2015/9/8/chartex" xmlns:cx2="http://schemas.microsoft.com/office/drawing/2015/10/21/chartex" xmlns:cx3="http://schemas.microsoft.com/office/drawing/2016/5/9/chartex" xmlns:cx4="http://schemas.microsoft.com/office/drawing/2016/5/10/chartex" xmlns:cx5="http://schemas.microsoft.com/office/drawing/2016/5/11/chartex" xmlns:cx6="http://schemas.microsoft.com/office/drawing/2016/5/12/chartex" xmlns:cx7="http://schemas.microsoft.com/office/drawing/2016/5/13/chartex" xmlns:cx8="http://schemas.microsoft.com/office/drawing/2016/5/14/chartex" xmlns:mc="http://schemas.openxmlformats.org/markup-compatibility/2006" xmlns:aink="http://schemas.microsoft.com/office/drawing/2016/ink" xmlns:am3d="http://schemas.microsoft.com/office/drawing/2017/model3d" xmlns:o="urn:schemas-microsoft-com:office:office" xmlns:oel="http://schemas.microsoft.com/office/2019/extlst" xmlns:r="http://schemas.openxmlformats.org/officeDocument/2006/relationships" xmlns:m="http://schemas.openxmlformats.org/officeDocument/2006/math" xmlns:v="urn:schemas-microsoft-com:vml" xmlns:wp14="http://schemas.microsoft.com/office/word/2010/wordprocessingDrawing" xmlns:wp="http://schemas.openxmlformats.org/drawingml/2006/wordprocessingDrawing" xmlns:w10="urn:schemas-microsoft-com:office:word" xmlns:w="http://schemas.openxmlformats.org/wordprocessingml/2006/main" xmlns:w14="http://schemas.microsoft.com/office/word/2010/wordml" xmlns:w15="http://schemas.microsoft.com/office/word/2012/wordml" xmlns:w16cex="http://schemas.microsoft.com/office/word/2018/wordml/cex" xmlns:w16cid="http://schemas.microsoft.com/office/word/2016/wordml/cid" xmlns:w16="http://schemas.microsoft.com/office/word/2018/wordml" xmlns:w16du="http://schemas.microsoft.com/office/word/2023/wordml/word16du" xmlns:w16sdtdh="http://schemas.microsoft.com/office/word/2020/wordml/sdtdatahash" xmlns:w16sdtfl="http://schemas.microsoft.com/office/word/2024/wordml/sdtformatlock" xmlns:w16se="http://schemas.microsoft.com/office/word/2015/wordml/symex" xmlns:wpg="http://schemas.microsoft.com/office/word/2010/wordprocessingGroup" xmlns:wpi="http://schemas.microsoft.com/office/word/2010/wordprocessingInk" xmlns:wne="http://schemas.microsoft.com/office/word/2006/wordml" xmlns:wps="http://schemas.microsoft.com/office/word/2010/wordprocessingShape" mc:Ignorable="w14 w15 w16se w16cid w16 w16cex w16sdtdh w16sdtfl w16du wp14">
-  <w:abstractNum w:abstractNumId="0" w15:restartNumberingAfterBreak="0">
+<w:numbering xmlns:wpc="http://schemas.microsoft.com/office/word/2010/wordprocessingCanvas" xmlns:mc="http://schemas.openxmlformats.org/markup-compatibility/2006" xmlns:o="urn:schemas-microsoft-com:office:office" xmlns:r="http://schemas.openxmlformats.org/officeDocument/2006/relationships" xmlns:m="http://schemas.openxmlformats.org/officeDocument/2006/math" xmlns:v="urn:schemas-microsoft-com:vml" xmlns:wp14="http://schemas.microsoft.com/office/word/2010/wordprocessingDrawing" xmlns:wp="http://schemas.openxmlformats.org/drawingml/2006/wordprocessingDrawing" xmlns:w10="urn:schemas-microsoft-com:office:word" xmlns:w="http://schemas.openxmlformats.org/wordprocessingml/2006/main" xmlns:w14="http://schemas.microsoft.com/office/word/2010/wordml" xmlns:wpg="http://schemas.microsoft.com/office/word/2010/wordprocessingGroup" xmlns:wpi="http://schemas.microsoft.com/office/word/2010/wordprocessingInk" xmlns:wne="http://schemas.microsoft.com/office/word/2006/wordml" xmlns:wps="http://schemas.microsoft.com/office/word/2010/wordprocessingShape" mc:Ignorable="w14 wp14">
+  <w:abstractNum w:abstractNumId="0">
     <w:nsid w:val="07DE711C"/>
     <w:multiLevelType w:val="multilevel"/>
     <w:tmpl w:val="0E425538"/>
@@ -7206,14 +7261,14 @@
       </w:pPr>
     </w:lvl>
   </w:abstractNum>
-  <w:num w:numId="1" w16cid:durableId="1079405117">
+  <w:num w:numId="1">
     <w:abstractNumId w:val="0"/>
   </w:num>
 </w:numbering>
 </file>
 
 <file path=word/styles.xml><?xml version="1.0" encoding="utf-8"?>
-<w:styles xmlns:mc="http://schemas.openxmlformats.org/markup-compatibility/2006" xmlns:r="http://schemas.openxmlformats.org/officeDocument/2006/relationships" xmlns:w="http://schemas.openxmlformats.org/wordprocessingml/2006/main" xmlns:w14="http://schemas.microsoft.com/office/word/2010/wordml" xmlns:w15="http://schemas.microsoft.com/office/word/2012/wordml" xmlns:w16cex="http://schemas.microsoft.com/office/word/2018/wordml/cex" xmlns:w16cid="http://schemas.microsoft.com/office/word/2016/wordml/cid" xmlns:w16="http://schemas.microsoft.com/office/word/2018/wordml" xmlns:w16du="http://schemas.microsoft.com/office/word/2023/wordml/word16du" xmlns:w16sdtdh="http://schemas.microsoft.com/office/word/2020/wordml/sdtdatahash" xmlns:w16sdtfl="http://schemas.microsoft.com/office/word/2024/wordml/sdtformatlock" xmlns:w16se="http://schemas.microsoft.com/office/word/2015/wordml/symex" mc:Ignorable="w14 w15 w16se w16cid w16 w16cex w16sdtdh w16sdtfl w16du">
+<w:styles xmlns:mc="http://schemas.openxmlformats.org/markup-compatibility/2006" xmlns:r="http://schemas.openxmlformats.org/officeDocument/2006/relationships" xmlns:w="http://schemas.openxmlformats.org/wordprocessingml/2006/main" xmlns:w14="http://schemas.microsoft.com/office/word/2010/wordml" mc:Ignorable="w14">
   <w:docDefaults>
     <w:rPrDefault>
       <w:rPr>
@@ -7229,383 +7284,144 @@
       </w:pPr>
     </w:pPrDefault>
   </w:docDefaults>
-  <w:latentStyles w:defLockedState="0" w:defUIPriority="99" w:defSemiHidden="0" w:defUnhideWhenUsed="0" w:defQFormat="0" w:count="376">
-    <w:lsdException w:name="Normal" w:uiPriority="0" w:qFormat="1"/>
-    <w:lsdException w:name="heading 1" w:uiPriority="9" w:qFormat="1"/>
-    <w:lsdException w:name="heading 2" w:semiHidden="1" w:uiPriority="9" w:unhideWhenUsed="1" w:qFormat="1"/>
-    <w:lsdException w:name="heading 3" w:semiHidden="1" w:uiPriority="9" w:unhideWhenUsed="1" w:qFormat="1"/>
-    <w:lsdException w:name="heading 4" w:semiHidden="1" w:uiPriority="9" w:unhideWhenUsed="1" w:qFormat="1"/>
-    <w:lsdException w:name="heading 5" w:semiHidden="1" w:uiPriority="9" w:unhideWhenUsed="1" w:qFormat="1"/>
-    <w:lsdException w:name="heading 6" w:semiHidden="1" w:uiPriority="9" w:unhideWhenUsed="1" w:qFormat="1"/>
-    <w:lsdException w:name="heading 7" w:semiHidden="1" w:uiPriority="9" w:unhideWhenUsed="1" w:qFormat="1"/>
-    <w:lsdException w:name="heading 8" w:semiHidden="1" w:uiPriority="9" w:unhideWhenUsed="1" w:qFormat="1"/>
-    <w:lsdException w:name="heading 9" w:semiHidden="1" w:uiPriority="9" w:unhideWhenUsed="1" w:qFormat="1"/>
-    <w:lsdException w:name="index 1" w:semiHidden="1" w:unhideWhenUsed="1"/>
-    <w:lsdException w:name="index 2" w:semiHidden="1" w:unhideWhenUsed="1"/>
-    <w:lsdException w:name="index 3" w:semiHidden="1" w:unhideWhenUsed="1"/>
-    <w:lsdException w:name="index 4" w:semiHidden="1" w:unhideWhenUsed="1"/>
-    <w:lsdException w:name="index 5" w:semiHidden="1" w:unhideWhenUsed="1"/>
-    <w:lsdException w:name="index 6" w:semiHidden="1" w:unhideWhenUsed="1"/>
-    <w:lsdException w:name="index 7" w:semiHidden="1" w:unhideWhenUsed="1"/>
-    <w:lsdException w:name="index 8" w:semiHidden="1" w:unhideWhenUsed="1"/>
-    <w:lsdException w:name="index 9" w:semiHidden="1" w:unhideWhenUsed="1"/>
-    <w:lsdException w:name="toc 1" w:semiHidden="1" w:uiPriority="39" w:unhideWhenUsed="1"/>
-    <w:lsdException w:name="toc 2" w:semiHidden="1" w:uiPriority="39" w:unhideWhenUsed="1"/>
-    <w:lsdException w:name="toc 3" w:semiHidden="1" w:uiPriority="39" w:unhideWhenUsed="1"/>
-    <w:lsdException w:name="toc 4" w:semiHidden="1" w:uiPriority="39" w:unhideWhenUsed="1"/>
-    <w:lsdException w:name="toc 5" w:semiHidden="1" w:uiPriority="39" w:unhideWhenUsed="1"/>
-    <w:lsdException w:name="toc 6" w:semiHidden="1" w:uiPriority="39" w:unhideWhenUsed="1"/>
-    <w:lsdException w:name="toc 7" w:semiHidden="1" w:uiPriority="39" w:unhideWhenUsed="1"/>
-    <w:lsdException w:name="toc 8" w:semiHidden="1" w:uiPriority="39" w:unhideWhenUsed="1"/>
-    <w:lsdException w:name="toc 9" w:semiHidden="1" w:uiPriority="39" w:unhideWhenUsed="1"/>
-    <w:lsdException w:name="Normal Indent" w:semiHidden="1" w:unhideWhenUsed="1"/>
-    <w:lsdException w:name="footnote text" w:semiHidden="1" w:unhideWhenUsed="1"/>
-    <w:lsdException w:name="annotation text" w:semiHidden="1" w:unhideWhenUsed="1"/>
-    <w:lsdException w:name="header" w:semiHidden="1" w:unhideWhenUsed="1"/>
-    <w:lsdException w:name="footer" w:semiHidden="1" w:unhideWhenUsed="1"/>
-    <w:lsdException w:name="index heading" w:semiHidden="1" w:unhideWhenUsed="1"/>
-    <w:lsdException w:name="caption" w:semiHidden="1" w:uiPriority="35" w:unhideWhenUsed="1" w:qFormat="1"/>
-    <w:lsdException w:name="table of figures" w:semiHidden="1" w:unhideWhenUsed="1"/>
-    <w:lsdException w:name="envelope address" w:semiHidden="1" w:unhideWhenUsed="1"/>
-    <w:lsdException w:name="envelope return" w:semiHidden="1" w:unhideWhenUsed="1"/>
-    <w:lsdException w:name="footnote reference" w:semiHidden="1" w:unhideWhenUsed="1"/>
-    <w:lsdException w:name="annotation reference" w:semiHidden="1" w:unhideWhenUsed="1"/>
-    <w:lsdException w:name="line number" w:semiHidden="1" w:unhideWhenUsed="1"/>
-    <w:lsdException w:name="page number" w:semiHidden="1" w:unhideWhenUsed="1"/>
-    <w:lsdException w:name="endnote reference" w:semiHidden="1" w:unhideWhenUsed="1"/>
-    <w:lsdException w:name="endnote text" w:semiHidden="1" w:unhideWhenUsed="1"/>
-    <w:lsdException w:name="table of authorities" w:semiHidden="1" w:unhideWhenUsed="1"/>
-    <w:lsdException w:name="macro" w:semiHidden="1" w:unhideWhenUsed="1"/>
-    <w:lsdException w:name="toa heading" w:semiHidden="1" w:unhideWhenUsed="1"/>
-    <w:lsdException w:name="List" w:semiHidden="1" w:unhideWhenUsed="1"/>
-    <w:lsdException w:name="List Bullet" w:semiHidden="1" w:unhideWhenUsed="1"/>
-    <w:lsdException w:name="List Number" w:semiHidden="1" w:unhideWhenUsed="1"/>
-    <w:lsdException w:name="List 2" w:semiHidden="1" w:unhideWhenUsed="1"/>
-    <w:lsdException w:name="List 3" w:semiHidden="1" w:unhideWhenUsed="1"/>
-    <w:lsdException w:name="List 4" w:semiHidden="1" w:unhideWhenUsed="1"/>
-    <w:lsdException w:name="List 5" w:semiHidden="1" w:unhideWhenUsed="1"/>
-    <w:lsdException w:name="List Bullet 2" w:semiHidden="1" w:unhideWhenUsed="1"/>
-    <w:lsdException w:name="List Bullet 3" w:semiHidden="1" w:unhideWhenUsed="1"/>
-    <w:lsdException w:name="List Bullet 4" w:semiHidden="1" w:unhideWhenUsed="1"/>
-    <w:lsdException w:name="List Bullet 5" w:semiHidden="1" w:unhideWhenUsed="1"/>
-    <w:lsdException w:name="List Number 2" w:semiHidden="1" w:unhideWhenUsed="1"/>
-    <w:lsdException w:name="List Number 3" w:semiHidden="1" w:unhideWhenUsed="1"/>
-    <w:lsdException w:name="List Number 4" w:semiHidden="1" w:unhideWhenUsed="1"/>
-    <w:lsdException w:name="List Number 5" w:semiHidden="1" w:unhideWhenUsed="1"/>
-    <w:lsdException w:name="Title" w:uiPriority="10" w:qFormat="1"/>
-    <w:lsdException w:name="Closing" w:semiHidden="1" w:unhideWhenUsed="1"/>
-    <w:lsdException w:name="Signature" w:semiHidden="1" w:unhideWhenUsed="1"/>
-    <w:lsdException w:name="Default Paragraph Font" w:semiHidden="1" w:uiPriority="1" w:unhideWhenUsed="1"/>
-    <w:lsdException w:name="Body Text" w:semiHidden="1" w:unhideWhenUsed="1"/>
-    <w:lsdException w:name="Body Text Indent" w:semiHidden="1" w:unhideWhenUsed="1"/>
-    <w:lsdException w:name="List Continue" w:semiHidden="1" w:unhideWhenUsed="1"/>
-    <w:lsdException w:name="List Continue 2" w:semiHidden="1" w:unhideWhenUsed="1"/>
-    <w:lsdException w:name="List Continue 3" w:semiHidden="1" w:unhideWhenUsed="1"/>
-    <w:lsdException w:name="List Continue 4" w:semiHidden="1" w:unhideWhenUsed="1"/>
-    <w:lsdException w:name="List Continue 5" w:semiHidden="1" w:unhideWhenUsed="1"/>
-    <w:lsdException w:name="Message Header" w:semiHidden="1" w:unhideWhenUsed="1"/>
-    <w:lsdException w:name="Subtitle" w:uiPriority="11" w:qFormat="1"/>
-    <w:lsdException w:name="Salutation" w:semiHidden="1" w:unhideWhenUsed="1"/>
-    <w:lsdException w:name="Date" w:semiHidden="1" w:unhideWhenUsed="1"/>
-    <w:lsdException w:name="Body Text First Indent" w:semiHidden="1" w:unhideWhenUsed="1"/>
-    <w:lsdException w:name="Body Text First Indent 2" w:semiHidden="1" w:unhideWhenUsed="1"/>
-    <w:lsdException w:name="Note Heading" w:semiHidden="1" w:unhideWhenUsed="1"/>
-    <w:lsdException w:name="Body Text 2" w:semiHidden="1" w:unhideWhenUsed="1"/>
-    <w:lsdException w:name="Body Text 3" w:semiHidden="1" w:unhideWhenUsed="1"/>
-    <w:lsdException w:name="Body Text Indent 2" w:semiHidden="1" w:unhideWhenUsed="1"/>
-    <w:lsdException w:name="Body Text Indent 3" w:semiHidden="1" w:unhideWhenUsed="1"/>
-    <w:lsdException w:name="Block Text" w:semiHidden="1" w:unhideWhenUsed="1"/>
-    <w:lsdException w:name="Hyperlink" w:semiHidden="1" w:unhideWhenUsed="1"/>
-    <w:lsdException w:name="FollowedHyperlink" w:semiHidden="1" w:unhideWhenUsed="1"/>
-    <w:lsdException w:name="Strong" w:uiPriority="22" w:qFormat="1"/>
-    <w:lsdException w:name="Emphasis" w:uiPriority="20" w:qFormat="1"/>
-    <w:lsdException w:name="Document Map" w:semiHidden="1" w:unhideWhenUsed="1"/>
-    <w:lsdException w:name="Plain Text" w:semiHidden="1" w:unhideWhenUsed="1"/>
-    <w:lsdException w:name="E-mail Signature" w:semiHidden="1" w:unhideWhenUsed="1"/>
-    <w:lsdException w:name="HTML Top of Form" w:semiHidden="1" w:unhideWhenUsed="1"/>
-    <w:lsdException w:name="HTML Bottom of Form" w:semiHidden="1" w:unhideWhenUsed="1"/>
-    <w:lsdException w:name="Normal (Web)" w:semiHidden="1" w:unhideWhenUsed="1"/>
-    <w:lsdException w:name="HTML Acronym" w:semiHidden="1" w:unhideWhenUsed="1"/>
-    <w:lsdException w:name="HTML Address" w:semiHidden="1" w:unhideWhenUsed="1"/>
-    <w:lsdException w:name="HTML Cite" w:semiHidden="1" w:unhideWhenUsed="1"/>
-    <w:lsdException w:name="HTML Code" w:semiHidden="1" w:unhideWhenUsed="1"/>
-    <w:lsdException w:name="HTML Definition" w:semiHidden="1" w:unhideWhenUsed="1"/>
-    <w:lsdException w:name="HTML Keyboard" w:semiHidden="1" w:unhideWhenUsed="1"/>
-    <w:lsdException w:name="HTML Preformatted" w:semiHidden="1" w:unhideWhenUsed="1"/>
-    <w:lsdException w:name="HTML Sample" w:semiHidden="1" w:unhideWhenUsed="1"/>
-    <w:lsdException w:name="HTML Typewriter" w:semiHidden="1" w:unhideWhenUsed="1"/>
-    <w:lsdException w:name="HTML Variable" w:semiHidden="1" w:unhideWhenUsed="1"/>
-    <w:lsdException w:name="Normal Table" w:semiHidden="1" w:unhideWhenUsed="1"/>
-    <w:lsdException w:name="annotation subject" w:semiHidden="1" w:unhideWhenUsed="1"/>
-    <w:lsdException w:name="No List" w:semiHidden="1" w:unhideWhenUsed="1"/>
-    <w:lsdException w:name="Outline List 1" w:semiHidden="1" w:unhideWhenUsed="1"/>
-    <w:lsdException w:name="Outline List 2" w:semiHidden="1" w:unhideWhenUsed="1"/>
-    <w:lsdException w:name="Outline List 3" w:semiHidden="1" w:unhideWhenUsed="1"/>
-    <w:lsdException w:name="Table Simple 1" w:semiHidden="1" w:unhideWhenUsed="1"/>
-    <w:lsdException w:name="Table Simple 2" w:semiHidden="1" w:unhideWhenUsed="1"/>
-    <w:lsdException w:name="Table Simple 3" w:semiHidden="1" w:unhideWhenUsed="1"/>
-    <w:lsdException w:name="Table Classic 1" w:semiHidden="1" w:unhideWhenUsed="1"/>
-    <w:lsdException w:name="Table Classic 2" w:semiHidden="1" w:unhideWhenUsed="1"/>
-    <w:lsdException w:name="Table Classic 3" w:semiHidden="1" w:unhideWhenUsed="1"/>
-    <w:lsdException w:name="Table Classic 4" w:semiHidden="1" w:unhideWhenUsed="1"/>
-    <w:lsdException w:name="Table Colorful 1" w:semiHidden="1" w:unhideWhenUsed="1"/>
-    <w:lsdException w:name="Table Colorful 2" w:semiHidden="1" w:unhideWhenUsed="1"/>
-    <w:lsdException w:name="Table Colorful 3" w:semiHidden="1" w:unhideWhenUsed="1"/>
-    <w:lsdException w:name="Table Columns 1" w:semiHidden="1" w:unhideWhenUsed="1"/>
-    <w:lsdException w:name="Table Columns 2" w:semiHidden="1" w:unhideWhenUsed="1"/>
-    <w:lsdException w:name="Table Columns 3" w:semiHidden="1" w:unhideWhenUsed="1"/>
-    <w:lsdException w:name="Table Columns 4" w:semiHidden="1" w:unhideWhenUsed="1"/>
-    <w:lsdException w:name="Table Columns 5" w:semiHidden="1" w:unhideWhenUsed="1"/>
-    <w:lsdException w:name="Table Grid 1" w:semiHidden="1" w:unhideWhenUsed="1"/>
-    <w:lsdException w:name="Table Grid 2" w:semiHidden="1" w:unhideWhenUsed="1"/>
-    <w:lsdException w:name="Table Grid 3" w:semiHidden="1" w:unhideWhenUsed="1"/>
-    <w:lsdException w:name="Table Grid 4" w:semiHidden="1" w:unhideWhenUsed="1"/>
-    <w:lsdException w:name="Table Grid 5" w:semiHidden="1" w:unhideWhenUsed="1"/>
-    <w:lsdException w:name="Table Grid 6" w:semiHidden="1" w:unhideWhenUsed="1"/>
-    <w:lsdException w:name="Table Grid 7" w:semiHidden="1" w:unhideWhenUsed="1"/>
-    <w:lsdException w:name="Table Grid 8" w:semiHidden="1" w:unhideWhenUsed="1"/>
-    <w:lsdException w:name="Table List 1" w:semiHidden="1" w:unhideWhenUsed="1"/>
-    <w:lsdException w:name="Table List 2" w:semiHidden="1" w:unhideWhenUsed="1"/>
-    <w:lsdException w:name="Table List 3" w:semiHidden="1" w:unhideWhenUsed="1"/>
-    <w:lsdException w:name="Table List 4" w:semiHidden="1" w:unhideWhenUsed="1"/>
-    <w:lsdException w:name="Table List 5" w:semiHidden="1" w:unhideWhenUsed="1"/>
-    <w:lsdException w:name="Table List 6" w:semiHidden="1" w:unhideWhenUsed="1"/>
-    <w:lsdException w:name="Table List 7" w:semiHidden="1" w:unhideWhenUsed="1"/>
-    <w:lsdException w:name="Table List 8" w:semiHidden="1" w:unhideWhenUsed="1"/>
-    <w:lsdException w:name="Table 3D effects 1" w:semiHidden="1" w:unhideWhenUsed="1"/>
-    <w:lsdException w:name="Table 3D effects 2" w:semiHidden="1" w:unhideWhenUsed="1"/>
-    <w:lsdException w:name="Table 3D effects 3" w:semiHidden="1" w:unhideWhenUsed="1"/>
-    <w:lsdException w:name="Table Contemporary" w:semiHidden="1" w:unhideWhenUsed="1"/>
-    <w:lsdException w:name="Table Elegant" w:semiHidden="1" w:unhideWhenUsed="1"/>
-    <w:lsdException w:name="Table Professional" w:semiHidden="1" w:unhideWhenUsed="1"/>
-    <w:lsdException w:name="Table Subtle 1" w:semiHidden="1" w:unhideWhenUsed="1"/>
-    <w:lsdException w:name="Table Subtle 2" w:semiHidden="1" w:unhideWhenUsed="1"/>
-    <w:lsdException w:name="Table Web 1" w:semiHidden="1" w:unhideWhenUsed="1"/>
-    <w:lsdException w:name="Table Web 2" w:semiHidden="1" w:unhideWhenUsed="1"/>
-    <w:lsdException w:name="Table Web 3" w:semiHidden="1" w:unhideWhenUsed="1"/>
-    <w:lsdException w:name="Balloon Text" w:semiHidden="1" w:unhideWhenUsed="1"/>
-    <w:lsdException w:name="Table Grid" w:uiPriority="39"/>
-    <w:lsdException w:name="Table Theme" w:semiHidden="1" w:unhideWhenUsed="1"/>
-    <w:lsdException w:name="Placeholder Text" w:semiHidden="1"/>
-    <w:lsdException w:name="No Spacing" w:uiPriority="1" w:qFormat="1"/>
-    <w:lsdException w:name="Light Shading" w:uiPriority="60"/>
-    <w:lsdException w:name="Light List" w:uiPriority="61"/>
-    <w:lsdException w:name="Light Grid" w:uiPriority="62"/>
-    <w:lsdException w:name="Medium Shading 1" w:uiPriority="63"/>
-    <w:lsdException w:name="Medium Shading 2" w:uiPriority="64"/>
-    <w:lsdException w:name="Medium List 1" w:uiPriority="65"/>
-    <w:lsdException w:name="Medium List 2" w:uiPriority="66"/>
-    <w:lsdException w:name="Medium Grid 1" w:uiPriority="67"/>
-    <w:lsdException w:name="Medium Grid 2" w:uiPriority="68"/>
-    <w:lsdException w:name="Medium Grid 3" w:uiPriority="69"/>
-    <w:lsdException w:name="Dark List" w:uiPriority="70"/>
-    <w:lsdException w:name="Colorful Shading" w:uiPriority="71"/>
-    <w:lsdException w:name="Colorful List" w:uiPriority="72"/>
-    <w:lsdException w:name="Colorful Grid" w:uiPriority="73"/>
-    <w:lsdException w:name="Light Shading Accent 1" w:uiPriority="60"/>
-    <w:lsdException w:name="Light List Accent 1" w:uiPriority="61"/>
-    <w:lsdException w:name="Light Grid Accent 1" w:uiPriority="62"/>
-    <w:lsdException w:name="Medium Shading 1 Accent 1" w:uiPriority="63"/>
-    <w:lsdException w:name="Medium Shading 2 Accent 1" w:uiPriority="64"/>
-    <w:lsdException w:name="Medium List 1 Accent 1" w:uiPriority="65"/>
-    <w:lsdException w:name="Revision" w:semiHidden="1"/>
-    <w:lsdException w:name="List Paragraph" w:uiPriority="34" w:qFormat="1"/>
-    <w:lsdException w:name="Quote" w:uiPriority="29" w:qFormat="1"/>
-    <w:lsdException w:name="Intense Quote" w:uiPriority="30" w:qFormat="1"/>
-    <w:lsdException w:name="Medium List 2 Accent 1" w:uiPriority="66"/>
-    <w:lsdException w:name="Medium Grid 1 Accent 1" w:uiPriority="67"/>
-    <w:lsdException w:name="Medium Grid 2 Accent 1" w:uiPriority="68"/>
-    <w:lsdException w:name="Medium Grid 3 Accent 1" w:uiPriority="69"/>
-    <w:lsdException w:name="Dark List Accent 1" w:uiPriority="70"/>
-    <w:lsdException w:name="Colorful Shading Accent 1" w:uiPriority="71"/>
-    <w:lsdException w:name="Colorful List Accent 1" w:uiPriority="72"/>
-    <w:lsdException w:name="Colorful Grid Accent 1" w:uiPriority="73"/>
-    <w:lsdException w:name="Light Shading Accent 2" w:uiPriority="60"/>
-    <w:lsdException w:name="Light List Accent 2" w:uiPriority="61"/>
-    <w:lsdException w:name="Light Grid Accent 2" w:uiPriority="62"/>
-    <w:lsdException w:name="Medium Shading 1 Accent 2" w:uiPriority="63"/>
-    <w:lsdException w:name="Medium Shading 2 Accent 2" w:uiPriority="64"/>
-    <w:lsdException w:name="Medium List 1 Accent 2" w:uiPriority="65"/>
-    <w:lsdException w:name="Medium List 2 Accent 2" w:uiPriority="66"/>
-    <w:lsdException w:name="Medium Grid 1 Accent 2" w:uiPriority="67"/>
-    <w:lsdException w:name="Medium Grid 2 Accent 2" w:uiPriority="68"/>
-    <w:lsdException w:name="Medium Grid 3 Accent 2" w:uiPriority="69"/>
-    <w:lsdException w:name="Dark List Accent 2" w:uiPriority="70"/>
-    <w:lsdException w:name="Colorful Shading Accent 2" w:uiPriority="71"/>
-    <w:lsdException w:name="Colorful List Accent 2" w:uiPriority="72"/>
-    <w:lsdException w:name="Colorful Grid Accent 2" w:uiPriority="73"/>
-    <w:lsdException w:name="Light Shading Accent 3" w:uiPriority="60"/>
-    <w:lsdException w:name="Light List Accent 3" w:uiPriority="61"/>
-    <w:lsdException w:name="Light Grid Accent 3" w:uiPriority="62"/>
-    <w:lsdException w:name="Medium Shading 1 Accent 3" w:uiPriority="63"/>
-    <w:lsdException w:name="Medium Shading 2 Accent 3" w:uiPriority="64"/>
-    <w:lsdException w:name="Medium List 1 Accent 3" w:uiPriority="65"/>
-    <w:lsdException w:name="Medium List 2 Accent 3" w:uiPriority="66"/>
-    <w:lsdException w:name="Medium Grid 1 Accent 3" w:uiPriority="67"/>
-    <w:lsdException w:name="Medium Grid 2 Accent 3" w:uiPriority="68"/>
-    <w:lsdException w:name="Medium Grid 3 Accent 3" w:uiPriority="69"/>
-    <w:lsdException w:name="Dark List Accent 3" w:uiPriority="70"/>
-    <w:lsdException w:name="Colorful Shading Accent 3" w:uiPriority="71"/>
-    <w:lsdException w:name="Colorful List Accent 3" w:uiPriority="72"/>
-    <w:lsdException w:name="Colorful Grid Accent 3" w:uiPriority="73"/>
-    <w:lsdException w:name="Light Shading Accent 4" w:uiPriority="60"/>
-    <w:lsdException w:name="Light List Accent 4" w:uiPriority="61"/>
-    <w:lsdException w:name="Light Grid Accent 4" w:uiPriority="62"/>
-    <w:lsdException w:name="Medium Shading 1 Accent 4" w:uiPriority="63"/>
-    <w:lsdException w:name="Medium Shading 2 Accent 4" w:uiPriority="64"/>
-    <w:lsdException w:name="Medium List 1 Accent 4" w:uiPriority="65"/>
-    <w:lsdException w:name="Medium List 2 Accent 4" w:uiPriority="66"/>
-    <w:lsdException w:name="Medium Grid 1 Accent 4" w:uiPriority="67"/>
-    <w:lsdException w:name="Medium Grid 2 Accent 4" w:uiPriority="68"/>
-    <w:lsdException w:name="Medium Grid 3 Accent 4" w:uiPriority="69"/>
-    <w:lsdException w:name="Dark List Accent 4" w:uiPriority="70"/>
-    <w:lsdException w:name="Colorful Shading Accent 4" w:uiPriority="71"/>
-    <w:lsdException w:name="Colorful List Accent 4" w:uiPriority="72"/>
-    <w:lsdException w:name="Colorful Grid Accent 4" w:uiPriority="73"/>
-    <w:lsdException w:name="Light Shading Accent 5" w:uiPriority="60"/>
-    <w:lsdException w:name="Light List Accent 5" w:uiPriority="61"/>
-    <w:lsdException w:name="Light Grid Accent 5" w:uiPriority="62"/>
-    <w:lsdException w:name="Medium Shading 1 Accent 5" w:uiPriority="63"/>
-    <w:lsdException w:name="Medium Shading 2 Accent 5" w:uiPriority="64"/>
-    <w:lsdException w:name="Medium List 1 Accent 5" w:uiPriority="65"/>
-    <w:lsdException w:name="Medium List 2 Accent 5" w:uiPriority="66"/>
-    <w:lsdException w:name="Medium Grid 1 Accent 5" w:uiPriority="67"/>
-    <w:lsdException w:name="Medium Grid 2 Accent 5" w:uiPriority="68"/>
-    <w:lsdException w:name="Medium Grid 3 Accent 5" w:uiPriority="69"/>
-    <w:lsdException w:name="Dark List Accent 5" w:uiPriority="70"/>
-    <w:lsdException w:name="Colorful Shading Accent 5" w:uiPriority="71"/>
-    <w:lsdException w:name="Colorful List Accent 5" w:uiPriority="72"/>
-    <w:lsdException w:name="Colorful Grid Accent 5" w:uiPriority="73"/>
-    <w:lsdException w:name="Light Shading Accent 6" w:uiPriority="60"/>
-    <w:lsdException w:name="Light List Accent 6" w:uiPriority="61"/>
-    <w:lsdException w:name="Light Grid Accent 6" w:uiPriority="62"/>
-    <w:lsdException w:name="Medium Shading 1 Accent 6" w:uiPriority="63"/>
-    <w:lsdException w:name="Medium Shading 2 Accent 6" w:uiPriority="64"/>
-    <w:lsdException w:name="Medium List 1 Accent 6" w:uiPriority="65"/>
-    <w:lsdException w:name="Medium List 2 Accent 6" w:uiPriority="66"/>
-    <w:lsdException w:name="Medium Grid 1 Accent 6" w:uiPriority="67"/>
-    <w:lsdException w:name="Medium Grid 2 Accent 6" w:uiPriority="68"/>
-    <w:lsdException w:name="Medium Grid 3 Accent 6" w:uiPriority="69"/>
-    <w:lsdException w:name="Dark List Accent 6" w:uiPriority="70"/>
-    <w:lsdException w:name="Colorful Shading Accent 6" w:uiPriority="71"/>
-    <w:lsdException w:name="Colorful List Accent 6" w:uiPriority="72"/>
-    <w:lsdException w:name="Colorful Grid Accent 6" w:uiPriority="73"/>
-    <w:lsdException w:name="Subtle Emphasis" w:uiPriority="19" w:qFormat="1"/>
-    <w:lsdException w:name="Intense Emphasis" w:uiPriority="21" w:qFormat="1"/>
-    <w:lsdException w:name="Subtle Reference" w:uiPriority="31" w:qFormat="1"/>
-    <w:lsdException w:name="Intense Reference" w:uiPriority="32" w:qFormat="1"/>
-    <w:lsdException w:name="Book Title" w:uiPriority="33" w:qFormat="1"/>
-    <w:lsdException w:name="Bibliography" w:semiHidden="1" w:uiPriority="37" w:unhideWhenUsed="1"/>
-    <w:lsdException w:name="TOC Heading" w:semiHidden="1" w:uiPriority="39" w:unhideWhenUsed="1" w:qFormat="1"/>
-    <w:lsdException w:name="Plain Table 1" w:uiPriority="41"/>
-    <w:lsdException w:name="Plain Table 2" w:uiPriority="42"/>
-    <w:lsdException w:name="Plain Table 3" w:uiPriority="43"/>
-    <w:lsdException w:name="Plain Table 4" w:uiPriority="44"/>
-    <w:lsdException w:name="Plain Table 5" w:uiPriority="45"/>
-    <w:lsdException w:name="Grid Table Light" w:uiPriority="40"/>
-    <w:lsdException w:name="Grid Table 1 Light" w:uiPriority="46"/>
-    <w:lsdException w:name="Grid Table 2" w:uiPriority="47"/>
-    <w:lsdException w:name="Grid Table 3" w:uiPriority="48"/>
-    <w:lsdException w:name="Grid Table 4" w:uiPriority="49"/>
-    <w:lsdException w:name="Grid Table 5 Dark" w:uiPriority="50"/>
-    <w:lsdException w:name="Grid Table 6 Colorful" w:uiPriority="51"/>
-    <w:lsdException w:name="Grid Table 7 Colorful" w:uiPriority="52"/>
-    <w:lsdException w:name="Grid Table 1 Light Accent 1" w:uiPriority="46"/>
-    <w:lsdException w:name="Grid Table 2 Accent 1" w:uiPriority="47"/>
-    <w:lsdException w:name="Grid Table 3 Accent 1" w:uiPriority="48"/>
-    <w:lsdException w:name="Grid Table 4 Accent 1" w:uiPriority="49"/>
-    <w:lsdException w:name="Grid Table 5 Dark Accent 1" w:uiPriority="50"/>
-    <w:lsdException w:name="Grid Table 6 Colorful Accent 1" w:uiPriority="51"/>
-    <w:lsdException w:name="Grid Table 7 Colorful Accent 1" w:uiPriority="52"/>
-    <w:lsdException w:name="Grid Table 1 Light Accent 2" w:uiPriority="46"/>
-    <w:lsdException w:name="Grid Table 2 Accent 2" w:uiPriority="47"/>
-    <w:lsdException w:name="Grid Table 3 Accent 2" w:uiPriority="48"/>
-    <w:lsdException w:name="Grid Table 4 Accent 2" w:uiPriority="49"/>
-    <w:lsdException w:name="Grid Table 5 Dark Accent 2" w:uiPriority="50"/>
-    <w:lsdException w:name="Grid Table 6 Colorful Accent 2" w:uiPriority="51"/>
-    <w:lsdException w:name="Grid Table 7 Colorful Accent 2" w:uiPriority="52"/>
-    <w:lsdException w:name="Grid Table 1 Light Accent 3" w:uiPriority="46"/>
-    <w:lsdException w:name="Grid Table 2 Accent 3" w:uiPriority="47"/>
-    <w:lsdException w:name="Grid Table 3 Accent 3" w:uiPriority="48"/>
-    <w:lsdException w:name="Grid Table 4 Accent 3" w:uiPriority="49"/>
-    <w:lsdException w:name="Grid Table 5 Dark Accent 3" w:uiPriority="50"/>
-    <w:lsdException w:name="Grid Table 6 Colorful Accent 3" w:uiPriority="51"/>
-    <w:lsdException w:name="Grid Table 7 Colorful Accent 3" w:uiPriority="52"/>
-    <w:lsdException w:name="Grid Table 1 Light Accent 4" w:uiPriority="46"/>
-    <w:lsdException w:name="Grid Table 2 Accent 4" w:uiPriority="47"/>
-    <w:lsdException w:name="Grid Table 3 Accent 4" w:uiPriority="48"/>
-    <w:lsdException w:name="Grid Table 4 Accent 4" w:uiPriority="49"/>
-    <w:lsdException w:name="Grid Table 5 Dark Accent 4" w:uiPriority="50"/>
-    <w:lsdException w:name="Grid Table 6 Colorful Accent 4" w:uiPriority="51"/>
-    <w:lsdException w:name="Grid Table 7 Colorful Accent 4" w:uiPriority="52"/>
-    <w:lsdException w:name="Grid Table 1 Light Accent 5" w:uiPriority="46"/>
-    <w:lsdException w:name="Grid Table 2 Accent 5" w:uiPriority="47"/>
-    <w:lsdException w:name="Grid Table 3 Accent 5" w:uiPriority="48"/>
-    <w:lsdException w:name="Grid Table 4 Accent 5" w:uiPriority="49"/>
-    <w:lsdException w:name="Grid Table 5 Dark Accent 5" w:uiPriority="50"/>
-    <w:lsdException w:name="Grid Table 6 Colorful Accent 5" w:uiPriority="51"/>
-    <w:lsdException w:name="Grid Table 7 Colorful Accent 5" w:uiPriority="52"/>
-    <w:lsdException w:name="Grid Table 1 Light Accent 6" w:uiPriority="46"/>
-    <w:lsdException w:name="Grid Table 2 Accent 6" w:uiPriority="47"/>
-    <w:lsdException w:name="Grid Table 3 Accent 6" w:uiPriority="48"/>
-    <w:lsdException w:name="Grid Table 4 Accent 6" w:uiPriority="49"/>
-    <w:lsdException w:name="Grid Table 5 Dark Accent 6" w:uiPriority="50"/>
-    <w:lsdException w:name="Grid Table 6 Colorful Accent 6" w:uiPriority="51"/>
-    <w:lsdException w:name="Grid Table 7 Colorful Accent 6" w:uiPriority="52"/>
-    <w:lsdException w:name="List Table 1 Light" w:uiPriority="46"/>
-    <w:lsdException w:name="List Table 2" w:uiPriority="47"/>
-    <w:lsdException w:name="List Table 3" w:uiPriority="48"/>
-    <w:lsdException w:name="List Table 4" w:uiPriority="49"/>
-    <w:lsdException w:name="List Table 5 Dark" w:uiPriority="50"/>
-    <w:lsdException w:name="List Table 6 Colorful" w:uiPriority="51"/>
-    <w:lsdException w:name="List Table 7 Colorful" w:uiPriority="52"/>
-    <w:lsdException w:name="List Table 1 Light Accent 1" w:uiPriority="46"/>
-    <w:lsdException w:name="List Table 2 Accent 1" w:uiPriority="47"/>
-    <w:lsdException w:name="List Table 3 Accent 1" w:uiPriority="48"/>
-    <w:lsdException w:name="List Table 4 Accent 1" w:uiPriority="49"/>
-    <w:lsdException w:name="List Table 5 Dark Accent 1" w:uiPriority="50"/>
-    <w:lsdException w:name="List Table 6 Colorful Accent 1" w:uiPriority="51"/>
-    <w:lsdException w:name="List Table 7 Colorful Accent 1" w:uiPriority="52"/>
-    <w:lsdException w:name="List Table 1 Light Accent 2" w:uiPriority="46"/>
-    <w:lsdException w:name="List Table 2 Accent 2" w:uiPriority="47"/>
-    <w:lsdException w:name="List Table 3 Accent 2" w:uiPriority="48"/>
-    <w:lsdException w:name="List Table 4 Accent 2" w:uiPriority="49"/>
-    <w:lsdException w:name="List Table 5 Dark Accent 2" w:uiPriority="50"/>
-    <w:lsdException w:name="List Table 6 Colorful Accent 2" w:uiPriority="51"/>
-    <w:lsdException w:name="List Table 7 Colorful Accent 2" w:uiPriority="52"/>
-    <w:lsdException w:name="List Table 1 Light Accent 3" w:uiPriority="46"/>
-    <w:lsdException w:name="List Table 2 Accent 3" w:uiPriority="47"/>
-    <w:lsdException w:name="List Table 3 Accent 3" w:uiPriority="48"/>
-    <w:lsdException w:name="List Table 4 Accent 3" w:uiPriority="49"/>
-    <w:lsdException w:name="List Table 5 Dark Accent 3" w:uiPriority="50"/>
-    <w:lsdException w:name="List Table 6 Colorful Accent 3" w:uiPriority="51"/>
-    <w:lsdException w:name="List Table 7 Colorful Accent 3" w:uiPriority="52"/>
-    <w:lsdException w:name="List Table 1 Light Accent 4" w:uiPriority="46"/>
-    <w:lsdException w:name="List Table 2 Accent 4" w:uiPriority="47"/>
-    <w:lsdException w:name="List Table 3 Accent 4" w:uiPriority="48"/>
-    <w:lsdException w:name="List Table 4 Accent 4" w:uiPriority="49"/>
-    <w:lsdException w:name="List Table 5 Dark Accent 4" w:uiPriority="50"/>
-    <w:lsdException w:name="List Table 6 Colorful Accent 4" w:uiPriority="51"/>
-    <w:lsdException w:name="List Table 7 Colorful Accent 4" w:uiPriority="52"/>
-    <w:lsdException w:name="List Table 1 Light Accent 5" w:uiPriority="46"/>
-    <w:lsdException w:name="List Table 2 Accent 5" w:uiPriority="47"/>
-    <w:lsdException w:name="List Table 3 Accent 5" w:uiPriority="48"/>
-    <w:lsdException w:name="List Table 4 Accent 5" w:uiPriority="49"/>
-    <w:lsdException w:name="List Table 5 Dark Accent 5" w:uiPriority="50"/>
-    <w:lsdException w:name="List Table 6 Colorful Accent 5" w:uiPriority="51"/>
-    <w:lsdException w:name="List Table 7 Colorful Accent 5" w:uiPriority="52"/>
-    <w:lsdException w:name="List Table 1 Light Accent 6" w:uiPriority="46"/>
-    <w:lsdException w:name="List Table 2 Accent 6" w:uiPriority="47"/>
-    <w:lsdException w:name="List Table 3 Accent 6" w:uiPriority="48"/>
-    <w:lsdException w:name="List Table 4 Accent 6" w:uiPriority="49"/>
-    <w:lsdException w:name="List Table 5 Dark Accent 6" w:uiPriority="50"/>
-    <w:lsdException w:name="List Table 6 Colorful Accent 6" w:uiPriority="51"/>
-    <w:lsdException w:name="List Table 7 Colorful Accent 6" w:uiPriority="52"/>
-    <w:lsdException w:name="Mention" w:semiHidden="1" w:unhideWhenUsed="1"/>
-    <w:lsdException w:name="Smart Hyperlink" w:semiHidden="1" w:unhideWhenUsed="1"/>
-    <w:lsdException w:name="Hashtag" w:semiHidden="1" w:unhideWhenUsed="1"/>
-    <w:lsdException w:name="Unresolved Mention" w:semiHidden="1" w:unhideWhenUsed="1"/>
-    <w:lsdException w:name="Smart Link" w:semiHidden="1" w:unhideWhenUsed="1"/>
+  <w:latentStyles w:defLockedState="0" w:defUIPriority="99" w:defSemiHidden="1" w:defUnhideWhenUsed="1" w:defQFormat="0" w:count="267">
+    <w:lsdException w:name="Normal" w:semiHidden="0" w:uiPriority="0" w:unhideWhenUsed="0" w:qFormat="1"/>
+    <w:lsdException w:name="heading 1" w:semiHidden="0" w:uiPriority="9" w:unhideWhenUsed="0" w:qFormat="1"/>
+    <w:lsdException w:name="heading 2" w:uiPriority="9" w:qFormat="1"/>
+    <w:lsdException w:name="heading 3" w:uiPriority="9" w:qFormat="1"/>
+    <w:lsdException w:name="heading 4" w:uiPriority="9" w:qFormat="1"/>
+    <w:lsdException w:name="heading 5" w:uiPriority="9" w:qFormat="1"/>
+    <w:lsdException w:name="heading 6" w:uiPriority="9" w:qFormat="1"/>
+    <w:lsdException w:name="heading 7" w:uiPriority="9" w:qFormat="1"/>
+    <w:lsdException w:name="heading 8" w:uiPriority="9" w:qFormat="1"/>
+    <w:lsdException w:name="heading 9" w:uiPriority="9" w:qFormat="1"/>
+    <w:lsdException w:name="toc 1" w:uiPriority="39"/>
+    <w:lsdException w:name="toc 2" w:uiPriority="39"/>
+    <w:lsdException w:name="toc 3" w:uiPriority="39"/>
+    <w:lsdException w:name="toc 4" w:uiPriority="39"/>
+    <w:lsdException w:name="toc 5" w:uiPriority="39"/>
+    <w:lsdException w:name="toc 6" w:uiPriority="39"/>
+    <w:lsdException w:name="toc 7" w:uiPriority="39"/>
+    <w:lsdException w:name="toc 8" w:uiPriority="39"/>
+    <w:lsdException w:name="toc 9" w:uiPriority="39"/>
+    <w:lsdException w:name="caption" w:uiPriority="35" w:qFormat="1"/>
+    <w:lsdException w:name="Title" w:semiHidden="0" w:uiPriority="10" w:unhideWhenUsed="0" w:qFormat="1"/>
+    <w:lsdException w:name="Default Paragraph Font" w:uiPriority="1"/>
+    <w:lsdException w:name="Subtitle" w:semiHidden="0" w:uiPriority="11" w:unhideWhenUsed="0" w:qFormat="1"/>
+    <w:lsdException w:name="Strong" w:semiHidden="0" w:uiPriority="22" w:unhideWhenUsed="0" w:qFormat="1"/>
+    <w:lsdException w:name="Emphasis" w:semiHidden="0" w:uiPriority="20" w:unhideWhenUsed="0" w:qFormat="1"/>
+    <w:lsdException w:name="Table Grid" w:semiHidden="0" w:uiPriority="39" w:unhideWhenUsed="0"/>
+    <w:lsdException w:name="Placeholder Text" w:unhideWhenUsed="0"/>
+    <w:lsdException w:name="No Spacing" w:semiHidden="0" w:uiPriority="1" w:unhideWhenUsed="0" w:qFormat="1"/>
+    <w:lsdException w:name="Light Shading" w:semiHidden="0" w:uiPriority="60" w:unhideWhenUsed="0"/>
+    <w:lsdException w:name="Light List" w:semiHidden="0" w:uiPriority="61" w:unhideWhenUsed="0"/>
+    <w:lsdException w:name="Light Grid" w:semiHidden="0" w:uiPriority="62" w:unhideWhenUsed="0"/>
+    <w:lsdException w:name="Medium Shading 1" w:semiHidden="0" w:uiPriority="63" w:unhideWhenUsed="0"/>
+    <w:lsdException w:name="Medium Shading 2" w:semiHidden="0" w:uiPriority="64" w:unhideWhenUsed="0"/>
+    <w:lsdException w:name="Medium List 1" w:semiHidden="0" w:uiPriority="65" w:unhideWhenUsed="0"/>
+    <w:lsdException w:name="Medium List 2" w:semiHidden="0" w:uiPriority="66" w:unhideWhenUsed="0"/>
+    <w:lsdException w:name="Medium Grid 1" w:semiHidden="0" w:uiPriority="67" w:unhideWhenUsed="0"/>
+    <w:lsdException w:name="Medium Grid 2" w:semiHidden="0" w:uiPriority="68" w:unhideWhenUsed="0"/>
+    <w:lsdException w:name="Medium Grid 3" w:semiHidden="0" w:uiPriority="69" w:unhideWhenUsed="0"/>
+    <w:lsdException w:name="Dark List" w:semiHidden="0" w:uiPriority="70" w:unhideWhenUsed="0"/>
+    <w:lsdException w:name="Colorful Shading" w:semiHidden="0" w:uiPriority="71" w:unhideWhenUsed="0"/>
+    <w:lsdException w:name="Colorful List" w:semiHidden="0" w:uiPriority="72" w:unhideWhenUsed="0"/>
+    <w:lsdException w:name="Colorful Grid" w:semiHidden="0" w:uiPriority="73" w:unhideWhenUsed="0"/>
+    <w:lsdException w:name="Light Shading Accent 1" w:semiHidden="0" w:uiPriority="60" w:unhideWhenUsed="0"/>
+    <w:lsdException w:name="Light List Accent 1" w:semiHidden="0" w:uiPriority="61" w:unhideWhenUsed="0"/>
+    <w:lsdException w:name="Light Grid Accent 1" w:semiHidden="0" w:uiPriority="62" w:unhideWhenUsed="0"/>
+    <w:lsdException w:name="Medium Shading 1 Accent 1" w:semiHidden="0" w:uiPriority="63" w:unhideWhenUsed="0"/>
+    <w:lsdException w:name="Medium Shading 2 Accent 1" w:semiHidden="0" w:uiPriority="64" w:unhideWhenUsed="0"/>
+    <w:lsdException w:name="Medium List 1 Accent 1" w:semiHidden="0" w:uiPriority="65" w:unhideWhenUsed="0"/>
+    <w:lsdException w:name="Revision" w:unhideWhenUsed="0"/>
+    <w:lsdException w:name="List Paragraph" w:semiHidden="0" w:uiPriority="34" w:unhideWhenUsed="0" w:qFormat="1"/>
+    <w:lsdException w:name="Quote" w:semiHidden="0" w:uiPriority="29" w:unhideWhenUsed="0" w:qFormat="1"/>
+    <w:lsdException w:name="Intense Quote" w:semiHidden="0" w:uiPriority="30" w:unhideWhenUsed="0" w:qFormat="1"/>
+    <w:lsdException w:name="Medium List 2 Accent 1" w:semiHidden="0" w:uiPriority="66" w:unhideWhenUsed="0"/>
+    <w:lsdException w:name="Medium Grid 1 Accent 1" w:semiHidden="0" w:uiPriority="67" w:unhideWhenUsed="0"/>
+    <w:lsdException w:name="Medium Grid 2 Accent 1" w:semiHidden="0" w:uiPriority="68" w:unhideWhenUsed="0"/>
+    <w:lsdException w:name="Medium Grid 3 Accent 1" w:semiHidden="0" w:uiPriority="69" w:unhideWhenUsed="0"/>
+    <w:lsdException w:name="Dark List Accent 1" w:semiHidden="0" w:uiPriority="70" w:unhideWhenUsed="0"/>
+    <w:lsdException w:name="Colorful Shading Accent 1" w:semiHidden="0" w:uiPriority="71" w:unhideWhenUsed="0"/>
+    <w:lsdException w:name="Colorful List Accent 1" w:semiHidden="0" w:uiPriority="72" w:unhideWhenUsed="0"/>
+    <w:lsdException w:name="Colorful Grid Accent 1" w:semiHidden="0" w:uiPriority="73" w:unhideWhenUsed="0"/>
+    <w:lsdException w:name="Light Shading Accent 2" w:semiHidden="0" w:uiPriority="60" w:unhideWhenUsed="0"/>
+    <w:lsdException w:name="Light List Accent 2" w:semiHidden="0" w:uiPriority="61" w:unhideWhenUsed="0"/>
+    <w:lsdException w:name="Light Grid Accent 2" w:semiHidden="0" w:uiPriority="62" w:unhideWhenUsed="0"/>
+    <w:lsdException w:name="Medium Shading 1 Accent 2" w:semiHidden="0" w:uiPriority="63" w:unhideWhenUsed="0"/>
+    <w:lsdException w:name="Medium Shading 2 Accent 2" w:semiHidden="0" w:uiPriority="64" w:unhideWhenUsed="0"/>
+    <w:lsdException w:name="Medium List 1 Accent 2" w:semiHidden="0" w:uiPriority="65" w:unhideWhenUsed="0"/>
+    <w:lsdException w:name="Medium List 2 Accent 2" w:semiHidden="0" w:uiPriority="66" w:unhideWhenUsed="0"/>
+    <w:lsdException w:name="Medium Grid 1 Accent 2" w:semiHidden="0" w:uiPriority="67" w:unhideWhenUsed="0"/>
+    <w:lsdException w:name="Medium Grid 2 Accent 2" w:semiHidden="0" w:uiPriority="68" w:unhideWhenUsed="0"/>
+    <w:lsdException w:name="Medium Grid 3 Accent 2" w:semiHidden="0" w:uiPriority="69" w:unhideWhenUsed="0"/>
+    <w:lsdException w:name="Dark List Accent 2" w:semiHidden="0" w:uiPriority="70" w:unhideWhenUsed="0"/>
+    <w:lsdException w:name="Colorful Shading Accent 2" w:semiHidden="0" w:uiPriority="71" w:unhideWhenUsed="0"/>
+    <w:lsdException w:name="Colorful List Accent 2" w:semiHidden="0" w:uiPriority="72" w:unhideWhenUsed="0"/>
+    <w:lsdException w:name="Colorful Grid Accent 2" w:semiHidden="0" w:uiPriority="73" w:unhideWhenUsed="0"/>
+    <w:lsdException w:name="Light Shading Accent 3" w:semiHidden="0" w:uiPriority="60" w:unhideWhenUsed="0"/>
+    <w:lsdException w:name="Light List Accent 3" w:semiHidden="0" w:uiPriority="61" w:unhideWhenUsed="0"/>
+    <w:lsdException w:name="Light Grid Accent 3" w:semiHidden="0" w:uiPriority="62" w:unhideWhenUsed="0"/>
+    <w:lsdException w:name="Medium Shading 1 Accent 3" w:semiHidden="0" w:uiPriority="63" w:unhideWhenUsed="0"/>
+    <w:lsdException w:name="Medium Shading 2 Accent 3" w:semiHidden="0" w:uiPriority="64" w:unhideWhenUsed="0"/>
+    <w:lsdException w:name="Medium List 1 Accent 3" w:semiHidden="0" w:uiPriority="65" w:unhideWhenUsed="0"/>
+    <w:lsdException w:name="Medium List 2 Accent 3" w:semiHidden="0" w:uiPriority="66" w:unhideWhenUsed="0"/>
+    <w:lsdException w:name="Medium Grid 1 Accent 3" w:semiHidden="0" w:uiPriority="67" w:unhideWhenUsed="0"/>
+    <w:lsdException w:name="Medium Grid 2 Accent 3" w:semiHidden="0" w:uiPriority="68" w:unhideWhenUsed="0"/>
+    <w:lsdException w:name="Medium Grid 3 Accent 3" w:semiHidden="0" w:uiPriority="69" w:unhideWhenUsed="0"/>
+    <w:lsdException w:name="Dark List Accent 3" w:semiHidden="0" w:uiPriority="70" w:unhideWhenUsed="0"/>
+    <w:lsdException w:name="Colorful Shading Accent 3" w:semiHidden="0" w:uiPriority="71" w:unhideWhenUsed="0"/>
+    <w:lsdException w:name="Colorful List Accent 3" w:semiHidden="0" w:uiPriority="72" w:unhideWhenUsed="0"/>
+    <w:lsdException w:name="Colorful Grid Accent 3" w:semiHidden="0" w:uiPriority="73" w:unhideWhenUsed="0"/>
+    <w:lsdException w:name="Light Shading Accent 4" w:semiHidden="0" w:uiPriority="60" w:unhideWhenUsed="0"/>
+    <w:lsdException w:name="Light List Accent 4" w:semiHidden="0" w:uiPriority="61" w:unhideWhenUsed="0"/>
+    <w:lsdException w:name="Light Grid Accent 4" w:semiHidden="0" w:uiPriority="62" w:unhideWhenUsed="0"/>
+    <w:lsdException w:name="Medium Shading 1 Accent 4" w:semiHidden="0" w:uiPriority="63" w:unhideWhenUsed="0"/>
+    <w:lsdException w:name="Medium Shading 2 Accent 4" w:semiHidden="0" w:uiPriority="64" w:unhideWhenUsed="0"/>
+    <w:lsdException w:name="Medium List 1 Accent 4" w:semiHidden="0" w:uiPriority="65" w:unhideWhenUsed="0"/>
+    <w:lsdException w:name="Medium List 2 Accent 4" w:semiHidden="0" w:uiPriority="66" w:unhideWhenUsed="0"/>
+    <w:lsdException w:name="Medium Grid 1 Accent 4" w:semiHidden="0" w:uiPriority="67" w:unhideWhenUsed="0"/>
+    <w:lsdException w:name="Medium Grid 2 Accent 4" w:semiHidden="0" w:uiPriority="68" w:unhideWhenUsed="0"/>
+    <w:lsdException w:name="Medium Grid 3 Accent 4" w:semiHidden="0" w:uiPriority="69" w:unhideWhenUsed="0"/>
+    <w:lsdException w:name="Dark List Accent 4" w:semiHidden="0" w:uiPriority="70" w:unhideWhenUsed="0"/>
+    <w:lsdException w:name="Colorful Shading Accent 4" w:semiHidden="0" w:uiPriority="71" w:unhideWhenUsed="0"/>
+    <w:lsdException w:name="Colorful List Accent 4" w:semiHidden="0" w:uiPriority="72" w:unhideWhenUsed="0"/>
+    <w:lsdException w:name="Colorful Grid Accent 4" w:semiHidden="0" w:uiPriority="73" w:unhideWhenUsed="0"/>
+    <w:lsdException w:name="Light Shading Accent 5" w:semiHidden="0" w:uiPriority="60" w:unhideWhenUsed="0"/>
+    <w:lsdException w:name="Light List Accent 5" w:semiHidden="0" w:uiPriority="61" w:unhideWhenUsed="0"/>
+    <w:lsdException w:name="Light Grid Accent 5" w:semiHidden="0" w:uiPriority="62" w:unhideWhenUsed="0"/>
+    <w:lsdException w:name="Medium Shading 1 Accent 5" w:semiHidden="0" w:uiPriority="63" w:unhideWhenUsed="0"/>
+    <w:lsdException w:name="Medium Shading 2 Accent 5" w:semiHidden="0" w:uiPriority="64" w:unhideWhenUsed="0"/>
+    <w:lsdException w:name="Medium List 1 Accent 5" w:semiHidden="0" w:uiPriority="65" w:unhideWhenUsed="0"/>
+    <w:lsdException w:name="Medium List 2 Accent 5" w:semiHidden="0" w:uiPriority="66" w:unhideWhenUsed="0"/>
+    <w:lsdException w:name="Medium Grid 1 Accent 5" w:semiHidden="0" w:uiPriority="67" w:unhideWhenUsed="0"/>
+    <w:lsdException w:name="Medium Grid 2 Accent 5" w:semiHidden="0" w:uiPriority="68" w:unhideWhenUsed="0"/>
+    <w:lsdException w:name="Medium Grid 3 Accent 5" w:semiHidden="0" w:uiPriority="69" w:unhideWhenUsed="0"/>
+    <w:lsdException w:name="Dark List Accent 5" w:semiHidden="0" w:uiPriority="70" w:unhideWhenUsed="0"/>
+    <w:lsdException w:name="Colorful Shading Accent 5" w:semiHidden="0" w:uiPriority="71" w:unhideWhenUsed="0"/>
+    <w:lsdException w:name="Colorful List Accent 5" w:semiHidden="0" w:uiPriority="72" w:unhideWhenUsed="0"/>
+    <w:lsdException w:name="Colorful Grid Accent 5" w:semiHidden="0" w:uiPriority="73" w:unhideWhenUsed="0"/>
+    <w:lsdException w:name="Light Shading Accent 6" w:semiHidden="0" w:uiPriority="60" w:unhideWhenUsed="0"/>
+    <w:lsdException w:name="Light List Accent 6" w:semiHidden="0" w:uiPriority="61" w:unhideWhenUsed="0"/>
+    <w:lsdException w:name="Light Grid Accent 6" w:semiHidden="0" w:uiPriority="62" w:unhideWhenUsed="0"/>
+    <w:lsdException w:name="Medium Shading 1 Accent 6" w:semiHidden="0" w:uiPriority="63" w:unhideWhenUsed="0"/>
+    <w:lsdException w:name="Medium Shading 2 Accent 6" w:semiHidden="0" w:uiPriority="64" w:unhideWhenUsed="0"/>
+    <w:lsdException w:name="Medium List 1 Accent 6" w:semiHidden="0" w:uiPriority="65" w:unhideWhenUsed="0"/>
+    <w:lsdException w:name="Medium List 2 Accent 6" w:semiHidden="0" w:uiPriority="66" w:unhideWhenUsed="0"/>
+    <w:lsdException w:name="Medium Grid 1 Accent 6" w:semiHidden="0" w:uiPriority="67" w:unhideWhenUsed="0"/>
+    <w:lsdException w:name="Medium Grid 2 Accent 6" w:semiHidden="0" w:uiPriority="68" w:unhideWhenUsed="0"/>
+    <w:lsdException w:name="Medium Grid 3 Accent 6" w:semiHidden="0" w:uiPriority="69" w:unhideWhenUsed="0"/>
+    <w:lsdException w:name="Dark List Accent 6" w:semiHidden="0" w:uiPriority="70" w:unhideWhenUsed="0"/>
+    <w:lsdException w:name="Colorful Shading Accent 6" w:semiHidden="0" w:uiPriority="71" w:unhideWhenUsed="0"/>
+    <w:lsdException w:name="Colorful List Accent 6" w:semiHidden="0" w:uiPriority="72" w:unhideWhenUsed="0"/>
+    <w:lsdException w:name="Colorful Grid Accent 6" w:semiHidden="0" w:uiPriority="73" w:unhideWhenUsed="0"/>
+    <w:lsdException w:name="Subtle Emphasis" w:semiHidden="0" w:uiPriority="19" w:unhideWhenUsed="0" w:qFormat="1"/>
+    <w:lsdException w:name="Intense Emphasis" w:semiHidden="0" w:uiPriority="21" w:unhideWhenUsed="0" w:qFormat="1"/>
+    <w:lsdException w:name="Subtle Reference" w:semiHidden="0" w:uiPriority="31" w:unhideWhenUsed="0" w:qFormat="1"/>
+    <w:lsdException w:name="Intense Reference" w:semiHidden="0" w:uiPriority="32" w:unhideWhenUsed="0" w:qFormat="1"/>
+    <w:lsdException w:name="Book Title" w:semiHidden="0" w:uiPriority="33" w:unhideWhenUsed="0" w:qFormat="1"/>
+    <w:lsdException w:name="Bibliography" w:uiPriority="37"/>
+    <w:lsdException w:name="TOC Heading" w:uiPriority="39" w:qFormat="1"/>
   </w:latentStyles>
   <w:style w:type="paragraph" w:default="1" w:styleId="Normal">
     <w:name w:val="Normal"/>
@@ -7736,6 +7552,7 @@
   <w:style w:type="character" w:default="1" w:styleId="Fontepargpadro">
     <w:name w:val="Default Paragraph Font"/>
     <w:uiPriority w:val="1"/>
+    <w:semiHidden/>
     <w:unhideWhenUsed/>
   </w:style>
   <w:style w:type="table" w:default="1" w:styleId="Tabelanormal">
@@ -7873,6 +7690,7 @@
       <w:spacing w:after="0" w:line="240" w:lineRule="auto"/>
     </w:pPr>
     <w:tblPr>
+      <w:tblInd w:w="0" w:type="dxa"/>
       <w:tblBorders>
         <w:top w:val="single" w:sz="4" w:space="0" w:color="auto"/>
         <w:left w:val="single" w:sz="4" w:space="0" w:color="auto"/>
@@ -7881,6 +7699,530 @@
         <w:insideH w:val="single" w:sz="4" w:space="0" w:color="auto"/>
         <w:insideV w:val="single" w:sz="4" w:space="0" w:color="auto"/>
       </w:tblBorders>
+      <w:tblCellMar>
+        <w:top w:w="0" w:type="dxa"/>
+        <w:left w:w="108" w:type="dxa"/>
+        <w:bottom w:w="0" w:type="dxa"/>
+        <w:right w:w="108" w:type="dxa"/>
+      </w:tblCellMar>
+    </w:tblPr>
+  </w:style>
+  <w:style w:type="character" w:customStyle="1" w:styleId="citation-150">
+    <w:name w:val="citation-150"/>
+    <w:basedOn w:val="Fontepargpadro"/>
+    <w:rsid w:val="00A711AC"/>
+  </w:style>
+  <w:style w:type="character" w:customStyle="1" w:styleId="citation-148">
+    <w:name w:val="citation-148"/>
+    <w:basedOn w:val="Fontepargpadro"/>
+    <w:rsid w:val="007F7CF9"/>
+  </w:style>
+  <w:style w:type="paragraph" w:styleId="NormalWeb">
+    <w:name w:val="Normal (Web)"/>
+    <w:basedOn w:val="Normal"/>
+    <w:uiPriority w:val="99"/>
+    <w:semiHidden/>
+    <w:unhideWhenUsed/>
+    <w:rsid w:val="00610733"/>
+    <w:pPr>
+      <w:spacing w:before="100" w:beforeAutospacing="1" w:after="100" w:afterAutospacing="1" w:line="240" w:lineRule="auto"/>
+    </w:pPr>
+  </w:style>
+  <w:style w:type="character" w:customStyle="1" w:styleId="citation-140">
+    <w:name w:val="citation-140"/>
+    <w:basedOn w:val="Fontepargpadro"/>
+    <w:rsid w:val="00610733"/>
+  </w:style>
+  <w:style w:type="character" w:customStyle="1" w:styleId="citation-139">
+    <w:name w:val="citation-139"/>
+    <w:basedOn w:val="Fontepargpadro"/>
+    <w:rsid w:val="00610733"/>
+  </w:style>
+  <w:style w:type="character" w:customStyle="1" w:styleId="citation-138">
+    <w:name w:val="citation-138"/>
+    <w:basedOn w:val="Fontepargpadro"/>
+    <w:rsid w:val="00610733"/>
+  </w:style>
+  <w:style w:type="character" w:customStyle="1" w:styleId="citation-137">
+    <w:name w:val="citation-137"/>
+    <w:basedOn w:val="Fontepargpadro"/>
+    <w:rsid w:val="00610733"/>
+  </w:style>
+  <w:style w:type="character" w:customStyle="1" w:styleId="citation-136">
+    <w:name w:val="citation-136"/>
+    <w:basedOn w:val="Fontepargpadro"/>
+    <w:rsid w:val="00610733"/>
+  </w:style>
+  <w:style w:type="character" w:customStyle="1" w:styleId="citation-135">
+    <w:name w:val="citation-135"/>
+    <w:basedOn w:val="Fontepargpadro"/>
+    <w:rsid w:val="00610733"/>
+  </w:style>
+  <w:style w:type="character" w:customStyle="1" w:styleId="citation-134">
+    <w:name w:val="citation-134"/>
+    <w:basedOn w:val="Fontepargpadro"/>
+    <w:rsid w:val="00610733"/>
+  </w:style>
+  <w:style w:type="paragraph" w:styleId="Legenda">
+    <w:name w:val="caption"/>
+    <w:basedOn w:val="Normal"/>
+    <w:next w:val="Normal"/>
+    <w:uiPriority w:val="35"/>
+    <w:unhideWhenUsed/>
+    <w:qFormat/>
+    <w:rsid w:val="00B6568B"/>
+    <w:pPr>
+      <w:spacing w:after="200" w:line="240" w:lineRule="auto"/>
+    </w:pPr>
+    <w:rPr>
+      <w:i/>
+      <w:iCs/>
+      <w:color w:val="1F497D" w:themeColor="text2"/>
+      <w:sz w:val="18"/>
+      <w:szCs w:val="18"/>
+    </w:rPr>
+  </w:style>
+</w:styles>
+</file>
+
+<file path=word/stylesWithEffects.xml><?xml version="1.0" encoding="utf-8"?>
+<w:styles xmlns:wpc="http://schemas.microsoft.com/office/word/2010/wordprocessingCanvas" xmlns:mc="http://schemas.openxmlformats.org/markup-compatibility/2006" xmlns:o="urn:schemas-microsoft-com:office:office" xmlns:r="http://schemas.openxmlformats.org/officeDocument/2006/relationships" xmlns:m="http://schemas.openxmlformats.org/officeDocument/2006/math" xmlns:v="urn:schemas-microsoft-com:vml" xmlns:wp14="http://schemas.microsoft.com/office/word/2010/wordprocessingDrawing" xmlns:wp="http://schemas.openxmlformats.org/drawingml/2006/wordprocessingDrawing" xmlns:w10="urn:schemas-microsoft-com:office:word" xmlns:w="http://schemas.openxmlformats.org/wordprocessingml/2006/main" xmlns:w14="http://schemas.microsoft.com/office/word/2010/wordml" xmlns:wpg="http://schemas.microsoft.com/office/word/2010/wordprocessingGroup" xmlns:wpi="http://schemas.microsoft.com/office/word/2010/wordprocessingInk" xmlns:wne="http://schemas.microsoft.com/office/word/2006/wordml" xmlns:wps="http://schemas.microsoft.com/office/word/2010/wordprocessingShape" mc:Ignorable="w14 wp14">
+  <w:docDefaults>
+    <w:rPrDefault>
+      <w:rPr>
+        <w:rFonts w:ascii="Times New Roman" w:eastAsia="Times New Roman" w:hAnsi="Times New Roman" w:cs="Times New Roman"/>
+        <w:sz w:val="24"/>
+        <w:szCs w:val="24"/>
+        <w:lang w:val="pt-BR" w:eastAsia="pt-BR" w:bidi="ar-SA"/>
+      </w:rPr>
+    </w:rPrDefault>
+    <w:pPrDefault>
+      <w:pPr>
+        <w:spacing w:after="240" w:line="360" w:lineRule="auto"/>
+      </w:pPr>
+    </w:pPrDefault>
+  </w:docDefaults>
+  <w:latentStyles w:defLockedState="0" w:defUIPriority="99" w:defSemiHidden="1" w:defUnhideWhenUsed="1" w:defQFormat="0" w:count="267">
+    <w:lsdException w:name="Normal" w:semiHidden="0" w:uiPriority="0" w:unhideWhenUsed="0" w:qFormat="1"/>
+    <w:lsdException w:name="heading 1" w:semiHidden="0" w:uiPriority="9" w:unhideWhenUsed="0" w:qFormat="1"/>
+    <w:lsdException w:name="heading 2" w:uiPriority="9" w:qFormat="1"/>
+    <w:lsdException w:name="heading 3" w:uiPriority="9" w:qFormat="1"/>
+    <w:lsdException w:name="heading 4" w:uiPriority="9" w:qFormat="1"/>
+    <w:lsdException w:name="heading 5" w:uiPriority="9" w:qFormat="1"/>
+    <w:lsdException w:name="heading 6" w:uiPriority="9" w:qFormat="1"/>
+    <w:lsdException w:name="heading 7" w:uiPriority="9" w:qFormat="1"/>
+    <w:lsdException w:name="heading 8" w:uiPriority="9" w:qFormat="1"/>
+    <w:lsdException w:name="heading 9" w:uiPriority="9" w:qFormat="1"/>
+    <w:lsdException w:name="toc 1" w:uiPriority="39"/>
+    <w:lsdException w:name="toc 2" w:uiPriority="39"/>
+    <w:lsdException w:name="toc 3" w:uiPriority="39"/>
+    <w:lsdException w:name="toc 4" w:uiPriority="39"/>
+    <w:lsdException w:name="toc 5" w:uiPriority="39"/>
+    <w:lsdException w:name="toc 6" w:uiPriority="39"/>
+    <w:lsdException w:name="toc 7" w:uiPriority="39"/>
+    <w:lsdException w:name="toc 8" w:uiPriority="39"/>
+    <w:lsdException w:name="toc 9" w:uiPriority="39"/>
+    <w:lsdException w:name="caption" w:uiPriority="35" w:qFormat="1"/>
+    <w:lsdException w:name="Title" w:semiHidden="0" w:uiPriority="10" w:unhideWhenUsed="0" w:qFormat="1"/>
+    <w:lsdException w:name="Default Paragraph Font" w:uiPriority="1"/>
+    <w:lsdException w:name="Subtitle" w:semiHidden="0" w:uiPriority="11" w:unhideWhenUsed="0" w:qFormat="1"/>
+    <w:lsdException w:name="Strong" w:semiHidden="0" w:uiPriority="22" w:unhideWhenUsed="0" w:qFormat="1"/>
+    <w:lsdException w:name="Emphasis" w:semiHidden="0" w:uiPriority="20" w:unhideWhenUsed="0" w:qFormat="1"/>
+    <w:lsdException w:name="Table Grid" w:semiHidden="0" w:uiPriority="39" w:unhideWhenUsed="0"/>
+    <w:lsdException w:name="Placeholder Text" w:unhideWhenUsed="0"/>
+    <w:lsdException w:name="No Spacing" w:semiHidden="0" w:uiPriority="1" w:unhideWhenUsed="0" w:qFormat="1"/>
+    <w:lsdException w:name="Light Shading" w:semiHidden="0" w:uiPriority="60" w:unhideWhenUsed="0"/>
+    <w:lsdException w:name="Light List" w:semiHidden="0" w:uiPriority="61" w:unhideWhenUsed="0"/>
+    <w:lsdException w:name="Light Grid" w:semiHidden="0" w:uiPriority="62" w:unhideWhenUsed="0"/>
+    <w:lsdException w:name="Medium Shading 1" w:semiHidden="0" w:uiPriority="63" w:unhideWhenUsed="0"/>
+    <w:lsdException w:name="Medium Shading 2" w:semiHidden="0" w:uiPriority="64" w:unhideWhenUsed="0"/>
+    <w:lsdException w:name="Medium List 1" w:semiHidden="0" w:uiPriority="65" w:unhideWhenUsed="0"/>
+    <w:lsdException w:name="Medium List 2" w:semiHidden="0" w:uiPriority="66" w:unhideWhenUsed="0"/>
+    <w:lsdException w:name="Medium Grid 1" w:semiHidden="0" w:uiPriority="67" w:unhideWhenUsed="0"/>
+    <w:lsdException w:name="Medium Grid 2" w:semiHidden="0" w:uiPriority="68" w:unhideWhenUsed="0"/>
+    <w:lsdException w:name="Medium Grid 3" w:semiHidden="0" w:uiPriority="69" w:unhideWhenUsed="0"/>
+    <w:lsdException w:name="Dark List" w:semiHidden="0" w:uiPriority="70" w:unhideWhenUsed="0"/>
+    <w:lsdException w:name="Colorful Shading" w:semiHidden="0" w:uiPriority="71" w:unhideWhenUsed="0"/>
+    <w:lsdException w:name="Colorful List" w:semiHidden="0" w:uiPriority="72" w:unhideWhenUsed="0"/>
+    <w:lsdException w:name="Colorful Grid" w:semiHidden="0" w:uiPriority="73" w:unhideWhenUsed="0"/>
+    <w:lsdException w:name="Light Shading Accent 1" w:semiHidden="0" w:uiPriority="60" w:unhideWhenUsed="0"/>
+    <w:lsdException w:name="Light List Accent 1" w:semiHidden="0" w:uiPriority="61" w:unhideWhenUsed="0"/>
+    <w:lsdException w:name="Light Grid Accent 1" w:semiHidden="0" w:uiPriority="62" w:unhideWhenUsed="0"/>
+    <w:lsdException w:name="Medium Shading 1 Accent 1" w:semiHidden="0" w:uiPriority="63" w:unhideWhenUsed="0"/>
+    <w:lsdException w:name="Medium Shading 2 Accent 1" w:semiHidden="0" w:uiPriority="64" w:unhideWhenUsed="0"/>
+    <w:lsdException w:name="Medium List 1 Accent 1" w:semiHidden="0" w:uiPriority="65" w:unhideWhenUsed="0"/>
+    <w:lsdException w:name="Revision" w:unhideWhenUsed="0"/>
+    <w:lsdException w:name="List Paragraph" w:semiHidden="0" w:uiPriority="34" w:unhideWhenUsed="0" w:qFormat="1"/>
+    <w:lsdException w:name="Quote" w:semiHidden="0" w:uiPriority="29" w:unhideWhenUsed="0" w:qFormat="1"/>
+    <w:lsdException w:name="Intense Quote" w:semiHidden="0" w:uiPriority="30" w:unhideWhenUsed="0" w:qFormat="1"/>
+    <w:lsdException w:name="Medium List 2 Accent 1" w:semiHidden="0" w:uiPriority="66" w:unhideWhenUsed="0"/>
+    <w:lsdException w:name="Medium Grid 1 Accent 1" w:semiHidden="0" w:uiPriority="67" w:unhideWhenUsed="0"/>
+    <w:lsdException w:name="Medium Grid 2 Accent 1" w:semiHidden="0" w:uiPriority="68" w:unhideWhenUsed="0"/>
+    <w:lsdException w:name="Medium Grid 3 Accent 1" w:semiHidden="0" w:uiPriority="69" w:unhideWhenUsed="0"/>
+    <w:lsdException w:name="Dark List Accent 1" w:semiHidden="0" w:uiPriority="70" w:unhideWhenUsed="0"/>
+    <w:lsdException w:name="Colorful Shading Accent 1" w:semiHidden="0" w:uiPriority="71" w:unhideWhenUsed="0"/>
+    <w:lsdException w:name="Colorful List Accent 1" w:semiHidden="0" w:uiPriority="72" w:unhideWhenUsed="0"/>
+    <w:lsdException w:name="Colorful Grid Accent 1" w:semiHidden="0" w:uiPriority="73" w:unhideWhenUsed="0"/>
+    <w:lsdException w:name="Light Shading Accent 2" w:semiHidden="0" w:uiPriority="60" w:unhideWhenUsed="0"/>
+    <w:lsdException w:name="Light List Accent 2" w:semiHidden="0" w:uiPriority="61" w:unhideWhenUsed="0"/>
+    <w:lsdException w:name="Light Grid Accent 2" w:semiHidden="0" w:uiPriority="62" w:unhideWhenUsed="0"/>
+    <w:lsdException w:name="Medium Shading 1 Accent 2" w:semiHidden="0" w:uiPriority="63" w:unhideWhenUsed="0"/>
+    <w:lsdException w:name="Medium Shading 2 Accent 2" w:semiHidden="0" w:uiPriority="64" w:unhideWhenUsed="0"/>
+    <w:lsdException w:name="Medium List 1 Accent 2" w:semiHidden="0" w:uiPriority="65" w:unhideWhenUsed="0"/>
+    <w:lsdException w:name="Medium List 2 Accent 2" w:semiHidden="0" w:uiPriority="66" w:unhideWhenUsed="0"/>
+    <w:lsdException w:name="Medium Grid 1 Accent 2" w:semiHidden="0" w:uiPriority="67" w:unhideWhenUsed="0"/>
+    <w:lsdException w:name="Medium Grid 2 Accent 2" w:semiHidden="0" w:uiPriority="68" w:unhideWhenUsed="0"/>
+    <w:lsdException w:name="Medium Grid 3 Accent 2" w:semiHidden="0" w:uiPriority="69" w:unhideWhenUsed="0"/>
+    <w:lsdException w:name="Dark List Accent 2" w:semiHidden="0" w:uiPriority="70" w:unhideWhenUsed="0"/>
+    <w:lsdException w:name="Colorful Shading Accent 2" w:semiHidden="0" w:uiPriority="71" w:unhideWhenUsed="0"/>
+    <w:lsdException w:name="Colorful List Accent 2" w:semiHidden="0" w:uiPriority="72" w:unhideWhenUsed="0"/>
+    <w:lsdException w:name="Colorful Grid Accent 2" w:semiHidden="0" w:uiPriority="73" w:unhideWhenUsed="0"/>
+    <w:lsdException w:name="Light Shading Accent 3" w:semiHidden="0" w:uiPriority="60" w:unhideWhenUsed="0"/>
+    <w:lsdException w:name="Light List Accent 3" w:semiHidden="0" w:uiPriority="61" w:unhideWhenUsed="0"/>
+    <w:lsdException w:name="Light Grid Accent 3" w:semiHidden="0" w:uiPriority="62" w:unhideWhenUsed="0"/>
+    <w:lsdException w:name="Medium Shading 1 Accent 3" w:semiHidden="0" w:uiPriority="63" w:unhideWhenUsed="0"/>
+    <w:lsdException w:name="Medium Shading 2 Accent 3" w:semiHidden="0" w:uiPriority="64" w:unhideWhenUsed="0"/>
+    <w:lsdException w:name="Medium List 1 Accent 3" w:semiHidden="0" w:uiPriority="65" w:unhideWhenUsed="0"/>
+    <w:lsdException w:name="Medium List 2 Accent 3" w:semiHidden="0" w:uiPriority="66" w:unhideWhenUsed="0"/>
+    <w:lsdException w:name="Medium Grid 1 Accent 3" w:semiHidden="0" w:uiPriority="67" w:unhideWhenUsed="0"/>
+    <w:lsdException w:name="Medium Grid 2 Accent 3" w:semiHidden="0" w:uiPriority="68" w:unhideWhenUsed="0"/>
+    <w:lsdException w:name="Medium Grid 3 Accent 3" w:semiHidden="0" w:uiPriority="69" w:unhideWhenUsed="0"/>
+    <w:lsdException w:name="Dark List Accent 3" w:semiHidden="0" w:uiPriority="70" w:unhideWhenUsed="0"/>
+    <w:lsdException w:name="Colorful Shading Accent 3" w:semiHidden="0" w:uiPriority="71" w:unhideWhenUsed="0"/>
+    <w:lsdException w:name="Colorful List Accent 3" w:semiHidden="0" w:uiPriority="72" w:unhideWhenUsed="0"/>
+    <w:lsdException w:name="Colorful Grid Accent 3" w:semiHidden="0" w:uiPriority="73" w:unhideWhenUsed="0"/>
+    <w:lsdException w:name="Light Shading Accent 4" w:semiHidden="0" w:uiPriority="60" w:unhideWhenUsed="0"/>
+    <w:lsdException w:name="Light List Accent 4" w:semiHidden="0" w:uiPriority="61" w:unhideWhenUsed="0"/>
+    <w:lsdException w:name="Light Grid Accent 4" w:semiHidden="0" w:uiPriority="62" w:unhideWhenUsed="0"/>
+    <w:lsdException w:name="Medium Shading 1 Accent 4" w:semiHidden="0" w:uiPriority="63" w:unhideWhenUsed="0"/>
+    <w:lsdException w:name="Medium Shading 2 Accent 4" w:semiHidden="0" w:uiPriority="64" w:unhideWhenUsed="0"/>
+    <w:lsdException w:name="Medium List 1 Accent 4" w:semiHidden="0" w:uiPriority="65" w:unhideWhenUsed="0"/>
+    <w:lsdException w:name="Medium List 2 Accent 4" w:semiHidden="0" w:uiPriority="66" w:unhideWhenUsed="0"/>
+    <w:lsdException w:name="Medium Grid 1 Accent 4" w:semiHidden="0" w:uiPriority="67" w:unhideWhenUsed="0"/>
+    <w:lsdException w:name="Medium Grid 2 Accent 4" w:semiHidden="0" w:uiPriority="68" w:unhideWhenUsed="0"/>
+    <w:lsdException w:name="Medium Grid 3 Accent 4" w:semiHidden="0" w:uiPriority="69" w:unhideWhenUsed="0"/>
+    <w:lsdException w:name="Dark List Accent 4" w:semiHidden="0" w:uiPriority="70" w:unhideWhenUsed="0"/>
+    <w:lsdException w:name="Colorful Shading Accent 4" w:semiHidden="0" w:uiPriority="71" w:unhideWhenUsed="0"/>
+    <w:lsdException w:name="Colorful List Accent 4" w:semiHidden="0" w:uiPriority="72" w:unhideWhenUsed="0"/>
+    <w:lsdException w:name="Colorful Grid Accent 4" w:semiHidden="0" w:uiPriority="73" w:unhideWhenUsed="0"/>
+    <w:lsdException w:name="Light Shading Accent 5" w:semiHidden="0" w:uiPriority="60" w:unhideWhenUsed="0"/>
+    <w:lsdException w:name="Light List Accent 5" w:semiHidden="0" w:uiPriority="61" w:unhideWhenUsed="0"/>
+    <w:lsdException w:name="Light Grid Accent 5" w:semiHidden="0" w:uiPriority="62" w:unhideWhenUsed="0"/>
+    <w:lsdException w:name="Medium Shading 1 Accent 5" w:semiHidden="0" w:uiPriority="63" w:unhideWhenUsed="0"/>
+    <w:lsdException w:name="Medium Shading 2 Accent 5" w:semiHidden="0" w:uiPriority="64" w:unhideWhenUsed="0"/>
+    <w:lsdException w:name="Medium List 1 Accent 5" w:semiHidden="0" w:uiPriority="65" w:unhideWhenUsed="0"/>
+    <w:lsdException w:name="Medium List 2 Accent 5" w:semiHidden="0" w:uiPriority="66" w:unhideWhenUsed="0"/>
+    <w:lsdException w:name="Medium Grid 1 Accent 5" w:semiHidden="0" w:uiPriority="67" w:unhideWhenUsed="0"/>
+    <w:lsdException w:name="Medium Grid 2 Accent 5" w:semiHidden="0" w:uiPriority="68" w:unhideWhenUsed="0"/>
+    <w:lsdException w:name="Medium Grid 3 Accent 5" w:semiHidden="0" w:uiPriority="69" w:unhideWhenUsed="0"/>
+    <w:lsdException w:name="Dark List Accent 5" w:semiHidden="0" w:uiPriority="70" w:unhideWhenUsed="0"/>
+    <w:lsdException w:name="Colorful Shading Accent 5" w:semiHidden="0" w:uiPriority="71" w:unhideWhenUsed="0"/>
+    <w:lsdException w:name="Colorful List Accent 5" w:semiHidden="0" w:uiPriority="72" w:unhideWhenUsed="0"/>
+    <w:lsdException w:name="Colorful Grid Accent 5" w:semiHidden="0" w:uiPriority="73" w:unhideWhenUsed="0"/>
+    <w:lsdException w:name="Light Shading Accent 6" w:semiHidden="0" w:uiPriority="60" w:unhideWhenUsed="0"/>
+    <w:lsdException w:name="Light List Accent 6" w:semiHidden="0" w:uiPriority="61" w:unhideWhenUsed="0"/>
+    <w:lsdException w:name="Light Grid Accent 6" w:semiHidden="0" w:uiPriority="62" w:unhideWhenUsed="0"/>
+    <w:lsdException w:name="Medium Shading 1 Accent 6" w:semiHidden="0" w:uiPriority="63" w:unhideWhenUsed="0"/>
+    <w:lsdException w:name="Medium Shading 2 Accent 6" w:semiHidden="0" w:uiPriority="64" w:unhideWhenUsed="0"/>
+    <w:lsdException w:name="Medium List 1 Accent 6" w:semiHidden="0" w:uiPriority="65" w:unhideWhenUsed="0"/>
+    <w:lsdException w:name="Medium List 2 Accent 6" w:semiHidden="0" w:uiPriority="66" w:unhideWhenUsed="0"/>
+    <w:lsdException w:name="Medium Grid 1 Accent 6" w:semiHidden="0" w:uiPriority="67" w:unhideWhenUsed="0"/>
+    <w:lsdException w:name="Medium Grid 2 Accent 6" w:semiHidden="0" w:uiPriority="68" w:unhideWhenUsed="0"/>
+    <w:lsdException w:name="Medium Grid 3 Accent 6" w:semiHidden="0" w:uiPriority="69" w:unhideWhenUsed="0"/>
+    <w:lsdException w:name="Dark List Accent 6" w:semiHidden="0" w:uiPriority="70" w:unhideWhenUsed="0"/>
+    <w:lsdException w:name="Colorful Shading Accent 6" w:semiHidden="0" w:uiPriority="71" w:unhideWhenUsed="0"/>
+    <w:lsdException w:name="Colorful List Accent 6" w:semiHidden="0" w:uiPriority="72" w:unhideWhenUsed="0"/>
+    <w:lsdException w:name="Colorful Grid Accent 6" w:semiHidden="0" w:uiPriority="73" w:unhideWhenUsed="0"/>
+    <w:lsdException w:name="Subtle Emphasis" w:semiHidden="0" w:uiPriority="19" w:unhideWhenUsed="0" w:qFormat="1"/>
+    <w:lsdException w:name="Intense Emphasis" w:semiHidden="0" w:uiPriority="21" w:unhideWhenUsed="0" w:qFormat="1"/>
+    <w:lsdException w:name="Subtle Reference" w:semiHidden="0" w:uiPriority="31" w:unhideWhenUsed="0" w:qFormat="1"/>
+    <w:lsdException w:name="Intense Reference" w:semiHidden="0" w:uiPriority="32" w:unhideWhenUsed="0" w:qFormat="1"/>
+    <w:lsdException w:name="Book Title" w:semiHidden="0" w:uiPriority="33" w:unhideWhenUsed="0" w:qFormat="1"/>
+    <w:lsdException w:name="Bibliography" w:uiPriority="37"/>
+    <w:lsdException w:name="TOC Heading" w:uiPriority="39" w:qFormat="1"/>
+  </w:latentStyles>
+  <w:style w:type="paragraph" w:default="1" w:styleId="Normal">
+    <w:name w:val="Normal"/>
+    <w:qFormat/>
+  </w:style>
+  <w:style w:type="paragraph" w:styleId="Ttulo1">
+    <w:name w:val="heading 1"/>
+    <w:basedOn w:val="Normal"/>
+    <w:next w:val="Normal"/>
+    <w:uiPriority w:val="9"/>
+    <w:qFormat/>
+    <w:pPr>
+      <w:keepNext/>
+      <w:keepLines/>
+      <w:spacing w:before="480" w:after="120"/>
+      <w:outlineLvl w:val="0"/>
+    </w:pPr>
+    <w:rPr>
+      <w:b/>
+      <w:bCs/>
+      <w:sz w:val="48"/>
+      <w:szCs w:val="48"/>
+    </w:rPr>
+  </w:style>
+  <w:style w:type="paragraph" w:styleId="Ttulo2">
+    <w:name w:val="heading 2"/>
+    <w:basedOn w:val="Normal"/>
+    <w:next w:val="Normal"/>
+    <w:uiPriority w:val="9"/>
+    <w:semiHidden/>
+    <w:unhideWhenUsed/>
+    <w:qFormat/>
+    <w:pPr>
+      <w:keepNext/>
+      <w:keepLines/>
+      <w:spacing w:before="360" w:after="80"/>
+      <w:outlineLvl w:val="1"/>
+    </w:pPr>
+    <w:rPr>
+      <w:b/>
+      <w:bCs/>
+      <w:sz w:val="36"/>
+      <w:szCs w:val="36"/>
+    </w:rPr>
+  </w:style>
+  <w:style w:type="paragraph" w:styleId="Ttulo3">
+    <w:name w:val="heading 3"/>
+    <w:basedOn w:val="Normal"/>
+    <w:next w:val="Normal"/>
+    <w:uiPriority w:val="9"/>
+    <w:semiHidden/>
+    <w:unhideWhenUsed/>
+    <w:qFormat/>
+    <w:pPr>
+      <w:keepNext/>
+      <w:keepLines/>
+      <w:spacing w:before="280" w:after="80"/>
+      <w:outlineLvl w:val="2"/>
+    </w:pPr>
+    <w:rPr>
+      <w:b/>
+      <w:bCs/>
+      <w:sz w:val="28"/>
+      <w:szCs w:val="28"/>
+    </w:rPr>
+  </w:style>
+  <w:style w:type="paragraph" w:styleId="Ttulo4">
+    <w:name w:val="heading 4"/>
+    <w:basedOn w:val="Normal"/>
+    <w:next w:val="Normal"/>
+    <w:uiPriority w:val="9"/>
+    <w:semiHidden/>
+    <w:unhideWhenUsed/>
+    <w:qFormat/>
+    <w:pPr>
+      <w:keepNext/>
+      <w:keepLines/>
+      <w:spacing w:before="240" w:after="40"/>
+      <w:outlineLvl w:val="3"/>
+    </w:pPr>
+    <w:rPr>
+      <w:b/>
+      <w:bCs/>
+    </w:rPr>
+  </w:style>
+  <w:style w:type="paragraph" w:styleId="Ttulo5">
+    <w:name w:val="heading 5"/>
+    <w:basedOn w:val="Normal"/>
+    <w:next w:val="Normal"/>
+    <w:uiPriority w:val="9"/>
+    <w:semiHidden/>
+    <w:unhideWhenUsed/>
+    <w:qFormat/>
+    <w:pPr>
+      <w:keepNext/>
+      <w:keepLines/>
+      <w:spacing w:before="220" w:after="40"/>
+      <w:outlineLvl w:val="4"/>
+    </w:pPr>
+    <w:rPr>
+      <w:b/>
+      <w:bCs/>
+      <w:sz w:val="22"/>
+      <w:szCs w:val="22"/>
+    </w:rPr>
+  </w:style>
+  <w:style w:type="paragraph" w:styleId="Ttulo6">
+    <w:name w:val="heading 6"/>
+    <w:basedOn w:val="Normal"/>
+    <w:next w:val="Normal"/>
+    <w:uiPriority w:val="9"/>
+    <w:semiHidden/>
+    <w:unhideWhenUsed/>
+    <w:qFormat/>
+    <w:pPr>
+      <w:keepNext/>
+      <w:keepLines/>
+      <w:spacing w:before="200" w:after="40"/>
+      <w:outlineLvl w:val="5"/>
+    </w:pPr>
+    <w:rPr>
+      <w:b/>
+      <w:bCs/>
+      <w:sz w:val="20"/>
+      <w:szCs w:val="20"/>
+    </w:rPr>
+  </w:style>
+  <w:style w:type="character" w:default="1" w:styleId="Fontepargpadro">
+    <w:name w:val="Default Paragraph Font"/>
+    <w:uiPriority w:val="1"/>
+    <w:semiHidden/>
+    <w:unhideWhenUsed/>
+  </w:style>
+  <w:style w:type="table" w:default="1" w:styleId="Tabelanormal">
+    <w:name w:val="Normal Table"/>
+    <w:uiPriority w:val="99"/>
+    <w:semiHidden/>
+    <w:unhideWhenUsed/>
+    <w:tblPr>
+      <w:tblInd w:w="0" w:type="dxa"/>
+      <w:tblCellMar>
+        <w:top w:w="0" w:type="dxa"/>
+        <w:left w:w="108" w:type="dxa"/>
+        <w:bottom w:w="0" w:type="dxa"/>
+        <w:right w:w="108" w:type="dxa"/>
+      </w:tblCellMar>
+    </w:tblPr>
+  </w:style>
+  <w:style w:type="numbering" w:default="1" w:styleId="Semlista">
+    <w:name w:val="No List"/>
+    <w:uiPriority w:val="99"/>
+    <w:semiHidden/>
+    <w:unhideWhenUsed/>
+  </w:style>
+  <w:style w:type="table" w:customStyle="1" w:styleId="TableNormal">
+    <w:name w:val="TableNormal"/>
+    <w:tblPr>
+      <w:tblCellMar>
+        <w:top w:w="100" w:type="dxa"/>
+        <w:left w:w="100" w:type="dxa"/>
+        <w:bottom w:w="100" w:type="dxa"/>
+        <w:right w:w="100" w:type="dxa"/>
+      </w:tblCellMar>
+    </w:tblPr>
+  </w:style>
+  <w:style w:type="paragraph" w:styleId="Ttulo">
+    <w:name w:val="Title"/>
+    <w:basedOn w:val="Normal"/>
+    <w:next w:val="Normal"/>
+    <w:uiPriority w:val="10"/>
+    <w:qFormat/>
+    <w:pPr>
+      <w:keepNext/>
+      <w:keepLines/>
+      <w:spacing w:before="480" w:after="120"/>
+    </w:pPr>
+    <w:rPr>
+      <w:b/>
+      <w:bCs/>
+      <w:sz w:val="72"/>
+      <w:szCs w:val="72"/>
+    </w:rPr>
+  </w:style>
+  <w:style w:type="paragraph" w:styleId="Subttulo">
+    <w:name w:val="Subtitle"/>
+    <w:basedOn w:val="Normal"/>
+    <w:next w:val="Normal"/>
+    <w:uiPriority w:val="11"/>
+    <w:qFormat/>
+    <w:pPr>
+      <w:keepNext/>
+      <w:keepLines/>
+      <w:spacing w:before="360" w:after="80"/>
+    </w:pPr>
+    <w:rPr>
+      <w:rFonts w:ascii="Georgia" w:eastAsia="Georgia" w:hAnsi="Georgia" w:cs="Georgia"/>
+      <w:i/>
+      <w:iCs/>
+      <w:color w:val="666666"/>
+      <w:sz w:val="48"/>
+      <w:szCs w:val="48"/>
+    </w:rPr>
+  </w:style>
+  <w:style w:type="table" w:customStyle="1" w:styleId="a">
+    <w:basedOn w:val="TableNormal"/>
+    <w:tblPr>
+      <w:tblStyleRowBandSize w:val="1"/>
+      <w:tblStyleColBandSize w:val="1"/>
+      <w:tblCellMar>
+        <w:top w:w="0" w:type="dxa"/>
+        <w:left w:w="108" w:type="dxa"/>
+        <w:bottom w:w="0" w:type="dxa"/>
+        <w:right w:w="108" w:type="dxa"/>
+      </w:tblCellMar>
+    </w:tblPr>
+  </w:style>
+  <w:style w:type="table" w:customStyle="1" w:styleId="a0">
+    <w:basedOn w:val="TableNormal"/>
+    <w:tblPr>
+      <w:tblStyleRowBandSize w:val="1"/>
+      <w:tblStyleColBandSize w:val="1"/>
+      <w:tblCellMar>
+        <w:top w:w="0" w:type="dxa"/>
+        <w:left w:w="108" w:type="dxa"/>
+        <w:bottom w:w="0" w:type="dxa"/>
+        <w:right w:w="108" w:type="dxa"/>
+      </w:tblCellMar>
+    </w:tblPr>
+  </w:style>
+  <w:style w:type="paragraph" w:styleId="Textodebalo">
+    <w:name w:val="Balloon Text"/>
+    <w:basedOn w:val="Normal"/>
+    <w:link w:val="TextodebaloChar"/>
+    <w:uiPriority w:val="99"/>
+    <w:semiHidden/>
+    <w:unhideWhenUsed/>
+    <w:rsid w:val="00B808CD"/>
+    <w:pPr>
+      <w:spacing w:after="0" w:line="240" w:lineRule="auto"/>
+    </w:pPr>
+    <w:rPr>
+      <w:rFonts w:ascii="Tahoma" w:hAnsi="Tahoma" w:cs="Tahoma"/>
+      <w:sz w:val="16"/>
+      <w:szCs w:val="16"/>
+    </w:rPr>
+  </w:style>
+  <w:style w:type="character" w:customStyle="1" w:styleId="TextodebaloChar">
+    <w:name w:val="Texto de balão Char"/>
+    <w:basedOn w:val="Fontepargpadro"/>
+    <w:link w:val="Textodebalo"/>
+    <w:uiPriority w:val="99"/>
+    <w:semiHidden/>
+    <w:rsid w:val="00B808CD"/>
+    <w:rPr>
+      <w:rFonts w:ascii="Tahoma" w:hAnsi="Tahoma" w:cs="Tahoma"/>
+      <w:sz w:val="16"/>
+      <w:szCs w:val="16"/>
+    </w:rPr>
+  </w:style>
+  <w:style w:type="table" w:styleId="Tabelacomgrade">
+    <w:name w:val="Table Grid"/>
+    <w:basedOn w:val="Tabelanormal"/>
+    <w:uiPriority w:val="39"/>
+    <w:rsid w:val="002757AB"/>
+    <w:pPr>
+      <w:spacing w:after="0" w:line="240" w:lineRule="auto"/>
+    </w:pPr>
+    <w:tblPr>
+      <w:tblInd w:w="0" w:type="dxa"/>
+      <w:tblBorders>
+        <w:top w:val="single" w:sz="4" w:space="0" w:color="auto"/>
+        <w:left w:val="single" w:sz="4" w:space="0" w:color="auto"/>
+        <w:bottom w:val="single" w:sz="4" w:space="0" w:color="auto"/>
+        <w:right w:val="single" w:sz="4" w:space="0" w:color="auto"/>
+        <w:insideH w:val="single" w:sz="4" w:space="0" w:color="auto"/>
+        <w:insideV w:val="single" w:sz="4" w:space="0" w:color="auto"/>
+      </w:tblBorders>
+      <w:tblCellMar>
+        <w:top w:w="0" w:type="dxa"/>
+        <w:left w:w="108" w:type="dxa"/>
+        <w:bottom w:w="0" w:type="dxa"/>
+        <w:right w:w="108" w:type="dxa"/>
+      </w:tblCellMar>
     </w:tblPr>
   </w:style>
   <w:style w:type="character" w:customStyle="1" w:styleId="citation-150">
@@ -8286,7 +8628,7 @@
 </file>
 
 <file path=customXml/itemProps1.xml><?xml version="1.0" encoding="utf-8"?>
-<ds:datastoreItem xmlns:ds="http://schemas.openxmlformats.org/officeDocument/2006/customXml" ds:itemID="{B8BAE98A-D240-461B-B040-D3F1B36F404F}">
+<ds:datastoreItem xmlns:ds="http://schemas.openxmlformats.org/officeDocument/2006/customXml" ds:itemID="{8FBD6257-1717-489A-86F0-B8B9FBC0C903}">
   <ds:schemaRefs>
     <ds:schemaRef ds:uri="http://schemas.openxmlformats.org/officeDocument/2006/bibliography"/>
   </ds:schemaRefs>

</xml_diff>

<commit_message>
docs: inserindo lista de figuras no pid
</commit_message>
<xml_diff>
--- a/PID_Relatório_5o_e_6o.Períodos_2026.docx
+++ b/PID_Relatório_5o_e_6o.Períodos_2026.docx
@@ -1,6 +1,6 @@
 
 <file path=word/document.xml><?xml version="1.0" encoding="utf-8"?>
-<w:document xmlns:wpc="http://schemas.microsoft.com/office/word/2010/wordprocessingCanvas" xmlns:mc="http://schemas.openxmlformats.org/markup-compatibility/2006" xmlns:o="urn:schemas-microsoft-com:office:office" xmlns:r="http://schemas.openxmlformats.org/officeDocument/2006/relationships" xmlns:m="http://schemas.openxmlformats.org/officeDocument/2006/math" xmlns:v="urn:schemas-microsoft-com:vml" xmlns:wp14="http://schemas.microsoft.com/office/word/2010/wordprocessingDrawing" xmlns:wp="http://schemas.openxmlformats.org/drawingml/2006/wordprocessingDrawing" xmlns:w10="urn:schemas-microsoft-com:office:word" xmlns:w="http://schemas.openxmlformats.org/wordprocessingml/2006/main" xmlns:w14="http://schemas.microsoft.com/office/word/2010/wordml" xmlns:wpg="http://schemas.microsoft.com/office/word/2010/wordprocessingGroup" xmlns:wpi="http://schemas.microsoft.com/office/word/2010/wordprocessingInk" xmlns:wne="http://schemas.microsoft.com/office/word/2006/wordml" xmlns:wps="http://schemas.microsoft.com/office/word/2010/wordprocessingShape" mc:Ignorable="w14 wp14">
+<w:document xmlns:wpc="http://schemas.microsoft.com/office/word/2010/wordprocessingCanvas" xmlns:cx="http://schemas.microsoft.com/office/drawing/2014/chartex" xmlns:mc="http://schemas.openxmlformats.org/markup-compatibility/2006" xmlns:o="urn:schemas-microsoft-com:office:office" xmlns:r="http://schemas.openxmlformats.org/officeDocument/2006/relationships" xmlns:m="http://schemas.openxmlformats.org/officeDocument/2006/math" xmlns:v="urn:schemas-microsoft-com:vml" xmlns:wp14="http://schemas.microsoft.com/office/word/2010/wordprocessingDrawing" xmlns:wp="http://schemas.openxmlformats.org/drawingml/2006/wordprocessingDrawing" xmlns:w10="urn:schemas-microsoft-com:office:word" xmlns:w="http://schemas.openxmlformats.org/wordprocessingml/2006/main" xmlns:w14="http://schemas.microsoft.com/office/word/2010/wordml" xmlns:w15="http://schemas.microsoft.com/office/word/2012/wordml" xmlns:w16se="http://schemas.microsoft.com/office/word/2015/wordml/symex" xmlns:wpg="http://schemas.microsoft.com/office/word/2010/wordprocessingGroup" xmlns:wpi="http://schemas.microsoft.com/office/word/2010/wordprocessingInk" xmlns:wne="http://schemas.microsoft.com/office/word/2006/wordml" xmlns:wps="http://schemas.microsoft.com/office/word/2010/wordprocessingShape" mc:Ignorable="w14 w15 w16se wp14">
   <w:body>
     <w:p>
       <w:pPr>
@@ -1187,15 +1187,7 @@
         <w:jc w:val="both"/>
       </w:pPr>
       <w:r>
-        <w:t xml:space="preserve">Com o aumento do envelhecimento da população nas últimas décadas, houve dificuldades para os familiares na organização das atividades diárias e no acompanhamento adequado da rotina de cuidado, necessitando do auxílio de cuidadores especializados. Devido à dificuldade de encontrar cuidadores confiáveis, o </w:t>
-      </w:r>
-      <w:proofErr w:type="spellStart"/>
-      <w:r>
-        <w:t>ElderConnect</w:t>
-      </w:r>
-      <w:proofErr w:type="spellEnd"/>
-      <w:r>
-        <w:t xml:space="preserve"> foi criado com o objetivo de auxiliar na conexão entre cuidadores e familiares, além de contribuir para o gerenciamento das atividades de cuidado. </w:t>
+        <w:t xml:space="preserve">Com o aumento do envelhecimento da população nas últimas décadas, houve dificuldades para os familiares na organização das atividades diárias e no acompanhamento adequado da rotina de cuidado, necessitando do auxílio de cuidadores especializados. Devido à dificuldade de encontrar cuidadores confiáveis, o ElderConnect foi criado com o objetivo de auxiliar na conexão entre cuidadores e familiares, além de contribuir para o gerenciamento das atividades de cuidado. </w:t>
       </w:r>
       <w:r>
         <w:t>A metodologia adotada consiste em</w:t>
@@ -1208,6 +1200,9 @@
       </w:r>
     </w:p>
     <w:p>
+      <w:pPr>
+        <w:jc w:val="center"/>
+      </w:pPr>
       <w:r>
         <w:rPr>
           <w:b/>
@@ -1314,13 +1309,13 @@
               </wp:anchor>
             </w:drawing>
           </mc:Choice>
-          <mc:Fallback xmlns:w16se="http://schemas.microsoft.com/office/word/2015/wordml/symex" xmlns:w16sdtfl="http://schemas.microsoft.com/office/word/2024/wordml/sdtformatlock" xmlns:w16sdtdh="http://schemas.microsoft.com/office/word/2020/wordml/sdtdatahash" xmlns:w16du="http://schemas.microsoft.com/office/word/2023/wordml/word16du" xmlns:w16="http://schemas.microsoft.com/office/word/2018/wordml" xmlns:w16cid="http://schemas.microsoft.com/office/word/2016/wordml/cid" xmlns:w16cex="http://schemas.microsoft.com/office/word/2018/wordml/cex" xmlns:w15="http://schemas.microsoft.com/office/word/2012/wordml" xmlns:oel="http://schemas.microsoft.com/office/2019/extlst" xmlns:am3d="http://schemas.microsoft.com/office/drawing/2017/model3d" xmlns:aink="http://schemas.microsoft.com/office/drawing/2016/ink" xmlns:cx8="http://schemas.microsoft.com/office/drawing/2016/5/14/chartex" xmlns:cx7="http://schemas.microsoft.com/office/drawing/2016/5/13/chartex" xmlns:cx6="http://schemas.microsoft.com/office/drawing/2016/5/12/chartex" xmlns:cx5="http://schemas.microsoft.com/office/drawing/2016/5/11/chartex" xmlns:cx4="http://schemas.microsoft.com/office/drawing/2016/5/10/chartex" xmlns:cx3="http://schemas.microsoft.com/office/drawing/2016/5/9/chartex" xmlns:cx2="http://schemas.microsoft.com/office/drawing/2015/10/21/chartex" xmlns:cx1="http://schemas.microsoft.com/office/drawing/2015/9/8/chartex" xmlns:cx="http://schemas.microsoft.com/office/drawing/2014/chartex">
+          <mc:Fallback>
             <w:pict>
               <v:shapetype w14:anchorId="7018CBA8" id="_x0000_t202" coordsize="21600,21600" o:spt="202" path="m,l,21600r21600,l21600,xe">
                 <v:stroke joinstyle="miter"/>
                 <v:path gradientshapeok="t" o:connecttype="rect"/>
               </v:shapetype>
-              <v:shape id="Caixa de Texto 1" o:spid="_x0000_s1026" type="#_x0000_t202" style="position:absolute;margin-left:445pt;margin-top:-47.6pt;width:10pt;height:13.6pt;z-index:251658240;visibility:visible;mso-wrap-style:square;mso-wrap-distance-left:9pt;mso-wrap-distance-top:0;mso-wrap-distance-right:9pt;mso-wrap-distance-bottom:0;mso-position-horizontal:absolute;mso-position-horizontal-relative:text;mso-position-vertical:absolute;mso-position-vertical-relative:text;v-text-anchor:top" o:gfxdata="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" stroked="f">
+              <v:shape id="Caixa de Texto 1" o:spid="_x0000_s1026" type="#_x0000_t202" style="position:absolute;left:0;text-align:left;margin-left:445pt;margin-top:-47.6pt;width:10pt;height:13.6pt;z-index:251658240;visibility:visible;mso-wrap-style:square;mso-wrap-distance-left:9pt;mso-wrap-distance-top:0;mso-wrap-distance-right:9pt;mso-wrap-distance-bottom:0;mso-position-horizontal:absolute;mso-position-horizontal-relative:text;mso-position-vertical:absolute;mso-position-vertical-relative:text;v-text-anchor:top" o:gfxdata="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" stroked="f">
                 <v:textbox>
                   <w:txbxContent>
                     <w:p>
@@ -1359,6 +1354,364 @@
     </w:p>
     <w:p>
       <w:pPr>
+        <w:pStyle w:val="ndicedeilustraes"/>
+        <w:tabs>
+          <w:tab w:val="right" w:leader="dot" w:pos="9062"/>
+        </w:tabs>
+        <w:rPr>
+          <w:noProof/>
+        </w:rPr>
+      </w:pPr>
+      <w:r>
+        <w:rPr>
+          <w:color w:val="0070C0"/>
+        </w:rPr>
+        <w:fldChar w:fldCharType="begin"/>
+      </w:r>
+      <w:r>
+        <w:rPr>
+          <w:color w:val="0070C0"/>
+        </w:rPr>
+        <w:instrText xml:space="preserve"> TOC \h \z \c "Figura" </w:instrText>
+      </w:r>
+      <w:r>
+        <w:rPr>
+          <w:color w:val="0070C0"/>
+        </w:rPr>
+        <w:fldChar w:fldCharType="separate"/>
+      </w:r>
+      <w:hyperlink w:anchor="_Toc238883409" w:history="1">
+        <w:r>
+          <w:rPr>
+            <w:rStyle w:val="Hyperlink"/>
+            <w:noProof/>
+          </w:rPr>
+          <w:t>FIGURA 1 - Diagrama de Pacotes da Backend</w:t>
+        </w:r>
+        <w:r>
+          <w:rPr>
+            <w:noProof/>
+            <w:webHidden/>
+          </w:rPr>
+          <w:tab/>
+        </w:r>
+        <w:r>
+          <w:rPr>
+            <w:noProof/>
+            <w:webHidden/>
+          </w:rPr>
+          <w:fldChar w:fldCharType="begin"/>
+        </w:r>
+        <w:r>
+          <w:rPr>
+            <w:noProof/>
+            <w:webHidden/>
+          </w:rPr>
+          <w:instrText xml:space="preserve"> PAGEREF _Toc238883409 \h </w:instrText>
+        </w:r>
+        <w:r>
+          <w:rPr>
+            <w:noProof/>
+            <w:webHidden/>
+          </w:rPr>
+        </w:r>
+        <w:r>
+          <w:rPr>
+            <w:noProof/>
+            <w:webHidden/>
+          </w:rPr>
+          <w:fldChar w:fldCharType="separate"/>
+        </w:r>
+        <w:r>
+          <w:rPr>
+            <w:noProof/>
+            <w:webHidden/>
+          </w:rPr>
+          <w:t>22</w:t>
+        </w:r>
+        <w:r>
+          <w:rPr>
+            <w:noProof/>
+            <w:webHidden/>
+          </w:rPr>
+          <w:fldChar w:fldCharType="end"/>
+        </w:r>
+      </w:hyperlink>
+    </w:p>
+    <w:p>
+      <w:pPr>
+        <w:pStyle w:val="ndicedeilustraes"/>
+        <w:tabs>
+          <w:tab w:val="right" w:leader="dot" w:pos="9062"/>
+        </w:tabs>
+        <w:rPr>
+          <w:noProof/>
+        </w:rPr>
+      </w:pPr>
+      <w:hyperlink w:anchor="_Toc238883410" w:history="1">
+        <w:r>
+          <w:rPr>
+            <w:rStyle w:val="Hyperlink"/>
+            <w:noProof/>
+          </w:rPr>
+          <w:t>FIGURA 2 - Diagrama de Pacotes do Frontend</w:t>
+        </w:r>
+        <w:r>
+          <w:rPr>
+            <w:noProof/>
+            <w:webHidden/>
+          </w:rPr>
+          <w:tab/>
+        </w:r>
+        <w:r>
+          <w:rPr>
+            <w:noProof/>
+            <w:webHidden/>
+          </w:rPr>
+          <w:fldChar w:fldCharType="begin"/>
+        </w:r>
+        <w:r>
+          <w:rPr>
+            <w:noProof/>
+            <w:webHidden/>
+          </w:rPr>
+          <w:instrText xml:space="preserve"> PAGEREF _Toc238883410 \h </w:instrText>
+        </w:r>
+        <w:r>
+          <w:rPr>
+            <w:noProof/>
+            <w:webHidden/>
+          </w:rPr>
+        </w:r>
+        <w:r>
+          <w:rPr>
+            <w:noProof/>
+            <w:webHidden/>
+          </w:rPr>
+          <w:fldChar w:fldCharType="separate"/>
+        </w:r>
+        <w:r>
+          <w:rPr>
+            <w:noProof/>
+            <w:webHidden/>
+          </w:rPr>
+          <w:t>23</w:t>
+        </w:r>
+        <w:r>
+          <w:rPr>
+            <w:noProof/>
+            <w:webHidden/>
+          </w:rPr>
+          <w:fldChar w:fldCharType="end"/>
+        </w:r>
+      </w:hyperlink>
+    </w:p>
+    <w:p>
+      <w:pPr>
+        <w:pStyle w:val="ndicedeilustraes"/>
+        <w:tabs>
+          <w:tab w:val="right" w:leader="dot" w:pos="9062"/>
+        </w:tabs>
+        <w:rPr>
+          <w:noProof/>
+        </w:rPr>
+      </w:pPr>
+      <w:hyperlink w:anchor="_Toc238883411" w:history="1">
+        <w:r>
+          <w:rPr>
+            <w:rStyle w:val="Hyperlink"/>
+            <w:noProof/>
+          </w:rPr>
+          <w:t>FIGURA 3 - Diagrama de Classe de Negócios</w:t>
+        </w:r>
+        <w:r>
+          <w:rPr>
+            <w:noProof/>
+            <w:webHidden/>
+          </w:rPr>
+          <w:tab/>
+        </w:r>
+        <w:r>
+          <w:rPr>
+            <w:noProof/>
+            <w:webHidden/>
+          </w:rPr>
+          <w:fldChar w:fldCharType="begin"/>
+        </w:r>
+        <w:r>
+          <w:rPr>
+            <w:noProof/>
+            <w:webHidden/>
+          </w:rPr>
+          <w:instrText xml:space="preserve"> PAGEREF _Toc238883411 \h </w:instrText>
+        </w:r>
+        <w:r>
+          <w:rPr>
+            <w:noProof/>
+            <w:webHidden/>
+          </w:rPr>
+        </w:r>
+        <w:r>
+          <w:rPr>
+            <w:noProof/>
+            <w:webHidden/>
+          </w:rPr>
+          <w:fldChar w:fldCharType="separate"/>
+        </w:r>
+        <w:r>
+          <w:rPr>
+            <w:noProof/>
+            <w:webHidden/>
+          </w:rPr>
+          <w:t>24</w:t>
+        </w:r>
+        <w:r>
+          <w:rPr>
+            <w:noProof/>
+            <w:webHidden/>
+          </w:rPr>
+          <w:fldChar w:fldCharType="end"/>
+        </w:r>
+      </w:hyperlink>
+    </w:p>
+    <w:p>
+      <w:pPr>
+        <w:pStyle w:val="ndicedeilustraes"/>
+        <w:tabs>
+          <w:tab w:val="right" w:leader="dot" w:pos="9062"/>
+        </w:tabs>
+        <w:rPr>
+          <w:noProof/>
+        </w:rPr>
+      </w:pPr>
+      <w:hyperlink w:anchor="_Toc238883412" w:history="1">
+        <w:r>
+          <w:rPr>
+            <w:rStyle w:val="Hyperlink"/>
+            <w:noProof/>
+          </w:rPr>
+          <w:t>FIGURA 4 - Diagrama de Sequência do cenário principal</w:t>
+        </w:r>
+        <w:r>
+          <w:rPr>
+            <w:noProof/>
+            <w:webHidden/>
+          </w:rPr>
+          <w:tab/>
+        </w:r>
+        <w:r>
+          <w:rPr>
+            <w:noProof/>
+            <w:webHidden/>
+          </w:rPr>
+          <w:fldChar w:fldCharType="begin"/>
+        </w:r>
+        <w:r>
+          <w:rPr>
+            <w:noProof/>
+            <w:webHidden/>
+          </w:rPr>
+          <w:instrText xml:space="preserve"> PAGEREF _Toc238883412 \h </w:instrText>
+        </w:r>
+        <w:r>
+          <w:rPr>
+            <w:noProof/>
+            <w:webHidden/>
+          </w:rPr>
+        </w:r>
+        <w:r>
+          <w:rPr>
+            <w:noProof/>
+            <w:webHidden/>
+          </w:rPr>
+          <w:fldChar w:fldCharType="separate"/>
+        </w:r>
+        <w:r>
+          <w:rPr>
+            <w:noProof/>
+            <w:webHidden/>
+          </w:rPr>
+          <w:t>25</w:t>
+        </w:r>
+        <w:r>
+          <w:rPr>
+            <w:noProof/>
+            <w:webHidden/>
+          </w:rPr>
+          <w:fldChar w:fldCharType="end"/>
+        </w:r>
+      </w:hyperlink>
+    </w:p>
+    <w:p>
+      <w:pPr>
+        <w:pStyle w:val="ndicedeilustraes"/>
+        <w:tabs>
+          <w:tab w:val="right" w:leader="dot" w:pos="9062"/>
+        </w:tabs>
+        <w:rPr>
+          <w:noProof/>
+        </w:rPr>
+      </w:pPr>
+      <w:hyperlink w:anchor="_Toc238883413" w:history="1">
+        <w:r>
+          <w:rPr>
+            <w:rStyle w:val="Hyperlink"/>
+            <w:noProof/>
+          </w:rPr>
+          <w:t>FIGURA 5 - Diagrama de Sequência do cenário alternativo</w:t>
+        </w:r>
+        <w:r>
+          <w:rPr>
+            <w:noProof/>
+            <w:webHidden/>
+          </w:rPr>
+          <w:tab/>
+        </w:r>
+        <w:r>
+          <w:rPr>
+            <w:noProof/>
+            <w:webHidden/>
+          </w:rPr>
+          <w:fldChar w:fldCharType="begin"/>
+        </w:r>
+        <w:r>
+          <w:rPr>
+            <w:noProof/>
+            <w:webHidden/>
+          </w:rPr>
+          <w:instrText xml:space="preserve"> PAGEREF _Toc238883413 \h </w:instrText>
+        </w:r>
+        <w:r>
+          <w:rPr>
+            <w:noProof/>
+            <w:webHidden/>
+          </w:rPr>
+        </w:r>
+        <w:r>
+          <w:rPr>
+            <w:noProof/>
+            <w:webHidden/>
+          </w:rPr>
+          <w:fldChar w:fldCharType="separate"/>
+        </w:r>
+        <w:r>
+          <w:rPr>
+            <w:noProof/>
+            <w:webHidden/>
+          </w:rPr>
+          <w:t>26</w:t>
+        </w:r>
+        <w:r>
+          <w:rPr>
+            <w:noProof/>
+            <w:webHidden/>
+          </w:rPr>
+          <w:fldChar w:fldCharType="end"/>
+        </w:r>
+      </w:hyperlink>
+    </w:p>
+    <w:p>
+      <w:pPr>
         <w:spacing w:before="120" w:after="120"/>
         <w:jc w:val="both"/>
         <w:rPr>
@@ -1369,19 +1722,8 @@
         <w:rPr>
           <w:color w:val="0070C0"/>
         </w:rPr>
-        <w:t>Após inserir as figuras nas seções do documento, atualize esta lista com a tecla F9 (faça a geração automática da lista com a numeração indicada).</w:t>
-      </w:r>
-    </w:p>
-    <w:p>
-      <w:pPr>
-        <w:spacing w:before="120" w:after="120"/>
-        <w:jc w:val="both"/>
-        <w:rPr>
-          <w:color w:val="0070C0"/>
-        </w:rPr>
-      </w:pPr>
-      <w:bookmarkStart w:id="1" w:name="_GoBack"/>
-      <w:bookmarkEnd w:id="1"/>
+        <w:fldChar w:fldCharType="end"/>
+      </w:r>
     </w:p>
     <w:p>
       <w:pPr>
@@ -1505,33 +1847,8 @@
                 <w:i/>
                 <w:iCs/>
               </w:rPr>
-              <w:t xml:space="preserve">Java Standard </w:t>
-            </w:r>
-            <w:proofErr w:type="spellStart"/>
-            <w:r>
-              <w:rPr>
-                <w:i/>
-                <w:iCs/>
-              </w:rPr>
-              <w:t>Runtime</w:t>
-            </w:r>
-            <w:proofErr w:type="spellEnd"/>
-            <w:r>
-              <w:rPr>
-                <w:i/>
-                <w:iCs/>
-              </w:rPr>
-              <w:t xml:space="preserve"> </w:t>
-            </w:r>
-            <w:proofErr w:type="spellStart"/>
-            <w:r>
-              <w:rPr>
-                <w:i/>
-                <w:iCs/>
-              </w:rPr>
-              <w:t>Environment</w:t>
-            </w:r>
-            <w:proofErr w:type="spellEnd"/>
+              <w:t>Java Standard Runtime Environment</w:t>
+            </w:r>
           </w:p>
         </w:tc>
       </w:tr>
@@ -1559,31 +1876,13 @@
               <w:spacing w:before="120" w:after="120"/>
               <w:jc w:val="both"/>
             </w:pPr>
-            <w:proofErr w:type="spellStart"/>
             <w:r>
               <w:rPr>
                 <w:i/>
                 <w:iCs/>
               </w:rPr>
-              <w:t>Random</w:t>
-            </w:r>
-            <w:proofErr w:type="spellEnd"/>
-            <w:r>
-              <w:rPr>
-                <w:i/>
-                <w:iCs/>
-              </w:rPr>
-              <w:t xml:space="preserve"> Access </w:t>
-            </w:r>
-            <w:proofErr w:type="spellStart"/>
-            <w:r>
-              <w:rPr>
-                <w:i/>
-                <w:iCs/>
-              </w:rPr>
-              <w:t>Memory</w:t>
-            </w:r>
-            <w:proofErr w:type="spellEnd"/>
+              <w:t>Random Access Memory</w:t>
+            </w:r>
           </w:p>
         </w:tc>
       </w:tr>
@@ -1671,47 +1970,13 @@
               <w:spacing w:before="120" w:after="120"/>
               <w:jc w:val="both"/>
             </w:pPr>
-            <w:proofErr w:type="spellStart"/>
             <w:r>
               <w:rPr>
                 <w:i/>
                 <w:iCs/>
               </w:rPr>
-              <w:t>Unified</w:t>
-            </w:r>
-            <w:proofErr w:type="spellEnd"/>
-            <w:r>
-              <w:rPr>
-                <w:i/>
-                <w:iCs/>
-              </w:rPr>
-              <w:t xml:space="preserve"> </w:t>
-            </w:r>
-            <w:proofErr w:type="spellStart"/>
-            <w:r>
-              <w:rPr>
-                <w:i/>
-                <w:iCs/>
-              </w:rPr>
-              <w:t>Modeling</w:t>
-            </w:r>
-            <w:proofErr w:type="spellEnd"/>
-            <w:r>
-              <w:rPr>
-                <w:i/>
-                <w:iCs/>
-              </w:rPr>
-              <w:t xml:space="preserve"> </w:t>
-            </w:r>
-            <w:proofErr w:type="spellStart"/>
-            <w:r>
-              <w:rPr>
-                <w:i/>
-                <w:iCs/>
-              </w:rPr>
-              <w:t>Language</w:t>
-            </w:r>
-            <w:proofErr w:type="spellEnd"/>
+              <w:t>Unified Modeling Language</w:t>
+            </w:r>
           </w:p>
         </w:tc>
       </w:tr>
@@ -1720,21 +1985,6 @@
       <w:pPr>
         <w:spacing w:before="120" w:after="120"/>
       </w:pPr>
-    </w:p>
-    <w:p>
-      <w:pPr>
-        <w:spacing w:before="120" w:after="120"/>
-        <w:jc w:val="both"/>
-        <w:rPr>
-          <w:color w:val="0070C0"/>
-        </w:rPr>
-      </w:pPr>
-      <w:r>
-        <w:rPr>
-          <w:color w:val="0070C0"/>
-        </w:rPr>
-        <w:t>Adicione aqui as demais siglas usadas em seu documento, sempre mantendo a ordem alfabética.</w:t>
-      </w:r>
     </w:p>
     <w:p>
       <w:pPr>
@@ -2789,9 +3039,9 @@
         <w:spacing w:before="120" w:after="120"/>
         <w:jc w:val="both"/>
         <w:sectPr>
-          <w:headerReference w:type="even" r:id="rId9"/>
-          <w:headerReference w:type="default" r:id="rId10"/>
-          <w:headerReference w:type="first" r:id="rId11"/>
+          <w:headerReference w:type="even" r:id="rId8"/>
+          <w:headerReference w:type="default" r:id="rId9"/>
+          <w:headerReference w:type="first" r:id="rId10"/>
           <w:pgSz w:w="11907" w:h="16840"/>
           <w:pgMar w:top="1701" w:right="1134" w:bottom="1134" w:left="1701" w:header="720" w:footer="720" w:gutter="0"/>
           <w:pgNumType w:start="1"/>
@@ -2819,8 +3069,8 @@
           <w:color w:val="000000"/>
         </w:rPr>
       </w:pPr>
-      <w:bookmarkStart w:id="2" w:name="_uebpuqog7hoa" w:colFirst="0" w:colLast="0"/>
-      <w:bookmarkEnd w:id="2"/>
+      <w:bookmarkStart w:id="1" w:name="_uebpuqog7hoa" w:colFirst="0" w:colLast="0"/>
+      <w:bookmarkEnd w:id="1"/>
       <w:r>
         <w:rPr>
           <w:b/>
@@ -2910,9 +3160,9 @@
               </wp:anchor>
             </w:drawing>
           </mc:Choice>
-          <mc:Fallback xmlns:w16se="http://schemas.microsoft.com/office/word/2015/wordml/symex" xmlns:w16sdtfl="http://schemas.microsoft.com/office/word/2024/wordml/sdtformatlock" xmlns:w16sdtdh="http://schemas.microsoft.com/office/word/2020/wordml/sdtdatahash" xmlns:w16du="http://schemas.microsoft.com/office/word/2023/wordml/word16du" xmlns:w16="http://schemas.microsoft.com/office/word/2018/wordml" xmlns:w16cid="http://schemas.microsoft.com/office/word/2016/wordml/cid" xmlns:w16cex="http://schemas.microsoft.com/office/word/2018/wordml/cex" xmlns:w15="http://schemas.microsoft.com/office/word/2012/wordml" xmlns:oel="http://schemas.microsoft.com/office/2019/extlst" xmlns:am3d="http://schemas.microsoft.com/office/drawing/2017/model3d" xmlns:aink="http://schemas.microsoft.com/office/drawing/2016/ink" xmlns:cx8="http://schemas.microsoft.com/office/drawing/2016/5/14/chartex" xmlns:cx7="http://schemas.microsoft.com/office/drawing/2016/5/13/chartex" xmlns:cx6="http://schemas.microsoft.com/office/drawing/2016/5/12/chartex" xmlns:cx5="http://schemas.microsoft.com/office/drawing/2016/5/11/chartex" xmlns:cx4="http://schemas.microsoft.com/office/drawing/2016/5/10/chartex" xmlns:cx3="http://schemas.microsoft.com/office/drawing/2016/5/9/chartex" xmlns:cx2="http://schemas.microsoft.com/office/drawing/2015/10/21/chartex" xmlns:cx1="http://schemas.microsoft.com/office/drawing/2015/9/8/chartex" xmlns:cx="http://schemas.microsoft.com/office/drawing/2014/chartex">
+          <mc:Fallback>
             <w:pict>
-              <v:shape w14:anchorId="65E7CEEC" id="Caixa de Texto 3" o:spid="_x0000_s1027" type="#_x0000_t202" style="position:absolute;margin-left:440pt;margin-top:-54.4pt;width:15pt;height:20.4pt;z-index:251659264;visibility:visible;mso-wrap-style:square;mso-wrap-distance-left:9pt;mso-wrap-distance-top:0;mso-wrap-distance-right:9pt;mso-wrap-distance-bottom:0;mso-position-horizontal:absolute;mso-position-horizontal-relative:text;mso-position-vertical:absolute;mso-position-vertical-relative:text;v-text-anchor:top" o:gfxdata="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" stroked="f">
+              <v:shape w14:anchorId="65E7CEEC" id="Caixa de Texto 3" o:spid="_x0000_s1027" type="#_x0000_t202" style="position:absolute;margin-left:440pt;margin-top:-54.4pt;width:15pt;height:20.4pt;z-index:251659264;visibility:visible;mso-wrap-style:square;mso-wrap-distance-left:9pt;mso-wrap-distance-top:0;mso-wrap-distance-right:9pt;mso-wrap-distance-bottom:0;mso-position-horizontal:absolute;mso-position-horizontal-relative:text;mso-position-vertical:absolute;mso-position-vertical-relative:text;v-text-anchor:top" o:gfxdata="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" stroked="f">
                 <v:textbox>
                   <w:txbxContent>
                     <w:p>
@@ -3027,9 +3277,9 @@
               </wp:anchor>
             </w:drawing>
           </mc:Choice>
-          <mc:Fallback xmlns:w16se="http://schemas.microsoft.com/office/word/2015/wordml/symex" xmlns:w16sdtfl="http://schemas.microsoft.com/office/word/2024/wordml/sdtformatlock" xmlns:w16sdtdh="http://schemas.microsoft.com/office/word/2020/wordml/sdtdatahash" xmlns:w16du="http://schemas.microsoft.com/office/word/2023/wordml/word16du" xmlns:w16="http://schemas.microsoft.com/office/word/2018/wordml" xmlns:w16cid="http://schemas.microsoft.com/office/word/2016/wordml/cid" xmlns:w16cex="http://schemas.microsoft.com/office/word/2018/wordml/cex" xmlns:w15="http://schemas.microsoft.com/office/word/2012/wordml" xmlns:oel="http://schemas.microsoft.com/office/2019/extlst" xmlns:am3d="http://schemas.microsoft.com/office/drawing/2017/model3d" xmlns:aink="http://schemas.microsoft.com/office/drawing/2016/ink" xmlns:cx8="http://schemas.microsoft.com/office/drawing/2016/5/14/chartex" xmlns:cx7="http://schemas.microsoft.com/office/drawing/2016/5/13/chartex" xmlns:cx6="http://schemas.microsoft.com/office/drawing/2016/5/12/chartex" xmlns:cx5="http://schemas.microsoft.com/office/drawing/2016/5/11/chartex" xmlns:cx4="http://schemas.microsoft.com/office/drawing/2016/5/10/chartex" xmlns:cx3="http://schemas.microsoft.com/office/drawing/2016/5/9/chartex" xmlns:cx2="http://schemas.microsoft.com/office/drawing/2015/10/21/chartex" xmlns:cx1="http://schemas.microsoft.com/office/drawing/2015/9/8/chartex" xmlns:cx="http://schemas.microsoft.com/office/drawing/2014/chartex">
+          <mc:Fallback>
             <w:pict>
-              <v:shape w14:anchorId="7FCD1C33" id="Caixa de Texto 2" o:spid="_x0000_s1028" type="#_x0000_t202" style="position:absolute;margin-left:445pt;margin-top:-54.4pt;width:10pt;height:20.4pt;z-index:251660288;visibility:visible;mso-wrap-style:square;mso-wrap-distance-left:9pt;mso-wrap-distance-top:0;mso-wrap-distance-right:9pt;mso-wrap-distance-bottom:0;mso-position-horizontal:absolute;mso-position-horizontal-relative:text;mso-position-vertical:absolute;mso-position-vertical-relative:text;v-text-anchor:top" o:gfxdata="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" stroked="f">
+              <v:shape w14:anchorId="7FCD1C33" id="Caixa de Texto 2" o:spid="_x0000_s1028" type="#_x0000_t202" style="position:absolute;margin-left:445pt;margin-top:-54.4pt;width:10pt;height:20.4pt;z-index:251660288;visibility:visible;mso-wrap-style:square;mso-wrap-distance-left:9pt;mso-wrap-distance-top:0;mso-wrap-distance-right:9pt;mso-wrap-distance-bottom:0;mso-position-horizontal:absolute;mso-position-horizontal-relative:text;mso-position-vertical:absolute;mso-position-vertical-relative:text;v-text-anchor:top" o:gfxdata="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" stroked="f">
                 <v:textbox>
                   <w:txbxContent>
                     <w:p>
@@ -3089,47 +3339,32 @@
         <w:rPr>
           <w:color w:val="000000" w:themeColor="text1"/>
         </w:rPr>
-        <w:t xml:space="preserve">O </w:t>
-      </w:r>
-      <w:proofErr w:type="spellStart"/>
+        <w:t xml:space="preserve">O ElderConnect é um sistema para facilitar a conexão entre </w:t>
+      </w:r>
       <w:r>
         <w:rPr>
           <w:color w:val="000000" w:themeColor="text1"/>
         </w:rPr>
-        <w:t>ElderConnect</w:t>
-      </w:r>
-      <w:proofErr w:type="spellEnd"/>
+        <w:t xml:space="preserve">idosos ou </w:t>
+      </w:r>
       <w:r>
         <w:rPr>
           <w:color w:val="000000" w:themeColor="text1"/>
         </w:rPr>
-        <w:t xml:space="preserve"> é um sistema para facilitar a conexão entre </w:t>
+        <w:t>responsáveis</w:t>
       </w:r>
       <w:r>
         <w:rPr>
           <w:color w:val="000000" w:themeColor="text1"/>
         </w:rPr>
-        <w:t xml:space="preserve">idosos ou </w:t>
+        <w:t xml:space="preserve"> do idoso</w:t>
       </w:r>
       <w:r>
         <w:rPr>
           <w:color w:val="000000" w:themeColor="text1"/>
         </w:rPr>
-        <w:t>responsáveis</w:t>
-      </w:r>
-      <w:r>
-        <w:rPr>
-          <w:color w:val="000000" w:themeColor="text1"/>
-        </w:rPr>
-        <w:t xml:space="preserve"> do idoso</w:t>
-      </w:r>
-      <w:r>
-        <w:rPr>
-          <w:color w:val="000000" w:themeColor="text1"/>
-        </w:rPr>
         <w:t xml:space="preserve"> e cuidadores, além de organizar a rotina e os cuidados diários de pessoas idosas. A proposta do sistema é resolver problemas como a dificuldade de encontrar cuidadores disponíveis e confiáveis, bem como auxiliar no controle de medicamentos e acompanhamento da saúde do idoso. O sistema permitirá o cadastro de responsáveis, cuidadores e idosos, com autenticação segura de usuários. Os cuidadores poderão informar sua experiência, cidade, valor por hora e horários disponíveis, possibilitando que responsáveis realizem buscas com filtros específicos. Também será possível vincular um cuidador a um idoso após a contratação. Além disso, o portal contará com uma agenda de medicamentos, onde poderão ser cadastrados nome do remédio, dose, horários e frequência, permitindo melhor controle da administração. O sistema será desenvolvido com Java no </w:t>
       </w:r>
-      <w:proofErr w:type="spellStart"/>
       <w:r>
         <w:rPr>
           <w:i/>
@@ -3137,26 +3372,11 @@
         </w:rPr>
         <w:t>backend</w:t>
       </w:r>
-      <w:proofErr w:type="spellEnd"/>
       <w:r>
         <w:rPr>
           <w:color w:val="000000" w:themeColor="text1"/>
         </w:rPr>
-        <w:t xml:space="preserve"> e </w:t>
-      </w:r>
-      <w:proofErr w:type="spellStart"/>
-      <w:r>
-        <w:rPr>
-          <w:color w:val="000000" w:themeColor="text1"/>
-        </w:rPr>
-        <w:t>PostgreSQL</w:t>
-      </w:r>
-      <w:proofErr w:type="spellEnd"/>
-      <w:r>
-        <w:rPr>
-          <w:color w:val="000000" w:themeColor="text1"/>
-        </w:rPr>
-        <w:t xml:space="preserve"> como banco de dados, garantindo organização, segurança e escalabilidade. O objetivo principal é oferecer uma solução prática, segura e organizada para apoiar o cuidado com a pessoa idosa, promovendo mais tranquilidade aos familiares e maior profissionalização aos cuidadores.</w:t>
+        <w:t xml:space="preserve"> e PostgreSQL como banco de dados, garantindo organização, segurança e escalabilidade. O objetivo principal é oferecer uma solução prática, segura e organizada para apoiar o cuidado com a pessoa idosa, promovendo mais tranquilidade aos familiares e maior profissionalização aos cuidadores.</w:t>
       </w:r>
     </w:p>
     <w:p>
@@ -3177,8 +3397,8 @@
           <w:color w:val="000000"/>
         </w:rPr>
       </w:pPr>
-      <w:bookmarkStart w:id="3" w:name="_gihow8iyy5tk" w:colFirst="0" w:colLast="0"/>
-      <w:bookmarkEnd w:id="3"/>
+      <w:bookmarkStart w:id="2" w:name="_gihow8iyy5tk" w:colFirst="0" w:colLast="0"/>
+      <w:bookmarkEnd w:id="2"/>
       <w:r>
         <w:br w:type="page"/>
       </w:r>
@@ -3259,8 +3479,8 @@
         </w:rPr>
         <w:t>Sistema Web para auxiliar comunicação entre idosos, responsáveis e cuidadores, facilitando o contato e a organização dos cuidados.</w:t>
       </w:r>
-      <w:bookmarkStart w:id="4" w:name="_wtwf8uuzt1zz" w:colFirst="0" w:colLast="0"/>
-      <w:bookmarkEnd w:id="4"/>
+      <w:bookmarkStart w:id="3" w:name="_wtwf8uuzt1zz" w:colFirst="0" w:colLast="0"/>
+      <w:bookmarkEnd w:id="3"/>
     </w:p>
     <w:p>
       <w:pPr>
@@ -3334,8 +3554,8 @@
           <w:color w:val="FF0000"/>
         </w:rPr>
       </w:pPr>
-      <w:bookmarkStart w:id="5" w:name="_4kon9gd1dvv5" w:colFirst="0" w:colLast="0"/>
-      <w:bookmarkEnd w:id="5"/>
+      <w:bookmarkStart w:id="4" w:name="_4kon9gd1dvv5" w:colFirst="0" w:colLast="0"/>
+      <w:bookmarkEnd w:id="4"/>
       <w:r>
         <w:rPr>
           <w:color w:val="FF0000"/>
@@ -3495,8 +3715,8 @@
           <w:color w:val="FF0000"/>
         </w:rPr>
       </w:pPr>
-      <w:bookmarkStart w:id="6" w:name="_a242hfqy1pb1" w:colFirst="0" w:colLast="0"/>
-      <w:bookmarkEnd w:id="6"/>
+      <w:bookmarkStart w:id="5" w:name="_a242hfqy1pb1" w:colFirst="0" w:colLast="0"/>
+      <w:bookmarkEnd w:id="5"/>
     </w:p>
     <w:p>
       <w:pPr>
@@ -3525,8 +3745,8 @@
       <w:pPr>
         <w:keepNext/>
       </w:pPr>
-      <w:bookmarkStart w:id="7" w:name="_vu5456qxwj1m" w:colFirst="0" w:colLast="0"/>
-      <w:bookmarkEnd w:id="7"/>
+      <w:bookmarkStart w:id="6" w:name="_vu5456qxwj1m" w:colFirst="0" w:colLast="0"/>
+      <w:bookmarkEnd w:id="6"/>
       <w:r>
         <w:t>O sistema é direcionado principalmente a cuidadores de idosos, bem como aos próprios idosos e seus familiares.</w:t>
       </w:r>
@@ -3592,8 +3812,8 @@
       <w:r>
         <w:t>Um exemplo de trabalho relacionado é o aplicativo DoseApp, que foi desenvolvido com o objetivo de auxiliar cuidadores e familiares no gerenciamento de medicamentos e na organização da rotina diária de idosos. O sistema permite registrar horários, dosagens e outras informações importantes, reduzindo o risco de perda de informações quando há revezamento entre diferentes cuidadores (ROSTIROLLA; SOUZA, 2022)</w:t>
       </w:r>
-      <w:bookmarkStart w:id="8" w:name="_ctqy09cxo6nw"/>
-      <w:bookmarkEnd w:id="8"/>
+      <w:bookmarkStart w:id="7" w:name="_ctqy09cxo6nw"/>
+      <w:bookmarkEnd w:id="7"/>
     </w:p>
     <w:p>
       <w:pPr>
@@ -3677,8 +3897,8 @@
         <w:lastRenderedPageBreak/>
         <w:t>identificadas no início do projeto. Caso sejam identificados problemas ou melhorias, ajustes serão realizados antes da finalização do projeto.</w:t>
       </w:r>
-      <w:bookmarkStart w:id="9" w:name="_u304za3h7w33"/>
-      <w:bookmarkEnd w:id="9"/>
+      <w:bookmarkStart w:id="8" w:name="_u304za3h7w33"/>
+      <w:bookmarkEnd w:id="8"/>
     </w:p>
     <w:p>
       <w:pPr>
@@ -3737,8 +3957,8 @@
           <w:color w:val="000000"/>
         </w:rPr>
       </w:pPr>
-      <w:bookmarkStart w:id="10" w:name="_5xhdqyoxv5pz"/>
-      <w:bookmarkEnd w:id="10"/>
+      <w:bookmarkStart w:id="9" w:name="_5xhdqyoxv5pz"/>
+      <w:bookmarkEnd w:id="9"/>
       <w:r>
         <w:rPr>
           <w:b/>
@@ -3761,8 +3981,8 @@
           <w:color w:val="0070C0"/>
         </w:rPr>
       </w:pPr>
-      <w:bookmarkStart w:id="11" w:name="_85x6gq42hjga" w:colFirst="0" w:colLast="0"/>
-      <w:bookmarkEnd w:id="11"/>
+      <w:bookmarkStart w:id="10" w:name="_85x6gq42hjga" w:colFirst="0" w:colLast="0"/>
+      <w:bookmarkEnd w:id="10"/>
     </w:p>
     <w:p>
       <w:pPr>
@@ -3856,8 +4076,8 @@
           <w:color w:val="FF0000"/>
         </w:rPr>
       </w:pPr>
-      <w:bookmarkStart w:id="12" w:name="_hlzhjesqyqyu"/>
-      <w:bookmarkEnd w:id="12"/>
+      <w:bookmarkStart w:id="11" w:name="_hlzhjesqyqyu"/>
+      <w:bookmarkEnd w:id="11"/>
     </w:p>
     <w:p>
       <w:pPr>
@@ -3993,115 +4213,67 @@
           <w:color w:val="000000" w:themeColor="text1"/>
           <w:lang w:val="en-US"/>
         </w:rPr>
-        <w:t xml:space="preserve"> ram ssd480 </w:t>
-      </w:r>
-      <w:proofErr w:type="spellStart"/>
-      <w:r>
+        <w:t xml:space="preserve"> ram ssd480 hd 500</w:t>
+      </w:r>
+    </w:p>
+    <w:p>
+      <w:pPr>
+        <w:jc w:val="both"/>
         <w:rPr>
           <w:color w:val="000000" w:themeColor="text1"/>
           <w:lang w:val="en-US"/>
         </w:rPr>
-        <w:t>hd</w:t>
-      </w:r>
-      <w:proofErr w:type="spellEnd"/>
+      </w:pPr>
       <w:r>
         <w:rPr>
           <w:color w:val="000000" w:themeColor="text1"/>
           <w:lang w:val="en-US"/>
         </w:rPr>
-        <w:t xml:space="preserve"> 500</w:t>
-      </w:r>
-    </w:p>
-    <w:p>
-      <w:pPr>
-        <w:jc w:val="both"/>
+        <w:t xml:space="preserve">RH 3 – </w:t>
+      </w:r>
+      <w:r>
         <w:rPr>
           <w:color w:val="000000" w:themeColor="text1"/>
           <w:lang w:val="en-US"/>
         </w:rPr>
-      </w:pPr>
-      <w:r>
+        <w:t>Notebook Dell Inspiron i5 8gb ram, ssd 240, hd 620</w:t>
+      </w:r>
+    </w:p>
+    <w:p>
+      <w:pPr>
+        <w:jc w:val="both"/>
         <w:rPr>
           <w:color w:val="000000" w:themeColor="text1"/>
-          <w:lang w:val="en-US"/>
-        </w:rPr>
-        <w:t xml:space="preserve">RH 3 – </w:t>
-      </w:r>
+        </w:rPr>
+      </w:pPr>
       <w:r>
         <w:rPr>
           <w:color w:val="000000" w:themeColor="text1"/>
-          <w:lang w:val="en-US"/>
-        </w:rPr>
-        <w:t xml:space="preserve">Notebook Dell Inspiron i5 8gb ram, </w:t>
-      </w:r>
-      <w:proofErr w:type="spellStart"/>
-      <w:r>
+        </w:rPr>
+        <w:t>RH 4 – Teclado</w:t>
+      </w:r>
+    </w:p>
+    <w:p>
+      <w:pPr>
+        <w:jc w:val="both"/>
         <w:rPr>
           <w:color w:val="000000" w:themeColor="text1"/>
-          <w:lang w:val="en-US"/>
-        </w:rPr>
-        <w:t>ssd</w:t>
-      </w:r>
-      <w:proofErr w:type="spellEnd"/>
+        </w:rPr>
+      </w:pPr>
       <w:r>
         <w:rPr>
           <w:color w:val="000000" w:themeColor="text1"/>
-          <w:lang w:val="en-US"/>
-        </w:rPr>
-        <w:t xml:space="preserve"> 240, </w:t>
-      </w:r>
-      <w:proofErr w:type="spellStart"/>
+        </w:rPr>
+        <w:t>RH 5 -</w:t>
+      </w:r>
       <w:r>
         <w:rPr>
           <w:color w:val="000000" w:themeColor="text1"/>
-          <w:lang w:val="en-US"/>
-        </w:rPr>
-        <w:t>hd</w:t>
-      </w:r>
-      <w:proofErr w:type="spellEnd"/>
-      <w:r>
-        <w:rPr>
-          <w:color w:val="000000" w:themeColor="text1"/>
-          <w:lang w:val="en-US"/>
-        </w:rPr>
-        <w:t xml:space="preserve"> 620</w:t>
-      </w:r>
-    </w:p>
-    <w:p>
-      <w:pPr>
-        <w:jc w:val="both"/>
-        <w:rPr>
-          <w:color w:val="000000" w:themeColor="text1"/>
-        </w:rPr>
-      </w:pPr>
-      <w:r>
-        <w:rPr>
-          <w:color w:val="000000" w:themeColor="text1"/>
-        </w:rPr>
-        <w:t>RH 4 – Teclado</w:t>
-      </w:r>
-    </w:p>
-    <w:p>
-      <w:pPr>
-        <w:jc w:val="both"/>
-        <w:rPr>
-          <w:color w:val="000000" w:themeColor="text1"/>
-        </w:rPr>
-      </w:pPr>
-      <w:r>
-        <w:rPr>
-          <w:color w:val="000000" w:themeColor="text1"/>
-        </w:rPr>
-        <w:t>RH 5 -</w:t>
-      </w:r>
-      <w:r>
-        <w:rPr>
-          <w:color w:val="000000" w:themeColor="text1"/>
         </w:rPr>
         <w:t xml:space="preserve"> Mouse</w:t>
       </w:r>
-      <w:bookmarkStart w:id="13" w:name="_zgip7uuby6ix"/>
-      <w:bookmarkEnd w:id="13"/>
+      <w:bookmarkStart w:id="12" w:name="_zgip7uuby6ix"/>
+      <w:bookmarkEnd w:id="12"/>
     </w:p>
     <w:p>
       <w:pPr>
@@ -4143,70 +4315,69 @@
           <w:color w:val="000000" w:themeColor="text1"/>
           <w:lang w:val="en-US"/>
         </w:rPr>
-        <w:t xml:space="preserve">RS 1 </w:t>
-      </w:r>
-      <w:proofErr w:type="gramStart"/>
-      <w:r>
+        <w:t>RS 1 -  IntelliJ IDEA v. 2025.</w:t>
+      </w:r>
+    </w:p>
+    <w:p>
+      <w:pPr>
         <w:rPr>
           <w:color w:val="000000" w:themeColor="text1"/>
           <w:lang w:val="en-US"/>
         </w:rPr>
-        <w:t>-  IntelliJ</w:t>
-      </w:r>
-      <w:proofErr w:type="gramEnd"/>
+      </w:pPr>
       <w:r>
         <w:rPr>
           <w:color w:val="000000" w:themeColor="text1"/>
           <w:lang w:val="en-US"/>
         </w:rPr>
-        <w:t xml:space="preserve"> IDEA v. 2025.</w:t>
-      </w:r>
-    </w:p>
-    <w:p>
-      <w:pPr>
+        <w:t xml:space="preserve">RS </w:t>
+      </w:r>
+      <w:bookmarkStart w:id="13" w:name="_GoBack"/>
+      <w:bookmarkEnd w:id="13"/>
+      <w:r>
         <w:rPr>
           <w:color w:val="000000" w:themeColor="text1"/>
           <w:lang w:val="en-US"/>
         </w:rPr>
-      </w:pPr>
+        <w:t>2 -</w:t>
+      </w:r>
       <w:r>
         <w:rPr>
           <w:color w:val="000000" w:themeColor="text1"/>
           <w:lang w:val="en-US"/>
         </w:rPr>
-        <w:t xml:space="preserve">RS </w:t>
-      </w:r>
-      <w:proofErr w:type="gramStart"/>
-      <w:r>
+        <w:t xml:space="preserve"> Microsoft Word 2019.</w:t>
+      </w:r>
+    </w:p>
+    <w:p>
+      <w:pPr>
+        <w:rPr>
+          <w:color w:val="000000" w:themeColor="text1"/>
+        </w:rPr>
+      </w:pPr>
+      <w:r>
+        <w:rPr>
+          <w:color w:val="000000" w:themeColor="text1"/>
+        </w:rPr>
+        <w:t>RS 3 - Sistema operacional Microsoft Windows 11 Professional.</w:t>
+      </w:r>
+      <w:bookmarkStart w:id="14" w:name="_pxyab1tdqc6h"/>
+      <w:bookmarkEnd w:id="14"/>
+    </w:p>
+    <w:p>
+      <w:pPr>
         <w:rPr>
           <w:color w:val="000000" w:themeColor="text1"/>
           <w:lang w:val="en-US"/>
         </w:rPr>
-        <w:t>2  -</w:t>
-      </w:r>
-      <w:proofErr w:type="gramEnd"/>
+      </w:pPr>
       <w:r>
         <w:rPr>
           <w:color w:val="000000" w:themeColor="text1"/>
           <w:lang w:val="en-US"/>
         </w:rPr>
-        <w:t xml:space="preserve"> Microsoft Word 2019.</w:t>
-      </w:r>
-    </w:p>
-    <w:p>
-      <w:pPr>
-        <w:rPr>
-          <w:color w:val="000000" w:themeColor="text1"/>
-        </w:rPr>
-      </w:pPr>
-      <w:r>
-        <w:rPr>
-          <w:color w:val="000000" w:themeColor="text1"/>
-        </w:rPr>
-        <w:t>RS 3 - Sistema operacional Microsoft Windows 11 Professional.</w:t>
-      </w:r>
-      <w:bookmarkStart w:id="14" w:name="_pxyab1tdqc6h"/>
-      <w:bookmarkEnd w:id="14"/>
+        <w:t>RS 4 - PostgreSQL</w:t>
+      </w:r>
     </w:p>
     <w:p>
       <w:pPr>
@@ -4220,39 +4391,22 @@
           <w:color w:val="000000" w:themeColor="text1"/>
           <w:lang w:val="en-US"/>
         </w:rPr>
-        <w:t>RS 4 - PostgreSQL</w:t>
-      </w:r>
-    </w:p>
-    <w:p>
-      <w:pPr>
+        <w:t xml:space="preserve">RS 5 </w:t>
+      </w:r>
+      <w:r>
         <w:rPr>
           <w:color w:val="000000" w:themeColor="text1"/>
           <w:lang w:val="en-US"/>
         </w:rPr>
-      </w:pPr>
+        <w:t xml:space="preserve">- </w:t>
+      </w:r>
       <w:r>
         <w:rPr>
           <w:color w:val="000000" w:themeColor="text1"/>
           <w:lang w:val="en-US"/>
         </w:rPr>
-        <w:t xml:space="preserve">RS 5 </w:t>
-      </w:r>
-      <w:proofErr w:type="gramStart"/>
-      <w:r>
-        <w:rPr>
-          <w:color w:val="000000" w:themeColor="text1"/>
-          <w:lang w:val="en-US"/>
-        </w:rPr>
-        <w:t xml:space="preserve">- </w:t>
-      </w:r>
-      <w:r>
-        <w:rPr>
-          <w:color w:val="000000" w:themeColor="text1"/>
-          <w:lang w:val="en-US"/>
-        </w:rPr>
         <w:t xml:space="preserve"> Git</w:t>
       </w:r>
-      <w:proofErr w:type="gramEnd"/>
     </w:p>
     <w:p>
       <w:pPr>
@@ -4592,7 +4746,6 @@
         </w:rPr>
         <w:t xml:space="preserve"> </w:t>
       </w:r>
-      <w:proofErr w:type="spellStart"/>
       <w:r>
         <w:rPr>
           <w:rStyle w:val="citation-150"/>
@@ -4600,7 +4753,6 @@
         </w:rPr>
         <w:t>ElderConnect</w:t>
       </w:r>
-      <w:proofErr w:type="spellEnd"/>
       <w:r>
         <w:rPr>
           <w:rStyle w:val="citation-150"/>
@@ -4732,15 +4884,7 @@
               <w:jc w:val="center"/>
             </w:pPr>
             <w:r>
-              <w:t>(</w:t>
-            </w:r>
-            <w:proofErr w:type="spellStart"/>
-            <w:r>
-              <w:t>Toast</w:t>
-            </w:r>
-            <w:proofErr w:type="spellEnd"/>
-            <w:r>
-              <w:t xml:space="preserve"> Verde)</w:t>
+              <w:t>(Toast Verde)</w:t>
             </w:r>
           </w:p>
         </w:tc>
@@ -4937,15 +5081,7 @@
           </w:p>
           <w:p>
             <w:r>
-              <w:t>(</w:t>
-            </w:r>
-            <w:proofErr w:type="spellStart"/>
-            <w:r>
-              <w:t>Toast</w:t>
-            </w:r>
-            <w:proofErr w:type="spellEnd"/>
-            <w:r>
-              <w:t xml:space="preserve"> Verde)</w:t>
+              <w:t>(Toast Verde)</w:t>
             </w:r>
           </w:p>
           <w:p>
@@ -5020,11 +5156,9 @@
         <w:br/>
         <w:t xml:space="preserve">Para garantir a total conformidade com a LGPD, o </w:t>
       </w:r>
-      <w:proofErr w:type="spellStart"/>
       <w:r>
         <w:t>ElderConnect</w:t>
       </w:r>
-      <w:proofErr w:type="spellEnd"/>
       <w:r>
         <w:t xml:space="preserve"> implementa a governança de dados pautada nos princípios da finalidade, necessidade e transparência através dos seguintes pilares arquiteturais:</w:t>
       </w:r>
@@ -5036,15 +5170,7 @@
         <w:jc w:val="both"/>
       </w:pPr>
       <w:r>
-        <w:t>Consentimento Explícito (</w:t>
-      </w:r>
-      <w:proofErr w:type="spellStart"/>
-      <w:r>
-        <w:t>Opt-in</w:t>
-      </w:r>
-      <w:proofErr w:type="spellEnd"/>
-      <w:r>
-        <w:t xml:space="preserve">): No momento do cadastro do usuário (seja responsável ou cuidador), haverá uma caixa de seleção obrigatória desmarcada por padrão, onde o usuário </w:t>
+        <w:t xml:space="preserve">Consentimento Explícito (Opt-in): No momento do cadastro do usuário (seja responsável ou cuidador), haverá uma caixa de seleção obrigatória desmarcada por padrão, onde o usuário </w:t>
       </w:r>
       <w:r>
         <w:lastRenderedPageBreak/>
@@ -5111,21 +5237,8 @@
         <w:t xml:space="preserve">. Esses registros trafegarão sob criptografia e sua persistência no banco contará com controle de acesso rígido por nível de permissão (RBAC - </w:t>
       </w:r>
       <w:r>
-        <w:t>Role-</w:t>
-      </w:r>
-      <w:proofErr w:type="spellStart"/>
-      <w:r>
-        <w:t>Based</w:t>
-      </w:r>
-      <w:proofErr w:type="spellEnd"/>
-      <w:r>
-        <w:t xml:space="preserve"> Access </w:t>
-      </w:r>
-      <w:proofErr w:type="spellStart"/>
-      <w:r>
-        <w:t>Control</w:t>
-      </w:r>
-      <w:proofErr w:type="spellEnd"/>
+        <w:t>Role-Based Access Control</w:t>
+      </w:r>
       <w:r>
         <w:t>), impedindo vazamentos internos.</w:t>
       </w:r>
@@ -5166,37 +5279,13 @@
         <w:jc w:val="both"/>
       </w:pPr>
       <w:r>
-        <w:t xml:space="preserve">Este capítulo apresenta a arquitetura e o projeto do sistema de software </w:t>
-      </w:r>
-      <w:proofErr w:type="spellStart"/>
-      <w:r>
-        <w:t>ElderConnect</w:t>
-      </w:r>
-      <w:proofErr w:type="spellEnd"/>
-      <w:r>
-        <w:t>.</w:t>
+        <w:t>Este capítulo apresenta a arquitetura e o projeto do sistema de software ElderConnect.</w:t>
       </w:r>
       <w:r>
         <w:t xml:space="preserve"> </w:t>
       </w:r>
       <w:r>
-        <w:t xml:space="preserve">Para representar a estrutura do sistema, foram utilizados diagramas de pacotes referentes ao </w:t>
-      </w:r>
-      <w:proofErr w:type="spellStart"/>
-      <w:r>
-        <w:t>back-end</w:t>
-      </w:r>
-      <w:proofErr w:type="spellEnd"/>
-      <w:r>
-        <w:t xml:space="preserve"> e ao front-</w:t>
-      </w:r>
-      <w:proofErr w:type="spellStart"/>
-      <w:r>
-        <w:t>end</w:t>
-      </w:r>
-      <w:proofErr w:type="spellEnd"/>
-      <w:r>
-        <w:t>, um diagrama de classes de negócio e diagramas de sequência.</w:t>
+        <w:t>Para representar a estrutura do sistema, foram utilizados diagramas de pacotes referentes ao back-end e ao front-end, um diagrama de classes de negócio e diagramas de sequência.</w:t>
       </w:r>
     </w:p>
     <w:p>
@@ -5232,15 +5321,7 @@
         <w:t>O</w:t>
       </w:r>
       <w:r>
-        <w:t xml:space="preserve"> projeto do </w:t>
-      </w:r>
-      <w:proofErr w:type="spellStart"/>
-      <w:r>
-        <w:t>back-end</w:t>
-      </w:r>
-      <w:proofErr w:type="spellEnd"/>
-      <w:r>
-        <w:t xml:space="preserve"> </w:t>
+        <w:t xml:space="preserve"> projeto do back-end </w:t>
       </w:r>
       <w:r>
         <w:t>foi</w:t>
@@ -5256,23 +5337,7 @@
         <w:jc w:val="both"/>
       </w:pPr>
       <w:r>
-        <w:t xml:space="preserve">A Figura 1 apresenta a estrutura definida para os pacotes do </w:t>
-      </w:r>
-      <w:proofErr w:type="spellStart"/>
-      <w:r>
-        <w:t>back-end</w:t>
-      </w:r>
-      <w:proofErr w:type="spellEnd"/>
-      <w:r>
-        <w:t xml:space="preserve"> do </w:t>
-      </w:r>
-      <w:proofErr w:type="spellStart"/>
-      <w:r>
-        <w:t>ElderConnect</w:t>
-      </w:r>
-      <w:proofErr w:type="spellEnd"/>
-      <w:r>
-        <w:t>.</w:t>
+        <w:t>A Figura 1 apresenta a estrutura definida para os pacotes do back-end do ElderConnect.</w:t>
       </w:r>
     </w:p>
     <w:p>
@@ -5309,7 +5374,7 @@
                     </pic:cNvPicPr>
                   </pic:nvPicPr>
                   <pic:blipFill rotWithShape="1">
-                    <a:blip r:embed="rId12" cstate="print">
+                    <a:blip r:embed="rId11" cstate="print">
                       <a:extLst>
                         <a:ext uri="{28A0092B-C50C-407E-A947-70E740481C1C}">
                           <a14:useLocalDpi xmlns:a14="http://schemas.microsoft.com/office/drawing/2010/main" val="0"/>
@@ -5357,6 +5422,7 @@
           <w:szCs w:val="20"/>
         </w:rPr>
       </w:pPr>
+      <w:bookmarkStart w:id="21" w:name="_Toc238883409"/>
       <w:r>
         <w:rPr>
           <w:i w:val="0"/>
@@ -5426,10 +5492,13 @@
           <w:sz w:val="20"/>
           <w:szCs w:val="20"/>
         </w:rPr>
-        <w:t xml:space="preserve"> - Diagrama de Pacotes da </w:t>
-      </w:r>
-      <w:proofErr w:type="spellStart"/>
-      <w:r>
+        <w:t xml:space="preserve"> - Diagrama de Pacotes da Backend</w:t>
+      </w:r>
+      <w:bookmarkEnd w:id="21"/>
+    </w:p>
+    <w:p>
+      <w:pPr>
+        <w:pStyle w:val="Legenda"/>
         <w:rPr>
           <w:i w:val="0"/>
           <w:iCs w:val="0"/>
@@ -5437,13 +5506,8 @@
           <w:sz w:val="20"/>
           <w:szCs w:val="20"/>
         </w:rPr>
-        <w:t>Backend</w:t>
-      </w:r>
-      <w:proofErr w:type="spellEnd"/>
-    </w:p>
-    <w:p>
-      <w:pPr>
-        <w:pStyle w:val="Legenda"/>
+      </w:pPr>
+      <w:r>
         <w:rPr>
           <w:i w:val="0"/>
           <w:iCs w:val="0"/>
@@ -5451,15 +5515,6 @@
           <w:sz w:val="20"/>
           <w:szCs w:val="20"/>
         </w:rPr>
-      </w:pPr>
-      <w:r>
-        <w:rPr>
-          <w:i w:val="0"/>
-          <w:iCs w:val="0"/>
-          <w:color w:val="auto"/>
-          <w:sz w:val="20"/>
-          <w:szCs w:val="20"/>
-        </w:rPr>
         <w:t>FONTE: Elaboração dos autores</w:t>
       </w:r>
     </w:p>
@@ -5476,13 +5531,8 @@
         <w:jc w:val="both"/>
       </w:pPr>
       <w:r>
-        <w:t>O front-</w:t>
-      </w:r>
-      <w:proofErr w:type="spellStart"/>
-      <w:r>
-        <w:t>end</w:t>
-      </w:r>
-      <w:proofErr w:type="spellEnd"/>
+        <w:t>O front-end</w:t>
+      </w:r>
       <w:r>
         <w:t xml:space="preserve"> é a </w:t>
       </w:r>
@@ -5539,7 +5589,7 @@
                     </pic:cNvPicPr>
                   </pic:nvPicPr>
                   <pic:blipFill>
-                    <a:blip r:embed="rId13" cstate="print">
+                    <a:blip r:embed="rId12" cstate="print">
                       <a:extLst>
                         <a:ext uri="{28A0092B-C50C-407E-A947-70E740481C1C}">
                           <a14:useLocalDpi xmlns:a14="http://schemas.microsoft.com/office/drawing/2010/main" val="0"/>
@@ -5582,6 +5632,7 @@
           <w:szCs w:val="20"/>
         </w:rPr>
       </w:pPr>
+      <w:bookmarkStart w:id="22" w:name="_Toc238883410"/>
       <w:r>
         <w:rPr>
           <w:i w:val="0"/>
@@ -5651,10 +5702,13 @@
           <w:sz w:val="20"/>
           <w:szCs w:val="20"/>
         </w:rPr>
-        <w:t xml:space="preserve"> - Diagrama de Pacotes do </w:t>
-      </w:r>
-      <w:proofErr w:type="spellStart"/>
-      <w:r>
+        <w:t xml:space="preserve"> - Diagrama de Pacotes do Frontend</w:t>
+      </w:r>
+      <w:bookmarkEnd w:id="22"/>
+    </w:p>
+    <w:p>
+      <w:pPr>
+        <w:pStyle w:val="Legenda"/>
         <w:rPr>
           <w:i w:val="0"/>
           <w:iCs w:val="0"/>
@@ -5662,13 +5716,8 @@
           <w:sz w:val="20"/>
           <w:szCs w:val="20"/>
         </w:rPr>
-        <w:t>Frontend</w:t>
-      </w:r>
-      <w:proofErr w:type="spellEnd"/>
-    </w:p>
-    <w:p>
-      <w:pPr>
-        <w:pStyle w:val="Legenda"/>
+      </w:pPr>
+      <w:r>
         <w:rPr>
           <w:i w:val="0"/>
           <w:iCs w:val="0"/>
@@ -5676,15 +5725,6 @@
           <w:sz w:val="20"/>
           <w:szCs w:val="20"/>
         </w:rPr>
-      </w:pPr>
-      <w:r>
-        <w:rPr>
-          <w:i w:val="0"/>
-          <w:iCs w:val="0"/>
-          <w:color w:val="auto"/>
-          <w:sz w:val="20"/>
-          <w:szCs w:val="20"/>
-        </w:rPr>
         <w:t>FONTE: Elaboração dos autores</w:t>
       </w:r>
     </w:p>
@@ -5716,15 +5756,7 @@
         <w:jc w:val="both"/>
       </w:pPr>
       <w:r>
-        <w:t xml:space="preserve">O diagrama de classes de negócio representa os principais elementos envolvidos no funcionamento do </w:t>
-      </w:r>
-      <w:proofErr w:type="spellStart"/>
-      <w:r>
-        <w:t>ElderConnect</w:t>
-      </w:r>
-      <w:proofErr w:type="spellEnd"/>
-      <w:r>
-        <w:t xml:space="preserve"> e os relacionamentos existentes entre eles.</w:t>
+        <w:t>O diagrama de classes de negócio representa os principais elementos envolvidos no funcionamento do ElderConnect e os relacionamentos existentes entre eles.</w:t>
       </w:r>
     </w:p>
     <w:p>
@@ -5761,7 +5793,7 @@
                     </pic:cNvPicPr>
                   </pic:nvPicPr>
                   <pic:blipFill>
-                    <a:blip r:embed="rId14">
+                    <a:blip r:embed="rId13">
                       <a:extLst>
                         <a:ext uri="{28A0092B-C50C-407E-A947-70E740481C1C}">
                           <a14:useLocalDpi xmlns:a14="http://schemas.microsoft.com/office/drawing/2010/main" val="0"/>
@@ -5804,6 +5836,7 @@
           <w:szCs w:val="20"/>
         </w:rPr>
       </w:pPr>
+      <w:bookmarkStart w:id="23" w:name="_Toc238883411"/>
       <w:r>
         <w:rPr>
           <w:i w:val="0"/>
@@ -5875,6 +5908,7 @@
         </w:rPr>
         <w:t xml:space="preserve"> - Diagrama de Classe de Negócios</w:t>
       </w:r>
+      <w:bookmarkEnd w:id="23"/>
     </w:p>
     <w:p>
       <w:pPr>
@@ -5925,15 +5959,7 @@
         <w:jc w:val="both"/>
       </w:pPr>
       <w:r>
-        <w:t xml:space="preserve">No projeto </w:t>
-      </w:r>
-      <w:proofErr w:type="spellStart"/>
-      <w:r>
-        <w:t>ElderConnect</w:t>
-      </w:r>
-      <w:proofErr w:type="spellEnd"/>
-      <w:r>
-        <w:t xml:space="preserve"> foram elaborados dois diagramas de sequência: um referente ao cenário principal de autenticação e outro relacionado ao cenário alternativo de recuperação de senha.</w:t>
+        <w:t>No projeto ElderConnect foram elaborados dois diagramas de sequência: um referente ao cenário principal de autenticação e outro relacionado ao cenário alternativo de recuperação de senha.</w:t>
       </w:r>
     </w:p>
     <w:p>
@@ -5988,7 +6014,7 @@
                     </pic:cNvPicPr>
                   </pic:nvPicPr>
                   <pic:blipFill>
-                    <a:blip r:embed="rId15">
+                    <a:blip r:embed="rId14">
                       <a:extLst>
                         <a:ext uri="{28A0092B-C50C-407E-A947-70E740481C1C}">
                           <a14:useLocalDpi xmlns:a14="http://schemas.microsoft.com/office/drawing/2010/main" val="0"/>
@@ -6031,6 +6057,7 @@
           <w:szCs w:val="20"/>
         </w:rPr>
       </w:pPr>
+      <w:bookmarkStart w:id="24" w:name="_Toc238883412"/>
       <w:r>
         <w:rPr>
           <w:i w:val="0"/>
@@ -6102,6 +6129,7 @@
         </w:rPr>
         <w:t xml:space="preserve"> - Diagrama de Sequência do cenário principal</w:t>
       </w:r>
+      <w:bookmarkEnd w:id="24"/>
     </w:p>
     <w:p>
       <w:pPr>
@@ -6178,7 +6206,7 @@
                     </pic:cNvPicPr>
                   </pic:nvPicPr>
                   <pic:blipFill>
-                    <a:blip r:embed="rId16">
+                    <a:blip r:embed="rId15">
                       <a:extLst>
                         <a:ext uri="{28A0092B-C50C-407E-A947-70E740481C1C}">
                           <a14:useLocalDpi xmlns:a14="http://schemas.microsoft.com/office/drawing/2010/main" val="0"/>
@@ -6221,6 +6249,7 @@
           <w:szCs w:val="20"/>
         </w:rPr>
       </w:pPr>
+      <w:bookmarkStart w:id="25" w:name="_Toc238883413"/>
       <w:r>
         <w:rPr>
           <w:i w:val="0"/>
@@ -6292,6 +6321,7 @@
         </w:rPr>
         <w:t xml:space="preserve"> - Diagrama de Sequência do cenário alternativo</w:t>
       </w:r>
+      <w:bookmarkEnd w:id="25"/>
     </w:p>
     <w:p>
       <w:pPr>
@@ -6385,8 +6415,8 @@
           <w:color w:val="000000"/>
         </w:rPr>
       </w:pPr>
-      <w:bookmarkStart w:id="21" w:name="_xwz6vzo9lzyl" w:colFirst="0" w:colLast="0"/>
-      <w:bookmarkEnd w:id="21"/>
+      <w:bookmarkStart w:id="26" w:name="_xwz6vzo9lzyl" w:colFirst="0" w:colLast="0"/>
+      <w:bookmarkEnd w:id="26"/>
       <w:r>
         <w:br w:type="page"/>
       </w:r>
@@ -6452,8 +6482,8 @@
           <w:color w:val="FF0000"/>
         </w:rPr>
       </w:pPr>
-      <w:bookmarkStart w:id="22" w:name="_mkvs2qyhhbcp" w:colFirst="0" w:colLast="0"/>
-      <w:bookmarkEnd w:id="22"/>
+      <w:bookmarkStart w:id="27" w:name="_mkvs2qyhhbcp" w:colFirst="0" w:colLast="0"/>
+      <w:bookmarkEnd w:id="27"/>
     </w:p>
     <w:p>
       <w:pPr>
@@ -6473,8 +6503,8 @@
           <w:color w:val="000000"/>
         </w:rPr>
       </w:pPr>
-      <w:bookmarkStart w:id="23" w:name="_8zxqz5wgmdxn" w:colFirst="0" w:colLast="0"/>
-      <w:bookmarkEnd w:id="23"/>
+      <w:bookmarkStart w:id="28" w:name="_8zxqz5wgmdxn" w:colFirst="0" w:colLast="0"/>
+      <w:bookmarkEnd w:id="28"/>
       <w:r>
         <w:br w:type="page"/>
       </w:r>
@@ -6521,8 +6551,8 @@
           <w:color w:val="000000"/>
         </w:rPr>
       </w:pPr>
-      <w:bookmarkStart w:id="24" w:name="_vu8skbkjafvu"/>
-      <w:bookmarkEnd w:id="24"/>
+      <w:bookmarkStart w:id="29" w:name="_vu8skbkjafvu"/>
+      <w:bookmarkEnd w:id="29"/>
       <w:r>
         <w:br w:type="page"/>
       </w:r>
@@ -6550,13 +6580,8 @@
         </w:rPr>
         <w:t xml:space="preserve">Medication Management of the Community-Dwelling Older Adult. In: Patient Safety and Quality: An Evidence-Based Handbook for Nurses. </w:t>
       </w:r>
-      <w:proofErr w:type="spellStart"/>
-      <w:r>
-        <w:t>Rockville</w:t>
-      </w:r>
-      <w:proofErr w:type="spellEnd"/>
-      <w:r>
-        <w:t>: AHRQ, 2008.</w:t>
+      <w:r>
+        <w:t>Rockville: AHRQ, 2008.</w:t>
       </w:r>
       <w:r>
         <w:t xml:space="preserve"> </w:t>
@@ -6631,8 +6656,8 @@
           <w:color w:val="000000"/>
         </w:rPr>
       </w:pPr>
-      <w:bookmarkStart w:id="25" w:name="_amvst46n8d5f" w:colFirst="0" w:colLast="0"/>
-      <w:bookmarkEnd w:id="25"/>
+      <w:bookmarkStart w:id="30" w:name="_amvst46n8d5f" w:colFirst="0" w:colLast="0"/>
+      <w:bookmarkEnd w:id="30"/>
       <w:r>
         <w:br w:type="page"/>
       </w:r>
@@ -6648,15 +6673,7 @@
     </w:p>
     <w:p>
       <w:r>
-        <w:t>O cronograma do projeto está disponível na pasta “</w:t>
-      </w:r>
-      <w:proofErr w:type="spellStart"/>
-      <w:r>
-        <w:t>ApêndiceA</w:t>
-      </w:r>
-      <w:proofErr w:type="spellEnd"/>
-      <w:r>
-        <w:t>” que acompanha este documento.</w:t>
+        <w:t>O cronograma do projeto está disponível na pasta “ApêndiceA” que acompanha este documento.</w:t>
       </w:r>
     </w:p>
     <w:p>
@@ -6677,8 +6694,8 @@
           <w:color w:val="000000"/>
         </w:rPr>
       </w:pPr>
-      <w:bookmarkStart w:id="26" w:name="_9qjp406jcxub" w:colFirst="0" w:colLast="0"/>
-      <w:bookmarkEnd w:id="26"/>
+      <w:bookmarkStart w:id="31" w:name="_9qjp406jcxub" w:colFirst="0" w:colLast="0"/>
+      <w:bookmarkEnd w:id="31"/>
       <w:r>
         <w:br w:type="page"/>
       </w:r>
@@ -6694,15 +6711,7 @@
     </w:p>
     <w:p>
       <w:r>
-        <w:t>Os requisitos estão disponíveis na pasta “</w:t>
-      </w:r>
-      <w:proofErr w:type="spellStart"/>
-      <w:r>
-        <w:t>ApêndiceB</w:t>
-      </w:r>
-      <w:proofErr w:type="spellEnd"/>
-      <w:r>
-        <w:t>” que acompanha este documento.</w:t>
+        <w:t>Os requisitos estão disponíveis na pasta “ApêndiceB” que acompanha este documento.</w:t>
       </w:r>
     </w:p>
     <w:p>
@@ -6723,8 +6732,8 @@
           <w:color w:val="000000"/>
         </w:rPr>
       </w:pPr>
-      <w:bookmarkStart w:id="27" w:name="_io2bxhhvd09c" w:colFirst="0" w:colLast="0"/>
-      <w:bookmarkEnd w:id="27"/>
+      <w:bookmarkStart w:id="32" w:name="_io2bxhhvd09c" w:colFirst="0" w:colLast="0"/>
+      <w:bookmarkEnd w:id="32"/>
       <w:r>
         <w:br w:type="page"/>
       </w:r>
@@ -6740,15 +6749,7 @@
     </w:p>
     <w:p>
       <w:r>
-        <w:t>Os requisitos estão disponíveis na pasta “</w:t>
-      </w:r>
-      <w:proofErr w:type="spellStart"/>
-      <w:r>
-        <w:t>ApêndiceC</w:t>
-      </w:r>
-      <w:proofErr w:type="spellEnd"/>
-      <w:r>
-        <w:t>” que acompanha este documento.</w:t>
+        <w:t>Os requisitos estão disponíveis na pasta “ApêndiceC” que acompanha este documento.</w:t>
       </w:r>
     </w:p>
     <w:p/>
@@ -6773,8 +6774,8 @@
       </w:pPr>
     </w:p>
     <w:sectPr>
-      <w:headerReference w:type="default" r:id="rId17"/>
-      <w:headerReference w:type="first" r:id="rId18"/>
+      <w:headerReference w:type="default" r:id="rId16"/>
+      <w:headerReference w:type="first" r:id="rId17"/>
       <w:pgSz w:w="11907" w:h="16840"/>
       <w:pgMar w:top="1699" w:right="1138" w:bottom="1238" w:left="1699" w:header="720" w:footer="720" w:gutter="0"/>
       <w:cols w:space="720"/>
@@ -6785,7 +6786,7 @@
 </file>
 
 <file path=word/endnotes.xml><?xml version="1.0" encoding="utf-8"?>
-<w:endnotes xmlns:wpc="http://schemas.microsoft.com/office/word/2010/wordprocessingCanvas" xmlns:mc="http://schemas.openxmlformats.org/markup-compatibility/2006" xmlns:o="urn:schemas-microsoft-com:office:office" xmlns:r="http://schemas.openxmlformats.org/officeDocument/2006/relationships" xmlns:m="http://schemas.openxmlformats.org/officeDocument/2006/math" xmlns:v="urn:schemas-microsoft-com:vml" xmlns:wp14="http://schemas.microsoft.com/office/word/2010/wordprocessingDrawing" xmlns:wp="http://schemas.openxmlformats.org/drawingml/2006/wordprocessingDrawing" xmlns:w10="urn:schemas-microsoft-com:office:word" xmlns:w="http://schemas.openxmlformats.org/wordprocessingml/2006/main" xmlns:w14="http://schemas.microsoft.com/office/word/2010/wordml" xmlns:wpg="http://schemas.microsoft.com/office/word/2010/wordprocessingGroup" xmlns:wpi="http://schemas.microsoft.com/office/word/2010/wordprocessingInk" xmlns:wne="http://schemas.microsoft.com/office/word/2006/wordml" xmlns:wps="http://schemas.microsoft.com/office/word/2010/wordprocessingShape" mc:Ignorable="w14 wp14">
+<w:endnotes xmlns:wpc="http://schemas.microsoft.com/office/word/2010/wordprocessingCanvas" xmlns:cx="http://schemas.microsoft.com/office/drawing/2014/chartex" xmlns:mc="http://schemas.openxmlformats.org/markup-compatibility/2006" xmlns:o="urn:schemas-microsoft-com:office:office" xmlns:r="http://schemas.openxmlformats.org/officeDocument/2006/relationships" xmlns:m="http://schemas.openxmlformats.org/officeDocument/2006/math" xmlns:v="urn:schemas-microsoft-com:vml" xmlns:wp14="http://schemas.microsoft.com/office/word/2010/wordprocessingDrawing" xmlns:wp="http://schemas.openxmlformats.org/drawingml/2006/wordprocessingDrawing" xmlns:w10="urn:schemas-microsoft-com:office:word" xmlns:w="http://schemas.openxmlformats.org/wordprocessingml/2006/main" xmlns:w14="http://schemas.microsoft.com/office/word/2010/wordml" xmlns:w15="http://schemas.microsoft.com/office/word/2012/wordml" xmlns:w16se="http://schemas.microsoft.com/office/word/2015/wordml/symex" xmlns:wpg="http://schemas.microsoft.com/office/word/2010/wordprocessingGroup" xmlns:wpi="http://schemas.microsoft.com/office/word/2010/wordprocessingInk" xmlns:wne="http://schemas.microsoft.com/office/word/2006/wordml" xmlns:wps="http://schemas.microsoft.com/office/word/2010/wordprocessingShape" mc:Ignorable="w14 w15 w16se wp14">
   <w:endnote w:type="separator" w:id="-1">
     <w:p>
       <w:pPr>
@@ -6810,7 +6811,7 @@
 </file>
 
 <file path=word/footnotes.xml><?xml version="1.0" encoding="utf-8"?>
-<w:footnotes xmlns:wpc="http://schemas.microsoft.com/office/word/2010/wordprocessingCanvas" xmlns:mc="http://schemas.openxmlformats.org/markup-compatibility/2006" xmlns:o="urn:schemas-microsoft-com:office:office" xmlns:r="http://schemas.openxmlformats.org/officeDocument/2006/relationships" xmlns:m="http://schemas.openxmlformats.org/officeDocument/2006/math" xmlns:v="urn:schemas-microsoft-com:vml" xmlns:wp14="http://schemas.microsoft.com/office/word/2010/wordprocessingDrawing" xmlns:wp="http://schemas.openxmlformats.org/drawingml/2006/wordprocessingDrawing" xmlns:w10="urn:schemas-microsoft-com:office:word" xmlns:w="http://schemas.openxmlformats.org/wordprocessingml/2006/main" xmlns:w14="http://schemas.microsoft.com/office/word/2010/wordml" xmlns:wpg="http://schemas.microsoft.com/office/word/2010/wordprocessingGroup" xmlns:wpi="http://schemas.microsoft.com/office/word/2010/wordprocessingInk" xmlns:wne="http://schemas.microsoft.com/office/word/2006/wordml" xmlns:wps="http://schemas.microsoft.com/office/word/2010/wordprocessingShape" mc:Ignorable="w14 wp14">
+<w:footnotes xmlns:wpc="http://schemas.microsoft.com/office/word/2010/wordprocessingCanvas" xmlns:cx="http://schemas.microsoft.com/office/drawing/2014/chartex" xmlns:mc="http://schemas.openxmlformats.org/markup-compatibility/2006" xmlns:o="urn:schemas-microsoft-com:office:office" xmlns:r="http://schemas.openxmlformats.org/officeDocument/2006/relationships" xmlns:m="http://schemas.openxmlformats.org/officeDocument/2006/math" xmlns:v="urn:schemas-microsoft-com:vml" xmlns:wp14="http://schemas.microsoft.com/office/word/2010/wordprocessingDrawing" xmlns:wp="http://schemas.openxmlformats.org/drawingml/2006/wordprocessingDrawing" xmlns:w10="urn:schemas-microsoft-com:office:word" xmlns:w="http://schemas.openxmlformats.org/wordprocessingml/2006/main" xmlns:w14="http://schemas.microsoft.com/office/word/2010/wordml" xmlns:w15="http://schemas.microsoft.com/office/word/2012/wordml" xmlns:w16se="http://schemas.microsoft.com/office/word/2015/wordml/symex" xmlns:wpg="http://schemas.microsoft.com/office/word/2010/wordprocessingGroup" xmlns:wpi="http://schemas.microsoft.com/office/word/2010/wordprocessingInk" xmlns:wne="http://schemas.microsoft.com/office/word/2006/wordml" xmlns:wps="http://schemas.microsoft.com/office/word/2010/wordprocessingShape" mc:Ignorable="w14 w15 w16se wp14">
   <w:footnote w:type="separator" w:id="-1">
     <w:p>
       <w:pPr>
@@ -6835,7 +6836,7 @@
 </file>
 
 <file path=word/header1.xml><?xml version="1.0" encoding="utf-8"?>
-<w:hdr xmlns:wpc="http://schemas.microsoft.com/office/word/2010/wordprocessingCanvas" xmlns:mc="http://schemas.openxmlformats.org/markup-compatibility/2006" xmlns:o="urn:schemas-microsoft-com:office:office" xmlns:r="http://schemas.openxmlformats.org/officeDocument/2006/relationships" xmlns:m="http://schemas.openxmlformats.org/officeDocument/2006/math" xmlns:v="urn:schemas-microsoft-com:vml" xmlns:wp14="http://schemas.microsoft.com/office/word/2010/wordprocessingDrawing" xmlns:wp="http://schemas.openxmlformats.org/drawingml/2006/wordprocessingDrawing" xmlns:w10="urn:schemas-microsoft-com:office:word" xmlns:w="http://schemas.openxmlformats.org/wordprocessingml/2006/main" xmlns:w14="http://schemas.microsoft.com/office/word/2010/wordml" xmlns:wpg="http://schemas.microsoft.com/office/word/2010/wordprocessingGroup" xmlns:wpi="http://schemas.microsoft.com/office/word/2010/wordprocessingInk" xmlns:wne="http://schemas.microsoft.com/office/word/2006/wordml" xmlns:wps="http://schemas.microsoft.com/office/word/2010/wordprocessingShape" mc:Ignorable="w14 wp14">
+<w:hdr xmlns:wpc="http://schemas.microsoft.com/office/word/2010/wordprocessingCanvas" xmlns:cx="http://schemas.microsoft.com/office/drawing/2014/chartex" xmlns:mc="http://schemas.openxmlformats.org/markup-compatibility/2006" xmlns:o="urn:schemas-microsoft-com:office:office" xmlns:r="http://schemas.openxmlformats.org/officeDocument/2006/relationships" xmlns:m="http://schemas.openxmlformats.org/officeDocument/2006/math" xmlns:v="urn:schemas-microsoft-com:vml" xmlns:wp14="http://schemas.microsoft.com/office/word/2010/wordprocessingDrawing" xmlns:wp="http://schemas.openxmlformats.org/drawingml/2006/wordprocessingDrawing" xmlns:w10="urn:schemas-microsoft-com:office:word" xmlns:w="http://schemas.openxmlformats.org/wordprocessingml/2006/main" xmlns:w14="http://schemas.microsoft.com/office/word/2010/wordml" xmlns:w15="http://schemas.microsoft.com/office/word/2012/wordml" xmlns:w16se="http://schemas.microsoft.com/office/word/2015/wordml/symex" xmlns:wpg="http://schemas.microsoft.com/office/word/2010/wordprocessingGroup" xmlns:wpi="http://schemas.microsoft.com/office/word/2010/wordprocessingInk" xmlns:wne="http://schemas.microsoft.com/office/word/2006/wordml" xmlns:wps="http://schemas.microsoft.com/office/word/2010/wordprocessingShape" mc:Ignorable="w14 w15 w16se wp14">
   <w:p>
     <w:pPr>
       <w:pBdr>
@@ -6896,7 +6897,7 @@
 </file>
 
 <file path=word/header2.xml><?xml version="1.0" encoding="utf-8"?>
-<w:hdr xmlns:wpc="http://schemas.microsoft.com/office/word/2010/wordprocessingCanvas" xmlns:mc="http://schemas.openxmlformats.org/markup-compatibility/2006" xmlns:o="urn:schemas-microsoft-com:office:office" xmlns:r="http://schemas.openxmlformats.org/officeDocument/2006/relationships" xmlns:m="http://schemas.openxmlformats.org/officeDocument/2006/math" xmlns:v="urn:schemas-microsoft-com:vml" xmlns:wp14="http://schemas.microsoft.com/office/word/2010/wordprocessingDrawing" xmlns:wp="http://schemas.openxmlformats.org/drawingml/2006/wordprocessingDrawing" xmlns:w10="urn:schemas-microsoft-com:office:word" xmlns:w="http://schemas.openxmlformats.org/wordprocessingml/2006/main" xmlns:w14="http://schemas.microsoft.com/office/word/2010/wordml" xmlns:wpg="http://schemas.microsoft.com/office/word/2010/wordprocessingGroup" xmlns:wpi="http://schemas.microsoft.com/office/word/2010/wordprocessingInk" xmlns:wne="http://schemas.microsoft.com/office/word/2006/wordml" xmlns:wps="http://schemas.microsoft.com/office/word/2010/wordprocessingShape" mc:Ignorable="w14 wp14">
+<w:hdr xmlns:wpc="http://schemas.microsoft.com/office/word/2010/wordprocessingCanvas" xmlns:cx="http://schemas.microsoft.com/office/drawing/2014/chartex" xmlns:mc="http://schemas.openxmlformats.org/markup-compatibility/2006" xmlns:o="urn:schemas-microsoft-com:office:office" xmlns:r="http://schemas.openxmlformats.org/officeDocument/2006/relationships" xmlns:m="http://schemas.openxmlformats.org/officeDocument/2006/math" xmlns:v="urn:schemas-microsoft-com:vml" xmlns:wp14="http://schemas.microsoft.com/office/word/2010/wordprocessingDrawing" xmlns:wp="http://schemas.openxmlformats.org/drawingml/2006/wordprocessingDrawing" xmlns:w10="urn:schemas-microsoft-com:office:word" xmlns:w="http://schemas.openxmlformats.org/wordprocessingml/2006/main" xmlns:w14="http://schemas.microsoft.com/office/word/2010/wordml" xmlns:w15="http://schemas.microsoft.com/office/word/2012/wordml" xmlns:w16se="http://schemas.microsoft.com/office/word/2015/wordml/symex" xmlns:wpg="http://schemas.microsoft.com/office/word/2010/wordprocessingGroup" xmlns:wpi="http://schemas.microsoft.com/office/word/2010/wordprocessingInk" xmlns:wne="http://schemas.microsoft.com/office/word/2006/wordml" xmlns:wps="http://schemas.microsoft.com/office/word/2010/wordprocessingShape" mc:Ignorable="w14 w15 w16se wp14">
   <w:p>
     <w:pPr>
       <w:pBdr>
@@ -6938,7 +6939,7 @@
         <w:noProof/>
         <w:color w:val="000000"/>
       </w:rPr>
-      <w:t>2</w:t>
+      <w:t>9</w:t>
     </w:r>
     <w:r>
       <w:rPr>
@@ -6970,7 +6971,7 @@
 </file>
 
 <file path=word/header3.xml><?xml version="1.0" encoding="utf-8"?>
-<w:hdr xmlns:wpc="http://schemas.microsoft.com/office/word/2010/wordprocessingCanvas" xmlns:mc="http://schemas.openxmlformats.org/markup-compatibility/2006" xmlns:o="urn:schemas-microsoft-com:office:office" xmlns:r="http://schemas.openxmlformats.org/officeDocument/2006/relationships" xmlns:m="http://schemas.openxmlformats.org/officeDocument/2006/math" xmlns:v="urn:schemas-microsoft-com:vml" xmlns:wp14="http://schemas.microsoft.com/office/word/2010/wordprocessingDrawing" xmlns:wp="http://schemas.openxmlformats.org/drawingml/2006/wordprocessingDrawing" xmlns:w10="urn:schemas-microsoft-com:office:word" xmlns:w="http://schemas.openxmlformats.org/wordprocessingml/2006/main" xmlns:w14="http://schemas.microsoft.com/office/word/2010/wordml" xmlns:wpg="http://schemas.microsoft.com/office/word/2010/wordprocessingGroup" xmlns:wpi="http://schemas.microsoft.com/office/word/2010/wordprocessingInk" xmlns:wne="http://schemas.microsoft.com/office/word/2006/wordml" xmlns:wps="http://schemas.microsoft.com/office/word/2010/wordprocessingShape" mc:Ignorable="w14 wp14">
+<w:hdr xmlns:wpc="http://schemas.microsoft.com/office/word/2010/wordprocessingCanvas" xmlns:cx="http://schemas.microsoft.com/office/drawing/2014/chartex" xmlns:mc="http://schemas.openxmlformats.org/markup-compatibility/2006" xmlns:o="urn:schemas-microsoft-com:office:office" xmlns:r="http://schemas.openxmlformats.org/officeDocument/2006/relationships" xmlns:m="http://schemas.openxmlformats.org/officeDocument/2006/math" xmlns:v="urn:schemas-microsoft-com:vml" xmlns:wp14="http://schemas.microsoft.com/office/word/2010/wordprocessingDrawing" xmlns:wp="http://schemas.openxmlformats.org/drawingml/2006/wordprocessingDrawing" xmlns:w10="urn:schemas-microsoft-com:office:word" xmlns:w="http://schemas.openxmlformats.org/wordprocessingml/2006/main" xmlns:w14="http://schemas.microsoft.com/office/word/2010/wordml" xmlns:w15="http://schemas.microsoft.com/office/word/2012/wordml" xmlns:w16se="http://schemas.microsoft.com/office/word/2015/wordml/symex" xmlns:wpg="http://schemas.microsoft.com/office/word/2010/wordprocessingGroup" xmlns:wpi="http://schemas.microsoft.com/office/word/2010/wordprocessingInk" xmlns:wne="http://schemas.microsoft.com/office/word/2006/wordml" xmlns:wps="http://schemas.microsoft.com/office/word/2010/wordprocessingShape" mc:Ignorable="w14 w15 w16se wp14">
   <w:p>
     <w:pPr>
       <w:pBdr>
@@ -7012,7 +7013,7 @@
 </file>
 
 <file path=word/header4.xml><?xml version="1.0" encoding="utf-8"?>
-<w:hdr xmlns:wpc="http://schemas.microsoft.com/office/word/2010/wordprocessingCanvas" xmlns:mc="http://schemas.openxmlformats.org/markup-compatibility/2006" xmlns:o="urn:schemas-microsoft-com:office:office" xmlns:r="http://schemas.openxmlformats.org/officeDocument/2006/relationships" xmlns:m="http://schemas.openxmlformats.org/officeDocument/2006/math" xmlns:v="urn:schemas-microsoft-com:vml" xmlns:wp14="http://schemas.microsoft.com/office/word/2010/wordprocessingDrawing" xmlns:wp="http://schemas.openxmlformats.org/drawingml/2006/wordprocessingDrawing" xmlns:w10="urn:schemas-microsoft-com:office:word" xmlns:w="http://schemas.openxmlformats.org/wordprocessingml/2006/main" xmlns:w14="http://schemas.microsoft.com/office/word/2010/wordml" xmlns:wpg="http://schemas.microsoft.com/office/word/2010/wordprocessingGroup" xmlns:wpi="http://schemas.microsoft.com/office/word/2010/wordprocessingInk" xmlns:wne="http://schemas.microsoft.com/office/word/2006/wordml" xmlns:wps="http://schemas.microsoft.com/office/word/2010/wordprocessingShape" mc:Ignorable="w14 wp14">
+<w:hdr xmlns:wpc="http://schemas.microsoft.com/office/word/2010/wordprocessingCanvas" xmlns:cx="http://schemas.microsoft.com/office/drawing/2014/chartex" xmlns:mc="http://schemas.openxmlformats.org/markup-compatibility/2006" xmlns:o="urn:schemas-microsoft-com:office:office" xmlns:r="http://schemas.openxmlformats.org/officeDocument/2006/relationships" xmlns:m="http://schemas.openxmlformats.org/officeDocument/2006/math" xmlns:v="urn:schemas-microsoft-com:vml" xmlns:wp14="http://schemas.microsoft.com/office/word/2010/wordprocessingDrawing" xmlns:wp="http://schemas.openxmlformats.org/drawingml/2006/wordprocessingDrawing" xmlns:w10="urn:schemas-microsoft-com:office:word" xmlns:w="http://schemas.openxmlformats.org/wordprocessingml/2006/main" xmlns:w14="http://schemas.microsoft.com/office/word/2010/wordml" xmlns:w15="http://schemas.microsoft.com/office/word/2012/wordml" xmlns:w16se="http://schemas.microsoft.com/office/word/2015/wordml/symex" xmlns:wpg="http://schemas.microsoft.com/office/word/2010/wordprocessingGroup" xmlns:wpi="http://schemas.microsoft.com/office/word/2010/wordprocessingInk" xmlns:wne="http://schemas.microsoft.com/office/word/2006/wordml" xmlns:wps="http://schemas.microsoft.com/office/word/2010/wordprocessingShape" mc:Ignorable="w14 w15 w16se wp14">
   <w:p>
     <w:pPr>
       <w:pBdr>
@@ -7054,7 +7055,7 @@
         <w:noProof/>
         <w:color w:val="000000"/>
       </w:rPr>
-      <w:t>11</w:t>
+      <w:t>17</w:t>
     </w:r>
     <w:r>
       <w:rPr>
@@ -7086,7 +7087,7 @@
 </file>
 
 <file path=word/header5.xml><?xml version="1.0" encoding="utf-8"?>
-<w:hdr xmlns:wpc="http://schemas.microsoft.com/office/word/2010/wordprocessingCanvas" xmlns:mc="http://schemas.openxmlformats.org/markup-compatibility/2006" xmlns:o="urn:schemas-microsoft-com:office:office" xmlns:r="http://schemas.openxmlformats.org/officeDocument/2006/relationships" xmlns:m="http://schemas.openxmlformats.org/officeDocument/2006/math" xmlns:v="urn:schemas-microsoft-com:vml" xmlns:wp14="http://schemas.microsoft.com/office/word/2010/wordprocessingDrawing" xmlns:wp="http://schemas.openxmlformats.org/drawingml/2006/wordprocessingDrawing" xmlns:w10="urn:schemas-microsoft-com:office:word" xmlns:w="http://schemas.openxmlformats.org/wordprocessingml/2006/main" xmlns:w14="http://schemas.microsoft.com/office/word/2010/wordml" xmlns:wpg="http://schemas.microsoft.com/office/word/2010/wordprocessingGroup" xmlns:wpi="http://schemas.microsoft.com/office/word/2010/wordprocessingInk" xmlns:wne="http://schemas.microsoft.com/office/word/2006/wordml" xmlns:wps="http://schemas.microsoft.com/office/word/2010/wordprocessingShape" mc:Ignorable="w14 wp14">
+<w:hdr xmlns:wpc="http://schemas.microsoft.com/office/word/2010/wordprocessingCanvas" xmlns:cx="http://schemas.microsoft.com/office/drawing/2014/chartex" xmlns:mc="http://schemas.openxmlformats.org/markup-compatibility/2006" xmlns:o="urn:schemas-microsoft-com:office:office" xmlns:r="http://schemas.openxmlformats.org/officeDocument/2006/relationships" xmlns:m="http://schemas.openxmlformats.org/officeDocument/2006/math" xmlns:v="urn:schemas-microsoft-com:vml" xmlns:wp14="http://schemas.microsoft.com/office/word/2010/wordprocessingDrawing" xmlns:wp="http://schemas.openxmlformats.org/drawingml/2006/wordprocessingDrawing" xmlns:w10="urn:schemas-microsoft-com:office:word" xmlns:w="http://schemas.openxmlformats.org/wordprocessingml/2006/main" xmlns:w14="http://schemas.microsoft.com/office/word/2010/wordml" xmlns:w15="http://schemas.microsoft.com/office/word/2012/wordml" xmlns:w16se="http://schemas.microsoft.com/office/word/2015/wordml/symex" xmlns:wpg="http://schemas.microsoft.com/office/word/2010/wordprocessingGroup" xmlns:wpi="http://schemas.microsoft.com/office/word/2010/wordprocessingInk" xmlns:wne="http://schemas.microsoft.com/office/word/2006/wordml" xmlns:wps="http://schemas.microsoft.com/office/word/2010/wordprocessingShape" mc:Ignorable="w14 w15 w16se wp14">
   <w:p>
     <w:pPr>
       <w:pBdr>
@@ -7147,8 +7148,8 @@
 </file>
 
 <file path=word/numbering.xml><?xml version="1.0" encoding="utf-8"?>
-<w:numbering xmlns:wpc="http://schemas.microsoft.com/office/word/2010/wordprocessingCanvas" xmlns:mc="http://schemas.openxmlformats.org/markup-compatibility/2006" xmlns:o="urn:schemas-microsoft-com:office:office" xmlns:r="http://schemas.openxmlformats.org/officeDocument/2006/relationships" xmlns:m="http://schemas.openxmlformats.org/officeDocument/2006/math" xmlns:v="urn:schemas-microsoft-com:vml" xmlns:wp14="http://schemas.microsoft.com/office/word/2010/wordprocessingDrawing" xmlns:wp="http://schemas.openxmlformats.org/drawingml/2006/wordprocessingDrawing" xmlns:w10="urn:schemas-microsoft-com:office:word" xmlns:w="http://schemas.openxmlformats.org/wordprocessingml/2006/main" xmlns:w14="http://schemas.microsoft.com/office/word/2010/wordml" xmlns:wpg="http://schemas.microsoft.com/office/word/2010/wordprocessingGroup" xmlns:wpi="http://schemas.microsoft.com/office/word/2010/wordprocessingInk" xmlns:wne="http://schemas.microsoft.com/office/word/2006/wordml" xmlns:wps="http://schemas.microsoft.com/office/word/2010/wordprocessingShape" mc:Ignorable="w14 wp14">
-  <w:abstractNum w:abstractNumId="0">
+<w:numbering xmlns:wpc="http://schemas.microsoft.com/office/word/2010/wordprocessingCanvas" xmlns:cx="http://schemas.microsoft.com/office/drawing/2014/chartex" xmlns:mc="http://schemas.openxmlformats.org/markup-compatibility/2006" xmlns:o="urn:schemas-microsoft-com:office:office" xmlns:r="http://schemas.openxmlformats.org/officeDocument/2006/relationships" xmlns:m="http://schemas.openxmlformats.org/officeDocument/2006/math" xmlns:v="urn:schemas-microsoft-com:vml" xmlns:wp14="http://schemas.microsoft.com/office/word/2010/wordprocessingDrawing" xmlns:wp="http://schemas.openxmlformats.org/drawingml/2006/wordprocessingDrawing" xmlns:w10="urn:schemas-microsoft-com:office:word" xmlns:w="http://schemas.openxmlformats.org/wordprocessingml/2006/main" xmlns:w14="http://schemas.microsoft.com/office/word/2010/wordml" xmlns:w15="http://schemas.microsoft.com/office/word/2012/wordml" xmlns:w16se="http://schemas.microsoft.com/office/word/2015/wordml/symex" xmlns:wpg="http://schemas.microsoft.com/office/word/2010/wordprocessingGroup" xmlns:wpi="http://schemas.microsoft.com/office/word/2010/wordprocessingInk" xmlns:wne="http://schemas.microsoft.com/office/word/2006/wordml" xmlns:wps="http://schemas.microsoft.com/office/word/2010/wordprocessingShape" mc:Ignorable="w14 w15 w16se wp14">
+  <w:abstractNum w:abstractNumId="0" w15:restartNumberingAfterBreak="0">
     <w:nsid w:val="07DE711C"/>
     <w:multiLevelType w:val="multilevel"/>
     <w:tmpl w:val="0E425538"/>
@@ -7268,7 +7269,7 @@
 </file>
 
 <file path=word/styles.xml><?xml version="1.0" encoding="utf-8"?>
-<w:styles xmlns:mc="http://schemas.openxmlformats.org/markup-compatibility/2006" xmlns:r="http://schemas.openxmlformats.org/officeDocument/2006/relationships" xmlns:w="http://schemas.openxmlformats.org/wordprocessingml/2006/main" xmlns:w14="http://schemas.microsoft.com/office/word/2010/wordml" mc:Ignorable="w14">
+<w:styles xmlns:mc="http://schemas.openxmlformats.org/markup-compatibility/2006" xmlns:r="http://schemas.openxmlformats.org/officeDocument/2006/relationships" xmlns:w="http://schemas.openxmlformats.org/wordprocessingml/2006/main" xmlns:w14="http://schemas.microsoft.com/office/word/2010/wordml" xmlns:w15="http://schemas.microsoft.com/office/word/2012/wordml" xmlns:w16se="http://schemas.microsoft.com/office/word/2015/wordml/symex" mc:Ignorable="w14 w15 w16se">
   <w:docDefaults>
     <w:rPrDefault>
       <w:rPr>
@@ -7284,144 +7285,378 @@
       </w:pPr>
     </w:pPrDefault>
   </w:docDefaults>
-  <w:latentStyles w:defLockedState="0" w:defUIPriority="99" w:defSemiHidden="1" w:defUnhideWhenUsed="1" w:defQFormat="0" w:count="267">
-    <w:lsdException w:name="Normal" w:semiHidden="0" w:uiPriority="0" w:unhideWhenUsed="0" w:qFormat="1"/>
-    <w:lsdException w:name="heading 1" w:semiHidden="0" w:uiPriority="9" w:unhideWhenUsed="0" w:qFormat="1"/>
-    <w:lsdException w:name="heading 2" w:uiPriority="9" w:qFormat="1"/>
-    <w:lsdException w:name="heading 3" w:uiPriority="9" w:qFormat="1"/>
-    <w:lsdException w:name="heading 4" w:uiPriority="9" w:qFormat="1"/>
-    <w:lsdException w:name="heading 5" w:uiPriority="9" w:qFormat="1"/>
-    <w:lsdException w:name="heading 6" w:uiPriority="9" w:qFormat="1"/>
-    <w:lsdException w:name="heading 7" w:uiPriority="9" w:qFormat="1"/>
-    <w:lsdException w:name="heading 8" w:uiPriority="9" w:qFormat="1"/>
-    <w:lsdException w:name="heading 9" w:uiPriority="9" w:qFormat="1"/>
-    <w:lsdException w:name="toc 1" w:uiPriority="39"/>
-    <w:lsdException w:name="toc 2" w:uiPriority="39"/>
-    <w:lsdException w:name="toc 3" w:uiPriority="39"/>
-    <w:lsdException w:name="toc 4" w:uiPriority="39"/>
-    <w:lsdException w:name="toc 5" w:uiPriority="39"/>
-    <w:lsdException w:name="toc 6" w:uiPriority="39"/>
-    <w:lsdException w:name="toc 7" w:uiPriority="39"/>
-    <w:lsdException w:name="toc 8" w:uiPriority="39"/>
-    <w:lsdException w:name="toc 9" w:uiPriority="39"/>
-    <w:lsdException w:name="caption" w:uiPriority="35" w:qFormat="1"/>
-    <w:lsdException w:name="Title" w:semiHidden="0" w:uiPriority="10" w:unhideWhenUsed="0" w:qFormat="1"/>
-    <w:lsdException w:name="Default Paragraph Font" w:uiPriority="1"/>
-    <w:lsdException w:name="Subtitle" w:semiHidden="0" w:uiPriority="11" w:unhideWhenUsed="0" w:qFormat="1"/>
-    <w:lsdException w:name="Strong" w:semiHidden="0" w:uiPriority="22" w:unhideWhenUsed="0" w:qFormat="1"/>
-    <w:lsdException w:name="Emphasis" w:semiHidden="0" w:uiPriority="20" w:unhideWhenUsed="0" w:qFormat="1"/>
-    <w:lsdException w:name="Table Grid" w:semiHidden="0" w:uiPriority="39" w:unhideWhenUsed="0"/>
-    <w:lsdException w:name="Placeholder Text" w:unhideWhenUsed="0"/>
-    <w:lsdException w:name="No Spacing" w:semiHidden="0" w:uiPriority="1" w:unhideWhenUsed="0" w:qFormat="1"/>
-    <w:lsdException w:name="Light Shading" w:semiHidden="0" w:uiPriority="60" w:unhideWhenUsed="0"/>
-    <w:lsdException w:name="Light List" w:semiHidden="0" w:uiPriority="61" w:unhideWhenUsed="0"/>
-    <w:lsdException w:name="Light Grid" w:semiHidden="0" w:uiPriority="62" w:unhideWhenUsed="0"/>
-    <w:lsdException w:name="Medium Shading 1" w:semiHidden="0" w:uiPriority="63" w:unhideWhenUsed="0"/>
-    <w:lsdException w:name="Medium Shading 2" w:semiHidden="0" w:uiPriority="64" w:unhideWhenUsed="0"/>
-    <w:lsdException w:name="Medium List 1" w:semiHidden="0" w:uiPriority="65" w:unhideWhenUsed="0"/>
-    <w:lsdException w:name="Medium List 2" w:semiHidden="0" w:uiPriority="66" w:unhideWhenUsed="0"/>
-    <w:lsdException w:name="Medium Grid 1" w:semiHidden="0" w:uiPriority="67" w:unhideWhenUsed="0"/>
-    <w:lsdException w:name="Medium Grid 2" w:semiHidden="0" w:uiPriority="68" w:unhideWhenUsed="0"/>
-    <w:lsdException w:name="Medium Grid 3" w:semiHidden="0" w:uiPriority="69" w:unhideWhenUsed="0"/>
-    <w:lsdException w:name="Dark List" w:semiHidden="0" w:uiPriority="70" w:unhideWhenUsed="0"/>
-    <w:lsdException w:name="Colorful Shading" w:semiHidden="0" w:uiPriority="71" w:unhideWhenUsed="0"/>
-    <w:lsdException w:name="Colorful List" w:semiHidden="0" w:uiPriority="72" w:unhideWhenUsed="0"/>
-    <w:lsdException w:name="Colorful Grid" w:semiHidden="0" w:uiPriority="73" w:unhideWhenUsed="0"/>
-    <w:lsdException w:name="Light Shading Accent 1" w:semiHidden="0" w:uiPriority="60" w:unhideWhenUsed="0"/>
-    <w:lsdException w:name="Light List Accent 1" w:semiHidden="0" w:uiPriority="61" w:unhideWhenUsed="0"/>
-    <w:lsdException w:name="Light Grid Accent 1" w:semiHidden="0" w:uiPriority="62" w:unhideWhenUsed="0"/>
-    <w:lsdException w:name="Medium Shading 1 Accent 1" w:semiHidden="0" w:uiPriority="63" w:unhideWhenUsed="0"/>
-    <w:lsdException w:name="Medium Shading 2 Accent 1" w:semiHidden="0" w:uiPriority="64" w:unhideWhenUsed="0"/>
-    <w:lsdException w:name="Medium List 1 Accent 1" w:semiHidden="0" w:uiPriority="65" w:unhideWhenUsed="0"/>
-    <w:lsdException w:name="Revision" w:unhideWhenUsed="0"/>
-    <w:lsdException w:name="List Paragraph" w:semiHidden="0" w:uiPriority="34" w:unhideWhenUsed="0" w:qFormat="1"/>
-    <w:lsdException w:name="Quote" w:semiHidden="0" w:uiPriority="29" w:unhideWhenUsed="0" w:qFormat="1"/>
-    <w:lsdException w:name="Intense Quote" w:semiHidden="0" w:uiPriority="30" w:unhideWhenUsed="0" w:qFormat="1"/>
-    <w:lsdException w:name="Medium List 2 Accent 1" w:semiHidden="0" w:uiPriority="66" w:unhideWhenUsed="0"/>
-    <w:lsdException w:name="Medium Grid 1 Accent 1" w:semiHidden="0" w:uiPriority="67" w:unhideWhenUsed="0"/>
-    <w:lsdException w:name="Medium Grid 2 Accent 1" w:semiHidden="0" w:uiPriority="68" w:unhideWhenUsed="0"/>
-    <w:lsdException w:name="Medium Grid 3 Accent 1" w:semiHidden="0" w:uiPriority="69" w:unhideWhenUsed="0"/>
-    <w:lsdException w:name="Dark List Accent 1" w:semiHidden="0" w:uiPriority="70" w:unhideWhenUsed="0"/>
-    <w:lsdException w:name="Colorful Shading Accent 1" w:semiHidden="0" w:uiPriority="71" w:unhideWhenUsed="0"/>
-    <w:lsdException w:name="Colorful List Accent 1" w:semiHidden="0" w:uiPriority="72" w:unhideWhenUsed="0"/>
-    <w:lsdException w:name="Colorful Grid Accent 1" w:semiHidden="0" w:uiPriority="73" w:unhideWhenUsed="0"/>
-    <w:lsdException w:name="Light Shading Accent 2" w:semiHidden="0" w:uiPriority="60" w:unhideWhenUsed="0"/>
-    <w:lsdException w:name="Light List Accent 2" w:semiHidden="0" w:uiPriority="61" w:unhideWhenUsed="0"/>
-    <w:lsdException w:name="Light Grid Accent 2" w:semiHidden="0" w:uiPriority="62" w:unhideWhenUsed="0"/>
-    <w:lsdException w:name="Medium Shading 1 Accent 2" w:semiHidden="0" w:uiPriority="63" w:unhideWhenUsed="0"/>
-    <w:lsdException w:name="Medium Shading 2 Accent 2" w:semiHidden="0" w:uiPriority="64" w:unhideWhenUsed="0"/>
-    <w:lsdException w:name="Medium List 1 Accent 2" w:semiHidden="0" w:uiPriority="65" w:unhideWhenUsed="0"/>
-    <w:lsdException w:name="Medium List 2 Accent 2" w:semiHidden="0" w:uiPriority="66" w:unhideWhenUsed="0"/>
-    <w:lsdException w:name="Medium Grid 1 Accent 2" w:semiHidden="0" w:uiPriority="67" w:unhideWhenUsed="0"/>
-    <w:lsdException w:name="Medium Grid 2 Accent 2" w:semiHidden="0" w:uiPriority="68" w:unhideWhenUsed="0"/>
-    <w:lsdException w:name="Medium Grid 3 Accent 2" w:semiHidden="0" w:uiPriority="69" w:unhideWhenUsed="0"/>
-    <w:lsdException w:name="Dark List Accent 2" w:semiHidden="0" w:uiPriority="70" w:unhideWhenUsed="0"/>
-    <w:lsdException w:name="Colorful Shading Accent 2" w:semiHidden="0" w:uiPriority="71" w:unhideWhenUsed="0"/>
-    <w:lsdException w:name="Colorful List Accent 2" w:semiHidden="0" w:uiPriority="72" w:unhideWhenUsed="0"/>
-    <w:lsdException w:name="Colorful Grid Accent 2" w:semiHidden="0" w:uiPriority="73" w:unhideWhenUsed="0"/>
-    <w:lsdException w:name="Light Shading Accent 3" w:semiHidden="0" w:uiPriority="60" w:unhideWhenUsed="0"/>
-    <w:lsdException w:name="Light List Accent 3" w:semiHidden="0" w:uiPriority="61" w:unhideWhenUsed="0"/>
-    <w:lsdException w:name="Light Grid Accent 3" w:semiHidden="0" w:uiPriority="62" w:unhideWhenUsed="0"/>
-    <w:lsdException w:name="Medium Shading 1 Accent 3" w:semiHidden="0" w:uiPriority="63" w:unhideWhenUsed="0"/>
-    <w:lsdException w:name="Medium Shading 2 Accent 3" w:semiHidden="0" w:uiPriority="64" w:unhideWhenUsed="0"/>
-    <w:lsdException w:name="Medium List 1 Accent 3" w:semiHidden="0" w:uiPriority="65" w:unhideWhenUsed="0"/>
-    <w:lsdException w:name="Medium List 2 Accent 3" w:semiHidden="0" w:uiPriority="66" w:unhideWhenUsed="0"/>
-    <w:lsdException w:name="Medium Grid 1 Accent 3" w:semiHidden="0" w:uiPriority="67" w:unhideWhenUsed="0"/>
-    <w:lsdException w:name="Medium Grid 2 Accent 3" w:semiHidden="0" w:uiPriority="68" w:unhideWhenUsed="0"/>
-    <w:lsdException w:name="Medium Grid 3 Accent 3" w:semiHidden="0" w:uiPriority="69" w:unhideWhenUsed="0"/>
-    <w:lsdException w:name="Dark List Accent 3" w:semiHidden="0" w:uiPriority="70" w:unhideWhenUsed="0"/>
-    <w:lsdException w:name="Colorful Shading Accent 3" w:semiHidden="0" w:uiPriority="71" w:unhideWhenUsed="0"/>
-    <w:lsdException w:name="Colorful List Accent 3" w:semiHidden="0" w:uiPriority="72" w:unhideWhenUsed="0"/>
-    <w:lsdException w:name="Colorful Grid Accent 3" w:semiHidden="0" w:uiPriority="73" w:unhideWhenUsed="0"/>
-    <w:lsdException w:name="Light Shading Accent 4" w:semiHidden="0" w:uiPriority="60" w:unhideWhenUsed="0"/>
-    <w:lsdException w:name="Light List Accent 4" w:semiHidden="0" w:uiPriority="61" w:unhideWhenUsed="0"/>
-    <w:lsdException w:name="Light Grid Accent 4" w:semiHidden="0" w:uiPriority="62" w:unhideWhenUsed="0"/>
-    <w:lsdException w:name="Medium Shading 1 Accent 4" w:semiHidden="0" w:uiPriority="63" w:unhideWhenUsed="0"/>
-    <w:lsdException w:name="Medium Shading 2 Accent 4" w:semiHidden="0" w:uiPriority="64" w:unhideWhenUsed="0"/>
-    <w:lsdException w:name="Medium List 1 Accent 4" w:semiHidden="0" w:uiPriority="65" w:unhideWhenUsed="0"/>
-    <w:lsdException w:name="Medium List 2 Accent 4" w:semiHidden="0" w:uiPriority="66" w:unhideWhenUsed="0"/>
-    <w:lsdException w:name="Medium Grid 1 Accent 4" w:semiHidden="0" w:uiPriority="67" w:unhideWhenUsed="0"/>
-    <w:lsdException w:name="Medium Grid 2 Accent 4" w:semiHidden="0" w:uiPriority="68" w:unhideWhenUsed="0"/>
-    <w:lsdException w:name="Medium Grid 3 Accent 4" w:semiHidden="0" w:uiPriority="69" w:unhideWhenUsed="0"/>
-    <w:lsdException w:name="Dark List Accent 4" w:semiHidden="0" w:uiPriority="70" w:unhideWhenUsed="0"/>
-    <w:lsdException w:name="Colorful Shading Accent 4" w:semiHidden="0" w:uiPriority="71" w:unhideWhenUsed="0"/>
-    <w:lsdException w:name="Colorful List Accent 4" w:semiHidden="0" w:uiPriority="72" w:unhideWhenUsed="0"/>
-    <w:lsdException w:name="Colorful Grid Accent 4" w:semiHidden="0" w:uiPriority="73" w:unhideWhenUsed="0"/>
-    <w:lsdException w:name="Light Shading Accent 5" w:semiHidden="0" w:uiPriority="60" w:unhideWhenUsed="0"/>
-    <w:lsdException w:name="Light List Accent 5" w:semiHidden="0" w:uiPriority="61" w:unhideWhenUsed="0"/>
-    <w:lsdException w:name="Light Grid Accent 5" w:semiHidden="0" w:uiPriority="62" w:unhideWhenUsed="0"/>
-    <w:lsdException w:name="Medium Shading 1 Accent 5" w:semiHidden="0" w:uiPriority="63" w:unhideWhenUsed="0"/>
-    <w:lsdException w:name="Medium Shading 2 Accent 5" w:semiHidden="0" w:uiPriority="64" w:unhideWhenUsed="0"/>
-    <w:lsdException w:name="Medium List 1 Accent 5" w:semiHidden="0" w:uiPriority="65" w:unhideWhenUsed="0"/>
-    <w:lsdException w:name="Medium List 2 Accent 5" w:semiHidden="0" w:uiPriority="66" w:unhideWhenUsed="0"/>
-    <w:lsdException w:name="Medium Grid 1 Accent 5" w:semiHidden="0" w:uiPriority="67" w:unhideWhenUsed="0"/>
-    <w:lsdException w:name="Medium Grid 2 Accent 5" w:semiHidden="0" w:uiPriority="68" w:unhideWhenUsed="0"/>
-    <w:lsdException w:name="Medium Grid 3 Accent 5" w:semiHidden="0" w:uiPriority="69" w:unhideWhenUsed="0"/>
-    <w:lsdException w:name="Dark List Accent 5" w:semiHidden="0" w:uiPriority="70" w:unhideWhenUsed="0"/>
-    <w:lsdException w:name="Colorful Shading Accent 5" w:semiHidden="0" w:uiPriority="71" w:unhideWhenUsed="0"/>
-    <w:lsdException w:name="Colorful List Accent 5" w:semiHidden="0" w:uiPriority="72" w:unhideWhenUsed="0"/>
-    <w:lsdException w:name="Colorful Grid Accent 5" w:semiHidden="0" w:uiPriority="73" w:unhideWhenUsed="0"/>
-    <w:lsdException w:name="Light Shading Accent 6" w:semiHidden="0" w:uiPriority="60" w:unhideWhenUsed="0"/>
-    <w:lsdException w:name="Light List Accent 6" w:semiHidden="0" w:uiPriority="61" w:unhideWhenUsed="0"/>
-    <w:lsdException w:name="Light Grid Accent 6" w:semiHidden="0" w:uiPriority="62" w:unhideWhenUsed="0"/>
-    <w:lsdException w:name="Medium Shading 1 Accent 6" w:semiHidden="0" w:uiPriority="63" w:unhideWhenUsed="0"/>
-    <w:lsdException w:name="Medium Shading 2 Accent 6" w:semiHidden="0" w:uiPriority="64" w:unhideWhenUsed="0"/>
-    <w:lsdException w:name="Medium List 1 Accent 6" w:semiHidden="0" w:uiPriority="65" w:unhideWhenUsed="0"/>
-    <w:lsdException w:name="Medium List 2 Accent 6" w:semiHidden="0" w:uiPriority="66" w:unhideWhenUsed="0"/>
-    <w:lsdException w:name="Medium Grid 1 Accent 6" w:semiHidden="0" w:uiPriority="67" w:unhideWhenUsed="0"/>
-    <w:lsdException w:name="Medium Grid 2 Accent 6" w:semiHidden="0" w:uiPriority="68" w:unhideWhenUsed="0"/>
-    <w:lsdException w:name="Medium Grid 3 Accent 6" w:semiHidden="0" w:uiPriority="69" w:unhideWhenUsed="0"/>
-    <w:lsdException w:name="Dark List Accent 6" w:semiHidden="0" w:uiPriority="70" w:unhideWhenUsed="0"/>
-    <w:lsdException w:name="Colorful Shading Accent 6" w:semiHidden="0" w:uiPriority="71" w:unhideWhenUsed="0"/>
-    <w:lsdException w:name="Colorful List Accent 6" w:semiHidden="0" w:uiPriority="72" w:unhideWhenUsed="0"/>
-    <w:lsdException w:name="Colorful Grid Accent 6" w:semiHidden="0" w:uiPriority="73" w:unhideWhenUsed="0"/>
-    <w:lsdException w:name="Subtle Emphasis" w:semiHidden="0" w:uiPriority="19" w:unhideWhenUsed="0" w:qFormat="1"/>
-    <w:lsdException w:name="Intense Emphasis" w:semiHidden="0" w:uiPriority="21" w:unhideWhenUsed="0" w:qFormat="1"/>
-    <w:lsdException w:name="Subtle Reference" w:semiHidden="0" w:uiPriority="31" w:unhideWhenUsed="0" w:qFormat="1"/>
-    <w:lsdException w:name="Intense Reference" w:semiHidden="0" w:uiPriority="32" w:unhideWhenUsed="0" w:qFormat="1"/>
-    <w:lsdException w:name="Book Title" w:semiHidden="0" w:uiPriority="33" w:unhideWhenUsed="0" w:qFormat="1"/>
-    <w:lsdException w:name="Bibliography" w:uiPriority="37"/>
-    <w:lsdException w:name="TOC Heading" w:uiPriority="39" w:qFormat="1"/>
+  <w:latentStyles w:defLockedState="0" w:defUIPriority="99" w:defSemiHidden="0" w:defUnhideWhenUsed="0" w:defQFormat="0" w:count="371">
+    <w:lsdException w:name="Normal" w:uiPriority="0" w:qFormat="1"/>
+    <w:lsdException w:name="heading 1" w:uiPriority="9" w:qFormat="1"/>
+    <w:lsdException w:name="heading 2" w:semiHidden="1" w:uiPriority="9" w:unhideWhenUsed="1" w:qFormat="1"/>
+    <w:lsdException w:name="heading 3" w:semiHidden="1" w:uiPriority="9" w:unhideWhenUsed="1" w:qFormat="1"/>
+    <w:lsdException w:name="heading 4" w:semiHidden="1" w:uiPriority="9" w:unhideWhenUsed="1" w:qFormat="1"/>
+    <w:lsdException w:name="heading 5" w:semiHidden="1" w:uiPriority="9" w:unhideWhenUsed="1" w:qFormat="1"/>
+    <w:lsdException w:name="heading 6" w:semiHidden="1" w:uiPriority="9" w:unhideWhenUsed="1" w:qFormat="1"/>
+    <w:lsdException w:name="heading 7" w:semiHidden="1" w:uiPriority="9" w:unhideWhenUsed="1" w:qFormat="1"/>
+    <w:lsdException w:name="heading 8" w:semiHidden="1" w:uiPriority="9" w:unhideWhenUsed="1" w:qFormat="1"/>
+    <w:lsdException w:name="heading 9" w:semiHidden="1" w:uiPriority="9" w:unhideWhenUsed="1" w:qFormat="1"/>
+    <w:lsdException w:name="index 1" w:semiHidden="1" w:unhideWhenUsed="1"/>
+    <w:lsdException w:name="index 2" w:semiHidden="1" w:unhideWhenUsed="1"/>
+    <w:lsdException w:name="index 3" w:semiHidden="1" w:unhideWhenUsed="1"/>
+    <w:lsdException w:name="index 4" w:semiHidden="1" w:unhideWhenUsed="1"/>
+    <w:lsdException w:name="index 5" w:semiHidden="1" w:unhideWhenUsed="1"/>
+    <w:lsdException w:name="index 6" w:semiHidden="1" w:unhideWhenUsed="1"/>
+    <w:lsdException w:name="index 7" w:semiHidden="1" w:unhideWhenUsed="1"/>
+    <w:lsdException w:name="index 8" w:semiHidden="1" w:unhideWhenUsed="1"/>
+    <w:lsdException w:name="index 9" w:semiHidden="1" w:unhideWhenUsed="1"/>
+    <w:lsdException w:name="toc 1" w:semiHidden="1" w:uiPriority="39" w:unhideWhenUsed="1"/>
+    <w:lsdException w:name="toc 2" w:semiHidden="1" w:uiPriority="39" w:unhideWhenUsed="1"/>
+    <w:lsdException w:name="toc 3" w:semiHidden="1" w:uiPriority="39" w:unhideWhenUsed="1"/>
+    <w:lsdException w:name="toc 4" w:semiHidden="1" w:uiPriority="39" w:unhideWhenUsed="1"/>
+    <w:lsdException w:name="toc 5" w:semiHidden="1" w:uiPriority="39" w:unhideWhenUsed="1"/>
+    <w:lsdException w:name="toc 6" w:semiHidden="1" w:uiPriority="39" w:unhideWhenUsed="1"/>
+    <w:lsdException w:name="toc 7" w:semiHidden="1" w:uiPriority="39" w:unhideWhenUsed="1"/>
+    <w:lsdException w:name="toc 8" w:semiHidden="1" w:uiPriority="39" w:unhideWhenUsed="1"/>
+    <w:lsdException w:name="toc 9" w:semiHidden="1" w:uiPriority="39" w:unhideWhenUsed="1"/>
+    <w:lsdException w:name="Normal Indent" w:semiHidden="1" w:unhideWhenUsed="1"/>
+    <w:lsdException w:name="footnote text" w:semiHidden="1" w:unhideWhenUsed="1"/>
+    <w:lsdException w:name="annotation text" w:semiHidden="1" w:unhideWhenUsed="1"/>
+    <w:lsdException w:name="header" w:semiHidden="1" w:unhideWhenUsed="1"/>
+    <w:lsdException w:name="footer" w:semiHidden="1" w:unhideWhenUsed="1"/>
+    <w:lsdException w:name="index heading" w:semiHidden="1" w:unhideWhenUsed="1"/>
+    <w:lsdException w:name="caption" w:semiHidden="1" w:uiPriority="35" w:unhideWhenUsed="1" w:qFormat="1"/>
+    <w:lsdException w:name="table of figures" w:semiHidden="1" w:unhideWhenUsed="1"/>
+    <w:lsdException w:name="envelope address" w:semiHidden="1" w:unhideWhenUsed="1"/>
+    <w:lsdException w:name="envelope return" w:semiHidden="1" w:unhideWhenUsed="1"/>
+    <w:lsdException w:name="footnote reference" w:semiHidden="1" w:unhideWhenUsed="1"/>
+    <w:lsdException w:name="annotation reference" w:semiHidden="1" w:unhideWhenUsed="1"/>
+    <w:lsdException w:name="line number" w:semiHidden="1" w:unhideWhenUsed="1"/>
+    <w:lsdException w:name="page number" w:semiHidden="1" w:unhideWhenUsed="1"/>
+    <w:lsdException w:name="endnote reference" w:semiHidden="1" w:unhideWhenUsed="1"/>
+    <w:lsdException w:name="endnote text" w:semiHidden="1" w:unhideWhenUsed="1"/>
+    <w:lsdException w:name="table of authorities" w:semiHidden="1" w:unhideWhenUsed="1"/>
+    <w:lsdException w:name="macro" w:semiHidden="1" w:unhideWhenUsed="1"/>
+    <w:lsdException w:name="toa heading" w:semiHidden="1" w:unhideWhenUsed="1"/>
+    <w:lsdException w:name="List" w:semiHidden="1" w:unhideWhenUsed="1"/>
+    <w:lsdException w:name="List Bullet" w:semiHidden="1" w:unhideWhenUsed="1"/>
+    <w:lsdException w:name="List Number" w:semiHidden="1" w:unhideWhenUsed="1"/>
+    <w:lsdException w:name="List 2" w:semiHidden="1" w:unhideWhenUsed="1"/>
+    <w:lsdException w:name="List 3" w:semiHidden="1" w:unhideWhenUsed="1"/>
+    <w:lsdException w:name="List 4" w:semiHidden="1" w:unhideWhenUsed="1"/>
+    <w:lsdException w:name="List 5" w:semiHidden="1" w:unhideWhenUsed="1"/>
+    <w:lsdException w:name="List Bullet 2" w:semiHidden="1" w:unhideWhenUsed="1"/>
+    <w:lsdException w:name="List Bullet 3" w:semiHidden="1" w:unhideWhenUsed="1"/>
+    <w:lsdException w:name="List Bullet 4" w:semiHidden="1" w:unhideWhenUsed="1"/>
+    <w:lsdException w:name="List Bullet 5" w:semiHidden="1" w:unhideWhenUsed="1"/>
+    <w:lsdException w:name="List Number 2" w:semiHidden="1" w:unhideWhenUsed="1"/>
+    <w:lsdException w:name="List Number 3" w:semiHidden="1" w:unhideWhenUsed="1"/>
+    <w:lsdException w:name="List Number 4" w:semiHidden="1" w:unhideWhenUsed="1"/>
+    <w:lsdException w:name="List Number 5" w:semiHidden="1" w:unhideWhenUsed="1"/>
+    <w:lsdException w:name="Title" w:uiPriority="10" w:qFormat="1"/>
+    <w:lsdException w:name="Closing" w:semiHidden="1" w:unhideWhenUsed="1"/>
+    <w:lsdException w:name="Signature" w:semiHidden="1" w:unhideWhenUsed="1"/>
+    <w:lsdException w:name="Default Paragraph Font" w:semiHidden="1" w:uiPriority="1" w:unhideWhenUsed="1"/>
+    <w:lsdException w:name="Body Text" w:semiHidden="1" w:unhideWhenUsed="1"/>
+    <w:lsdException w:name="Body Text Indent" w:semiHidden="1" w:unhideWhenUsed="1"/>
+    <w:lsdException w:name="List Continue" w:semiHidden="1" w:unhideWhenUsed="1"/>
+    <w:lsdException w:name="List Continue 2" w:semiHidden="1" w:unhideWhenUsed="1"/>
+    <w:lsdException w:name="List Continue 3" w:semiHidden="1" w:unhideWhenUsed="1"/>
+    <w:lsdException w:name="List Continue 4" w:semiHidden="1" w:unhideWhenUsed="1"/>
+    <w:lsdException w:name="List Continue 5" w:semiHidden="1" w:unhideWhenUsed="1"/>
+    <w:lsdException w:name="Message Header" w:semiHidden="1" w:unhideWhenUsed="1"/>
+    <w:lsdException w:name="Subtitle" w:uiPriority="11" w:qFormat="1"/>
+    <w:lsdException w:name="Salutation" w:semiHidden="1" w:unhideWhenUsed="1"/>
+    <w:lsdException w:name="Date" w:semiHidden="1" w:unhideWhenUsed="1"/>
+    <w:lsdException w:name="Body Text First Indent" w:semiHidden="1" w:unhideWhenUsed="1"/>
+    <w:lsdException w:name="Body Text First Indent 2" w:semiHidden="1" w:unhideWhenUsed="1"/>
+    <w:lsdException w:name="Note Heading" w:semiHidden="1" w:unhideWhenUsed="1"/>
+    <w:lsdException w:name="Body Text 2" w:semiHidden="1" w:unhideWhenUsed="1"/>
+    <w:lsdException w:name="Body Text 3" w:semiHidden="1" w:unhideWhenUsed="1"/>
+    <w:lsdException w:name="Body Text Indent 2" w:semiHidden="1" w:unhideWhenUsed="1"/>
+    <w:lsdException w:name="Body Text Indent 3" w:semiHidden="1" w:unhideWhenUsed="1"/>
+    <w:lsdException w:name="Block Text" w:semiHidden="1" w:unhideWhenUsed="1"/>
+    <w:lsdException w:name="Hyperlink" w:semiHidden="1" w:unhideWhenUsed="1"/>
+    <w:lsdException w:name="FollowedHyperlink" w:semiHidden="1" w:unhideWhenUsed="1"/>
+    <w:lsdException w:name="Strong" w:uiPriority="22" w:qFormat="1"/>
+    <w:lsdException w:name="Emphasis" w:uiPriority="20" w:qFormat="1"/>
+    <w:lsdException w:name="Document Map" w:semiHidden="1" w:unhideWhenUsed="1"/>
+    <w:lsdException w:name="Plain Text" w:semiHidden="1" w:unhideWhenUsed="1"/>
+    <w:lsdException w:name="E-mail Signature" w:semiHidden="1" w:unhideWhenUsed="1"/>
+    <w:lsdException w:name="HTML Top of Form" w:semiHidden="1" w:unhideWhenUsed="1"/>
+    <w:lsdException w:name="HTML Bottom of Form" w:semiHidden="1" w:unhideWhenUsed="1"/>
+    <w:lsdException w:name="Normal (Web)" w:semiHidden="1" w:unhideWhenUsed="1"/>
+    <w:lsdException w:name="HTML Acronym" w:semiHidden="1" w:unhideWhenUsed="1"/>
+    <w:lsdException w:name="HTML Address" w:semiHidden="1" w:unhideWhenUsed="1"/>
+    <w:lsdException w:name="HTML Cite" w:semiHidden="1" w:unhideWhenUsed="1"/>
+    <w:lsdException w:name="HTML Code" w:semiHidden="1" w:unhideWhenUsed="1"/>
+    <w:lsdException w:name="HTML Definition" w:semiHidden="1" w:unhideWhenUsed="1"/>
+    <w:lsdException w:name="HTML Keyboard" w:semiHidden="1" w:unhideWhenUsed="1"/>
+    <w:lsdException w:name="HTML Preformatted" w:semiHidden="1" w:unhideWhenUsed="1"/>
+    <w:lsdException w:name="HTML Sample" w:semiHidden="1" w:unhideWhenUsed="1"/>
+    <w:lsdException w:name="HTML Typewriter" w:semiHidden="1" w:unhideWhenUsed="1"/>
+    <w:lsdException w:name="HTML Variable" w:semiHidden="1" w:unhideWhenUsed="1"/>
+    <w:lsdException w:name="Normal Table" w:semiHidden="1" w:unhideWhenUsed="1"/>
+    <w:lsdException w:name="annotation subject" w:semiHidden="1" w:unhideWhenUsed="1"/>
+    <w:lsdException w:name="No List" w:semiHidden="1" w:unhideWhenUsed="1"/>
+    <w:lsdException w:name="Outline List 1" w:semiHidden="1" w:unhideWhenUsed="1"/>
+    <w:lsdException w:name="Outline List 2" w:semiHidden="1" w:unhideWhenUsed="1"/>
+    <w:lsdException w:name="Outline List 3" w:semiHidden="1" w:unhideWhenUsed="1"/>
+    <w:lsdException w:name="Table Simple 1" w:semiHidden="1" w:unhideWhenUsed="1"/>
+    <w:lsdException w:name="Table Simple 2" w:semiHidden="1" w:unhideWhenUsed="1"/>
+    <w:lsdException w:name="Table Simple 3" w:semiHidden="1" w:unhideWhenUsed="1"/>
+    <w:lsdException w:name="Table Classic 1" w:semiHidden="1" w:unhideWhenUsed="1"/>
+    <w:lsdException w:name="Table Classic 2" w:semiHidden="1" w:unhideWhenUsed="1"/>
+    <w:lsdException w:name="Table Classic 3" w:semiHidden="1" w:unhideWhenUsed="1"/>
+    <w:lsdException w:name="Table Classic 4" w:semiHidden="1" w:unhideWhenUsed="1"/>
+    <w:lsdException w:name="Table Colorful 1" w:semiHidden="1" w:unhideWhenUsed="1"/>
+    <w:lsdException w:name="Table Colorful 2" w:semiHidden="1" w:unhideWhenUsed="1"/>
+    <w:lsdException w:name="Table Colorful 3" w:semiHidden="1" w:unhideWhenUsed="1"/>
+    <w:lsdException w:name="Table Columns 1" w:semiHidden="1" w:unhideWhenUsed="1"/>
+    <w:lsdException w:name="Table Columns 2" w:semiHidden="1" w:unhideWhenUsed="1"/>
+    <w:lsdException w:name="Table Columns 3" w:semiHidden="1" w:unhideWhenUsed="1"/>
+    <w:lsdException w:name="Table Columns 4" w:semiHidden="1" w:unhideWhenUsed="1"/>
+    <w:lsdException w:name="Table Columns 5" w:semiHidden="1" w:unhideWhenUsed="1"/>
+    <w:lsdException w:name="Table Grid 1" w:semiHidden="1" w:unhideWhenUsed="1"/>
+    <w:lsdException w:name="Table Grid 2" w:semiHidden="1" w:unhideWhenUsed="1"/>
+    <w:lsdException w:name="Table Grid 3" w:semiHidden="1" w:unhideWhenUsed="1"/>
+    <w:lsdException w:name="Table Grid 4" w:semiHidden="1" w:unhideWhenUsed="1"/>
+    <w:lsdException w:name="Table Grid 5" w:semiHidden="1" w:unhideWhenUsed="1"/>
+    <w:lsdException w:name="Table Grid 6" w:semiHidden="1" w:unhideWhenUsed="1"/>
+    <w:lsdException w:name="Table Grid 7" w:semiHidden="1" w:unhideWhenUsed="1"/>
+    <w:lsdException w:name="Table Grid 8" w:semiHidden="1" w:unhideWhenUsed="1"/>
+    <w:lsdException w:name="Table List 1" w:semiHidden="1" w:unhideWhenUsed="1"/>
+    <w:lsdException w:name="Table List 2" w:semiHidden="1" w:unhideWhenUsed="1"/>
+    <w:lsdException w:name="Table List 3" w:semiHidden="1" w:unhideWhenUsed="1"/>
+    <w:lsdException w:name="Table List 4" w:semiHidden="1" w:unhideWhenUsed="1"/>
+    <w:lsdException w:name="Table List 5" w:semiHidden="1" w:unhideWhenUsed="1"/>
+    <w:lsdException w:name="Table List 6" w:semiHidden="1" w:unhideWhenUsed="1"/>
+    <w:lsdException w:name="Table List 7" w:semiHidden="1" w:unhideWhenUsed="1"/>
+    <w:lsdException w:name="Table List 8" w:semiHidden="1" w:unhideWhenUsed="1"/>
+    <w:lsdException w:name="Table 3D effects 1" w:semiHidden="1" w:unhideWhenUsed="1"/>
+    <w:lsdException w:name="Table 3D effects 2" w:semiHidden="1" w:unhideWhenUsed="1"/>
+    <w:lsdException w:name="Table 3D effects 3" w:semiHidden="1" w:unhideWhenUsed="1"/>
+    <w:lsdException w:name="Table Contemporary" w:semiHidden="1" w:unhideWhenUsed="1"/>
+    <w:lsdException w:name="Table Elegant" w:semiHidden="1" w:unhideWhenUsed="1"/>
+    <w:lsdException w:name="Table Professional" w:semiHidden="1" w:unhideWhenUsed="1"/>
+    <w:lsdException w:name="Table Subtle 1" w:semiHidden="1" w:unhideWhenUsed="1"/>
+    <w:lsdException w:name="Table Subtle 2" w:semiHidden="1" w:unhideWhenUsed="1"/>
+    <w:lsdException w:name="Table Web 1" w:semiHidden="1" w:unhideWhenUsed="1"/>
+    <w:lsdException w:name="Table Web 2" w:semiHidden="1" w:unhideWhenUsed="1"/>
+    <w:lsdException w:name="Table Web 3" w:semiHidden="1" w:unhideWhenUsed="1"/>
+    <w:lsdException w:name="Balloon Text" w:semiHidden="1" w:unhideWhenUsed="1"/>
+    <w:lsdException w:name="Table Grid" w:uiPriority="39"/>
+    <w:lsdException w:name="Table Theme" w:semiHidden="1" w:unhideWhenUsed="1"/>
+    <w:lsdException w:name="Placeholder Text" w:semiHidden="1"/>
+    <w:lsdException w:name="No Spacing" w:uiPriority="1" w:qFormat="1"/>
+    <w:lsdException w:name="Light Shading" w:uiPriority="60"/>
+    <w:lsdException w:name="Light List" w:uiPriority="61"/>
+    <w:lsdException w:name="Light Grid" w:uiPriority="62"/>
+    <w:lsdException w:name="Medium Shading 1" w:uiPriority="63"/>
+    <w:lsdException w:name="Medium Shading 2" w:uiPriority="64"/>
+    <w:lsdException w:name="Medium List 1" w:uiPriority="65"/>
+    <w:lsdException w:name="Medium List 2" w:uiPriority="66"/>
+    <w:lsdException w:name="Medium Grid 1" w:uiPriority="67"/>
+    <w:lsdException w:name="Medium Grid 2" w:uiPriority="68"/>
+    <w:lsdException w:name="Medium Grid 3" w:uiPriority="69"/>
+    <w:lsdException w:name="Dark List" w:uiPriority="70"/>
+    <w:lsdException w:name="Colorful Shading" w:uiPriority="71"/>
+    <w:lsdException w:name="Colorful List" w:uiPriority="72"/>
+    <w:lsdException w:name="Colorful Grid" w:uiPriority="73"/>
+    <w:lsdException w:name="Light Shading Accent 1" w:uiPriority="60"/>
+    <w:lsdException w:name="Light List Accent 1" w:uiPriority="61"/>
+    <w:lsdException w:name="Light Grid Accent 1" w:uiPriority="62"/>
+    <w:lsdException w:name="Medium Shading 1 Accent 1" w:uiPriority="63"/>
+    <w:lsdException w:name="Medium Shading 2 Accent 1" w:uiPriority="64"/>
+    <w:lsdException w:name="Medium List 1 Accent 1" w:uiPriority="65"/>
+    <w:lsdException w:name="Revision" w:semiHidden="1"/>
+    <w:lsdException w:name="List Paragraph" w:uiPriority="34" w:qFormat="1"/>
+    <w:lsdException w:name="Quote" w:uiPriority="29" w:qFormat="1"/>
+    <w:lsdException w:name="Intense Quote" w:uiPriority="30" w:qFormat="1"/>
+    <w:lsdException w:name="Medium List 2 Accent 1" w:uiPriority="66"/>
+    <w:lsdException w:name="Medium Grid 1 Accent 1" w:uiPriority="67"/>
+    <w:lsdException w:name="Medium Grid 2 Accent 1" w:uiPriority="68"/>
+    <w:lsdException w:name="Medium Grid 3 Accent 1" w:uiPriority="69"/>
+    <w:lsdException w:name="Dark List Accent 1" w:uiPriority="70"/>
+    <w:lsdException w:name="Colorful Shading Accent 1" w:uiPriority="71"/>
+    <w:lsdException w:name="Colorful List Accent 1" w:uiPriority="72"/>
+    <w:lsdException w:name="Colorful Grid Accent 1" w:uiPriority="73"/>
+    <w:lsdException w:name="Light Shading Accent 2" w:uiPriority="60"/>
+    <w:lsdException w:name="Light List Accent 2" w:uiPriority="61"/>
+    <w:lsdException w:name="Light Grid Accent 2" w:uiPriority="62"/>
+    <w:lsdException w:name="Medium Shading 1 Accent 2" w:uiPriority="63"/>
+    <w:lsdException w:name="Medium Shading 2 Accent 2" w:uiPriority="64"/>
+    <w:lsdException w:name="Medium List 1 Accent 2" w:uiPriority="65"/>
+    <w:lsdException w:name="Medium List 2 Accent 2" w:uiPriority="66"/>
+    <w:lsdException w:name="Medium Grid 1 Accent 2" w:uiPriority="67"/>
+    <w:lsdException w:name="Medium Grid 2 Accent 2" w:uiPriority="68"/>
+    <w:lsdException w:name="Medium Grid 3 Accent 2" w:uiPriority="69"/>
+    <w:lsdException w:name="Dark List Accent 2" w:uiPriority="70"/>
+    <w:lsdException w:name="Colorful Shading Accent 2" w:uiPriority="71"/>
+    <w:lsdException w:name="Colorful List Accent 2" w:uiPriority="72"/>
+    <w:lsdException w:name="Colorful Grid Accent 2" w:uiPriority="73"/>
+    <w:lsdException w:name="Light Shading Accent 3" w:uiPriority="60"/>
+    <w:lsdException w:name="Light List Accent 3" w:uiPriority="61"/>
+    <w:lsdException w:name="Light Grid Accent 3" w:uiPriority="62"/>
+    <w:lsdException w:name="Medium Shading 1 Accent 3" w:uiPriority="63"/>
+    <w:lsdException w:name="Medium Shading 2 Accent 3" w:uiPriority="64"/>
+    <w:lsdException w:name="Medium List 1 Accent 3" w:uiPriority="65"/>
+    <w:lsdException w:name="Medium List 2 Accent 3" w:uiPriority="66"/>
+    <w:lsdException w:name="Medium Grid 1 Accent 3" w:uiPriority="67"/>
+    <w:lsdException w:name="Medium Grid 2 Accent 3" w:uiPriority="68"/>
+    <w:lsdException w:name="Medium Grid 3 Accent 3" w:uiPriority="69"/>
+    <w:lsdException w:name="Dark List Accent 3" w:uiPriority="70"/>
+    <w:lsdException w:name="Colorful Shading Accent 3" w:uiPriority="71"/>
+    <w:lsdException w:name="Colorful List Accent 3" w:uiPriority="72"/>
+    <w:lsdException w:name="Colorful Grid Accent 3" w:uiPriority="73"/>
+    <w:lsdException w:name="Light Shading Accent 4" w:uiPriority="60"/>
+    <w:lsdException w:name="Light List Accent 4" w:uiPriority="61"/>
+    <w:lsdException w:name="Light Grid Accent 4" w:uiPriority="62"/>
+    <w:lsdException w:name="Medium Shading 1 Accent 4" w:uiPriority="63"/>
+    <w:lsdException w:name="Medium Shading 2 Accent 4" w:uiPriority="64"/>
+    <w:lsdException w:name="Medium List 1 Accent 4" w:uiPriority="65"/>
+    <w:lsdException w:name="Medium List 2 Accent 4" w:uiPriority="66"/>
+    <w:lsdException w:name="Medium Grid 1 Accent 4" w:uiPriority="67"/>
+    <w:lsdException w:name="Medium Grid 2 Accent 4" w:uiPriority="68"/>
+    <w:lsdException w:name="Medium Grid 3 Accent 4" w:uiPriority="69"/>
+    <w:lsdException w:name="Dark List Accent 4" w:uiPriority="70"/>
+    <w:lsdException w:name="Colorful Shading Accent 4" w:uiPriority="71"/>
+    <w:lsdException w:name="Colorful List Accent 4" w:uiPriority="72"/>
+    <w:lsdException w:name="Colorful Grid Accent 4" w:uiPriority="73"/>
+    <w:lsdException w:name="Light Shading Accent 5" w:uiPriority="60"/>
+    <w:lsdException w:name="Light List Accent 5" w:uiPriority="61"/>
+    <w:lsdException w:name="Light Grid Accent 5" w:uiPriority="62"/>
+    <w:lsdException w:name="Medium Shading 1 Accent 5" w:uiPriority="63"/>
+    <w:lsdException w:name="Medium Shading 2 Accent 5" w:uiPriority="64"/>
+    <w:lsdException w:name="Medium List 1 Accent 5" w:uiPriority="65"/>
+    <w:lsdException w:name="Medium List 2 Accent 5" w:uiPriority="66"/>
+    <w:lsdException w:name="Medium Grid 1 Accent 5" w:uiPriority="67"/>
+    <w:lsdException w:name="Medium Grid 2 Accent 5" w:uiPriority="68"/>
+    <w:lsdException w:name="Medium Grid 3 Accent 5" w:uiPriority="69"/>
+    <w:lsdException w:name="Dark List Accent 5" w:uiPriority="70"/>
+    <w:lsdException w:name="Colorful Shading Accent 5" w:uiPriority="71"/>
+    <w:lsdException w:name="Colorful List Accent 5" w:uiPriority="72"/>
+    <w:lsdException w:name="Colorful Grid Accent 5" w:uiPriority="73"/>
+    <w:lsdException w:name="Light Shading Accent 6" w:uiPriority="60"/>
+    <w:lsdException w:name="Light List Accent 6" w:uiPriority="61"/>
+    <w:lsdException w:name="Light Grid Accent 6" w:uiPriority="62"/>
+    <w:lsdException w:name="Medium Shading 1 Accent 6" w:uiPriority="63"/>
+    <w:lsdException w:name="Medium Shading 2 Accent 6" w:uiPriority="64"/>
+    <w:lsdException w:name="Medium List 1 Accent 6" w:uiPriority="65"/>
+    <w:lsdException w:name="Medium List 2 Accent 6" w:uiPriority="66"/>
+    <w:lsdException w:name="Medium Grid 1 Accent 6" w:uiPriority="67"/>
+    <w:lsdException w:name="Medium Grid 2 Accent 6" w:uiPriority="68"/>
+    <w:lsdException w:name="Medium Grid 3 Accent 6" w:uiPriority="69"/>
+    <w:lsdException w:name="Dark List Accent 6" w:uiPriority="70"/>
+    <w:lsdException w:name="Colorful Shading Accent 6" w:uiPriority="71"/>
+    <w:lsdException w:name="Colorful List Accent 6" w:uiPriority="72"/>
+    <w:lsdException w:name="Colorful Grid Accent 6" w:uiPriority="73"/>
+    <w:lsdException w:name="Subtle Emphasis" w:uiPriority="19" w:qFormat="1"/>
+    <w:lsdException w:name="Intense Emphasis" w:uiPriority="21" w:qFormat="1"/>
+    <w:lsdException w:name="Subtle Reference" w:uiPriority="31" w:qFormat="1"/>
+    <w:lsdException w:name="Intense Reference" w:uiPriority="32" w:qFormat="1"/>
+    <w:lsdException w:name="Book Title" w:uiPriority="33" w:qFormat="1"/>
+    <w:lsdException w:name="Bibliography" w:semiHidden="1" w:uiPriority="37" w:unhideWhenUsed="1"/>
+    <w:lsdException w:name="TOC Heading" w:semiHidden="1" w:uiPriority="39" w:unhideWhenUsed="1" w:qFormat="1"/>
+    <w:lsdException w:name="Plain Table 1" w:uiPriority="41"/>
+    <w:lsdException w:name="Plain Table 2" w:uiPriority="42"/>
+    <w:lsdException w:name="Plain Table 3" w:uiPriority="43"/>
+    <w:lsdException w:name="Plain Table 4" w:uiPriority="44"/>
+    <w:lsdException w:name="Plain Table 5" w:uiPriority="45"/>
+    <w:lsdException w:name="Grid Table Light" w:uiPriority="40"/>
+    <w:lsdException w:name="Grid Table 1 Light" w:uiPriority="46"/>
+    <w:lsdException w:name="Grid Table 2" w:uiPriority="47"/>
+    <w:lsdException w:name="Grid Table 3" w:uiPriority="48"/>
+    <w:lsdException w:name="Grid Table 4" w:uiPriority="49"/>
+    <w:lsdException w:name="Grid Table 5 Dark" w:uiPriority="50"/>
+    <w:lsdException w:name="Grid Table 6 Colorful" w:uiPriority="51"/>
+    <w:lsdException w:name="Grid Table 7 Colorful" w:uiPriority="52"/>
+    <w:lsdException w:name="Grid Table 1 Light Accent 1" w:uiPriority="46"/>
+    <w:lsdException w:name="Grid Table 2 Accent 1" w:uiPriority="47"/>
+    <w:lsdException w:name="Grid Table 3 Accent 1" w:uiPriority="48"/>
+    <w:lsdException w:name="Grid Table 4 Accent 1" w:uiPriority="49"/>
+    <w:lsdException w:name="Grid Table 5 Dark Accent 1" w:uiPriority="50"/>
+    <w:lsdException w:name="Grid Table 6 Colorful Accent 1" w:uiPriority="51"/>
+    <w:lsdException w:name="Grid Table 7 Colorful Accent 1" w:uiPriority="52"/>
+    <w:lsdException w:name="Grid Table 1 Light Accent 2" w:uiPriority="46"/>
+    <w:lsdException w:name="Grid Table 2 Accent 2" w:uiPriority="47"/>
+    <w:lsdException w:name="Grid Table 3 Accent 2" w:uiPriority="48"/>
+    <w:lsdException w:name="Grid Table 4 Accent 2" w:uiPriority="49"/>
+    <w:lsdException w:name="Grid Table 5 Dark Accent 2" w:uiPriority="50"/>
+    <w:lsdException w:name="Grid Table 6 Colorful Accent 2" w:uiPriority="51"/>
+    <w:lsdException w:name="Grid Table 7 Colorful Accent 2" w:uiPriority="52"/>
+    <w:lsdException w:name="Grid Table 1 Light Accent 3" w:uiPriority="46"/>
+    <w:lsdException w:name="Grid Table 2 Accent 3" w:uiPriority="47"/>
+    <w:lsdException w:name="Grid Table 3 Accent 3" w:uiPriority="48"/>
+    <w:lsdException w:name="Grid Table 4 Accent 3" w:uiPriority="49"/>
+    <w:lsdException w:name="Grid Table 5 Dark Accent 3" w:uiPriority="50"/>
+    <w:lsdException w:name="Grid Table 6 Colorful Accent 3" w:uiPriority="51"/>
+    <w:lsdException w:name="Grid Table 7 Colorful Accent 3" w:uiPriority="52"/>
+    <w:lsdException w:name="Grid Table 1 Light Accent 4" w:uiPriority="46"/>
+    <w:lsdException w:name="Grid Table 2 Accent 4" w:uiPriority="47"/>
+    <w:lsdException w:name="Grid Table 3 Accent 4" w:uiPriority="48"/>
+    <w:lsdException w:name="Grid Table 4 Accent 4" w:uiPriority="49"/>
+    <w:lsdException w:name="Grid Table 5 Dark Accent 4" w:uiPriority="50"/>
+    <w:lsdException w:name="Grid Table 6 Colorful Accent 4" w:uiPriority="51"/>
+    <w:lsdException w:name="Grid Table 7 Colorful Accent 4" w:uiPriority="52"/>
+    <w:lsdException w:name="Grid Table 1 Light Accent 5" w:uiPriority="46"/>
+    <w:lsdException w:name="Grid Table 2 Accent 5" w:uiPriority="47"/>
+    <w:lsdException w:name="Grid Table 3 Accent 5" w:uiPriority="48"/>
+    <w:lsdException w:name="Grid Table 4 Accent 5" w:uiPriority="49"/>
+    <w:lsdException w:name="Grid Table 5 Dark Accent 5" w:uiPriority="50"/>
+    <w:lsdException w:name="Grid Table 6 Colorful Accent 5" w:uiPriority="51"/>
+    <w:lsdException w:name="Grid Table 7 Colorful Accent 5" w:uiPriority="52"/>
+    <w:lsdException w:name="Grid Table 1 Light Accent 6" w:uiPriority="46"/>
+    <w:lsdException w:name="Grid Table 2 Accent 6" w:uiPriority="47"/>
+    <w:lsdException w:name="Grid Table 3 Accent 6" w:uiPriority="48"/>
+    <w:lsdException w:name="Grid Table 4 Accent 6" w:uiPriority="49"/>
+    <w:lsdException w:name="Grid Table 5 Dark Accent 6" w:uiPriority="50"/>
+    <w:lsdException w:name="Grid Table 6 Colorful Accent 6" w:uiPriority="51"/>
+    <w:lsdException w:name="Grid Table 7 Colorful Accent 6" w:uiPriority="52"/>
+    <w:lsdException w:name="List Table 1 Light" w:uiPriority="46"/>
+    <w:lsdException w:name="List Table 2" w:uiPriority="47"/>
+    <w:lsdException w:name="List Table 3" w:uiPriority="48"/>
+    <w:lsdException w:name="List Table 4" w:uiPriority="49"/>
+    <w:lsdException w:name="List Table 5 Dark" w:uiPriority="50"/>
+    <w:lsdException w:name="List Table 6 Colorful" w:uiPriority="51"/>
+    <w:lsdException w:name="List Table 7 Colorful" w:uiPriority="52"/>
+    <w:lsdException w:name="List Table 1 Light Accent 1" w:uiPriority="46"/>
+    <w:lsdException w:name="List Table 2 Accent 1" w:uiPriority="47"/>
+    <w:lsdException w:name="List Table 3 Accent 1" w:uiPriority="48"/>
+    <w:lsdException w:name="List Table 4 Accent 1" w:uiPriority="49"/>
+    <w:lsdException w:name="List Table 5 Dark Accent 1" w:uiPriority="50"/>
+    <w:lsdException w:name="List Table 6 Colorful Accent 1" w:uiPriority="51"/>
+    <w:lsdException w:name="List Table 7 Colorful Accent 1" w:uiPriority="52"/>
+    <w:lsdException w:name="List Table 1 Light Accent 2" w:uiPriority="46"/>
+    <w:lsdException w:name="List Table 2 Accent 2" w:uiPriority="47"/>
+    <w:lsdException w:name="List Table 3 Accent 2" w:uiPriority="48"/>
+    <w:lsdException w:name="List Table 4 Accent 2" w:uiPriority="49"/>
+    <w:lsdException w:name="List Table 5 Dark Accent 2" w:uiPriority="50"/>
+    <w:lsdException w:name="List Table 6 Colorful Accent 2" w:uiPriority="51"/>
+    <w:lsdException w:name="List Table 7 Colorful Accent 2" w:uiPriority="52"/>
+    <w:lsdException w:name="List Table 1 Light Accent 3" w:uiPriority="46"/>
+    <w:lsdException w:name="List Table 2 Accent 3" w:uiPriority="47"/>
+    <w:lsdException w:name="List Table 3 Accent 3" w:uiPriority="48"/>
+    <w:lsdException w:name="List Table 4 Accent 3" w:uiPriority="49"/>
+    <w:lsdException w:name="List Table 5 Dark Accent 3" w:uiPriority="50"/>
+    <w:lsdException w:name="List Table 6 Colorful Accent 3" w:uiPriority="51"/>
+    <w:lsdException w:name="List Table 7 Colorful Accent 3" w:uiPriority="52"/>
+    <w:lsdException w:name="List Table 1 Light Accent 4" w:uiPriority="46"/>
+    <w:lsdException w:name="List Table 2 Accent 4" w:uiPriority="47"/>
+    <w:lsdException w:name="List Table 3 Accent 4" w:uiPriority="48"/>
+    <w:lsdException w:name="List Table 4 Accent 4" w:uiPriority="49"/>
+    <w:lsdException w:name="List Table 5 Dark Accent 4" w:uiPriority="50"/>
+    <w:lsdException w:name="List Table 6 Colorful Accent 4" w:uiPriority="51"/>
+    <w:lsdException w:name="List Table 7 Colorful Accent 4" w:uiPriority="52"/>
+    <w:lsdException w:name="List Table 1 Light Accent 5" w:uiPriority="46"/>
+    <w:lsdException w:name="List Table 2 Accent 5" w:uiPriority="47"/>
+    <w:lsdException w:name="List Table 3 Accent 5" w:uiPriority="48"/>
+    <w:lsdException w:name="List Table 4 Accent 5" w:uiPriority="49"/>
+    <w:lsdException w:name="List Table 5 Dark Accent 5" w:uiPriority="50"/>
+    <w:lsdException w:name="List Table 6 Colorful Accent 5" w:uiPriority="51"/>
+    <w:lsdException w:name="List Table 7 Colorful Accent 5" w:uiPriority="52"/>
+    <w:lsdException w:name="List Table 1 Light Accent 6" w:uiPriority="46"/>
+    <w:lsdException w:name="List Table 2 Accent 6" w:uiPriority="47"/>
+    <w:lsdException w:name="List Table 3 Accent 6" w:uiPriority="48"/>
+    <w:lsdException w:name="List Table 4 Accent 6" w:uiPriority="49"/>
+    <w:lsdException w:name="List Table 5 Dark Accent 6" w:uiPriority="50"/>
+    <w:lsdException w:name="List Table 6 Colorful Accent 6" w:uiPriority="51"/>
+    <w:lsdException w:name="List Table 7 Colorful Accent 6" w:uiPriority="52"/>
   </w:latentStyles>
   <w:style w:type="paragraph" w:default="1" w:styleId="Normal">
     <w:name w:val="Normal"/>
@@ -7690,7 +7925,6 @@
       <w:spacing w:after="0" w:line="240" w:lineRule="auto"/>
     </w:pPr>
     <w:tblPr>
-      <w:tblInd w:w="0" w:type="dxa"/>
       <w:tblBorders>
         <w:top w:val="single" w:sz="4" w:space="0" w:color="auto"/>
         <w:left w:val="single" w:sz="4" w:space="0" w:color="auto"/>
@@ -7699,12 +7933,6 @@
         <w:insideH w:val="single" w:sz="4" w:space="0" w:color="auto"/>
         <w:insideV w:val="single" w:sz="4" w:space="0" w:color="auto"/>
       </w:tblBorders>
-      <w:tblCellMar>
-        <w:top w:w="0" w:type="dxa"/>
-        <w:left w:w="108" w:type="dxa"/>
-        <w:bottom w:w="0" w:type="dxa"/>
-        <w:right w:w="108" w:type="dxa"/>
-      </w:tblCellMar>
     </w:tblPr>
   </w:style>
   <w:style w:type="character" w:customStyle="1" w:styleId="citation-150">
@@ -7782,522 +8010,26 @@
       <w:szCs w:val="18"/>
     </w:rPr>
   </w:style>
-</w:styles>
-</file>
-
-<file path=word/stylesWithEffects.xml><?xml version="1.0" encoding="utf-8"?>
-<w:styles xmlns:wpc="http://schemas.microsoft.com/office/word/2010/wordprocessingCanvas" xmlns:mc="http://schemas.openxmlformats.org/markup-compatibility/2006" xmlns:o="urn:schemas-microsoft-com:office:office" xmlns:r="http://schemas.openxmlformats.org/officeDocument/2006/relationships" xmlns:m="http://schemas.openxmlformats.org/officeDocument/2006/math" xmlns:v="urn:schemas-microsoft-com:vml" xmlns:wp14="http://schemas.microsoft.com/office/word/2010/wordprocessingDrawing" xmlns:wp="http://schemas.openxmlformats.org/drawingml/2006/wordprocessingDrawing" xmlns:w10="urn:schemas-microsoft-com:office:word" xmlns:w="http://schemas.openxmlformats.org/wordprocessingml/2006/main" xmlns:w14="http://schemas.microsoft.com/office/word/2010/wordml" xmlns:wpg="http://schemas.microsoft.com/office/word/2010/wordprocessingGroup" xmlns:wpi="http://schemas.microsoft.com/office/word/2010/wordprocessingInk" xmlns:wne="http://schemas.microsoft.com/office/word/2006/wordml" xmlns:wps="http://schemas.microsoft.com/office/word/2010/wordprocessingShape" mc:Ignorable="w14 wp14">
-  <w:docDefaults>
-    <w:rPrDefault>
-      <w:rPr>
-        <w:rFonts w:ascii="Times New Roman" w:eastAsia="Times New Roman" w:hAnsi="Times New Roman" w:cs="Times New Roman"/>
-        <w:sz w:val="24"/>
-        <w:szCs w:val="24"/>
-        <w:lang w:val="pt-BR" w:eastAsia="pt-BR" w:bidi="ar-SA"/>
-      </w:rPr>
-    </w:rPrDefault>
-    <w:pPrDefault>
-      <w:pPr>
-        <w:spacing w:after="240" w:line="360" w:lineRule="auto"/>
-      </w:pPr>
-    </w:pPrDefault>
-  </w:docDefaults>
-  <w:latentStyles w:defLockedState="0" w:defUIPriority="99" w:defSemiHidden="1" w:defUnhideWhenUsed="1" w:defQFormat="0" w:count="267">
-    <w:lsdException w:name="Normal" w:semiHidden="0" w:uiPriority="0" w:unhideWhenUsed="0" w:qFormat="1"/>
-    <w:lsdException w:name="heading 1" w:semiHidden="0" w:uiPriority="9" w:unhideWhenUsed="0" w:qFormat="1"/>
-    <w:lsdException w:name="heading 2" w:uiPriority="9" w:qFormat="1"/>
-    <w:lsdException w:name="heading 3" w:uiPriority="9" w:qFormat="1"/>
-    <w:lsdException w:name="heading 4" w:uiPriority="9" w:qFormat="1"/>
-    <w:lsdException w:name="heading 5" w:uiPriority="9" w:qFormat="1"/>
-    <w:lsdException w:name="heading 6" w:uiPriority="9" w:qFormat="1"/>
-    <w:lsdException w:name="heading 7" w:uiPriority="9" w:qFormat="1"/>
-    <w:lsdException w:name="heading 8" w:uiPriority="9" w:qFormat="1"/>
-    <w:lsdException w:name="heading 9" w:uiPriority="9" w:qFormat="1"/>
-    <w:lsdException w:name="toc 1" w:uiPriority="39"/>
-    <w:lsdException w:name="toc 2" w:uiPriority="39"/>
-    <w:lsdException w:name="toc 3" w:uiPriority="39"/>
-    <w:lsdException w:name="toc 4" w:uiPriority="39"/>
-    <w:lsdException w:name="toc 5" w:uiPriority="39"/>
-    <w:lsdException w:name="toc 6" w:uiPriority="39"/>
-    <w:lsdException w:name="toc 7" w:uiPriority="39"/>
-    <w:lsdException w:name="toc 8" w:uiPriority="39"/>
-    <w:lsdException w:name="toc 9" w:uiPriority="39"/>
-    <w:lsdException w:name="caption" w:uiPriority="35" w:qFormat="1"/>
-    <w:lsdException w:name="Title" w:semiHidden="0" w:uiPriority="10" w:unhideWhenUsed="0" w:qFormat="1"/>
-    <w:lsdException w:name="Default Paragraph Font" w:uiPriority="1"/>
-    <w:lsdException w:name="Subtitle" w:semiHidden="0" w:uiPriority="11" w:unhideWhenUsed="0" w:qFormat="1"/>
-    <w:lsdException w:name="Strong" w:semiHidden="0" w:uiPriority="22" w:unhideWhenUsed="0" w:qFormat="1"/>
-    <w:lsdException w:name="Emphasis" w:semiHidden="0" w:uiPriority="20" w:unhideWhenUsed="0" w:qFormat="1"/>
-    <w:lsdException w:name="Table Grid" w:semiHidden="0" w:uiPriority="39" w:unhideWhenUsed="0"/>
-    <w:lsdException w:name="Placeholder Text" w:unhideWhenUsed="0"/>
-    <w:lsdException w:name="No Spacing" w:semiHidden="0" w:uiPriority="1" w:unhideWhenUsed="0" w:qFormat="1"/>
-    <w:lsdException w:name="Light Shading" w:semiHidden="0" w:uiPriority="60" w:unhideWhenUsed="0"/>
-    <w:lsdException w:name="Light List" w:semiHidden="0" w:uiPriority="61" w:unhideWhenUsed="0"/>
-    <w:lsdException w:name="Light Grid" w:semiHidden="0" w:uiPriority="62" w:unhideWhenUsed="0"/>
-    <w:lsdException w:name="Medium Shading 1" w:semiHidden="0" w:uiPriority="63" w:unhideWhenUsed="0"/>
-    <w:lsdException w:name="Medium Shading 2" w:semiHidden="0" w:uiPriority="64" w:unhideWhenUsed="0"/>
-    <w:lsdException w:name="Medium List 1" w:semiHidden="0" w:uiPriority="65" w:unhideWhenUsed="0"/>
-    <w:lsdException w:name="Medium List 2" w:semiHidden="0" w:uiPriority="66" w:unhideWhenUsed="0"/>
-    <w:lsdException w:name="Medium Grid 1" w:semiHidden="0" w:uiPriority="67" w:unhideWhenUsed="0"/>
-    <w:lsdException w:name="Medium Grid 2" w:semiHidden="0" w:uiPriority="68" w:unhideWhenUsed="0"/>
-    <w:lsdException w:name="Medium Grid 3" w:semiHidden="0" w:uiPriority="69" w:unhideWhenUsed="0"/>
-    <w:lsdException w:name="Dark List" w:semiHidden="0" w:uiPriority="70" w:unhideWhenUsed="0"/>
-    <w:lsdException w:name="Colorful Shading" w:semiHidden="0" w:uiPriority="71" w:unhideWhenUsed="0"/>
-    <w:lsdException w:name="Colorful List" w:semiHidden="0" w:uiPriority="72" w:unhideWhenUsed="0"/>
-    <w:lsdException w:name="Colorful Grid" w:semiHidden="0" w:uiPriority="73" w:unhideWhenUsed="0"/>
-    <w:lsdException w:name="Light Shading Accent 1" w:semiHidden="0" w:uiPriority="60" w:unhideWhenUsed="0"/>
-    <w:lsdException w:name="Light List Accent 1" w:semiHidden="0" w:uiPriority="61" w:unhideWhenUsed="0"/>
-    <w:lsdException w:name="Light Grid Accent 1" w:semiHidden="0" w:uiPriority="62" w:unhideWhenUsed="0"/>
-    <w:lsdException w:name="Medium Shading 1 Accent 1" w:semiHidden="0" w:uiPriority="63" w:unhideWhenUsed="0"/>
-    <w:lsdException w:name="Medium Shading 2 Accent 1" w:semiHidden="0" w:uiPriority="64" w:unhideWhenUsed="0"/>
-    <w:lsdException w:name="Medium List 1 Accent 1" w:semiHidden="0" w:uiPriority="65" w:unhideWhenUsed="0"/>
-    <w:lsdException w:name="Revision" w:unhideWhenUsed="0"/>
-    <w:lsdException w:name="List Paragraph" w:semiHidden="0" w:uiPriority="34" w:unhideWhenUsed="0" w:qFormat="1"/>
-    <w:lsdException w:name="Quote" w:semiHidden="0" w:uiPriority="29" w:unhideWhenUsed="0" w:qFormat="1"/>
-    <w:lsdException w:name="Intense Quote" w:semiHidden="0" w:uiPriority="30" w:unhideWhenUsed="0" w:qFormat="1"/>
-    <w:lsdException w:name="Medium List 2 Accent 1" w:semiHidden="0" w:uiPriority="66" w:unhideWhenUsed="0"/>
-    <w:lsdException w:name="Medium Grid 1 Accent 1" w:semiHidden="0" w:uiPriority="67" w:unhideWhenUsed="0"/>
-    <w:lsdException w:name="Medium Grid 2 Accent 1" w:semiHidden="0" w:uiPriority="68" w:unhideWhenUsed="0"/>
-    <w:lsdException w:name="Medium Grid 3 Accent 1" w:semiHidden="0" w:uiPriority="69" w:unhideWhenUsed="0"/>
-    <w:lsdException w:name="Dark List Accent 1" w:semiHidden="0" w:uiPriority="70" w:unhideWhenUsed="0"/>
-    <w:lsdException w:name="Colorful Shading Accent 1" w:semiHidden="0" w:uiPriority="71" w:unhideWhenUsed="0"/>
-    <w:lsdException w:name="Colorful List Accent 1" w:semiHidden="0" w:uiPriority="72" w:unhideWhenUsed="0"/>
-    <w:lsdException w:name="Colorful Grid Accent 1" w:semiHidden="0" w:uiPriority="73" w:unhideWhenUsed="0"/>
-    <w:lsdException w:name="Light Shading Accent 2" w:semiHidden="0" w:uiPriority="60" w:unhideWhenUsed="0"/>
-    <w:lsdException w:name="Light List Accent 2" w:semiHidden="0" w:uiPriority="61" w:unhideWhenUsed="0"/>
-    <w:lsdException w:name="Light Grid Accent 2" w:semiHidden="0" w:uiPriority="62" w:unhideWhenUsed="0"/>
-    <w:lsdException w:name="Medium Shading 1 Accent 2" w:semiHidden="0" w:uiPriority="63" w:unhideWhenUsed="0"/>
-    <w:lsdException w:name="Medium Shading 2 Accent 2" w:semiHidden="0" w:uiPriority="64" w:unhideWhenUsed="0"/>
-    <w:lsdException w:name="Medium List 1 Accent 2" w:semiHidden="0" w:uiPriority="65" w:unhideWhenUsed="0"/>
-    <w:lsdException w:name="Medium List 2 Accent 2" w:semiHidden="0" w:uiPriority="66" w:unhideWhenUsed="0"/>
-    <w:lsdException w:name="Medium Grid 1 Accent 2" w:semiHidden="0" w:uiPriority="67" w:unhideWhenUsed="0"/>
-    <w:lsdException w:name="Medium Grid 2 Accent 2" w:semiHidden="0" w:uiPriority="68" w:unhideWhenUsed="0"/>
-    <w:lsdException w:name="Medium Grid 3 Accent 2" w:semiHidden="0" w:uiPriority="69" w:unhideWhenUsed="0"/>
-    <w:lsdException w:name="Dark List Accent 2" w:semiHidden="0" w:uiPriority="70" w:unhideWhenUsed="0"/>
-    <w:lsdException w:name="Colorful Shading Accent 2" w:semiHidden="0" w:uiPriority="71" w:unhideWhenUsed="0"/>
-    <w:lsdException w:name="Colorful List Accent 2" w:semiHidden="0" w:uiPriority="72" w:unhideWhenUsed="0"/>
-    <w:lsdException w:name="Colorful Grid Accent 2" w:semiHidden="0" w:uiPriority="73" w:unhideWhenUsed="0"/>
-    <w:lsdException w:name="Light Shading Accent 3" w:semiHidden="0" w:uiPriority="60" w:unhideWhenUsed="0"/>
-    <w:lsdException w:name="Light List Accent 3" w:semiHidden="0" w:uiPriority="61" w:unhideWhenUsed="0"/>
-    <w:lsdException w:name="Light Grid Accent 3" w:semiHidden="0" w:uiPriority="62" w:unhideWhenUsed="0"/>
-    <w:lsdException w:name="Medium Shading 1 Accent 3" w:semiHidden="0" w:uiPriority="63" w:unhideWhenUsed="0"/>
-    <w:lsdException w:name="Medium Shading 2 Accent 3" w:semiHidden="0" w:uiPriority="64" w:unhideWhenUsed="0"/>
-    <w:lsdException w:name="Medium List 1 Accent 3" w:semiHidden="0" w:uiPriority="65" w:unhideWhenUsed="0"/>
-    <w:lsdException w:name="Medium List 2 Accent 3" w:semiHidden="0" w:uiPriority="66" w:unhideWhenUsed="0"/>
-    <w:lsdException w:name="Medium Grid 1 Accent 3" w:semiHidden="0" w:uiPriority="67" w:unhideWhenUsed="0"/>
-    <w:lsdException w:name="Medium Grid 2 Accent 3" w:semiHidden="0" w:uiPriority="68" w:unhideWhenUsed="0"/>
-    <w:lsdException w:name="Medium Grid 3 Accent 3" w:semiHidden="0" w:uiPriority="69" w:unhideWhenUsed="0"/>
-    <w:lsdException w:name="Dark List Accent 3" w:semiHidden="0" w:uiPriority="70" w:unhideWhenUsed="0"/>
-    <w:lsdException w:name="Colorful Shading Accent 3" w:semiHidden="0" w:uiPriority="71" w:unhideWhenUsed="0"/>
-    <w:lsdException w:name="Colorful List Accent 3" w:semiHidden="0" w:uiPriority="72" w:unhideWhenUsed="0"/>
-    <w:lsdException w:name="Colorful Grid Accent 3" w:semiHidden="0" w:uiPriority="73" w:unhideWhenUsed="0"/>
-    <w:lsdException w:name="Light Shading Accent 4" w:semiHidden="0" w:uiPriority="60" w:unhideWhenUsed="0"/>
-    <w:lsdException w:name="Light List Accent 4" w:semiHidden="0" w:uiPriority="61" w:unhideWhenUsed="0"/>
-    <w:lsdException w:name="Light Grid Accent 4" w:semiHidden="0" w:uiPriority="62" w:unhideWhenUsed="0"/>
-    <w:lsdException w:name="Medium Shading 1 Accent 4" w:semiHidden="0" w:uiPriority="63" w:unhideWhenUsed="0"/>
-    <w:lsdException w:name="Medium Shading 2 Accent 4" w:semiHidden="0" w:uiPriority="64" w:unhideWhenUsed="0"/>
-    <w:lsdException w:name="Medium List 1 Accent 4" w:semiHidden="0" w:uiPriority="65" w:unhideWhenUsed="0"/>
-    <w:lsdException w:name="Medium List 2 Accent 4" w:semiHidden="0" w:uiPriority="66" w:unhideWhenUsed="0"/>
-    <w:lsdException w:name="Medium Grid 1 Accent 4" w:semiHidden="0" w:uiPriority="67" w:unhideWhenUsed="0"/>
-    <w:lsdException w:name="Medium Grid 2 Accent 4" w:semiHidden="0" w:uiPriority="68" w:unhideWhenUsed="0"/>
-    <w:lsdException w:name="Medium Grid 3 Accent 4" w:semiHidden="0" w:uiPriority="69" w:unhideWhenUsed="0"/>
-    <w:lsdException w:name="Dark List Accent 4" w:semiHidden="0" w:uiPriority="70" w:unhideWhenUsed="0"/>
-    <w:lsdException w:name="Colorful Shading Accent 4" w:semiHidden="0" w:uiPriority="71" w:unhideWhenUsed="0"/>
-    <w:lsdException w:name="Colorful List Accent 4" w:semiHidden="0" w:uiPriority="72" w:unhideWhenUsed="0"/>
-    <w:lsdException w:name="Colorful Grid Accent 4" w:semiHidden="0" w:uiPriority="73" w:unhideWhenUsed="0"/>
-    <w:lsdException w:name="Light Shading Accent 5" w:semiHidden="0" w:uiPriority="60" w:unhideWhenUsed="0"/>
-    <w:lsdException w:name="Light List Accent 5" w:semiHidden="0" w:uiPriority="61" w:unhideWhenUsed="0"/>
-    <w:lsdException w:name="Light Grid Accent 5" w:semiHidden="0" w:uiPriority="62" w:unhideWhenUsed="0"/>
-    <w:lsdException w:name="Medium Shading 1 Accent 5" w:semiHidden="0" w:uiPriority="63" w:unhideWhenUsed="0"/>
-    <w:lsdException w:name="Medium Shading 2 Accent 5" w:semiHidden="0" w:uiPriority="64" w:unhideWhenUsed="0"/>
-    <w:lsdException w:name="Medium List 1 Accent 5" w:semiHidden="0" w:uiPriority="65" w:unhideWhenUsed="0"/>
-    <w:lsdException w:name="Medium List 2 Accent 5" w:semiHidden="0" w:uiPriority="66" w:unhideWhenUsed="0"/>
-    <w:lsdException w:name="Medium Grid 1 Accent 5" w:semiHidden="0" w:uiPriority="67" w:unhideWhenUsed="0"/>
-    <w:lsdException w:name="Medium Grid 2 Accent 5" w:semiHidden="0" w:uiPriority="68" w:unhideWhenUsed="0"/>
-    <w:lsdException w:name="Medium Grid 3 Accent 5" w:semiHidden="0" w:uiPriority="69" w:unhideWhenUsed="0"/>
-    <w:lsdException w:name="Dark List Accent 5" w:semiHidden="0" w:uiPriority="70" w:unhideWhenUsed="0"/>
-    <w:lsdException w:name="Colorful Shading Accent 5" w:semiHidden="0" w:uiPriority="71" w:unhideWhenUsed="0"/>
-    <w:lsdException w:name="Colorful List Accent 5" w:semiHidden="0" w:uiPriority="72" w:unhideWhenUsed="0"/>
-    <w:lsdException w:name="Colorful Grid Accent 5" w:semiHidden="0" w:uiPriority="73" w:unhideWhenUsed="0"/>
-    <w:lsdException w:name="Light Shading Accent 6" w:semiHidden="0" w:uiPriority="60" w:unhideWhenUsed="0"/>
-    <w:lsdException w:name="Light List Accent 6" w:semiHidden="0" w:uiPriority="61" w:unhideWhenUsed="0"/>
-    <w:lsdException w:name="Light Grid Accent 6" w:semiHidden="0" w:uiPriority="62" w:unhideWhenUsed="0"/>
-    <w:lsdException w:name="Medium Shading 1 Accent 6" w:semiHidden="0" w:uiPriority="63" w:unhideWhenUsed="0"/>
-    <w:lsdException w:name="Medium Shading 2 Accent 6" w:semiHidden="0" w:uiPriority="64" w:unhideWhenUsed="0"/>
-    <w:lsdException w:name="Medium List 1 Accent 6" w:semiHidden="0" w:uiPriority="65" w:unhideWhenUsed="0"/>
-    <w:lsdException w:name="Medium List 2 Accent 6" w:semiHidden="0" w:uiPriority="66" w:unhideWhenUsed="0"/>
-    <w:lsdException w:name="Medium Grid 1 Accent 6" w:semiHidden="0" w:uiPriority="67" w:unhideWhenUsed="0"/>
-    <w:lsdException w:name="Medium Grid 2 Accent 6" w:semiHidden="0" w:uiPriority="68" w:unhideWhenUsed="0"/>
-    <w:lsdException w:name="Medium Grid 3 Accent 6" w:semiHidden="0" w:uiPriority="69" w:unhideWhenUsed="0"/>
-    <w:lsdException w:name="Dark List Accent 6" w:semiHidden="0" w:uiPriority="70" w:unhideWhenUsed="0"/>
-    <w:lsdException w:name="Colorful Shading Accent 6" w:semiHidden="0" w:uiPriority="71" w:unhideWhenUsed="0"/>
-    <w:lsdException w:name="Colorful List Accent 6" w:semiHidden="0" w:uiPriority="72" w:unhideWhenUsed="0"/>
-    <w:lsdException w:name="Colorful Grid Accent 6" w:semiHidden="0" w:uiPriority="73" w:unhideWhenUsed="0"/>
-    <w:lsdException w:name="Subtle Emphasis" w:semiHidden="0" w:uiPriority="19" w:unhideWhenUsed="0" w:qFormat="1"/>
-    <w:lsdException w:name="Intense Emphasis" w:semiHidden="0" w:uiPriority="21" w:unhideWhenUsed="0" w:qFormat="1"/>
-    <w:lsdException w:name="Subtle Reference" w:semiHidden="0" w:uiPriority="31" w:unhideWhenUsed="0" w:qFormat="1"/>
-    <w:lsdException w:name="Intense Reference" w:semiHidden="0" w:uiPriority="32" w:unhideWhenUsed="0" w:qFormat="1"/>
-    <w:lsdException w:name="Book Title" w:semiHidden="0" w:uiPriority="33" w:unhideWhenUsed="0" w:qFormat="1"/>
-    <w:lsdException w:name="Bibliography" w:uiPriority="37"/>
-    <w:lsdException w:name="TOC Heading" w:uiPriority="39" w:qFormat="1"/>
-  </w:latentStyles>
-  <w:style w:type="paragraph" w:default="1" w:styleId="Normal">
-    <w:name w:val="Normal"/>
-    <w:qFormat/>
-  </w:style>
-  <w:style w:type="paragraph" w:styleId="Ttulo1">
-    <w:name w:val="heading 1"/>
+  <w:style w:type="paragraph" w:styleId="ndicedeilustraes">
+    <w:name w:val="table of figures"/>
     <w:basedOn w:val="Normal"/>
     <w:next w:val="Normal"/>
-    <w:uiPriority w:val="9"/>
-    <w:qFormat/>
+    <w:uiPriority w:val="99"/>
+    <w:unhideWhenUsed/>
+    <w:rsid w:val="009D7EEC"/>
     <w:pPr>
-      <w:keepNext/>
-      <w:keepLines/>
-      <w:spacing w:before="480" w:after="120"/>
-      <w:outlineLvl w:val="0"/>
-    </w:pPr>
-    <w:rPr>
-      <w:b/>
-      <w:bCs/>
-      <w:sz w:val="48"/>
-      <w:szCs w:val="48"/>
-    </w:rPr>
-  </w:style>
-  <w:style w:type="paragraph" w:styleId="Ttulo2">
-    <w:name w:val="heading 2"/>
-    <w:basedOn w:val="Normal"/>
-    <w:next w:val="Normal"/>
-    <w:uiPriority w:val="9"/>
-    <w:semiHidden/>
-    <w:unhideWhenUsed/>
-    <w:qFormat/>
-    <w:pPr>
-      <w:keepNext/>
-      <w:keepLines/>
-      <w:spacing w:before="360" w:after="80"/>
-      <w:outlineLvl w:val="1"/>
-    </w:pPr>
-    <w:rPr>
-      <w:b/>
-      <w:bCs/>
-      <w:sz w:val="36"/>
-      <w:szCs w:val="36"/>
-    </w:rPr>
-  </w:style>
-  <w:style w:type="paragraph" w:styleId="Ttulo3">
-    <w:name w:val="heading 3"/>
-    <w:basedOn w:val="Normal"/>
-    <w:next w:val="Normal"/>
-    <w:uiPriority w:val="9"/>
-    <w:semiHidden/>
-    <w:unhideWhenUsed/>
-    <w:qFormat/>
-    <w:pPr>
-      <w:keepNext/>
-      <w:keepLines/>
-      <w:spacing w:before="280" w:after="80"/>
-      <w:outlineLvl w:val="2"/>
-    </w:pPr>
-    <w:rPr>
-      <w:b/>
-      <w:bCs/>
-      <w:sz w:val="28"/>
-      <w:szCs w:val="28"/>
-    </w:rPr>
-  </w:style>
-  <w:style w:type="paragraph" w:styleId="Ttulo4">
-    <w:name w:val="heading 4"/>
-    <w:basedOn w:val="Normal"/>
-    <w:next w:val="Normal"/>
-    <w:uiPriority w:val="9"/>
-    <w:semiHidden/>
-    <w:unhideWhenUsed/>
-    <w:qFormat/>
-    <w:pPr>
-      <w:keepNext/>
-      <w:keepLines/>
-      <w:spacing w:before="240" w:after="40"/>
-      <w:outlineLvl w:val="3"/>
-    </w:pPr>
-    <w:rPr>
-      <w:b/>
-      <w:bCs/>
-    </w:rPr>
-  </w:style>
-  <w:style w:type="paragraph" w:styleId="Ttulo5">
-    <w:name w:val="heading 5"/>
-    <w:basedOn w:val="Normal"/>
-    <w:next w:val="Normal"/>
-    <w:uiPriority w:val="9"/>
-    <w:semiHidden/>
-    <w:unhideWhenUsed/>
-    <w:qFormat/>
-    <w:pPr>
-      <w:keepNext/>
-      <w:keepLines/>
-      <w:spacing w:before="220" w:after="40"/>
-      <w:outlineLvl w:val="4"/>
-    </w:pPr>
-    <w:rPr>
-      <w:b/>
-      <w:bCs/>
-      <w:sz w:val="22"/>
-      <w:szCs w:val="22"/>
-    </w:rPr>
-  </w:style>
-  <w:style w:type="paragraph" w:styleId="Ttulo6">
-    <w:name w:val="heading 6"/>
-    <w:basedOn w:val="Normal"/>
-    <w:next w:val="Normal"/>
-    <w:uiPriority w:val="9"/>
-    <w:semiHidden/>
-    <w:unhideWhenUsed/>
-    <w:qFormat/>
-    <w:pPr>
-      <w:keepNext/>
-      <w:keepLines/>
-      <w:spacing w:before="200" w:after="40"/>
-      <w:outlineLvl w:val="5"/>
-    </w:pPr>
-    <w:rPr>
-      <w:b/>
-      <w:bCs/>
-      <w:sz w:val="20"/>
-      <w:szCs w:val="20"/>
-    </w:rPr>
-  </w:style>
-  <w:style w:type="character" w:default="1" w:styleId="Fontepargpadro">
-    <w:name w:val="Default Paragraph Font"/>
-    <w:uiPriority w:val="1"/>
-    <w:semiHidden/>
-    <w:unhideWhenUsed/>
-  </w:style>
-  <w:style w:type="table" w:default="1" w:styleId="Tabelanormal">
-    <w:name w:val="Normal Table"/>
-    <w:uiPriority w:val="99"/>
-    <w:semiHidden/>
-    <w:unhideWhenUsed/>
-    <w:tblPr>
-      <w:tblInd w:w="0" w:type="dxa"/>
-      <w:tblCellMar>
-        <w:top w:w="0" w:type="dxa"/>
-        <w:left w:w="108" w:type="dxa"/>
-        <w:bottom w:w="0" w:type="dxa"/>
-        <w:right w:w="108" w:type="dxa"/>
-      </w:tblCellMar>
-    </w:tblPr>
-  </w:style>
-  <w:style w:type="numbering" w:default="1" w:styleId="Semlista">
-    <w:name w:val="No List"/>
-    <w:uiPriority w:val="99"/>
-    <w:semiHidden/>
-    <w:unhideWhenUsed/>
-  </w:style>
-  <w:style w:type="table" w:customStyle="1" w:styleId="TableNormal">
-    <w:name w:val="TableNormal"/>
-    <w:tblPr>
-      <w:tblCellMar>
-        <w:top w:w="100" w:type="dxa"/>
-        <w:left w:w="100" w:type="dxa"/>
-        <w:bottom w:w="100" w:type="dxa"/>
-        <w:right w:w="100" w:type="dxa"/>
-      </w:tblCellMar>
-    </w:tblPr>
-  </w:style>
-  <w:style w:type="paragraph" w:styleId="Ttulo">
-    <w:name w:val="Title"/>
-    <w:basedOn w:val="Normal"/>
-    <w:next w:val="Normal"/>
-    <w:uiPriority w:val="10"/>
-    <w:qFormat/>
-    <w:pPr>
-      <w:keepNext/>
-      <w:keepLines/>
-      <w:spacing w:before="480" w:after="120"/>
-    </w:pPr>
-    <w:rPr>
-      <w:b/>
-      <w:bCs/>
-      <w:sz w:val="72"/>
-      <w:szCs w:val="72"/>
-    </w:rPr>
-  </w:style>
-  <w:style w:type="paragraph" w:styleId="Subttulo">
-    <w:name w:val="Subtitle"/>
-    <w:basedOn w:val="Normal"/>
-    <w:next w:val="Normal"/>
-    <w:uiPriority w:val="11"/>
-    <w:qFormat/>
-    <w:pPr>
-      <w:keepNext/>
-      <w:keepLines/>
-      <w:spacing w:before="360" w:after="80"/>
-    </w:pPr>
-    <w:rPr>
-      <w:rFonts w:ascii="Georgia" w:eastAsia="Georgia" w:hAnsi="Georgia" w:cs="Georgia"/>
-      <w:i/>
-      <w:iCs/>
-      <w:color w:val="666666"/>
-      <w:sz w:val="48"/>
-      <w:szCs w:val="48"/>
-    </w:rPr>
-  </w:style>
-  <w:style w:type="table" w:customStyle="1" w:styleId="a">
-    <w:basedOn w:val="TableNormal"/>
-    <w:tblPr>
-      <w:tblStyleRowBandSize w:val="1"/>
-      <w:tblStyleColBandSize w:val="1"/>
-      <w:tblCellMar>
-        <w:top w:w="0" w:type="dxa"/>
-        <w:left w:w="108" w:type="dxa"/>
-        <w:bottom w:w="0" w:type="dxa"/>
-        <w:right w:w="108" w:type="dxa"/>
-      </w:tblCellMar>
-    </w:tblPr>
-  </w:style>
-  <w:style w:type="table" w:customStyle="1" w:styleId="a0">
-    <w:basedOn w:val="TableNormal"/>
-    <w:tblPr>
-      <w:tblStyleRowBandSize w:val="1"/>
-      <w:tblStyleColBandSize w:val="1"/>
-      <w:tblCellMar>
-        <w:top w:w="0" w:type="dxa"/>
-        <w:left w:w="108" w:type="dxa"/>
-        <w:bottom w:w="0" w:type="dxa"/>
-        <w:right w:w="108" w:type="dxa"/>
-      </w:tblCellMar>
-    </w:tblPr>
-  </w:style>
-  <w:style w:type="paragraph" w:styleId="Textodebalo">
-    <w:name w:val="Balloon Text"/>
-    <w:basedOn w:val="Normal"/>
-    <w:link w:val="TextodebaloChar"/>
-    <w:uiPriority w:val="99"/>
-    <w:semiHidden/>
-    <w:unhideWhenUsed/>
-    <w:rsid w:val="00B808CD"/>
-    <w:pPr>
-      <w:spacing w:after="0" w:line="240" w:lineRule="auto"/>
-    </w:pPr>
-    <w:rPr>
-      <w:rFonts w:ascii="Tahoma" w:hAnsi="Tahoma" w:cs="Tahoma"/>
-      <w:sz w:val="16"/>
-      <w:szCs w:val="16"/>
-    </w:rPr>
-  </w:style>
-  <w:style w:type="character" w:customStyle="1" w:styleId="TextodebaloChar">
-    <w:name w:val="Texto de balão Char"/>
-    <w:basedOn w:val="Fontepargpadro"/>
-    <w:link w:val="Textodebalo"/>
-    <w:uiPriority w:val="99"/>
-    <w:semiHidden/>
-    <w:rsid w:val="00B808CD"/>
-    <w:rPr>
-      <w:rFonts w:ascii="Tahoma" w:hAnsi="Tahoma" w:cs="Tahoma"/>
-      <w:sz w:val="16"/>
-      <w:szCs w:val="16"/>
-    </w:rPr>
-  </w:style>
-  <w:style w:type="table" w:styleId="Tabelacomgrade">
-    <w:name w:val="Table Grid"/>
-    <w:basedOn w:val="Tabelanormal"/>
-    <w:uiPriority w:val="39"/>
-    <w:rsid w:val="002757AB"/>
-    <w:pPr>
-      <w:spacing w:after="0" w:line="240" w:lineRule="auto"/>
-    </w:pPr>
-    <w:tblPr>
-      <w:tblInd w:w="0" w:type="dxa"/>
-      <w:tblBorders>
-        <w:top w:val="single" w:sz="4" w:space="0" w:color="auto"/>
-        <w:left w:val="single" w:sz="4" w:space="0" w:color="auto"/>
-        <w:bottom w:val="single" w:sz="4" w:space="0" w:color="auto"/>
-        <w:right w:val="single" w:sz="4" w:space="0" w:color="auto"/>
-        <w:insideH w:val="single" w:sz="4" w:space="0" w:color="auto"/>
-        <w:insideV w:val="single" w:sz="4" w:space="0" w:color="auto"/>
-      </w:tblBorders>
-      <w:tblCellMar>
-        <w:top w:w="0" w:type="dxa"/>
-        <w:left w:w="108" w:type="dxa"/>
-        <w:bottom w:w="0" w:type="dxa"/>
-        <w:right w:w="108" w:type="dxa"/>
-      </w:tblCellMar>
-    </w:tblPr>
-  </w:style>
-  <w:style w:type="character" w:customStyle="1" w:styleId="citation-150">
-    <w:name w:val="citation-150"/>
-    <w:basedOn w:val="Fontepargpadro"/>
-    <w:rsid w:val="00A711AC"/>
-  </w:style>
-  <w:style w:type="character" w:customStyle="1" w:styleId="citation-148">
-    <w:name w:val="citation-148"/>
-    <w:basedOn w:val="Fontepargpadro"/>
-    <w:rsid w:val="007F7CF9"/>
-  </w:style>
-  <w:style w:type="paragraph" w:styleId="NormalWeb">
-    <w:name w:val="Normal (Web)"/>
-    <w:basedOn w:val="Normal"/>
-    <w:uiPriority w:val="99"/>
-    <w:semiHidden/>
-    <w:unhideWhenUsed/>
-    <w:rsid w:val="00610733"/>
-    <w:pPr>
-      <w:spacing w:before="100" w:beforeAutospacing="1" w:after="100" w:afterAutospacing="1" w:line="240" w:lineRule="auto"/>
+      <w:spacing w:after="0"/>
     </w:pPr>
   </w:style>
-  <w:style w:type="character" w:customStyle="1" w:styleId="citation-140">
-    <w:name w:val="citation-140"/>
+  <w:style w:type="character" w:styleId="Hyperlink">
+    <w:name w:val="Hyperlink"/>
     <w:basedOn w:val="Fontepargpadro"/>
-    <w:rsid w:val="00610733"/>
-  </w:style>
-  <w:style w:type="character" w:customStyle="1" w:styleId="citation-139">
-    <w:name w:val="citation-139"/>
-    <w:basedOn w:val="Fontepargpadro"/>
-    <w:rsid w:val="00610733"/>
-  </w:style>
-  <w:style w:type="character" w:customStyle="1" w:styleId="citation-138">
-    <w:name w:val="citation-138"/>
-    <w:basedOn w:val="Fontepargpadro"/>
-    <w:rsid w:val="00610733"/>
-  </w:style>
-  <w:style w:type="character" w:customStyle="1" w:styleId="citation-137">
-    <w:name w:val="citation-137"/>
-    <w:basedOn w:val="Fontepargpadro"/>
-    <w:rsid w:val="00610733"/>
-  </w:style>
-  <w:style w:type="character" w:customStyle="1" w:styleId="citation-136">
-    <w:name w:val="citation-136"/>
-    <w:basedOn w:val="Fontepargpadro"/>
-    <w:rsid w:val="00610733"/>
-  </w:style>
-  <w:style w:type="character" w:customStyle="1" w:styleId="citation-135">
-    <w:name w:val="citation-135"/>
-    <w:basedOn w:val="Fontepargpadro"/>
-    <w:rsid w:val="00610733"/>
-  </w:style>
-  <w:style w:type="character" w:customStyle="1" w:styleId="citation-134">
-    <w:name w:val="citation-134"/>
-    <w:basedOn w:val="Fontepargpadro"/>
-    <w:rsid w:val="00610733"/>
-  </w:style>
-  <w:style w:type="paragraph" w:styleId="Legenda">
-    <w:name w:val="caption"/>
-    <w:basedOn w:val="Normal"/>
-    <w:next w:val="Normal"/>
-    <w:uiPriority w:val="35"/>
+    <w:uiPriority w:val="99"/>
     <w:unhideWhenUsed/>
-    <w:qFormat/>
-    <w:rsid w:val="00B6568B"/>
-    <w:pPr>
-      <w:spacing w:after="200" w:line="240" w:lineRule="auto"/>
-    </w:pPr>
+    <w:rsid w:val="009D7EEC"/>
     <w:rPr>
-      <w:i/>
-      <w:iCs/>
-      <w:color w:val="1F497D" w:themeColor="text2"/>
-      <w:sz w:val="18"/>
-      <w:szCs w:val="18"/>
+      <w:color w:val="0000FF" w:themeColor="hyperlink"/>
+      <w:u w:val="single"/>
     </w:rPr>
   </w:style>
 </w:styles>
@@ -8628,7 +8360,7 @@
 </file>
 
 <file path=customXml/itemProps1.xml><?xml version="1.0" encoding="utf-8"?>
-<ds:datastoreItem xmlns:ds="http://schemas.openxmlformats.org/officeDocument/2006/customXml" ds:itemID="{8FBD6257-1717-489A-86F0-B8B9FBC0C903}">
+<ds:datastoreItem xmlns:ds="http://schemas.openxmlformats.org/officeDocument/2006/customXml" ds:itemID="{14196FDD-76F5-4386-985F-E4DCD2C0655B}">
   <ds:schemaRefs>
     <ds:schemaRef ds:uri="http://schemas.openxmlformats.org/officeDocument/2006/bibliography"/>
   </ds:schemaRefs>

</xml_diff>